<commit_message>
started building map adjusted screen width/height
</commit_message>
<xml_diff>
--- a/documentation/ongoing_testing.docx
+++ b/documentation/ongoing_testing.docx
@@ -1,6 +1,6 @@
 
 <file path=word/document.xml><?xml version="1.0" encoding="utf-8"?>
-<w:document xmlns:wpc="http://schemas.microsoft.com/office/word/2010/wordprocessingCanvas" xmlns:cx="http://schemas.microsoft.com/office/drawing/2014/chartex" xmlns:cx1="http://schemas.microsoft.com/office/drawing/2015/9/8/chartex" xmlns:cx2="http://schemas.microsoft.com/office/drawing/2015/10/21/chartex" xmlns:cx3="http://schemas.microsoft.com/office/drawing/2016/5/9/chartex" xmlns:cx4="http://schemas.microsoft.com/office/drawing/2016/5/10/chartex" xmlns:cx5="http://schemas.microsoft.com/office/drawing/2016/5/11/chartex" xmlns:cx6="http://schemas.microsoft.com/office/drawing/2016/5/12/chartex" xmlns:cx7="http://schemas.microsoft.com/office/drawing/2016/5/13/chartex" xmlns:cx8="http://schemas.microsoft.com/office/drawing/2016/5/14/chartex" xmlns:mc="http://schemas.openxmlformats.org/markup-compatibility/2006" xmlns:aink="http://schemas.microsoft.com/office/drawing/2016/ink" xmlns:am3d="http://schemas.microsoft.com/office/drawing/2017/model3d" xmlns:o="urn:schemas-microsoft-com:office:office" xmlns:oel="http://schemas.microsoft.com/office/2019/extlst" xmlns:r="http://schemas.openxmlformats.org/officeDocument/2006/relationships" xmlns:m="http://schemas.openxmlformats.org/officeDocument/2006/math" xmlns:v="urn:schemas-microsoft-com:vml" xmlns:wp14="http://schemas.microsoft.com/office/word/2010/wordprocessingDrawing" xmlns:wp="http://schemas.openxmlformats.org/drawingml/2006/wordprocessingDrawing" xmlns:w10="urn:schemas-microsoft-com:office:word" xmlns:w="http://schemas.openxmlformats.org/wordprocessingml/2006/main" xmlns:w14="http://schemas.microsoft.com/office/word/2010/wordml" xmlns:w15="http://schemas.microsoft.com/office/word/2012/wordml" xmlns:w16cex="http://schemas.microsoft.com/office/word/2018/wordml/cex" xmlns:w16cid="http://schemas.microsoft.com/office/word/2016/wordml/cid" xmlns:w16="http://schemas.microsoft.com/office/word/2018/wordml" xmlns:w16du="http://schemas.microsoft.com/office/word/2023/wordml/word16du" xmlns:w16sdtdh="http://schemas.microsoft.com/office/word/2020/wordml/sdtdatahash" xmlns:w16se="http://schemas.microsoft.com/office/word/2015/wordml/symex" xmlns:wpg="http://schemas.microsoft.com/office/word/2010/wordprocessingGroup" xmlns:wpi="http://schemas.microsoft.com/office/word/2010/wordprocessingInk" xmlns:wne="http://schemas.microsoft.com/office/word/2006/wordml" xmlns:wps="http://schemas.microsoft.com/office/word/2010/wordprocessingShape" mc:Ignorable="w14 w15 w16se w16cid w16 w16cex w16sdtdh w16du wp14">
+<w:document xmlns:wpc="http://schemas.microsoft.com/office/word/2010/wordprocessingCanvas" xmlns:cx="http://schemas.microsoft.com/office/drawing/2014/chartex" xmlns:cx1="http://schemas.microsoft.com/office/drawing/2015/9/8/chartex" xmlns:cx2="http://schemas.microsoft.com/office/drawing/2015/10/21/chartex" xmlns:cx3="http://schemas.microsoft.com/office/drawing/2016/5/9/chartex" xmlns:cx4="http://schemas.microsoft.com/office/drawing/2016/5/10/chartex" xmlns:cx5="http://schemas.microsoft.com/office/drawing/2016/5/11/chartex" xmlns:cx6="http://schemas.microsoft.com/office/drawing/2016/5/12/chartex" xmlns:cx7="http://schemas.microsoft.com/office/drawing/2016/5/13/chartex" xmlns:cx8="http://schemas.microsoft.com/office/drawing/2016/5/14/chartex" xmlns:mc="http://schemas.openxmlformats.org/markup-compatibility/2006" xmlns:aink="http://schemas.microsoft.com/office/drawing/2016/ink" xmlns:am3d="http://schemas.microsoft.com/office/drawing/2017/model3d" xmlns:o="urn:schemas-microsoft-com:office:office" xmlns:oel="http://schemas.microsoft.com/office/2019/extlst" xmlns:r="http://schemas.openxmlformats.org/officeDocument/2006/relationships" xmlns:m="http://schemas.openxmlformats.org/officeDocument/2006/math" xmlns:v="urn:schemas-microsoft-com:vml" xmlns:wp14="http://schemas.microsoft.com/office/word/2010/wordprocessingDrawing" xmlns:wp="http://schemas.openxmlformats.org/drawingml/2006/wordprocessingDrawing" xmlns:w10="urn:schemas-microsoft-com:office:word" xmlns:w="http://schemas.openxmlformats.org/wordprocessingml/2006/main" xmlns:w14="http://schemas.microsoft.com/office/word/2010/wordml" xmlns:w15="http://schemas.microsoft.com/office/word/2012/wordml" xmlns:w16cex="http://schemas.microsoft.com/office/word/2018/wordml/cex" xmlns:w16cid="http://schemas.microsoft.com/office/word/2016/wordml/cid" xmlns:w16="http://schemas.microsoft.com/office/word/2018/wordml" xmlns:w16sdtdh="http://schemas.microsoft.com/office/word/2020/wordml/sdtdatahash" xmlns:w16se="http://schemas.microsoft.com/office/word/2015/wordml/symex" xmlns:wpg="http://schemas.microsoft.com/office/word/2010/wordprocessingGroup" xmlns:wpi="http://schemas.microsoft.com/office/word/2010/wordprocessingInk" xmlns:wne="http://schemas.microsoft.com/office/word/2006/wordml" xmlns:wps="http://schemas.microsoft.com/office/word/2010/wordprocessingShape" mc:Ignorable="w14 w15 w16se w16cid w16 w16cex w16sdtdh wp14">
   <w:body>
     <w:tbl>
       <w:tblPr>
@@ -112,7 +112,11 @@
           <w:tcPr>
             <w:tcW w:w="1804" w:type="dxa"/>
           </w:tcPr>
-          <w:p/>
+          <w:p>
+            <w:r>
+              <w:t>Changed compression type to zlib</w:t>
+            </w:r>
+          </w:p>
         </w:tc>
       </w:tr>
       <w:tr>
@@ -120,31 +124,51 @@
           <w:tcPr>
             <w:tcW w:w="846" w:type="dxa"/>
           </w:tcPr>
-          <w:p/>
+          <w:p>
+            <w:r>
+              <w:t>14/03</w:t>
+            </w:r>
+          </w:p>
         </w:tc>
         <w:tc>
           <w:tcPr>
             <w:tcW w:w="2126" w:type="dxa"/>
           </w:tcPr>
-          <w:p/>
+          <w:p>
+            <w:r>
+              <w:t>Basic game</w:t>
+            </w:r>
+          </w:p>
         </w:tc>
         <w:tc>
           <w:tcPr>
             <w:tcW w:w="2437" w:type="dxa"/>
           </w:tcPr>
-          <w:p/>
+          <w:p>
+            <w:r>
+              <w:t>Basic game to load with basic map</w:t>
+            </w:r>
+          </w:p>
         </w:tc>
         <w:tc>
           <w:tcPr>
             <w:tcW w:w="1803" w:type="dxa"/>
           </w:tcPr>
-          <w:p/>
+          <w:p>
+            <w:r>
+              <w:t>Game loads</w:t>
+            </w:r>
+          </w:p>
         </w:tc>
         <w:tc>
           <w:tcPr>
             <w:tcW w:w="1804" w:type="dxa"/>
           </w:tcPr>
-          <w:p/>
+          <w:p>
+            <w:r>
+              <w:t>None</w:t>
+            </w:r>
+          </w:p>
         </w:tc>
       </w:tr>
       <w:tr>
@@ -152,19 +176,31 @@
           <w:tcPr>
             <w:tcW w:w="846" w:type="dxa"/>
           </w:tcPr>
-          <w:p/>
+          <w:p>
+            <w:r>
+              <w:t>14/03</w:t>
+            </w:r>
+          </w:p>
         </w:tc>
         <w:tc>
           <w:tcPr>
             <w:tcW w:w="2126" w:type="dxa"/>
           </w:tcPr>
-          <w:p/>
+          <w:p>
+            <w:r>
+              <w:t>Screen window size</w:t>
+            </w:r>
+          </w:p>
         </w:tc>
         <w:tc>
           <w:tcPr>
             <w:tcW w:w="2437" w:type="dxa"/>
           </w:tcPr>
-          <w:p/>
+          <w:p>
+            <w:r>
+              <w:t>Screen window matches the size of the map</w:t>
+            </w:r>
+          </w:p>
         </w:tc>
         <w:tc>
           <w:tcPr>
@@ -320,7 +356,7 @@
 </file>
 
 <file path=word/styles.xml><?xml version="1.0" encoding="utf-8"?>
-<w:styles xmlns:mc="http://schemas.openxmlformats.org/markup-compatibility/2006" xmlns:r="http://schemas.openxmlformats.org/officeDocument/2006/relationships" xmlns:w="http://schemas.openxmlformats.org/wordprocessingml/2006/main" xmlns:w14="http://schemas.microsoft.com/office/word/2010/wordml" xmlns:w15="http://schemas.microsoft.com/office/word/2012/wordml" xmlns:w16cex="http://schemas.microsoft.com/office/word/2018/wordml/cex" xmlns:w16cid="http://schemas.microsoft.com/office/word/2016/wordml/cid" xmlns:w16="http://schemas.microsoft.com/office/word/2018/wordml" xmlns:w16du="http://schemas.microsoft.com/office/word/2023/wordml/word16du" xmlns:w16sdtdh="http://schemas.microsoft.com/office/word/2020/wordml/sdtdatahash" xmlns:w16se="http://schemas.microsoft.com/office/word/2015/wordml/symex" mc:Ignorable="w14 w15 w16se w16cid w16 w16cex w16sdtdh w16du">
+<w:styles xmlns:mc="http://schemas.openxmlformats.org/markup-compatibility/2006" xmlns:r="http://schemas.openxmlformats.org/officeDocument/2006/relationships" xmlns:w="http://schemas.openxmlformats.org/wordprocessingml/2006/main" xmlns:w14="http://schemas.microsoft.com/office/word/2010/wordml" xmlns:w15="http://schemas.microsoft.com/office/word/2012/wordml" xmlns:w16cex="http://schemas.microsoft.com/office/word/2018/wordml/cex" xmlns:w16cid="http://schemas.microsoft.com/office/word/2016/wordml/cid" xmlns:w16="http://schemas.microsoft.com/office/word/2018/wordml" xmlns:w16sdtdh="http://schemas.microsoft.com/office/word/2020/wordml/sdtdatahash" xmlns:w16se="http://schemas.microsoft.com/office/word/2015/wordml/symex" mc:Ignorable="w14 w15 w16se w16cid w16 w16cex w16sdtdh">
   <w:docDefaults>
     <w:rPrDefault>
       <w:rPr>

</xml_diff>

<commit_message>
Worked on change direction code
</commit_message>
<xml_diff>
--- a/documentation/ongoing_testing.docx
+++ b/documentation/ongoing_testing.docx
@@ -9,16 +9,16 @@
         <w:tblLook w:val="04A0" w:firstRow="1" w:lastRow="0" w:firstColumn="1" w:lastColumn="0" w:noHBand="0" w:noVBand="1"/>
       </w:tblPr>
       <w:tblGrid>
-        <w:gridCol w:w="846"/>
-        <w:gridCol w:w="2126"/>
-        <w:gridCol w:w="2437"/>
-        <w:gridCol w:w="1803"/>
-        <w:gridCol w:w="1804"/>
+        <w:gridCol w:w="762"/>
+        <w:gridCol w:w="1299"/>
+        <w:gridCol w:w="1344"/>
+        <w:gridCol w:w="1469"/>
+        <w:gridCol w:w="4142"/>
       </w:tblGrid>
       <w:tr>
         <w:tc>
           <w:tcPr>
-            <w:tcW w:w="846" w:type="dxa"/>
+            <w:tcW w:w="762" w:type="dxa"/>
           </w:tcPr>
           <w:p>
             <w:r>
@@ -28,7 +28,7 @@
         </w:tc>
         <w:tc>
           <w:tcPr>
-            <w:tcW w:w="2126" w:type="dxa"/>
+            <w:tcW w:w="1299" w:type="dxa"/>
           </w:tcPr>
           <w:p>
             <w:r>
@@ -38,7 +38,7 @@
         </w:tc>
         <w:tc>
           <w:tcPr>
-            <w:tcW w:w="2437" w:type="dxa"/>
+            <w:tcW w:w="1344" w:type="dxa"/>
           </w:tcPr>
           <w:p>
             <w:r>
@@ -48,7 +48,7 @@
         </w:tc>
         <w:tc>
           <w:tcPr>
-            <w:tcW w:w="1803" w:type="dxa"/>
+            <w:tcW w:w="1469" w:type="dxa"/>
           </w:tcPr>
           <w:p>
             <w:r>
@@ -58,7 +58,7 @@
         </w:tc>
         <w:tc>
           <w:tcPr>
-            <w:tcW w:w="1804" w:type="dxa"/>
+            <w:tcW w:w="4142" w:type="dxa"/>
           </w:tcPr>
           <w:p>
             <w:r>
@@ -70,7 +70,7 @@
       <w:tr>
         <w:tc>
           <w:tcPr>
-            <w:tcW w:w="846" w:type="dxa"/>
+            <w:tcW w:w="762" w:type="dxa"/>
           </w:tcPr>
           <w:p>
             <w:r>
@@ -80,7 +80,7 @@
         </w:tc>
         <w:tc>
           <w:tcPr>
-            <w:tcW w:w="2126" w:type="dxa"/>
+            <w:tcW w:w="1299" w:type="dxa"/>
           </w:tcPr>
           <w:p>
             <w:r>
@@ -90,7 +90,7 @@
         </w:tc>
         <w:tc>
           <w:tcPr>
-            <w:tcW w:w="2437" w:type="dxa"/>
+            <w:tcW w:w="1344" w:type="dxa"/>
           </w:tcPr>
           <w:p>
             <w:r>
@@ -100,29 +100,42 @@
         </w:tc>
         <w:tc>
           <w:tcPr>
-            <w:tcW w:w="1803" w:type="dxa"/>
-          </w:tcPr>
-          <w:p>
-            <w:r>
-              <w:t>Vs code complains about vstd compression</w:t>
-            </w:r>
-          </w:p>
-        </w:tc>
-        <w:tc>
-          <w:tcPr>
-            <w:tcW w:w="1804" w:type="dxa"/>
-          </w:tcPr>
-          <w:p>
-            <w:r>
-              <w:t>Changed compression type to zlib</w:t>
-            </w:r>
+            <w:tcW w:w="1469" w:type="dxa"/>
+          </w:tcPr>
+          <w:p>
+            <w:r>
+              <w:t xml:space="preserve">Vs code complains about </w:t>
+            </w:r>
+            <w:proofErr w:type="spellStart"/>
+            <w:r>
+              <w:t>vstd</w:t>
+            </w:r>
+            <w:proofErr w:type="spellEnd"/>
+            <w:r>
+              <w:t xml:space="preserve"> compression</w:t>
+            </w:r>
+          </w:p>
+        </w:tc>
+        <w:tc>
+          <w:tcPr>
+            <w:tcW w:w="4142" w:type="dxa"/>
+          </w:tcPr>
+          <w:p>
+            <w:r>
+              <w:t xml:space="preserve">Changed compression type to </w:t>
+            </w:r>
+            <w:proofErr w:type="spellStart"/>
+            <w:r>
+              <w:t>zlib</w:t>
+            </w:r>
+            <w:proofErr w:type="spellEnd"/>
           </w:p>
         </w:tc>
       </w:tr>
       <w:tr>
         <w:tc>
           <w:tcPr>
-            <w:tcW w:w="846" w:type="dxa"/>
+            <w:tcW w:w="762" w:type="dxa"/>
           </w:tcPr>
           <w:p>
             <w:r>
@@ -132,7 +145,7 @@
         </w:tc>
         <w:tc>
           <w:tcPr>
-            <w:tcW w:w="2126" w:type="dxa"/>
+            <w:tcW w:w="1299" w:type="dxa"/>
           </w:tcPr>
           <w:p>
             <w:r>
@@ -142,7 +155,7 @@
         </w:tc>
         <w:tc>
           <w:tcPr>
-            <w:tcW w:w="2437" w:type="dxa"/>
+            <w:tcW w:w="1344" w:type="dxa"/>
           </w:tcPr>
           <w:p>
             <w:r>
@@ -152,7 +165,7 @@
         </w:tc>
         <w:tc>
           <w:tcPr>
-            <w:tcW w:w="1803" w:type="dxa"/>
+            <w:tcW w:w="1469" w:type="dxa"/>
           </w:tcPr>
           <w:p>
             <w:r>
@@ -162,7 +175,7 @@
         </w:tc>
         <w:tc>
           <w:tcPr>
-            <w:tcW w:w="1804" w:type="dxa"/>
+            <w:tcW w:w="4142" w:type="dxa"/>
           </w:tcPr>
           <w:p>
             <w:r>
@@ -174,7 +187,7 @@
       <w:tr>
         <w:tc>
           <w:tcPr>
-            <w:tcW w:w="846" w:type="dxa"/>
+            <w:tcW w:w="762" w:type="dxa"/>
           </w:tcPr>
           <w:p>
             <w:r>
@@ -184,7 +197,7 @@
         </w:tc>
         <w:tc>
           <w:tcPr>
-            <w:tcW w:w="2126" w:type="dxa"/>
+            <w:tcW w:w="1299" w:type="dxa"/>
           </w:tcPr>
           <w:p>
             <w:r>
@@ -194,7 +207,7 @@
         </w:tc>
         <w:tc>
           <w:tcPr>
-            <w:tcW w:w="2437" w:type="dxa"/>
+            <w:tcW w:w="1344" w:type="dxa"/>
           </w:tcPr>
           <w:p>
             <w:r>
@@ -204,7 +217,7 @@
         </w:tc>
         <w:tc>
           <w:tcPr>
-            <w:tcW w:w="1803" w:type="dxa"/>
+            <w:tcW w:w="1469" w:type="dxa"/>
           </w:tcPr>
           <w:p>
             <w:r>
@@ -214,7 +227,7 @@
         </w:tc>
         <w:tc>
           <w:tcPr>
-            <w:tcW w:w="1804" w:type="dxa"/>
+            <w:tcW w:w="4142" w:type="dxa"/>
           </w:tcPr>
           <w:p>
             <w:r>
@@ -226,7 +239,7 @@
       <w:tr>
         <w:tc>
           <w:tcPr>
-            <w:tcW w:w="846" w:type="dxa"/>
+            <w:tcW w:w="762" w:type="dxa"/>
           </w:tcPr>
           <w:p>
             <w:r>
@@ -236,7 +249,7 @@
         </w:tc>
         <w:tc>
           <w:tcPr>
-            <w:tcW w:w="2126" w:type="dxa"/>
+            <w:tcW w:w="1299" w:type="dxa"/>
           </w:tcPr>
           <w:p>
             <w:r>
@@ -246,7 +259,7 @@
         </w:tc>
         <w:tc>
           <w:tcPr>
-            <w:tcW w:w="2437" w:type="dxa"/>
+            <w:tcW w:w="1344" w:type="dxa"/>
           </w:tcPr>
           <w:p>
             <w:r>
@@ -256,7 +269,7 @@
         </w:tc>
         <w:tc>
           <w:tcPr>
-            <w:tcW w:w="1803" w:type="dxa"/>
+            <w:tcW w:w="1469" w:type="dxa"/>
           </w:tcPr>
           <w:p>
             <w:r>
@@ -269,7 +282,7 @@
         </w:tc>
         <w:tc>
           <w:tcPr>
-            <w:tcW w:w="1804" w:type="dxa"/>
+            <w:tcW w:w="4142" w:type="dxa"/>
           </w:tcPr>
           <w:p/>
         </w:tc>
@@ -277,95 +290,569 @@
       <w:tr>
         <w:tc>
           <w:tcPr>
-            <w:tcW w:w="846" w:type="dxa"/>
-          </w:tcPr>
-          <w:p/>
-        </w:tc>
-        <w:tc>
-          <w:tcPr>
-            <w:tcW w:w="2126" w:type="dxa"/>
-          </w:tcPr>
-          <w:p/>
-        </w:tc>
-        <w:tc>
-          <w:tcPr>
-            <w:tcW w:w="2437" w:type="dxa"/>
-          </w:tcPr>
-          <w:p/>
-        </w:tc>
-        <w:tc>
-          <w:tcPr>
-            <w:tcW w:w="1803" w:type="dxa"/>
-          </w:tcPr>
-          <w:p/>
-        </w:tc>
-        <w:tc>
-          <w:tcPr>
-            <w:tcW w:w="1804" w:type="dxa"/>
-          </w:tcPr>
+            <w:tcW w:w="762" w:type="dxa"/>
+          </w:tcPr>
+          <w:p>
+            <w:r>
+              <w:t>18/03</w:t>
+            </w:r>
+          </w:p>
+        </w:tc>
+        <w:tc>
+          <w:tcPr>
+            <w:tcW w:w="1299" w:type="dxa"/>
+          </w:tcPr>
+          <w:p>
+            <w:r>
+              <w:t>Character face</w:t>
+            </w:r>
+          </w:p>
+        </w:tc>
+        <w:tc>
+          <w:tcPr>
+            <w:tcW w:w="1344" w:type="dxa"/>
+          </w:tcPr>
+          <w:p>
+            <w:r>
+              <w:t>Character flips horizontally depending on direction</w:t>
+            </w:r>
+          </w:p>
+        </w:tc>
+        <w:tc>
+          <w:tcPr>
+            <w:tcW w:w="1469" w:type="dxa"/>
+          </w:tcPr>
+          <w:p>
+            <w:r>
+              <w:t>Hit box error</w:t>
+            </w:r>
+          </w:p>
+        </w:tc>
+        <w:tc>
+          <w:tcPr>
+            <w:tcW w:w="4142" w:type="dxa"/>
+          </w:tcPr>
+          <w:p>
+            <w:pPr>
+              <w:shd w:val="clear" w:color="auto" w:fill="1E1E1E"/>
+              <w:spacing w:after="160" w:line="285" w:lineRule="atLeast"/>
+            </w:pPr>
+            <w:r>
+              <w:t xml:space="preserve">Added </w:t>
+            </w:r>
+          </w:p>
+          <w:p>
+            <w:pPr>
+              <w:shd w:val="clear" w:color="auto" w:fill="1E1E1E"/>
+              <w:spacing w:line="285" w:lineRule="atLeast"/>
+              <w:rPr>
+                <w:rFonts w:ascii="Consolas" w:eastAsia="Times New Roman" w:hAnsi="Consolas" w:cs="Times New Roman"/>
+                <w:color w:val="D4D4D4"/>
+                <w:sz w:val="21"/>
+                <w:szCs w:val="21"/>
+                <w:lang w:eastAsia="en-NZ"/>
+              </w:rPr>
+            </w:pPr>
+            <w:proofErr w:type="spellStart"/>
+            <w:r>
+              <w:rPr>
+                <w:rFonts w:ascii="Consolas" w:eastAsia="Times New Roman" w:hAnsi="Consolas" w:cs="Times New Roman"/>
+                <w:color w:val="9CDCFE"/>
+                <w:sz w:val="21"/>
+                <w:szCs w:val="21"/>
+                <w:lang w:eastAsia="en-NZ"/>
+              </w:rPr>
+              <w:t>self</w:t>
+            </w:r>
+            <w:r>
+              <w:rPr>
+                <w:rFonts w:ascii="Consolas" w:eastAsia="Times New Roman" w:hAnsi="Consolas" w:cs="Times New Roman"/>
+                <w:color w:val="D4D4D4"/>
+                <w:sz w:val="21"/>
+                <w:szCs w:val="21"/>
+                <w:lang w:eastAsia="en-NZ"/>
+              </w:rPr>
+              <w:t>.</w:t>
+            </w:r>
+            <w:r>
+              <w:rPr>
+                <w:rFonts w:ascii="Consolas" w:eastAsia="Times New Roman" w:hAnsi="Consolas" w:cs="Times New Roman"/>
+                <w:color w:val="9CDCFE"/>
+                <w:sz w:val="21"/>
+                <w:szCs w:val="21"/>
+                <w:lang w:eastAsia="en-NZ"/>
+              </w:rPr>
+              <w:t>hit_box</w:t>
+            </w:r>
+            <w:proofErr w:type="spellEnd"/>
+            <w:r>
+              <w:rPr>
+                <w:rFonts w:ascii="Consolas" w:eastAsia="Times New Roman" w:hAnsi="Consolas" w:cs="Times New Roman"/>
+                <w:color w:val="D4D4D4"/>
+                <w:sz w:val="21"/>
+                <w:szCs w:val="21"/>
+                <w:lang w:eastAsia="en-NZ"/>
+              </w:rPr>
+              <w:t xml:space="preserve"> = </w:t>
+            </w:r>
+            <w:r>
+              <w:rPr>
+                <w:rFonts w:ascii="Consolas" w:eastAsia="Times New Roman" w:hAnsi="Consolas" w:cs="Times New Roman"/>
+                <w:color w:val="9CDCFE"/>
+                <w:sz w:val="21"/>
+                <w:szCs w:val="21"/>
+                <w:lang w:eastAsia="en-NZ"/>
+              </w:rPr>
+              <w:t>self</w:t>
+            </w:r>
+            <w:r>
+              <w:rPr>
+                <w:rFonts w:ascii="Consolas" w:eastAsia="Times New Roman" w:hAnsi="Consolas" w:cs="Times New Roman"/>
+                <w:color w:val="D4D4D4"/>
+                <w:sz w:val="21"/>
+                <w:szCs w:val="21"/>
+                <w:lang w:eastAsia="en-NZ"/>
+              </w:rPr>
+              <w:t>.</w:t>
+            </w:r>
+            <w:r>
+              <w:rPr>
+                <w:rFonts w:ascii="Consolas" w:eastAsia="Times New Roman" w:hAnsi="Consolas" w:cs="Times New Roman"/>
+                <w:color w:val="9CDCFE"/>
+                <w:sz w:val="21"/>
+                <w:szCs w:val="21"/>
+                <w:lang w:eastAsia="en-NZ"/>
+              </w:rPr>
+              <w:t>walk_textures</w:t>
+            </w:r>
+            <w:r>
+              <w:rPr>
+                <w:rFonts w:ascii="Consolas" w:eastAsia="Times New Roman" w:hAnsi="Consolas" w:cs="Times New Roman"/>
+                <w:color w:val="D4D4D4"/>
+                <w:sz w:val="21"/>
+                <w:szCs w:val="21"/>
+                <w:lang w:eastAsia="en-NZ"/>
+              </w:rPr>
+              <w:t>.hit_box_points</w:t>
+            </w:r>
+          </w:p>
           <w:p/>
         </w:tc>
       </w:tr>
       <w:tr>
         <w:tc>
           <w:tcPr>
-            <w:tcW w:w="846" w:type="dxa"/>
-          </w:tcPr>
-          <w:p/>
-        </w:tc>
-        <w:tc>
-          <w:tcPr>
-            <w:tcW w:w="2126" w:type="dxa"/>
-          </w:tcPr>
-          <w:p/>
-        </w:tc>
-        <w:tc>
-          <w:tcPr>
-            <w:tcW w:w="2437" w:type="dxa"/>
-          </w:tcPr>
-          <w:p/>
-        </w:tc>
-        <w:tc>
-          <w:tcPr>
-            <w:tcW w:w="1803" w:type="dxa"/>
-          </w:tcPr>
-          <w:p/>
-        </w:tc>
-        <w:tc>
-          <w:tcPr>
-            <w:tcW w:w="1804" w:type="dxa"/>
-          </w:tcPr>
+            <w:tcW w:w="762" w:type="dxa"/>
+          </w:tcPr>
+          <w:p>
+            <w:r>
+              <w:t>18/03</w:t>
+            </w:r>
+          </w:p>
+        </w:tc>
+        <w:tc>
+          <w:tcPr>
+            <w:tcW w:w="1299" w:type="dxa"/>
+          </w:tcPr>
+          <w:p>
+            <w:r>
+              <w:t>Character face</w:t>
+            </w:r>
+          </w:p>
+        </w:tc>
+        <w:tc>
+          <w:tcPr>
+            <w:tcW w:w="1344" w:type="dxa"/>
+          </w:tcPr>
+          <w:p>
+            <w:r>
+              <w:t>Character flips horizontally depending on direction</w:t>
+            </w:r>
+          </w:p>
+        </w:tc>
+        <w:tc>
+          <w:tcPr>
+            <w:tcW w:w="1469" w:type="dxa"/>
+          </w:tcPr>
+          <w:p>
+            <w:r>
+              <w:t>Hit box error</w:t>
+            </w:r>
+          </w:p>
+        </w:tc>
+        <w:tc>
+          <w:tcPr>
+            <w:tcW w:w="4142" w:type="dxa"/>
+          </w:tcPr>
+          <w:p>
+            <w:r>
+              <w:t>Added</w:t>
+            </w:r>
+          </w:p>
+          <w:p>
+            <w:pPr>
+              <w:shd w:val="clear" w:color="auto" w:fill="1E1E1E"/>
+              <w:spacing w:after="0" w:line="285" w:lineRule="atLeast"/>
+              <w:rPr>
+                <w:rFonts w:ascii="Consolas" w:eastAsia="Times New Roman" w:hAnsi="Consolas" w:cs="Times New Roman"/>
+                <w:color w:val="D4D4D4"/>
+                <w:sz w:val="21"/>
+                <w:szCs w:val="21"/>
+                <w:lang w:eastAsia="en-NZ"/>
+              </w:rPr>
+            </w:pPr>
+          </w:p>
+          <w:p>
+            <w:pPr>
+              <w:shd w:val="clear" w:color="auto" w:fill="1E1E1E"/>
+              <w:spacing w:line="285" w:lineRule="atLeast"/>
+              <w:rPr>
+                <w:rFonts w:ascii="Consolas" w:eastAsia="Times New Roman" w:hAnsi="Consolas" w:cs="Times New Roman"/>
+                <w:color w:val="D4D4D4"/>
+                <w:sz w:val="21"/>
+                <w:szCs w:val="21"/>
+                <w:lang w:eastAsia="en-NZ"/>
+              </w:rPr>
+            </w:pPr>
+            <w:r>
+              <w:rPr>
+                <w:rFonts w:ascii="Consolas" w:eastAsia="Times New Roman" w:hAnsi="Consolas" w:cs="Times New Roman"/>
+                <w:color w:val="D4D4D4"/>
+                <w:sz w:val="21"/>
+                <w:szCs w:val="21"/>
+                <w:lang w:eastAsia="en-NZ"/>
+              </w:rPr>
+              <w:t xml:space="preserve">        </w:t>
+            </w:r>
+            <w:proofErr w:type="spellStart"/>
+            <w:proofErr w:type="gramStart"/>
+            <w:r>
+              <w:rPr>
+                <w:rFonts w:ascii="Consolas" w:eastAsia="Times New Roman" w:hAnsi="Consolas" w:cs="Times New Roman"/>
+                <w:color w:val="9CDCFE"/>
+                <w:sz w:val="21"/>
+                <w:szCs w:val="21"/>
+                <w:lang w:eastAsia="en-NZ"/>
+              </w:rPr>
+              <w:t>self</w:t>
+            </w:r>
+            <w:r>
+              <w:rPr>
+                <w:rFonts w:ascii="Consolas" w:eastAsia="Times New Roman" w:hAnsi="Consolas" w:cs="Times New Roman"/>
+                <w:color w:val="D4D4D4"/>
+                <w:sz w:val="21"/>
+                <w:szCs w:val="21"/>
+                <w:lang w:eastAsia="en-NZ"/>
+              </w:rPr>
+              <w:t>.</w:t>
+            </w:r>
+            <w:r>
+              <w:rPr>
+                <w:rFonts w:ascii="Consolas" w:eastAsia="Times New Roman" w:hAnsi="Consolas" w:cs="Times New Roman"/>
+                <w:color w:val="9CDCFE"/>
+                <w:sz w:val="21"/>
+                <w:szCs w:val="21"/>
+                <w:lang w:eastAsia="en-NZ"/>
+              </w:rPr>
+              <w:t>hitbox</w:t>
+            </w:r>
+            <w:proofErr w:type="gramEnd"/>
+            <w:r>
+              <w:rPr>
+                <w:rFonts w:ascii="Consolas" w:eastAsia="Times New Roman" w:hAnsi="Consolas" w:cs="Times New Roman"/>
+                <w:color w:val="9CDCFE"/>
+                <w:sz w:val="21"/>
+                <w:szCs w:val="21"/>
+                <w:lang w:eastAsia="en-NZ"/>
+              </w:rPr>
+              <w:t>_texture</w:t>
+            </w:r>
+            <w:proofErr w:type="spellEnd"/>
+            <w:r>
+              <w:rPr>
+                <w:rFonts w:ascii="Consolas" w:eastAsia="Times New Roman" w:hAnsi="Consolas" w:cs="Times New Roman"/>
+                <w:color w:val="D4D4D4"/>
+                <w:sz w:val="21"/>
+                <w:szCs w:val="21"/>
+                <w:lang w:eastAsia="en-NZ"/>
+              </w:rPr>
+              <w:t xml:space="preserve"> = </w:t>
+            </w:r>
+            <w:proofErr w:type="spellStart"/>
+            <w:r>
+              <w:rPr>
+                <w:rFonts w:ascii="Consolas" w:eastAsia="Times New Roman" w:hAnsi="Consolas" w:cs="Times New Roman"/>
+                <w:color w:val="9CDCFE"/>
+                <w:sz w:val="21"/>
+                <w:szCs w:val="21"/>
+                <w:lang w:eastAsia="en-NZ"/>
+              </w:rPr>
+              <w:t>self</w:t>
+            </w:r>
+            <w:r>
+              <w:rPr>
+                <w:rFonts w:ascii="Consolas" w:eastAsia="Times New Roman" w:hAnsi="Consolas" w:cs="Times New Roman"/>
+                <w:color w:val="D4D4D4"/>
+                <w:sz w:val="21"/>
+                <w:szCs w:val="21"/>
+                <w:lang w:eastAsia="en-NZ"/>
+              </w:rPr>
+              <w:t>.</w:t>
+            </w:r>
+            <w:r>
+              <w:rPr>
+                <w:rFonts w:ascii="Consolas" w:eastAsia="Times New Roman" w:hAnsi="Consolas" w:cs="Times New Roman"/>
+                <w:color w:val="9CDCFE"/>
+                <w:sz w:val="21"/>
+                <w:szCs w:val="21"/>
+                <w:lang w:eastAsia="en-NZ"/>
+              </w:rPr>
+              <w:t>idle_texture_pair</w:t>
+            </w:r>
+            <w:proofErr w:type="spellEnd"/>
+            <w:r>
+              <w:rPr>
+                <w:rFonts w:ascii="Consolas" w:eastAsia="Times New Roman" w:hAnsi="Consolas" w:cs="Times New Roman"/>
+                <w:color w:val="D4D4D4"/>
+                <w:sz w:val="21"/>
+                <w:szCs w:val="21"/>
+                <w:lang w:eastAsia="en-NZ"/>
+              </w:rPr>
+              <w:t>[</w:t>
+            </w:r>
+            <w:r>
+              <w:rPr>
+                <w:rFonts w:ascii="Consolas" w:eastAsia="Times New Roman" w:hAnsi="Consolas" w:cs="Times New Roman"/>
+                <w:color w:val="B5CEA8"/>
+                <w:sz w:val="21"/>
+                <w:szCs w:val="21"/>
+                <w:lang w:eastAsia="en-NZ"/>
+              </w:rPr>
+              <w:t>0</w:t>
+            </w:r>
+            <w:r>
+              <w:rPr>
+                <w:rFonts w:ascii="Consolas" w:eastAsia="Times New Roman" w:hAnsi="Consolas" w:cs="Times New Roman"/>
+                <w:color w:val="D4D4D4"/>
+                <w:sz w:val="21"/>
+                <w:szCs w:val="21"/>
+                <w:lang w:eastAsia="en-NZ"/>
+              </w:rPr>
+              <w:t>]</w:t>
+            </w:r>
+          </w:p>
+          <w:p>
+            <w:pPr>
+              <w:shd w:val="clear" w:color="auto" w:fill="1E1E1E"/>
+              <w:spacing w:line="285" w:lineRule="atLeast"/>
+              <w:rPr>
+                <w:rFonts w:ascii="Consolas" w:eastAsia="Times New Roman" w:hAnsi="Consolas" w:cs="Times New Roman"/>
+                <w:color w:val="D4D4D4"/>
+                <w:sz w:val="21"/>
+                <w:szCs w:val="21"/>
+                <w:lang w:eastAsia="en-NZ"/>
+              </w:rPr>
+            </w:pPr>
+            <w:r>
+              <w:rPr>
+                <w:rFonts w:ascii="Consolas" w:eastAsia="Times New Roman" w:hAnsi="Consolas" w:cs="Times New Roman"/>
+                <w:color w:val="D4D4D4"/>
+                <w:sz w:val="21"/>
+                <w:szCs w:val="21"/>
+                <w:lang w:eastAsia="en-NZ"/>
+              </w:rPr>
+              <w:t xml:space="preserve">        </w:t>
+            </w:r>
+            <w:proofErr w:type="spellStart"/>
+            <w:r>
+              <w:rPr>
+                <w:rFonts w:ascii="Consolas" w:eastAsia="Times New Roman" w:hAnsi="Consolas" w:cs="Times New Roman"/>
+                <w:color w:val="9CDCFE"/>
+                <w:sz w:val="21"/>
+                <w:szCs w:val="21"/>
+                <w:lang w:eastAsia="en-NZ"/>
+              </w:rPr>
+              <w:t>self</w:t>
+            </w:r>
+            <w:r>
+              <w:rPr>
+                <w:rFonts w:ascii="Consolas" w:eastAsia="Times New Roman" w:hAnsi="Consolas" w:cs="Times New Roman"/>
+                <w:color w:val="D4D4D4"/>
+                <w:sz w:val="21"/>
+                <w:szCs w:val="21"/>
+                <w:lang w:eastAsia="en-NZ"/>
+              </w:rPr>
+              <w:t>.</w:t>
+            </w:r>
+            <w:r>
+              <w:rPr>
+                <w:rFonts w:ascii="Consolas" w:eastAsia="Times New Roman" w:hAnsi="Consolas" w:cs="Times New Roman"/>
+                <w:color w:val="9CDCFE"/>
+                <w:sz w:val="21"/>
+                <w:szCs w:val="21"/>
+                <w:lang w:eastAsia="en-NZ"/>
+              </w:rPr>
+              <w:t>hit_box</w:t>
+            </w:r>
+            <w:proofErr w:type="spellEnd"/>
+            <w:r>
+              <w:rPr>
+                <w:rFonts w:ascii="Consolas" w:eastAsia="Times New Roman" w:hAnsi="Consolas" w:cs="Times New Roman"/>
+                <w:color w:val="D4D4D4"/>
+                <w:sz w:val="21"/>
+                <w:szCs w:val="21"/>
+                <w:lang w:eastAsia="en-NZ"/>
+              </w:rPr>
+              <w:t xml:space="preserve"> = </w:t>
+            </w:r>
+            <w:proofErr w:type="spellStart"/>
+            <w:r>
+              <w:rPr>
+                <w:rFonts w:ascii="Consolas" w:eastAsia="Times New Roman" w:hAnsi="Consolas" w:cs="Times New Roman"/>
+                <w:color w:val="9CDCFE"/>
+                <w:sz w:val="21"/>
+                <w:szCs w:val="21"/>
+                <w:lang w:eastAsia="en-NZ"/>
+              </w:rPr>
+              <w:t>self</w:t>
+            </w:r>
+            <w:r>
+              <w:rPr>
+                <w:rFonts w:ascii="Consolas" w:eastAsia="Times New Roman" w:hAnsi="Consolas" w:cs="Times New Roman"/>
+                <w:color w:val="D4D4D4"/>
+                <w:sz w:val="21"/>
+                <w:szCs w:val="21"/>
+                <w:lang w:eastAsia="en-NZ"/>
+              </w:rPr>
+              <w:t>.</w:t>
+            </w:r>
+            <w:r>
+              <w:rPr>
+                <w:rFonts w:ascii="Consolas" w:eastAsia="Times New Roman" w:hAnsi="Consolas" w:cs="Times New Roman"/>
+                <w:color w:val="9CDCFE"/>
+                <w:sz w:val="21"/>
+                <w:szCs w:val="21"/>
+                <w:lang w:eastAsia="en-NZ"/>
+              </w:rPr>
+              <w:t>hitbox_texture</w:t>
+            </w:r>
+            <w:r>
+              <w:rPr>
+                <w:rFonts w:ascii="Consolas" w:eastAsia="Times New Roman" w:hAnsi="Consolas" w:cs="Times New Roman"/>
+                <w:color w:val="D4D4D4"/>
+                <w:sz w:val="21"/>
+                <w:szCs w:val="21"/>
+                <w:lang w:eastAsia="en-NZ"/>
+              </w:rPr>
+              <w:t>.</w:t>
+            </w:r>
+            <w:r>
+              <w:rPr>
+                <w:rFonts w:ascii="Consolas" w:eastAsia="Times New Roman" w:hAnsi="Consolas" w:cs="Times New Roman"/>
+                <w:color w:val="9CDCFE"/>
+                <w:sz w:val="21"/>
+                <w:szCs w:val="21"/>
+                <w:lang w:eastAsia="en-NZ"/>
+              </w:rPr>
+              <w:t>hit_box_points</w:t>
+            </w:r>
+            <w:proofErr w:type="spellEnd"/>
+          </w:p>
           <w:p/>
         </w:tc>
       </w:tr>
       <w:tr>
         <w:tc>
           <w:tcPr>
-            <w:tcW w:w="846" w:type="dxa"/>
+            <w:tcW w:w="762" w:type="dxa"/>
+          </w:tcPr>
+          <w:p>
+            <w:r>
+              <w:t>18/03</w:t>
+            </w:r>
+          </w:p>
+        </w:tc>
+        <w:tc>
+          <w:tcPr>
+            <w:tcW w:w="1299" w:type="dxa"/>
+          </w:tcPr>
+          <w:p>
+            <w:r>
+              <w:t>Character face</w:t>
+            </w:r>
+          </w:p>
+        </w:tc>
+        <w:tc>
+          <w:tcPr>
+            <w:tcW w:w="1344" w:type="dxa"/>
+          </w:tcPr>
+          <w:p>
+            <w:r>
+              <w:t>Character flips horizontally depending on direction</w:t>
+            </w:r>
+          </w:p>
+        </w:tc>
+        <w:tc>
+          <w:tcPr>
+            <w:tcW w:w="1469" w:type="dxa"/>
+          </w:tcPr>
+          <w:p>
+            <w:r>
+              <w:t>Sprite does not appear</w:t>
+            </w:r>
+          </w:p>
+        </w:tc>
+        <w:tc>
+          <w:tcPr>
+            <w:tcW w:w="4142" w:type="dxa"/>
+          </w:tcPr>
+          <w:p>
+            <w:r>
+              <w:t>Returned the texture when the player changes direction</w:t>
+            </w:r>
+          </w:p>
+        </w:tc>
+      </w:tr>
+      <w:tr>
+        <w:tc>
+          <w:tcPr>
+            <w:tcW w:w="762" w:type="dxa"/>
+          </w:tcPr>
+          <w:p>
+            <w:r>
+              <w:t>18/03</w:t>
+            </w:r>
+          </w:p>
+        </w:tc>
+        <w:tc>
+          <w:tcPr>
+            <w:tcW w:w="1299" w:type="dxa"/>
+          </w:tcPr>
+          <w:p>
+            <w:r>
+              <w:t>Character face</w:t>
+            </w:r>
+          </w:p>
+        </w:tc>
+        <w:tc>
+          <w:tcPr>
+            <w:tcW w:w="1344" w:type="dxa"/>
+          </w:tcPr>
+          <w:p>
+            <w:r>
+              <w:t>Character flips horizontally depending on direction</w:t>
+            </w:r>
+          </w:p>
+        </w:tc>
+        <w:tc>
+          <w:tcPr>
+            <w:tcW w:w="1469" w:type="dxa"/>
           </w:tcPr>
           <w:p/>
         </w:tc>
         <w:tc>
           <w:tcPr>
-            <w:tcW w:w="2126" w:type="dxa"/>
-          </w:tcPr>
-          <w:p/>
-        </w:tc>
-        <w:tc>
-          <w:tcPr>
-            <w:tcW w:w="2437" w:type="dxa"/>
-          </w:tcPr>
-          <w:p/>
-        </w:tc>
-        <w:tc>
-          <w:tcPr>
-            <w:tcW w:w="1803" w:type="dxa"/>
-          </w:tcPr>
-          <w:p/>
-        </w:tc>
-        <w:tc>
-          <w:tcPr>
-            <w:tcW w:w="1804" w:type="dxa"/>
+            <w:tcW w:w="4142" w:type="dxa"/>
           </w:tcPr>
           <w:p/>
         </w:tc>

</xml_diff>

<commit_message>
Working on direction code
</commit_message>
<xml_diff>
--- a/documentation/ongoing_testing.docx
+++ b/documentation/ongoing_testing.docx
@@ -1,6 +1,6 @@
 
 <file path=word/document.xml><?xml version="1.0" encoding="utf-8"?>
-<w:document xmlns:wpc="http://schemas.microsoft.com/office/word/2010/wordprocessingCanvas" xmlns:cx="http://schemas.microsoft.com/office/drawing/2014/chartex" xmlns:cx1="http://schemas.microsoft.com/office/drawing/2015/9/8/chartex" xmlns:cx2="http://schemas.microsoft.com/office/drawing/2015/10/21/chartex" xmlns:cx3="http://schemas.microsoft.com/office/drawing/2016/5/9/chartex" xmlns:cx4="http://schemas.microsoft.com/office/drawing/2016/5/10/chartex" xmlns:cx5="http://schemas.microsoft.com/office/drawing/2016/5/11/chartex" xmlns:cx6="http://schemas.microsoft.com/office/drawing/2016/5/12/chartex" xmlns:cx7="http://schemas.microsoft.com/office/drawing/2016/5/13/chartex" xmlns:cx8="http://schemas.microsoft.com/office/drawing/2016/5/14/chartex" xmlns:mc="http://schemas.openxmlformats.org/markup-compatibility/2006" xmlns:aink="http://schemas.microsoft.com/office/drawing/2016/ink" xmlns:am3d="http://schemas.microsoft.com/office/drawing/2017/model3d" xmlns:o="urn:schemas-microsoft-com:office:office" xmlns:oel="http://schemas.microsoft.com/office/2019/extlst" xmlns:r="http://schemas.openxmlformats.org/officeDocument/2006/relationships" xmlns:m="http://schemas.openxmlformats.org/officeDocument/2006/math" xmlns:v="urn:schemas-microsoft-com:vml" xmlns:wp14="http://schemas.microsoft.com/office/word/2010/wordprocessingDrawing" xmlns:wp="http://schemas.openxmlformats.org/drawingml/2006/wordprocessingDrawing" xmlns:w10="urn:schemas-microsoft-com:office:word" xmlns:w="http://schemas.openxmlformats.org/wordprocessingml/2006/main" xmlns:w14="http://schemas.microsoft.com/office/word/2010/wordml" xmlns:w15="http://schemas.microsoft.com/office/word/2012/wordml" xmlns:w16cex="http://schemas.microsoft.com/office/word/2018/wordml/cex" xmlns:w16cid="http://schemas.microsoft.com/office/word/2016/wordml/cid" xmlns:w16="http://schemas.microsoft.com/office/word/2018/wordml" xmlns:w16sdtdh="http://schemas.microsoft.com/office/word/2020/wordml/sdtdatahash" xmlns:w16se="http://schemas.microsoft.com/office/word/2015/wordml/symex" xmlns:wpg="http://schemas.microsoft.com/office/word/2010/wordprocessingGroup" xmlns:wpi="http://schemas.microsoft.com/office/word/2010/wordprocessingInk" xmlns:wne="http://schemas.microsoft.com/office/word/2006/wordml" xmlns:wps="http://schemas.microsoft.com/office/word/2010/wordprocessingShape" mc:Ignorable="w14 w15 w16se w16cid w16 w16cex w16sdtdh wp14">
+<w:document xmlns:wpc="http://schemas.microsoft.com/office/word/2010/wordprocessingCanvas" xmlns:cx="http://schemas.microsoft.com/office/drawing/2014/chartex" xmlns:cx1="http://schemas.microsoft.com/office/drawing/2015/9/8/chartex" xmlns:cx2="http://schemas.microsoft.com/office/drawing/2015/10/21/chartex" xmlns:cx3="http://schemas.microsoft.com/office/drawing/2016/5/9/chartex" xmlns:cx4="http://schemas.microsoft.com/office/drawing/2016/5/10/chartex" xmlns:cx5="http://schemas.microsoft.com/office/drawing/2016/5/11/chartex" xmlns:cx6="http://schemas.microsoft.com/office/drawing/2016/5/12/chartex" xmlns:cx7="http://schemas.microsoft.com/office/drawing/2016/5/13/chartex" xmlns:cx8="http://schemas.microsoft.com/office/drawing/2016/5/14/chartex" xmlns:mc="http://schemas.openxmlformats.org/markup-compatibility/2006" xmlns:aink="http://schemas.microsoft.com/office/drawing/2016/ink" xmlns:am3d="http://schemas.microsoft.com/office/drawing/2017/model3d" xmlns:o="urn:schemas-microsoft-com:office:office" xmlns:oel="http://schemas.microsoft.com/office/2019/extlst" xmlns:r="http://schemas.openxmlformats.org/officeDocument/2006/relationships" xmlns:m="http://schemas.openxmlformats.org/officeDocument/2006/math" xmlns:v="urn:schemas-microsoft-com:vml" xmlns:wp14="http://schemas.microsoft.com/office/word/2010/wordprocessingDrawing" xmlns:wp="http://schemas.openxmlformats.org/drawingml/2006/wordprocessingDrawing" xmlns:w10="urn:schemas-microsoft-com:office:word" xmlns:w="http://schemas.openxmlformats.org/wordprocessingml/2006/main" xmlns:w14="http://schemas.microsoft.com/office/word/2010/wordml" xmlns:w15="http://schemas.microsoft.com/office/word/2012/wordml" xmlns:w16cex="http://schemas.microsoft.com/office/word/2018/wordml/cex" xmlns:w16cid="http://schemas.microsoft.com/office/word/2016/wordml/cid" xmlns:w16="http://schemas.microsoft.com/office/word/2018/wordml" xmlns:w16du="http://schemas.microsoft.com/office/word/2023/wordml/word16du" xmlns:w16sdtdh="http://schemas.microsoft.com/office/word/2020/wordml/sdtdatahash" xmlns:w16se="http://schemas.microsoft.com/office/word/2015/wordml/symex" xmlns:wpg="http://schemas.microsoft.com/office/word/2010/wordprocessingGroup" xmlns:wpi="http://schemas.microsoft.com/office/word/2010/wordprocessingInk" xmlns:wne="http://schemas.microsoft.com/office/word/2006/wordml" xmlns:wps="http://schemas.microsoft.com/office/word/2010/wordprocessingShape" mc:Ignorable="w14 w15 w16se w16cid w16 w16cex w16sdtdh w16du wp14">
   <w:body>
     <w:tbl>
       <w:tblPr>
@@ -104,7 +104,15 @@
           </w:tcPr>
           <w:p>
             <w:r>
-              <w:t>Vs code complains about vstd compression</w:t>
+              <w:t xml:space="preserve">Vs code complains about </w:t>
+            </w:r>
+            <w:proofErr w:type="spellStart"/>
+            <w:r>
+              <w:t>vstd</w:t>
+            </w:r>
+            <w:proofErr w:type="spellEnd"/>
+            <w:r>
+              <w:t xml:space="preserve"> compression</w:t>
             </w:r>
           </w:p>
         </w:tc>
@@ -114,8 +122,13 @@
           </w:tcPr>
           <w:p>
             <w:r>
-              <w:t>Changed compression type to zlib</w:t>
-            </w:r>
+              <w:t xml:space="preserve">Changed compression type to </w:t>
+            </w:r>
+            <w:proofErr w:type="spellStart"/>
+            <w:r>
+              <w:t>zlib</w:t>
+            </w:r>
+            <w:proofErr w:type="spellEnd"/>
           </w:p>
         </w:tc>
       </w:tr>
@@ -340,6 +353,7 @@
                 <w:lang w:eastAsia="en-NZ"/>
               </w:rPr>
             </w:pPr>
+            <w:proofErr w:type="spellStart"/>
             <w:r>
               <w:rPr>
                 <w:rFonts w:ascii="Consolas" w:eastAsia="Times New Roman" w:hAnsi="Consolas" w:cs="Times New Roman"/>
@@ -370,6 +384,7 @@
               </w:rPr>
               <w:t>hit_box</w:t>
             </w:r>
+            <w:proofErr w:type="spellEnd"/>
             <w:r>
               <w:rPr>
                 <w:rFonts w:ascii="Consolas" w:eastAsia="Times New Roman" w:hAnsi="Consolas" w:cs="Times New Roman"/>
@@ -380,6 +395,7 @@
               </w:rPr>
               <w:t xml:space="preserve"> = </w:t>
             </w:r>
+            <w:proofErr w:type="spellStart"/>
             <w:r>
               <w:rPr>
                 <w:rFonts w:ascii="Consolas" w:eastAsia="Times New Roman" w:hAnsi="Consolas" w:cs="Times New Roman"/>
@@ -420,6 +436,7 @@
               </w:rPr>
               <w:t>.hit_box_points</w:t>
             </w:r>
+            <w:proofErr w:type="spellEnd"/>
           </w:p>
           <w:p/>
         </w:tc>
@@ -473,19 +490,6 @@
             <w:r>
               <w:t>Added</w:t>
             </w:r>
-          </w:p>
-          <w:p>
-            <w:pPr>
-              <w:shd w:val="clear" w:color="auto" w:fill="1E1E1E"/>
-              <w:spacing w:after="0" w:line="285" w:lineRule="atLeast"/>
-              <w:rPr>
-                <w:rFonts w:ascii="Consolas" w:eastAsia="Times New Roman" w:hAnsi="Consolas" w:cs="Times New Roman"/>
-                <w:color w:val="D4D4D4"/>
-                <w:sz w:val="21"/>
-                <w:szCs w:val="21"/>
-                <w:lang w:eastAsia="en-NZ"/>
-              </w:rPr>
-            </w:pPr>
           </w:p>
           <w:p>
             <w:pPr>
@@ -499,116 +503,6 @@
                 <w:lang w:eastAsia="en-NZ"/>
               </w:rPr>
             </w:pPr>
-            <w:r>
-              <w:rPr>
-                <w:rFonts w:ascii="Consolas" w:eastAsia="Times New Roman" w:hAnsi="Consolas" w:cs="Times New Roman"/>
-                <w:color w:val="D4D4D4"/>
-                <w:sz w:val="21"/>
-                <w:szCs w:val="21"/>
-                <w:lang w:eastAsia="en-NZ"/>
-              </w:rPr>
-              <w:t xml:space="preserve">        </w:t>
-            </w:r>
-            <w:r>
-              <w:rPr>
-                <w:rFonts w:ascii="Consolas" w:eastAsia="Times New Roman" w:hAnsi="Consolas" w:cs="Times New Roman"/>
-                <w:color w:val="9CDCFE"/>
-                <w:sz w:val="21"/>
-                <w:szCs w:val="21"/>
-                <w:lang w:eastAsia="en-NZ"/>
-              </w:rPr>
-              <w:t>self</w:t>
-            </w:r>
-            <w:r>
-              <w:rPr>
-                <w:rFonts w:ascii="Consolas" w:eastAsia="Times New Roman" w:hAnsi="Consolas" w:cs="Times New Roman"/>
-                <w:color w:val="D4D4D4"/>
-                <w:sz w:val="21"/>
-                <w:szCs w:val="21"/>
-                <w:lang w:eastAsia="en-NZ"/>
-              </w:rPr>
-              <w:t>.</w:t>
-            </w:r>
-            <w:r>
-              <w:rPr>
-                <w:rFonts w:ascii="Consolas" w:eastAsia="Times New Roman" w:hAnsi="Consolas" w:cs="Times New Roman"/>
-                <w:color w:val="9CDCFE"/>
-                <w:sz w:val="21"/>
-                <w:szCs w:val="21"/>
-                <w:lang w:eastAsia="en-NZ"/>
-              </w:rPr>
-              <w:t>hitbox_texture</w:t>
-            </w:r>
-            <w:r>
-              <w:rPr>
-                <w:rFonts w:ascii="Consolas" w:eastAsia="Times New Roman" w:hAnsi="Consolas" w:cs="Times New Roman"/>
-                <w:color w:val="D4D4D4"/>
-                <w:sz w:val="21"/>
-                <w:szCs w:val="21"/>
-                <w:lang w:eastAsia="en-NZ"/>
-              </w:rPr>
-              <w:t xml:space="preserve"> = </w:t>
-            </w:r>
-            <w:r>
-              <w:rPr>
-                <w:rFonts w:ascii="Consolas" w:eastAsia="Times New Roman" w:hAnsi="Consolas" w:cs="Times New Roman"/>
-                <w:color w:val="9CDCFE"/>
-                <w:sz w:val="21"/>
-                <w:szCs w:val="21"/>
-                <w:lang w:eastAsia="en-NZ"/>
-              </w:rPr>
-              <w:t>self</w:t>
-            </w:r>
-            <w:r>
-              <w:rPr>
-                <w:rFonts w:ascii="Consolas" w:eastAsia="Times New Roman" w:hAnsi="Consolas" w:cs="Times New Roman"/>
-                <w:color w:val="D4D4D4"/>
-                <w:sz w:val="21"/>
-                <w:szCs w:val="21"/>
-                <w:lang w:eastAsia="en-NZ"/>
-              </w:rPr>
-              <w:t>.</w:t>
-            </w:r>
-            <w:r>
-              <w:rPr>
-                <w:rFonts w:ascii="Consolas" w:eastAsia="Times New Roman" w:hAnsi="Consolas" w:cs="Times New Roman"/>
-                <w:color w:val="9CDCFE"/>
-                <w:sz w:val="21"/>
-                <w:szCs w:val="21"/>
-                <w:lang w:eastAsia="en-NZ"/>
-              </w:rPr>
-              <w:t>idle_texture_pair</w:t>
-            </w:r>
-            <w:r>
-              <w:rPr>
-                <w:rFonts w:ascii="Consolas" w:eastAsia="Times New Roman" w:hAnsi="Consolas" w:cs="Times New Roman"/>
-                <w:color w:val="D4D4D4"/>
-                <w:sz w:val="21"/>
-                <w:szCs w:val="21"/>
-                <w:lang w:eastAsia="en-NZ"/>
-              </w:rPr>
-              <w:t>[</w:t>
-            </w:r>
-            <w:r>
-              <w:rPr>
-                <w:rFonts w:ascii="Consolas" w:eastAsia="Times New Roman" w:hAnsi="Consolas" w:cs="Times New Roman"/>
-                <w:color w:val="B5CEA8"/>
-                <w:sz w:val="21"/>
-                <w:szCs w:val="21"/>
-                <w:lang w:eastAsia="en-NZ"/>
-              </w:rPr>
-              <w:t>0</w:t>
-            </w:r>
-            <w:r>
-              <w:rPr>
-                <w:rFonts w:ascii="Consolas" w:eastAsia="Times New Roman" w:hAnsi="Consolas" w:cs="Times New Roman"/>
-                <w:color w:val="D4D4D4"/>
-                <w:sz w:val="21"/>
-                <w:szCs w:val="21"/>
-                <w:lang w:eastAsia="en-NZ"/>
-              </w:rPr>
-              <w:t>]</w:t>
-            </w:r>
           </w:p>
           <w:p>
             <w:pPr>
@@ -632,6 +526,7 @@
               </w:rPr>
               <w:t xml:space="preserve">        </w:t>
             </w:r>
+            <w:proofErr w:type="spellStart"/>
             <w:r>
               <w:rPr>
                 <w:rFonts w:ascii="Consolas" w:eastAsia="Times New Roman" w:hAnsi="Consolas" w:cs="Times New Roman"/>
@@ -660,8 +555,136 @@
                 <w:szCs w:val="21"/>
                 <w:lang w:eastAsia="en-NZ"/>
               </w:rPr>
+              <w:t>hitbox_texture</w:t>
+            </w:r>
+            <w:proofErr w:type="spellEnd"/>
+            <w:r>
+              <w:rPr>
+                <w:rFonts w:ascii="Consolas" w:eastAsia="Times New Roman" w:hAnsi="Consolas" w:cs="Times New Roman"/>
+                <w:color w:val="D4D4D4"/>
+                <w:sz w:val="21"/>
+                <w:szCs w:val="21"/>
+                <w:lang w:eastAsia="en-NZ"/>
+              </w:rPr>
+              <w:t xml:space="preserve"> = </w:t>
+            </w:r>
+            <w:proofErr w:type="spellStart"/>
+            <w:r>
+              <w:rPr>
+                <w:rFonts w:ascii="Consolas" w:eastAsia="Times New Roman" w:hAnsi="Consolas" w:cs="Times New Roman"/>
+                <w:color w:val="9CDCFE"/>
+                <w:sz w:val="21"/>
+                <w:szCs w:val="21"/>
+                <w:lang w:eastAsia="en-NZ"/>
+              </w:rPr>
+              <w:t>self</w:t>
+            </w:r>
+            <w:r>
+              <w:rPr>
+                <w:rFonts w:ascii="Consolas" w:eastAsia="Times New Roman" w:hAnsi="Consolas" w:cs="Times New Roman"/>
+                <w:color w:val="D4D4D4"/>
+                <w:sz w:val="21"/>
+                <w:szCs w:val="21"/>
+                <w:lang w:eastAsia="en-NZ"/>
+              </w:rPr>
+              <w:t>.</w:t>
+            </w:r>
+            <w:r>
+              <w:rPr>
+                <w:rFonts w:ascii="Consolas" w:eastAsia="Times New Roman" w:hAnsi="Consolas" w:cs="Times New Roman"/>
+                <w:color w:val="9CDCFE"/>
+                <w:sz w:val="21"/>
+                <w:szCs w:val="21"/>
+                <w:lang w:eastAsia="en-NZ"/>
+              </w:rPr>
+              <w:t>idle_texture_pair</w:t>
+            </w:r>
+            <w:proofErr w:type="spellEnd"/>
+            <w:r>
+              <w:rPr>
+                <w:rFonts w:ascii="Consolas" w:eastAsia="Times New Roman" w:hAnsi="Consolas" w:cs="Times New Roman"/>
+                <w:color w:val="D4D4D4"/>
+                <w:sz w:val="21"/>
+                <w:szCs w:val="21"/>
+                <w:lang w:eastAsia="en-NZ"/>
+              </w:rPr>
+              <w:t>[</w:t>
+            </w:r>
+            <w:r>
+              <w:rPr>
+                <w:rFonts w:ascii="Consolas" w:eastAsia="Times New Roman" w:hAnsi="Consolas" w:cs="Times New Roman"/>
+                <w:color w:val="B5CEA8"/>
+                <w:sz w:val="21"/>
+                <w:szCs w:val="21"/>
+                <w:lang w:eastAsia="en-NZ"/>
+              </w:rPr>
+              <w:t>0</w:t>
+            </w:r>
+            <w:r>
+              <w:rPr>
+                <w:rFonts w:ascii="Consolas" w:eastAsia="Times New Roman" w:hAnsi="Consolas" w:cs="Times New Roman"/>
+                <w:color w:val="D4D4D4"/>
+                <w:sz w:val="21"/>
+                <w:szCs w:val="21"/>
+                <w:lang w:eastAsia="en-NZ"/>
+              </w:rPr>
+              <w:t>]</w:t>
+            </w:r>
+          </w:p>
+          <w:p>
+            <w:pPr>
+              <w:shd w:val="clear" w:color="auto" w:fill="1E1E1E"/>
+              <w:spacing w:line="285" w:lineRule="atLeast"/>
+              <w:rPr>
+                <w:rFonts w:ascii="Consolas" w:eastAsia="Times New Roman" w:hAnsi="Consolas" w:cs="Times New Roman"/>
+                <w:color w:val="D4D4D4"/>
+                <w:sz w:val="21"/>
+                <w:szCs w:val="21"/>
+                <w:lang w:eastAsia="en-NZ"/>
+              </w:rPr>
+            </w:pPr>
+            <w:r>
+              <w:rPr>
+                <w:rFonts w:ascii="Consolas" w:eastAsia="Times New Roman" w:hAnsi="Consolas" w:cs="Times New Roman"/>
+                <w:color w:val="D4D4D4"/>
+                <w:sz w:val="21"/>
+                <w:szCs w:val="21"/>
+                <w:lang w:eastAsia="en-NZ"/>
+              </w:rPr>
+              <w:t xml:space="preserve">        </w:t>
+            </w:r>
+            <w:proofErr w:type="spellStart"/>
+            <w:r>
+              <w:rPr>
+                <w:rFonts w:ascii="Consolas" w:eastAsia="Times New Roman" w:hAnsi="Consolas" w:cs="Times New Roman"/>
+                <w:color w:val="9CDCFE"/>
+                <w:sz w:val="21"/>
+                <w:szCs w:val="21"/>
+                <w:lang w:eastAsia="en-NZ"/>
+              </w:rPr>
+              <w:t>self</w:t>
+            </w:r>
+            <w:r>
+              <w:rPr>
+                <w:rFonts w:ascii="Consolas" w:eastAsia="Times New Roman" w:hAnsi="Consolas" w:cs="Times New Roman"/>
+                <w:color w:val="D4D4D4"/>
+                <w:sz w:val="21"/>
+                <w:szCs w:val="21"/>
+                <w:lang w:eastAsia="en-NZ"/>
+              </w:rPr>
+              <w:t>.</w:t>
+            </w:r>
+            <w:r>
+              <w:rPr>
+                <w:rFonts w:ascii="Consolas" w:eastAsia="Times New Roman" w:hAnsi="Consolas" w:cs="Times New Roman"/>
+                <w:color w:val="9CDCFE"/>
+                <w:sz w:val="21"/>
+                <w:szCs w:val="21"/>
+                <w:lang w:eastAsia="en-NZ"/>
+              </w:rPr>
               <w:t>hit_box</w:t>
             </w:r>
+            <w:proofErr w:type="spellEnd"/>
             <w:r>
               <w:rPr>
                 <w:rFonts w:ascii="Consolas" w:eastAsia="Times New Roman" w:hAnsi="Consolas" w:cs="Times New Roman"/>
@@ -672,6 +695,7 @@
               </w:rPr>
               <w:t xml:space="preserve"> = </w:t>
             </w:r>
+            <w:proofErr w:type="spellStart"/>
             <w:r>
               <w:rPr>
                 <w:rFonts w:ascii="Consolas" w:eastAsia="Times New Roman" w:hAnsi="Consolas" w:cs="Times New Roman"/>
@@ -722,6 +746,7 @@
               </w:rPr>
               <w:t>hit_box_points</w:t>
             </w:r>
+            <w:proofErr w:type="spellEnd"/>
           </w:p>
           <w:p/>
         </w:tc>
@@ -816,6 +841,67 @@
           <w:p>
             <w:r>
               <w:t>Sprite does not appear</w:t>
+            </w:r>
+          </w:p>
+        </w:tc>
+        <w:tc>
+          <w:tcPr>
+            <w:tcW w:w="4142" w:type="dxa"/>
+          </w:tcPr>
+          <w:p>
+            <w:r>
+              <w:t>Fixed hitbox code</w:t>
+            </w:r>
+          </w:p>
+        </w:tc>
+      </w:tr>
+      <w:tr>
+        <w:tc>
+          <w:tcPr>
+            <w:tcW w:w="762" w:type="dxa"/>
+          </w:tcPr>
+          <w:p>
+            <w:r>
+              <w:t>18/03</w:t>
+            </w:r>
+          </w:p>
+        </w:tc>
+        <w:tc>
+          <w:tcPr>
+            <w:tcW w:w="1299" w:type="dxa"/>
+          </w:tcPr>
+          <w:p>
+            <w:r>
+              <w:t>Character face</w:t>
+            </w:r>
+          </w:p>
+        </w:tc>
+        <w:tc>
+          <w:tcPr>
+            <w:tcW w:w="1344" w:type="dxa"/>
+          </w:tcPr>
+          <w:p>
+            <w:r>
+              <w:t xml:space="preserve">Character flips horizontally </w:t>
+            </w:r>
+            <w:r>
+              <w:lastRenderedPageBreak/>
+              <w:t>depending on direction</w:t>
+            </w:r>
+          </w:p>
+        </w:tc>
+        <w:tc>
+          <w:tcPr>
+            <w:tcW w:w="1469" w:type="dxa"/>
+          </w:tcPr>
+          <w:p>
+            <w:r>
+              <w:lastRenderedPageBreak/>
+              <w:t xml:space="preserve">Character model does </w:t>
+            </w:r>
+            <w:r>
+              <w:lastRenderedPageBreak/>
+              <w:t xml:space="preserve">not change direction </w:t>
             </w:r>
           </w:p>
         </w:tc>
@@ -839,7 +925,7 @@
 </file>
 
 <file path=word/styles.xml><?xml version="1.0" encoding="utf-8"?>
-<w:styles xmlns:mc="http://schemas.openxmlformats.org/markup-compatibility/2006" xmlns:r="http://schemas.openxmlformats.org/officeDocument/2006/relationships" xmlns:w="http://schemas.openxmlformats.org/wordprocessingml/2006/main" xmlns:w14="http://schemas.microsoft.com/office/word/2010/wordml" xmlns:w15="http://schemas.microsoft.com/office/word/2012/wordml" xmlns:w16cex="http://schemas.microsoft.com/office/word/2018/wordml/cex" xmlns:w16cid="http://schemas.microsoft.com/office/word/2016/wordml/cid" xmlns:w16="http://schemas.microsoft.com/office/word/2018/wordml" xmlns:w16sdtdh="http://schemas.microsoft.com/office/word/2020/wordml/sdtdatahash" xmlns:w16se="http://schemas.microsoft.com/office/word/2015/wordml/symex" mc:Ignorable="w14 w15 w16se w16cid w16 w16cex w16sdtdh">
+<w:styles xmlns:mc="http://schemas.openxmlformats.org/markup-compatibility/2006" xmlns:r="http://schemas.openxmlformats.org/officeDocument/2006/relationships" xmlns:w="http://schemas.openxmlformats.org/wordprocessingml/2006/main" xmlns:w14="http://schemas.microsoft.com/office/word/2010/wordml" xmlns:w15="http://schemas.microsoft.com/office/word/2012/wordml" xmlns:w16cex="http://schemas.microsoft.com/office/word/2018/wordml/cex" xmlns:w16cid="http://schemas.microsoft.com/office/word/2016/wordml/cid" xmlns:w16="http://schemas.microsoft.com/office/word/2018/wordml" xmlns:w16du="http://schemas.microsoft.com/office/word/2023/wordml/word16du" xmlns:w16sdtdh="http://schemas.microsoft.com/office/word/2020/wordml/sdtdatahash" xmlns:w16se="http://schemas.microsoft.com/office/word/2015/wordml/symex" mc:Ignorable="w14 w15 w16se w16cid w16 w16cex w16sdtdh w16du">
   <w:docDefaults>
     <w:rPrDefault>
       <w:rPr>

</xml_diff>

<commit_message>
Worked on animations while falling couldn't get them to work
</commit_message>
<xml_diff>
--- a/documentation/ongoing_testing.docx
+++ b/documentation/ongoing_testing.docx
@@ -9,11 +9,11 @@
         <w:tblLook w:val="04A0" w:firstRow="1" w:lastRow="0" w:firstColumn="1" w:lastColumn="0" w:noHBand="0" w:noVBand="1"/>
       </w:tblPr>
       <w:tblGrid>
-        <w:gridCol w:w="762"/>
-        <w:gridCol w:w="1299"/>
-        <w:gridCol w:w="1344"/>
-        <w:gridCol w:w="1469"/>
-        <w:gridCol w:w="4142"/>
+        <w:gridCol w:w="650"/>
+        <w:gridCol w:w="1066"/>
+        <w:gridCol w:w="1099"/>
+        <w:gridCol w:w="1208"/>
+        <w:gridCol w:w="4993"/>
       </w:tblGrid>
       <w:tr>
         <w:tc>
@@ -527,6 +527,7 @@
               <w:t xml:space="preserve">        </w:t>
             </w:r>
             <w:proofErr w:type="spellStart"/>
+            <w:proofErr w:type="gramStart"/>
             <w:r>
               <w:rPr>
                 <w:rFonts w:ascii="Consolas" w:eastAsia="Times New Roman" w:hAnsi="Consolas" w:cs="Times New Roman"/>
@@ -555,7 +556,18 @@
                 <w:szCs w:val="21"/>
                 <w:lang w:eastAsia="en-NZ"/>
               </w:rPr>
-              <w:t>hitbox_texture</w:t>
+              <w:t>hitbox</w:t>
+            </w:r>
+            <w:proofErr w:type="gramEnd"/>
+            <w:r>
+              <w:rPr>
+                <w:rFonts w:ascii="Consolas" w:eastAsia="Times New Roman" w:hAnsi="Consolas" w:cs="Times New Roman"/>
+                <w:color w:val="9CDCFE"/>
+                <w:sz w:val="21"/>
+                <w:szCs w:val="21"/>
+                <w:lang w:eastAsia="en-NZ"/>
+              </w:rPr>
+              <w:t>_texture</w:t>
             </w:r>
             <w:proofErr w:type="spellEnd"/>
             <w:r>
@@ -778,7 +790,11 @@
           </w:tcPr>
           <w:p>
             <w:r>
-              <w:t>Character flips horizontally depending on direction</w:t>
+              <w:t xml:space="preserve">Character flips horizontally </w:t>
+            </w:r>
+            <w:r>
+              <w:lastRenderedPageBreak/>
+              <w:t>depending on direction</w:t>
             </w:r>
           </w:p>
         </w:tc>
@@ -788,6 +804,7 @@
           </w:tcPr>
           <w:p>
             <w:r>
+              <w:lastRenderedPageBreak/>
               <w:t>Sprite does not appear</w:t>
             </w:r>
           </w:p>
@@ -882,11 +899,7 @@
           </w:tcPr>
           <w:p>
             <w:r>
-              <w:t xml:space="preserve">Character flips horizontally </w:t>
-            </w:r>
-            <w:r>
-              <w:lastRenderedPageBreak/>
-              <w:t>depending on direction</w:t>
+              <w:t>Character flips horizontally depending on direction</w:t>
             </w:r>
           </w:p>
         </w:tc>
@@ -896,12 +909,7 @@
           </w:tcPr>
           <w:p>
             <w:r>
-              <w:lastRenderedPageBreak/>
-              <w:t xml:space="preserve">Character model does </w:t>
-            </w:r>
-            <w:r>
-              <w:lastRenderedPageBreak/>
-              <w:t xml:space="preserve">not change direction </w:t>
+              <w:t xml:space="preserve">Character model does not change direction </w:t>
             </w:r>
           </w:p>
         </w:tc>
@@ -909,7 +917,781 @@
           <w:tcPr>
             <w:tcW w:w="4142" w:type="dxa"/>
           </w:tcPr>
+          <w:p>
+            <w:r>
+              <w:t xml:space="preserve">Called function in </w:t>
+            </w:r>
+            <w:proofErr w:type="spellStart"/>
+            <w:r>
+              <w:t>on_update</w:t>
+            </w:r>
+            <w:proofErr w:type="spellEnd"/>
+            <w:r>
+              <w:t xml:space="preserve"> function</w:t>
+            </w:r>
+          </w:p>
+        </w:tc>
+      </w:tr>
+      <w:tr>
+        <w:tc>
+          <w:tcPr>
+            <w:tcW w:w="762" w:type="dxa"/>
+          </w:tcPr>
+          <w:p>
+            <w:r>
+              <w:t>18/03</w:t>
+            </w:r>
+          </w:p>
+        </w:tc>
+        <w:tc>
+          <w:tcPr>
+            <w:tcW w:w="1299" w:type="dxa"/>
+          </w:tcPr>
+          <w:p>
+            <w:r>
+              <w:t>Character face direction</w:t>
+            </w:r>
+          </w:p>
+        </w:tc>
+        <w:tc>
+          <w:tcPr>
+            <w:tcW w:w="1344" w:type="dxa"/>
+          </w:tcPr>
+          <w:p>
+            <w:r>
+              <w:t>Character flips horizontally depending on direction</w:t>
+            </w:r>
+          </w:p>
+        </w:tc>
+        <w:tc>
+          <w:tcPr>
+            <w:tcW w:w="1469" w:type="dxa"/>
+          </w:tcPr>
+          <w:p>
+            <w:r>
+              <w:t>Character model changes direction</w:t>
+            </w:r>
+          </w:p>
+        </w:tc>
+        <w:tc>
+          <w:tcPr>
+            <w:tcW w:w="4142" w:type="dxa"/>
+          </w:tcPr>
+          <w:p>
+            <w:r>
+              <w:t>None</w:t>
+            </w:r>
+          </w:p>
           <w:p/>
+        </w:tc>
+      </w:tr>
+      <w:tr>
+        <w:tc>
+          <w:tcPr>
+            <w:tcW w:w="762" w:type="dxa"/>
+          </w:tcPr>
+          <w:p>
+            <w:r>
+              <w:t>18/04</w:t>
+            </w:r>
+          </w:p>
+        </w:tc>
+        <w:tc>
+          <w:tcPr>
+            <w:tcW w:w="1299" w:type="dxa"/>
+          </w:tcPr>
+          <w:p>
+            <w:r>
+              <w:t>Falling animation</w:t>
+            </w:r>
+          </w:p>
+        </w:tc>
+        <w:tc>
+          <w:tcPr>
+            <w:tcW w:w="1344" w:type="dxa"/>
+          </w:tcPr>
+          <w:p>
+            <w:r>
+              <w:t>One cycle of the animation is run</w:t>
+            </w:r>
+          </w:p>
+        </w:tc>
+        <w:tc>
+          <w:tcPr>
+            <w:tcW w:w="1469" w:type="dxa"/>
+          </w:tcPr>
+          <w:p>
+            <w:r>
+              <w:t>Only one change in texture instead of two</w:t>
+            </w:r>
+          </w:p>
+        </w:tc>
+        <w:tc>
+          <w:tcPr>
+            <w:tcW w:w="4142" w:type="dxa"/>
+          </w:tcPr>
+          <w:p>
+            <w:pPr>
+              <w:shd w:val="clear" w:color="auto" w:fill="1F1F1F"/>
+              <w:spacing w:after="0" w:line="285" w:lineRule="atLeast"/>
+              <w:rPr>
+                <w:rFonts w:ascii="Consolas" w:eastAsia="Times New Roman" w:hAnsi="Consolas" w:cs="Times New Roman"/>
+                <w:color w:val="CCCCCC"/>
+                <w:sz w:val="21"/>
+                <w:szCs w:val="21"/>
+                <w:lang w:eastAsia="en-NZ"/>
+              </w:rPr>
+            </w:pPr>
+            <w:r>
+              <w:rPr>
+                <w:rFonts w:ascii="Consolas" w:eastAsia="Times New Roman" w:hAnsi="Consolas" w:cs="Times New Roman"/>
+                <w:color w:val="C586C0"/>
+                <w:sz w:val="21"/>
+                <w:szCs w:val="21"/>
+                <w:lang w:eastAsia="en-NZ"/>
+              </w:rPr>
+              <w:t>if</w:t>
+            </w:r>
+            <w:r>
+              <w:rPr>
+                <w:rFonts w:ascii="Consolas" w:eastAsia="Times New Roman" w:hAnsi="Consolas" w:cs="Times New Roman"/>
+                <w:color w:val="CCCCCC"/>
+                <w:sz w:val="21"/>
+                <w:szCs w:val="21"/>
+                <w:lang w:eastAsia="en-NZ"/>
+              </w:rPr>
+              <w:t xml:space="preserve"> </w:t>
+            </w:r>
+            <w:proofErr w:type="spellStart"/>
+            <w:proofErr w:type="gramStart"/>
+            <w:r>
+              <w:rPr>
+                <w:rFonts w:ascii="Consolas" w:eastAsia="Times New Roman" w:hAnsi="Consolas" w:cs="Times New Roman"/>
+                <w:color w:val="9CDCFE"/>
+                <w:sz w:val="21"/>
+                <w:szCs w:val="21"/>
+                <w:lang w:eastAsia="en-NZ"/>
+              </w:rPr>
+              <w:t>self</w:t>
+            </w:r>
+            <w:r>
+              <w:rPr>
+                <w:rFonts w:ascii="Consolas" w:eastAsia="Times New Roman" w:hAnsi="Consolas" w:cs="Times New Roman"/>
+                <w:color w:val="CCCCCC"/>
+                <w:sz w:val="21"/>
+                <w:szCs w:val="21"/>
+                <w:lang w:eastAsia="en-NZ"/>
+              </w:rPr>
+              <w:t>.</w:t>
+            </w:r>
+            <w:r>
+              <w:rPr>
+                <w:rFonts w:ascii="Consolas" w:eastAsia="Times New Roman" w:hAnsi="Consolas" w:cs="Times New Roman"/>
+                <w:color w:val="9CDCFE"/>
+                <w:sz w:val="21"/>
+                <w:szCs w:val="21"/>
+                <w:lang w:eastAsia="en-NZ"/>
+              </w:rPr>
+              <w:t>change</w:t>
+            </w:r>
+            <w:proofErr w:type="gramEnd"/>
+            <w:r>
+              <w:rPr>
+                <w:rFonts w:ascii="Consolas" w:eastAsia="Times New Roman" w:hAnsi="Consolas" w:cs="Times New Roman"/>
+                <w:color w:val="9CDCFE"/>
+                <w:sz w:val="21"/>
+                <w:szCs w:val="21"/>
+                <w:lang w:eastAsia="en-NZ"/>
+              </w:rPr>
+              <w:t>_y</w:t>
+            </w:r>
+            <w:proofErr w:type="spellEnd"/>
+            <w:r>
+              <w:rPr>
+                <w:rFonts w:ascii="Consolas" w:eastAsia="Times New Roman" w:hAnsi="Consolas" w:cs="Times New Roman"/>
+                <w:color w:val="CCCCCC"/>
+                <w:sz w:val="21"/>
+                <w:szCs w:val="21"/>
+                <w:lang w:eastAsia="en-NZ"/>
+              </w:rPr>
+              <w:t xml:space="preserve"> </w:t>
+            </w:r>
+            <w:r>
+              <w:rPr>
+                <w:rFonts w:ascii="Consolas" w:eastAsia="Times New Roman" w:hAnsi="Consolas" w:cs="Times New Roman"/>
+                <w:color w:val="D4D4D4"/>
+                <w:sz w:val="21"/>
+                <w:szCs w:val="21"/>
+                <w:lang w:eastAsia="en-NZ"/>
+              </w:rPr>
+              <w:t>&lt;</w:t>
+            </w:r>
+            <w:r>
+              <w:rPr>
+                <w:rFonts w:ascii="Consolas" w:eastAsia="Times New Roman" w:hAnsi="Consolas" w:cs="Times New Roman"/>
+                <w:color w:val="CCCCCC"/>
+                <w:sz w:val="21"/>
+                <w:szCs w:val="21"/>
+                <w:lang w:eastAsia="en-NZ"/>
+              </w:rPr>
+              <w:t xml:space="preserve"> </w:t>
+            </w:r>
+            <w:r>
+              <w:rPr>
+                <w:rFonts w:ascii="Consolas" w:eastAsia="Times New Roman" w:hAnsi="Consolas" w:cs="Times New Roman"/>
+                <w:color w:val="B5CEA8"/>
+                <w:sz w:val="21"/>
+                <w:szCs w:val="21"/>
+                <w:lang w:eastAsia="en-NZ"/>
+              </w:rPr>
+              <w:t>0</w:t>
+            </w:r>
+            <w:r>
+              <w:rPr>
+                <w:rFonts w:ascii="Consolas" w:eastAsia="Times New Roman" w:hAnsi="Consolas" w:cs="Times New Roman"/>
+                <w:color w:val="CCCCCC"/>
+                <w:sz w:val="21"/>
+                <w:szCs w:val="21"/>
+                <w:lang w:eastAsia="en-NZ"/>
+              </w:rPr>
+              <w:t>:</w:t>
+            </w:r>
+          </w:p>
+          <w:p>
+            <w:pPr>
+              <w:shd w:val="clear" w:color="auto" w:fill="1F1F1F"/>
+              <w:spacing w:line="285" w:lineRule="atLeast"/>
+              <w:rPr>
+                <w:rFonts w:ascii="Consolas" w:eastAsia="Times New Roman" w:hAnsi="Consolas" w:cs="Times New Roman"/>
+                <w:color w:val="CCCCCC"/>
+                <w:sz w:val="21"/>
+                <w:szCs w:val="21"/>
+                <w:lang w:eastAsia="en-NZ"/>
+              </w:rPr>
+            </w:pPr>
+            <w:r>
+              <w:rPr>
+                <w:rFonts w:ascii="Consolas" w:eastAsia="Times New Roman" w:hAnsi="Consolas" w:cs="Times New Roman"/>
+                <w:color w:val="CCCCCC"/>
+                <w:sz w:val="21"/>
+                <w:szCs w:val="21"/>
+                <w:lang w:eastAsia="en-NZ"/>
+              </w:rPr>
+              <w:t xml:space="preserve">            </w:t>
+            </w:r>
+            <w:proofErr w:type="spellStart"/>
+            <w:proofErr w:type="gramStart"/>
+            <w:r>
+              <w:rPr>
+                <w:rFonts w:ascii="Consolas" w:eastAsia="Times New Roman" w:hAnsi="Consolas" w:cs="Times New Roman"/>
+                <w:color w:val="9CDCFE"/>
+                <w:sz w:val="21"/>
+                <w:szCs w:val="21"/>
+                <w:lang w:eastAsia="en-NZ"/>
+              </w:rPr>
+              <w:t>self</w:t>
+            </w:r>
+            <w:r>
+              <w:rPr>
+                <w:rFonts w:ascii="Consolas" w:eastAsia="Times New Roman" w:hAnsi="Consolas" w:cs="Times New Roman"/>
+                <w:color w:val="CCCCCC"/>
+                <w:sz w:val="21"/>
+                <w:szCs w:val="21"/>
+                <w:lang w:eastAsia="en-NZ"/>
+              </w:rPr>
+              <w:t>.</w:t>
+            </w:r>
+            <w:r>
+              <w:rPr>
+                <w:rFonts w:ascii="Consolas" w:eastAsia="Times New Roman" w:hAnsi="Consolas" w:cs="Times New Roman"/>
+                <w:color w:val="9CDCFE"/>
+                <w:sz w:val="21"/>
+                <w:szCs w:val="21"/>
+                <w:lang w:eastAsia="en-NZ"/>
+              </w:rPr>
+              <w:t>texture</w:t>
+            </w:r>
+            <w:proofErr w:type="spellEnd"/>
+            <w:proofErr w:type="gramEnd"/>
+            <w:r>
+              <w:rPr>
+                <w:rFonts w:ascii="Consolas" w:eastAsia="Times New Roman" w:hAnsi="Consolas" w:cs="Times New Roman"/>
+                <w:color w:val="CCCCCC"/>
+                <w:sz w:val="21"/>
+                <w:szCs w:val="21"/>
+                <w:lang w:eastAsia="en-NZ"/>
+              </w:rPr>
+              <w:t xml:space="preserve"> </w:t>
+            </w:r>
+            <w:r>
+              <w:rPr>
+                <w:rFonts w:ascii="Consolas" w:eastAsia="Times New Roman" w:hAnsi="Consolas" w:cs="Times New Roman"/>
+                <w:color w:val="D4D4D4"/>
+                <w:sz w:val="21"/>
+                <w:szCs w:val="21"/>
+                <w:lang w:eastAsia="en-NZ"/>
+              </w:rPr>
+              <w:t>=</w:t>
+            </w:r>
+            <w:r>
+              <w:rPr>
+                <w:rFonts w:ascii="Consolas" w:eastAsia="Times New Roman" w:hAnsi="Consolas" w:cs="Times New Roman"/>
+                <w:color w:val="CCCCCC"/>
+                <w:sz w:val="21"/>
+                <w:szCs w:val="21"/>
+                <w:lang w:eastAsia="en-NZ"/>
+              </w:rPr>
+              <w:t xml:space="preserve"> </w:t>
+            </w:r>
+            <w:proofErr w:type="spellStart"/>
+            <w:r>
+              <w:rPr>
+                <w:rFonts w:ascii="Consolas" w:eastAsia="Times New Roman" w:hAnsi="Consolas" w:cs="Times New Roman"/>
+                <w:color w:val="9CDCFE"/>
+                <w:sz w:val="21"/>
+                <w:szCs w:val="21"/>
+                <w:lang w:eastAsia="en-NZ"/>
+              </w:rPr>
+              <w:t>self</w:t>
+            </w:r>
+            <w:r>
+              <w:rPr>
+                <w:rFonts w:ascii="Consolas" w:eastAsia="Times New Roman" w:hAnsi="Consolas" w:cs="Times New Roman"/>
+                <w:color w:val="CCCCCC"/>
+                <w:sz w:val="21"/>
+                <w:szCs w:val="21"/>
+                <w:lang w:eastAsia="en-NZ"/>
+              </w:rPr>
+              <w:t>.</w:t>
+            </w:r>
+            <w:r>
+              <w:rPr>
+                <w:rFonts w:ascii="Consolas" w:eastAsia="Times New Roman" w:hAnsi="Consolas" w:cs="Times New Roman"/>
+                <w:color w:val="9CDCFE"/>
+                <w:sz w:val="21"/>
+                <w:szCs w:val="21"/>
+                <w:lang w:eastAsia="en-NZ"/>
+              </w:rPr>
+              <w:t>fall_textures</w:t>
+            </w:r>
+            <w:proofErr w:type="spellEnd"/>
+            <w:r>
+              <w:rPr>
+                <w:rFonts w:ascii="Consolas" w:eastAsia="Times New Roman" w:hAnsi="Consolas" w:cs="Times New Roman"/>
+                <w:color w:val="CCCCCC"/>
+                <w:sz w:val="21"/>
+                <w:szCs w:val="21"/>
+                <w:lang w:eastAsia="en-NZ"/>
+              </w:rPr>
+              <w:t>[</w:t>
+            </w:r>
+            <w:r>
+              <w:rPr>
+                <w:rFonts w:ascii="Consolas" w:eastAsia="Times New Roman" w:hAnsi="Consolas" w:cs="Times New Roman"/>
+                <w:color w:val="B5CEA8"/>
+                <w:sz w:val="21"/>
+                <w:szCs w:val="21"/>
+                <w:lang w:eastAsia="en-NZ"/>
+              </w:rPr>
+              <w:t>1</w:t>
+            </w:r>
+            <w:r>
+              <w:rPr>
+                <w:rFonts w:ascii="Consolas" w:eastAsia="Times New Roman" w:hAnsi="Consolas" w:cs="Times New Roman"/>
+                <w:color w:val="CCCCCC"/>
+                <w:sz w:val="21"/>
+                <w:szCs w:val="21"/>
+                <w:lang w:eastAsia="en-NZ"/>
+              </w:rPr>
+              <w:t>][</w:t>
+            </w:r>
+            <w:proofErr w:type="spellStart"/>
+            <w:r>
+              <w:rPr>
+                <w:rFonts w:ascii="Consolas" w:eastAsia="Times New Roman" w:hAnsi="Consolas" w:cs="Times New Roman"/>
+                <w:color w:val="9CDCFE"/>
+                <w:sz w:val="21"/>
+                <w:szCs w:val="21"/>
+                <w:lang w:eastAsia="en-NZ"/>
+              </w:rPr>
+              <w:t>self</w:t>
+            </w:r>
+            <w:r>
+              <w:rPr>
+                <w:rFonts w:ascii="Consolas" w:eastAsia="Times New Roman" w:hAnsi="Consolas" w:cs="Times New Roman"/>
+                <w:color w:val="CCCCCC"/>
+                <w:sz w:val="21"/>
+                <w:szCs w:val="21"/>
+                <w:lang w:eastAsia="en-NZ"/>
+              </w:rPr>
+              <w:t>.</w:t>
+            </w:r>
+            <w:r>
+              <w:rPr>
+                <w:rFonts w:ascii="Consolas" w:eastAsia="Times New Roman" w:hAnsi="Consolas" w:cs="Times New Roman"/>
+                <w:color w:val="9CDCFE"/>
+                <w:sz w:val="21"/>
+                <w:szCs w:val="21"/>
+                <w:lang w:eastAsia="en-NZ"/>
+              </w:rPr>
+              <w:t>character_face_direction</w:t>
+            </w:r>
+            <w:proofErr w:type="spellEnd"/>
+            <w:r>
+              <w:rPr>
+                <w:rFonts w:ascii="Consolas" w:eastAsia="Times New Roman" w:hAnsi="Consolas" w:cs="Times New Roman"/>
+                <w:color w:val="CCCCCC"/>
+                <w:sz w:val="21"/>
+                <w:szCs w:val="21"/>
+                <w:lang w:eastAsia="en-NZ"/>
+              </w:rPr>
+              <w:t>]</w:t>
+            </w:r>
+          </w:p>
+          <w:p>
+            <w:pPr>
+              <w:shd w:val="clear" w:color="auto" w:fill="1F1F1F"/>
+              <w:spacing w:line="285" w:lineRule="atLeast"/>
+              <w:rPr>
+                <w:rFonts w:ascii="Consolas" w:eastAsia="Times New Roman" w:hAnsi="Consolas" w:cs="Times New Roman"/>
+                <w:color w:val="CCCCCC"/>
+                <w:sz w:val="21"/>
+                <w:szCs w:val="21"/>
+                <w:lang w:eastAsia="en-NZ"/>
+              </w:rPr>
+            </w:pPr>
+            <w:r>
+              <w:rPr>
+                <w:rFonts w:ascii="Consolas" w:eastAsia="Times New Roman" w:hAnsi="Consolas" w:cs="Times New Roman"/>
+                <w:color w:val="CCCCCC"/>
+                <w:sz w:val="21"/>
+                <w:szCs w:val="21"/>
+                <w:lang w:eastAsia="en-NZ"/>
+              </w:rPr>
+              <w:t xml:space="preserve">        </w:t>
+            </w:r>
+            <w:r>
+              <w:rPr>
+                <w:rFonts w:ascii="Consolas" w:eastAsia="Times New Roman" w:hAnsi="Consolas" w:cs="Times New Roman"/>
+                <w:color w:val="C586C0"/>
+                <w:sz w:val="21"/>
+                <w:szCs w:val="21"/>
+                <w:lang w:eastAsia="en-NZ"/>
+              </w:rPr>
+              <w:t>if</w:t>
+            </w:r>
+            <w:r>
+              <w:rPr>
+                <w:rFonts w:ascii="Consolas" w:eastAsia="Times New Roman" w:hAnsi="Consolas" w:cs="Times New Roman"/>
+                <w:color w:val="CCCCCC"/>
+                <w:sz w:val="21"/>
+                <w:szCs w:val="21"/>
+                <w:lang w:eastAsia="en-NZ"/>
+              </w:rPr>
+              <w:t xml:space="preserve"> </w:t>
+            </w:r>
+            <w:proofErr w:type="spellStart"/>
+            <w:proofErr w:type="gramStart"/>
+            <w:r>
+              <w:rPr>
+                <w:rFonts w:ascii="Consolas" w:eastAsia="Times New Roman" w:hAnsi="Consolas" w:cs="Times New Roman"/>
+                <w:color w:val="9CDCFE"/>
+                <w:sz w:val="21"/>
+                <w:szCs w:val="21"/>
+                <w:lang w:eastAsia="en-NZ"/>
+              </w:rPr>
+              <w:t>self</w:t>
+            </w:r>
+            <w:r>
+              <w:rPr>
+                <w:rFonts w:ascii="Consolas" w:eastAsia="Times New Roman" w:hAnsi="Consolas" w:cs="Times New Roman"/>
+                <w:color w:val="CCCCCC"/>
+                <w:sz w:val="21"/>
+                <w:szCs w:val="21"/>
+                <w:lang w:eastAsia="en-NZ"/>
+              </w:rPr>
+              <w:t>.</w:t>
+            </w:r>
+            <w:r>
+              <w:rPr>
+                <w:rFonts w:ascii="Consolas" w:eastAsia="Times New Roman" w:hAnsi="Consolas" w:cs="Times New Roman"/>
+                <w:color w:val="9CDCFE"/>
+                <w:sz w:val="21"/>
+                <w:szCs w:val="21"/>
+                <w:lang w:eastAsia="en-NZ"/>
+              </w:rPr>
+              <w:t>change</w:t>
+            </w:r>
+            <w:proofErr w:type="gramEnd"/>
+            <w:r>
+              <w:rPr>
+                <w:rFonts w:ascii="Consolas" w:eastAsia="Times New Roman" w:hAnsi="Consolas" w:cs="Times New Roman"/>
+                <w:color w:val="9CDCFE"/>
+                <w:sz w:val="21"/>
+                <w:szCs w:val="21"/>
+                <w:lang w:eastAsia="en-NZ"/>
+              </w:rPr>
+              <w:t>_y</w:t>
+            </w:r>
+            <w:proofErr w:type="spellEnd"/>
+            <w:r>
+              <w:rPr>
+                <w:rFonts w:ascii="Consolas" w:eastAsia="Times New Roman" w:hAnsi="Consolas" w:cs="Times New Roman"/>
+                <w:color w:val="CCCCCC"/>
+                <w:sz w:val="21"/>
+                <w:szCs w:val="21"/>
+                <w:lang w:eastAsia="en-NZ"/>
+              </w:rPr>
+              <w:t xml:space="preserve"> </w:t>
+            </w:r>
+            <w:r>
+              <w:rPr>
+                <w:rFonts w:ascii="Consolas" w:eastAsia="Times New Roman" w:hAnsi="Consolas" w:cs="Times New Roman"/>
+                <w:color w:val="D4D4D4"/>
+                <w:sz w:val="21"/>
+                <w:szCs w:val="21"/>
+                <w:lang w:eastAsia="en-NZ"/>
+              </w:rPr>
+              <w:t>&lt;</w:t>
+            </w:r>
+            <w:r>
+              <w:rPr>
+                <w:rFonts w:ascii="Consolas" w:eastAsia="Times New Roman" w:hAnsi="Consolas" w:cs="Times New Roman"/>
+                <w:color w:val="CCCCCC"/>
+                <w:sz w:val="21"/>
+                <w:szCs w:val="21"/>
+                <w:lang w:eastAsia="en-NZ"/>
+              </w:rPr>
+              <w:t xml:space="preserve"> </w:t>
+            </w:r>
+            <w:r>
+              <w:rPr>
+                <w:rFonts w:ascii="Consolas" w:eastAsia="Times New Roman" w:hAnsi="Consolas" w:cs="Times New Roman"/>
+                <w:color w:val="D4D4D4"/>
+                <w:sz w:val="21"/>
+                <w:szCs w:val="21"/>
+                <w:lang w:eastAsia="en-NZ"/>
+              </w:rPr>
+              <w:t>-</w:t>
+            </w:r>
+            <w:r>
+              <w:rPr>
+                <w:rFonts w:ascii="Consolas" w:eastAsia="Times New Roman" w:hAnsi="Consolas" w:cs="Times New Roman"/>
+                <w:color w:val="B5CEA8"/>
+                <w:sz w:val="21"/>
+                <w:szCs w:val="21"/>
+                <w:lang w:eastAsia="en-NZ"/>
+              </w:rPr>
+              <w:t>1</w:t>
+            </w:r>
+            <w:r>
+              <w:rPr>
+                <w:rFonts w:ascii="Consolas" w:eastAsia="Times New Roman" w:hAnsi="Consolas" w:cs="Times New Roman"/>
+                <w:color w:val="CCCCCC"/>
+                <w:sz w:val="21"/>
+                <w:szCs w:val="21"/>
+                <w:lang w:eastAsia="en-NZ"/>
+              </w:rPr>
+              <w:t>:</w:t>
+            </w:r>
+          </w:p>
+          <w:p>
+            <w:pPr>
+              <w:shd w:val="clear" w:color="auto" w:fill="1F1F1F"/>
+              <w:spacing w:line="285" w:lineRule="atLeast"/>
+              <w:rPr>
+                <w:rFonts w:ascii="Consolas" w:eastAsia="Times New Roman" w:hAnsi="Consolas" w:cs="Times New Roman"/>
+                <w:color w:val="CCCCCC"/>
+                <w:sz w:val="21"/>
+                <w:szCs w:val="21"/>
+                <w:lang w:eastAsia="en-NZ"/>
+              </w:rPr>
+            </w:pPr>
+            <w:r>
+              <w:rPr>
+                <w:rFonts w:ascii="Consolas" w:eastAsia="Times New Roman" w:hAnsi="Consolas" w:cs="Times New Roman"/>
+                <w:color w:val="CCCCCC"/>
+                <w:sz w:val="21"/>
+                <w:szCs w:val="21"/>
+                <w:lang w:eastAsia="en-NZ"/>
+              </w:rPr>
+              <w:t xml:space="preserve">            </w:t>
+            </w:r>
+            <w:proofErr w:type="spellStart"/>
+            <w:proofErr w:type="gramStart"/>
+            <w:r>
+              <w:rPr>
+                <w:rFonts w:ascii="Consolas" w:eastAsia="Times New Roman" w:hAnsi="Consolas" w:cs="Times New Roman"/>
+                <w:color w:val="9CDCFE"/>
+                <w:sz w:val="21"/>
+                <w:szCs w:val="21"/>
+                <w:lang w:eastAsia="en-NZ"/>
+              </w:rPr>
+              <w:t>self</w:t>
+            </w:r>
+            <w:r>
+              <w:rPr>
+                <w:rFonts w:ascii="Consolas" w:eastAsia="Times New Roman" w:hAnsi="Consolas" w:cs="Times New Roman"/>
+                <w:color w:val="CCCCCC"/>
+                <w:sz w:val="21"/>
+                <w:szCs w:val="21"/>
+                <w:lang w:eastAsia="en-NZ"/>
+              </w:rPr>
+              <w:t>.</w:t>
+            </w:r>
+            <w:r>
+              <w:rPr>
+                <w:rFonts w:ascii="Consolas" w:eastAsia="Times New Roman" w:hAnsi="Consolas" w:cs="Times New Roman"/>
+                <w:color w:val="9CDCFE"/>
+                <w:sz w:val="21"/>
+                <w:szCs w:val="21"/>
+                <w:lang w:eastAsia="en-NZ"/>
+              </w:rPr>
+              <w:t>texture</w:t>
+            </w:r>
+            <w:proofErr w:type="spellEnd"/>
+            <w:proofErr w:type="gramEnd"/>
+            <w:r>
+              <w:rPr>
+                <w:rFonts w:ascii="Consolas" w:eastAsia="Times New Roman" w:hAnsi="Consolas" w:cs="Times New Roman"/>
+                <w:color w:val="CCCCCC"/>
+                <w:sz w:val="21"/>
+                <w:szCs w:val="21"/>
+                <w:lang w:eastAsia="en-NZ"/>
+              </w:rPr>
+              <w:t xml:space="preserve"> </w:t>
+            </w:r>
+            <w:r>
+              <w:rPr>
+                <w:rFonts w:ascii="Consolas" w:eastAsia="Times New Roman" w:hAnsi="Consolas" w:cs="Times New Roman"/>
+                <w:color w:val="D4D4D4"/>
+                <w:sz w:val="21"/>
+                <w:szCs w:val="21"/>
+                <w:lang w:eastAsia="en-NZ"/>
+              </w:rPr>
+              <w:t>=</w:t>
+            </w:r>
+            <w:r>
+              <w:rPr>
+                <w:rFonts w:ascii="Consolas" w:eastAsia="Times New Roman" w:hAnsi="Consolas" w:cs="Times New Roman"/>
+                <w:color w:val="CCCCCC"/>
+                <w:sz w:val="21"/>
+                <w:szCs w:val="21"/>
+                <w:lang w:eastAsia="en-NZ"/>
+              </w:rPr>
+              <w:t xml:space="preserve"> </w:t>
+            </w:r>
+            <w:proofErr w:type="spellStart"/>
+            <w:r>
+              <w:rPr>
+                <w:rFonts w:ascii="Consolas" w:eastAsia="Times New Roman" w:hAnsi="Consolas" w:cs="Times New Roman"/>
+                <w:color w:val="9CDCFE"/>
+                <w:sz w:val="21"/>
+                <w:szCs w:val="21"/>
+                <w:lang w:eastAsia="en-NZ"/>
+              </w:rPr>
+              <w:t>self</w:t>
+            </w:r>
+            <w:r>
+              <w:rPr>
+                <w:rFonts w:ascii="Consolas" w:eastAsia="Times New Roman" w:hAnsi="Consolas" w:cs="Times New Roman"/>
+                <w:color w:val="CCCCCC"/>
+                <w:sz w:val="21"/>
+                <w:szCs w:val="21"/>
+                <w:lang w:eastAsia="en-NZ"/>
+              </w:rPr>
+              <w:t>.</w:t>
+            </w:r>
+            <w:r>
+              <w:rPr>
+                <w:rFonts w:ascii="Consolas" w:eastAsia="Times New Roman" w:hAnsi="Consolas" w:cs="Times New Roman"/>
+                <w:color w:val="9CDCFE"/>
+                <w:sz w:val="21"/>
+                <w:szCs w:val="21"/>
+                <w:lang w:eastAsia="en-NZ"/>
+              </w:rPr>
+              <w:t>fall_textures</w:t>
+            </w:r>
+            <w:proofErr w:type="spellEnd"/>
+            <w:r>
+              <w:rPr>
+                <w:rFonts w:ascii="Consolas" w:eastAsia="Times New Roman" w:hAnsi="Consolas" w:cs="Times New Roman"/>
+                <w:color w:val="CCCCCC"/>
+                <w:sz w:val="21"/>
+                <w:szCs w:val="21"/>
+                <w:lang w:eastAsia="en-NZ"/>
+              </w:rPr>
+              <w:t>[</w:t>
+            </w:r>
+            <w:r>
+              <w:rPr>
+                <w:rFonts w:ascii="Consolas" w:eastAsia="Times New Roman" w:hAnsi="Consolas" w:cs="Times New Roman"/>
+                <w:color w:val="B5CEA8"/>
+                <w:sz w:val="21"/>
+                <w:szCs w:val="21"/>
+                <w:lang w:eastAsia="en-NZ"/>
+              </w:rPr>
+              <w:t>0</w:t>
+            </w:r>
+            <w:r>
+              <w:rPr>
+                <w:rFonts w:ascii="Consolas" w:eastAsia="Times New Roman" w:hAnsi="Consolas" w:cs="Times New Roman"/>
+                <w:color w:val="CCCCCC"/>
+                <w:sz w:val="21"/>
+                <w:szCs w:val="21"/>
+                <w:lang w:eastAsia="en-NZ"/>
+              </w:rPr>
+              <w:t>][</w:t>
+            </w:r>
+            <w:proofErr w:type="spellStart"/>
+            <w:r>
+              <w:rPr>
+                <w:rFonts w:ascii="Consolas" w:eastAsia="Times New Roman" w:hAnsi="Consolas" w:cs="Times New Roman"/>
+                <w:color w:val="9CDCFE"/>
+                <w:sz w:val="21"/>
+                <w:szCs w:val="21"/>
+                <w:lang w:eastAsia="en-NZ"/>
+              </w:rPr>
+              <w:t>self</w:t>
+            </w:r>
+            <w:r>
+              <w:rPr>
+                <w:rFonts w:ascii="Consolas" w:eastAsia="Times New Roman" w:hAnsi="Consolas" w:cs="Times New Roman"/>
+                <w:color w:val="CCCCCC"/>
+                <w:sz w:val="21"/>
+                <w:szCs w:val="21"/>
+                <w:lang w:eastAsia="en-NZ"/>
+              </w:rPr>
+              <w:t>.</w:t>
+            </w:r>
+            <w:r>
+              <w:rPr>
+                <w:rFonts w:ascii="Consolas" w:eastAsia="Times New Roman" w:hAnsi="Consolas" w:cs="Times New Roman"/>
+                <w:color w:val="9CDCFE"/>
+                <w:sz w:val="21"/>
+                <w:szCs w:val="21"/>
+                <w:lang w:eastAsia="en-NZ"/>
+              </w:rPr>
+              <w:t>character_face_direction</w:t>
+            </w:r>
+            <w:proofErr w:type="spellEnd"/>
+            <w:r>
+              <w:rPr>
+                <w:rFonts w:ascii="Consolas" w:eastAsia="Times New Roman" w:hAnsi="Consolas" w:cs="Times New Roman"/>
+                <w:color w:val="CCCCCC"/>
+                <w:sz w:val="21"/>
+                <w:szCs w:val="21"/>
+                <w:lang w:eastAsia="en-NZ"/>
+              </w:rPr>
+              <w:t>]</w:t>
+            </w:r>
+          </w:p>
+          <w:p>
+            <w:pPr>
+              <w:shd w:val="clear" w:color="auto" w:fill="1F1F1F"/>
+              <w:spacing w:line="285" w:lineRule="atLeast"/>
+            </w:pPr>
+          </w:p>
         </w:tc>
       </w:tr>
     </w:tbl>

</xml_diff>

<commit_message>
animation code still not working
</commit_message>
<xml_diff>
--- a/documentation/ongoing_testing.docx
+++ b/documentation/ongoing_testing.docx
@@ -1,6 +1,6 @@
 
 <file path=word/document.xml><?xml version="1.0" encoding="utf-8"?>
-<w:document xmlns:wpc="http://schemas.microsoft.com/office/word/2010/wordprocessingCanvas" xmlns:cx="http://schemas.microsoft.com/office/drawing/2014/chartex" xmlns:cx1="http://schemas.microsoft.com/office/drawing/2015/9/8/chartex" xmlns:cx2="http://schemas.microsoft.com/office/drawing/2015/10/21/chartex" xmlns:cx3="http://schemas.microsoft.com/office/drawing/2016/5/9/chartex" xmlns:cx4="http://schemas.microsoft.com/office/drawing/2016/5/10/chartex" xmlns:cx5="http://schemas.microsoft.com/office/drawing/2016/5/11/chartex" xmlns:cx6="http://schemas.microsoft.com/office/drawing/2016/5/12/chartex" xmlns:cx7="http://schemas.microsoft.com/office/drawing/2016/5/13/chartex" xmlns:cx8="http://schemas.microsoft.com/office/drawing/2016/5/14/chartex" xmlns:mc="http://schemas.openxmlformats.org/markup-compatibility/2006" xmlns:aink="http://schemas.microsoft.com/office/drawing/2016/ink" xmlns:am3d="http://schemas.microsoft.com/office/drawing/2017/model3d" xmlns:o="urn:schemas-microsoft-com:office:office" xmlns:oel="http://schemas.microsoft.com/office/2019/extlst" xmlns:r="http://schemas.openxmlformats.org/officeDocument/2006/relationships" xmlns:m="http://schemas.openxmlformats.org/officeDocument/2006/math" xmlns:v="urn:schemas-microsoft-com:vml" xmlns:wp14="http://schemas.microsoft.com/office/word/2010/wordprocessingDrawing" xmlns:wp="http://schemas.openxmlformats.org/drawingml/2006/wordprocessingDrawing" xmlns:w10="urn:schemas-microsoft-com:office:word" xmlns:w="http://schemas.openxmlformats.org/wordprocessingml/2006/main" xmlns:w14="http://schemas.microsoft.com/office/word/2010/wordml" xmlns:w15="http://schemas.microsoft.com/office/word/2012/wordml" xmlns:w16cex="http://schemas.microsoft.com/office/word/2018/wordml/cex" xmlns:w16cid="http://schemas.microsoft.com/office/word/2016/wordml/cid" xmlns:w16="http://schemas.microsoft.com/office/word/2018/wordml" xmlns:w16du="http://schemas.microsoft.com/office/word/2023/wordml/word16du" xmlns:w16sdtdh="http://schemas.microsoft.com/office/word/2020/wordml/sdtdatahash" xmlns:w16se="http://schemas.microsoft.com/office/word/2015/wordml/symex" xmlns:wpg="http://schemas.microsoft.com/office/word/2010/wordprocessingGroup" xmlns:wpi="http://schemas.microsoft.com/office/word/2010/wordprocessingInk" xmlns:wne="http://schemas.microsoft.com/office/word/2006/wordml" xmlns:wps="http://schemas.microsoft.com/office/word/2010/wordprocessingShape" mc:Ignorable="w14 w15 w16se w16cid w16 w16cex w16sdtdh w16du wp14">
+<w:document xmlns:wpc="http://schemas.microsoft.com/office/word/2010/wordprocessingCanvas" xmlns:cx="http://schemas.microsoft.com/office/drawing/2014/chartex" xmlns:cx1="http://schemas.microsoft.com/office/drawing/2015/9/8/chartex" xmlns:cx2="http://schemas.microsoft.com/office/drawing/2015/10/21/chartex" xmlns:cx3="http://schemas.microsoft.com/office/drawing/2016/5/9/chartex" xmlns:cx4="http://schemas.microsoft.com/office/drawing/2016/5/10/chartex" xmlns:cx5="http://schemas.microsoft.com/office/drawing/2016/5/11/chartex" xmlns:cx6="http://schemas.microsoft.com/office/drawing/2016/5/12/chartex" xmlns:cx7="http://schemas.microsoft.com/office/drawing/2016/5/13/chartex" xmlns:cx8="http://schemas.microsoft.com/office/drawing/2016/5/14/chartex" xmlns:mc="http://schemas.openxmlformats.org/markup-compatibility/2006" xmlns:aink="http://schemas.microsoft.com/office/drawing/2016/ink" xmlns:am3d="http://schemas.microsoft.com/office/drawing/2017/model3d" xmlns:o="urn:schemas-microsoft-com:office:office" xmlns:oel="http://schemas.microsoft.com/office/2019/extlst" xmlns:r="http://schemas.openxmlformats.org/officeDocument/2006/relationships" xmlns:m="http://schemas.openxmlformats.org/officeDocument/2006/math" xmlns:v="urn:schemas-microsoft-com:vml" xmlns:wp14="http://schemas.microsoft.com/office/word/2010/wordprocessingDrawing" xmlns:wp="http://schemas.openxmlformats.org/drawingml/2006/wordprocessingDrawing" xmlns:w10="urn:schemas-microsoft-com:office:word" xmlns:w="http://schemas.openxmlformats.org/wordprocessingml/2006/main" xmlns:w14="http://schemas.microsoft.com/office/word/2010/wordml" xmlns:w15="http://schemas.microsoft.com/office/word/2012/wordml" xmlns:w16cex="http://schemas.microsoft.com/office/word/2018/wordml/cex" xmlns:w16cid="http://schemas.microsoft.com/office/word/2016/wordml/cid" xmlns:w16="http://schemas.microsoft.com/office/word/2018/wordml" xmlns:w16sdtdh="http://schemas.microsoft.com/office/word/2020/wordml/sdtdatahash" xmlns:w16se="http://schemas.microsoft.com/office/word/2015/wordml/symex" xmlns:wpg="http://schemas.microsoft.com/office/word/2010/wordprocessingGroup" xmlns:wpi="http://schemas.microsoft.com/office/word/2010/wordprocessingInk" xmlns:wne="http://schemas.microsoft.com/office/word/2006/wordml" xmlns:wps="http://schemas.microsoft.com/office/word/2010/wordprocessingShape" mc:Ignorable="w14 w15 w16se w16cid w16 w16cex w16sdtdh wp14">
   <w:body>
     <w:tbl>
       <w:tblPr>
@@ -1033,7 +1033,7 @@
           <w:p>
             <w:pPr>
               <w:shd w:val="clear" w:color="auto" w:fill="1F1F1F"/>
-              <w:spacing w:after="0" w:line="285" w:lineRule="atLeast"/>
+              <w:spacing w:line="285" w:lineRule="atLeast"/>
               <w:rPr>
                 <w:rFonts w:ascii="Consolas" w:eastAsia="Times New Roman" w:hAnsi="Consolas" w:cs="Times New Roman"/>
                 <w:color w:val="CCCCCC"/>
@@ -1690,6 +1690,66 @@
             <w:pPr>
               <w:shd w:val="clear" w:color="auto" w:fill="1F1F1F"/>
               <w:spacing w:line="285" w:lineRule="atLeast"/>
+            </w:pPr>
+          </w:p>
+        </w:tc>
+      </w:tr>
+      <w:tr>
+        <w:tc>
+          <w:tcPr>
+            <w:tcW w:w="650" w:type="dxa"/>
+          </w:tcPr>
+          <w:p>
+            <w:r>
+              <w:t>18/04</w:t>
+            </w:r>
+          </w:p>
+        </w:tc>
+        <w:tc>
+          <w:tcPr>
+            <w:tcW w:w="1066" w:type="dxa"/>
+          </w:tcPr>
+          <w:p>
+            <w:r>
+              <w:t>Falling animation</w:t>
+            </w:r>
+          </w:p>
+        </w:tc>
+        <w:tc>
+          <w:tcPr>
+            <w:tcW w:w="1099" w:type="dxa"/>
+          </w:tcPr>
+          <w:p>
+            <w:r>
+              <w:t>One cycle of the animation is run</w:t>
+            </w:r>
+          </w:p>
+        </w:tc>
+        <w:tc>
+          <w:tcPr>
+            <w:tcW w:w="1208" w:type="dxa"/>
+          </w:tcPr>
+          <w:p>
+            <w:r>
+              <w:t>Only one change in texture instead of two</w:t>
+            </w:r>
+          </w:p>
+        </w:tc>
+        <w:tc>
+          <w:tcPr>
+            <w:tcW w:w="4993" w:type="dxa"/>
+          </w:tcPr>
+          <w:p>
+            <w:pPr>
+              <w:shd w:val="clear" w:color="auto" w:fill="1F1F1F"/>
+              <w:spacing w:line="285" w:lineRule="atLeast"/>
+              <w:rPr>
+                <w:rFonts w:ascii="Consolas" w:eastAsia="Times New Roman" w:hAnsi="Consolas" w:cs="Times New Roman"/>
+                <w:color w:val="C586C0"/>
+                <w:sz w:val="21"/>
+                <w:szCs w:val="21"/>
+                <w:lang w:eastAsia="en-NZ"/>
+              </w:rPr>
             </w:pPr>
           </w:p>
         </w:tc>
@@ -1767,7 +1827,7 @@
 </file>
 
 <file path=word/styles.xml><?xml version="1.0" encoding="utf-8"?>
-<w:styles xmlns:mc="http://schemas.openxmlformats.org/markup-compatibility/2006" xmlns:r="http://schemas.openxmlformats.org/officeDocument/2006/relationships" xmlns:w="http://schemas.openxmlformats.org/wordprocessingml/2006/main" xmlns:w14="http://schemas.microsoft.com/office/word/2010/wordml" xmlns:w15="http://schemas.microsoft.com/office/word/2012/wordml" xmlns:w16cex="http://schemas.microsoft.com/office/word/2018/wordml/cex" xmlns:w16cid="http://schemas.microsoft.com/office/word/2016/wordml/cid" xmlns:w16="http://schemas.microsoft.com/office/word/2018/wordml" xmlns:w16du="http://schemas.microsoft.com/office/word/2023/wordml/word16du" xmlns:w16sdtdh="http://schemas.microsoft.com/office/word/2020/wordml/sdtdatahash" xmlns:w16se="http://schemas.microsoft.com/office/word/2015/wordml/symex" mc:Ignorable="w14 w15 w16se w16cid w16 w16cex w16sdtdh w16du">
+<w:styles xmlns:mc="http://schemas.openxmlformats.org/markup-compatibility/2006" xmlns:r="http://schemas.openxmlformats.org/officeDocument/2006/relationships" xmlns:w="http://schemas.openxmlformats.org/wordprocessingml/2006/main" xmlns:w14="http://schemas.microsoft.com/office/word/2010/wordml" xmlns:w15="http://schemas.microsoft.com/office/word/2012/wordml" xmlns:w16cex="http://schemas.microsoft.com/office/word/2018/wordml/cex" xmlns:w16cid="http://schemas.microsoft.com/office/word/2016/wordml/cid" xmlns:w16="http://schemas.microsoft.com/office/word/2018/wordml" xmlns:w16sdtdh="http://schemas.microsoft.com/office/word/2020/wordml/sdtdatahash" xmlns:w16se="http://schemas.microsoft.com/office/word/2015/wordml/symex" mc:Ignorable="w14 w15 w16se w16cid w16 w16cex w16sdtdh">
   <w:docDefaults>
     <w:rPrDefault>
       <w:rPr>

</xml_diff>

<commit_message>
added layer image into tiled map
</commit_message>
<xml_diff>
--- a/documentation/ongoing_testing.docx
+++ b/documentation/ongoing_testing.docx
@@ -1,6 +1,6 @@
 
 <file path=word/document.xml><?xml version="1.0" encoding="utf-8"?>
-<w:document xmlns:wpc="http://schemas.microsoft.com/office/word/2010/wordprocessingCanvas" xmlns:cx="http://schemas.microsoft.com/office/drawing/2014/chartex" xmlns:cx1="http://schemas.microsoft.com/office/drawing/2015/9/8/chartex" xmlns:cx2="http://schemas.microsoft.com/office/drawing/2015/10/21/chartex" xmlns:cx3="http://schemas.microsoft.com/office/drawing/2016/5/9/chartex" xmlns:cx4="http://schemas.microsoft.com/office/drawing/2016/5/10/chartex" xmlns:cx5="http://schemas.microsoft.com/office/drawing/2016/5/11/chartex" xmlns:cx6="http://schemas.microsoft.com/office/drawing/2016/5/12/chartex" xmlns:cx7="http://schemas.microsoft.com/office/drawing/2016/5/13/chartex" xmlns:cx8="http://schemas.microsoft.com/office/drawing/2016/5/14/chartex" xmlns:mc="http://schemas.openxmlformats.org/markup-compatibility/2006" xmlns:aink="http://schemas.microsoft.com/office/drawing/2016/ink" xmlns:am3d="http://schemas.microsoft.com/office/drawing/2017/model3d" xmlns:o="urn:schemas-microsoft-com:office:office" xmlns:oel="http://schemas.microsoft.com/office/2019/extlst" xmlns:r="http://schemas.openxmlformats.org/officeDocument/2006/relationships" xmlns:m="http://schemas.openxmlformats.org/officeDocument/2006/math" xmlns:v="urn:schemas-microsoft-com:vml" xmlns:wp14="http://schemas.microsoft.com/office/word/2010/wordprocessingDrawing" xmlns:wp="http://schemas.openxmlformats.org/drawingml/2006/wordprocessingDrawing" xmlns:w10="urn:schemas-microsoft-com:office:word" xmlns:w="http://schemas.openxmlformats.org/wordprocessingml/2006/main" xmlns:w14="http://schemas.microsoft.com/office/word/2010/wordml" xmlns:w15="http://schemas.microsoft.com/office/word/2012/wordml" xmlns:w16cex="http://schemas.microsoft.com/office/word/2018/wordml/cex" xmlns:w16cid="http://schemas.microsoft.com/office/word/2016/wordml/cid" xmlns:w16="http://schemas.microsoft.com/office/word/2018/wordml" xmlns:w16sdtdh="http://schemas.microsoft.com/office/word/2020/wordml/sdtdatahash" xmlns:w16se="http://schemas.microsoft.com/office/word/2015/wordml/symex" xmlns:wpg="http://schemas.microsoft.com/office/word/2010/wordprocessingGroup" xmlns:wpi="http://schemas.microsoft.com/office/word/2010/wordprocessingInk" xmlns:wne="http://schemas.microsoft.com/office/word/2006/wordml" xmlns:wps="http://schemas.microsoft.com/office/word/2010/wordprocessingShape" mc:Ignorable="w14 w15 w16se w16cid w16 w16cex w16sdtdh wp14">
+<w:document xmlns:wpc="http://schemas.microsoft.com/office/word/2010/wordprocessingCanvas" xmlns:cx="http://schemas.microsoft.com/office/drawing/2014/chartex" xmlns:cx1="http://schemas.microsoft.com/office/drawing/2015/9/8/chartex" xmlns:cx2="http://schemas.microsoft.com/office/drawing/2015/10/21/chartex" xmlns:cx3="http://schemas.microsoft.com/office/drawing/2016/5/9/chartex" xmlns:cx4="http://schemas.microsoft.com/office/drawing/2016/5/10/chartex" xmlns:cx5="http://schemas.microsoft.com/office/drawing/2016/5/11/chartex" xmlns:cx6="http://schemas.microsoft.com/office/drawing/2016/5/12/chartex" xmlns:cx7="http://schemas.microsoft.com/office/drawing/2016/5/13/chartex" xmlns:cx8="http://schemas.microsoft.com/office/drawing/2016/5/14/chartex" xmlns:mc="http://schemas.openxmlformats.org/markup-compatibility/2006" xmlns:aink="http://schemas.microsoft.com/office/drawing/2016/ink" xmlns:am3d="http://schemas.microsoft.com/office/drawing/2017/model3d" xmlns:o="urn:schemas-microsoft-com:office:office" xmlns:oel="http://schemas.microsoft.com/office/2019/extlst" xmlns:r="http://schemas.openxmlformats.org/officeDocument/2006/relationships" xmlns:m="http://schemas.openxmlformats.org/officeDocument/2006/math" xmlns:v="urn:schemas-microsoft-com:vml" xmlns:wp14="http://schemas.microsoft.com/office/word/2010/wordprocessingDrawing" xmlns:wp="http://schemas.openxmlformats.org/drawingml/2006/wordprocessingDrawing" xmlns:w10="urn:schemas-microsoft-com:office:word" xmlns:w="http://schemas.openxmlformats.org/wordprocessingml/2006/main" xmlns:w14="http://schemas.microsoft.com/office/word/2010/wordml" xmlns:w15="http://schemas.microsoft.com/office/word/2012/wordml" xmlns:w16cex="http://schemas.microsoft.com/office/word/2018/wordml/cex" xmlns:w16cid="http://schemas.microsoft.com/office/word/2016/wordml/cid" xmlns:w16="http://schemas.microsoft.com/office/word/2018/wordml" xmlns:w16du="http://schemas.microsoft.com/office/word/2023/wordml/word16du" xmlns:w16sdtdh="http://schemas.microsoft.com/office/word/2020/wordml/sdtdatahash" xmlns:w16se="http://schemas.microsoft.com/office/word/2015/wordml/symex" xmlns:wpg="http://schemas.microsoft.com/office/word/2010/wordprocessingGroup" xmlns:wpi="http://schemas.microsoft.com/office/word/2010/wordprocessingInk" xmlns:wne="http://schemas.microsoft.com/office/word/2006/wordml" xmlns:wps="http://schemas.microsoft.com/office/word/2010/wordprocessingShape" mc:Ignorable="w14 w15 w16se w16cid w16 w16cex w16sdtdh w16du wp14">
   <w:body>
     <w:tbl>
       <w:tblPr>
@@ -9,16 +9,16 @@
         <w:tblLook w:val="04A0" w:firstRow="1" w:lastRow="0" w:firstColumn="1" w:lastColumn="0" w:noHBand="0" w:noVBand="1"/>
       </w:tblPr>
       <w:tblGrid>
-        <w:gridCol w:w="650"/>
-        <w:gridCol w:w="1066"/>
-        <w:gridCol w:w="1099"/>
-        <w:gridCol w:w="1208"/>
-        <w:gridCol w:w="4993"/>
+        <w:gridCol w:w="595"/>
+        <w:gridCol w:w="1012"/>
+        <w:gridCol w:w="989"/>
+        <w:gridCol w:w="1085"/>
+        <w:gridCol w:w="5335"/>
       </w:tblGrid>
       <w:tr>
         <w:tc>
           <w:tcPr>
-            <w:tcW w:w="650" w:type="dxa"/>
+            <w:tcW w:w="595" w:type="dxa"/>
           </w:tcPr>
           <w:p>
             <w:r>
@@ -28,7 +28,7 @@
         </w:tc>
         <w:tc>
           <w:tcPr>
-            <w:tcW w:w="1066" w:type="dxa"/>
+            <w:tcW w:w="1012" w:type="dxa"/>
           </w:tcPr>
           <w:p>
             <w:r>
@@ -38,7 +38,7 @@
         </w:tc>
         <w:tc>
           <w:tcPr>
-            <w:tcW w:w="1099" w:type="dxa"/>
+            <w:tcW w:w="989" w:type="dxa"/>
           </w:tcPr>
           <w:p>
             <w:r>
@@ -48,7 +48,7 @@
         </w:tc>
         <w:tc>
           <w:tcPr>
-            <w:tcW w:w="1208" w:type="dxa"/>
+            <w:tcW w:w="1510" w:type="dxa"/>
           </w:tcPr>
           <w:p>
             <w:r>
@@ -58,7 +58,7 @@
         </w:tc>
         <w:tc>
           <w:tcPr>
-            <w:tcW w:w="4993" w:type="dxa"/>
+            <w:tcW w:w="4910" w:type="dxa"/>
           </w:tcPr>
           <w:p>
             <w:r>
@@ -70,7 +70,7 @@
       <w:tr>
         <w:tc>
           <w:tcPr>
-            <w:tcW w:w="650" w:type="dxa"/>
+            <w:tcW w:w="595" w:type="dxa"/>
           </w:tcPr>
           <w:p>
             <w:r>
@@ -80,7 +80,7 @@
         </w:tc>
         <w:tc>
           <w:tcPr>
-            <w:tcW w:w="1066" w:type="dxa"/>
+            <w:tcW w:w="1012" w:type="dxa"/>
           </w:tcPr>
           <w:p>
             <w:r>
@@ -90,7 +90,7 @@
         </w:tc>
         <w:tc>
           <w:tcPr>
-            <w:tcW w:w="1099" w:type="dxa"/>
+            <w:tcW w:w="989" w:type="dxa"/>
           </w:tcPr>
           <w:p>
             <w:r>
@@ -100,7 +100,7 @@
         </w:tc>
         <w:tc>
           <w:tcPr>
-            <w:tcW w:w="1208" w:type="dxa"/>
+            <w:tcW w:w="1510" w:type="dxa"/>
           </w:tcPr>
           <w:p>
             <w:r>
@@ -118,7 +118,7 @@
         </w:tc>
         <w:tc>
           <w:tcPr>
-            <w:tcW w:w="4993" w:type="dxa"/>
+            <w:tcW w:w="4910" w:type="dxa"/>
           </w:tcPr>
           <w:p>
             <w:r>
@@ -135,7 +135,7 @@
       <w:tr>
         <w:tc>
           <w:tcPr>
-            <w:tcW w:w="650" w:type="dxa"/>
+            <w:tcW w:w="595" w:type="dxa"/>
           </w:tcPr>
           <w:p>
             <w:r>
@@ -145,7 +145,7 @@
         </w:tc>
         <w:tc>
           <w:tcPr>
-            <w:tcW w:w="1066" w:type="dxa"/>
+            <w:tcW w:w="1012" w:type="dxa"/>
           </w:tcPr>
           <w:p>
             <w:r>
@@ -155,7 +155,7 @@
         </w:tc>
         <w:tc>
           <w:tcPr>
-            <w:tcW w:w="1099" w:type="dxa"/>
+            <w:tcW w:w="989" w:type="dxa"/>
           </w:tcPr>
           <w:p>
             <w:r>
@@ -165,7 +165,7 @@
         </w:tc>
         <w:tc>
           <w:tcPr>
-            <w:tcW w:w="1208" w:type="dxa"/>
+            <w:tcW w:w="1510" w:type="dxa"/>
           </w:tcPr>
           <w:p>
             <w:r>
@@ -175,7 +175,7 @@
         </w:tc>
         <w:tc>
           <w:tcPr>
-            <w:tcW w:w="4993" w:type="dxa"/>
+            <w:tcW w:w="4910" w:type="dxa"/>
           </w:tcPr>
           <w:p>
             <w:r>
@@ -187,7 +187,7 @@
       <w:tr>
         <w:tc>
           <w:tcPr>
-            <w:tcW w:w="650" w:type="dxa"/>
+            <w:tcW w:w="595" w:type="dxa"/>
           </w:tcPr>
           <w:p>
             <w:r>
@@ -197,7 +197,7 @@
         </w:tc>
         <w:tc>
           <w:tcPr>
-            <w:tcW w:w="1066" w:type="dxa"/>
+            <w:tcW w:w="1012" w:type="dxa"/>
           </w:tcPr>
           <w:p>
             <w:r>
@@ -207,7 +207,7 @@
         </w:tc>
         <w:tc>
           <w:tcPr>
-            <w:tcW w:w="1099" w:type="dxa"/>
+            <w:tcW w:w="989" w:type="dxa"/>
           </w:tcPr>
           <w:p>
             <w:r>
@@ -217,7 +217,7 @@
         </w:tc>
         <w:tc>
           <w:tcPr>
-            <w:tcW w:w="1208" w:type="dxa"/>
+            <w:tcW w:w="1510" w:type="dxa"/>
           </w:tcPr>
           <w:p>
             <w:r>
@@ -227,7 +227,7 @@
         </w:tc>
         <w:tc>
           <w:tcPr>
-            <w:tcW w:w="4993" w:type="dxa"/>
+            <w:tcW w:w="4910" w:type="dxa"/>
           </w:tcPr>
           <w:p>
             <w:r>
@@ -239,7 +239,7 @@
       <w:tr>
         <w:tc>
           <w:tcPr>
-            <w:tcW w:w="650" w:type="dxa"/>
+            <w:tcW w:w="595" w:type="dxa"/>
           </w:tcPr>
           <w:p>
             <w:r>
@@ -249,7 +249,7 @@
         </w:tc>
         <w:tc>
           <w:tcPr>
-            <w:tcW w:w="1066" w:type="dxa"/>
+            <w:tcW w:w="1012" w:type="dxa"/>
           </w:tcPr>
           <w:p>
             <w:r>
@@ -259,7 +259,7 @@
         </w:tc>
         <w:tc>
           <w:tcPr>
-            <w:tcW w:w="1099" w:type="dxa"/>
+            <w:tcW w:w="989" w:type="dxa"/>
           </w:tcPr>
           <w:p>
             <w:r>
@@ -269,7 +269,7 @@
         </w:tc>
         <w:tc>
           <w:tcPr>
-            <w:tcW w:w="1208" w:type="dxa"/>
+            <w:tcW w:w="1510" w:type="dxa"/>
           </w:tcPr>
           <w:p>
             <w:r>
@@ -282,7 +282,7 @@
         </w:tc>
         <w:tc>
           <w:tcPr>
-            <w:tcW w:w="4993" w:type="dxa"/>
+            <w:tcW w:w="4910" w:type="dxa"/>
           </w:tcPr>
           <w:p/>
         </w:tc>
@@ -290,7 +290,7 @@
       <w:tr>
         <w:tc>
           <w:tcPr>
-            <w:tcW w:w="650" w:type="dxa"/>
+            <w:tcW w:w="595" w:type="dxa"/>
           </w:tcPr>
           <w:p>
             <w:r>
@@ -300,7 +300,7 @@
         </w:tc>
         <w:tc>
           <w:tcPr>
-            <w:tcW w:w="1066" w:type="dxa"/>
+            <w:tcW w:w="1012" w:type="dxa"/>
           </w:tcPr>
           <w:p>
             <w:r>
@@ -310,7 +310,7 @@
         </w:tc>
         <w:tc>
           <w:tcPr>
-            <w:tcW w:w="1099" w:type="dxa"/>
+            <w:tcW w:w="989" w:type="dxa"/>
           </w:tcPr>
           <w:p>
             <w:r>
@@ -320,7 +320,7 @@
         </w:tc>
         <w:tc>
           <w:tcPr>
-            <w:tcW w:w="1208" w:type="dxa"/>
+            <w:tcW w:w="1510" w:type="dxa"/>
           </w:tcPr>
           <w:p>
             <w:r>
@@ -330,7 +330,7 @@
         </w:tc>
         <w:tc>
           <w:tcPr>
-            <w:tcW w:w="4993" w:type="dxa"/>
+            <w:tcW w:w="4910" w:type="dxa"/>
           </w:tcPr>
           <w:p>
             <w:pPr>
@@ -444,7 +444,7 @@
       <w:tr>
         <w:tc>
           <w:tcPr>
-            <w:tcW w:w="650" w:type="dxa"/>
+            <w:tcW w:w="595" w:type="dxa"/>
           </w:tcPr>
           <w:p>
             <w:r>
@@ -454,7 +454,7 @@
         </w:tc>
         <w:tc>
           <w:tcPr>
-            <w:tcW w:w="1066" w:type="dxa"/>
+            <w:tcW w:w="1012" w:type="dxa"/>
           </w:tcPr>
           <w:p>
             <w:r>
@@ -464,7 +464,7 @@
         </w:tc>
         <w:tc>
           <w:tcPr>
-            <w:tcW w:w="1099" w:type="dxa"/>
+            <w:tcW w:w="989" w:type="dxa"/>
           </w:tcPr>
           <w:p>
             <w:r>
@@ -474,7 +474,7 @@
         </w:tc>
         <w:tc>
           <w:tcPr>
-            <w:tcW w:w="1208" w:type="dxa"/>
+            <w:tcW w:w="1510" w:type="dxa"/>
           </w:tcPr>
           <w:p>
             <w:r>
@@ -484,7 +484,7 @@
         </w:tc>
         <w:tc>
           <w:tcPr>
-            <w:tcW w:w="4993" w:type="dxa"/>
+            <w:tcW w:w="4910" w:type="dxa"/>
           </w:tcPr>
           <w:p>
             <w:r>
@@ -527,7 +527,6 @@
               <w:t xml:space="preserve">        </w:t>
             </w:r>
             <w:proofErr w:type="spellStart"/>
-            <w:proofErr w:type="gramStart"/>
             <w:r>
               <w:rPr>
                 <w:rFonts w:ascii="Consolas" w:eastAsia="Times New Roman" w:hAnsi="Consolas" w:cs="Times New Roman"/>
@@ -556,18 +555,7 @@
                 <w:szCs w:val="21"/>
                 <w:lang w:eastAsia="en-NZ"/>
               </w:rPr>
-              <w:t>hitbox</w:t>
-            </w:r>
-            <w:proofErr w:type="gramEnd"/>
-            <w:r>
-              <w:rPr>
-                <w:rFonts w:ascii="Consolas" w:eastAsia="Times New Roman" w:hAnsi="Consolas" w:cs="Times New Roman"/>
-                <w:color w:val="9CDCFE"/>
-                <w:sz w:val="21"/>
-                <w:szCs w:val="21"/>
-                <w:lang w:eastAsia="en-NZ"/>
-              </w:rPr>
-              <w:t>_texture</w:t>
+              <w:t>hitbox_texture</w:t>
             </w:r>
             <w:proofErr w:type="spellEnd"/>
             <w:r>
@@ -766,17 +754,18 @@
       <w:tr>
         <w:tc>
           <w:tcPr>
-            <w:tcW w:w="650" w:type="dxa"/>
-          </w:tcPr>
-          <w:p>
-            <w:r>
+            <w:tcW w:w="595" w:type="dxa"/>
+          </w:tcPr>
+          <w:p>
+            <w:r>
+              <w:lastRenderedPageBreak/>
               <w:t>18/03</w:t>
             </w:r>
           </w:p>
         </w:tc>
         <w:tc>
           <w:tcPr>
-            <w:tcW w:w="1066" w:type="dxa"/>
+            <w:tcW w:w="1012" w:type="dxa"/>
           </w:tcPr>
           <w:p>
             <w:r>
@@ -786,32 +775,27 @@
         </w:tc>
         <w:tc>
           <w:tcPr>
-            <w:tcW w:w="1099" w:type="dxa"/>
-          </w:tcPr>
-          <w:p>
-            <w:r>
-              <w:t xml:space="preserve">Character flips horizontally </w:t>
-            </w:r>
-            <w:r>
-              <w:lastRenderedPageBreak/>
-              <w:t>depending on direction</w:t>
-            </w:r>
-          </w:p>
-        </w:tc>
-        <w:tc>
-          <w:tcPr>
-            <w:tcW w:w="1208" w:type="dxa"/>
-          </w:tcPr>
-          <w:p>
-            <w:r>
-              <w:lastRenderedPageBreak/>
+            <w:tcW w:w="989" w:type="dxa"/>
+          </w:tcPr>
+          <w:p>
+            <w:r>
+              <w:t>Character flips horizontally depending on direction</w:t>
+            </w:r>
+          </w:p>
+        </w:tc>
+        <w:tc>
+          <w:tcPr>
+            <w:tcW w:w="1510" w:type="dxa"/>
+          </w:tcPr>
+          <w:p>
+            <w:r>
               <w:t>Sprite does not appear</w:t>
             </w:r>
           </w:p>
         </w:tc>
         <w:tc>
           <w:tcPr>
-            <w:tcW w:w="4993" w:type="dxa"/>
+            <w:tcW w:w="4910" w:type="dxa"/>
           </w:tcPr>
           <w:p>
             <w:r>
@@ -823,7 +807,7 @@
       <w:tr>
         <w:tc>
           <w:tcPr>
-            <w:tcW w:w="650" w:type="dxa"/>
+            <w:tcW w:w="595" w:type="dxa"/>
           </w:tcPr>
           <w:p>
             <w:r>
@@ -833,7 +817,7 @@
         </w:tc>
         <w:tc>
           <w:tcPr>
-            <w:tcW w:w="1066" w:type="dxa"/>
+            <w:tcW w:w="1012" w:type="dxa"/>
           </w:tcPr>
           <w:p>
             <w:r>
@@ -843,7 +827,7 @@
         </w:tc>
         <w:tc>
           <w:tcPr>
-            <w:tcW w:w="1099" w:type="dxa"/>
+            <w:tcW w:w="989" w:type="dxa"/>
           </w:tcPr>
           <w:p>
             <w:r>
@@ -853,7 +837,7 @@
         </w:tc>
         <w:tc>
           <w:tcPr>
-            <w:tcW w:w="1208" w:type="dxa"/>
+            <w:tcW w:w="1510" w:type="dxa"/>
           </w:tcPr>
           <w:p>
             <w:r>
@@ -863,7 +847,7 @@
         </w:tc>
         <w:tc>
           <w:tcPr>
-            <w:tcW w:w="4993" w:type="dxa"/>
+            <w:tcW w:w="4910" w:type="dxa"/>
           </w:tcPr>
           <w:p>
             <w:r>
@@ -875,7 +859,7 @@
       <w:tr>
         <w:tc>
           <w:tcPr>
-            <w:tcW w:w="650" w:type="dxa"/>
+            <w:tcW w:w="595" w:type="dxa"/>
           </w:tcPr>
           <w:p>
             <w:r>
@@ -885,7 +869,7 @@
         </w:tc>
         <w:tc>
           <w:tcPr>
-            <w:tcW w:w="1066" w:type="dxa"/>
+            <w:tcW w:w="1012" w:type="dxa"/>
           </w:tcPr>
           <w:p>
             <w:r>
@@ -895,7 +879,7 @@
         </w:tc>
         <w:tc>
           <w:tcPr>
-            <w:tcW w:w="1099" w:type="dxa"/>
+            <w:tcW w:w="989" w:type="dxa"/>
           </w:tcPr>
           <w:p>
             <w:r>
@@ -905,7 +889,7 @@
         </w:tc>
         <w:tc>
           <w:tcPr>
-            <w:tcW w:w="1208" w:type="dxa"/>
+            <w:tcW w:w="1510" w:type="dxa"/>
           </w:tcPr>
           <w:p>
             <w:r>
@@ -915,7 +899,7 @@
         </w:tc>
         <w:tc>
           <w:tcPr>
-            <w:tcW w:w="4993" w:type="dxa"/>
+            <w:tcW w:w="4910" w:type="dxa"/>
           </w:tcPr>
           <w:p>
             <w:r>
@@ -935,7 +919,7 @@
       <w:tr>
         <w:tc>
           <w:tcPr>
-            <w:tcW w:w="650" w:type="dxa"/>
+            <w:tcW w:w="595" w:type="dxa"/>
           </w:tcPr>
           <w:p>
             <w:r>
@@ -945,7 +929,7 @@
         </w:tc>
         <w:tc>
           <w:tcPr>
-            <w:tcW w:w="1066" w:type="dxa"/>
+            <w:tcW w:w="1012" w:type="dxa"/>
           </w:tcPr>
           <w:p>
             <w:r>
@@ -955,7 +939,7 @@
         </w:tc>
         <w:tc>
           <w:tcPr>
-            <w:tcW w:w="1099" w:type="dxa"/>
+            <w:tcW w:w="989" w:type="dxa"/>
           </w:tcPr>
           <w:p>
             <w:r>
@@ -965,7 +949,7 @@
         </w:tc>
         <w:tc>
           <w:tcPr>
-            <w:tcW w:w="1208" w:type="dxa"/>
+            <w:tcW w:w="1510" w:type="dxa"/>
           </w:tcPr>
           <w:p>
             <w:r>
@@ -975,7 +959,7 @@
         </w:tc>
         <w:tc>
           <w:tcPr>
-            <w:tcW w:w="4993" w:type="dxa"/>
+            <w:tcW w:w="4910" w:type="dxa"/>
           </w:tcPr>
           <w:p>
             <w:r>
@@ -988,7 +972,7 @@
       <w:tr>
         <w:tc>
           <w:tcPr>
-            <w:tcW w:w="650" w:type="dxa"/>
+            <w:tcW w:w="595" w:type="dxa"/>
           </w:tcPr>
           <w:p>
             <w:r>
@@ -998,7 +982,7 @@
         </w:tc>
         <w:tc>
           <w:tcPr>
-            <w:tcW w:w="1066" w:type="dxa"/>
+            <w:tcW w:w="1012" w:type="dxa"/>
           </w:tcPr>
           <w:p>
             <w:r>
@@ -1008,7 +992,7 @@
         </w:tc>
         <w:tc>
           <w:tcPr>
-            <w:tcW w:w="1099" w:type="dxa"/>
+            <w:tcW w:w="989" w:type="dxa"/>
           </w:tcPr>
           <w:p>
             <w:r>
@@ -1018,7 +1002,7 @@
         </w:tc>
         <w:tc>
           <w:tcPr>
-            <w:tcW w:w="1208" w:type="dxa"/>
+            <w:tcW w:w="1510" w:type="dxa"/>
           </w:tcPr>
           <w:p>
             <w:r>
@@ -1028,7 +1012,7 @@
         </w:tc>
         <w:tc>
           <w:tcPr>
-            <w:tcW w:w="4993" w:type="dxa"/>
+            <w:tcW w:w="4910" w:type="dxa"/>
           </w:tcPr>
           <w:p>
             <w:pPr>
@@ -1063,7 +1047,6 @@
               <w:t xml:space="preserve"> </w:t>
             </w:r>
             <w:proofErr w:type="spellStart"/>
-            <w:proofErr w:type="gramStart"/>
             <w:r>
               <w:rPr>
                 <w:rFonts w:ascii="Consolas" w:eastAsia="Times New Roman" w:hAnsi="Consolas" w:cs="Times New Roman"/>
@@ -1092,18 +1075,7 @@
                 <w:szCs w:val="21"/>
                 <w:lang w:eastAsia="en-NZ"/>
               </w:rPr>
-              <w:t>change</w:t>
-            </w:r>
-            <w:proofErr w:type="gramEnd"/>
-            <w:r>
-              <w:rPr>
-                <w:rFonts w:ascii="Consolas" w:eastAsia="Times New Roman" w:hAnsi="Consolas" w:cs="Times New Roman"/>
-                <w:color w:val="9CDCFE"/>
-                <w:sz w:val="21"/>
-                <w:szCs w:val="21"/>
-                <w:lang w:eastAsia="en-NZ"/>
-              </w:rPr>
-              <w:t>_y</w:t>
+              <w:t>change_y</w:t>
             </w:r>
             <w:proofErr w:type="spellEnd"/>
             <w:r>
@@ -1180,7 +1152,6 @@
               <w:t xml:space="preserve">            </w:t>
             </w:r>
             <w:proofErr w:type="spellStart"/>
-            <w:proofErr w:type="gramStart"/>
             <w:r>
               <w:rPr>
                 <w:rFonts w:ascii="Consolas" w:eastAsia="Times New Roman" w:hAnsi="Consolas" w:cs="Times New Roman"/>
@@ -1212,7 +1183,6 @@
               <w:t>texture</w:t>
             </w:r>
             <w:proofErr w:type="spellEnd"/>
-            <w:proofErr w:type="gramEnd"/>
             <w:r>
               <w:rPr>
                 <w:rFonts w:ascii="Consolas" w:eastAsia="Times New Roman" w:hAnsi="Consolas" w:cs="Times New Roman"/>
@@ -1391,7 +1361,6 @@
               <w:t xml:space="preserve"> </w:t>
             </w:r>
             <w:proofErr w:type="spellStart"/>
-            <w:proofErr w:type="gramStart"/>
             <w:r>
               <w:rPr>
                 <w:rFonts w:ascii="Consolas" w:eastAsia="Times New Roman" w:hAnsi="Consolas" w:cs="Times New Roman"/>
@@ -1420,18 +1389,7 @@
                 <w:szCs w:val="21"/>
                 <w:lang w:eastAsia="en-NZ"/>
               </w:rPr>
-              <w:t>change</w:t>
-            </w:r>
-            <w:proofErr w:type="gramEnd"/>
-            <w:r>
-              <w:rPr>
-                <w:rFonts w:ascii="Consolas" w:eastAsia="Times New Roman" w:hAnsi="Consolas" w:cs="Times New Roman"/>
-                <w:color w:val="9CDCFE"/>
-                <w:sz w:val="21"/>
-                <w:szCs w:val="21"/>
-                <w:lang w:eastAsia="en-NZ"/>
-              </w:rPr>
-              <w:t>_y</w:t>
+              <w:t>change_y</w:t>
             </w:r>
             <w:proofErr w:type="spellEnd"/>
             <w:r>
@@ -1518,7 +1476,6 @@
               <w:t xml:space="preserve">            </w:t>
             </w:r>
             <w:proofErr w:type="spellStart"/>
-            <w:proofErr w:type="gramStart"/>
             <w:r>
               <w:rPr>
                 <w:rFonts w:ascii="Consolas" w:eastAsia="Times New Roman" w:hAnsi="Consolas" w:cs="Times New Roman"/>
@@ -1550,7 +1507,6 @@
               <w:t>texture</w:t>
             </w:r>
             <w:proofErr w:type="spellEnd"/>
-            <w:proofErr w:type="gramEnd"/>
             <w:r>
               <w:rPr>
                 <w:rFonts w:ascii="Consolas" w:eastAsia="Times New Roman" w:hAnsi="Consolas" w:cs="Times New Roman"/>
@@ -1697,7 +1653,7 @@
       <w:tr>
         <w:tc>
           <w:tcPr>
-            <w:tcW w:w="650" w:type="dxa"/>
+            <w:tcW w:w="595" w:type="dxa"/>
           </w:tcPr>
           <w:p>
             <w:r>
@@ -1707,7 +1663,7 @@
         </w:tc>
         <w:tc>
           <w:tcPr>
-            <w:tcW w:w="1066" w:type="dxa"/>
+            <w:tcW w:w="1012" w:type="dxa"/>
           </w:tcPr>
           <w:p>
             <w:r>
@@ -1717,7 +1673,7 @@
         </w:tc>
         <w:tc>
           <w:tcPr>
-            <w:tcW w:w="1099" w:type="dxa"/>
+            <w:tcW w:w="989" w:type="dxa"/>
           </w:tcPr>
           <w:p>
             <w:r>
@@ -1727,7 +1683,7 @@
         </w:tc>
         <w:tc>
           <w:tcPr>
-            <w:tcW w:w="1208" w:type="dxa"/>
+            <w:tcW w:w="1510" w:type="dxa"/>
           </w:tcPr>
           <w:p>
             <w:r>
@@ -1737,7 +1693,7 @@
         </w:tc>
         <w:tc>
           <w:tcPr>
-            <w:tcW w:w="4993" w:type="dxa"/>
+            <w:tcW w:w="4910" w:type="dxa"/>
           </w:tcPr>
           <w:p>
             <w:pPr>
@@ -1757,17 +1713,18 @@
       <w:tr>
         <w:tc>
           <w:tcPr>
-            <w:tcW w:w="650" w:type="dxa"/>
-          </w:tcPr>
-          <w:p>
-            <w:r>
+            <w:tcW w:w="595" w:type="dxa"/>
+          </w:tcPr>
+          <w:p>
+            <w:r>
+              <w:lastRenderedPageBreak/>
               <w:t>18/04</w:t>
             </w:r>
           </w:p>
         </w:tc>
         <w:tc>
           <w:tcPr>
-            <w:tcW w:w="1066" w:type="dxa"/>
+            <w:tcW w:w="1012" w:type="dxa"/>
           </w:tcPr>
           <w:p>
             <w:r>
@@ -1777,7 +1734,7 @@
         </w:tc>
         <w:tc>
           <w:tcPr>
-            <w:tcW w:w="1099" w:type="dxa"/>
+            <w:tcW w:w="989" w:type="dxa"/>
           </w:tcPr>
           <w:p>
             <w:r>
@@ -1787,7 +1744,7 @@
         </w:tc>
         <w:tc>
           <w:tcPr>
-            <w:tcW w:w="1208" w:type="dxa"/>
+            <w:tcW w:w="1510" w:type="dxa"/>
           </w:tcPr>
           <w:p>
             <w:r>
@@ -1797,7 +1754,7 @@
         </w:tc>
         <w:tc>
           <w:tcPr>
-            <w:tcW w:w="4993" w:type="dxa"/>
+            <w:tcW w:w="4910" w:type="dxa"/>
           </w:tcPr>
           <w:p>
             <w:pPr>
@@ -1806,6 +1763,275 @@
               <w:rPr>
                 <w:rFonts w:ascii="Consolas" w:eastAsia="Times New Roman" w:hAnsi="Consolas" w:cs="Times New Roman"/>
                 <w:color w:val="C586C0"/>
+                <w:sz w:val="21"/>
+                <w:szCs w:val="21"/>
+                <w:lang w:eastAsia="en-NZ"/>
+              </w:rPr>
+            </w:pPr>
+            <w:r>
+              <w:rPr>
+                <w:rFonts w:ascii="Consolas" w:eastAsia="Times New Roman" w:hAnsi="Consolas" w:cs="Times New Roman"/>
+                <w:color w:val="CCCCCC"/>
+                <w:sz w:val="21"/>
+                <w:szCs w:val="21"/>
+                <w:lang w:eastAsia="en-NZ"/>
+              </w:rPr>
+              <w:t> </w:t>
+            </w:r>
+            <w:r>
+              <w:rPr>
+                <w:rFonts w:ascii="Consolas" w:eastAsia="Times New Roman" w:hAnsi="Consolas" w:cs="Times New Roman"/>
+                <w:color w:val="CCCCCC"/>
+                <w:sz w:val="21"/>
+                <w:szCs w:val="21"/>
+                <w:lang w:eastAsia="en-NZ"/>
+              </w:rPr>
+              <w:drawing>
+                <wp:inline distT="0" distB="0" distL="0" distR="0" wp14:anchorId="13DCFD48" wp14:editId="1FED5D0B">
+                  <wp:extent cx="4591691" cy="1305107"/>
+                  <wp:effectExtent l="0" t="0" r="0" b="9525"/>
+                  <wp:docPr id="1854480239" name="Picture 1"/>
+                  <wp:cNvGraphicFramePr>
+                    <a:graphicFrameLocks xmlns:a="http://schemas.openxmlformats.org/drawingml/2006/main" noChangeAspect="1"/>
+                  </wp:cNvGraphicFramePr>
+                  <a:graphic xmlns:a="http://schemas.openxmlformats.org/drawingml/2006/main">
+                    <a:graphicData uri="http://schemas.openxmlformats.org/drawingml/2006/picture">
+                      <pic:pic xmlns:pic="http://schemas.openxmlformats.org/drawingml/2006/picture">
+                        <pic:nvPicPr>
+                          <pic:cNvPr id="1854480239" name=""/>
+                          <pic:cNvPicPr/>
+                        </pic:nvPicPr>
+                        <pic:blipFill>
+                          <a:blip r:embed="rId4"/>
+                          <a:stretch>
+                            <a:fillRect/>
+                          </a:stretch>
+                        </pic:blipFill>
+                        <pic:spPr>
+                          <a:xfrm>
+                            <a:off x="0" y="0"/>
+                            <a:ext cx="4591691" cy="1305107"/>
+                          </a:xfrm>
+                          <a:prstGeom prst="rect">
+                            <a:avLst/>
+                          </a:prstGeom>
+                        </pic:spPr>
+                      </pic:pic>
+                    </a:graphicData>
+                  </a:graphic>
+                </wp:inline>
+              </w:drawing>
+            </w:r>
+          </w:p>
+        </w:tc>
+      </w:tr>
+      <w:tr>
+        <w:trPr>
+          <w:trHeight w:val="396"/>
+        </w:trPr>
+        <w:tc>
+          <w:tcPr>
+            <w:tcW w:w="595" w:type="dxa"/>
+          </w:tcPr>
+          <w:p>
+            <w:r>
+              <w:t>1</w:t>
+            </w:r>
+            <w:r>
+              <w:t>9</w:t>
+            </w:r>
+            <w:r>
+              <w:t>/04</w:t>
+            </w:r>
+          </w:p>
+        </w:tc>
+        <w:tc>
+          <w:tcPr>
+            <w:tcW w:w="1012" w:type="dxa"/>
+          </w:tcPr>
+          <w:p>
+            <w:r>
+              <w:t>Falling animation</w:t>
+            </w:r>
+          </w:p>
+        </w:tc>
+        <w:tc>
+          <w:tcPr>
+            <w:tcW w:w="989" w:type="dxa"/>
+          </w:tcPr>
+          <w:p>
+            <w:r>
+              <w:t>One cycle of the animation is run</w:t>
+            </w:r>
+          </w:p>
+        </w:tc>
+        <w:tc>
+          <w:tcPr>
+            <w:tcW w:w="1510" w:type="dxa"/>
+          </w:tcPr>
+          <w:p>
+            <w:r>
+              <w:t>Animations play in correct order</w:t>
+            </w:r>
+          </w:p>
+        </w:tc>
+        <w:tc>
+          <w:tcPr>
+            <w:tcW w:w="4910" w:type="dxa"/>
+          </w:tcPr>
+          <w:p>
+            <w:pPr>
+              <w:shd w:val="clear" w:color="auto" w:fill="1F1F1F"/>
+              <w:spacing w:line="285" w:lineRule="atLeast"/>
+              <w:rPr>
+                <w:rFonts w:ascii="Consolas" w:eastAsia="Times New Roman" w:hAnsi="Consolas" w:cs="Times New Roman"/>
+                <w:color w:val="CCCCCC"/>
+                <w:sz w:val="21"/>
+                <w:szCs w:val="21"/>
+                <w:lang w:eastAsia="en-NZ"/>
+              </w:rPr>
+            </w:pPr>
+            <w:r>
+              <w:rPr>
+                <w:rFonts w:ascii="Consolas" w:eastAsia="Times New Roman" w:hAnsi="Consolas" w:cs="Times New Roman"/>
+                <w:color w:val="CCCCCC"/>
+                <w:sz w:val="21"/>
+                <w:szCs w:val="21"/>
+                <w:lang w:eastAsia="en-NZ"/>
+              </w:rPr>
+              <w:t>None</w:t>
+            </w:r>
+          </w:p>
+        </w:tc>
+      </w:tr>
+      <w:tr>
+        <w:trPr>
+          <w:trHeight w:val="396"/>
+        </w:trPr>
+        <w:tc>
+          <w:tcPr>
+            <w:tcW w:w="595" w:type="dxa"/>
+          </w:tcPr>
+          <w:p>
+            <w:r>
+              <w:t>20/4</w:t>
+            </w:r>
+          </w:p>
+        </w:tc>
+        <w:tc>
+          <w:tcPr>
+            <w:tcW w:w="1012" w:type="dxa"/>
+          </w:tcPr>
+          <w:p>
+            <w:r>
+              <w:t>Background image layer</w:t>
+            </w:r>
+          </w:p>
+        </w:tc>
+        <w:tc>
+          <w:tcPr>
+            <w:tcW w:w="989" w:type="dxa"/>
+          </w:tcPr>
+          <w:p>
+            <w:r>
+              <w:t>Image layer is correct size and position</w:t>
+            </w:r>
+          </w:p>
+        </w:tc>
+        <w:tc>
+          <w:tcPr>
+            <w:tcW w:w="1510" w:type="dxa"/>
+          </w:tcPr>
+          <w:p>
+            <w:r>
+              <w:t>Image is not in right position</w:t>
+            </w:r>
+          </w:p>
+        </w:tc>
+        <w:tc>
+          <w:tcPr>
+            <w:tcW w:w="4910" w:type="dxa"/>
+          </w:tcPr>
+          <w:p>
+            <w:pPr>
+              <w:shd w:val="clear" w:color="auto" w:fill="1F1F1F"/>
+              <w:spacing w:line="285" w:lineRule="atLeast"/>
+              <w:rPr>
+                <w:rFonts w:ascii="Consolas" w:eastAsia="Times New Roman" w:hAnsi="Consolas" w:cs="Times New Roman"/>
+                <w:color w:val="CCCCCC"/>
+                <w:sz w:val="21"/>
+                <w:szCs w:val="21"/>
+                <w:lang w:eastAsia="en-NZ"/>
+              </w:rPr>
+            </w:pPr>
+            <w:r>
+              <w:rPr>
+                <w:rFonts w:ascii="Consolas" w:eastAsia="Times New Roman" w:hAnsi="Consolas" w:cs="Times New Roman"/>
+                <w:color w:val="CCCCCC"/>
+                <w:sz w:val="21"/>
+                <w:szCs w:val="21"/>
+                <w:lang w:eastAsia="en-NZ"/>
+              </w:rPr>
+              <w:t>Realigned position of image layer</w:t>
+            </w:r>
+          </w:p>
+        </w:tc>
+      </w:tr>
+      <w:tr>
+        <w:trPr>
+          <w:trHeight w:val="396"/>
+        </w:trPr>
+        <w:tc>
+          <w:tcPr>
+            <w:tcW w:w="595" w:type="dxa"/>
+          </w:tcPr>
+          <w:p>
+            <w:r>
+              <w:t>20/4</w:t>
+            </w:r>
+          </w:p>
+        </w:tc>
+        <w:tc>
+          <w:tcPr>
+            <w:tcW w:w="1012" w:type="dxa"/>
+          </w:tcPr>
+          <w:p>
+            <w:r>
+              <w:t>Background image layer</w:t>
+            </w:r>
+          </w:p>
+        </w:tc>
+        <w:tc>
+          <w:tcPr>
+            <w:tcW w:w="989" w:type="dxa"/>
+          </w:tcPr>
+          <w:p>
+            <w:r>
+              <w:t>Image layer is correct size and position</w:t>
+            </w:r>
+          </w:p>
+        </w:tc>
+        <w:tc>
+          <w:tcPr>
+            <w:tcW w:w="1510" w:type="dxa"/>
+          </w:tcPr>
+          <w:p>
+            <w:r>
+              <w:t>Image is not in right position</w:t>
+            </w:r>
+          </w:p>
+        </w:tc>
+        <w:tc>
+          <w:tcPr>
+            <w:tcW w:w="4910" w:type="dxa"/>
+          </w:tcPr>
+          <w:p>
+            <w:pPr>
+              <w:shd w:val="clear" w:color="auto" w:fill="1F1F1F"/>
+              <w:spacing w:line="285" w:lineRule="atLeast"/>
+              <w:rPr>
+                <w:rFonts w:ascii="Consolas" w:eastAsia="Times New Roman" w:hAnsi="Consolas" w:cs="Times New Roman"/>
+                <w:color w:val="CCCCCC"/>
                 <w:sz w:val="21"/>
                 <w:szCs w:val="21"/>
                 <w:lang w:eastAsia="en-NZ"/>
@@ -1827,7 +2053,7 @@
 </file>
 
 <file path=word/styles.xml><?xml version="1.0" encoding="utf-8"?>
-<w:styles xmlns:mc="http://schemas.openxmlformats.org/markup-compatibility/2006" xmlns:r="http://schemas.openxmlformats.org/officeDocument/2006/relationships" xmlns:w="http://schemas.openxmlformats.org/wordprocessingml/2006/main" xmlns:w14="http://schemas.microsoft.com/office/word/2010/wordml" xmlns:w15="http://schemas.microsoft.com/office/word/2012/wordml" xmlns:w16cex="http://schemas.microsoft.com/office/word/2018/wordml/cex" xmlns:w16cid="http://schemas.microsoft.com/office/word/2016/wordml/cid" xmlns:w16="http://schemas.microsoft.com/office/word/2018/wordml" xmlns:w16sdtdh="http://schemas.microsoft.com/office/word/2020/wordml/sdtdatahash" xmlns:w16se="http://schemas.microsoft.com/office/word/2015/wordml/symex" mc:Ignorable="w14 w15 w16se w16cid w16 w16cex w16sdtdh">
+<w:styles xmlns:mc="http://schemas.openxmlformats.org/markup-compatibility/2006" xmlns:r="http://schemas.openxmlformats.org/officeDocument/2006/relationships" xmlns:w="http://schemas.openxmlformats.org/wordprocessingml/2006/main" xmlns:w14="http://schemas.microsoft.com/office/word/2010/wordml" xmlns:w15="http://schemas.microsoft.com/office/word/2012/wordml" xmlns:w16cex="http://schemas.microsoft.com/office/word/2018/wordml/cex" xmlns:w16cid="http://schemas.microsoft.com/office/word/2016/wordml/cid" xmlns:w16="http://schemas.microsoft.com/office/word/2018/wordml" xmlns:w16du="http://schemas.microsoft.com/office/word/2023/wordml/word16du" xmlns:w16sdtdh="http://schemas.microsoft.com/office/word/2020/wordml/sdtdatahash" xmlns:w16se="http://schemas.microsoft.com/office/word/2015/wordml/symex" mc:Ignorable="w14 w15 w16se w16cid w16 w16cex w16sdtdh w16du">
   <w:docDefaults>
     <w:rPrDefault>
       <w:rPr>

</xml_diff>

<commit_message>
can't get enemies to move
</commit_message>
<xml_diff>
--- a/documentation/ongoing_testing.docx
+++ b/documentation/ongoing_testing.docx
@@ -5,20 +5,21 @@
     <w:tbl>
       <w:tblPr>
         <w:tblStyle w:val="TableGrid"/>
-        <w:tblW w:w="0" w:type="auto"/>
+        <w:tblW w:w="12471" w:type="dxa"/>
+        <w:tblInd w:w="-856" w:type="dxa"/>
         <w:tblLook w:val="04A0" w:firstRow="1" w:lastRow="0" w:firstColumn="1" w:lastColumn="0" w:noHBand="0" w:noVBand="1"/>
       </w:tblPr>
       <w:tblGrid>
-        <w:gridCol w:w="595"/>
-        <w:gridCol w:w="1012"/>
-        <w:gridCol w:w="989"/>
-        <w:gridCol w:w="1085"/>
-        <w:gridCol w:w="5335"/>
+        <w:gridCol w:w="761"/>
+        <w:gridCol w:w="1358"/>
+        <w:gridCol w:w="1326"/>
+        <w:gridCol w:w="1463"/>
+        <w:gridCol w:w="7563"/>
       </w:tblGrid>
       <w:tr>
         <w:tc>
           <w:tcPr>
-            <w:tcW w:w="595" w:type="dxa"/>
+            <w:tcW w:w="761" w:type="dxa"/>
           </w:tcPr>
           <w:p>
             <w:r>
@@ -28,7 +29,7 @@
         </w:tc>
         <w:tc>
           <w:tcPr>
-            <w:tcW w:w="1012" w:type="dxa"/>
+            <w:tcW w:w="1358" w:type="dxa"/>
           </w:tcPr>
           <w:p>
             <w:r>
@@ -38,7 +39,7 @@
         </w:tc>
         <w:tc>
           <w:tcPr>
-            <w:tcW w:w="989" w:type="dxa"/>
+            <w:tcW w:w="1326" w:type="dxa"/>
           </w:tcPr>
           <w:p>
             <w:r>
@@ -48,7 +49,7 @@
         </w:tc>
         <w:tc>
           <w:tcPr>
-            <w:tcW w:w="1510" w:type="dxa"/>
+            <w:tcW w:w="1463" w:type="dxa"/>
           </w:tcPr>
           <w:p>
             <w:r>
@@ -58,7 +59,7 @@
         </w:tc>
         <w:tc>
           <w:tcPr>
-            <w:tcW w:w="4910" w:type="dxa"/>
+            <w:tcW w:w="7563" w:type="dxa"/>
           </w:tcPr>
           <w:p>
             <w:r>
@@ -70,7 +71,7 @@
       <w:tr>
         <w:tc>
           <w:tcPr>
-            <w:tcW w:w="595" w:type="dxa"/>
+            <w:tcW w:w="761" w:type="dxa"/>
           </w:tcPr>
           <w:p>
             <w:r>
@@ -80,7 +81,7 @@
         </w:tc>
         <w:tc>
           <w:tcPr>
-            <w:tcW w:w="1012" w:type="dxa"/>
+            <w:tcW w:w="1358" w:type="dxa"/>
           </w:tcPr>
           <w:p>
             <w:r>
@@ -90,7 +91,7 @@
         </w:tc>
         <w:tc>
           <w:tcPr>
-            <w:tcW w:w="989" w:type="dxa"/>
+            <w:tcW w:w="1326" w:type="dxa"/>
           </w:tcPr>
           <w:p>
             <w:r>
@@ -100,7 +101,7 @@
         </w:tc>
         <w:tc>
           <w:tcPr>
-            <w:tcW w:w="1510" w:type="dxa"/>
+            <w:tcW w:w="1463" w:type="dxa"/>
           </w:tcPr>
           <w:p>
             <w:r>
@@ -118,7 +119,7 @@
         </w:tc>
         <w:tc>
           <w:tcPr>
-            <w:tcW w:w="4910" w:type="dxa"/>
+            <w:tcW w:w="7563" w:type="dxa"/>
           </w:tcPr>
           <w:p>
             <w:r>
@@ -135,7 +136,7 @@
       <w:tr>
         <w:tc>
           <w:tcPr>
-            <w:tcW w:w="595" w:type="dxa"/>
+            <w:tcW w:w="761" w:type="dxa"/>
           </w:tcPr>
           <w:p>
             <w:r>
@@ -145,7 +146,7 @@
         </w:tc>
         <w:tc>
           <w:tcPr>
-            <w:tcW w:w="1012" w:type="dxa"/>
+            <w:tcW w:w="1358" w:type="dxa"/>
           </w:tcPr>
           <w:p>
             <w:r>
@@ -155,7 +156,7 @@
         </w:tc>
         <w:tc>
           <w:tcPr>
-            <w:tcW w:w="989" w:type="dxa"/>
+            <w:tcW w:w="1326" w:type="dxa"/>
           </w:tcPr>
           <w:p>
             <w:r>
@@ -165,7 +166,7 @@
         </w:tc>
         <w:tc>
           <w:tcPr>
-            <w:tcW w:w="1510" w:type="dxa"/>
+            <w:tcW w:w="1463" w:type="dxa"/>
           </w:tcPr>
           <w:p>
             <w:r>
@@ -175,7 +176,7 @@
         </w:tc>
         <w:tc>
           <w:tcPr>
-            <w:tcW w:w="4910" w:type="dxa"/>
+            <w:tcW w:w="7563" w:type="dxa"/>
           </w:tcPr>
           <w:p>
             <w:r>
@@ -187,7 +188,7 @@
       <w:tr>
         <w:tc>
           <w:tcPr>
-            <w:tcW w:w="595" w:type="dxa"/>
+            <w:tcW w:w="761" w:type="dxa"/>
           </w:tcPr>
           <w:p>
             <w:r>
@@ -197,7 +198,7 @@
         </w:tc>
         <w:tc>
           <w:tcPr>
-            <w:tcW w:w="1012" w:type="dxa"/>
+            <w:tcW w:w="1358" w:type="dxa"/>
           </w:tcPr>
           <w:p>
             <w:r>
@@ -207,7 +208,7 @@
         </w:tc>
         <w:tc>
           <w:tcPr>
-            <w:tcW w:w="989" w:type="dxa"/>
+            <w:tcW w:w="1326" w:type="dxa"/>
           </w:tcPr>
           <w:p>
             <w:r>
@@ -217,7 +218,7 @@
         </w:tc>
         <w:tc>
           <w:tcPr>
-            <w:tcW w:w="1510" w:type="dxa"/>
+            <w:tcW w:w="1463" w:type="dxa"/>
           </w:tcPr>
           <w:p>
             <w:r>
@@ -227,7 +228,7 @@
         </w:tc>
         <w:tc>
           <w:tcPr>
-            <w:tcW w:w="4910" w:type="dxa"/>
+            <w:tcW w:w="7563" w:type="dxa"/>
           </w:tcPr>
           <w:p>
             <w:r>
@@ -239,7 +240,7 @@
       <w:tr>
         <w:tc>
           <w:tcPr>
-            <w:tcW w:w="595" w:type="dxa"/>
+            <w:tcW w:w="761" w:type="dxa"/>
           </w:tcPr>
           <w:p>
             <w:r>
@@ -249,7 +250,7 @@
         </w:tc>
         <w:tc>
           <w:tcPr>
-            <w:tcW w:w="1012" w:type="dxa"/>
+            <w:tcW w:w="1358" w:type="dxa"/>
           </w:tcPr>
           <w:p>
             <w:r>
@@ -259,7 +260,7 @@
         </w:tc>
         <w:tc>
           <w:tcPr>
-            <w:tcW w:w="989" w:type="dxa"/>
+            <w:tcW w:w="1326" w:type="dxa"/>
           </w:tcPr>
           <w:p>
             <w:r>
@@ -269,7 +270,7 @@
         </w:tc>
         <w:tc>
           <w:tcPr>
-            <w:tcW w:w="1510" w:type="dxa"/>
+            <w:tcW w:w="1463" w:type="dxa"/>
           </w:tcPr>
           <w:p>
             <w:r>
@@ -282,7 +283,7 @@
         </w:tc>
         <w:tc>
           <w:tcPr>
-            <w:tcW w:w="4910" w:type="dxa"/>
+            <w:tcW w:w="7563" w:type="dxa"/>
           </w:tcPr>
           <w:p/>
         </w:tc>
@@ -290,7 +291,7 @@
       <w:tr>
         <w:tc>
           <w:tcPr>
-            <w:tcW w:w="595" w:type="dxa"/>
+            <w:tcW w:w="761" w:type="dxa"/>
           </w:tcPr>
           <w:p>
             <w:r>
@@ -300,7 +301,7 @@
         </w:tc>
         <w:tc>
           <w:tcPr>
-            <w:tcW w:w="1012" w:type="dxa"/>
+            <w:tcW w:w="1358" w:type="dxa"/>
           </w:tcPr>
           <w:p>
             <w:r>
@@ -310,7 +311,7 @@
         </w:tc>
         <w:tc>
           <w:tcPr>
-            <w:tcW w:w="989" w:type="dxa"/>
+            <w:tcW w:w="1326" w:type="dxa"/>
           </w:tcPr>
           <w:p>
             <w:r>
@@ -320,7 +321,7 @@
         </w:tc>
         <w:tc>
           <w:tcPr>
-            <w:tcW w:w="1510" w:type="dxa"/>
+            <w:tcW w:w="1463" w:type="dxa"/>
           </w:tcPr>
           <w:p>
             <w:r>
@@ -330,7 +331,7 @@
         </w:tc>
         <w:tc>
           <w:tcPr>
-            <w:tcW w:w="4910" w:type="dxa"/>
+            <w:tcW w:w="7563" w:type="dxa"/>
           </w:tcPr>
           <w:p>
             <w:pPr>
@@ -444,7 +445,7 @@
       <w:tr>
         <w:tc>
           <w:tcPr>
-            <w:tcW w:w="595" w:type="dxa"/>
+            <w:tcW w:w="761" w:type="dxa"/>
           </w:tcPr>
           <w:p>
             <w:r>
@@ -454,7 +455,7 @@
         </w:tc>
         <w:tc>
           <w:tcPr>
-            <w:tcW w:w="1012" w:type="dxa"/>
+            <w:tcW w:w="1358" w:type="dxa"/>
           </w:tcPr>
           <w:p>
             <w:r>
@@ -464,7 +465,7 @@
         </w:tc>
         <w:tc>
           <w:tcPr>
-            <w:tcW w:w="989" w:type="dxa"/>
+            <w:tcW w:w="1326" w:type="dxa"/>
           </w:tcPr>
           <w:p>
             <w:r>
@@ -474,7 +475,7 @@
         </w:tc>
         <w:tc>
           <w:tcPr>
-            <w:tcW w:w="1510" w:type="dxa"/>
+            <w:tcW w:w="1463" w:type="dxa"/>
           </w:tcPr>
           <w:p>
             <w:r>
@@ -484,7 +485,7 @@
         </w:tc>
         <w:tc>
           <w:tcPr>
-            <w:tcW w:w="4910" w:type="dxa"/>
+            <w:tcW w:w="7563" w:type="dxa"/>
           </w:tcPr>
           <w:p>
             <w:r>
@@ -754,18 +755,17 @@
       <w:tr>
         <w:tc>
           <w:tcPr>
-            <w:tcW w:w="595" w:type="dxa"/>
-          </w:tcPr>
-          <w:p>
-            <w:r>
-              <w:lastRenderedPageBreak/>
+            <w:tcW w:w="761" w:type="dxa"/>
+          </w:tcPr>
+          <w:p>
+            <w:r>
               <w:t>18/03</w:t>
             </w:r>
           </w:p>
         </w:tc>
         <w:tc>
           <w:tcPr>
-            <w:tcW w:w="1012" w:type="dxa"/>
+            <w:tcW w:w="1358" w:type="dxa"/>
           </w:tcPr>
           <w:p>
             <w:r>
@@ -775,7 +775,7 @@
         </w:tc>
         <w:tc>
           <w:tcPr>
-            <w:tcW w:w="989" w:type="dxa"/>
+            <w:tcW w:w="1326" w:type="dxa"/>
           </w:tcPr>
           <w:p>
             <w:r>
@@ -785,7 +785,7 @@
         </w:tc>
         <w:tc>
           <w:tcPr>
-            <w:tcW w:w="1510" w:type="dxa"/>
+            <w:tcW w:w="1463" w:type="dxa"/>
           </w:tcPr>
           <w:p>
             <w:r>
@@ -795,7 +795,7 @@
         </w:tc>
         <w:tc>
           <w:tcPr>
-            <w:tcW w:w="4910" w:type="dxa"/>
+            <w:tcW w:w="7563" w:type="dxa"/>
           </w:tcPr>
           <w:p>
             <w:r>
@@ -807,7 +807,7 @@
       <w:tr>
         <w:tc>
           <w:tcPr>
-            <w:tcW w:w="595" w:type="dxa"/>
+            <w:tcW w:w="761" w:type="dxa"/>
           </w:tcPr>
           <w:p>
             <w:r>
@@ -817,7 +817,7 @@
         </w:tc>
         <w:tc>
           <w:tcPr>
-            <w:tcW w:w="1012" w:type="dxa"/>
+            <w:tcW w:w="1358" w:type="dxa"/>
           </w:tcPr>
           <w:p>
             <w:r>
@@ -827,7 +827,7 @@
         </w:tc>
         <w:tc>
           <w:tcPr>
-            <w:tcW w:w="989" w:type="dxa"/>
+            <w:tcW w:w="1326" w:type="dxa"/>
           </w:tcPr>
           <w:p>
             <w:r>
@@ -837,7 +837,7 @@
         </w:tc>
         <w:tc>
           <w:tcPr>
-            <w:tcW w:w="1510" w:type="dxa"/>
+            <w:tcW w:w="1463" w:type="dxa"/>
           </w:tcPr>
           <w:p>
             <w:r>
@@ -847,7 +847,7 @@
         </w:tc>
         <w:tc>
           <w:tcPr>
-            <w:tcW w:w="4910" w:type="dxa"/>
+            <w:tcW w:w="7563" w:type="dxa"/>
           </w:tcPr>
           <w:p>
             <w:r>
@@ -859,7 +859,7 @@
       <w:tr>
         <w:tc>
           <w:tcPr>
-            <w:tcW w:w="595" w:type="dxa"/>
+            <w:tcW w:w="761" w:type="dxa"/>
           </w:tcPr>
           <w:p>
             <w:r>
@@ -869,7 +869,7 @@
         </w:tc>
         <w:tc>
           <w:tcPr>
-            <w:tcW w:w="1012" w:type="dxa"/>
+            <w:tcW w:w="1358" w:type="dxa"/>
           </w:tcPr>
           <w:p>
             <w:r>
@@ -879,27 +879,32 @@
         </w:tc>
         <w:tc>
           <w:tcPr>
-            <w:tcW w:w="989" w:type="dxa"/>
-          </w:tcPr>
-          <w:p>
-            <w:r>
-              <w:t>Character flips horizontally depending on direction</w:t>
-            </w:r>
-          </w:p>
-        </w:tc>
-        <w:tc>
-          <w:tcPr>
-            <w:tcW w:w="1510" w:type="dxa"/>
-          </w:tcPr>
-          <w:p>
-            <w:r>
+            <w:tcW w:w="1326" w:type="dxa"/>
+          </w:tcPr>
+          <w:p>
+            <w:r>
+              <w:t xml:space="preserve">Character flips horizontally depending </w:t>
+            </w:r>
+            <w:r>
+              <w:lastRenderedPageBreak/>
+              <w:t>on direction</w:t>
+            </w:r>
+          </w:p>
+        </w:tc>
+        <w:tc>
+          <w:tcPr>
+            <w:tcW w:w="1463" w:type="dxa"/>
+          </w:tcPr>
+          <w:p>
+            <w:r>
+              <w:lastRenderedPageBreak/>
               <w:t xml:space="preserve">Character model does not change direction </w:t>
             </w:r>
           </w:p>
         </w:tc>
         <w:tc>
           <w:tcPr>
-            <w:tcW w:w="4910" w:type="dxa"/>
+            <w:tcW w:w="7563" w:type="dxa"/>
           </w:tcPr>
           <w:p>
             <w:r>
@@ -919,7 +924,7 @@
       <w:tr>
         <w:tc>
           <w:tcPr>
-            <w:tcW w:w="595" w:type="dxa"/>
+            <w:tcW w:w="761" w:type="dxa"/>
           </w:tcPr>
           <w:p>
             <w:r>
@@ -929,7 +934,7 @@
         </w:tc>
         <w:tc>
           <w:tcPr>
-            <w:tcW w:w="1012" w:type="dxa"/>
+            <w:tcW w:w="1358" w:type="dxa"/>
           </w:tcPr>
           <w:p>
             <w:r>
@@ -939,7 +944,7 @@
         </w:tc>
         <w:tc>
           <w:tcPr>
-            <w:tcW w:w="989" w:type="dxa"/>
+            <w:tcW w:w="1326" w:type="dxa"/>
           </w:tcPr>
           <w:p>
             <w:r>
@@ -949,7 +954,7 @@
         </w:tc>
         <w:tc>
           <w:tcPr>
-            <w:tcW w:w="1510" w:type="dxa"/>
+            <w:tcW w:w="1463" w:type="dxa"/>
           </w:tcPr>
           <w:p>
             <w:r>
@@ -959,7 +964,7 @@
         </w:tc>
         <w:tc>
           <w:tcPr>
-            <w:tcW w:w="4910" w:type="dxa"/>
+            <w:tcW w:w="7563" w:type="dxa"/>
           </w:tcPr>
           <w:p>
             <w:r>
@@ -972,7 +977,7 @@
       <w:tr>
         <w:tc>
           <w:tcPr>
-            <w:tcW w:w="595" w:type="dxa"/>
+            <w:tcW w:w="761" w:type="dxa"/>
           </w:tcPr>
           <w:p>
             <w:r>
@@ -982,7 +987,7 @@
         </w:tc>
         <w:tc>
           <w:tcPr>
-            <w:tcW w:w="1012" w:type="dxa"/>
+            <w:tcW w:w="1358" w:type="dxa"/>
           </w:tcPr>
           <w:p>
             <w:r>
@@ -992,7 +997,7 @@
         </w:tc>
         <w:tc>
           <w:tcPr>
-            <w:tcW w:w="989" w:type="dxa"/>
+            <w:tcW w:w="1326" w:type="dxa"/>
           </w:tcPr>
           <w:p>
             <w:r>
@@ -1002,7 +1007,7 @@
         </w:tc>
         <w:tc>
           <w:tcPr>
-            <w:tcW w:w="1510" w:type="dxa"/>
+            <w:tcW w:w="1463" w:type="dxa"/>
           </w:tcPr>
           <w:p>
             <w:r>
@@ -1012,7 +1017,7 @@
         </w:tc>
         <w:tc>
           <w:tcPr>
-            <w:tcW w:w="4910" w:type="dxa"/>
+            <w:tcW w:w="7563" w:type="dxa"/>
           </w:tcPr>
           <w:p>
             <w:pPr>
@@ -1653,7 +1658,7 @@
       <w:tr>
         <w:tc>
           <w:tcPr>
-            <w:tcW w:w="595" w:type="dxa"/>
+            <w:tcW w:w="761" w:type="dxa"/>
           </w:tcPr>
           <w:p>
             <w:r>
@@ -1663,7 +1668,7 @@
         </w:tc>
         <w:tc>
           <w:tcPr>
-            <w:tcW w:w="1012" w:type="dxa"/>
+            <w:tcW w:w="1358" w:type="dxa"/>
           </w:tcPr>
           <w:p>
             <w:r>
@@ -1673,7 +1678,7 @@
         </w:tc>
         <w:tc>
           <w:tcPr>
-            <w:tcW w:w="989" w:type="dxa"/>
+            <w:tcW w:w="1326" w:type="dxa"/>
           </w:tcPr>
           <w:p>
             <w:r>
@@ -1683,7 +1688,7 @@
         </w:tc>
         <w:tc>
           <w:tcPr>
-            <w:tcW w:w="1510" w:type="dxa"/>
+            <w:tcW w:w="1463" w:type="dxa"/>
           </w:tcPr>
           <w:p>
             <w:r>
@@ -1693,7 +1698,7 @@
         </w:tc>
         <w:tc>
           <w:tcPr>
-            <w:tcW w:w="4910" w:type="dxa"/>
+            <w:tcW w:w="7563" w:type="dxa"/>
           </w:tcPr>
           <w:p>
             <w:pPr>
@@ -1713,18 +1718,17 @@
       <w:tr>
         <w:tc>
           <w:tcPr>
-            <w:tcW w:w="595" w:type="dxa"/>
-          </w:tcPr>
-          <w:p>
-            <w:r>
-              <w:lastRenderedPageBreak/>
+            <w:tcW w:w="761" w:type="dxa"/>
+          </w:tcPr>
+          <w:p>
+            <w:r>
               <w:t>18/04</w:t>
             </w:r>
           </w:p>
         </w:tc>
         <w:tc>
           <w:tcPr>
-            <w:tcW w:w="1012" w:type="dxa"/>
+            <w:tcW w:w="1358" w:type="dxa"/>
           </w:tcPr>
           <w:p>
             <w:r>
@@ -1734,7 +1738,7 @@
         </w:tc>
         <w:tc>
           <w:tcPr>
-            <w:tcW w:w="989" w:type="dxa"/>
+            <w:tcW w:w="1326" w:type="dxa"/>
           </w:tcPr>
           <w:p>
             <w:r>
@@ -1744,7 +1748,7 @@
         </w:tc>
         <w:tc>
           <w:tcPr>
-            <w:tcW w:w="1510" w:type="dxa"/>
+            <w:tcW w:w="1463" w:type="dxa"/>
           </w:tcPr>
           <w:p>
             <w:r>
@@ -1754,7 +1758,7 @@
         </w:tc>
         <w:tc>
           <w:tcPr>
-            <w:tcW w:w="4910" w:type="dxa"/>
+            <w:tcW w:w="7563" w:type="dxa"/>
           </w:tcPr>
           <w:p>
             <w:pPr>
@@ -1831,7 +1835,7 @@
         </w:trPr>
         <w:tc>
           <w:tcPr>
-            <w:tcW w:w="595" w:type="dxa"/>
+            <w:tcW w:w="761" w:type="dxa"/>
           </w:tcPr>
           <w:p>
             <w:r>
@@ -1847,7 +1851,7 @@
         </w:tc>
         <w:tc>
           <w:tcPr>
-            <w:tcW w:w="1012" w:type="dxa"/>
+            <w:tcW w:w="1358" w:type="dxa"/>
           </w:tcPr>
           <w:p>
             <w:r>
@@ -1857,7 +1861,7 @@
         </w:tc>
         <w:tc>
           <w:tcPr>
-            <w:tcW w:w="989" w:type="dxa"/>
+            <w:tcW w:w="1326" w:type="dxa"/>
           </w:tcPr>
           <w:p>
             <w:r>
@@ -1867,7 +1871,7 @@
         </w:tc>
         <w:tc>
           <w:tcPr>
-            <w:tcW w:w="1510" w:type="dxa"/>
+            <w:tcW w:w="1463" w:type="dxa"/>
           </w:tcPr>
           <w:p>
             <w:r>
@@ -1877,7 +1881,7 @@
         </w:tc>
         <w:tc>
           <w:tcPr>
-            <w:tcW w:w="4910" w:type="dxa"/>
+            <w:tcW w:w="7563" w:type="dxa"/>
           </w:tcPr>
           <w:p>
             <w:pPr>
@@ -1910,7 +1914,7 @@
         </w:trPr>
         <w:tc>
           <w:tcPr>
-            <w:tcW w:w="595" w:type="dxa"/>
+            <w:tcW w:w="761" w:type="dxa"/>
           </w:tcPr>
           <w:p>
             <w:r>
@@ -1920,7 +1924,7 @@
         </w:tc>
         <w:tc>
           <w:tcPr>
-            <w:tcW w:w="1012" w:type="dxa"/>
+            <w:tcW w:w="1358" w:type="dxa"/>
           </w:tcPr>
           <w:p>
             <w:r>
@@ -1930,7 +1934,7 @@
         </w:tc>
         <w:tc>
           <w:tcPr>
-            <w:tcW w:w="989" w:type="dxa"/>
+            <w:tcW w:w="1326" w:type="dxa"/>
           </w:tcPr>
           <w:p>
             <w:r>
@@ -1940,7 +1944,7 @@
         </w:tc>
         <w:tc>
           <w:tcPr>
-            <w:tcW w:w="1510" w:type="dxa"/>
+            <w:tcW w:w="1463" w:type="dxa"/>
           </w:tcPr>
           <w:p>
             <w:r>
@@ -1950,7 +1954,7 @@
         </w:tc>
         <w:tc>
           <w:tcPr>
-            <w:tcW w:w="4910" w:type="dxa"/>
+            <w:tcW w:w="7563" w:type="dxa"/>
           </w:tcPr>
           <w:p>
             <w:pPr>
@@ -1983,7 +1987,7 @@
         </w:trPr>
         <w:tc>
           <w:tcPr>
-            <w:tcW w:w="595" w:type="dxa"/>
+            <w:tcW w:w="761" w:type="dxa"/>
           </w:tcPr>
           <w:p>
             <w:r>
@@ -1993,7 +1997,7 @@
         </w:tc>
         <w:tc>
           <w:tcPr>
-            <w:tcW w:w="1012" w:type="dxa"/>
+            <w:tcW w:w="1358" w:type="dxa"/>
           </w:tcPr>
           <w:p>
             <w:r>
@@ -2003,7 +2007,7 @@
         </w:tc>
         <w:tc>
           <w:tcPr>
-            <w:tcW w:w="989" w:type="dxa"/>
+            <w:tcW w:w="1326" w:type="dxa"/>
           </w:tcPr>
           <w:p>
             <w:r>
@@ -2013,7 +2017,7 @@
         </w:tc>
         <w:tc>
           <w:tcPr>
-            <w:tcW w:w="1510" w:type="dxa"/>
+            <w:tcW w:w="1463" w:type="dxa"/>
           </w:tcPr>
           <w:p>
             <w:r>
@@ -2023,7 +2027,245 @@
         </w:tc>
         <w:tc>
           <w:tcPr>
-            <w:tcW w:w="4910" w:type="dxa"/>
+            <w:tcW w:w="7563" w:type="dxa"/>
+          </w:tcPr>
+          <w:p>
+            <w:pPr>
+              <w:shd w:val="clear" w:color="auto" w:fill="1F1F1F"/>
+              <w:spacing w:line="285" w:lineRule="atLeast"/>
+              <w:rPr>
+                <w:rFonts w:ascii="Consolas" w:eastAsia="Times New Roman" w:hAnsi="Consolas" w:cs="Times New Roman"/>
+                <w:color w:val="CCCCCC"/>
+                <w:sz w:val="21"/>
+                <w:szCs w:val="21"/>
+                <w:lang w:eastAsia="en-NZ"/>
+              </w:rPr>
+            </w:pPr>
+            <w:r>
+              <w:rPr>
+                <w:rFonts w:ascii="Consolas" w:eastAsia="Times New Roman" w:hAnsi="Consolas" w:cs="Times New Roman"/>
+                <w:color w:val="CCCCCC"/>
+                <w:sz w:val="21"/>
+                <w:szCs w:val="21"/>
+                <w:lang w:eastAsia="en-NZ"/>
+              </w:rPr>
+              <w:t>Offset image by 400 pixels which for some reason put it in the right position.</w:t>
+            </w:r>
+          </w:p>
+        </w:tc>
+      </w:tr>
+      <w:tr>
+        <w:trPr>
+          <w:trHeight w:val="396"/>
+        </w:trPr>
+        <w:tc>
+          <w:tcPr>
+            <w:tcW w:w="761" w:type="dxa"/>
+          </w:tcPr>
+          <w:p>
+            <w:r>
+              <w:t>20/4</w:t>
+            </w:r>
+          </w:p>
+        </w:tc>
+        <w:tc>
+          <w:tcPr>
+            <w:tcW w:w="1358" w:type="dxa"/>
+          </w:tcPr>
+          <w:p>
+            <w:r>
+              <w:t>Enemy sprite</w:t>
+            </w:r>
+          </w:p>
+        </w:tc>
+        <w:tc>
+          <w:tcPr>
+            <w:tcW w:w="1326" w:type="dxa"/>
+          </w:tcPr>
+          <w:p>
+            <w:r>
+              <w:t>Enemy sprite appears in scene</w:t>
+            </w:r>
+          </w:p>
+        </w:tc>
+        <w:tc>
+          <w:tcPr>
+            <w:tcW w:w="1463" w:type="dxa"/>
+          </w:tcPr>
+          <w:p>
+            <w:r>
+              <w:t>Enemy sprite appears in game</w:t>
+            </w:r>
+          </w:p>
+        </w:tc>
+        <w:tc>
+          <w:tcPr>
+            <w:tcW w:w="7563" w:type="dxa"/>
+          </w:tcPr>
+          <w:p>
+            <w:pPr>
+              <w:shd w:val="clear" w:color="auto" w:fill="1F1F1F"/>
+              <w:spacing w:line="285" w:lineRule="atLeast"/>
+              <w:rPr>
+                <w:rFonts w:ascii="Consolas" w:eastAsia="Times New Roman" w:hAnsi="Consolas" w:cs="Times New Roman"/>
+                <w:color w:val="CCCCCC"/>
+                <w:sz w:val="21"/>
+                <w:szCs w:val="21"/>
+                <w:lang w:eastAsia="en-NZ"/>
+              </w:rPr>
+            </w:pPr>
+            <w:r>
+              <w:rPr>
+                <w:rFonts w:ascii="Consolas" w:eastAsia="Times New Roman" w:hAnsi="Consolas" w:cs="Times New Roman"/>
+                <w:color w:val="CCCCCC"/>
+                <w:sz w:val="21"/>
+                <w:szCs w:val="21"/>
+                <w:lang w:eastAsia="en-NZ"/>
+              </w:rPr>
+              <w:t>N</w:t>
+            </w:r>
+            <w:r>
+              <w:rPr>
+                <w:rFonts w:ascii="Consolas" w:eastAsia="Times New Roman" w:hAnsi="Consolas" w:cs="Times New Roman"/>
+                <w:color w:val="CCCCCC"/>
+                <w:sz w:val="21"/>
+                <w:szCs w:val="21"/>
+                <w:lang w:eastAsia="en-NZ"/>
+              </w:rPr>
+              <w:t>one</w:t>
+            </w:r>
+          </w:p>
+        </w:tc>
+      </w:tr>
+      <w:tr>
+        <w:trPr>
+          <w:trHeight w:val="396"/>
+        </w:trPr>
+        <w:tc>
+          <w:tcPr>
+            <w:tcW w:w="761" w:type="dxa"/>
+          </w:tcPr>
+          <w:p>
+            <w:r>
+              <w:t>20/4</w:t>
+            </w:r>
+          </w:p>
+        </w:tc>
+        <w:tc>
+          <w:tcPr>
+            <w:tcW w:w="1358" w:type="dxa"/>
+          </w:tcPr>
+          <w:p>
+            <w:r>
+              <w:t>Enemy sprite movement</w:t>
+            </w:r>
+          </w:p>
+        </w:tc>
+        <w:tc>
+          <w:tcPr>
+            <w:tcW w:w="1326" w:type="dxa"/>
+          </w:tcPr>
+          <w:p>
+            <w:r>
+              <w:t>Enemy sprite moves in a random direction</w:t>
+            </w:r>
+          </w:p>
+        </w:tc>
+        <w:tc>
+          <w:tcPr>
+            <w:tcW w:w="1463" w:type="dxa"/>
+          </w:tcPr>
+          <w:p>
+            <w:r>
+              <w:t xml:space="preserve">Game doesn’t </w:t>
+            </w:r>
+            <w:r>
+              <w:t>run.</w:t>
+            </w:r>
+          </w:p>
+          <w:p>
+            <w:r>
+              <w:t>Object doesn’t have the sprite attribute</w:t>
+            </w:r>
+          </w:p>
+        </w:tc>
+        <w:tc>
+          <w:tcPr>
+            <w:tcW w:w="7563" w:type="dxa"/>
+          </w:tcPr>
+          <w:p>
+            <w:pPr>
+              <w:shd w:val="clear" w:color="auto" w:fill="1F1F1F"/>
+              <w:spacing w:line="285" w:lineRule="atLeast"/>
+              <w:rPr>
+                <w:rFonts w:ascii="Consolas" w:eastAsia="Times New Roman" w:hAnsi="Consolas" w:cs="Times New Roman"/>
+                <w:color w:val="CCCCCC"/>
+                <w:sz w:val="21"/>
+                <w:szCs w:val="21"/>
+                <w:lang w:eastAsia="en-NZ"/>
+              </w:rPr>
+            </w:pPr>
+            <w:r>
+              <w:rPr>
+                <w:rFonts w:ascii="Consolas" w:eastAsia="Times New Roman" w:hAnsi="Consolas" w:cs="Times New Roman"/>
+                <w:color w:val="CCCCCC"/>
+                <w:sz w:val="21"/>
+                <w:szCs w:val="21"/>
+                <w:lang w:eastAsia="en-NZ"/>
+              </w:rPr>
+              <w:t>Put movement code in goblin class</w:t>
+            </w:r>
+          </w:p>
+        </w:tc>
+      </w:tr>
+      <w:tr>
+        <w:trPr>
+          <w:trHeight w:val="396"/>
+        </w:trPr>
+        <w:tc>
+          <w:tcPr>
+            <w:tcW w:w="761" w:type="dxa"/>
+          </w:tcPr>
+          <w:p>
+            <w:r>
+              <w:lastRenderedPageBreak/>
+              <w:t>20/4</w:t>
+            </w:r>
+          </w:p>
+        </w:tc>
+        <w:tc>
+          <w:tcPr>
+            <w:tcW w:w="1358" w:type="dxa"/>
+          </w:tcPr>
+          <w:p>
+            <w:r>
+              <w:t>Enemy sprite movement</w:t>
+            </w:r>
+          </w:p>
+        </w:tc>
+        <w:tc>
+          <w:tcPr>
+            <w:tcW w:w="1326" w:type="dxa"/>
+          </w:tcPr>
+          <w:p>
+            <w:r>
+              <w:t>Enemy sprite moves in a random direction</w:t>
+            </w:r>
+          </w:p>
+        </w:tc>
+        <w:tc>
+          <w:tcPr>
+            <w:tcW w:w="1463" w:type="dxa"/>
+          </w:tcPr>
+          <w:p>
+            <w:r>
+              <w:t>Enemy sprite doesn’t move</w:t>
+            </w:r>
+          </w:p>
+        </w:tc>
+        <w:tc>
+          <w:tcPr>
+            <w:tcW w:w="7563" w:type="dxa"/>
           </w:tcPr>
           <w:p>
             <w:pPr>

</xml_diff>

<commit_message>
got enemies to move but can't interact with gravity
</commit_message>
<xml_diff>
--- a/documentation/ongoing_testing.docx
+++ b/documentation/ongoing_testing.docx
@@ -105,15 +105,7 @@
           </w:tcPr>
           <w:p>
             <w:r>
-              <w:t xml:space="preserve">Vs code complains about </w:t>
-            </w:r>
-            <w:proofErr w:type="spellStart"/>
-            <w:r>
-              <w:t>vstd</w:t>
-            </w:r>
-            <w:proofErr w:type="spellEnd"/>
-            <w:r>
-              <w:t xml:space="preserve"> compression</w:t>
+              <w:t>Vs code complains about vstd compression</w:t>
             </w:r>
           </w:p>
         </w:tc>
@@ -123,13 +115,8 @@
           </w:tcPr>
           <w:p>
             <w:r>
-              <w:t xml:space="preserve">Changed compression type to </w:t>
-            </w:r>
-            <w:proofErr w:type="spellStart"/>
-            <w:r>
-              <w:t>zlib</w:t>
-            </w:r>
-            <w:proofErr w:type="spellEnd"/>
+              <w:t>Changed compression type to zlib</w:t>
+            </w:r>
           </w:p>
         </w:tc>
       </w:tr>
@@ -354,7 +341,6 @@
                 <w:lang w:eastAsia="en-NZ"/>
               </w:rPr>
             </w:pPr>
-            <w:proofErr w:type="spellStart"/>
             <w:r>
               <w:rPr>
                 <w:rFonts w:ascii="Consolas" w:eastAsia="Times New Roman" w:hAnsi="Consolas" w:cs="Times New Roman"/>
@@ -385,7 +371,6 @@
               </w:rPr>
               <w:t>hit_box</w:t>
             </w:r>
-            <w:proofErr w:type="spellEnd"/>
             <w:r>
               <w:rPr>
                 <w:rFonts w:ascii="Consolas" w:eastAsia="Times New Roman" w:hAnsi="Consolas" w:cs="Times New Roman"/>
@@ -396,7 +381,6 @@
               </w:rPr>
               <w:t xml:space="preserve"> = </w:t>
             </w:r>
-            <w:proofErr w:type="spellStart"/>
             <w:r>
               <w:rPr>
                 <w:rFonts w:ascii="Consolas" w:eastAsia="Times New Roman" w:hAnsi="Consolas" w:cs="Times New Roman"/>
@@ -437,7 +421,6 @@
               </w:rPr>
               <w:t>.hit_box_points</w:t>
             </w:r>
-            <w:proofErr w:type="spellEnd"/>
           </w:p>
           <w:p/>
         </w:tc>
@@ -527,7 +510,6 @@
               </w:rPr>
               <w:t xml:space="preserve">        </w:t>
             </w:r>
-            <w:proofErr w:type="spellStart"/>
             <w:r>
               <w:rPr>
                 <w:rFonts w:ascii="Consolas" w:eastAsia="Times New Roman" w:hAnsi="Consolas" w:cs="Times New Roman"/>
@@ -558,7 +540,6 @@
               </w:rPr>
               <w:t>hitbox_texture</w:t>
             </w:r>
-            <w:proofErr w:type="spellEnd"/>
             <w:r>
               <w:rPr>
                 <w:rFonts w:ascii="Consolas" w:eastAsia="Times New Roman" w:hAnsi="Consolas" w:cs="Times New Roman"/>
@@ -569,7 +550,6 @@
               </w:rPr>
               <w:t xml:space="preserve"> = </w:t>
             </w:r>
-            <w:proofErr w:type="spellStart"/>
             <w:r>
               <w:rPr>
                 <w:rFonts w:ascii="Consolas" w:eastAsia="Times New Roman" w:hAnsi="Consolas" w:cs="Times New Roman"/>
@@ -600,7 +580,6 @@
               </w:rPr>
               <w:t>idle_texture_pair</w:t>
             </w:r>
-            <w:proofErr w:type="spellEnd"/>
             <w:r>
               <w:rPr>
                 <w:rFonts w:ascii="Consolas" w:eastAsia="Times New Roman" w:hAnsi="Consolas" w:cs="Times New Roman"/>
@@ -654,7 +633,6 @@
               </w:rPr>
               <w:t xml:space="preserve">        </w:t>
             </w:r>
-            <w:proofErr w:type="spellStart"/>
             <w:r>
               <w:rPr>
                 <w:rFonts w:ascii="Consolas" w:eastAsia="Times New Roman" w:hAnsi="Consolas" w:cs="Times New Roman"/>
@@ -685,7 +663,6 @@
               </w:rPr>
               <w:t>hit_box</w:t>
             </w:r>
-            <w:proofErr w:type="spellEnd"/>
             <w:r>
               <w:rPr>
                 <w:rFonts w:ascii="Consolas" w:eastAsia="Times New Roman" w:hAnsi="Consolas" w:cs="Times New Roman"/>
@@ -696,7 +673,6 @@
               </w:rPr>
               <w:t xml:space="preserve"> = </w:t>
             </w:r>
-            <w:proofErr w:type="spellStart"/>
             <w:r>
               <w:rPr>
                 <w:rFonts w:ascii="Consolas" w:eastAsia="Times New Roman" w:hAnsi="Consolas" w:cs="Times New Roman"/>
@@ -747,7 +723,6 @@
               </w:rPr>
               <w:t>hit_box_points</w:t>
             </w:r>
-            <w:proofErr w:type="spellEnd"/>
           </w:p>
           <w:p/>
         </w:tc>
@@ -908,15 +883,7 @@
           </w:tcPr>
           <w:p>
             <w:r>
-              <w:t xml:space="preserve">Called function in </w:t>
-            </w:r>
-            <w:proofErr w:type="spellStart"/>
-            <w:r>
-              <w:t>on_update</w:t>
-            </w:r>
-            <w:proofErr w:type="spellEnd"/>
-            <w:r>
-              <w:t xml:space="preserve"> function</w:t>
+              <w:t>Called function in on_update function</w:t>
             </w:r>
           </w:p>
         </w:tc>
@@ -1051,7 +1018,6 @@
               </w:rPr>
               <w:t xml:space="preserve"> </w:t>
             </w:r>
-            <w:proofErr w:type="spellStart"/>
             <w:r>
               <w:rPr>
                 <w:rFonts w:ascii="Consolas" w:eastAsia="Times New Roman" w:hAnsi="Consolas" w:cs="Times New Roman"/>
@@ -1082,7 +1048,6 @@
               </w:rPr>
               <w:t>change_y</w:t>
             </w:r>
-            <w:proofErr w:type="spellEnd"/>
             <w:r>
               <w:rPr>
                 <w:rFonts w:ascii="Consolas" w:eastAsia="Times New Roman" w:hAnsi="Consolas" w:cs="Times New Roman"/>
@@ -1156,7 +1121,6 @@
               </w:rPr>
               <w:t xml:space="preserve">            </w:t>
             </w:r>
-            <w:proofErr w:type="spellStart"/>
             <w:r>
               <w:rPr>
                 <w:rFonts w:ascii="Consolas" w:eastAsia="Times New Roman" w:hAnsi="Consolas" w:cs="Times New Roman"/>
@@ -1187,7 +1151,6 @@
               </w:rPr>
               <w:t>texture</w:t>
             </w:r>
-            <w:proofErr w:type="spellEnd"/>
             <w:r>
               <w:rPr>
                 <w:rFonts w:ascii="Consolas" w:eastAsia="Times New Roman" w:hAnsi="Consolas" w:cs="Times New Roman"/>
@@ -1218,7 +1181,6 @@
               </w:rPr>
               <w:t xml:space="preserve"> </w:t>
             </w:r>
-            <w:proofErr w:type="spellStart"/>
             <w:r>
               <w:rPr>
                 <w:rFonts w:ascii="Consolas" w:eastAsia="Times New Roman" w:hAnsi="Consolas" w:cs="Times New Roman"/>
@@ -1249,7 +1211,6 @@
               </w:rPr>
               <w:t>fall_textures</w:t>
             </w:r>
-            <w:proofErr w:type="spellEnd"/>
             <w:r>
               <w:rPr>
                 <w:rFonts w:ascii="Consolas" w:eastAsia="Times New Roman" w:hAnsi="Consolas" w:cs="Times New Roman"/>
@@ -1280,7 +1241,6 @@
               </w:rPr>
               <w:t>][</w:t>
             </w:r>
-            <w:proofErr w:type="spellStart"/>
             <w:r>
               <w:rPr>
                 <w:rFonts w:ascii="Consolas" w:eastAsia="Times New Roman" w:hAnsi="Consolas" w:cs="Times New Roman"/>
@@ -1311,7 +1271,6 @@
               </w:rPr>
               <w:t>character_face_direction</w:t>
             </w:r>
-            <w:proofErr w:type="spellEnd"/>
             <w:r>
               <w:rPr>
                 <w:rFonts w:ascii="Consolas" w:eastAsia="Times New Roman" w:hAnsi="Consolas" w:cs="Times New Roman"/>
@@ -1365,7 +1324,6 @@
               </w:rPr>
               <w:t xml:space="preserve"> </w:t>
             </w:r>
-            <w:proofErr w:type="spellStart"/>
             <w:r>
               <w:rPr>
                 <w:rFonts w:ascii="Consolas" w:eastAsia="Times New Roman" w:hAnsi="Consolas" w:cs="Times New Roman"/>
@@ -1396,7 +1354,6 @@
               </w:rPr>
               <w:t>change_y</w:t>
             </w:r>
-            <w:proofErr w:type="spellEnd"/>
             <w:r>
               <w:rPr>
                 <w:rFonts w:ascii="Consolas" w:eastAsia="Times New Roman" w:hAnsi="Consolas" w:cs="Times New Roman"/>
@@ -1480,7 +1437,6 @@
               </w:rPr>
               <w:t xml:space="preserve">            </w:t>
             </w:r>
-            <w:proofErr w:type="spellStart"/>
             <w:r>
               <w:rPr>
                 <w:rFonts w:ascii="Consolas" w:eastAsia="Times New Roman" w:hAnsi="Consolas" w:cs="Times New Roman"/>
@@ -1511,7 +1467,6 @@
               </w:rPr>
               <w:t>texture</w:t>
             </w:r>
-            <w:proofErr w:type="spellEnd"/>
             <w:r>
               <w:rPr>
                 <w:rFonts w:ascii="Consolas" w:eastAsia="Times New Roman" w:hAnsi="Consolas" w:cs="Times New Roman"/>
@@ -1542,7 +1497,6 @@
               </w:rPr>
               <w:t xml:space="preserve"> </w:t>
             </w:r>
-            <w:proofErr w:type="spellStart"/>
             <w:r>
               <w:rPr>
                 <w:rFonts w:ascii="Consolas" w:eastAsia="Times New Roman" w:hAnsi="Consolas" w:cs="Times New Roman"/>
@@ -1573,7 +1527,6 @@
               </w:rPr>
               <w:t>fall_textures</w:t>
             </w:r>
-            <w:proofErr w:type="spellEnd"/>
             <w:r>
               <w:rPr>
                 <w:rFonts w:ascii="Consolas" w:eastAsia="Times New Roman" w:hAnsi="Consolas" w:cs="Times New Roman"/>
@@ -1604,7 +1557,6 @@
               </w:rPr>
               <w:t>][</w:t>
             </w:r>
-            <w:proofErr w:type="spellStart"/>
             <w:r>
               <w:rPr>
                 <w:rFonts w:ascii="Consolas" w:eastAsia="Times New Roman" w:hAnsi="Consolas" w:cs="Times New Roman"/>
@@ -1635,7 +1587,6 @@
               </w:rPr>
               <w:t>character_face_direction</w:t>
             </w:r>
-            <w:proofErr w:type="spellEnd"/>
             <w:r>
               <w:rPr>
                 <w:rFonts w:ascii="Consolas" w:eastAsia="Times New Roman" w:hAnsi="Consolas" w:cs="Times New Roman"/>
@@ -2279,6 +2230,89 @@
                 <w:lang w:eastAsia="en-NZ"/>
               </w:rPr>
             </w:pPr>
+            <w:r>
+              <w:rPr>
+                <w:rFonts w:ascii="Consolas" w:eastAsia="Times New Roman" w:hAnsi="Consolas" w:cs="Times New Roman"/>
+                <w:color w:val="CCCCCC"/>
+                <w:sz w:val="21"/>
+                <w:szCs w:val="21"/>
+                <w:lang w:eastAsia="en-NZ"/>
+              </w:rPr>
+              <w:t>Changed code from self.change_x to self.center += x</w:t>
+            </w:r>
+          </w:p>
+        </w:tc>
+      </w:tr>
+      <w:tr>
+        <w:trPr>
+          <w:trHeight w:val="396"/>
+        </w:trPr>
+        <w:tc>
+          <w:tcPr>
+            <w:tcW w:w="761" w:type="dxa"/>
+          </w:tcPr>
+          <w:p>
+            <w:r>
+              <w:t>20/4</w:t>
+            </w:r>
+          </w:p>
+        </w:tc>
+        <w:tc>
+          <w:tcPr>
+            <w:tcW w:w="1358" w:type="dxa"/>
+          </w:tcPr>
+          <w:p>
+            <w:r>
+              <w:t>Enemy sprite movement</w:t>
+            </w:r>
+          </w:p>
+        </w:tc>
+        <w:tc>
+          <w:tcPr>
+            <w:tcW w:w="1326" w:type="dxa"/>
+          </w:tcPr>
+          <w:p>
+            <w:r>
+              <w:t>Enemy sprite moves in a random direction</w:t>
+            </w:r>
+          </w:p>
+        </w:tc>
+        <w:tc>
+          <w:tcPr>
+            <w:tcW w:w="1463" w:type="dxa"/>
+          </w:tcPr>
+          <w:p>
+            <w:r>
+              <w:t>Enemy sprites moves</w:t>
+            </w:r>
+          </w:p>
+        </w:tc>
+        <w:tc>
+          <w:tcPr>
+            <w:tcW w:w="7563" w:type="dxa"/>
+          </w:tcPr>
+          <w:p>
+            <w:pPr>
+              <w:shd w:val="clear" w:color="auto" w:fill="1F1F1F"/>
+              <w:spacing w:line="285" w:lineRule="atLeast"/>
+              <w:rPr>
+                <w:rFonts w:ascii="Consolas" w:eastAsia="Times New Roman" w:hAnsi="Consolas" w:cs="Times New Roman"/>
+                <w:color w:val="CCCCCC"/>
+                <w:sz w:val="21"/>
+                <w:szCs w:val="21"/>
+                <w:lang w:eastAsia="en-NZ"/>
+              </w:rPr>
+            </w:pPr>
+            <w:r>
+              <w:rPr>
+                <w:rFonts w:ascii="Consolas" w:eastAsia="Times New Roman" w:hAnsi="Consolas" w:cs="Times New Roman"/>
+                <w:color w:val="CCCCCC"/>
+                <w:sz w:val="21"/>
+                <w:szCs w:val="21"/>
+                <w:lang w:eastAsia="en-NZ"/>
+              </w:rPr>
+              <w:t>None</w:t>
+            </w:r>
           </w:p>
         </w:tc>
       </w:tr>

</xml_diff>

<commit_message>
fixed enemy sprite speed
</commit_message>
<xml_diff>
--- a/documentation/ongoing_testing.docx
+++ b/documentation/ongoing_testing.docx
@@ -12,7 +12,7 @@
       <w:tblGrid>
         <w:gridCol w:w="761"/>
         <w:gridCol w:w="1358"/>
-        <w:gridCol w:w="1326"/>
+        <w:gridCol w:w="1344"/>
         <w:gridCol w:w="1463"/>
         <w:gridCol w:w="7563"/>
       </w:tblGrid>
@@ -1736,6 +1736,7 @@
             <w:r>
               <w:rPr>
                 <w:rFonts w:ascii="Consolas" w:eastAsia="Times New Roman" w:hAnsi="Consolas" w:cs="Times New Roman"/>
+                <w:noProof/>
                 <w:color w:val="CCCCCC"/>
                 <w:sz w:val="21"/>
                 <w:szCs w:val="21"/>
@@ -2312,6 +2313,79 @@
                 <w:lang w:eastAsia="en-NZ"/>
               </w:rPr>
               <w:t>None</w:t>
+            </w:r>
+          </w:p>
+        </w:tc>
+      </w:tr>
+      <w:tr>
+        <w:trPr>
+          <w:trHeight w:val="396"/>
+        </w:trPr>
+        <w:tc>
+          <w:tcPr>
+            <w:tcW w:w="761" w:type="dxa"/>
+          </w:tcPr>
+          <w:p>
+            <w:r>
+              <w:t>20/4</w:t>
+            </w:r>
+          </w:p>
+        </w:tc>
+        <w:tc>
+          <w:tcPr>
+            <w:tcW w:w="1358" w:type="dxa"/>
+          </w:tcPr>
+          <w:p>
+            <w:r>
+              <w:t>Enemy sprite movment</w:t>
+            </w:r>
+          </w:p>
+        </w:tc>
+        <w:tc>
+          <w:tcPr>
+            <w:tcW w:w="1326" w:type="dxa"/>
+          </w:tcPr>
+          <w:p>
+            <w:r>
+              <w:t xml:space="preserve">Enemy enemy sprites make small movements left and right and jump </w:t>
+            </w:r>
+          </w:p>
+        </w:tc>
+        <w:tc>
+          <w:tcPr>
+            <w:tcW w:w="1463" w:type="dxa"/>
+          </w:tcPr>
+          <w:p>
+            <w:r>
+              <w:t xml:space="preserve">Sprites move way to quickly </w:t>
+            </w:r>
+          </w:p>
+        </w:tc>
+        <w:tc>
+          <w:tcPr>
+            <w:tcW w:w="7563" w:type="dxa"/>
+          </w:tcPr>
+          <w:p>
+            <w:pPr>
+              <w:shd w:val="clear" w:color="auto" w:fill="1F1F1F"/>
+              <w:spacing w:line="285" w:lineRule="atLeast"/>
+              <w:rPr>
+                <w:rFonts w:ascii="Consolas" w:eastAsia="Times New Roman" w:hAnsi="Consolas" w:cs="Times New Roman"/>
+                <w:color w:val="CCCCCC"/>
+                <w:sz w:val="21"/>
+                <w:szCs w:val="21"/>
+                <w:lang w:eastAsia="en-NZ"/>
+              </w:rPr>
+            </w:pPr>
+            <w:r>
+              <w:rPr>
+                <w:rFonts w:ascii="Consolas" w:eastAsia="Times New Roman" w:hAnsi="Consolas" w:cs="Times New Roman"/>
+                <w:color w:val="CCCCCC"/>
+                <w:sz w:val="21"/>
+                <w:szCs w:val="21"/>
+                <w:lang w:eastAsia="en-NZ"/>
+              </w:rPr>
+              <w:t>Lowered jump speed and lowered movement speed as well</w:t>
             </w:r>
           </w:p>
         </w:tc>

</xml_diff>

<commit_message>
can't get sprite aniimations to work
</commit_message>
<xml_diff>
--- a/documentation/ongoing_testing.docx
+++ b/documentation/ongoing_testing.docx
@@ -1,6 +1,6 @@
 
 <file path=word/document.xml><?xml version="1.0" encoding="utf-8"?>
-<w:document xmlns:wpc="http://schemas.microsoft.com/office/word/2010/wordprocessingCanvas" xmlns:cx="http://schemas.microsoft.com/office/drawing/2014/chartex" xmlns:cx1="http://schemas.microsoft.com/office/drawing/2015/9/8/chartex" xmlns:cx2="http://schemas.microsoft.com/office/drawing/2015/10/21/chartex" xmlns:cx3="http://schemas.microsoft.com/office/drawing/2016/5/9/chartex" xmlns:cx4="http://schemas.microsoft.com/office/drawing/2016/5/10/chartex" xmlns:cx5="http://schemas.microsoft.com/office/drawing/2016/5/11/chartex" xmlns:cx6="http://schemas.microsoft.com/office/drawing/2016/5/12/chartex" xmlns:cx7="http://schemas.microsoft.com/office/drawing/2016/5/13/chartex" xmlns:cx8="http://schemas.microsoft.com/office/drawing/2016/5/14/chartex" xmlns:mc="http://schemas.openxmlformats.org/markup-compatibility/2006" xmlns:aink="http://schemas.microsoft.com/office/drawing/2016/ink" xmlns:am3d="http://schemas.microsoft.com/office/drawing/2017/model3d" xmlns:o="urn:schemas-microsoft-com:office:office" xmlns:oel="http://schemas.microsoft.com/office/2019/extlst" xmlns:r="http://schemas.openxmlformats.org/officeDocument/2006/relationships" xmlns:m="http://schemas.openxmlformats.org/officeDocument/2006/math" xmlns:v="urn:schemas-microsoft-com:vml" xmlns:wp14="http://schemas.microsoft.com/office/word/2010/wordprocessingDrawing" xmlns:wp="http://schemas.openxmlformats.org/drawingml/2006/wordprocessingDrawing" xmlns:w10="urn:schemas-microsoft-com:office:word" xmlns:w="http://schemas.openxmlformats.org/wordprocessingml/2006/main" xmlns:w14="http://schemas.microsoft.com/office/word/2010/wordml" xmlns:w15="http://schemas.microsoft.com/office/word/2012/wordml" xmlns:w16cex="http://schemas.microsoft.com/office/word/2018/wordml/cex" xmlns:w16cid="http://schemas.microsoft.com/office/word/2016/wordml/cid" xmlns:w16="http://schemas.microsoft.com/office/word/2018/wordml" xmlns:w16du="http://schemas.microsoft.com/office/word/2023/wordml/word16du" xmlns:w16sdtdh="http://schemas.microsoft.com/office/word/2020/wordml/sdtdatahash" xmlns:w16se="http://schemas.microsoft.com/office/word/2015/wordml/symex" xmlns:wpg="http://schemas.microsoft.com/office/word/2010/wordprocessingGroup" xmlns:wpi="http://schemas.microsoft.com/office/word/2010/wordprocessingInk" xmlns:wne="http://schemas.microsoft.com/office/word/2006/wordml" xmlns:wps="http://schemas.microsoft.com/office/word/2010/wordprocessingShape" mc:Ignorable="w14 w15 w16se w16cid w16 w16cex w16sdtdh w16du wp14">
+<w:document xmlns:wpc="http://schemas.microsoft.com/office/word/2010/wordprocessingCanvas" xmlns:cx="http://schemas.microsoft.com/office/drawing/2014/chartex" xmlns:cx1="http://schemas.microsoft.com/office/drawing/2015/9/8/chartex" xmlns:cx2="http://schemas.microsoft.com/office/drawing/2015/10/21/chartex" xmlns:cx3="http://schemas.microsoft.com/office/drawing/2016/5/9/chartex" xmlns:cx4="http://schemas.microsoft.com/office/drawing/2016/5/10/chartex" xmlns:cx5="http://schemas.microsoft.com/office/drawing/2016/5/11/chartex" xmlns:cx6="http://schemas.microsoft.com/office/drawing/2016/5/12/chartex" xmlns:cx7="http://schemas.microsoft.com/office/drawing/2016/5/13/chartex" xmlns:cx8="http://schemas.microsoft.com/office/drawing/2016/5/14/chartex" xmlns:mc="http://schemas.openxmlformats.org/markup-compatibility/2006" xmlns:aink="http://schemas.microsoft.com/office/drawing/2016/ink" xmlns:am3d="http://schemas.microsoft.com/office/drawing/2017/model3d" xmlns:o="urn:schemas-microsoft-com:office:office" xmlns:oel="http://schemas.microsoft.com/office/2019/extlst" xmlns:r="http://schemas.openxmlformats.org/officeDocument/2006/relationships" xmlns:m="http://schemas.openxmlformats.org/officeDocument/2006/math" xmlns:v="urn:schemas-microsoft-com:vml" xmlns:wp14="http://schemas.microsoft.com/office/word/2010/wordprocessingDrawing" xmlns:wp="http://schemas.openxmlformats.org/drawingml/2006/wordprocessingDrawing" xmlns:w10="urn:schemas-microsoft-com:office:word" xmlns:w="http://schemas.openxmlformats.org/wordprocessingml/2006/main" xmlns:w14="http://schemas.microsoft.com/office/word/2010/wordml" xmlns:w15="http://schemas.microsoft.com/office/word/2012/wordml" xmlns:w16cex="http://schemas.microsoft.com/office/word/2018/wordml/cex" xmlns:w16cid="http://schemas.microsoft.com/office/word/2016/wordml/cid" xmlns:w16="http://schemas.microsoft.com/office/word/2018/wordml" xmlns:w16sdtdh="http://schemas.microsoft.com/office/word/2020/wordml/sdtdatahash" xmlns:w16se="http://schemas.microsoft.com/office/word/2015/wordml/symex" xmlns:wpg="http://schemas.microsoft.com/office/word/2010/wordprocessingGroup" xmlns:wpi="http://schemas.microsoft.com/office/word/2010/wordprocessingInk" xmlns:wne="http://schemas.microsoft.com/office/word/2006/wordml" xmlns:wps="http://schemas.microsoft.com/office/word/2010/wordprocessingShape" mc:Ignorable="w14 w15 w16se w16cid w16 w16cex w16sdtdh wp14">
   <w:body>
     <w:tbl>
       <w:tblPr>
@@ -105,7 +105,15 @@
           </w:tcPr>
           <w:p>
             <w:r>
-              <w:t>Vs code complains about vstd compression</w:t>
+              <w:t xml:space="preserve">Vs code complains about </w:t>
+            </w:r>
+            <w:proofErr w:type="spellStart"/>
+            <w:r>
+              <w:t>vstd</w:t>
+            </w:r>
+            <w:proofErr w:type="spellEnd"/>
+            <w:r>
+              <w:t xml:space="preserve"> compression</w:t>
             </w:r>
           </w:p>
         </w:tc>
@@ -115,8 +123,13 @@
           </w:tcPr>
           <w:p>
             <w:r>
-              <w:t>Changed compression type to zlib</w:t>
-            </w:r>
+              <w:t xml:space="preserve">Changed compression type to </w:t>
+            </w:r>
+            <w:proofErr w:type="spellStart"/>
+            <w:r>
+              <w:t>zlib</w:t>
+            </w:r>
+            <w:proofErr w:type="spellEnd"/>
           </w:p>
         </w:tc>
       </w:tr>
@@ -341,6 +354,7 @@
                 <w:lang w:eastAsia="en-NZ"/>
               </w:rPr>
             </w:pPr>
+            <w:proofErr w:type="spellStart"/>
             <w:r>
               <w:rPr>
                 <w:rFonts w:ascii="Consolas" w:eastAsia="Times New Roman" w:hAnsi="Consolas" w:cs="Times New Roman"/>
@@ -371,6 +385,7 @@
               </w:rPr>
               <w:t>hit_box</w:t>
             </w:r>
+            <w:proofErr w:type="spellEnd"/>
             <w:r>
               <w:rPr>
                 <w:rFonts w:ascii="Consolas" w:eastAsia="Times New Roman" w:hAnsi="Consolas" w:cs="Times New Roman"/>
@@ -381,6 +396,7 @@
               </w:rPr>
               <w:t xml:space="preserve"> = </w:t>
             </w:r>
+            <w:proofErr w:type="spellStart"/>
             <w:r>
               <w:rPr>
                 <w:rFonts w:ascii="Consolas" w:eastAsia="Times New Roman" w:hAnsi="Consolas" w:cs="Times New Roman"/>
@@ -421,6 +437,7 @@
               </w:rPr>
               <w:t>.hit_box_points</w:t>
             </w:r>
+            <w:proofErr w:type="spellEnd"/>
           </w:p>
           <w:p/>
         </w:tc>
@@ -510,6 +527,8 @@
               </w:rPr>
               <w:t xml:space="preserve">        </w:t>
             </w:r>
+            <w:proofErr w:type="spellStart"/>
+            <w:proofErr w:type="gramStart"/>
             <w:r>
               <w:rPr>
                 <w:rFonts w:ascii="Consolas" w:eastAsia="Times New Roman" w:hAnsi="Consolas" w:cs="Times New Roman"/>
@@ -538,8 +557,20 @@
                 <w:szCs w:val="21"/>
                 <w:lang w:eastAsia="en-NZ"/>
               </w:rPr>
-              <w:t>hitbox_texture</w:t>
-            </w:r>
+              <w:t>hitbox</w:t>
+            </w:r>
+            <w:proofErr w:type="gramEnd"/>
+            <w:r>
+              <w:rPr>
+                <w:rFonts w:ascii="Consolas" w:eastAsia="Times New Roman" w:hAnsi="Consolas" w:cs="Times New Roman"/>
+                <w:color w:val="9CDCFE"/>
+                <w:sz w:val="21"/>
+                <w:szCs w:val="21"/>
+                <w:lang w:eastAsia="en-NZ"/>
+              </w:rPr>
+              <w:t>_texture</w:t>
+            </w:r>
+            <w:proofErr w:type="spellEnd"/>
             <w:r>
               <w:rPr>
                 <w:rFonts w:ascii="Consolas" w:eastAsia="Times New Roman" w:hAnsi="Consolas" w:cs="Times New Roman"/>
@@ -550,6 +581,7 @@
               </w:rPr>
               <w:t xml:space="preserve"> = </w:t>
             </w:r>
+            <w:proofErr w:type="spellStart"/>
             <w:r>
               <w:rPr>
                 <w:rFonts w:ascii="Consolas" w:eastAsia="Times New Roman" w:hAnsi="Consolas" w:cs="Times New Roman"/>
@@ -580,6 +612,7 @@
               </w:rPr>
               <w:t>idle_texture_pair</w:t>
             </w:r>
+            <w:proofErr w:type="spellEnd"/>
             <w:r>
               <w:rPr>
                 <w:rFonts w:ascii="Consolas" w:eastAsia="Times New Roman" w:hAnsi="Consolas" w:cs="Times New Roman"/>
@@ -633,6 +666,7 @@
               </w:rPr>
               <w:t xml:space="preserve">        </w:t>
             </w:r>
+            <w:proofErr w:type="spellStart"/>
             <w:r>
               <w:rPr>
                 <w:rFonts w:ascii="Consolas" w:eastAsia="Times New Roman" w:hAnsi="Consolas" w:cs="Times New Roman"/>
@@ -663,6 +697,7 @@
               </w:rPr>
               <w:t>hit_box</w:t>
             </w:r>
+            <w:proofErr w:type="spellEnd"/>
             <w:r>
               <w:rPr>
                 <w:rFonts w:ascii="Consolas" w:eastAsia="Times New Roman" w:hAnsi="Consolas" w:cs="Times New Roman"/>
@@ -673,6 +708,7 @@
               </w:rPr>
               <w:t xml:space="preserve"> = </w:t>
             </w:r>
+            <w:proofErr w:type="spellStart"/>
             <w:r>
               <w:rPr>
                 <w:rFonts w:ascii="Consolas" w:eastAsia="Times New Roman" w:hAnsi="Consolas" w:cs="Times New Roman"/>
@@ -723,6 +759,7 @@
               </w:rPr>
               <w:t>hit_box_points</w:t>
             </w:r>
+            <w:proofErr w:type="spellEnd"/>
           </w:p>
           <w:p/>
         </w:tc>
@@ -878,7 +915,15 @@
           </w:tcPr>
           <w:p>
             <w:r>
-              <w:t>Called function in on_update function</w:t>
+              <w:t xml:space="preserve">Called function in </w:t>
+            </w:r>
+            <w:proofErr w:type="spellStart"/>
+            <w:r>
+              <w:t>on_update</w:t>
+            </w:r>
+            <w:proofErr w:type="spellEnd"/>
+            <w:r>
+              <w:t xml:space="preserve"> function</w:t>
             </w:r>
           </w:p>
         </w:tc>
@@ -1018,6 +1063,8 @@
               </w:rPr>
               <w:t xml:space="preserve"> </w:t>
             </w:r>
+            <w:proofErr w:type="spellStart"/>
+            <w:proofErr w:type="gramStart"/>
             <w:r>
               <w:rPr>
                 <w:rFonts w:ascii="Consolas" w:eastAsia="Times New Roman" w:hAnsi="Consolas" w:cs="Times New Roman"/>
@@ -1046,8 +1093,20 @@
                 <w:szCs w:val="21"/>
                 <w:lang w:eastAsia="en-NZ"/>
               </w:rPr>
-              <w:t>change_y</w:t>
-            </w:r>
+              <w:t>change</w:t>
+            </w:r>
+            <w:proofErr w:type="gramEnd"/>
+            <w:r>
+              <w:rPr>
+                <w:rFonts w:ascii="Consolas" w:eastAsia="Times New Roman" w:hAnsi="Consolas" w:cs="Times New Roman"/>
+                <w:color w:val="9CDCFE"/>
+                <w:sz w:val="21"/>
+                <w:szCs w:val="21"/>
+                <w:lang w:eastAsia="en-NZ"/>
+              </w:rPr>
+              <w:t>_y</w:t>
+            </w:r>
+            <w:proofErr w:type="spellEnd"/>
             <w:r>
               <w:rPr>
                 <w:rFonts w:ascii="Consolas" w:eastAsia="Times New Roman" w:hAnsi="Consolas" w:cs="Times New Roman"/>
@@ -1121,6 +1180,8 @@
               </w:rPr>
               <w:t xml:space="preserve">            </w:t>
             </w:r>
+            <w:proofErr w:type="spellStart"/>
+            <w:proofErr w:type="gramStart"/>
             <w:r>
               <w:rPr>
                 <w:rFonts w:ascii="Consolas" w:eastAsia="Times New Roman" w:hAnsi="Consolas" w:cs="Times New Roman"/>
@@ -1151,6 +1212,8 @@
               </w:rPr>
               <w:t>texture</w:t>
             </w:r>
+            <w:proofErr w:type="spellEnd"/>
+            <w:proofErr w:type="gramEnd"/>
             <w:r>
               <w:rPr>
                 <w:rFonts w:ascii="Consolas" w:eastAsia="Times New Roman" w:hAnsi="Consolas" w:cs="Times New Roman"/>
@@ -1181,6 +1244,7 @@
               </w:rPr>
               <w:t xml:space="preserve"> </w:t>
             </w:r>
+            <w:proofErr w:type="spellStart"/>
             <w:r>
               <w:rPr>
                 <w:rFonts w:ascii="Consolas" w:eastAsia="Times New Roman" w:hAnsi="Consolas" w:cs="Times New Roman"/>
@@ -1211,6 +1275,7 @@
               </w:rPr>
               <w:t>fall_textures</w:t>
             </w:r>
+            <w:proofErr w:type="spellEnd"/>
             <w:r>
               <w:rPr>
                 <w:rFonts w:ascii="Consolas" w:eastAsia="Times New Roman" w:hAnsi="Consolas" w:cs="Times New Roman"/>
@@ -1241,6 +1306,7 @@
               </w:rPr>
               <w:t>][</w:t>
             </w:r>
+            <w:proofErr w:type="spellStart"/>
             <w:r>
               <w:rPr>
                 <w:rFonts w:ascii="Consolas" w:eastAsia="Times New Roman" w:hAnsi="Consolas" w:cs="Times New Roman"/>
@@ -1271,6 +1337,7 @@
               </w:rPr>
               <w:t>character_face_direction</w:t>
             </w:r>
+            <w:proofErr w:type="spellEnd"/>
             <w:r>
               <w:rPr>
                 <w:rFonts w:ascii="Consolas" w:eastAsia="Times New Roman" w:hAnsi="Consolas" w:cs="Times New Roman"/>
@@ -1324,6 +1391,8 @@
               </w:rPr>
               <w:t xml:space="preserve"> </w:t>
             </w:r>
+            <w:proofErr w:type="spellStart"/>
+            <w:proofErr w:type="gramStart"/>
             <w:r>
               <w:rPr>
                 <w:rFonts w:ascii="Consolas" w:eastAsia="Times New Roman" w:hAnsi="Consolas" w:cs="Times New Roman"/>
@@ -1352,8 +1421,20 @@
                 <w:szCs w:val="21"/>
                 <w:lang w:eastAsia="en-NZ"/>
               </w:rPr>
-              <w:t>change_y</w:t>
-            </w:r>
+              <w:t>change</w:t>
+            </w:r>
+            <w:proofErr w:type="gramEnd"/>
+            <w:r>
+              <w:rPr>
+                <w:rFonts w:ascii="Consolas" w:eastAsia="Times New Roman" w:hAnsi="Consolas" w:cs="Times New Roman"/>
+                <w:color w:val="9CDCFE"/>
+                <w:sz w:val="21"/>
+                <w:szCs w:val="21"/>
+                <w:lang w:eastAsia="en-NZ"/>
+              </w:rPr>
+              <w:t>_y</w:t>
+            </w:r>
+            <w:proofErr w:type="spellEnd"/>
             <w:r>
               <w:rPr>
                 <w:rFonts w:ascii="Consolas" w:eastAsia="Times New Roman" w:hAnsi="Consolas" w:cs="Times New Roman"/>
@@ -1437,6 +1518,8 @@
               </w:rPr>
               <w:t xml:space="preserve">            </w:t>
             </w:r>
+            <w:proofErr w:type="spellStart"/>
+            <w:proofErr w:type="gramStart"/>
             <w:r>
               <w:rPr>
                 <w:rFonts w:ascii="Consolas" w:eastAsia="Times New Roman" w:hAnsi="Consolas" w:cs="Times New Roman"/>
@@ -1467,6 +1550,8 @@
               </w:rPr>
               <w:t>texture</w:t>
             </w:r>
+            <w:proofErr w:type="spellEnd"/>
+            <w:proofErr w:type="gramEnd"/>
             <w:r>
               <w:rPr>
                 <w:rFonts w:ascii="Consolas" w:eastAsia="Times New Roman" w:hAnsi="Consolas" w:cs="Times New Roman"/>
@@ -1497,6 +1582,7 @@
               </w:rPr>
               <w:t xml:space="preserve"> </w:t>
             </w:r>
+            <w:proofErr w:type="spellStart"/>
             <w:r>
               <w:rPr>
                 <w:rFonts w:ascii="Consolas" w:eastAsia="Times New Roman" w:hAnsi="Consolas" w:cs="Times New Roman"/>
@@ -1527,6 +1613,7 @@
               </w:rPr>
               <w:t>fall_textures</w:t>
             </w:r>
+            <w:proofErr w:type="spellEnd"/>
             <w:r>
               <w:rPr>
                 <w:rFonts w:ascii="Consolas" w:eastAsia="Times New Roman" w:hAnsi="Consolas" w:cs="Times New Roman"/>
@@ -1557,6 +1644,7 @@
               </w:rPr>
               <w:t>][</w:t>
             </w:r>
+            <w:proofErr w:type="spellStart"/>
             <w:r>
               <w:rPr>
                 <w:rFonts w:ascii="Consolas" w:eastAsia="Times New Roman" w:hAnsi="Consolas" w:cs="Times New Roman"/>
@@ -1587,6 +1675,7 @@
               </w:rPr>
               <w:t>character_face_direction</w:t>
             </w:r>
+            <w:proofErr w:type="spellEnd"/>
             <w:r>
               <w:rPr>
                 <w:rFonts w:ascii="Consolas" w:eastAsia="Times New Roman" w:hAnsi="Consolas" w:cs="Times New Roman"/>
@@ -2238,7 +2327,63 @@
                 <w:szCs w:val="21"/>
                 <w:lang w:eastAsia="en-NZ"/>
               </w:rPr>
-              <w:t>Changed code from self.change_x to self.center += x</w:t>
+              <w:t xml:space="preserve">Changed code from </w:t>
+            </w:r>
+            <w:proofErr w:type="spellStart"/>
+            <w:proofErr w:type="gramStart"/>
+            <w:r>
+              <w:rPr>
+                <w:rFonts w:ascii="Consolas" w:eastAsia="Times New Roman" w:hAnsi="Consolas" w:cs="Times New Roman"/>
+                <w:color w:val="CCCCCC"/>
+                <w:sz w:val="21"/>
+                <w:szCs w:val="21"/>
+                <w:lang w:eastAsia="en-NZ"/>
+              </w:rPr>
+              <w:t>self.change</w:t>
+            </w:r>
+            <w:proofErr w:type="gramEnd"/>
+            <w:r>
+              <w:rPr>
+                <w:rFonts w:ascii="Consolas" w:eastAsia="Times New Roman" w:hAnsi="Consolas" w:cs="Times New Roman"/>
+                <w:color w:val="CCCCCC"/>
+                <w:sz w:val="21"/>
+                <w:szCs w:val="21"/>
+                <w:lang w:eastAsia="en-NZ"/>
+              </w:rPr>
+              <w:t>_x</w:t>
+            </w:r>
+            <w:proofErr w:type="spellEnd"/>
+            <w:r>
+              <w:rPr>
+                <w:rFonts w:ascii="Consolas" w:eastAsia="Times New Roman" w:hAnsi="Consolas" w:cs="Times New Roman"/>
+                <w:color w:val="CCCCCC"/>
+                <w:sz w:val="21"/>
+                <w:szCs w:val="21"/>
+                <w:lang w:eastAsia="en-NZ"/>
+              </w:rPr>
+              <w:t xml:space="preserve"> to </w:t>
+            </w:r>
+            <w:proofErr w:type="spellStart"/>
+            <w:r>
+              <w:rPr>
+                <w:rFonts w:ascii="Consolas" w:eastAsia="Times New Roman" w:hAnsi="Consolas" w:cs="Times New Roman"/>
+                <w:color w:val="CCCCCC"/>
+                <w:sz w:val="21"/>
+                <w:szCs w:val="21"/>
+                <w:lang w:eastAsia="en-NZ"/>
+              </w:rPr>
+              <w:t>self.center</w:t>
+            </w:r>
+            <w:proofErr w:type="spellEnd"/>
+            <w:r>
+              <w:rPr>
+                <w:rFonts w:ascii="Consolas" w:eastAsia="Times New Roman" w:hAnsi="Consolas" w:cs="Times New Roman"/>
+                <w:color w:val="CCCCCC"/>
+                <w:sz w:val="21"/>
+                <w:szCs w:val="21"/>
+                <w:lang w:eastAsia="en-NZ"/>
+              </w:rPr>
+              <w:t xml:space="preserve"> += x</w:t>
             </w:r>
           </w:p>
         </w:tc>
@@ -2284,8 +2429,13 @@
           </w:tcPr>
           <w:p>
             <w:r>
-              <w:t>Enemy sprites moves</w:t>
-            </w:r>
+              <w:t xml:space="preserve">Enemy sprites </w:t>
+            </w:r>
+            <w:proofErr w:type="gramStart"/>
+            <w:r>
+              <w:t>moves</w:t>
+            </w:r>
+            <w:proofErr w:type="gramEnd"/>
           </w:p>
         </w:tc>
         <w:tc>
@@ -2337,8 +2487,13 @@
           </w:tcPr>
           <w:p>
             <w:r>
-              <w:t>Enemy sprite movment</w:t>
-            </w:r>
+              <w:t xml:space="preserve">Enemy sprite </w:t>
+            </w:r>
+            <w:proofErr w:type="spellStart"/>
+            <w:r>
+              <w:t>movment</w:t>
+            </w:r>
+            <w:proofErr w:type="spellEnd"/>
           </w:p>
         </w:tc>
         <w:tc>
@@ -2347,7 +2502,15 @@
           </w:tcPr>
           <w:p>
             <w:r>
-              <w:t xml:space="preserve">Enemy enemy sprites make small movements left and right and jump </w:t>
+              <w:t xml:space="preserve">Enemy </w:t>
+            </w:r>
+            <w:proofErr w:type="spellStart"/>
+            <w:r>
+              <w:t>enemy</w:t>
+            </w:r>
+            <w:proofErr w:type="spellEnd"/>
+            <w:r>
+              <w:t xml:space="preserve"> sprites make small movements left and right and jump </w:t>
             </w:r>
           </w:p>
         </w:tc>
@@ -2523,6 +2686,7 @@
                 <w:lang w:eastAsia="en-NZ"/>
               </w:rPr>
             </w:pPr>
+            <w:proofErr w:type="spellStart"/>
             <w:r>
               <w:rPr>
                 <w:rFonts w:ascii="Consolas" w:eastAsia="Times New Roman" w:hAnsi="Consolas" w:cs="Times New Roman"/>
@@ -2533,6 +2697,7 @@
               </w:rPr>
               <w:t>elif</w:t>
             </w:r>
+            <w:proofErr w:type="spellEnd"/>
             <w:r>
               <w:rPr>
                 <w:rFonts w:ascii="Consolas" w:eastAsia="Times New Roman" w:hAnsi="Consolas" w:cs="Times New Roman"/>
@@ -2543,6 +2708,8 @@
               </w:rPr>
               <w:t xml:space="preserve"> </w:t>
             </w:r>
+            <w:proofErr w:type="spellStart"/>
+            <w:proofErr w:type="gramStart"/>
             <w:r>
               <w:rPr>
                 <w:rFonts w:ascii="Consolas" w:eastAsia="Times New Roman" w:hAnsi="Consolas" w:cs="Times New Roman"/>
@@ -2573,6 +2740,8 @@
               </w:rPr>
               <w:t>direction</w:t>
             </w:r>
+            <w:proofErr w:type="spellEnd"/>
+            <w:proofErr w:type="gramEnd"/>
             <w:r>
               <w:rPr>
                 <w:rFonts w:ascii="Consolas" w:eastAsia="Times New Roman" w:hAnsi="Consolas" w:cs="Times New Roman"/>
@@ -2646,6 +2815,8 @@
               </w:rPr>
               <w:t xml:space="preserve">            </w:t>
             </w:r>
+            <w:proofErr w:type="spellStart"/>
+            <w:proofErr w:type="gramStart"/>
             <w:r>
               <w:rPr>
                 <w:rFonts w:ascii="Consolas" w:eastAsia="Times New Roman" w:hAnsi="Consolas" w:cs="Times New Roman"/>
@@ -2674,8 +2845,20 @@
                 <w:szCs w:val="21"/>
                 <w:lang w:eastAsia="en-NZ"/>
               </w:rPr>
-              <w:t>change_x</w:t>
-            </w:r>
+              <w:t>change</w:t>
+            </w:r>
+            <w:proofErr w:type="gramEnd"/>
+            <w:r>
+              <w:rPr>
+                <w:rFonts w:ascii="Consolas" w:eastAsia="Times New Roman" w:hAnsi="Consolas" w:cs="Times New Roman"/>
+                <w:color w:val="9CDCFE"/>
+                <w:sz w:val="21"/>
+                <w:szCs w:val="21"/>
+                <w:lang w:eastAsia="en-NZ"/>
+              </w:rPr>
+              <w:t>_x</w:t>
+            </w:r>
+            <w:proofErr w:type="spellEnd"/>
             <w:r>
               <w:rPr>
                 <w:rFonts w:ascii="Consolas" w:eastAsia="Times New Roman" w:hAnsi="Consolas" w:cs="Times New Roman"/>
@@ -2861,6 +3044,7 @@
                 <w:lang w:eastAsia="en-NZ"/>
               </w:rPr>
             </w:pPr>
+            <w:proofErr w:type="gramStart"/>
             <w:r>
               <w:rPr>
                 <w:rFonts w:ascii="Consolas" w:eastAsia="Times New Roman" w:hAnsi="Consolas" w:cs="Times New Roman"/>
@@ -2869,7 +3053,62 @@
                 <w:szCs w:val="21"/>
                 <w:lang w:eastAsia="en-NZ"/>
               </w:rPr>
-              <w:t>Changed .change_x -= 3 to  .change_x = -3</w:t>
+              <w:t>Changed .</w:t>
+            </w:r>
+            <w:proofErr w:type="spellStart"/>
+            <w:r>
+              <w:rPr>
+                <w:rFonts w:ascii="Consolas" w:eastAsia="Times New Roman" w:hAnsi="Consolas" w:cs="Times New Roman"/>
+                <w:color w:val="C586C0"/>
+                <w:sz w:val="21"/>
+                <w:szCs w:val="21"/>
+                <w:lang w:eastAsia="en-NZ"/>
+              </w:rPr>
+              <w:t>change</w:t>
+            </w:r>
+            <w:proofErr w:type="gramEnd"/>
+            <w:r>
+              <w:rPr>
+                <w:rFonts w:ascii="Consolas" w:eastAsia="Times New Roman" w:hAnsi="Consolas" w:cs="Times New Roman"/>
+                <w:color w:val="C586C0"/>
+                <w:sz w:val="21"/>
+                <w:szCs w:val="21"/>
+                <w:lang w:eastAsia="en-NZ"/>
+              </w:rPr>
+              <w:t>_x</w:t>
+            </w:r>
+            <w:proofErr w:type="spellEnd"/>
+            <w:r>
+              <w:rPr>
+                <w:rFonts w:ascii="Consolas" w:eastAsia="Times New Roman" w:hAnsi="Consolas" w:cs="Times New Roman"/>
+                <w:color w:val="C586C0"/>
+                <w:sz w:val="21"/>
+                <w:szCs w:val="21"/>
+                <w:lang w:eastAsia="en-NZ"/>
+              </w:rPr>
+              <w:t xml:space="preserve"> -= 3 to  .</w:t>
+            </w:r>
+            <w:proofErr w:type="spellStart"/>
+            <w:r>
+              <w:rPr>
+                <w:rFonts w:ascii="Consolas" w:eastAsia="Times New Roman" w:hAnsi="Consolas" w:cs="Times New Roman"/>
+                <w:color w:val="C586C0"/>
+                <w:sz w:val="21"/>
+                <w:szCs w:val="21"/>
+                <w:lang w:eastAsia="en-NZ"/>
+              </w:rPr>
+              <w:t>change_x</w:t>
+            </w:r>
+            <w:proofErr w:type="spellEnd"/>
+            <w:r>
+              <w:rPr>
+                <w:rFonts w:ascii="Consolas" w:eastAsia="Times New Roman" w:hAnsi="Consolas" w:cs="Times New Roman"/>
+                <w:color w:val="C586C0"/>
+                <w:sz w:val="21"/>
+                <w:szCs w:val="21"/>
+                <w:lang w:eastAsia="en-NZ"/>
+              </w:rPr>
+              <w:t xml:space="preserve"> = -3</w:t>
             </w:r>
           </w:p>
         </w:tc>
@@ -3017,6 +3256,69 @@
               </w:rPr>
               <w:t>Sent a permission key from the on key press function to update animation function.</w:t>
             </w:r>
+          </w:p>
+        </w:tc>
+      </w:tr>
+      <w:tr>
+        <w:trPr>
+          <w:trHeight w:val="396"/>
+        </w:trPr>
+        <w:tc>
+          <w:tcPr>
+            <w:tcW w:w="761" w:type="dxa"/>
+          </w:tcPr>
+          <w:p>
+            <w:r>
+              <w:t>22/4</w:t>
+            </w:r>
+          </w:p>
+        </w:tc>
+        <w:tc>
+          <w:tcPr>
+            <w:tcW w:w="1358" w:type="dxa"/>
+          </w:tcPr>
+          <w:p>
+            <w:r>
+              <w:t>Enemy sprite animation</w:t>
+            </w:r>
+          </w:p>
+        </w:tc>
+        <w:tc>
+          <w:tcPr>
+            <w:tcW w:w="1419" w:type="dxa"/>
+          </w:tcPr>
+          <w:p>
+            <w:r>
+              <w:t xml:space="preserve">Sprites play animation when space </w:t>
+            </w:r>
+            <w:r>
+              <w:lastRenderedPageBreak/>
+              <w:t xml:space="preserve">bar is pressed </w:t>
+            </w:r>
+          </w:p>
+        </w:tc>
+        <w:tc>
+          <w:tcPr>
+            <w:tcW w:w="1463" w:type="dxa"/>
+          </w:tcPr>
+          <w:p/>
+        </w:tc>
+        <w:tc>
+          <w:tcPr>
+            <w:tcW w:w="7563" w:type="dxa"/>
+          </w:tcPr>
+          <w:p>
+            <w:pPr>
+              <w:shd w:val="clear" w:color="auto" w:fill="1E1E1E"/>
+              <w:spacing w:line="285" w:lineRule="atLeast"/>
+              <w:rPr>
+                <w:rFonts w:ascii="Consolas" w:eastAsia="Times New Roman" w:hAnsi="Consolas" w:cs="Times New Roman"/>
+                <w:color w:val="C586C0"/>
+                <w:sz w:val="21"/>
+                <w:szCs w:val="21"/>
+                <w:lang w:eastAsia="en-NZ"/>
+              </w:rPr>
+            </w:pPr>
           </w:p>
         </w:tc>
       </w:tr>
@@ -3033,7 +3335,7 @@
 </file>
 
 <file path=word/styles.xml><?xml version="1.0" encoding="utf-8"?>
-<w:styles xmlns:mc="http://schemas.openxmlformats.org/markup-compatibility/2006" xmlns:r="http://schemas.openxmlformats.org/officeDocument/2006/relationships" xmlns:w="http://schemas.openxmlformats.org/wordprocessingml/2006/main" xmlns:w14="http://schemas.microsoft.com/office/word/2010/wordml" xmlns:w15="http://schemas.microsoft.com/office/word/2012/wordml" xmlns:w16cex="http://schemas.microsoft.com/office/word/2018/wordml/cex" xmlns:w16cid="http://schemas.microsoft.com/office/word/2016/wordml/cid" xmlns:w16="http://schemas.microsoft.com/office/word/2018/wordml" xmlns:w16du="http://schemas.microsoft.com/office/word/2023/wordml/word16du" xmlns:w16sdtdh="http://schemas.microsoft.com/office/word/2020/wordml/sdtdatahash" xmlns:w16se="http://schemas.microsoft.com/office/word/2015/wordml/symex" mc:Ignorable="w14 w15 w16se w16cid w16 w16cex w16sdtdh w16du">
+<w:styles xmlns:mc="http://schemas.openxmlformats.org/markup-compatibility/2006" xmlns:r="http://schemas.openxmlformats.org/officeDocument/2006/relationships" xmlns:w="http://schemas.openxmlformats.org/wordprocessingml/2006/main" xmlns:w14="http://schemas.microsoft.com/office/word/2010/wordml" xmlns:w15="http://schemas.microsoft.com/office/word/2012/wordml" xmlns:w16cex="http://schemas.microsoft.com/office/word/2018/wordml/cex" xmlns:w16cid="http://schemas.microsoft.com/office/word/2016/wordml/cid" xmlns:w16="http://schemas.microsoft.com/office/word/2018/wordml" xmlns:w16sdtdh="http://schemas.microsoft.com/office/word/2020/wordml/sdtdatahash" xmlns:w16se="http://schemas.microsoft.com/office/word/2015/wordml/symex" mc:Ignorable="w14 w15 w16se w16cid w16 w16cex w16sdtdh">
   <w:docDefaults>
     <w:rPrDefault>
       <w:rPr>

</xml_diff>

<commit_message>
got enemy animations to work
</commit_message>
<xml_diff>
--- a/documentation/ongoing_testing.docx
+++ b/documentation/ongoing_testing.docx
@@ -5,7 +5,7 @@
     <w:tbl>
       <w:tblPr>
         <w:tblStyle w:val="TableGrid"/>
-        <w:tblW w:w="12564" w:type="dxa"/>
+        <w:tblW w:w="14508" w:type="dxa"/>
         <w:tblInd w:w="-856" w:type="dxa"/>
         <w:tblLook w:val="04A0" w:firstRow="1" w:lastRow="0" w:firstColumn="1" w:lastColumn="0" w:noHBand="0" w:noVBand="1"/>
       </w:tblPr>
@@ -13,8 +13,8 @@
         <w:gridCol w:w="761"/>
         <w:gridCol w:w="1358"/>
         <w:gridCol w:w="1419"/>
-        <w:gridCol w:w="1463"/>
-        <w:gridCol w:w="7563"/>
+        <w:gridCol w:w="1724"/>
+        <w:gridCol w:w="9246"/>
       </w:tblGrid>
       <w:tr>
         <w:tc>
@@ -49,7 +49,7 @@
         </w:tc>
         <w:tc>
           <w:tcPr>
-            <w:tcW w:w="1463" w:type="dxa"/>
+            <w:tcW w:w="1724" w:type="dxa"/>
           </w:tcPr>
           <w:p>
             <w:r>
@@ -59,7 +59,7 @@
         </w:tc>
         <w:tc>
           <w:tcPr>
-            <w:tcW w:w="7563" w:type="dxa"/>
+            <w:tcW w:w="9246" w:type="dxa"/>
           </w:tcPr>
           <w:p>
             <w:r>
@@ -101,22 +101,35 @@
         </w:tc>
         <w:tc>
           <w:tcPr>
-            <w:tcW w:w="1463" w:type="dxa"/>
-          </w:tcPr>
-          <w:p>
-            <w:r>
-              <w:t>Vs code complains about vstd compression</w:t>
-            </w:r>
-          </w:p>
-        </w:tc>
-        <w:tc>
-          <w:tcPr>
-            <w:tcW w:w="7563" w:type="dxa"/>
-          </w:tcPr>
-          <w:p>
-            <w:r>
-              <w:t>Changed compression type to zlib</w:t>
-            </w:r>
+            <w:tcW w:w="1724" w:type="dxa"/>
+          </w:tcPr>
+          <w:p>
+            <w:r>
+              <w:t xml:space="preserve">Vs code complains about </w:t>
+            </w:r>
+            <w:proofErr w:type="spellStart"/>
+            <w:r>
+              <w:t>vstd</w:t>
+            </w:r>
+            <w:proofErr w:type="spellEnd"/>
+            <w:r>
+              <w:t xml:space="preserve"> compression</w:t>
+            </w:r>
+          </w:p>
+        </w:tc>
+        <w:tc>
+          <w:tcPr>
+            <w:tcW w:w="9246" w:type="dxa"/>
+          </w:tcPr>
+          <w:p>
+            <w:r>
+              <w:t xml:space="preserve">Changed compression type to </w:t>
+            </w:r>
+            <w:proofErr w:type="spellStart"/>
+            <w:r>
+              <w:t>zlib</w:t>
+            </w:r>
+            <w:proofErr w:type="spellEnd"/>
           </w:p>
         </w:tc>
       </w:tr>
@@ -153,7 +166,7 @@
         </w:tc>
         <w:tc>
           <w:tcPr>
-            <w:tcW w:w="1463" w:type="dxa"/>
+            <w:tcW w:w="1724" w:type="dxa"/>
           </w:tcPr>
           <w:p>
             <w:r>
@@ -163,7 +176,7 @@
         </w:tc>
         <w:tc>
           <w:tcPr>
-            <w:tcW w:w="7563" w:type="dxa"/>
+            <w:tcW w:w="9246" w:type="dxa"/>
           </w:tcPr>
           <w:p>
             <w:r>
@@ -205,7 +218,7 @@
         </w:tc>
         <w:tc>
           <w:tcPr>
-            <w:tcW w:w="1463" w:type="dxa"/>
+            <w:tcW w:w="1724" w:type="dxa"/>
           </w:tcPr>
           <w:p>
             <w:r>
@@ -215,7 +228,7 @@
         </w:tc>
         <w:tc>
           <w:tcPr>
-            <w:tcW w:w="7563" w:type="dxa"/>
+            <w:tcW w:w="9246" w:type="dxa"/>
           </w:tcPr>
           <w:p>
             <w:r>
@@ -257,7 +270,7 @@
         </w:tc>
         <w:tc>
           <w:tcPr>
-            <w:tcW w:w="1463" w:type="dxa"/>
+            <w:tcW w:w="1724" w:type="dxa"/>
           </w:tcPr>
           <w:p>
             <w:r>
@@ -270,7 +283,7 @@
         </w:tc>
         <w:tc>
           <w:tcPr>
-            <w:tcW w:w="7563" w:type="dxa"/>
+            <w:tcW w:w="9246" w:type="dxa"/>
           </w:tcPr>
           <w:p/>
         </w:tc>
@@ -308,7 +321,7 @@
         </w:tc>
         <w:tc>
           <w:tcPr>
-            <w:tcW w:w="1463" w:type="dxa"/>
+            <w:tcW w:w="1724" w:type="dxa"/>
           </w:tcPr>
           <w:p>
             <w:r>
@@ -318,7 +331,7 @@
         </w:tc>
         <w:tc>
           <w:tcPr>
-            <w:tcW w:w="7563" w:type="dxa"/>
+            <w:tcW w:w="9246" w:type="dxa"/>
           </w:tcPr>
           <w:p>
             <w:pPr>
@@ -341,6 +354,7 @@
                 <w:lang w:eastAsia="en-NZ"/>
               </w:rPr>
             </w:pPr>
+            <w:proofErr w:type="spellStart"/>
             <w:r>
               <w:rPr>
                 <w:rFonts w:ascii="Consolas" w:eastAsia="Times New Roman" w:hAnsi="Consolas" w:cs="Times New Roman"/>
@@ -371,6 +385,7 @@
               </w:rPr>
               <w:t>hit_box</w:t>
             </w:r>
+            <w:proofErr w:type="spellEnd"/>
             <w:r>
               <w:rPr>
                 <w:rFonts w:ascii="Consolas" w:eastAsia="Times New Roman" w:hAnsi="Consolas" w:cs="Times New Roman"/>
@@ -381,6 +396,7 @@
               </w:rPr>
               <w:t xml:space="preserve"> = </w:t>
             </w:r>
+            <w:proofErr w:type="spellStart"/>
             <w:r>
               <w:rPr>
                 <w:rFonts w:ascii="Consolas" w:eastAsia="Times New Roman" w:hAnsi="Consolas" w:cs="Times New Roman"/>
@@ -421,6 +437,7 @@
               </w:rPr>
               <w:t>.hit_box_points</w:t>
             </w:r>
+            <w:proofErr w:type="spellEnd"/>
           </w:p>
           <w:p/>
         </w:tc>
@@ -458,7 +475,7 @@
         </w:tc>
         <w:tc>
           <w:tcPr>
-            <w:tcW w:w="1463" w:type="dxa"/>
+            <w:tcW w:w="1724" w:type="dxa"/>
           </w:tcPr>
           <w:p>
             <w:r>
@@ -468,7 +485,7 @@
         </w:tc>
         <w:tc>
           <w:tcPr>
-            <w:tcW w:w="7563" w:type="dxa"/>
+            <w:tcW w:w="9246" w:type="dxa"/>
           </w:tcPr>
           <w:p>
             <w:r>
@@ -510,6 +527,8 @@
               </w:rPr>
               <w:t xml:space="preserve">        </w:t>
             </w:r>
+            <w:proofErr w:type="spellStart"/>
+            <w:proofErr w:type="gramStart"/>
             <w:r>
               <w:rPr>
                 <w:rFonts w:ascii="Consolas" w:eastAsia="Times New Roman" w:hAnsi="Consolas" w:cs="Times New Roman"/>
@@ -538,8 +557,20 @@
                 <w:szCs w:val="21"/>
                 <w:lang w:eastAsia="en-NZ"/>
               </w:rPr>
-              <w:t>hitbox_texture</w:t>
-            </w:r>
+              <w:t>hitbox</w:t>
+            </w:r>
+            <w:proofErr w:type="gramEnd"/>
+            <w:r>
+              <w:rPr>
+                <w:rFonts w:ascii="Consolas" w:eastAsia="Times New Roman" w:hAnsi="Consolas" w:cs="Times New Roman"/>
+                <w:color w:val="9CDCFE"/>
+                <w:sz w:val="21"/>
+                <w:szCs w:val="21"/>
+                <w:lang w:eastAsia="en-NZ"/>
+              </w:rPr>
+              <w:t>_texture</w:t>
+            </w:r>
+            <w:proofErr w:type="spellEnd"/>
             <w:r>
               <w:rPr>
                 <w:rFonts w:ascii="Consolas" w:eastAsia="Times New Roman" w:hAnsi="Consolas" w:cs="Times New Roman"/>
@@ -550,6 +581,7 @@
               </w:rPr>
               <w:t xml:space="preserve"> = </w:t>
             </w:r>
+            <w:proofErr w:type="spellStart"/>
             <w:r>
               <w:rPr>
                 <w:rFonts w:ascii="Consolas" w:eastAsia="Times New Roman" w:hAnsi="Consolas" w:cs="Times New Roman"/>
@@ -580,6 +612,7 @@
               </w:rPr>
               <w:t>idle_texture_pair</w:t>
             </w:r>
+            <w:proofErr w:type="spellEnd"/>
             <w:r>
               <w:rPr>
                 <w:rFonts w:ascii="Consolas" w:eastAsia="Times New Roman" w:hAnsi="Consolas" w:cs="Times New Roman"/>
@@ -633,6 +666,7 @@
               </w:rPr>
               <w:t xml:space="preserve">        </w:t>
             </w:r>
+            <w:proofErr w:type="spellStart"/>
             <w:r>
               <w:rPr>
                 <w:rFonts w:ascii="Consolas" w:eastAsia="Times New Roman" w:hAnsi="Consolas" w:cs="Times New Roman"/>
@@ -663,6 +697,7 @@
               </w:rPr>
               <w:t>hit_box</w:t>
             </w:r>
+            <w:proofErr w:type="spellEnd"/>
             <w:r>
               <w:rPr>
                 <w:rFonts w:ascii="Consolas" w:eastAsia="Times New Roman" w:hAnsi="Consolas" w:cs="Times New Roman"/>
@@ -673,6 +708,7 @@
               </w:rPr>
               <w:t xml:space="preserve"> = </w:t>
             </w:r>
+            <w:proofErr w:type="spellStart"/>
             <w:r>
               <w:rPr>
                 <w:rFonts w:ascii="Consolas" w:eastAsia="Times New Roman" w:hAnsi="Consolas" w:cs="Times New Roman"/>
@@ -723,6 +759,7 @@
               </w:rPr>
               <w:t>hit_box_points</w:t>
             </w:r>
+            <w:proofErr w:type="spellEnd"/>
           </w:p>
           <w:p/>
         </w:tc>
@@ -760,7 +797,7 @@
         </w:tc>
         <w:tc>
           <w:tcPr>
-            <w:tcW w:w="1463" w:type="dxa"/>
+            <w:tcW w:w="1724" w:type="dxa"/>
           </w:tcPr>
           <w:p>
             <w:r>
@@ -770,7 +807,7 @@
         </w:tc>
         <w:tc>
           <w:tcPr>
-            <w:tcW w:w="7563" w:type="dxa"/>
+            <w:tcW w:w="9246" w:type="dxa"/>
           </w:tcPr>
           <w:p>
             <w:r>
@@ -812,7 +849,7 @@
         </w:tc>
         <w:tc>
           <w:tcPr>
-            <w:tcW w:w="1463" w:type="dxa"/>
+            <w:tcW w:w="1724" w:type="dxa"/>
           </w:tcPr>
           <w:p>
             <w:r>
@@ -822,7 +859,7 @@
         </w:tc>
         <w:tc>
           <w:tcPr>
-            <w:tcW w:w="7563" w:type="dxa"/>
+            <w:tcW w:w="9246" w:type="dxa"/>
           </w:tcPr>
           <w:p>
             <w:r>
@@ -864,7 +901,7 @@
         </w:tc>
         <w:tc>
           <w:tcPr>
-            <w:tcW w:w="1463" w:type="dxa"/>
+            <w:tcW w:w="1724" w:type="dxa"/>
           </w:tcPr>
           <w:p>
             <w:r>
@@ -874,11 +911,19 @@
         </w:tc>
         <w:tc>
           <w:tcPr>
-            <w:tcW w:w="7563" w:type="dxa"/>
-          </w:tcPr>
-          <w:p>
-            <w:r>
-              <w:t>Called function in on_update function</w:t>
+            <w:tcW w:w="9246" w:type="dxa"/>
+          </w:tcPr>
+          <w:p>
+            <w:r>
+              <w:t xml:space="preserve">Called function in </w:t>
+            </w:r>
+            <w:proofErr w:type="spellStart"/>
+            <w:r>
+              <w:t>on_update</w:t>
+            </w:r>
+            <w:proofErr w:type="spellEnd"/>
+            <w:r>
+              <w:t xml:space="preserve"> function</w:t>
             </w:r>
           </w:p>
         </w:tc>
@@ -920,7 +965,7 @@
         </w:tc>
         <w:tc>
           <w:tcPr>
-            <w:tcW w:w="1463" w:type="dxa"/>
+            <w:tcW w:w="1724" w:type="dxa"/>
           </w:tcPr>
           <w:p>
             <w:r>
@@ -931,7 +976,7 @@
         </w:tc>
         <w:tc>
           <w:tcPr>
-            <w:tcW w:w="7563" w:type="dxa"/>
+            <w:tcW w:w="9246" w:type="dxa"/>
           </w:tcPr>
           <w:p>
             <w:r>
@@ -974,7 +1019,7 @@
         </w:tc>
         <w:tc>
           <w:tcPr>
-            <w:tcW w:w="1463" w:type="dxa"/>
+            <w:tcW w:w="1724" w:type="dxa"/>
           </w:tcPr>
           <w:p>
             <w:r>
@@ -984,7 +1029,7 @@
         </w:tc>
         <w:tc>
           <w:tcPr>
-            <w:tcW w:w="7563" w:type="dxa"/>
+            <w:tcW w:w="9246" w:type="dxa"/>
           </w:tcPr>
           <w:p>
             <w:pPr>
@@ -1018,6 +1063,8 @@
               </w:rPr>
               <w:t xml:space="preserve"> </w:t>
             </w:r>
+            <w:proofErr w:type="spellStart"/>
+            <w:proofErr w:type="gramStart"/>
             <w:r>
               <w:rPr>
                 <w:rFonts w:ascii="Consolas" w:eastAsia="Times New Roman" w:hAnsi="Consolas" w:cs="Times New Roman"/>
@@ -1046,8 +1093,20 @@
                 <w:szCs w:val="21"/>
                 <w:lang w:eastAsia="en-NZ"/>
               </w:rPr>
-              <w:t>change_y</w:t>
-            </w:r>
+              <w:t>change</w:t>
+            </w:r>
+            <w:proofErr w:type="gramEnd"/>
+            <w:r>
+              <w:rPr>
+                <w:rFonts w:ascii="Consolas" w:eastAsia="Times New Roman" w:hAnsi="Consolas" w:cs="Times New Roman"/>
+                <w:color w:val="9CDCFE"/>
+                <w:sz w:val="21"/>
+                <w:szCs w:val="21"/>
+                <w:lang w:eastAsia="en-NZ"/>
+              </w:rPr>
+              <w:t>_y</w:t>
+            </w:r>
+            <w:proofErr w:type="spellEnd"/>
             <w:r>
               <w:rPr>
                 <w:rFonts w:ascii="Consolas" w:eastAsia="Times New Roman" w:hAnsi="Consolas" w:cs="Times New Roman"/>
@@ -1121,6 +1180,8 @@
               </w:rPr>
               <w:t xml:space="preserve">            </w:t>
             </w:r>
+            <w:proofErr w:type="spellStart"/>
+            <w:proofErr w:type="gramStart"/>
             <w:r>
               <w:rPr>
                 <w:rFonts w:ascii="Consolas" w:eastAsia="Times New Roman" w:hAnsi="Consolas" w:cs="Times New Roman"/>
@@ -1151,6 +1212,8 @@
               </w:rPr>
               <w:t>texture</w:t>
             </w:r>
+            <w:proofErr w:type="spellEnd"/>
+            <w:proofErr w:type="gramEnd"/>
             <w:r>
               <w:rPr>
                 <w:rFonts w:ascii="Consolas" w:eastAsia="Times New Roman" w:hAnsi="Consolas" w:cs="Times New Roman"/>
@@ -1181,6 +1244,7 @@
               </w:rPr>
               <w:t xml:space="preserve"> </w:t>
             </w:r>
+            <w:proofErr w:type="spellStart"/>
             <w:r>
               <w:rPr>
                 <w:rFonts w:ascii="Consolas" w:eastAsia="Times New Roman" w:hAnsi="Consolas" w:cs="Times New Roman"/>
@@ -1211,6 +1275,7 @@
               </w:rPr>
               <w:t>fall_textures</w:t>
             </w:r>
+            <w:proofErr w:type="spellEnd"/>
             <w:r>
               <w:rPr>
                 <w:rFonts w:ascii="Consolas" w:eastAsia="Times New Roman" w:hAnsi="Consolas" w:cs="Times New Roman"/>
@@ -1241,6 +1306,7 @@
               </w:rPr>
               <w:t>][</w:t>
             </w:r>
+            <w:proofErr w:type="spellStart"/>
             <w:r>
               <w:rPr>
                 <w:rFonts w:ascii="Consolas" w:eastAsia="Times New Roman" w:hAnsi="Consolas" w:cs="Times New Roman"/>
@@ -1271,6 +1337,7 @@
               </w:rPr>
               <w:t>character_face_direction</w:t>
             </w:r>
+            <w:proofErr w:type="spellEnd"/>
             <w:r>
               <w:rPr>
                 <w:rFonts w:ascii="Consolas" w:eastAsia="Times New Roman" w:hAnsi="Consolas" w:cs="Times New Roman"/>
@@ -1324,6 +1391,8 @@
               </w:rPr>
               <w:t xml:space="preserve"> </w:t>
             </w:r>
+            <w:proofErr w:type="spellStart"/>
+            <w:proofErr w:type="gramStart"/>
             <w:r>
               <w:rPr>
                 <w:rFonts w:ascii="Consolas" w:eastAsia="Times New Roman" w:hAnsi="Consolas" w:cs="Times New Roman"/>
@@ -1352,8 +1421,20 @@
                 <w:szCs w:val="21"/>
                 <w:lang w:eastAsia="en-NZ"/>
               </w:rPr>
-              <w:t>change_y</w:t>
-            </w:r>
+              <w:t>change</w:t>
+            </w:r>
+            <w:proofErr w:type="gramEnd"/>
+            <w:r>
+              <w:rPr>
+                <w:rFonts w:ascii="Consolas" w:eastAsia="Times New Roman" w:hAnsi="Consolas" w:cs="Times New Roman"/>
+                <w:color w:val="9CDCFE"/>
+                <w:sz w:val="21"/>
+                <w:szCs w:val="21"/>
+                <w:lang w:eastAsia="en-NZ"/>
+              </w:rPr>
+              <w:t>_y</w:t>
+            </w:r>
+            <w:proofErr w:type="spellEnd"/>
             <w:r>
               <w:rPr>
                 <w:rFonts w:ascii="Consolas" w:eastAsia="Times New Roman" w:hAnsi="Consolas" w:cs="Times New Roman"/>
@@ -1437,6 +1518,8 @@
               </w:rPr>
               <w:t xml:space="preserve">            </w:t>
             </w:r>
+            <w:proofErr w:type="spellStart"/>
+            <w:proofErr w:type="gramStart"/>
             <w:r>
               <w:rPr>
                 <w:rFonts w:ascii="Consolas" w:eastAsia="Times New Roman" w:hAnsi="Consolas" w:cs="Times New Roman"/>
@@ -1467,6 +1550,8 @@
               </w:rPr>
               <w:t>texture</w:t>
             </w:r>
+            <w:proofErr w:type="spellEnd"/>
+            <w:proofErr w:type="gramEnd"/>
             <w:r>
               <w:rPr>
                 <w:rFonts w:ascii="Consolas" w:eastAsia="Times New Roman" w:hAnsi="Consolas" w:cs="Times New Roman"/>
@@ -1497,6 +1582,7 @@
               </w:rPr>
               <w:t xml:space="preserve"> </w:t>
             </w:r>
+            <w:proofErr w:type="spellStart"/>
             <w:r>
               <w:rPr>
                 <w:rFonts w:ascii="Consolas" w:eastAsia="Times New Roman" w:hAnsi="Consolas" w:cs="Times New Roman"/>
@@ -1527,6 +1613,7 @@
               </w:rPr>
               <w:t>fall_textures</w:t>
             </w:r>
+            <w:proofErr w:type="spellEnd"/>
             <w:r>
               <w:rPr>
                 <w:rFonts w:ascii="Consolas" w:eastAsia="Times New Roman" w:hAnsi="Consolas" w:cs="Times New Roman"/>
@@ -1557,6 +1644,7 @@
               </w:rPr>
               <w:t>][</w:t>
             </w:r>
+            <w:proofErr w:type="spellStart"/>
             <w:r>
               <w:rPr>
                 <w:rFonts w:ascii="Consolas" w:eastAsia="Times New Roman" w:hAnsi="Consolas" w:cs="Times New Roman"/>
@@ -1587,6 +1675,7 @@
               </w:rPr>
               <w:t>character_face_direction</w:t>
             </w:r>
+            <w:proofErr w:type="spellEnd"/>
             <w:r>
               <w:rPr>
                 <w:rFonts w:ascii="Consolas" w:eastAsia="Times New Roman" w:hAnsi="Consolas" w:cs="Times New Roman"/>
@@ -1639,7 +1728,7 @@
         </w:tc>
         <w:tc>
           <w:tcPr>
-            <w:tcW w:w="1463" w:type="dxa"/>
+            <w:tcW w:w="1724" w:type="dxa"/>
           </w:tcPr>
           <w:p>
             <w:r>
@@ -1649,7 +1738,7 @@
         </w:tc>
         <w:tc>
           <w:tcPr>
-            <w:tcW w:w="7563" w:type="dxa"/>
+            <w:tcW w:w="9246" w:type="dxa"/>
           </w:tcPr>
           <w:p>
             <w:pPr>
@@ -1699,7 +1788,7 @@
         </w:tc>
         <w:tc>
           <w:tcPr>
-            <w:tcW w:w="1463" w:type="dxa"/>
+            <w:tcW w:w="1724" w:type="dxa"/>
           </w:tcPr>
           <w:p>
             <w:r>
@@ -1709,7 +1798,7 @@
         </w:tc>
         <w:tc>
           <w:tcPr>
-            <w:tcW w:w="7563" w:type="dxa"/>
+            <w:tcW w:w="9246" w:type="dxa"/>
           </w:tcPr>
           <w:p>
             <w:pPr>
@@ -1823,7 +1912,7 @@
         </w:tc>
         <w:tc>
           <w:tcPr>
-            <w:tcW w:w="1463" w:type="dxa"/>
+            <w:tcW w:w="1724" w:type="dxa"/>
           </w:tcPr>
           <w:p>
             <w:r>
@@ -1833,7 +1922,7 @@
         </w:tc>
         <w:tc>
           <w:tcPr>
-            <w:tcW w:w="7563" w:type="dxa"/>
+            <w:tcW w:w="9246" w:type="dxa"/>
           </w:tcPr>
           <w:p>
             <w:pPr>
@@ -1896,7 +1985,7 @@
         </w:tc>
         <w:tc>
           <w:tcPr>
-            <w:tcW w:w="1463" w:type="dxa"/>
+            <w:tcW w:w="1724" w:type="dxa"/>
           </w:tcPr>
           <w:p>
             <w:r>
@@ -1906,7 +1995,7 @@
         </w:tc>
         <w:tc>
           <w:tcPr>
-            <w:tcW w:w="7563" w:type="dxa"/>
+            <w:tcW w:w="9246" w:type="dxa"/>
           </w:tcPr>
           <w:p>
             <w:pPr>
@@ -1969,7 +2058,7 @@
         </w:tc>
         <w:tc>
           <w:tcPr>
-            <w:tcW w:w="1463" w:type="dxa"/>
+            <w:tcW w:w="1724" w:type="dxa"/>
           </w:tcPr>
           <w:p>
             <w:r>
@@ -1979,7 +2068,7 @@
         </w:tc>
         <w:tc>
           <w:tcPr>
-            <w:tcW w:w="7563" w:type="dxa"/>
+            <w:tcW w:w="9246" w:type="dxa"/>
           </w:tcPr>
           <w:p>
             <w:pPr>
@@ -2042,7 +2131,7 @@
         </w:tc>
         <w:tc>
           <w:tcPr>
-            <w:tcW w:w="1463" w:type="dxa"/>
+            <w:tcW w:w="1724" w:type="dxa"/>
           </w:tcPr>
           <w:p>
             <w:r>
@@ -2052,7 +2141,7 @@
         </w:tc>
         <w:tc>
           <w:tcPr>
-            <w:tcW w:w="7563" w:type="dxa"/>
+            <w:tcW w:w="9246" w:type="dxa"/>
           </w:tcPr>
           <w:p>
             <w:pPr>
@@ -2125,7 +2214,7 @@
         </w:tc>
         <w:tc>
           <w:tcPr>
-            <w:tcW w:w="1463" w:type="dxa"/>
+            <w:tcW w:w="1724" w:type="dxa"/>
           </w:tcPr>
           <w:p>
             <w:r>
@@ -2143,7 +2232,7 @@
         </w:tc>
         <w:tc>
           <w:tcPr>
-            <w:tcW w:w="7563" w:type="dxa"/>
+            <w:tcW w:w="9246" w:type="dxa"/>
           </w:tcPr>
           <w:p>
             <w:pPr>
@@ -2206,7 +2295,7 @@
         </w:tc>
         <w:tc>
           <w:tcPr>
-            <w:tcW w:w="1463" w:type="dxa"/>
+            <w:tcW w:w="1724" w:type="dxa"/>
           </w:tcPr>
           <w:p>
             <w:r>
@@ -2216,7 +2305,7 @@
         </w:tc>
         <w:tc>
           <w:tcPr>
-            <w:tcW w:w="7563" w:type="dxa"/>
+            <w:tcW w:w="9246" w:type="dxa"/>
           </w:tcPr>
           <w:p>
             <w:pPr>
@@ -2238,7 +2327,63 @@
                 <w:szCs w:val="21"/>
                 <w:lang w:eastAsia="en-NZ"/>
               </w:rPr>
-              <w:t>Changed code from self.change_x to self.center += x</w:t>
+              <w:t xml:space="preserve">Changed code from </w:t>
+            </w:r>
+            <w:proofErr w:type="spellStart"/>
+            <w:proofErr w:type="gramStart"/>
+            <w:r>
+              <w:rPr>
+                <w:rFonts w:ascii="Consolas" w:eastAsia="Times New Roman" w:hAnsi="Consolas" w:cs="Times New Roman"/>
+                <w:color w:val="CCCCCC"/>
+                <w:sz w:val="21"/>
+                <w:szCs w:val="21"/>
+                <w:lang w:eastAsia="en-NZ"/>
+              </w:rPr>
+              <w:t>self.change</w:t>
+            </w:r>
+            <w:proofErr w:type="gramEnd"/>
+            <w:r>
+              <w:rPr>
+                <w:rFonts w:ascii="Consolas" w:eastAsia="Times New Roman" w:hAnsi="Consolas" w:cs="Times New Roman"/>
+                <w:color w:val="CCCCCC"/>
+                <w:sz w:val="21"/>
+                <w:szCs w:val="21"/>
+                <w:lang w:eastAsia="en-NZ"/>
+              </w:rPr>
+              <w:t>_x</w:t>
+            </w:r>
+            <w:proofErr w:type="spellEnd"/>
+            <w:r>
+              <w:rPr>
+                <w:rFonts w:ascii="Consolas" w:eastAsia="Times New Roman" w:hAnsi="Consolas" w:cs="Times New Roman"/>
+                <w:color w:val="CCCCCC"/>
+                <w:sz w:val="21"/>
+                <w:szCs w:val="21"/>
+                <w:lang w:eastAsia="en-NZ"/>
+              </w:rPr>
+              <w:t xml:space="preserve"> to </w:t>
+            </w:r>
+            <w:proofErr w:type="spellStart"/>
+            <w:r>
+              <w:rPr>
+                <w:rFonts w:ascii="Consolas" w:eastAsia="Times New Roman" w:hAnsi="Consolas" w:cs="Times New Roman"/>
+                <w:color w:val="CCCCCC"/>
+                <w:sz w:val="21"/>
+                <w:szCs w:val="21"/>
+                <w:lang w:eastAsia="en-NZ"/>
+              </w:rPr>
+              <w:t>self.center</w:t>
+            </w:r>
+            <w:proofErr w:type="spellEnd"/>
+            <w:r>
+              <w:rPr>
+                <w:rFonts w:ascii="Consolas" w:eastAsia="Times New Roman" w:hAnsi="Consolas" w:cs="Times New Roman"/>
+                <w:color w:val="CCCCCC"/>
+                <w:sz w:val="21"/>
+                <w:szCs w:val="21"/>
+                <w:lang w:eastAsia="en-NZ"/>
+              </w:rPr>
+              <w:t xml:space="preserve"> += x</w:t>
             </w:r>
           </w:p>
         </w:tc>
@@ -2253,44 +2398,53 @@
           </w:tcPr>
           <w:p>
             <w:r>
+              <w:t>20/4</w:t>
+            </w:r>
+          </w:p>
+        </w:tc>
+        <w:tc>
+          <w:tcPr>
+            <w:tcW w:w="1358" w:type="dxa"/>
+          </w:tcPr>
+          <w:p>
+            <w:r>
+              <w:t>Enemy sprite movement</w:t>
+            </w:r>
+          </w:p>
+        </w:tc>
+        <w:tc>
+          <w:tcPr>
+            <w:tcW w:w="1419" w:type="dxa"/>
+          </w:tcPr>
+          <w:p>
+            <w:r>
+              <w:t xml:space="preserve">Enemy sprite moves in a </w:t>
+            </w:r>
+            <w:r>
               <w:lastRenderedPageBreak/>
-              <w:t>20/4</w:t>
-            </w:r>
-          </w:p>
-        </w:tc>
-        <w:tc>
-          <w:tcPr>
-            <w:tcW w:w="1358" w:type="dxa"/>
-          </w:tcPr>
-          <w:p>
-            <w:r>
-              <w:t>Enemy sprite movement</w:t>
-            </w:r>
-          </w:p>
-        </w:tc>
-        <w:tc>
-          <w:tcPr>
-            <w:tcW w:w="1419" w:type="dxa"/>
-          </w:tcPr>
-          <w:p>
-            <w:r>
-              <w:t>Enemy sprite moves in a random direction</w:t>
-            </w:r>
-          </w:p>
-        </w:tc>
-        <w:tc>
-          <w:tcPr>
-            <w:tcW w:w="1463" w:type="dxa"/>
-          </w:tcPr>
-          <w:p>
-            <w:r>
-              <w:t>Enemy sprites moves</w:t>
-            </w:r>
-          </w:p>
-        </w:tc>
-        <w:tc>
-          <w:tcPr>
-            <w:tcW w:w="7563" w:type="dxa"/>
+              <w:t>random direction</w:t>
+            </w:r>
+          </w:p>
+        </w:tc>
+        <w:tc>
+          <w:tcPr>
+            <w:tcW w:w="1724" w:type="dxa"/>
+          </w:tcPr>
+          <w:p>
+            <w:r>
+              <w:lastRenderedPageBreak/>
+              <w:t xml:space="preserve">Enemy sprites </w:t>
+            </w:r>
+            <w:proofErr w:type="gramStart"/>
+            <w:r>
+              <w:t>moves</w:t>
+            </w:r>
+            <w:proofErr w:type="gramEnd"/>
+          </w:p>
+        </w:tc>
+        <w:tc>
+          <w:tcPr>
+            <w:tcW w:w="9246" w:type="dxa"/>
           </w:tcPr>
           <w:p>
             <w:pPr>
@@ -2337,8 +2491,13 @@
           </w:tcPr>
           <w:p>
             <w:r>
-              <w:t>Enemy sprite movment</w:t>
-            </w:r>
+              <w:t xml:space="preserve">Enemy sprite </w:t>
+            </w:r>
+            <w:proofErr w:type="spellStart"/>
+            <w:r>
+              <w:t>movment</w:t>
+            </w:r>
+            <w:proofErr w:type="spellEnd"/>
           </w:p>
         </w:tc>
         <w:tc>
@@ -2347,13 +2506,21 @@
           </w:tcPr>
           <w:p>
             <w:r>
-              <w:t xml:space="preserve">Enemy enemy sprites make small movements left and right and jump </w:t>
-            </w:r>
-          </w:p>
-        </w:tc>
-        <w:tc>
-          <w:tcPr>
-            <w:tcW w:w="1463" w:type="dxa"/>
+              <w:t xml:space="preserve">Enemy </w:t>
+            </w:r>
+            <w:proofErr w:type="spellStart"/>
+            <w:r>
+              <w:t>enemy</w:t>
+            </w:r>
+            <w:proofErr w:type="spellEnd"/>
+            <w:r>
+              <w:t xml:space="preserve"> sprites make small movements left and right and jump </w:t>
+            </w:r>
+          </w:p>
+        </w:tc>
+        <w:tc>
+          <w:tcPr>
+            <w:tcW w:w="1724" w:type="dxa"/>
           </w:tcPr>
           <w:p>
             <w:r>
@@ -2363,7 +2530,7 @@
         </w:tc>
         <w:tc>
           <w:tcPr>
-            <w:tcW w:w="7563" w:type="dxa"/>
+            <w:tcW w:w="9246" w:type="dxa"/>
           </w:tcPr>
           <w:p>
             <w:pPr>
@@ -2426,7 +2593,7 @@
         </w:tc>
         <w:tc>
           <w:tcPr>
-            <w:tcW w:w="1463" w:type="dxa"/>
+            <w:tcW w:w="1724" w:type="dxa"/>
           </w:tcPr>
           <w:p>
             <w:r>
@@ -2436,7 +2603,7 @@
         </w:tc>
         <w:tc>
           <w:tcPr>
-            <w:tcW w:w="7563" w:type="dxa"/>
+            <w:tcW w:w="9246" w:type="dxa"/>
           </w:tcPr>
           <w:p>
             <w:pPr>
@@ -2499,7 +2666,7 @@
         </w:tc>
         <w:tc>
           <w:tcPr>
-            <w:tcW w:w="1463" w:type="dxa"/>
+            <w:tcW w:w="1724" w:type="dxa"/>
           </w:tcPr>
           <w:p>
             <w:r>
@@ -2509,7 +2676,7 @@
         </w:tc>
         <w:tc>
           <w:tcPr>
-            <w:tcW w:w="7563" w:type="dxa"/>
+            <w:tcW w:w="9246" w:type="dxa"/>
           </w:tcPr>
           <w:p>
             <w:pPr>
@@ -2523,6 +2690,7 @@
                 <w:lang w:eastAsia="en-NZ"/>
               </w:rPr>
             </w:pPr>
+            <w:proofErr w:type="spellStart"/>
             <w:r>
               <w:rPr>
                 <w:rFonts w:ascii="Consolas" w:eastAsia="Times New Roman" w:hAnsi="Consolas" w:cs="Times New Roman"/>
@@ -2533,6 +2701,7 @@
               </w:rPr>
               <w:t>elif</w:t>
             </w:r>
+            <w:proofErr w:type="spellEnd"/>
             <w:r>
               <w:rPr>
                 <w:rFonts w:ascii="Consolas" w:eastAsia="Times New Roman" w:hAnsi="Consolas" w:cs="Times New Roman"/>
@@ -2543,6 +2712,8 @@
               </w:rPr>
               <w:t xml:space="preserve"> </w:t>
             </w:r>
+            <w:proofErr w:type="spellStart"/>
+            <w:proofErr w:type="gramStart"/>
             <w:r>
               <w:rPr>
                 <w:rFonts w:ascii="Consolas" w:eastAsia="Times New Roman" w:hAnsi="Consolas" w:cs="Times New Roman"/>
@@ -2573,6 +2744,8 @@
               </w:rPr>
               <w:t>direction</w:t>
             </w:r>
+            <w:proofErr w:type="spellEnd"/>
+            <w:proofErr w:type="gramEnd"/>
             <w:r>
               <w:rPr>
                 <w:rFonts w:ascii="Consolas" w:eastAsia="Times New Roman" w:hAnsi="Consolas" w:cs="Times New Roman"/>
@@ -2646,6 +2819,8 @@
               </w:rPr>
               <w:t xml:space="preserve">            </w:t>
             </w:r>
+            <w:proofErr w:type="spellStart"/>
+            <w:proofErr w:type="gramStart"/>
             <w:r>
               <w:rPr>
                 <w:rFonts w:ascii="Consolas" w:eastAsia="Times New Roman" w:hAnsi="Consolas" w:cs="Times New Roman"/>
@@ -2674,8 +2849,20 @@
                 <w:szCs w:val="21"/>
                 <w:lang w:eastAsia="en-NZ"/>
               </w:rPr>
-              <w:t>change_x</w:t>
-            </w:r>
+              <w:t>change</w:t>
+            </w:r>
+            <w:proofErr w:type="gramEnd"/>
+            <w:r>
+              <w:rPr>
+                <w:rFonts w:ascii="Consolas" w:eastAsia="Times New Roman" w:hAnsi="Consolas" w:cs="Times New Roman"/>
+                <w:color w:val="9CDCFE"/>
+                <w:sz w:val="21"/>
+                <w:szCs w:val="21"/>
+                <w:lang w:eastAsia="en-NZ"/>
+              </w:rPr>
+              <w:t>_x</w:t>
+            </w:r>
+            <w:proofErr w:type="spellEnd"/>
             <w:r>
               <w:rPr>
                 <w:rFonts w:ascii="Consolas" w:eastAsia="Times New Roman" w:hAnsi="Consolas" w:cs="Times New Roman"/>
@@ -2748,7 +2935,7 @@
         </w:tc>
         <w:tc>
           <w:tcPr>
-            <w:tcW w:w="1463" w:type="dxa"/>
+            <w:tcW w:w="1724" w:type="dxa"/>
           </w:tcPr>
           <w:p>
             <w:r>
@@ -2758,7 +2945,7 @@
         </w:tc>
         <w:tc>
           <w:tcPr>
-            <w:tcW w:w="7563" w:type="dxa"/>
+            <w:tcW w:w="9246" w:type="dxa"/>
           </w:tcPr>
           <w:p>
             <w:pPr>
@@ -2837,7 +3024,7 @@
         </w:tc>
         <w:tc>
           <w:tcPr>
-            <w:tcW w:w="1463" w:type="dxa"/>
+            <w:tcW w:w="1724" w:type="dxa"/>
           </w:tcPr>
           <w:p>
             <w:r>
@@ -2847,7 +3034,7 @@
         </w:tc>
         <w:tc>
           <w:tcPr>
-            <w:tcW w:w="7563" w:type="dxa"/>
+            <w:tcW w:w="9246" w:type="dxa"/>
           </w:tcPr>
           <w:p>
             <w:pPr>
@@ -2861,6 +3048,7 @@
                 <w:lang w:eastAsia="en-NZ"/>
               </w:rPr>
             </w:pPr>
+            <w:proofErr w:type="gramStart"/>
             <w:r>
               <w:rPr>
                 <w:rFonts w:ascii="Consolas" w:eastAsia="Times New Roman" w:hAnsi="Consolas" w:cs="Times New Roman"/>
@@ -2869,7 +3057,62 @@
                 <w:szCs w:val="21"/>
                 <w:lang w:eastAsia="en-NZ"/>
               </w:rPr>
-              <w:t>Changed .change_x -= 3 to  .change_x = -3</w:t>
+              <w:t>Changed .</w:t>
+            </w:r>
+            <w:proofErr w:type="spellStart"/>
+            <w:r>
+              <w:rPr>
+                <w:rFonts w:ascii="Consolas" w:eastAsia="Times New Roman" w:hAnsi="Consolas" w:cs="Times New Roman"/>
+                <w:color w:val="C586C0"/>
+                <w:sz w:val="21"/>
+                <w:szCs w:val="21"/>
+                <w:lang w:eastAsia="en-NZ"/>
+              </w:rPr>
+              <w:t>change</w:t>
+            </w:r>
+            <w:proofErr w:type="gramEnd"/>
+            <w:r>
+              <w:rPr>
+                <w:rFonts w:ascii="Consolas" w:eastAsia="Times New Roman" w:hAnsi="Consolas" w:cs="Times New Roman"/>
+                <w:color w:val="C586C0"/>
+                <w:sz w:val="21"/>
+                <w:szCs w:val="21"/>
+                <w:lang w:eastAsia="en-NZ"/>
+              </w:rPr>
+              <w:t>_x</w:t>
+            </w:r>
+            <w:proofErr w:type="spellEnd"/>
+            <w:r>
+              <w:rPr>
+                <w:rFonts w:ascii="Consolas" w:eastAsia="Times New Roman" w:hAnsi="Consolas" w:cs="Times New Roman"/>
+                <w:color w:val="C586C0"/>
+                <w:sz w:val="21"/>
+                <w:szCs w:val="21"/>
+                <w:lang w:eastAsia="en-NZ"/>
+              </w:rPr>
+              <w:t xml:space="preserve"> -= 3 to  .</w:t>
+            </w:r>
+            <w:proofErr w:type="spellStart"/>
+            <w:r>
+              <w:rPr>
+                <w:rFonts w:ascii="Consolas" w:eastAsia="Times New Roman" w:hAnsi="Consolas" w:cs="Times New Roman"/>
+                <w:color w:val="C586C0"/>
+                <w:sz w:val="21"/>
+                <w:szCs w:val="21"/>
+                <w:lang w:eastAsia="en-NZ"/>
+              </w:rPr>
+              <w:t>change_x</w:t>
+            </w:r>
+            <w:proofErr w:type="spellEnd"/>
+            <w:r>
+              <w:rPr>
+                <w:rFonts w:ascii="Consolas" w:eastAsia="Times New Roman" w:hAnsi="Consolas" w:cs="Times New Roman"/>
+                <w:color w:val="C586C0"/>
+                <w:sz w:val="21"/>
+                <w:szCs w:val="21"/>
+                <w:lang w:eastAsia="en-NZ"/>
+              </w:rPr>
+              <w:t xml:space="preserve"> = -3</w:t>
             </w:r>
           </w:p>
         </w:tc>
@@ -2910,7 +3153,7 @@
         </w:tc>
         <w:tc>
           <w:tcPr>
-            <w:tcW w:w="1463" w:type="dxa"/>
+            <w:tcW w:w="1724" w:type="dxa"/>
           </w:tcPr>
           <w:p>
             <w:r>
@@ -2920,7 +3163,7 @@
         </w:tc>
         <w:tc>
           <w:tcPr>
-            <w:tcW w:w="7563" w:type="dxa"/>
+            <w:tcW w:w="9246" w:type="dxa"/>
           </w:tcPr>
           <w:p>
             <w:pPr>
@@ -2983,7 +3226,7 @@
         </w:tc>
         <w:tc>
           <w:tcPr>
-            <w:tcW w:w="1463" w:type="dxa"/>
+            <w:tcW w:w="1724" w:type="dxa"/>
           </w:tcPr>
           <w:p>
             <w:r>
@@ -2993,7 +3236,7 @@
         </w:tc>
         <w:tc>
           <w:tcPr>
-            <w:tcW w:w="7563" w:type="dxa"/>
+            <w:tcW w:w="9246" w:type="dxa"/>
           </w:tcPr>
           <w:p>
             <w:pPr>
@@ -3017,6 +3260,1167 @@
               </w:rPr>
               <w:t>Sent a permission key from the on key press function to update animation function.</w:t>
             </w:r>
+          </w:p>
+        </w:tc>
+      </w:tr>
+      <w:tr>
+        <w:trPr>
+          <w:trHeight w:val="396"/>
+        </w:trPr>
+        <w:tc>
+          <w:tcPr>
+            <w:tcW w:w="761" w:type="dxa"/>
+          </w:tcPr>
+          <w:p>
+            <w:r>
+              <w:t>22/4</w:t>
+            </w:r>
+          </w:p>
+        </w:tc>
+        <w:tc>
+          <w:tcPr>
+            <w:tcW w:w="1358" w:type="dxa"/>
+          </w:tcPr>
+          <w:p>
+            <w:r>
+              <w:t>Enemy sprite animation</w:t>
+            </w:r>
+          </w:p>
+        </w:tc>
+        <w:tc>
+          <w:tcPr>
+            <w:tcW w:w="1419" w:type="dxa"/>
+          </w:tcPr>
+          <w:p>
+            <w:r>
+              <w:t xml:space="preserve">Sprites play animation when space bar is pressed </w:t>
+            </w:r>
+          </w:p>
+        </w:tc>
+        <w:tc>
+          <w:tcPr>
+            <w:tcW w:w="1724" w:type="dxa"/>
+          </w:tcPr>
+          <w:p>
+            <w:r>
+              <w:t>Animation doesn’t run</w:t>
+            </w:r>
+          </w:p>
+        </w:tc>
+        <w:tc>
+          <w:tcPr>
+            <w:tcW w:w="9246" w:type="dxa"/>
+          </w:tcPr>
+          <w:p>
+            <w:pPr>
+              <w:shd w:val="clear" w:color="auto" w:fill="1F1F1F"/>
+              <w:spacing w:after="0" w:line="285" w:lineRule="atLeast"/>
+              <w:rPr>
+                <w:rFonts w:ascii="Consolas" w:eastAsia="Times New Roman" w:hAnsi="Consolas" w:cs="Times New Roman"/>
+                <w:color w:val="CCCCCC"/>
+                <w:sz w:val="21"/>
+                <w:szCs w:val="21"/>
+                <w:lang w:eastAsia="en-NZ"/>
+              </w:rPr>
+            </w:pPr>
+            <w:r>
+              <w:rPr>
+                <w:rFonts w:ascii="Consolas" w:eastAsia="Times New Roman" w:hAnsi="Consolas" w:cs="Times New Roman"/>
+                <w:color w:val="CCCCCC"/>
+                <w:sz w:val="21"/>
+                <w:szCs w:val="21"/>
+                <w:lang w:eastAsia="en-NZ"/>
+              </w:rPr>
+              <w:t> </w:t>
+            </w:r>
+            <w:proofErr w:type="spellStart"/>
+            <w:r>
+              <w:rPr>
+                <w:rFonts w:ascii="Consolas" w:eastAsia="Times New Roman" w:hAnsi="Consolas" w:cs="Times New Roman"/>
+                <w:color w:val="C586C0"/>
+                <w:sz w:val="21"/>
+                <w:szCs w:val="21"/>
+                <w:lang w:eastAsia="en-NZ"/>
+              </w:rPr>
+              <w:t>elif</w:t>
+            </w:r>
+            <w:proofErr w:type="spellEnd"/>
+            <w:r>
+              <w:rPr>
+                <w:rFonts w:ascii="Consolas" w:eastAsia="Times New Roman" w:hAnsi="Consolas" w:cs="Times New Roman"/>
+                <w:color w:val="CCCCCC"/>
+                <w:sz w:val="21"/>
+                <w:szCs w:val="21"/>
+                <w:lang w:eastAsia="en-NZ"/>
+              </w:rPr>
+              <w:t xml:space="preserve"> </w:t>
+            </w:r>
+            <w:r>
+              <w:rPr>
+                <w:rFonts w:ascii="Consolas" w:eastAsia="Times New Roman" w:hAnsi="Consolas" w:cs="Times New Roman"/>
+                <w:color w:val="9CDCFE"/>
+                <w:sz w:val="21"/>
+                <w:szCs w:val="21"/>
+                <w:lang w:eastAsia="en-NZ"/>
+              </w:rPr>
+              <w:t>key</w:t>
+            </w:r>
+            <w:r>
+              <w:rPr>
+                <w:rFonts w:ascii="Consolas" w:eastAsia="Times New Roman" w:hAnsi="Consolas" w:cs="Times New Roman"/>
+                <w:color w:val="CCCCCC"/>
+                <w:sz w:val="21"/>
+                <w:szCs w:val="21"/>
+                <w:lang w:eastAsia="en-NZ"/>
+              </w:rPr>
+              <w:t xml:space="preserve"> </w:t>
+            </w:r>
+            <w:r>
+              <w:rPr>
+                <w:rFonts w:ascii="Consolas" w:eastAsia="Times New Roman" w:hAnsi="Consolas" w:cs="Times New Roman"/>
+                <w:color w:val="D4D4D4"/>
+                <w:sz w:val="21"/>
+                <w:szCs w:val="21"/>
+                <w:lang w:eastAsia="en-NZ"/>
+              </w:rPr>
+              <w:t>==</w:t>
+            </w:r>
+            <w:r>
+              <w:rPr>
+                <w:rFonts w:ascii="Consolas" w:eastAsia="Times New Roman" w:hAnsi="Consolas" w:cs="Times New Roman"/>
+                <w:color w:val="CCCCCC"/>
+                <w:sz w:val="21"/>
+                <w:szCs w:val="21"/>
+                <w:lang w:eastAsia="en-NZ"/>
+              </w:rPr>
+              <w:t xml:space="preserve"> </w:t>
+            </w:r>
+            <w:proofErr w:type="spellStart"/>
+            <w:proofErr w:type="gramStart"/>
+            <w:r>
+              <w:rPr>
+                <w:rFonts w:ascii="Consolas" w:eastAsia="Times New Roman" w:hAnsi="Consolas" w:cs="Times New Roman"/>
+                <w:color w:val="4EC9B0"/>
+                <w:sz w:val="21"/>
+                <w:szCs w:val="21"/>
+                <w:lang w:eastAsia="en-NZ"/>
+              </w:rPr>
+              <w:t>arcade</w:t>
+            </w:r>
+            <w:r>
+              <w:rPr>
+                <w:rFonts w:ascii="Consolas" w:eastAsia="Times New Roman" w:hAnsi="Consolas" w:cs="Times New Roman"/>
+                <w:color w:val="CCCCCC"/>
+                <w:sz w:val="21"/>
+                <w:szCs w:val="21"/>
+                <w:lang w:eastAsia="en-NZ"/>
+              </w:rPr>
+              <w:t>.</w:t>
+            </w:r>
+            <w:r>
+              <w:rPr>
+                <w:rFonts w:ascii="Consolas" w:eastAsia="Times New Roman" w:hAnsi="Consolas" w:cs="Times New Roman"/>
+                <w:color w:val="4EC9B0"/>
+                <w:sz w:val="21"/>
+                <w:szCs w:val="21"/>
+                <w:lang w:eastAsia="en-NZ"/>
+              </w:rPr>
+              <w:t>key</w:t>
+            </w:r>
+            <w:r>
+              <w:rPr>
+                <w:rFonts w:ascii="Consolas" w:eastAsia="Times New Roman" w:hAnsi="Consolas" w:cs="Times New Roman"/>
+                <w:color w:val="CCCCCC"/>
+                <w:sz w:val="21"/>
+                <w:szCs w:val="21"/>
+                <w:lang w:eastAsia="en-NZ"/>
+              </w:rPr>
+              <w:t>.</w:t>
+            </w:r>
+            <w:r>
+              <w:rPr>
+                <w:rFonts w:ascii="Consolas" w:eastAsia="Times New Roman" w:hAnsi="Consolas" w:cs="Times New Roman"/>
+                <w:color w:val="9CDCFE"/>
+                <w:sz w:val="21"/>
+                <w:szCs w:val="21"/>
+                <w:lang w:eastAsia="en-NZ"/>
+              </w:rPr>
+              <w:t>SPACE</w:t>
+            </w:r>
+            <w:proofErr w:type="spellEnd"/>
+            <w:proofErr w:type="gramEnd"/>
+            <w:r>
+              <w:rPr>
+                <w:rFonts w:ascii="Consolas" w:eastAsia="Times New Roman" w:hAnsi="Consolas" w:cs="Times New Roman"/>
+                <w:color w:val="CCCCCC"/>
+                <w:sz w:val="21"/>
+                <w:szCs w:val="21"/>
+                <w:lang w:eastAsia="en-NZ"/>
+              </w:rPr>
+              <w:t>:</w:t>
+            </w:r>
+          </w:p>
+          <w:p>
+            <w:pPr>
+              <w:shd w:val="clear" w:color="auto" w:fill="1F1F1F"/>
+              <w:spacing w:line="285" w:lineRule="atLeast"/>
+              <w:rPr>
+                <w:rFonts w:ascii="Consolas" w:eastAsia="Times New Roman" w:hAnsi="Consolas" w:cs="Times New Roman"/>
+                <w:color w:val="CCCCCC"/>
+                <w:sz w:val="21"/>
+                <w:szCs w:val="21"/>
+                <w:lang w:eastAsia="en-NZ"/>
+              </w:rPr>
+            </w:pPr>
+            <w:r>
+              <w:rPr>
+                <w:rFonts w:ascii="Consolas" w:eastAsia="Times New Roman" w:hAnsi="Consolas" w:cs="Times New Roman"/>
+                <w:color w:val="CCCCCC"/>
+                <w:sz w:val="21"/>
+                <w:szCs w:val="21"/>
+                <w:lang w:eastAsia="en-NZ"/>
+              </w:rPr>
+              <w:t>   </w:t>
+            </w:r>
+            <w:proofErr w:type="spellStart"/>
+            <w:proofErr w:type="gramStart"/>
+            <w:r>
+              <w:rPr>
+                <w:rFonts w:ascii="Consolas" w:eastAsia="Times New Roman" w:hAnsi="Consolas" w:cs="Times New Roman"/>
+                <w:color w:val="9CDCFE"/>
+                <w:sz w:val="21"/>
+                <w:szCs w:val="21"/>
+                <w:lang w:eastAsia="en-NZ"/>
+              </w:rPr>
+              <w:t>self</w:t>
+            </w:r>
+            <w:r>
+              <w:rPr>
+                <w:rFonts w:ascii="Consolas" w:eastAsia="Times New Roman" w:hAnsi="Consolas" w:cs="Times New Roman"/>
+                <w:color w:val="CCCCCC"/>
+                <w:sz w:val="21"/>
+                <w:szCs w:val="21"/>
+                <w:lang w:eastAsia="en-NZ"/>
+              </w:rPr>
+              <w:t>.</w:t>
+            </w:r>
+            <w:r>
+              <w:rPr>
+                <w:rFonts w:ascii="Consolas" w:eastAsia="Times New Roman" w:hAnsi="Consolas" w:cs="Times New Roman"/>
+                <w:color w:val="9CDCFE"/>
+                <w:sz w:val="21"/>
+                <w:szCs w:val="21"/>
+                <w:lang w:eastAsia="en-NZ"/>
+              </w:rPr>
+              <w:t>enemy</w:t>
+            </w:r>
+            <w:proofErr w:type="gramEnd"/>
+            <w:r>
+              <w:rPr>
+                <w:rFonts w:ascii="Consolas" w:eastAsia="Times New Roman" w:hAnsi="Consolas" w:cs="Times New Roman"/>
+                <w:color w:val="9CDCFE"/>
+                <w:sz w:val="21"/>
+                <w:szCs w:val="21"/>
+                <w:lang w:eastAsia="en-NZ"/>
+              </w:rPr>
+              <w:t>_sprite</w:t>
+            </w:r>
+            <w:r>
+              <w:rPr>
+                <w:rFonts w:ascii="Consolas" w:eastAsia="Times New Roman" w:hAnsi="Consolas" w:cs="Times New Roman"/>
+                <w:color w:val="CCCCCC"/>
+                <w:sz w:val="21"/>
+                <w:szCs w:val="21"/>
+                <w:lang w:eastAsia="en-NZ"/>
+              </w:rPr>
+              <w:t>.</w:t>
+            </w:r>
+            <w:r>
+              <w:rPr>
+                <w:rFonts w:ascii="Consolas" w:eastAsia="Times New Roman" w:hAnsi="Consolas" w:cs="Times New Roman"/>
+                <w:color w:val="9CDCFE"/>
+                <w:sz w:val="21"/>
+                <w:szCs w:val="21"/>
+                <w:lang w:eastAsia="en-NZ"/>
+              </w:rPr>
+              <w:t>attack</w:t>
+            </w:r>
+            <w:proofErr w:type="spellEnd"/>
+            <w:r>
+              <w:rPr>
+                <w:rFonts w:ascii="Consolas" w:eastAsia="Times New Roman" w:hAnsi="Consolas" w:cs="Times New Roman"/>
+                <w:color w:val="CCCCCC"/>
+                <w:sz w:val="21"/>
+                <w:szCs w:val="21"/>
+                <w:lang w:eastAsia="en-NZ"/>
+              </w:rPr>
+              <w:t xml:space="preserve"> </w:t>
+            </w:r>
+            <w:r>
+              <w:rPr>
+                <w:rFonts w:ascii="Consolas" w:eastAsia="Times New Roman" w:hAnsi="Consolas" w:cs="Times New Roman"/>
+                <w:color w:val="D4D4D4"/>
+                <w:sz w:val="21"/>
+                <w:szCs w:val="21"/>
+                <w:lang w:eastAsia="en-NZ"/>
+              </w:rPr>
+              <w:t>=</w:t>
+            </w:r>
+            <w:r>
+              <w:rPr>
+                <w:rFonts w:ascii="Consolas" w:eastAsia="Times New Roman" w:hAnsi="Consolas" w:cs="Times New Roman"/>
+                <w:color w:val="CCCCCC"/>
+                <w:sz w:val="21"/>
+                <w:szCs w:val="21"/>
+                <w:lang w:eastAsia="en-NZ"/>
+              </w:rPr>
+              <w:t xml:space="preserve"> </w:t>
+            </w:r>
+            <w:r>
+              <w:rPr>
+                <w:rFonts w:ascii="Consolas" w:eastAsia="Times New Roman" w:hAnsi="Consolas" w:cs="Times New Roman"/>
+                <w:color w:val="CE9178"/>
+                <w:sz w:val="21"/>
+                <w:szCs w:val="21"/>
+                <w:lang w:eastAsia="en-NZ"/>
+              </w:rPr>
+              <w:t>"attack"</w:t>
+            </w:r>
+          </w:p>
+          <w:p>
+            <w:pPr>
+              <w:shd w:val="clear" w:color="auto" w:fill="1E1E1E"/>
+              <w:spacing w:line="285" w:lineRule="atLeast"/>
+              <w:rPr>
+                <w:rFonts w:ascii="Consolas" w:eastAsia="Times New Roman" w:hAnsi="Consolas" w:cs="Times New Roman"/>
+                <w:color w:val="C586C0"/>
+                <w:sz w:val="21"/>
+                <w:szCs w:val="21"/>
+                <w:lang w:eastAsia="en-NZ"/>
+              </w:rPr>
+            </w:pPr>
+          </w:p>
+        </w:tc>
+      </w:tr>
+      <w:tr>
+        <w:trPr>
+          <w:trHeight w:val="396"/>
+        </w:trPr>
+        <w:tc>
+          <w:tcPr>
+            <w:tcW w:w="761" w:type="dxa"/>
+          </w:tcPr>
+          <w:p>
+            <w:r>
+              <w:t>22/4</w:t>
+            </w:r>
+          </w:p>
+        </w:tc>
+        <w:tc>
+          <w:tcPr>
+            <w:tcW w:w="1358" w:type="dxa"/>
+          </w:tcPr>
+          <w:p>
+            <w:r>
+              <w:t>Enemy sprite animation</w:t>
+            </w:r>
+          </w:p>
+        </w:tc>
+        <w:tc>
+          <w:tcPr>
+            <w:tcW w:w="1419" w:type="dxa"/>
+          </w:tcPr>
+          <w:p>
+            <w:r>
+              <w:t xml:space="preserve">Sprites play animation when space </w:t>
+            </w:r>
+            <w:r>
+              <w:lastRenderedPageBreak/>
+              <w:t xml:space="preserve">bar is pressed </w:t>
+            </w:r>
+          </w:p>
+        </w:tc>
+        <w:tc>
+          <w:tcPr>
+            <w:tcW w:w="1724" w:type="dxa"/>
+          </w:tcPr>
+          <w:p>
+            <w:r>
+              <w:lastRenderedPageBreak/>
+              <w:t xml:space="preserve">Animation plays too quickly and </w:t>
+            </w:r>
+            <w:r>
+              <w:lastRenderedPageBreak/>
+              <w:t>doesn’t reset to idle animation</w:t>
+            </w:r>
+          </w:p>
+        </w:tc>
+        <w:tc>
+          <w:tcPr>
+            <w:tcW w:w="9246" w:type="dxa"/>
+          </w:tcPr>
+          <w:p>
+            <w:pPr>
+              <w:shd w:val="clear" w:color="auto" w:fill="1F1F1F"/>
+              <w:spacing w:line="285" w:lineRule="atLeast"/>
+              <w:rPr>
+                <w:rFonts w:ascii="Consolas" w:eastAsia="Times New Roman" w:hAnsi="Consolas" w:cs="Times New Roman"/>
+                <w:color w:val="CCCCCC"/>
+                <w:sz w:val="21"/>
+                <w:szCs w:val="21"/>
+                <w:lang w:eastAsia="en-NZ"/>
+              </w:rPr>
+            </w:pPr>
+            <w:r>
+              <w:rPr>
+                <w:rFonts w:ascii="Consolas" w:eastAsia="Times New Roman" w:hAnsi="Consolas" w:cs="Times New Roman"/>
+                <w:color w:val="CCCCCC"/>
+                <w:sz w:val="21"/>
+                <w:szCs w:val="21"/>
+                <w:lang w:eastAsia="en-NZ"/>
+              </w:rPr>
+              <w:lastRenderedPageBreak/>
+              <w:t xml:space="preserve">Added </w:t>
+            </w:r>
+            <w:proofErr w:type="spellStart"/>
+            <w:proofErr w:type="gramStart"/>
+            <w:r>
+              <w:rPr>
+                <w:rFonts w:ascii="Consolas" w:eastAsia="Times New Roman" w:hAnsi="Consolas" w:cs="Times New Roman"/>
+                <w:color w:val="CCCCCC"/>
+                <w:sz w:val="21"/>
+                <w:szCs w:val="21"/>
+                <w:lang w:eastAsia="en-NZ"/>
+              </w:rPr>
+              <w:t>time.sleep</w:t>
+            </w:r>
+            <w:proofErr w:type="spellEnd"/>
+            <w:proofErr w:type="gramEnd"/>
+            <w:r>
+              <w:rPr>
+                <w:rFonts w:ascii="Consolas" w:eastAsia="Times New Roman" w:hAnsi="Consolas" w:cs="Times New Roman"/>
+                <w:color w:val="CCCCCC"/>
+                <w:sz w:val="21"/>
+                <w:szCs w:val="21"/>
+                <w:lang w:eastAsia="en-NZ"/>
+              </w:rPr>
+              <w:t>(1)</w:t>
+            </w:r>
+          </w:p>
+        </w:tc>
+      </w:tr>
+      <w:tr>
+        <w:trPr>
+          <w:trHeight w:val="396"/>
+        </w:trPr>
+        <w:tc>
+          <w:tcPr>
+            <w:tcW w:w="761" w:type="dxa"/>
+          </w:tcPr>
+          <w:p>
+            <w:r>
+              <w:t>22/4</w:t>
+            </w:r>
+          </w:p>
+        </w:tc>
+        <w:tc>
+          <w:tcPr>
+            <w:tcW w:w="1358" w:type="dxa"/>
+          </w:tcPr>
+          <w:p>
+            <w:r>
+              <w:t>Enemy sprite animation</w:t>
+            </w:r>
+          </w:p>
+        </w:tc>
+        <w:tc>
+          <w:tcPr>
+            <w:tcW w:w="1419" w:type="dxa"/>
+          </w:tcPr>
+          <w:p>
+            <w:r>
+              <w:t xml:space="preserve">Sprites play animation when space bar is pressed </w:t>
+            </w:r>
+          </w:p>
+        </w:tc>
+        <w:tc>
+          <w:tcPr>
+            <w:tcW w:w="1724" w:type="dxa"/>
+          </w:tcPr>
+          <w:p>
+            <w:r>
+              <w:t>Time freezes whole program</w:t>
+            </w:r>
+          </w:p>
+        </w:tc>
+        <w:tc>
+          <w:tcPr>
+            <w:tcW w:w="9246" w:type="dxa"/>
+          </w:tcPr>
+          <w:p>
+            <w:pPr>
+              <w:shd w:val="clear" w:color="auto" w:fill="1F1F1F"/>
+              <w:spacing w:line="285" w:lineRule="atLeast"/>
+              <w:rPr>
+                <w:rFonts w:ascii="Consolas" w:eastAsia="Times New Roman" w:hAnsi="Consolas" w:cs="Times New Roman"/>
+                <w:color w:val="CCCCCC"/>
+                <w:sz w:val="21"/>
+                <w:szCs w:val="21"/>
+                <w:lang w:eastAsia="en-NZ"/>
+              </w:rPr>
+            </w:pPr>
+            <w:r>
+              <w:rPr>
+                <w:rFonts w:ascii="Consolas" w:eastAsia="Times New Roman" w:hAnsi="Consolas" w:cs="Times New Roman"/>
+                <w:color w:val="CCCCCC"/>
+                <w:sz w:val="21"/>
+                <w:szCs w:val="21"/>
+                <w:lang w:eastAsia="en-NZ"/>
+              </w:rPr>
+              <w:drawing>
+                <wp:inline distT="0" distB="0" distL="0" distR="0" wp14:anchorId="431E6AD5" wp14:editId="7879E9C1">
+                  <wp:extent cx="3245485" cy="1388365"/>
+                  <wp:effectExtent l="0" t="0" r="0" b="2540"/>
+                  <wp:docPr id="1048499113" name="Picture 1"/>
+                  <wp:cNvGraphicFramePr>
+                    <a:graphicFrameLocks xmlns:a="http://schemas.openxmlformats.org/drawingml/2006/main" noChangeAspect="1"/>
+                  </wp:cNvGraphicFramePr>
+                  <a:graphic xmlns:a="http://schemas.openxmlformats.org/drawingml/2006/main">
+                    <a:graphicData uri="http://schemas.openxmlformats.org/drawingml/2006/picture">
+                      <pic:pic xmlns:pic="http://schemas.openxmlformats.org/drawingml/2006/picture">
+                        <pic:nvPicPr>
+                          <pic:cNvPr id="1048499113" name=""/>
+                          <pic:cNvPicPr/>
+                        </pic:nvPicPr>
+                        <pic:blipFill rotWithShape="1">
+                          <a:blip r:embed="rId5"/>
+                          <a:srcRect l="13627" t="24462"/>
+                          <a:stretch/>
+                        </pic:blipFill>
+                        <pic:spPr bwMode="auto">
+                          <a:xfrm>
+                            <a:off x="0" y="0"/>
+                            <a:ext cx="3271243" cy="1399384"/>
+                          </a:xfrm>
+                          <a:prstGeom prst="rect">
+                            <a:avLst/>
+                          </a:prstGeom>
+                          <a:ln>
+                            <a:noFill/>
+                          </a:ln>
+                          <a:extLst>
+                            <a:ext uri="{53640926-AAD7-44D8-BBD7-CCE9431645EC}">
+                              <a14:shadowObscured xmlns:a14="http://schemas.microsoft.com/office/drawing/2010/main"/>
+                            </a:ext>
+                          </a:extLst>
+                        </pic:spPr>
+                      </pic:pic>
+                    </a:graphicData>
+                  </a:graphic>
+                </wp:inline>
+              </w:drawing>
+            </w:r>
+          </w:p>
+        </w:tc>
+      </w:tr>
+      <w:tr>
+        <w:trPr>
+          <w:trHeight w:val="396"/>
+        </w:trPr>
+        <w:tc>
+          <w:tcPr>
+            <w:tcW w:w="761" w:type="dxa"/>
+          </w:tcPr>
+          <w:p>
+            <w:r>
+              <w:t>22/4</w:t>
+            </w:r>
+          </w:p>
+        </w:tc>
+        <w:tc>
+          <w:tcPr>
+            <w:tcW w:w="1358" w:type="dxa"/>
+          </w:tcPr>
+          <w:p>
+            <w:r>
+              <w:t>Enemy sprite animation</w:t>
+            </w:r>
+          </w:p>
+        </w:tc>
+        <w:tc>
+          <w:tcPr>
+            <w:tcW w:w="1419" w:type="dxa"/>
+          </w:tcPr>
+          <w:p>
+            <w:r>
+              <w:t xml:space="preserve">Sprites play animation when space bar is pressed </w:t>
+            </w:r>
+          </w:p>
+        </w:tc>
+        <w:tc>
+          <w:tcPr>
+            <w:tcW w:w="1724" w:type="dxa"/>
+          </w:tcPr>
+          <w:p>
+            <w:r>
+              <w:t>List index out of range</w:t>
+            </w:r>
+          </w:p>
+        </w:tc>
+        <w:tc>
+          <w:tcPr>
+            <w:tcW w:w="9246" w:type="dxa"/>
+          </w:tcPr>
+          <w:p>
+            <w:pPr>
+              <w:shd w:val="clear" w:color="auto" w:fill="1F1F1F"/>
+              <w:spacing w:line="285" w:lineRule="atLeast"/>
+              <w:rPr>
+                <w:rFonts w:ascii="Consolas" w:eastAsia="Times New Roman" w:hAnsi="Consolas" w:cs="Times New Roman"/>
+                <w:color w:val="CCCCCC"/>
+                <w:sz w:val="21"/>
+                <w:szCs w:val="21"/>
+                <w:lang w:eastAsia="en-NZ"/>
+              </w:rPr>
+            </w:pPr>
+            <w:r>
+              <w:rPr>
+                <w:rFonts w:ascii="Consolas" w:eastAsia="Times New Roman" w:hAnsi="Consolas" w:cs="Times New Roman"/>
+                <w:color w:val="CCCCCC"/>
+                <w:sz w:val="21"/>
+                <w:szCs w:val="21"/>
+                <w:lang w:eastAsia="en-NZ"/>
+              </w:rPr>
+              <w:t xml:space="preserve">Reset </w:t>
+            </w:r>
+            <w:proofErr w:type="spellStart"/>
+            <w:r>
+              <w:rPr>
+                <w:rFonts w:ascii="Consolas" w:eastAsia="Times New Roman" w:hAnsi="Consolas" w:cs="Times New Roman"/>
+                <w:color w:val="CCCCCC"/>
+                <w:sz w:val="21"/>
+                <w:szCs w:val="21"/>
+                <w:lang w:eastAsia="en-NZ"/>
+              </w:rPr>
+              <w:t>self.cur_texture</w:t>
+            </w:r>
+            <w:proofErr w:type="spellEnd"/>
+            <w:r>
+              <w:rPr>
+                <w:rFonts w:ascii="Consolas" w:eastAsia="Times New Roman" w:hAnsi="Consolas" w:cs="Times New Roman"/>
+                <w:color w:val="CCCCCC"/>
+                <w:sz w:val="21"/>
+                <w:szCs w:val="21"/>
+                <w:lang w:eastAsia="en-NZ"/>
+              </w:rPr>
+              <w:t xml:space="preserve"> when </w:t>
+            </w:r>
+            <w:proofErr w:type="spellStart"/>
+            <w:r>
+              <w:rPr>
+                <w:rFonts w:ascii="Consolas" w:eastAsia="Times New Roman" w:hAnsi="Consolas" w:cs="Times New Roman"/>
+                <w:color w:val="CCCCCC"/>
+                <w:sz w:val="21"/>
+                <w:szCs w:val="21"/>
+                <w:lang w:eastAsia="en-NZ"/>
+              </w:rPr>
+              <w:t>self attack</w:t>
+            </w:r>
+            <w:proofErr w:type="spellEnd"/>
+            <w:r>
+              <w:rPr>
+                <w:rFonts w:ascii="Consolas" w:eastAsia="Times New Roman" w:hAnsi="Consolas" w:cs="Times New Roman"/>
+                <w:color w:val="CCCCCC"/>
+                <w:sz w:val="21"/>
+                <w:szCs w:val="21"/>
+                <w:lang w:eastAsia="en-NZ"/>
+              </w:rPr>
+              <w:t xml:space="preserve"> == “attack</w:t>
+            </w:r>
+          </w:p>
+        </w:tc>
+      </w:tr>
+      <w:tr>
+        <w:trPr>
+          <w:trHeight w:val="396"/>
+        </w:trPr>
+        <w:tc>
+          <w:tcPr>
+            <w:tcW w:w="761" w:type="dxa"/>
+          </w:tcPr>
+          <w:p>
+            <w:r>
+              <w:t>22/4</w:t>
+            </w:r>
+          </w:p>
+        </w:tc>
+        <w:tc>
+          <w:tcPr>
+            <w:tcW w:w="1358" w:type="dxa"/>
+          </w:tcPr>
+          <w:p>
+            <w:r>
+              <w:t>Enemy sprite animation</w:t>
+            </w:r>
+          </w:p>
+        </w:tc>
+        <w:tc>
+          <w:tcPr>
+            <w:tcW w:w="1419" w:type="dxa"/>
+          </w:tcPr>
+          <w:p>
+            <w:r>
+              <w:t xml:space="preserve">Sprites play animation when space bar is pressed </w:t>
+            </w:r>
+          </w:p>
+        </w:tc>
+        <w:tc>
+          <w:tcPr>
+            <w:tcW w:w="1724" w:type="dxa"/>
+          </w:tcPr>
+          <w:p>
+            <w:proofErr w:type="spellStart"/>
+            <w:r>
+              <w:t>Self.cur_texture</w:t>
+            </w:r>
+            <w:proofErr w:type="spellEnd"/>
+            <w:r>
+              <w:t xml:space="preserve"> is not being updated</w:t>
+            </w:r>
+          </w:p>
+        </w:tc>
+        <w:tc>
+          <w:tcPr>
+            <w:tcW w:w="9246" w:type="dxa"/>
+          </w:tcPr>
+          <w:p>
+            <w:pPr>
+              <w:shd w:val="clear" w:color="auto" w:fill="1F1F1F"/>
+              <w:spacing w:line="285" w:lineRule="atLeast"/>
+              <w:rPr>
+                <w:rFonts w:ascii="Consolas" w:eastAsia="Times New Roman" w:hAnsi="Consolas" w:cs="Times New Roman"/>
+                <w:color w:val="CCCCCC"/>
+                <w:sz w:val="21"/>
+                <w:szCs w:val="21"/>
+                <w:lang w:eastAsia="en-NZ"/>
+              </w:rPr>
+            </w:pPr>
+            <w:r>
+              <w:rPr>
+                <w:rFonts w:ascii="Consolas" w:eastAsia="Times New Roman" w:hAnsi="Consolas" w:cs="Times New Roman"/>
+                <w:color w:val="CCCCCC"/>
+                <w:sz w:val="21"/>
+                <w:szCs w:val="21"/>
+                <w:lang w:eastAsia="en-NZ"/>
+              </w:rPr>
+              <w:drawing>
+                <wp:inline distT="0" distB="0" distL="0" distR="0" wp14:anchorId="45480C1D" wp14:editId="78058036">
+                  <wp:extent cx="5725324" cy="1790950"/>
+                  <wp:effectExtent l="0" t="0" r="8890" b="0"/>
+                  <wp:docPr id="441823052" name="Picture 1"/>
+                  <wp:cNvGraphicFramePr>
+                    <a:graphicFrameLocks xmlns:a="http://schemas.openxmlformats.org/drawingml/2006/main" noChangeAspect="1"/>
+                  </wp:cNvGraphicFramePr>
+                  <a:graphic xmlns:a="http://schemas.openxmlformats.org/drawingml/2006/main">
+                    <a:graphicData uri="http://schemas.openxmlformats.org/drawingml/2006/picture">
+                      <pic:pic xmlns:pic="http://schemas.openxmlformats.org/drawingml/2006/picture">
+                        <pic:nvPicPr>
+                          <pic:cNvPr id="441823052" name=""/>
+                          <pic:cNvPicPr/>
+                        </pic:nvPicPr>
+                        <pic:blipFill>
+                          <a:blip r:embed="rId6"/>
+                          <a:stretch>
+                            <a:fillRect/>
+                          </a:stretch>
+                        </pic:blipFill>
+                        <pic:spPr>
+                          <a:xfrm>
+                            <a:off x="0" y="0"/>
+                            <a:ext cx="5725324" cy="1790950"/>
+                          </a:xfrm>
+                          <a:prstGeom prst="rect">
+                            <a:avLst/>
+                          </a:prstGeom>
+                        </pic:spPr>
+                      </pic:pic>
+                    </a:graphicData>
+                  </a:graphic>
+                </wp:inline>
+              </w:drawing>
+            </w:r>
+          </w:p>
+        </w:tc>
+      </w:tr>
+      <w:tr>
+        <w:trPr>
+          <w:trHeight w:val="396"/>
+        </w:trPr>
+        <w:tc>
+          <w:tcPr>
+            <w:tcW w:w="761" w:type="dxa"/>
+          </w:tcPr>
+          <w:p>
+            <w:r>
+              <w:t>22/4</w:t>
+            </w:r>
+          </w:p>
+        </w:tc>
+        <w:tc>
+          <w:tcPr>
+            <w:tcW w:w="1358" w:type="dxa"/>
+          </w:tcPr>
+          <w:p>
+            <w:r>
+              <w:t>Enemy sprite animation</w:t>
+            </w:r>
+          </w:p>
+        </w:tc>
+        <w:tc>
+          <w:tcPr>
+            <w:tcW w:w="1419" w:type="dxa"/>
+          </w:tcPr>
+          <w:p>
+            <w:r>
+              <w:t xml:space="preserve">Sprites play animation when space bar is pressed </w:t>
+            </w:r>
+          </w:p>
+        </w:tc>
+        <w:tc>
+          <w:tcPr>
+            <w:tcW w:w="1724" w:type="dxa"/>
+          </w:tcPr>
+          <w:p>
+            <w:r>
+              <w:t>Animation plays too quickly</w:t>
+            </w:r>
+          </w:p>
+        </w:tc>
+        <w:tc>
+          <w:tcPr>
+            <w:tcW w:w="9246" w:type="dxa"/>
+          </w:tcPr>
+          <w:p>
+            <w:pPr>
+              <w:shd w:val="clear" w:color="auto" w:fill="1F1F1F"/>
+              <w:spacing w:line="285" w:lineRule="atLeast"/>
+              <w:rPr>
+                <w:rFonts w:ascii="Consolas" w:eastAsia="Times New Roman" w:hAnsi="Consolas" w:cs="Times New Roman"/>
+                <w:color w:val="CCCCCC"/>
+                <w:sz w:val="21"/>
+                <w:szCs w:val="21"/>
+                <w:lang w:eastAsia="en-NZ"/>
+              </w:rPr>
+            </w:pPr>
+            <w:r>
+              <w:rPr>
+                <w:rFonts w:ascii="Consolas" w:eastAsia="Times New Roman" w:hAnsi="Consolas" w:cs="Times New Roman"/>
+                <w:color w:val="CCCCCC"/>
+                <w:sz w:val="21"/>
+                <w:szCs w:val="21"/>
+                <w:lang w:eastAsia="en-NZ"/>
+              </w:rPr>
+              <w:t>Changed the delay &gt; 1 to delay &gt; 5</w:t>
+            </w:r>
+          </w:p>
+        </w:tc>
+      </w:tr>
+      <w:tr>
+        <w:trPr>
+          <w:trHeight w:val="396"/>
+        </w:trPr>
+        <w:tc>
+          <w:tcPr>
+            <w:tcW w:w="761" w:type="dxa"/>
+          </w:tcPr>
+          <w:p>
+            <w:r>
+              <w:t>22/4</w:t>
+            </w:r>
+          </w:p>
+        </w:tc>
+        <w:tc>
+          <w:tcPr>
+            <w:tcW w:w="1358" w:type="dxa"/>
+          </w:tcPr>
+          <w:p>
+            <w:r>
+              <w:t>Enemy sprite animation</w:t>
+            </w:r>
+          </w:p>
+        </w:tc>
+        <w:tc>
+          <w:tcPr>
+            <w:tcW w:w="1419" w:type="dxa"/>
+          </w:tcPr>
+          <w:p>
+            <w:r>
+              <w:t xml:space="preserve">Sprites play animation when space bar is pressed </w:t>
+            </w:r>
+          </w:p>
+        </w:tc>
+        <w:tc>
+          <w:tcPr>
+            <w:tcW w:w="1724" w:type="dxa"/>
+          </w:tcPr>
+          <w:p>
+            <w:r>
+              <w:t>Animation only slows down if the delay is printed and the whole program slows down</w:t>
+            </w:r>
+          </w:p>
+        </w:tc>
+        <w:tc>
+          <w:tcPr>
+            <w:tcW w:w="9246" w:type="dxa"/>
+          </w:tcPr>
+          <w:p>
+            <w:pPr>
+              <w:shd w:val="clear" w:color="auto" w:fill="1F1F1F"/>
+              <w:spacing w:line="285" w:lineRule="atLeast"/>
+              <w:rPr>
+                <w:rFonts w:ascii="Consolas" w:eastAsia="Times New Roman" w:hAnsi="Consolas" w:cs="Times New Roman"/>
+                <w:color w:val="CCCCCC"/>
+                <w:sz w:val="21"/>
+                <w:szCs w:val="21"/>
+                <w:lang w:eastAsia="en-NZ"/>
+              </w:rPr>
+            </w:pPr>
+            <w:r>
+              <w:rPr>
+                <w:rFonts w:ascii="Consolas" w:eastAsia="Times New Roman" w:hAnsi="Consolas" w:cs="Times New Roman"/>
+                <w:color w:val="CCCCCC"/>
+                <w:sz w:val="21"/>
+                <w:szCs w:val="21"/>
+                <w:lang w:eastAsia="en-NZ"/>
+              </w:rPr>
+              <w:t xml:space="preserve">Duplicated each frame by so the entire animation takes fives time </w:t>
+            </w:r>
+            <w:proofErr w:type="gramStart"/>
+            <w:r>
+              <w:rPr>
+                <w:rFonts w:ascii="Consolas" w:eastAsia="Times New Roman" w:hAnsi="Consolas" w:cs="Times New Roman"/>
+                <w:color w:val="CCCCCC"/>
+                <w:sz w:val="21"/>
+                <w:szCs w:val="21"/>
+                <w:lang w:eastAsia="en-NZ"/>
+              </w:rPr>
+              <w:t>as  long</w:t>
+            </w:r>
+            <w:proofErr w:type="gramEnd"/>
+            <w:r>
+              <w:rPr>
+                <w:rFonts w:ascii="Consolas" w:eastAsia="Times New Roman" w:hAnsi="Consolas" w:cs="Times New Roman"/>
+                <w:color w:val="CCCCCC"/>
+                <w:sz w:val="21"/>
+                <w:szCs w:val="21"/>
+                <w:lang w:eastAsia="en-NZ"/>
+              </w:rPr>
+              <w:t xml:space="preserve"> to run</w:t>
+            </w:r>
+          </w:p>
+        </w:tc>
+      </w:tr>
+      <w:tr>
+        <w:trPr>
+          <w:trHeight w:val="396"/>
+        </w:trPr>
+        <w:tc>
+          <w:tcPr>
+            <w:tcW w:w="761" w:type="dxa"/>
+          </w:tcPr>
+          <w:p>
+            <w:r>
+              <w:t>22/4</w:t>
+            </w:r>
+          </w:p>
+        </w:tc>
+        <w:tc>
+          <w:tcPr>
+            <w:tcW w:w="1358" w:type="dxa"/>
+          </w:tcPr>
+          <w:p>
+            <w:r>
+              <w:t>Enemy sprite animation</w:t>
+            </w:r>
+          </w:p>
+        </w:tc>
+        <w:tc>
+          <w:tcPr>
+            <w:tcW w:w="1419" w:type="dxa"/>
+          </w:tcPr>
+          <w:p>
+            <w:r>
+              <w:t>Sprites play animation when space bar is pressed</w:t>
+            </w:r>
+          </w:p>
+        </w:tc>
+        <w:tc>
+          <w:tcPr>
+            <w:tcW w:w="1724" w:type="dxa"/>
+          </w:tcPr>
+          <w:p>
+            <w:r>
+              <w:t>Animation only plays when space bar is held.</w:t>
+            </w:r>
+          </w:p>
+        </w:tc>
+        <w:tc>
+          <w:tcPr>
+            <w:tcW w:w="9246" w:type="dxa"/>
+          </w:tcPr>
+          <w:p>
+            <w:pPr>
+              <w:shd w:val="clear" w:color="auto" w:fill="1F1F1F"/>
+              <w:spacing w:line="285" w:lineRule="atLeast"/>
+              <w:rPr>
+                <w:rFonts w:ascii="Consolas" w:eastAsia="Times New Roman" w:hAnsi="Consolas" w:cs="Times New Roman"/>
+                <w:color w:val="CCCCCC"/>
+                <w:sz w:val="21"/>
+                <w:szCs w:val="21"/>
+                <w:lang w:eastAsia="en-NZ"/>
+              </w:rPr>
+            </w:pPr>
+            <w:r>
+              <w:rPr>
+                <w:rFonts w:ascii="Consolas" w:eastAsia="Times New Roman" w:hAnsi="Consolas" w:cs="Times New Roman"/>
+                <w:color w:val="CCCCCC"/>
+                <w:sz w:val="21"/>
+                <w:szCs w:val="21"/>
+                <w:lang w:eastAsia="en-NZ"/>
+              </w:rPr>
+              <w:t xml:space="preserve">Removed the code from on </w:t>
+            </w:r>
+            <w:proofErr w:type="spellStart"/>
+            <w:r>
+              <w:rPr>
+                <w:rFonts w:ascii="Consolas" w:eastAsia="Times New Roman" w:hAnsi="Consolas" w:cs="Times New Roman"/>
+                <w:color w:val="CCCCCC"/>
+                <w:sz w:val="21"/>
+                <w:szCs w:val="21"/>
+                <w:lang w:eastAsia="en-NZ"/>
+              </w:rPr>
+              <w:t>key_release</w:t>
+            </w:r>
+            <w:proofErr w:type="spellEnd"/>
+            <w:r>
+              <w:rPr>
+                <w:rFonts w:ascii="Consolas" w:eastAsia="Times New Roman" w:hAnsi="Consolas" w:cs="Times New Roman"/>
+                <w:color w:val="CCCCCC"/>
+                <w:sz w:val="21"/>
+                <w:szCs w:val="21"/>
+                <w:lang w:eastAsia="en-NZ"/>
+              </w:rPr>
+              <w:t xml:space="preserve"> that stops the animation code from running and made </w:t>
+            </w:r>
+            <w:proofErr w:type="spellStart"/>
+            <w:proofErr w:type="gramStart"/>
+            <w:r>
+              <w:rPr>
+                <w:rFonts w:ascii="Consolas" w:eastAsia="Times New Roman" w:hAnsi="Consolas" w:cs="Times New Roman"/>
+                <w:color w:val="CCCCCC"/>
+                <w:sz w:val="21"/>
+                <w:szCs w:val="21"/>
+                <w:lang w:eastAsia="en-NZ"/>
+              </w:rPr>
+              <w:t>self.attack</w:t>
+            </w:r>
+            <w:proofErr w:type="spellEnd"/>
+            <w:proofErr w:type="gramEnd"/>
+            <w:r>
+              <w:rPr>
+                <w:rFonts w:ascii="Consolas" w:eastAsia="Times New Roman" w:hAnsi="Consolas" w:cs="Times New Roman"/>
+                <w:color w:val="CCCCCC"/>
+                <w:sz w:val="21"/>
+                <w:szCs w:val="21"/>
+                <w:lang w:eastAsia="en-NZ"/>
+              </w:rPr>
+              <w:t xml:space="preserve"> = “” when the animation </w:t>
+            </w:r>
+            <w:proofErr w:type="spellStart"/>
+            <w:r>
+              <w:rPr>
+                <w:rFonts w:ascii="Consolas" w:eastAsia="Times New Roman" w:hAnsi="Consolas" w:cs="Times New Roman"/>
+                <w:color w:val="CCCCCC"/>
+                <w:sz w:val="21"/>
+                <w:szCs w:val="21"/>
+                <w:lang w:eastAsia="en-NZ"/>
+              </w:rPr>
+              <w:t>hd</w:t>
+            </w:r>
+            <w:proofErr w:type="spellEnd"/>
+            <w:r>
+              <w:rPr>
+                <w:rFonts w:ascii="Consolas" w:eastAsia="Times New Roman" w:hAnsi="Consolas" w:cs="Times New Roman"/>
+                <w:color w:val="CCCCCC"/>
+                <w:sz w:val="21"/>
+                <w:szCs w:val="21"/>
+                <w:lang w:eastAsia="en-NZ"/>
+              </w:rPr>
+              <w:t xml:space="preserve"> played.</w:t>
+            </w:r>
+          </w:p>
+        </w:tc>
+      </w:tr>
+      <w:tr>
+        <w:trPr>
+          <w:trHeight w:val="396"/>
+        </w:trPr>
+        <w:tc>
+          <w:tcPr>
+            <w:tcW w:w="761" w:type="dxa"/>
+          </w:tcPr>
+          <w:p>
+            <w:r>
+              <w:t>22/4</w:t>
+            </w:r>
+          </w:p>
+        </w:tc>
+        <w:tc>
+          <w:tcPr>
+            <w:tcW w:w="1358" w:type="dxa"/>
+          </w:tcPr>
+          <w:p>
+            <w:r>
+              <w:t>Enemy sprite animation</w:t>
+            </w:r>
+          </w:p>
+        </w:tc>
+        <w:tc>
+          <w:tcPr>
+            <w:tcW w:w="1419" w:type="dxa"/>
+          </w:tcPr>
+          <w:p>
+            <w:r>
+              <w:t>Sprites play animation when space bar is pressed</w:t>
+            </w:r>
+          </w:p>
+        </w:tc>
+        <w:tc>
+          <w:tcPr>
+            <w:tcW w:w="1724" w:type="dxa"/>
+          </w:tcPr>
+          <w:p>
+            <w:r>
+              <w:t>Animation plays correctly</w:t>
+            </w:r>
+          </w:p>
+        </w:tc>
+        <w:tc>
+          <w:tcPr>
+            <w:tcW w:w="9246" w:type="dxa"/>
+          </w:tcPr>
+          <w:p>
+            <w:pPr>
+              <w:shd w:val="clear" w:color="auto" w:fill="1F1F1F"/>
+              <w:spacing w:line="285" w:lineRule="atLeast"/>
+              <w:rPr>
+                <w:rFonts w:ascii="Consolas" w:eastAsia="Times New Roman" w:hAnsi="Consolas" w:cs="Times New Roman"/>
+                <w:color w:val="CCCCCC"/>
+                <w:sz w:val="21"/>
+                <w:szCs w:val="21"/>
+                <w:lang w:eastAsia="en-NZ"/>
+              </w:rPr>
+            </w:pPr>
           </w:p>
         </w:tc>
       </w:tr>

</xml_diff>

<commit_message>
added other animations to enemy sprites
</commit_message>
<xml_diff>
--- a/documentation/ongoing_testing.docx
+++ b/documentation/ongoing_testing.docx
@@ -3314,7 +3314,7 @@
           <w:p>
             <w:pPr>
               <w:shd w:val="clear" w:color="auto" w:fill="1F1F1F"/>
-              <w:spacing w:after="0" w:line="285" w:lineRule="atLeast"/>
+              <w:spacing w:line="285" w:lineRule="atLeast"/>
               <w:rPr>
                 <w:rFonts w:ascii="Consolas" w:eastAsia="Times New Roman" w:hAnsi="Consolas" w:cs="Times New Roman"/>
                 <w:color w:val="CCCCCC"/>
@@ -3772,6 +3772,7 @@
             <w:r>
               <w:rPr>
                 <w:rFonts w:ascii="Consolas" w:eastAsia="Times New Roman" w:hAnsi="Consolas" w:cs="Times New Roman"/>
+                <w:noProof/>
                 <w:color w:val="CCCCCC"/>
                 <w:sz w:val="21"/>
                 <w:szCs w:val="21"/>
@@ -4008,6 +4009,7 @@
             <w:r>
               <w:rPr>
                 <w:rFonts w:ascii="Consolas" w:eastAsia="Times New Roman" w:hAnsi="Consolas" w:cs="Times New Roman"/>
+                <w:noProof/>
                 <w:color w:val="CCCCCC"/>
                 <w:sz w:val="21"/>
                 <w:szCs w:val="21"/>
@@ -4193,29 +4195,7 @@
                 <w:szCs w:val="21"/>
                 <w:lang w:eastAsia="en-NZ"/>
               </w:rPr>
-              <w:t xml:space="preserve">Duplicated each frame by so the entire animation takes fives time </w:t>
-            </w:r>
-            <w:proofErr w:type="gramStart"/>
-            <w:r>
-              <w:rPr>
-                <w:rFonts w:ascii="Consolas" w:eastAsia="Times New Roman" w:hAnsi="Consolas" w:cs="Times New Roman"/>
-                <w:color w:val="CCCCCC"/>
-                <w:sz w:val="21"/>
-                <w:szCs w:val="21"/>
-                <w:lang w:eastAsia="en-NZ"/>
-              </w:rPr>
-              <w:t>as  long</w:t>
-            </w:r>
-            <w:proofErr w:type="gramEnd"/>
-            <w:r>
-              <w:rPr>
-                <w:rFonts w:ascii="Consolas" w:eastAsia="Times New Roman" w:hAnsi="Consolas" w:cs="Times New Roman"/>
-                <w:color w:val="CCCCCC"/>
-                <w:sz w:val="21"/>
-                <w:szCs w:val="21"/>
-                <w:lang w:eastAsia="en-NZ"/>
-              </w:rPr>
-              <w:t xml:space="preserve"> to run</w:t>
+              <w:t>Added a random integer timer</w:t>
             </w:r>
           </w:p>
         </w:tc>
@@ -4401,7 +4381,115 @@
           </w:tcPr>
           <w:p>
             <w:r>
-              <w:t>Animation plays correctly</w:t>
+              <w:t>Animation plays more than one time</w:t>
+            </w:r>
+          </w:p>
+        </w:tc>
+        <w:tc>
+          <w:tcPr>
+            <w:tcW w:w="9246" w:type="dxa"/>
+          </w:tcPr>
+          <w:p>
+            <w:pPr>
+              <w:shd w:val="clear" w:color="auto" w:fill="1F1F1F"/>
+              <w:spacing w:line="285" w:lineRule="atLeast"/>
+              <w:rPr>
+                <w:rFonts w:ascii="Consolas" w:eastAsia="Times New Roman" w:hAnsi="Consolas" w:cs="Times New Roman"/>
+                <w:color w:val="CCCCCC"/>
+                <w:sz w:val="21"/>
+                <w:szCs w:val="21"/>
+                <w:lang w:eastAsia="en-NZ"/>
+              </w:rPr>
+            </w:pPr>
+            <w:r>
+              <w:rPr>
+                <w:rFonts w:ascii="Consolas" w:eastAsia="Times New Roman" w:hAnsi="Consolas" w:cs="Times New Roman"/>
+                <w:color w:val="CCCCCC"/>
+                <w:sz w:val="21"/>
+                <w:szCs w:val="21"/>
+                <w:lang w:eastAsia="en-NZ"/>
+              </w:rPr>
+              <w:drawing>
+                <wp:inline distT="0" distB="0" distL="0" distR="0" wp14:anchorId="146302C7" wp14:editId="356E508E">
+                  <wp:extent cx="5630061" cy="1514686"/>
+                  <wp:effectExtent l="0" t="0" r="8890" b="9525"/>
+                  <wp:docPr id="616047744" name="Picture 1"/>
+                  <wp:cNvGraphicFramePr>
+                    <a:graphicFrameLocks xmlns:a="http://schemas.openxmlformats.org/drawingml/2006/main" noChangeAspect="1"/>
+                  </wp:cNvGraphicFramePr>
+                  <a:graphic xmlns:a="http://schemas.openxmlformats.org/drawingml/2006/main">
+                    <a:graphicData uri="http://schemas.openxmlformats.org/drawingml/2006/picture">
+                      <pic:pic xmlns:pic="http://schemas.openxmlformats.org/drawingml/2006/picture">
+                        <pic:nvPicPr>
+                          <pic:cNvPr id="616047744" name=""/>
+                          <pic:cNvPicPr/>
+                        </pic:nvPicPr>
+                        <pic:blipFill>
+                          <a:blip r:embed="rId7"/>
+                          <a:stretch>
+                            <a:fillRect/>
+                          </a:stretch>
+                        </pic:blipFill>
+                        <pic:spPr>
+                          <a:xfrm>
+                            <a:off x="0" y="0"/>
+                            <a:ext cx="5630061" cy="1514686"/>
+                          </a:xfrm>
+                          <a:prstGeom prst="rect">
+                            <a:avLst/>
+                          </a:prstGeom>
+                        </pic:spPr>
+                      </pic:pic>
+                    </a:graphicData>
+                  </a:graphic>
+                </wp:inline>
+              </w:drawing>
+            </w:r>
+          </w:p>
+        </w:tc>
+      </w:tr>
+      <w:tr>
+        <w:trPr>
+          <w:trHeight w:val="396"/>
+        </w:trPr>
+        <w:tc>
+          <w:tcPr>
+            <w:tcW w:w="761" w:type="dxa"/>
+          </w:tcPr>
+          <w:p>
+            <w:r>
+              <w:lastRenderedPageBreak/>
+              <w:t>22/4</w:t>
+            </w:r>
+          </w:p>
+        </w:tc>
+        <w:tc>
+          <w:tcPr>
+            <w:tcW w:w="1358" w:type="dxa"/>
+          </w:tcPr>
+          <w:p>
+            <w:r>
+              <w:t>Enemy sprite animation</w:t>
+            </w:r>
+          </w:p>
+        </w:tc>
+        <w:tc>
+          <w:tcPr>
+            <w:tcW w:w="1419" w:type="dxa"/>
+          </w:tcPr>
+          <w:p>
+            <w:r>
+              <w:t>Sprites play animation when space bar is pressed</w:t>
+            </w:r>
+          </w:p>
+        </w:tc>
+        <w:tc>
+          <w:tcPr>
+            <w:tcW w:w="1724" w:type="dxa"/>
+          </w:tcPr>
+          <w:p>
+            <w:r>
+              <w:t>Animation plays more than one time</w:t>
             </w:r>
           </w:p>
         </w:tc>

</xml_diff>

<commit_message>
can't get player attack animation to work
</commit_message>
<xml_diff>
--- a/documentation/ongoing_testing.docx
+++ b/documentation/ongoing_testing.docx
@@ -105,15 +105,7 @@
           </w:tcPr>
           <w:p>
             <w:r>
-              <w:t xml:space="preserve">Vs code complains about </w:t>
-            </w:r>
-            <w:proofErr w:type="spellStart"/>
-            <w:r>
-              <w:t>vstd</w:t>
-            </w:r>
-            <w:proofErr w:type="spellEnd"/>
-            <w:r>
-              <w:t xml:space="preserve"> compression</w:t>
+              <w:t>Vs code complains about vstd compression</w:t>
             </w:r>
           </w:p>
         </w:tc>
@@ -123,13 +115,8 @@
           </w:tcPr>
           <w:p>
             <w:r>
-              <w:t xml:space="preserve">Changed compression type to </w:t>
-            </w:r>
-            <w:proofErr w:type="spellStart"/>
-            <w:r>
-              <w:t>zlib</w:t>
-            </w:r>
-            <w:proofErr w:type="spellEnd"/>
+              <w:t>Changed compression type to zlib</w:t>
+            </w:r>
           </w:p>
         </w:tc>
       </w:tr>
@@ -354,7 +341,6 @@
                 <w:lang w:eastAsia="en-NZ"/>
               </w:rPr>
             </w:pPr>
-            <w:proofErr w:type="spellStart"/>
             <w:r>
               <w:rPr>
                 <w:rFonts w:ascii="Consolas" w:eastAsia="Times New Roman" w:hAnsi="Consolas" w:cs="Times New Roman"/>
@@ -385,7 +371,6 @@
               </w:rPr>
               <w:t>hit_box</w:t>
             </w:r>
-            <w:proofErr w:type="spellEnd"/>
             <w:r>
               <w:rPr>
                 <w:rFonts w:ascii="Consolas" w:eastAsia="Times New Roman" w:hAnsi="Consolas" w:cs="Times New Roman"/>
@@ -396,7 +381,6 @@
               </w:rPr>
               <w:t xml:space="preserve"> = </w:t>
             </w:r>
-            <w:proofErr w:type="spellStart"/>
             <w:r>
               <w:rPr>
                 <w:rFonts w:ascii="Consolas" w:eastAsia="Times New Roman" w:hAnsi="Consolas" w:cs="Times New Roman"/>
@@ -437,7 +421,6 @@
               </w:rPr>
               <w:t>.hit_box_points</w:t>
             </w:r>
-            <w:proofErr w:type="spellEnd"/>
           </w:p>
           <w:p/>
         </w:tc>
@@ -527,8 +510,6 @@
               </w:rPr>
               <w:t xml:space="preserve">        </w:t>
             </w:r>
-            <w:proofErr w:type="spellStart"/>
-            <w:proofErr w:type="gramStart"/>
             <w:r>
               <w:rPr>
                 <w:rFonts w:ascii="Consolas" w:eastAsia="Times New Roman" w:hAnsi="Consolas" w:cs="Times New Roman"/>
@@ -557,9 +538,18 @@
                 <w:szCs w:val="21"/>
                 <w:lang w:eastAsia="en-NZ"/>
               </w:rPr>
-              <w:t>hitbox</w:t>
-            </w:r>
-            <w:proofErr w:type="gramEnd"/>
+              <w:t>hitbox_texture</w:t>
+            </w:r>
+            <w:r>
+              <w:rPr>
+                <w:rFonts w:ascii="Consolas" w:eastAsia="Times New Roman" w:hAnsi="Consolas" w:cs="Times New Roman"/>
+                <w:color w:val="D4D4D4"/>
+                <w:sz w:val="21"/>
+                <w:szCs w:val="21"/>
+                <w:lang w:eastAsia="en-NZ"/>
+              </w:rPr>
+              <w:t xml:space="preserve"> = </w:t>
+            </w:r>
             <w:r>
               <w:rPr>
                 <w:rFonts w:ascii="Consolas" w:eastAsia="Times New Roman" w:hAnsi="Consolas" w:cs="Times New Roman"/>
@@ -568,9 +558,8 @@
                 <w:szCs w:val="21"/>
                 <w:lang w:eastAsia="en-NZ"/>
               </w:rPr>
-              <w:t>_texture</w:t>
-            </w:r>
-            <w:proofErr w:type="spellEnd"/>
+              <w:t>self</w:t>
+            </w:r>
             <w:r>
               <w:rPr>
                 <w:rFonts w:ascii="Consolas" w:eastAsia="Times New Roman" w:hAnsi="Consolas" w:cs="Times New Roman"/>
@@ -579,9 +568,8 @@
                 <w:szCs w:val="21"/>
                 <w:lang w:eastAsia="en-NZ"/>
               </w:rPr>
-              <w:t xml:space="preserve"> = </w:t>
-            </w:r>
-            <w:proofErr w:type="spellStart"/>
+              <w:t>.</w:t>
+            </w:r>
             <w:r>
               <w:rPr>
                 <w:rFonts w:ascii="Consolas" w:eastAsia="Times New Roman" w:hAnsi="Consolas" w:cs="Times New Roman"/>
@@ -590,29 +578,8 @@
                 <w:szCs w:val="21"/>
                 <w:lang w:eastAsia="en-NZ"/>
               </w:rPr>
-              <w:t>self</w:t>
-            </w:r>
-            <w:r>
-              <w:rPr>
-                <w:rFonts w:ascii="Consolas" w:eastAsia="Times New Roman" w:hAnsi="Consolas" w:cs="Times New Roman"/>
-                <w:color w:val="D4D4D4"/>
-                <w:sz w:val="21"/>
-                <w:szCs w:val="21"/>
-                <w:lang w:eastAsia="en-NZ"/>
-              </w:rPr>
-              <w:t>.</w:t>
-            </w:r>
-            <w:r>
-              <w:rPr>
-                <w:rFonts w:ascii="Consolas" w:eastAsia="Times New Roman" w:hAnsi="Consolas" w:cs="Times New Roman"/>
-                <w:color w:val="9CDCFE"/>
-                <w:sz w:val="21"/>
-                <w:szCs w:val="21"/>
-                <w:lang w:eastAsia="en-NZ"/>
-              </w:rPr>
               <w:t>idle_texture_pair</w:t>
             </w:r>
-            <w:proofErr w:type="spellEnd"/>
             <w:r>
               <w:rPr>
                 <w:rFonts w:ascii="Consolas" w:eastAsia="Times New Roman" w:hAnsi="Consolas" w:cs="Times New Roman"/>
@@ -666,7 +633,6 @@
               </w:rPr>
               <w:t xml:space="preserve">        </w:t>
             </w:r>
-            <w:proofErr w:type="spellStart"/>
             <w:r>
               <w:rPr>
                 <w:rFonts w:ascii="Consolas" w:eastAsia="Times New Roman" w:hAnsi="Consolas" w:cs="Times New Roman"/>
@@ -697,7 +663,6 @@
               </w:rPr>
               <w:t>hit_box</w:t>
             </w:r>
-            <w:proofErr w:type="spellEnd"/>
             <w:r>
               <w:rPr>
                 <w:rFonts w:ascii="Consolas" w:eastAsia="Times New Roman" w:hAnsi="Consolas" w:cs="Times New Roman"/>
@@ -708,7 +673,6 @@
               </w:rPr>
               <w:t xml:space="preserve"> = </w:t>
             </w:r>
-            <w:proofErr w:type="spellStart"/>
             <w:r>
               <w:rPr>
                 <w:rFonts w:ascii="Consolas" w:eastAsia="Times New Roman" w:hAnsi="Consolas" w:cs="Times New Roman"/>
@@ -759,7 +723,6 @@
               </w:rPr>
               <w:t>hit_box_points</w:t>
             </w:r>
-            <w:proofErr w:type="spellEnd"/>
           </w:p>
           <w:p/>
         </w:tc>
@@ -915,15 +878,7 @@
           </w:tcPr>
           <w:p>
             <w:r>
-              <w:t xml:space="preserve">Called function in </w:t>
-            </w:r>
-            <w:proofErr w:type="spellStart"/>
-            <w:r>
-              <w:t>on_update</w:t>
-            </w:r>
-            <w:proofErr w:type="spellEnd"/>
-            <w:r>
-              <w:t xml:space="preserve"> function</w:t>
+              <w:t>Called function in on_update function</w:t>
             </w:r>
           </w:p>
         </w:tc>
@@ -1063,8 +1018,6 @@
               </w:rPr>
               <w:t xml:space="preserve"> </w:t>
             </w:r>
-            <w:proofErr w:type="spellStart"/>
-            <w:proofErr w:type="gramStart"/>
             <w:r>
               <w:rPr>
                 <w:rFonts w:ascii="Consolas" w:eastAsia="Times New Roman" w:hAnsi="Consolas" w:cs="Times New Roman"/>
@@ -1093,20 +1046,8 @@
                 <w:szCs w:val="21"/>
                 <w:lang w:eastAsia="en-NZ"/>
               </w:rPr>
-              <w:t>change</w:t>
-            </w:r>
-            <w:proofErr w:type="gramEnd"/>
-            <w:r>
-              <w:rPr>
-                <w:rFonts w:ascii="Consolas" w:eastAsia="Times New Roman" w:hAnsi="Consolas" w:cs="Times New Roman"/>
-                <w:color w:val="9CDCFE"/>
-                <w:sz w:val="21"/>
-                <w:szCs w:val="21"/>
-                <w:lang w:eastAsia="en-NZ"/>
-              </w:rPr>
-              <w:t>_y</w:t>
-            </w:r>
-            <w:proofErr w:type="spellEnd"/>
+              <w:t>change_y</w:t>
+            </w:r>
             <w:r>
               <w:rPr>
                 <w:rFonts w:ascii="Consolas" w:eastAsia="Times New Roman" w:hAnsi="Consolas" w:cs="Times New Roman"/>
@@ -1180,8 +1121,6 @@
               </w:rPr>
               <w:t xml:space="preserve">            </w:t>
             </w:r>
-            <w:proofErr w:type="spellStart"/>
-            <w:proofErr w:type="gramStart"/>
             <w:r>
               <w:rPr>
                 <w:rFonts w:ascii="Consolas" w:eastAsia="Times New Roman" w:hAnsi="Consolas" w:cs="Times New Roman"/>
@@ -1212,8 +1151,6 @@
               </w:rPr>
               <w:t>texture</w:t>
             </w:r>
-            <w:proofErr w:type="spellEnd"/>
-            <w:proofErr w:type="gramEnd"/>
             <w:r>
               <w:rPr>
                 <w:rFonts w:ascii="Consolas" w:eastAsia="Times New Roman" w:hAnsi="Consolas" w:cs="Times New Roman"/>
@@ -1244,7 +1181,6 @@
               </w:rPr>
               <w:t xml:space="preserve"> </w:t>
             </w:r>
-            <w:proofErr w:type="spellStart"/>
             <w:r>
               <w:rPr>
                 <w:rFonts w:ascii="Consolas" w:eastAsia="Times New Roman" w:hAnsi="Consolas" w:cs="Times New Roman"/>
@@ -1275,7 +1211,6 @@
               </w:rPr>
               <w:t>fall_textures</w:t>
             </w:r>
-            <w:proofErr w:type="spellEnd"/>
             <w:r>
               <w:rPr>
                 <w:rFonts w:ascii="Consolas" w:eastAsia="Times New Roman" w:hAnsi="Consolas" w:cs="Times New Roman"/>
@@ -1306,7 +1241,6 @@
               </w:rPr>
               <w:t>][</w:t>
             </w:r>
-            <w:proofErr w:type="spellStart"/>
             <w:r>
               <w:rPr>
                 <w:rFonts w:ascii="Consolas" w:eastAsia="Times New Roman" w:hAnsi="Consolas" w:cs="Times New Roman"/>
@@ -1337,7 +1271,6 @@
               </w:rPr>
               <w:t>character_face_direction</w:t>
             </w:r>
-            <w:proofErr w:type="spellEnd"/>
             <w:r>
               <w:rPr>
                 <w:rFonts w:ascii="Consolas" w:eastAsia="Times New Roman" w:hAnsi="Consolas" w:cs="Times New Roman"/>
@@ -1391,8 +1324,6 @@
               </w:rPr>
               <w:t xml:space="preserve"> </w:t>
             </w:r>
-            <w:proofErr w:type="spellStart"/>
-            <w:proofErr w:type="gramStart"/>
             <w:r>
               <w:rPr>
                 <w:rFonts w:ascii="Consolas" w:eastAsia="Times New Roman" w:hAnsi="Consolas" w:cs="Times New Roman"/>
@@ -1421,20 +1352,8 @@
                 <w:szCs w:val="21"/>
                 <w:lang w:eastAsia="en-NZ"/>
               </w:rPr>
-              <w:t>change</w:t>
-            </w:r>
-            <w:proofErr w:type="gramEnd"/>
-            <w:r>
-              <w:rPr>
-                <w:rFonts w:ascii="Consolas" w:eastAsia="Times New Roman" w:hAnsi="Consolas" w:cs="Times New Roman"/>
-                <w:color w:val="9CDCFE"/>
-                <w:sz w:val="21"/>
-                <w:szCs w:val="21"/>
-                <w:lang w:eastAsia="en-NZ"/>
-              </w:rPr>
-              <w:t>_y</w:t>
-            </w:r>
-            <w:proofErr w:type="spellEnd"/>
+              <w:t>change_y</w:t>
+            </w:r>
             <w:r>
               <w:rPr>
                 <w:rFonts w:ascii="Consolas" w:eastAsia="Times New Roman" w:hAnsi="Consolas" w:cs="Times New Roman"/>
@@ -1518,8 +1437,6 @@
               </w:rPr>
               <w:t xml:space="preserve">            </w:t>
             </w:r>
-            <w:proofErr w:type="spellStart"/>
-            <w:proofErr w:type="gramStart"/>
             <w:r>
               <w:rPr>
                 <w:rFonts w:ascii="Consolas" w:eastAsia="Times New Roman" w:hAnsi="Consolas" w:cs="Times New Roman"/>
@@ -1550,8 +1467,6 @@
               </w:rPr>
               <w:t>texture</w:t>
             </w:r>
-            <w:proofErr w:type="spellEnd"/>
-            <w:proofErr w:type="gramEnd"/>
             <w:r>
               <w:rPr>
                 <w:rFonts w:ascii="Consolas" w:eastAsia="Times New Roman" w:hAnsi="Consolas" w:cs="Times New Roman"/>
@@ -1582,7 +1497,6 @@
               </w:rPr>
               <w:t xml:space="preserve"> </w:t>
             </w:r>
-            <w:proofErr w:type="spellStart"/>
             <w:r>
               <w:rPr>
                 <w:rFonts w:ascii="Consolas" w:eastAsia="Times New Roman" w:hAnsi="Consolas" w:cs="Times New Roman"/>
@@ -1613,7 +1527,6 @@
               </w:rPr>
               <w:t>fall_textures</w:t>
             </w:r>
-            <w:proofErr w:type="spellEnd"/>
             <w:r>
               <w:rPr>
                 <w:rFonts w:ascii="Consolas" w:eastAsia="Times New Roman" w:hAnsi="Consolas" w:cs="Times New Roman"/>
@@ -1644,7 +1557,6 @@
               </w:rPr>
               <w:t>][</w:t>
             </w:r>
-            <w:proofErr w:type="spellStart"/>
             <w:r>
               <w:rPr>
                 <w:rFonts w:ascii="Consolas" w:eastAsia="Times New Roman" w:hAnsi="Consolas" w:cs="Times New Roman"/>
@@ -1675,7 +1587,6 @@
               </w:rPr>
               <w:t>character_face_direction</w:t>
             </w:r>
-            <w:proofErr w:type="spellEnd"/>
             <w:r>
               <w:rPr>
                 <w:rFonts w:ascii="Consolas" w:eastAsia="Times New Roman" w:hAnsi="Consolas" w:cs="Times New Roman"/>
@@ -2327,63 +2238,7 @@
                 <w:szCs w:val="21"/>
                 <w:lang w:eastAsia="en-NZ"/>
               </w:rPr>
-              <w:t xml:space="preserve">Changed code from </w:t>
-            </w:r>
-            <w:proofErr w:type="spellStart"/>
-            <w:proofErr w:type="gramStart"/>
-            <w:r>
-              <w:rPr>
-                <w:rFonts w:ascii="Consolas" w:eastAsia="Times New Roman" w:hAnsi="Consolas" w:cs="Times New Roman"/>
-                <w:color w:val="CCCCCC"/>
-                <w:sz w:val="21"/>
-                <w:szCs w:val="21"/>
-                <w:lang w:eastAsia="en-NZ"/>
-              </w:rPr>
-              <w:t>self.change</w:t>
-            </w:r>
-            <w:proofErr w:type="gramEnd"/>
-            <w:r>
-              <w:rPr>
-                <w:rFonts w:ascii="Consolas" w:eastAsia="Times New Roman" w:hAnsi="Consolas" w:cs="Times New Roman"/>
-                <w:color w:val="CCCCCC"/>
-                <w:sz w:val="21"/>
-                <w:szCs w:val="21"/>
-                <w:lang w:eastAsia="en-NZ"/>
-              </w:rPr>
-              <w:t>_x</w:t>
-            </w:r>
-            <w:proofErr w:type="spellEnd"/>
-            <w:r>
-              <w:rPr>
-                <w:rFonts w:ascii="Consolas" w:eastAsia="Times New Roman" w:hAnsi="Consolas" w:cs="Times New Roman"/>
-                <w:color w:val="CCCCCC"/>
-                <w:sz w:val="21"/>
-                <w:szCs w:val="21"/>
-                <w:lang w:eastAsia="en-NZ"/>
-              </w:rPr>
-              <w:t xml:space="preserve"> to </w:t>
-            </w:r>
-            <w:proofErr w:type="spellStart"/>
-            <w:r>
-              <w:rPr>
-                <w:rFonts w:ascii="Consolas" w:eastAsia="Times New Roman" w:hAnsi="Consolas" w:cs="Times New Roman"/>
-                <w:color w:val="CCCCCC"/>
-                <w:sz w:val="21"/>
-                <w:szCs w:val="21"/>
-                <w:lang w:eastAsia="en-NZ"/>
-              </w:rPr>
-              <w:t>self.center</w:t>
-            </w:r>
-            <w:proofErr w:type="spellEnd"/>
-            <w:r>
-              <w:rPr>
-                <w:rFonts w:ascii="Consolas" w:eastAsia="Times New Roman" w:hAnsi="Consolas" w:cs="Times New Roman"/>
-                <w:color w:val="CCCCCC"/>
-                <w:sz w:val="21"/>
-                <w:szCs w:val="21"/>
-                <w:lang w:eastAsia="en-NZ"/>
-              </w:rPr>
-              <w:t xml:space="preserve"> += x</w:t>
+              <w:t>Changed code from self.change_x to self.center += x</w:t>
             </w:r>
           </w:p>
         </w:tc>
@@ -2433,13 +2288,8 @@
           <w:p>
             <w:r>
               <w:lastRenderedPageBreak/>
-              <w:t xml:space="preserve">Enemy sprites </w:t>
-            </w:r>
-            <w:proofErr w:type="gramStart"/>
-            <w:r>
-              <w:t>moves</w:t>
-            </w:r>
-            <w:proofErr w:type="gramEnd"/>
+              <w:t>Enemy sprites moves</w:t>
+            </w:r>
           </w:p>
         </w:tc>
         <w:tc>
@@ -2491,13 +2341,8 @@
           </w:tcPr>
           <w:p>
             <w:r>
-              <w:t xml:space="preserve">Enemy sprite </w:t>
-            </w:r>
-            <w:proofErr w:type="spellStart"/>
-            <w:r>
-              <w:t>movment</w:t>
-            </w:r>
-            <w:proofErr w:type="spellEnd"/>
+              <w:t>Enemy sprite movment</w:t>
+            </w:r>
           </w:p>
         </w:tc>
         <w:tc>
@@ -2506,15 +2351,7 @@
           </w:tcPr>
           <w:p>
             <w:r>
-              <w:t xml:space="preserve">Enemy </w:t>
-            </w:r>
-            <w:proofErr w:type="spellStart"/>
-            <w:r>
-              <w:t>enemy</w:t>
-            </w:r>
-            <w:proofErr w:type="spellEnd"/>
-            <w:r>
-              <w:t xml:space="preserve"> sprites make small movements left and right and jump </w:t>
+              <w:t xml:space="preserve">Enemy enemy sprites make small movements left and right and jump </w:t>
             </w:r>
           </w:p>
         </w:tc>
@@ -2690,7 +2527,6 @@
                 <w:lang w:eastAsia="en-NZ"/>
               </w:rPr>
             </w:pPr>
-            <w:proofErr w:type="spellStart"/>
             <w:r>
               <w:rPr>
                 <w:rFonts w:ascii="Consolas" w:eastAsia="Times New Roman" w:hAnsi="Consolas" w:cs="Times New Roman"/>
@@ -2701,7 +2537,6 @@
               </w:rPr>
               <w:t>elif</w:t>
             </w:r>
-            <w:proofErr w:type="spellEnd"/>
             <w:r>
               <w:rPr>
                 <w:rFonts w:ascii="Consolas" w:eastAsia="Times New Roman" w:hAnsi="Consolas" w:cs="Times New Roman"/>
@@ -2712,8 +2547,6 @@
               </w:rPr>
               <w:t xml:space="preserve"> </w:t>
             </w:r>
-            <w:proofErr w:type="spellStart"/>
-            <w:proofErr w:type="gramStart"/>
             <w:r>
               <w:rPr>
                 <w:rFonts w:ascii="Consolas" w:eastAsia="Times New Roman" w:hAnsi="Consolas" w:cs="Times New Roman"/>
@@ -2744,8 +2577,6 @@
               </w:rPr>
               <w:t>direction</w:t>
             </w:r>
-            <w:proofErr w:type="spellEnd"/>
-            <w:proofErr w:type="gramEnd"/>
             <w:r>
               <w:rPr>
                 <w:rFonts w:ascii="Consolas" w:eastAsia="Times New Roman" w:hAnsi="Consolas" w:cs="Times New Roman"/>
@@ -2819,8 +2650,6 @@
               </w:rPr>
               <w:t xml:space="preserve">            </w:t>
             </w:r>
-            <w:proofErr w:type="spellStart"/>
-            <w:proofErr w:type="gramStart"/>
             <w:r>
               <w:rPr>
                 <w:rFonts w:ascii="Consolas" w:eastAsia="Times New Roman" w:hAnsi="Consolas" w:cs="Times New Roman"/>
@@ -2849,20 +2678,8 @@
                 <w:szCs w:val="21"/>
                 <w:lang w:eastAsia="en-NZ"/>
               </w:rPr>
-              <w:t>change</w:t>
-            </w:r>
-            <w:proofErr w:type="gramEnd"/>
-            <w:r>
-              <w:rPr>
-                <w:rFonts w:ascii="Consolas" w:eastAsia="Times New Roman" w:hAnsi="Consolas" w:cs="Times New Roman"/>
-                <w:color w:val="9CDCFE"/>
-                <w:sz w:val="21"/>
-                <w:szCs w:val="21"/>
-                <w:lang w:eastAsia="en-NZ"/>
-              </w:rPr>
-              <w:t>_x</w:t>
-            </w:r>
-            <w:proofErr w:type="spellEnd"/>
+              <w:t>change_x</w:t>
+            </w:r>
             <w:r>
               <w:rPr>
                 <w:rFonts w:ascii="Consolas" w:eastAsia="Times New Roman" w:hAnsi="Consolas" w:cs="Times New Roman"/>
@@ -3048,7 +2865,6 @@
                 <w:lang w:eastAsia="en-NZ"/>
               </w:rPr>
             </w:pPr>
-            <w:proofErr w:type="gramStart"/>
             <w:r>
               <w:rPr>
                 <w:rFonts w:ascii="Consolas" w:eastAsia="Times New Roman" w:hAnsi="Consolas" w:cs="Times New Roman"/>
@@ -3057,62 +2873,7 @@
                 <w:szCs w:val="21"/>
                 <w:lang w:eastAsia="en-NZ"/>
               </w:rPr>
-              <w:t>Changed .</w:t>
-            </w:r>
-            <w:proofErr w:type="spellStart"/>
-            <w:r>
-              <w:rPr>
-                <w:rFonts w:ascii="Consolas" w:eastAsia="Times New Roman" w:hAnsi="Consolas" w:cs="Times New Roman"/>
-                <w:color w:val="C586C0"/>
-                <w:sz w:val="21"/>
-                <w:szCs w:val="21"/>
-                <w:lang w:eastAsia="en-NZ"/>
-              </w:rPr>
-              <w:t>change</w:t>
-            </w:r>
-            <w:proofErr w:type="gramEnd"/>
-            <w:r>
-              <w:rPr>
-                <w:rFonts w:ascii="Consolas" w:eastAsia="Times New Roman" w:hAnsi="Consolas" w:cs="Times New Roman"/>
-                <w:color w:val="C586C0"/>
-                <w:sz w:val="21"/>
-                <w:szCs w:val="21"/>
-                <w:lang w:eastAsia="en-NZ"/>
-              </w:rPr>
-              <w:t>_x</w:t>
-            </w:r>
-            <w:proofErr w:type="spellEnd"/>
-            <w:r>
-              <w:rPr>
-                <w:rFonts w:ascii="Consolas" w:eastAsia="Times New Roman" w:hAnsi="Consolas" w:cs="Times New Roman"/>
-                <w:color w:val="C586C0"/>
-                <w:sz w:val="21"/>
-                <w:szCs w:val="21"/>
-                <w:lang w:eastAsia="en-NZ"/>
-              </w:rPr>
-              <w:t xml:space="preserve"> -= 3 to  .</w:t>
-            </w:r>
-            <w:proofErr w:type="spellStart"/>
-            <w:r>
-              <w:rPr>
-                <w:rFonts w:ascii="Consolas" w:eastAsia="Times New Roman" w:hAnsi="Consolas" w:cs="Times New Roman"/>
-                <w:color w:val="C586C0"/>
-                <w:sz w:val="21"/>
-                <w:szCs w:val="21"/>
-                <w:lang w:eastAsia="en-NZ"/>
-              </w:rPr>
-              <w:t>change_x</w:t>
-            </w:r>
-            <w:proofErr w:type="spellEnd"/>
-            <w:r>
-              <w:rPr>
-                <w:rFonts w:ascii="Consolas" w:eastAsia="Times New Roman" w:hAnsi="Consolas" w:cs="Times New Roman"/>
-                <w:color w:val="C586C0"/>
-                <w:sz w:val="21"/>
-                <w:szCs w:val="21"/>
-                <w:lang w:eastAsia="en-NZ"/>
-              </w:rPr>
-              <w:t xml:space="preserve"> = -3</w:t>
+              <w:t>Changed .change_x -= 3 to  .change_x = -3</w:t>
             </w:r>
           </w:p>
         </w:tc>
@@ -3333,7 +3094,6 @@
               </w:rPr>
               <w:t> </w:t>
             </w:r>
-            <w:proofErr w:type="spellStart"/>
             <w:r>
               <w:rPr>
                 <w:rFonts w:ascii="Consolas" w:eastAsia="Times New Roman" w:hAnsi="Consolas" w:cs="Times New Roman"/>
@@ -3344,7 +3104,6 @@
               </w:rPr>
               <w:t>elif</w:t>
             </w:r>
-            <w:proofErr w:type="spellEnd"/>
             <w:r>
               <w:rPr>
                 <w:rFonts w:ascii="Consolas" w:eastAsia="Times New Roman" w:hAnsi="Consolas" w:cs="Times New Roman"/>
@@ -3395,8 +3154,6 @@
               </w:rPr>
               <w:t xml:space="preserve"> </w:t>
             </w:r>
-            <w:proofErr w:type="spellStart"/>
-            <w:proofErr w:type="gramStart"/>
             <w:r>
               <w:rPr>
                 <w:rFonts w:ascii="Consolas" w:eastAsia="Times New Roman" w:hAnsi="Consolas" w:cs="Times New Roman"/>
@@ -3447,8 +3204,6 @@
               </w:rPr>
               <w:t>SPACE</w:t>
             </w:r>
-            <w:proofErr w:type="spellEnd"/>
-            <w:proofErr w:type="gramEnd"/>
             <w:r>
               <w:rPr>
                 <w:rFonts w:ascii="Consolas" w:eastAsia="Times New Roman" w:hAnsi="Consolas" w:cs="Times New Roman"/>
@@ -3482,8 +3237,6 @@
               </w:rPr>
               <w:t>   </w:t>
             </w:r>
-            <w:proofErr w:type="spellStart"/>
-            <w:proofErr w:type="gramStart"/>
             <w:r>
               <w:rPr>
                 <w:rFonts w:ascii="Consolas" w:eastAsia="Times New Roman" w:hAnsi="Consolas" w:cs="Times New Roman"/>
@@ -3512,9 +3265,18 @@
                 <w:szCs w:val="21"/>
                 <w:lang w:eastAsia="en-NZ"/>
               </w:rPr>
-              <w:t>enemy</w:t>
-            </w:r>
-            <w:proofErr w:type="gramEnd"/>
+              <w:t>enemy_sprite</w:t>
+            </w:r>
+            <w:r>
+              <w:rPr>
+                <w:rFonts w:ascii="Consolas" w:eastAsia="Times New Roman" w:hAnsi="Consolas" w:cs="Times New Roman"/>
+                <w:color w:val="CCCCCC"/>
+                <w:sz w:val="21"/>
+                <w:szCs w:val="21"/>
+                <w:lang w:eastAsia="en-NZ"/>
+              </w:rPr>
+              <w:t>.</w:t>
+            </w:r>
             <w:r>
               <w:rPr>
                 <w:rFonts w:ascii="Consolas" w:eastAsia="Times New Roman" w:hAnsi="Consolas" w:cs="Times New Roman"/>
@@ -3523,29 +3285,8 @@
                 <w:szCs w:val="21"/>
                 <w:lang w:eastAsia="en-NZ"/>
               </w:rPr>
-              <w:t>_sprite</w:t>
-            </w:r>
-            <w:r>
-              <w:rPr>
-                <w:rFonts w:ascii="Consolas" w:eastAsia="Times New Roman" w:hAnsi="Consolas" w:cs="Times New Roman"/>
-                <w:color w:val="CCCCCC"/>
-                <w:sz w:val="21"/>
-                <w:szCs w:val="21"/>
-                <w:lang w:eastAsia="en-NZ"/>
-              </w:rPr>
-              <w:t>.</w:t>
-            </w:r>
-            <w:r>
-              <w:rPr>
-                <w:rFonts w:ascii="Consolas" w:eastAsia="Times New Roman" w:hAnsi="Consolas" w:cs="Times New Roman"/>
-                <w:color w:val="9CDCFE"/>
-                <w:sz w:val="21"/>
-                <w:szCs w:val="21"/>
-                <w:lang w:eastAsia="en-NZ"/>
-              </w:rPr>
               <w:t>attack</w:t>
             </w:r>
-            <w:proofErr w:type="spellEnd"/>
             <w:r>
               <w:rPr>
                 <w:rFonts w:ascii="Consolas" w:eastAsia="Times New Roman" w:hAnsi="Consolas" w:cs="Times New Roman"/>
@@ -3680,31 +3421,7 @@
                 <w:lang w:eastAsia="en-NZ"/>
               </w:rPr>
               <w:lastRenderedPageBreak/>
-              <w:t xml:space="preserve">Added </w:t>
-            </w:r>
-            <w:proofErr w:type="spellStart"/>
-            <w:proofErr w:type="gramStart"/>
-            <w:r>
-              <w:rPr>
-                <w:rFonts w:ascii="Consolas" w:eastAsia="Times New Roman" w:hAnsi="Consolas" w:cs="Times New Roman"/>
-                <w:color w:val="CCCCCC"/>
-                <w:sz w:val="21"/>
-                <w:szCs w:val="21"/>
-                <w:lang w:eastAsia="en-NZ"/>
-              </w:rPr>
-              <w:t>time.sleep</w:t>
-            </w:r>
-            <w:proofErr w:type="spellEnd"/>
-            <w:proofErr w:type="gramEnd"/>
-            <w:r>
-              <w:rPr>
-                <w:rFonts w:ascii="Consolas" w:eastAsia="Times New Roman" w:hAnsi="Consolas" w:cs="Times New Roman"/>
-                <w:color w:val="CCCCCC"/>
-                <w:sz w:val="21"/>
-                <w:szCs w:val="21"/>
-                <w:lang w:eastAsia="en-NZ"/>
-              </w:rPr>
-              <w:t>(1)</w:t>
+              <w:t>Added time.sleep(1)</w:t>
             </w:r>
           </w:p>
         </w:tc>
@@ -3892,51 +3609,7 @@
                 <w:szCs w:val="21"/>
                 <w:lang w:eastAsia="en-NZ"/>
               </w:rPr>
-              <w:t xml:space="preserve">Reset </w:t>
-            </w:r>
-            <w:proofErr w:type="spellStart"/>
-            <w:r>
-              <w:rPr>
-                <w:rFonts w:ascii="Consolas" w:eastAsia="Times New Roman" w:hAnsi="Consolas" w:cs="Times New Roman"/>
-                <w:color w:val="CCCCCC"/>
-                <w:sz w:val="21"/>
-                <w:szCs w:val="21"/>
-                <w:lang w:eastAsia="en-NZ"/>
-              </w:rPr>
-              <w:t>self.cur_texture</w:t>
-            </w:r>
-            <w:proofErr w:type="spellEnd"/>
-            <w:r>
-              <w:rPr>
-                <w:rFonts w:ascii="Consolas" w:eastAsia="Times New Roman" w:hAnsi="Consolas" w:cs="Times New Roman"/>
-                <w:color w:val="CCCCCC"/>
-                <w:sz w:val="21"/>
-                <w:szCs w:val="21"/>
-                <w:lang w:eastAsia="en-NZ"/>
-              </w:rPr>
-              <w:t xml:space="preserve"> when </w:t>
-            </w:r>
-            <w:proofErr w:type="spellStart"/>
-            <w:r>
-              <w:rPr>
-                <w:rFonts w:ascii="Consolas" w:eastAsia="Times New Roman" w:hAnsi="Consolas" w:cs="Times New Roman"/>
-                <w:color w:val="CCCCCC"/>
-                <w:sz w:val="21"/>
-                <w:szCs w:val="21"/>
-                <w:lang w:eastAsia="en-NZ"/>
-              </w:rPr>
-              <w:t>self attack</w:t>
-            </w:r>
-            <w:proofErr w:type="spellEnd"/>
-            <w:r>
-              <w:rPr>
-                <w:rFonts w:ascii="Consolas" w:eastAsia="Times New Roman" w:hAnsi="Consolas" w:cs="Times New Roman"/>
-                <w:color w:val="CCCCCC"/>
-                <w:sz w:val="21"/>
-                <w:szCs w:val="21"/>
-                <w:lang w:eastAsia="en-NZ"/>
-              </w:rPr>
-              <w:t xml:space="preserve"> == “attack</w:t>
+              <w:t>Reset self.cur_texture when self attack == “attack</w:t>
             </w:r>
           </w:p>
         </w:tc>
@@ -3980,13 +3653,8 @@
             <w:tcW w:w="1724" w:type="dxa"/>
           </w:tcPr>
           <w:p>
-            <w:proofErr w:type="spellStart"/>
-            <w:r>
-              <w:t>Self.cur_texture</w:t>
-            </w:r>
-            <w:proofErr w:type="spellEnd"/>
-            <w:r>
-              <w:t xml:space="preserve"> is not being updated</w:t>
+            <w:r>
+              <w:t>Self.cur_texture is not being updated</w:t>
             </w:r>
           </w:p>
         </w:tc>
@@ -4268,75 +3936,7 @@
                 <w:szCs w:val="21"/>
                 <w:lang w:eastAsia="en-NZ"/>
               </w:rPr>
-              <w:t xml:space="preserve">Removed the code from on </w:t>
-            </w:r>
-            <w:proofErr w:type="spellStart"/>
-            <w:r>
-              <w:rPr>
-                <w:rFonts w:ascii="Consolas" w:eastAsia="Times New Roman" w:hAnsi="Consolas" w:cs="Times New Roman"/>
-                <w:color w:val="CCCCCC"/>
-                <w:sz w:val="21"/>
-                <w:szCs w:val="21"/>
-                <w:lang w:eastAsia="en-NZ"/>
-              </w:rPr>
-              <w:t>key_release</w:t>
-            </w:r>
-            <w:proofErr w:type="spellEnd"/>
-            <w:r>
-              <w:rPr>
-                <w:rFonts w:ascii="Consolas" w:eastAsia="Times New Roman" w:hAnsi="Consolas" w:cs="Times New Roman"/>
-                <w:color w:val="CCCCCC"/>
-                <w:sz w:val="21"/>
-                <w:szCs w:val="21"/>
-                <w:lang w:eastAsia="en-NZ"/>
-              </w:rPr>
-              <w:t xml:space="preserve"> that stops the animation code from running and made </w:t>
-            </w:r>
-            <w:proofErr w:type="spellStart"/>
-            <w:proofErr w:type="gramStart"/>
-            <w:r>
-              <w:rPr>
-                <w:rFonts w:ascii="Consolas" w:eastAsia="Times New Roman" w:hAnsi="Consolas" w:cs="Times New Roman"/>
-                <w:color w:val="CCCCCC"/>
-                <w:sz w:val="21"/>
-                <w:szCs w:val="21"/>
-                <w:lang w:eastAsia="en-NZ"/>
-              </w:rPr>
-              <w:t>self.attack</w:t>
-            </w:r>
-            <w:proofErr w:type="spellEnd"/>
-            <w:proofErr w:type="gramEnd"/>
-            <w:r>
-              <w:rPr>
-                <w:rFonts w:ascii="Consolas" w:eastAsia="Times New Roman" w:hAnsi="Consolas" w:cs="Times New Roman"/>
-                <w:color w:val="CCCCCC"/>
-                <w:sz w:val="21"/>
-                <w:szCs w:val="21"/>
-                <w:lang w:eastAsia="en-NZ"/>
-              </w:rPr>
-              <w:t xml:space="preserve"> = “” when the animation </w:t>
-            </w:r>
-            <w:proofErr w:type="spellStart"/>
-            <w:r>
-              <w:rPr>
-                <w:rFonts w:ascii="Consolas" w:eastAsia="Times New Roman" w:hAnsi="Consolas" w:cs="Times New Roman"/>
-                <w:color w:val="CCCCCC"/>
-                <w:sz w:val="21"/>
-                <w:szCs w:val="21"/>
-                <w:lang w:eastAsia="en-NZ"/>
-              </w:rPr>
-              <w:t>hd</w:t>
-            </w:r>
-            <w:proofErr w:type="spellEnd"/>
-            <w:r>
-              <w:rPr>
-                <w:rFonts w:ascii="Consolas" w:eastAsia="Times New Roman" w:hAnsi="Consolas" w:cs="Times New Roman"/>
-                <w:color w:val="CCCCCC"/>
-                <w:sz w:val="21"/>
-                <w:szCs w:val="21"/>
-                <w:lang w:eastAsia="en-NZ"/>
-              </w:rPr>
-              <w:t xml:space="preserve"> played.</w:t>
+              <w:t>Removed the code from on key_release that stops the animation code from running and made self.attack = “” when the animation hd played.</w:t>
             </w:r>
           </w:p>
         </w:tc>
@@ -4404,6 +4004,7 @@
             <w:r>
               <w:rPr>
                 <w:rFonts w:ascii="Consolas" w:eastAsia="Times New Roman" w:hAnsi="Consolas" w:cs="Times New Roman"/>
+                <w:noProof/>
                 <w:color w:val="CCCCCC"/>
                 <w:sz w:val="21"/>
                 <w:szCs w:val="21"/>
@@ -4509,6 +4110,50 @@
                 <w:lang w:eastAsia="en-NZ"/>
               </w:rPr>
             </w:pPr>
+            <w:r>
+              <w:rPr>
+                <w:rFonts w:ascii="Consolas" w:eastAsia="Times New Roman" w:hAnsi="Consolas" w:cs="Times New Roman"/>
+                <w:color w:val="CCCCCC"/>
+                <w:sz w:val="21"/>
+                <w:szCs w:val="21"/>
+                <w:lang w:eastAsia="en-NZ"/>
+              </w:rPr>
+              <w:drawing>
+                <wp:inline distT="0" distB="0" distL="0" distR="0" wp14:anchorId="0B178B3D" wp14:editId="21455151">
+                  <wp:extent cx="5525271" cy="1667108"/>
+                  <wp:effectExtent l="0" t="0" r="0" b="9525"/>
+                  <wp:docPr id="1461391971" name="Picture 1"/>
+                  <wp:cNvGraphicFramePr>
+                    <a:graphicFrameLocks xmlns:a="http://schemas.openxmlformats.org/drawingml/2006/main" noChangeAspect="1"/>
+                  </wp:cNvGraphicFramePr>
+                  <a:graphic xmlns:a="http://schemas.openxmlformats.org/drawingml/2006/main">
+                    <a:graphicData uri="http://schemas.openxmlformats.org/drawingml/2006/picture">
+                      <pic:pic xmlns:pic="http://schemas.openxmlformats.org/drawingml/2006/picture">
+                        <pic:nvPicPr>
+                          <pic:cNvPr id="1461391971" name=""/>
+                          <pic:cNvPicPr/>
+                        </pic:nvPicPr>
+                        <pic:blipFill>
+                          <a:blip r:embed="rId8"/>
+                          <a:stretch>
+                            <a:fillRect/>
+                          </a:stretch>
+                        </pic:blipFill>
+                        <pic:spPr>
+                          <a:xfrm>
+                            <a:off x="0" y="0"/>
+                            <a:ext cx="5525271" cy="1667108"/>
+                          </a:xfrm>
+                          <a:prstGeom prst="rect">
+                            <a:avLst/>
+                          </a:prstGeom>
+                        </pic:spPr>
+                      </pic:pic>
+                    </a:graphicData>
+                  </a:graphic>
+                </wp:inline>
+              </w:drawing>
+            </w:r>
           </w:p>
         </w:tc>
       </w:tr>

</xml_diff>

<commit_message>
improved enemy movement and fixed attack animation
</commit_message>
<xml_diff>
--- a/documentation/ongoing_testing.docx
+++ b/documentation/ongoing_testing.docx
@@ -4113,6 +4113,7 @@
             <w:r>
               <w:rPr>
                 <w:rFonts w:ascii="Consolas" w:eastAsia="Times New Roman" w:hAnsi="Consolas" w:cs="Times New Roman"/>
+                <w:noProof/>
                 <w:color w:val="CCCCCC"/>
                 <w:sz w:val="21"/>
                 <w:szCs w:val="21"/>
@@ -4197,7 +4198,7 @@
           </w:tcPr>
           <w:p>
             <w:r>
-              <w:t>Attack animation works</w:t>
+              <w:t>Attack animation bugs out</w:t>
             </w:r>
           </w:p>
         </w:tc>
@@ -4225,8 +4226,117 @@
                 <w:szCs w:val="21"/>
                 <w:lang w:eastAsia="en-NZ"/>
               </w:rPr>
-              <w:t>None</w:t>
-            </w:r>
+              <w:t>Attack animation repeats when the sprites move</w:t>
+            </w:r>
+          </w:p>
+          <w:p>
+            <w:pPr>
+              <w:shd w:val="clear" w:color="auto" w:fill="1F1F1F"/>
+              <w:spacing w:line="285" w:lineRule="atLeast"/>
+              <w:rPr>
+                <w:rFonts w:ascii="Consolas" w:eastAsia="Times New Roman" w:hAnsi="Consolas" w:cs="Times New Roman"/>
+                <w:color w:val="CCCCCC"/>
+                <w:sz w:val="21"/>
+                <w:szCs w:val="21"/>
+                <w:lang w:eastAsia="en-NZ"/>
+              </w:rPr>
+            </w:pPr>
+            <w:r>
+              <w:rPr>
+                <w:rFonts w:ascii="Consolas" w:eastAsia="Times New Roman" w:hAnsi="Consolas" w:cs="Times New Roman"/>
+                <w:color w:val="CCCCCC"/>
+                <w:sz w:val="21"/>
+                <w:szCs w:val="21"/>
+                <w:lang w:eastAsia="en-NZ"/>
+              </w:rPr>
+              <w:t>So I stopped the enemy sprite movement when attack</w:t>
+            </w:r>
+          </w:p>
+          <w:p>
+            <w:pPr>
+              <w:shd w:val="clear" w:color="auto" w:fill="1F1F1F"/>
+              <w:spacing w:line="285" w:lineRule="atLeast"/>
+              <w:rPr>
+                <w:rFonts w:ascii="Consolas" w:eastAsia="Times New Roman" w:hAnsi="Consolas" w:cs="Times New Roman"/>
+                <w:color w:val="CCCCCC"/>
+                <w:sz w:val="21"/>
+                <w:szCs w:val="21"/>
+                <w:lang w:eastAsia="en-NZ"/>
+              </w:rPr>
+            </w:pPr>
+            <w:r>
+              <w:rPr>
+                <w:rFonts w:ascii="Consolas" w:eastAsia="Times New Roman" w:hAnsi="Consolas" w:cs="Times New Roman"/>
+                <w:color w:val="CCCCCC"/>
+                <w:sz w:val="21"/>
+                <w:szCs w:val="21"/>
+                <w:lang w:eastAsia="en-NZ"/>
+              </w:rPr>
+              <w:t>Is running</w:t>
+            </w:r>
+          </w:p>
+        </w:tc>
+      </w:tr>
+      <w:tr>
+        <w:trPr>
+          <w:trHeight w:val="396"/>
+        </w:trPr>
+        <w:tc>
+          <w:tcPr>
+            <w:tcW w:w="761" w:type="dxa"/>
+          </w:tcPr>
+          <w:p>
+            <w:r>
+              <w:t>22/4</w:t>
+            </w:r>
+          </w:p>
+        </w:tc>
+        <w:tc>
+          <w:tcPr>
+            <w:tcW w:w="1358" w:type="dxa"/>
+          </w:tcPr>
+          <w:p>
+            <w:r>
+              <w:t>Enemy sprite animation</w:t>
+            </w:r>
+          </w:p>
+        </w:tc>
+        <w:tc>
+          <w:tcPr>
+            <w:tcW w:w="1419" w:type="dxa"/>
+          </w:tcPr>
+          <w:p>
+            <w:r>
+              <w:t>Sprites play animation when space bar is pressed</w:t>
+            </w:r>
+          </w:p>
+        </w:tc>
+        <w:tc>
+          <w:tcPr>
+            <w:tcW w:w="1724" w:type="dxa"/>
+          </w:tcPr>
+          <w:p>
+            <w:r>
+              <w:t>Animation works</w:t>
+            </w:r>
+          </w:p>
+        </w:tc>
+        <w:tc>
+          <w:tcPr>
+            <w:tcW w:w="9246" w:type="dxa"/>
+          </w:tcPr>
+          <w:p>
+            <w:pPr>
+              <w:shd w:val="clear" w:color="auto" w:fill="1F1F1F"/>
+              <w:spacing w:line="285" w:lineRule="atLeast"/>
+              <w:rPr>
+                <w:rFonts w:ascii="Consolas" w:eastAsia="Times New Roman" w:hAnsi="Consolas" w:cs="Times New Roman"/>
+                <w:color w:val="CCCCCC"/>
+                <w:sz w:val="21"/>
+                <w:szCs w:val="21"/>
+                <w:lang w:eastAsia="en-NZ"/>
+              </w:rPr>
+            </w:pPr>
           </w:p>
         </w:tc>
       </w:tr>

</xml_diff>

<commit_message>
might have to make an entity function
</commit_message>
<xml_diff>
--- a/documentation/ongoing_testing.docx
+++ b/documentation/ongoing_testing.docx
@@ -948,7 +948,10 @@
           </w:tcPr>
           <w:p>
             <w:r>
-              <w:t>18/04</w:t>
+              <w:t>18/0</w:t>
+            </w:r>
+            <w:r>
+              <w:t>3</w:t>
             </w:r>
           </w:p>
         </w:tc>
@@ -1613,7 +1616,10 @@
           </w:tcPr>
           <w:p>
             <w:r>
-              <w:t>18/04</w:t>
+              <w:t>18/0</w:t>
+            </w:r>
+            <w:r>
+              <w:t>3</w:t>
             </w:r>
           </w:p>
         </w:tc>
@@ -1673,7 +1679,10 @@
           </w:tcPr>
           <w:p>
             <w:r>
-              <w:t>18/04</w:t>
+              <w:t>18/0</w:t>
+            </w:r>
+            <w:r>
+              <w:t>3</w:t>
             </w:r>
           </w:p>
         </w:tc>
@@ -3624,7 +3633,10 @@
           </w:tcPr>
           <w:p>
             <w:r>
-              <w:t>22/4</w:t>
+              <w:t>22/</w:t>
+            </w:r>
+            <w:r>
+              <w:t>3</w:t>
             </w:r>
           </w:p>
         </w:tc>
@@ -3732,7 +3744,10 @@
           </w:tcPr>
           <w:p>
             <w:r>
-              <w:t>22/4</w:t>
+              <w:t>22/</w:t>
+            </w:r>
+            <w:r>
+              <w:t>3</w:t>
             </w:r>
           </w:p>
         </w:tc>
@@ -3805,7 +3820,10 @@
           </w:tcPr>
           <w:p>
             <w:r>
-              <w:t>22/4</w:t>
+              <w:t>22/</w:t>
+            </w:r>
+            <w:r>
+              <w:t>3</w:t>
             </w:r>
           </w:p>
         </w:tc>
@@ -3878,7 +3896,10 @@
           </w:tcPr>
           <w:p>
             <w:r>
-              <w:t>22/4</w:t>
+              <w:t>22/</w:t>
+            </w:r>
+            <w:r>
+              <w:t>3</w:t>
             </w:r>
           </w:p>
         </w:tc>
@@ -3951,7 +3972,10 @@
           </w:tcPr>
           <w:p>
             <w:r>
-              <w:t>22/4</w:t>
+              <w:t>22/</w:t>
+            </w:r>
+            <w:r>
+              <w:t>3</w:t>
             </w:r>
           </w:p>
         </w:tc>
@@ -4060,7 +4084,10 @@
           <w:p>
             <w:r>
               <w:lastRenderedPageBreak/>
-              <w:t>22/4</w:t>
+              <w:t>22/</w:t>
+            </w:r>
+            <w:r>
+              <w:t>3</w:t>
             </w:r>
           </w:p>
         </w:tc>
@@ -4168,7 +4195,10 @@
           </w:tcPr>
           <w:p>
             <w:r>
-              <w:t>22/4</w:t>
+              <w:t>22/</w:t>
+            </w:r>
+            <w:r>
+              <w:t>3</w:t>
             </w:r>
           </w:p>
         </w:tc>
@@ -4287,7 +4317,10 @@
           </w:tcPr>
           <w:p>
             <w:r>
-              <w:t>22/4</w:t>
+              <w:t>22/</w:t>
+            </w:r>
+            <w:r>
+              <w:t>3</w:t>
             </w:r>
           </w:p>
         </w:tc>
@@ -4318,6 +4351,142 @@
           <w:p>
             <w:r>
               <w:t>Animation works</w:t>
+            </w:r>
+          </w:p>
+        </w:tc>
+        <w:tc>
+          <w:tcPr>
+            <w:tcW w:w="9246" w:type="dxa"/>
+          </w:tcPr>
+          <w:p>
+            <w:pPr>
+              <w:shd w:val="clear" w:color="auto" w:fill="1F1F1F"/>
+              <w:spacing w:line="285" w:lineRule="atLeast"/>
+              <w:rPr>
+                <w:rFonts w:ascii="Consolas" w:eastAsia="Times New Roman" w:hAnsi="Consolas" w:cs="Times New Roman"/>
+                <w:color w:val="CCCCCC"/>
+                <w:sz w:val="21"/>
+                <w:szCs w:val="21"/>
+                <w:lang w:eastAsia="en-NZ"/>
+              </w:rPr>
+            </w:pPr>
+            <w:r>
+              <w:rPr>
+                <w:rFonts w:ascii="Consolas" w:eastAsia="Times New Roman" w:hAnsi="Consolas" w:cs="Times New Roman"/>
+                <w:color w:val="CCCCCC"/>
+                <w:sz w:val="21"/>
+                <w:szCs w:val="21"/>
+                <w:lang w:eastAsia="en-NZ"/>
+              </w:rPr>
+              <w:t>None</w:t>
+            </w:r>
+          </w:p>
+        </w:tc>
+      </w:tr>
+      <w:tr>
+        <w:trPr>
+          <w:trHeight w:val="396"/>
+        </w:trPr>
+        <w:tc>
+          <w:tcPr>
+            <w:tcW w:w="761" w:type="dxa"/>
+          </w:tcPr>
+          <w:p>
+            <w:r>
+              <w:t>26/3</w:t>
+            </w:r>
+          </w:p>
+        </w:tc>
+        <w:tc>
+          <w:tcPr>
+            <w:tcW w:w="1358" w:type="dxa"/>
+          </w:tcPr>
+          <w:p>
+            <w:r>
+              <w:t>Enemy sprite collision</w:t>
+            </w:r>
+          </w:p>
+        </w:tc>
+        <w:tc>
+          <w:tcPr>
+            <w:tcW w:w="1419" w:type="dxa"/>
+          </w:tcPr>
+          <w:p>
+            <w:r>
+              <w:t>If player collides with enemy sprite the enemy plays attack animation</w:t>
+            </w:r>
+          </w:p>
+        </w:tc>
+        <w:tc>
+          <w:tcPr>
+            <w:tcW w:w="1724" w:type="dxa"/>
+          </w:tcPr>
+          <w:p>
+            <w:r>
+              <w:t>Enemies play attack animation when collision with player sprite</w:t>
+            </w:r>
+          </w:p>
+        </w:tc>
+        <w:tc>
+          <w:tcPr>
+            <w:tcW w:w="9246" w:type="dxa"/>
+          </w:tcPr>
+          <w:p>
+            <w:pPr>
+              <w:shd w:val="clear" w:color="auto" w:fill="1F1F1F"/>
+              <w:spacing w:line="285" w:lineRule="atLeast"/>
+              <w:rPr>
+                <w:rFonts w:ascii="Consolas" w:eastAsia="Times New Roman" w:hAnsi="Consolas" w:cs="Times New Roman"/>
+                <w:color w:val="CCCCCC"/>
+                <w:sz w:val="21"/>
+                <w:szCs w:val="21"/>
+                <w:lang w:eastAsia="en-NZ"/>
+              </w:rPr>
+            </w:pPr>
+          </w:p>
+        </w:tc>
+      </w:tr>
+      <w:tr>
+        <w:trPr>
+          <w:trHeight w:val="396"/>
+        </w:trPr>
+        <w:tc>
+          <w:tcPr>
+            <w:tcW w:w="761" w:type="dxa"/>
+          </w:tcPr>
+          <w:p>
+            <w:r>
+              <w:t>26/3</w:t>
+            </w:r>
+          </w:p>
+        </w:tc>
+        <w:tc>
+          <w:tcPr>
+            <w:tcW w:w="1358" w:type="dxa"/>
+          </w:tcPr>
+          <w:p>
+            <w:r>
+              <w:t>Enemy sprite collision</w:t>
+            </w:r>
+          </w:p>
+        </w:tc>
+        <w:tc>
+          <w:tcPr>
+            <w:tcW w:w="1419" w:type="dxa"/>
+          </w:tcPr>
+          <w:p>
+            <w:r>
+              <w:t>If player collides with enemy sprite the enemy plays attack animation</w:t>
+            </w:r>
+          </w:p>
+        </w:tc>
+        <w:tc>
+          <w:tcPr>
+            <w:tcW w:w="1724" w:type="dxa"/>
+          </w:tcPr>
+          <w:p>
+            <w:r>
+              <w:t>Animation doesn’t work for other enemy sprite</w:t>
             </w:r>
           </w:p>
         </w:tc>

</xml_diff>

<commit_message>
working on the player is hit
</commit_message>
<xml_diff>
--- a/documentation/ongoing_testing.docx
+++ b/documentation/ongoing_testing.docx
@@ -5,21 +5,27 @@
     <w:tbl>
       <w:tblPr>
         <w:tblStyle w:val="TableGrid"/>
-        <w:tblW w:w="14508" w:type="dxa"/>
+        <w:tblW w:w="14509" w:type="dxa"/>
         <w:tblInd w:w="-856" w:type="dxa"/>
         <w:tblLook w:val="04A0" w:firstRow="1" w:lastRow="0" w:firstColumn="1" w:lastColumn="0" w:noHBand="0" w:noVBand="1"/>
       </w:tblPr>
       <w:tblGrid>
-        <w:gridCol w:w="761"/>
+        <w:gridCol w:w="709"/>
+        <w:gridCol w:w="52"/>
         <w:gridCol w:w="1358"/>
         <w:gridCol w:w="1419"/>
-        <w:gridCol w:w="1724"/>
-        <w:gridCol w:w="9246"/>
+        <w:gridCol w:w="1613"/>
+        <w:gridCol w:w="374"/>
+        <w:gridCol w:w="721"/>
+        <w:gridCol w:w="1288"/>
+        <w:gridCol w:w="3360"/>
+        <w:gridCol w:w="3877"/>
       </w:tblGrid>
       <w:tr>
         <w:tc>
           <w:tcPr>
             <w:tcW w:w="761" w:type="dxa"/>
+            <w:gridSpan w:val="2"/>
           </w:tcPr>
           <w:p>
             <w:r>
@@ -39,7 +45,7 @@
         </w:tc>
         <w:tc>
           <w:tcPr>
-            <w:tcW w:w="1419" w:type="dxa"/>
+            <w:tcW w:w="575" w:type="dxa"/>
           </w:tcPr>
           <w:p>
             <w:r>
@@ -49,7 +55,8 @@
         </w:tc>
         <w:tc>
           <w:tcPr>
-            <w:tcW w:w="1724" w:type="dxa"/>
+            <w:tcW w:w="2569" w:type="dxa"/>
+            <w:gridSpan w:val="2"/>
           </w:tcPr>
           <w:p>
             <w:r>
@@ -60,6 +67,7 @@
         <w:tc>
           <w:tcPr>
             <w:tcW w:w="9246" w:type="dxa"/>
+            <w:gridSpan w:val="4"/>
           </w:tcPr>
           <w:p>
             <w:r>
@@ -72,6 +80,7 @@
         <w:tc>
           <w:tcPr>
             <w:tcW w:w="761" w:type="dxa"/>
+            <w:gridSpan w:val="2"/>
           </w:tcPr>
           <w:p>
             <w:r>
@@ -91,7 +100,7 @@
         </w:tc>
         <w:tc>
           <w:tcPr>
-            <w:tcW w:w="1419" w:type="dxa"/>
+            <w:tcW w:w="575" w:type="dxa"/>
           </w:tcPr>
           <w:p>
             <w:r>
@@ -101,22 +110,37 @@
         </w:tc>
         <w:tc>
           <w:tcPr>
-            <w:tcW w:w="1724" w:type="dxa"/>
-          </w:tcPr>
-          <w:p>
-            <w:r>
-              <w:t>Vs code complains about vstd compression</w:t>
+            <w:tcW w:w="2569" w:type="dxa"/>
+            <w:gridSpan w:val="2"/>
+          </w:tcPr>
+          <w:p>
+            <w:r>
+              <w:t xml:space="preserve">Vs code complains about </w:t>
+            </w:r>
+            <w:proofErr w:type="spellStart"/>
+            <w:r>
+              <w:t>vstd</w:t>
+            </w:r>
+            <w:proofErr w:type="spellEnd"/>
+            <w:r>
+              <w:t xml:space="preserve"> compression</w:t>
             </w:r>
           </w:p>
         </w:tc>
         <w:tc>
           <w:tcPr>
             <w:tcW w:w="9246" w:type="dxa"/>
-          </w:tcPr>
-          <w:p>
-            <w:r>
-              <w:t>Changed compression type to zlib</w:t>
-            </w:r>
+            <w:gridSpan w:val="4"/>
+          </w:tcPr>
+          <w:p>
+            <w:r>
+              <w:t xml:space="preserve">Changed compression type to </w:t>
+            </w:r>
+            <w:proofErr w:type="spellStart"/>
+            <w:r>
+              <w:t>zlib</w:t>
+            </w:r>
+            <w:proofErr w:type="spellEnd"/>
           </w:p>
         </w:tc>
       </w:tr>
@@ -124,6 +148,7 @@
         <w:tc>
           <w:tcPr>
             <w:tcW w:w="761" w:type="dxa"/>
+            <w:gridSpan w:val="2"/>
           </w:tcPr>
           <w:p>
             <w:r>
@@ -143,7 +168,7 @@
         </w:tc>
         <w:tc>
           <w:tcPr>
-            <w:tcW w:w="1419" w:type="dxa"/>
+            <w:tcW w:w="575" w:type="dxa"/>
           </w:tcPr>
           <w:p>
             <w:r>
@@ -153,7 +178,8 @@
         </w:tc>
         <w:tc>
           <w:tcPr>
-            <w:tcW w:w="1724" w:type="dxa"/>
+            <w:tcW w:w="2569" w:type="dxa"/>
+            <w:gridSpan w:val="2"/>
           </w:tcPr>
           <w:p>
             <w:r>
@@ -164,6 +190,7 @@
         <w:tc>
           <w:tcPr>
             <w:tcW w:w="9246" w:type="dxa"/>
+            <w:gridSpan w:val="4"/>
           </w:tcPr>
           <w:p>
             <w:r>
@@ -176,6 +203,7 @@
         <w:tc>
           <w:tcPr>
             <w:tcW w:w="761" w:type="dxa"/>
+            <w:gridSpan w:val="2"/>
           </w:tcPr>
           <w:p>
             <w:r>
@@ -195,7 +223,7 @@
         </w:tc>
         <w:tc>
           <w:tcPr>
-            <w:tcW w:w="1419" w:type="dxa"/>
+            <w:tcW w:w="575" w:type="dxa"/>
           </w:tcPr>
           <w:p>
             <w:r>
@@ -205,7 +233,8 @@
         </w:tc>
         <w:tc>
           <w:tcPr>
-            <w:tcW w:w="1724" w:type="dxa"/>
+            <w:tcW w:w="2569" w:type="dxa"/>
+            <w:gridSpan w:val="2"/>
           </w:tcPr>
           <w:p>
             <w:r>
@@ -216,6 +245,7 @@
         <w:tc>
           <w:tcPr>
             <w:tcW w:w="9246" w:type="dxa"/>
+            <w:gridSpan w:val="4"/>
           </w:tcPr>
           <w:p>
             <w:r>
@@ -228,6 +258,7 @@
         <w:tc>
           <w:tcPr>
             <w:tcW w:w="761" w:type="dxa"/>
+            <w:gridSpan w:val="2"/>
           </w:tcPr>
           <w:p>
             <w:r>
@@ -247,7 +278,7 @@
         </w:tc>
         <w:tc>
           <w:tcPr>
-            <w:tcW w:w="1419" w:type="dxa"/>
+            <w:tcW w:w="575" w:type="dxa"/>
           </w:tcPr>
           <w:p>
             <w:r>
@@ -257,7 +288,8 @@
         </w:tc>
         <w:tc>
           <w:tcPr>
-            <w:tcW w:w="1724" w:type="dxa"/>
+            <w:tcW w:w="2569" w:type="dxa"/>
+            <w:gridSpan w:val="2"/>
           </w:tcPr>
           <w:p>
             <w:r>
@@ -271,6 +303,7 @@
         <w:tc>
           <w:tcPr>
             <w:tcW w:w="9246" w:type="dxa"/>
+            <w:gridSpan w:val="4"/>
           </w:tcPr>
           <w:p/>
         </w:tc>
@@ -279,6 +312,7 @@
         <w:tc>
           <w:tcPr>
             <w:tcW w:w="761" w:type="dxa"/>
+            <w:gridSpan w:val="2"/>
           </w:tcPr>
           <w:p>
             <w:r>
@@ -298,7 +332,7 @@
         </w:tc>
         <w:tc>
           <w:tcPr>
-            <w:tcW w:w="1419" w:type="dxa"/>
+            <w:tcW w:w="575" w:type="dxa"/>
           </w:tcPr>
           <w:p>
             <w:r>
@@ -308,7 +342,8 @@
         </w:tc>
         <w:tc>
           <w:tcPr>
-            <w:tcW w:w="1724" w:type="dxa"/>
+            <w:tcW w:w="2569" w:type="dxa"/>
+            <w:gridSpan w:val="2"/>
           </w:tcPr>
           <w:p>
             <w:r>
@@ -319,6 +354,7 @@
         <w:tc>
           <w:tcPr>
             <w:tcW w:w="9246" w:type="dxa"/>
+            <w:gridSpan w:val="4"/>
           </w:tcPr>
           <w:p>
             <w:pPr>
@@ -341,6 +377,7 @@
                 <w:lang w:eastAsia="en-NZ"/>
               </w:rPr>
             </w:pPr>
+            <w:proofErr w:type="spellStart"/>
             <w:r>
               <w:rPr>
                 <w:rFonts w:ascii="Consolas" w:eastAsia="Times New Roman" w:hAnsi="Consolas" w:cs="Times New Roman"/>
@@ -371,6 +408,7 @@
               </w:rPr>
               <w:t>hit_box</w:t>
             </w:r>
+            <w:proofErr w:type="spellEnd"/>
             <w:r>
               <w:rPr>
                 <w:rFonts w:ascii="Consolas" w:eastAsia="Times New Roman" w:hAnsi="Consolas" w:cs="Times New Roman"/>
@@ -381,6 +419,7 @@
               </w:rPr>
               <w:t xml:space="preserve"> = </w:t>
             </w:r>
+            <w:proofErr w:type="spellStart"/>
             <w:r>
               <w:rPr>
                 <w:rFonts w:ascii="Consolas" w:eastAsia="Times New Roman" w:hAnsi="Consolas" w:cs="Times New Roman"/>
@@ -421,6 +460,7 @@
               </w:rPr>
               <w:t>.hit_box_points</w:t>
             </w:r>
+            <w:proofErr w:type="spellEnd"/>
           </w:p>
           <w:p/>
         </w:tc>
@@ -429,6 +469,7 @@
         <w:tc>
           <w:tcPr>
             <w:tcW w:w="761" w:type="dxa"/>
+            <w:gridSpan w:val="2"/>
           </w:tcPr>
           <w:p>
             <w:r>
@@ -448,7 +489,7 @@
         </w:tc>
         <w:tc>
           <w:tcPr>
-            <w:tcW w:w="1419" w:type="dxa"/>
+            <w:tcW w:w="575" w:type="dxa"/>
           </w:tcPr>
           <w:p>
             <w:r>
@@ -458,7 +499,8 @@
         </w:tc>
         <w:tc>
           <w:tcPr>
-            <w:tcW w:w="1724" w:type="dxa"/>
+            <w:tcW w:w="2569" w:type="dxa"/>
+            <w:gridSpan w:val="2"/>
           </w:tcPr>
           <w:p>
             <w:r>
@@ -469,6 +511,7 @@
         <w:tc>
           <w:tcPr>
             <w:tcW w:w="9246" w:type="dxa"/>
+            <w:gridSpan w:val="4"/>
           </w:tcPr>
           <w:p>
             <w:r>
@@ -510,6 +553,8 @@
               </w:rPr>
               <w:t xml:space="preserve">        </w:t>
             </w:r>
+            <w:proofErr w:type="spellStart"/>
+            <w:proofErr w:type="gramStart"/>
             <w:r>
               <w:rPr>
                 <w:rFonts w:ascii="Consolas" w:eastAsia="Times New Roman" w:hAnsi="Consolas" w:cs="Times New Roman"/>
@@ -538,8 +583,20 @@
                 <w:szCs w:val="21"/>
                 <w:lang w:eastAsia="en-NZ"/>
               </w:rPr>
-              <w:t>hitbox_texture</w:t>
-            </w:r>
+              <w:t>hitbox</w:t>
+            </w:r>
+            <w:proofErr w:type="gramEnd"/>
+            <w:r>
+              <w:rPr>
+                <w:rFonts w:ascii="Consolas" w:eastAsia="Times New Roman" w:hAnsi="Consolas" w:cs="Times New Roman"/>
+                <w:color w:val="9CDCFE"/>
+                <w:sz w:val="21"/>
+                <w:szCs w:val="21"/>
+                <w:lang w:eastAsia="en-NZ"/>
+              </w:rPr>
+              <w:t>_texture</w:t>
+            </w:r>
+            <w:proofErr w:type="spellEnd"/>
             <w:r>
               <w:rPr>
                 <w:rFonts w:ascii="Consolas" w:eastAsia="Times New Roman" w:hAnsi="Consolas" w:cs="Times New Roman"/>
@@ -550,6 +607,7 @@
               </w:rPr>
               <w:t xml:space="preserve"> = </w:t>
             </w:r>
+            <w:proofErr w:type="spellStart"/>
             <w:r>
               <w:rPr>
                 <w:rFonts w:ascii="Consolas" w:eastAsia="Times New Roman" w:hAnsi="Consolas" w:cs="Times New Roman"/>
@@ -580,6 +638,7 @@
               </w:rPr>
               <w:t>idle_texture_pair</w:t>
             </w:r>
+            <w:proofErr w:type="spellEnd"/>
             <w:r>
               <w:rPr>
                 <w:rFonts w:ascii="Consolas" w:eastAsia="Times New Roman" w:hAnsi="Consolas" w:cs="Times New Roman"/>
@@ -633,6 +692,7 @@
               </w:rPr>
               <w:t xml:space="preserve">        </w:t>
             </w:r>
+            <w:proofErr w:type="spellStart"/>
             <w:r>
               <w:rPr>
                 <w:rFonts w:ascii="Consolas" w:eastAsia="Times New Roman" w:hAnsi="Consolas" w:cs="Times New Roman"/>
@@ -663,6 +723,7 @@
               </w:rPr>
               <w:t>hit_box</w:t>
             </w:r>
+            <w:proofErr w:type="spellEnd"/>
             <w:r>
               <w:rPr>
                 <w:rFonts w:ascii="Consolas" w:eastAsia="Times New Roman" w:hAnsi="Consolas" w:cs="Times New Roman"/>
@@ -673,6 +734,7 @@
               </w:rPr>
               <w:t xml:space="preserve"> = </w:t>
             </w:r>
+            <w:proofErr w:type="spellStart"/>
             <w:r>
               <w:rPr>
                 <w:rFonts w:ascii="Consolas" w:eastAsia="Times New Roman" w:hAnsi="Consolas" w:cs="Times New Roman"/>
@@ -723,6 +785,7 @@
               </w:rPr>
               <w:t>hit_box_points</w:t>
             </w:r>
+            <w:proofErr w:type="spellEnd"/>
           </w:p>
           <w:p/>
         </w:tc>
@@ -731,6 +794,7 @@
         <w:tc>
           <w:tcPr>
             <w:tcW w:w="761" w:type="dxa"/>
+            <w:gridSpan w:val="2"/>
           </w:tcPr>
           <w:p>
             <w:r>
@@ -750,7 +814,7 @@
         </w:tc>
         <w:tc>
           <w:tcPr>
-            <w:tcW w:w="1419" w:type="dxa"/>
+            <w:tcW w:w="575" w:type="dxa"/>
           </w:tcPr>
           <w:p>
             <w:r>
@@ -760,7 +824,8 @@
         </w:tc>
         <w:tc>
           <w:tcPr>
-            <w:tcW w:w="1724" w:type="dxa"/>
+            <w:tcW w:w="2569" w:type="dxa"/>
+            <w:gridSpan w:val="2"/>
           </w:tcPr>
           <w:p>
             <w:r>
@@ -771,6 +836,7 @@
         <w:tc>
           <w:tcPr>
             <w:tcW w:w="9246" w:type="dxa"/>
+            <w:gridSpan w:val="4"/>
           </w:tcPr>
           <w:p>
             <w:r>
@@ -783,6 +849,7 @@
         <w:tc>
           <w:tcPr>
             <w:tcW w:w="761" w:type="dxa"/>
+            <w:gridSpan w:val="2"/>
           </w:tcPr>
           <w:p>
             <w:r>
@@ -802,7 +869,7 @@
         </w:tc>
         <w:tc>
           <w:tcPr>
-            <w:tcW w:w="1419" w:type="dxa"/>
+            <w:tcW w:w="575" w:type="dxa"/>
           </w:tcPr>
           <w:p>
             <w:r>
@@ -812,7 +879,8 @@
         </w:tc>
         <w:tc>
           <w:tcPr>
-            <w:tcW w:w="1724" w:type="dxa"/>
+            <w:tcW w:w="2569" w:type="dxa"/>
+            <w:gridSpan w:val="2"/>
           </w:tcPr>
           <w:p>
             <w:r>
@@ -823,6 +891,7 @@
         <w:tc>
           <w:tcPr>
             <w:tcW w:w="9246" w:type="dxa"/>
+            <w:gridSpan w:val="4"/>
           </w:tcPr>
           <w:p>
             <w:r>
@@ -835,6 +904,7 @@
         <w:tc>
           <w:tcPr>
             <w:tcW w:w="761" w:type="dxa"/>
+            <w:gridSpan w:val="2"/>
           </w:tcPr>
           <w:p>
             <w:r>
@@ -854,7 +924,7 @@
         </w:tc>
         <w:tc>
           <w:tcPr>
-            <w:tcW w:w="1419" w:type="dxa"/>
+            <w:tcW w:w="575" w:type="dxa"/>
           </w:tcPr>
           <w:p>
             <w:r>
@@ -864,7 +934,8 @@
         </w:tc>
         <w:tc>
           <w:tcPr>
-            <w:tcW w:w="1724" w:type="dxa"/>
+            <w:tcW w:w="2569" w:type="dxa"/>
+            <w:gridSpan w:val="2"/>
           </w:tcPr>
           <w:p>
             <w:r>
@@ -875,10 +946,19 @@
         <w:tc>
           <w:tcPr>
             <w:tcW w:w="9246" w:type="dxa"/>
-          </w:tcPr>
-          <w:p>
-            <w:r>
-              <w:t>Called function in on_update function</w:t>
+            <w:gridSpan w:val="4"/>
+          </w:tcPr>
+          <w:p>
+            <w:r>
+              <w:t xml:space="preserve">Called function in </w:t>
+            </w:r>
+            <w:proofErr w:type="spellStart"/>
+            <w:r>
+              <w:t>on_update</w:t>
+            </w:r>
+            <w:proofErr w:type="spellEnd"/>
+            <w:r>
+              <w:t xml:space="preserve"> function</w:t>
             </w:r>
           </w:p>
         </w:tc>
@@ -887,6 +967,7 @@
         <w:tc>
           <w:tcPr>
             <w:tcW w:w="761" w:type="dxa"/>
+            <w:gridSpan w:val="2"/>
           </w:tcPr>
           <w:p>
             <w:r>
@@ -906,25 +987,21 @@
         </w:tc>
         <w:tc>
           <w:tcPr>
-            <w:tcW w:w="1419" w:type="dxa"/>
-          </w:tcPr>
-          <w:p>
-            <w:r>
-              <w:t xml:space="preserve">Character flips horizontally </w:t>
-            </w:r>
-            <w:r>
-              <w:lastRenderedPageBreak/>
-              <w:t>depending on direction</w:t>
-            </w:r>
-          </w:p>
-        </w:tc>
-        <w:tc>
-          <w:tcPr>
-            <w:tcW w:w="1724" w:type="dxa"/>
-          </w:tcPr>
-          <w:p>
-            <w:r>
-              <w:lastRenderedPageBreak/>
+            <w:tcW w:w="575" w:type="dxa"/>
+          </w:tcPr>
+          <w:p>
+            <w:r>
+              <w:t>Character flips horizontally depending on direction</w:t>
+            </w:r>
+          </w:p>
+        </w:tc>
+        <w:tc>
+          <w:tcPr>
+            <w:tcW w:w="2569" w:type="dxa"/>
+            <w:gridSpan w:val="2"/>
+          </w:tcPr>
+          <w:p>
+            <w:r>
               <w:t>Character model changes direction</w:t>
             </w:r>
           </w:p>
@@ -932,6 +1009,7 @@
         <w:tc>
           <w:tcPr>
             <w:tcW w:w="9246" w:type="dxa"/>
+            <w:gridSpan w:val="4"/>
           </w:tcPr>
           <w:p>
             <w:r>
@@ -945,9 +1023,11 @@
         <w:tc>
           <w:tcPr>
             <w:tcW w:w="761" w:type="dxa"/>
-          </w:tcPr>
-          <w:p>
-            <w:r>
+            <w:gridSpan w:val="2"/>
+          </w:tcPr>
+          <w:p>
+            <w:r>
+              <w:lastRenderedPageBreak/>
               <w:t>18/0</w:t>
             </w:r>
             <w:r>
@@ -967,7 +1047,7 @@
         </w:tc>
         <w:tc>
           <w:tcPr>
-            <w:tcW w:w="1419" w:type="dxa"/>
+            <w:tcW w:w="575" w:type="dxa"/>
           </w:tcPr>
           <w:p>
             <w:r>
@@ -977,7 +1057,8 @@
         </w:tc>
         <w:tc>
           <w:tcPr>
-            <w:tcW w:w="1724" w:type="dxa"/>
+            <w:tcW w:w="2569" w:type="dxa"/>
+            <w:gridSpan w:val="2"/>
           </w:tcPr>
           <w:p>
             <w:r>
@@ -988,6 +1069,7 @@
         <w:tc>
           <w:tcPr>
             <w:tcW w:w="9246" w:type="dxa"/>
+            <w:gridSpan w:val="4"/>
           </w:tcPr>
           <w:p>
             <w:pPr>
@@ -1021,6 +1103,8 @@
               </w:rPr>
               <w:t xml:space="preserve"> </w:t>
             </w:r>
+            <w:proofErr w:type="spellStart"/>
+            <w:proofErr w:type="gramStart"/>
             <w:r>
               <w:rPr>
                 <w:rFonts w:ascii="Consolas" w:eastAsia="Times New Roman" w:hAnsi="Consolas" w:cs="Times New Roman"/>
@@ -1049,8 +1133,20 @@
                 <w:szCs w:val="21"/>
                 <w:lang w:eastAsia="en-NZ"/>
               </w:rPr>
-              <w:t>change_y</w:t>
-            </w:r>
+              <w:t>change</w:t>
+            </w:r>
+            <w:proofErr w:type="gramEnd"/>
+            <w:r>
+              <w:rPr>
+                <w:rFonts w:ascii="Consolas" w:eastAsia="Times New Roman" w:hAnsi="Consolas" w:cs="Times New Roman"/>
+                <w:color w:val="9CDCFE"/>
+                <w:sz w:val="21"/>
+                <w:szCs w:val="21"/>
+                <w:lang w:eastAsia="en-NZ"/>
+              </w:rPr>
+              <w:t>_y</w:t>
+            </w:r>
+            <w:proofErr w:type="spellEnd"/>
             <w:r>
               <w:rPr>
                 <w:rFonts w:ascii="Consolas" w:eastAsia="Times New Roman" w:hAnsi="Consolas" w:cs="Times New Roman"/>
@@ -1124,6 +1220,8 @@
               </w:rPr>
               <w:t xml:space="preserve">            </w:t>
             </w:r>
+            <w:proofErr w:type="spellStart"/>
+            <w:proofErr w:type="gramStart"/>
             <w:r>
               <w:rPr>
                 <w:rFonts w:ascii="Consolas" w:eastAsia="Times New Roman" w:hAnsi="Consolas" w:cs="Times New Roman"/>
@@ -1154,6 +1252,8 @@
               </w:rPr>
               <w:t>texture</w:t>
             </w:r>
+            <w:proofErr w:type="spellEnd"/>
+            <w:proofErr w:type="gramEnd"/>
             <w:r>
               <w:rPr>
                 <w:rFonts w:ascii="Consolas" w:eastAsia="Times New Roman" w:hAnsi="Consolas" w:cs="Times New Roman"/>
@@ -1184,6 +1284,7 @@
               </w:rPr>
               <w:t xml:space="preserve"> </w:t>
             </w:r>
+            <w:proofErr w:type="spellStart"/>
             <w:r>
               <w:rPr>
                 <w:rFonts w:ascii="Consolas" w:eastAsia="Times New Roman" w:hAnsi="Consolas" w:cs="Times New Roman"/>
@@ -1214,6 +1315,7 @@
               </w:rPr>
               <w:t>fall_textures</w:t>
             </w:r>
+            <w:proofErr w:type="spellEnd"/>
             <w:r>
               <w:rPr>
                 <w:rFonts w:ascii="Consolas" w:eastAsia="Times New Roman" w:hAnsi="Consolas" w:cs="Times New Roman"/>
@@ -1244,6 +1346,7 @@
               </w:rPr>
               <w:t>][</w:t>
             </w:r>
+            <w:proofErr w:type="spellStart"/>
             <w:r>
               <w:rPr>
                 <w:rFonts w:ascii="Consolas" w:eastAsia="Times New Roman" w:hAnsi="Consolas" w:cs="Times New Roman"/>
@@ -1274,6 +1377,7 @@
               </w:rPr>
               <w:t>character_face_direction</w:t>
             </w:r>
+            <w:proofErr w:type="spellEnd"/>
             <w:r>
               <w:rPr>
                 <w:rFonts w:ascii="Consolas" w:eastAsia="Times New Roman" w:hAnsi="Consolas" w:cs="Times New Roman"/>
@@ -1327,6 +1431,8 @@
               </w:rPr>
               <w:t xml:space="preserve"> </w:t>
             </w:r>
+            <w:proofErr w:type="spellStart"/>
+            <w:proofErr w:type="gramStart"/>
             <w:r>
               <w:rPr>
                 <w:rFonts w:ascii="Consolas" w:eastAsia="Times New Roman" w:hAnsi="Consolas" w:cs="Times New Roman"/>
@@ -1355,8 +1461,20 @@
                 <w:szCs w:val="21"/>
                 <w:lang w:eastAsia="en-NZ"/>
               </w:rPr>
-              <w:t>change_y</w:t>
-            </w:r>
+              <w:t>change</w:t>
+            </w:r>
+            <w:proofErr w:type="gramEnd"/>
+            <w:r>
+              <w:rPr>
+                <w:rFonts w:ascii="Consolas" w:eastAsia="Times New Roman" w:hAnsi="Consolas" w:cs="Times New Roman"/>
+                <w:color w:val="9CDCFE"/>
+                <w:sz w:val="21"/>
+                <w:szCs w:val="21"/>
+                <w:lang w:eastAsia="en-NZ"/>
+              </w:rPr>
+              <w:t>_y</w:t>
+            </w:r>
+            <w:proofErr w:type="spellEnd"/>
             <w:r>
               <w:rPr>
                 <w:rFonts w:ascii="Consolas" w:eastAsia="Times New Roman" w:hAnsi="Consolas" w:cs="Times New Roman"/>
@@ -1440,6 +1558,8 @@
               </w:rPr>
               <w:t xml:space="preserve">            </w:t>
             </w:r>
+            <w:proofErr w:type="spellStart"/>
+            <w:proofErr w:type="gramStart"/>
             <w:r>
               <w:rPr>
                 <w:rFonts w:ascii="Consolas" w:eastAsia="Times New Roman" w:hAnsi="Consolas" w:cs="Times New Roman"/>
@@ -1470,6 +1590,8 @@
               </w:rPr>
               <w:t>texture</w:t>
             </w:r>
+            <w:proofErr w:type="spellEnd"/>
+            <w:proofErr w:type="gramEnd"/>
             <w:r>
               <w:rPr>
                 <w:rFonts w:ascii="Consolas" w:eastAsia="Times New Roman" w:hAnsi="Consolas" w:cs="Times New Roman"/>
@@ -1500,6 +1622,7 @@
               </w:rPr>
               <w:t xml:space="preserve"> </w:t>
             </w:r>
+            <w:proofErr w:type="spellStart"/>
             <w:r>
               <w:rPr>
                 <w:rFonts w:ascii="Consolas" w:eastAsia="Times New Roman" w:hAnsi="Consolas" w:cs="Times New Roman"/>
@@ -1530,6 +1653,7 @@
               </w:rPr>
               <w:t>fall_textures</w:t>
             </w:r>
+            <w:proofErr w:type="spellEnd"/>
             <w:r>
               <w:rPr>
                 <w:rFonts w:ascii="Consolas" w:eastAsia="Times New Roman" w:hAnsi="Consolas" w:cs="Times New Roman"/>
@@ -1560,6 +1684,7 @@
               </w:rPr>
               <w:t>][</w:t>
             </w:r>
+            <w:proofErr w:type="spellStart"/>
             <w:r>
               <w:rPr>
                 <w:rFonts w:ascii="Consolas" w:eastAsia="Times New Roman" w:hAnsi="Consolas" w:cs="Times New Roman"/>
@@ -1590,6 +1715,7 @@
               </w:rPr>
               <w:t>character_face_direction</w:t>
             </w:r>
+            <w:proofErr w:type="spellEnd"/>
             <w:r>
               <w:rPr>
                 <w:rFonts w:ascii="Consolas" w:eastAsia="Times New Roman" w:hAnsi="Consolas" w:cs="Times New Roman"/>
@@ -1613,6 +1739,7 @@
         <w:tc>
           <w:tcPr>
             <w:tcW w:w="761" w:type="dxa"/>
+            <w:gridSpan w:val="2"/>
           </w:tcPr>
           <w:p>
             <w:r>
@@ -1635,7 +1762,7 @@
         </w:tc>
         <w:tc>
           <w:tcPr>
-            <w:tcW w:w="1419" w:type="dxa"/>
+            <w:tcW w:w="575" w:type="dxa"/>
           </w:tcPr>
           <w:p>
             <w:r>
@@ -1645,7 +1772,8 @@
         </w:tc>
         <w:tc>
           <w:tcPr>
-            <w:tcW w:w="1724" w:type="dxa"/>
+            <w:tcW w:w="2569" w:type="dxa"/>
+            <w:gridSpan w:val="2"/>
           </w:tcPr>
           <w:p>
             <w:r>
@@ -1656,6 +1784,7 @@
         <w:tc>
           <w:tcPr>
             <w:tcW w:w="9246" w:type="dxa"/>
+            <w:gridSpan w:val="4"/>
           </w:tcPr>
           <w:p>
             <w:pPr>
@@ -1676,6 +1805,7 @@
         <w:tc>
           <w:tcPr>
             <w:tcW w:w="761" w:type="dxa"/>
+            <w:gridSpan w:val="2"/>
           </w:tcPr>
           <w:p>
             <w:r>
@@ -1698,7 +1828,7 @@
         </w:tc>
         <w:tc>
           <w:tcPr>
-            <w:tcW w:w="1419" w:type="dxa"/>
+            <w:tcW w:w="575" w:type="dxa"/>
           </w:tcPr>
           <w:p>
             <w:r>
@@ -1708,7 +1838,8 @@
         </w:tc>
         <w:tc>
           <w:tcPr>
-            <w:tcW w:w="1724" w:type="dxa"/>
+            <w:tcW w:w="2569" w:type="dxa"/>
+            <w:gridSpan w:val="2"/>
           </w:tcPr>
           <w:p>
             <w:r>
@@ -1719,6 +1850,7 @@
         <w:tc>
           <w:tcPr>
             <w:tcW w:w="9246" w:type="dxa"/>
+            <w:gridSpan w:val="4"/>
           </w:tcPr>
           <w:p>
             <w:pPr>
@@ -1797,6 +1929,7 @@
         <w:tc>
           <w:tcPr>
             <w:tcW w:w="761" w:type="dxa"/>
+            <w:gridSpan w:val="2"/>
           </w:tcPr>
           <w:p>
             <w:r>
@@ -1822,7 +1955,7 @@
         </w:tc>
         <w:tc>
           <w:tcPr>
-            <w:tcW w:w="1419" w:type="dxa"/>
+            <w:tcW w:w="575" w:type="dxa"/>
           </w:tcPr>
           <w:p>
             <w:r>
@@ -1832,7 +1965,8 @@
         </w:tc>
         <w:tc>
           <w:tcPr>
-            <w:tcW w:w="1724" w:type="dxa"/>
+            <w:tcW w:w="2569" w:type="dxa"/>
+            <w:gridSpan w:val="2"/>
           </w:tcPr>
           <w:p>
             <w:r>
@@ -1843,6 +1977,7 @@
         <w:tc>
           <w:tcPr>
             <w:tcW w:w="9246" w:type="dxa"/>
+            <w:gridSpan w:val="4"/>
           </w:tcPr>
           <w:p>
             <w:pPr>
@@ -1876,6 +2011,7 @@
         <w:tc>
           <w:tcPr>
             <w:tcW w:w="761" w:type="dxa"/>
+            <w:gridSpan w:val="2"/>
           </w:tcPr>
           <w:p>
             <w:r>
@@ -1895,7 +2031,7 @@
         </w:tc>
         <w:tc>
           <w:tcPr>
-            <w:tcW w:w="1419" w:type="dxa"/>
+            <w:tcW w:w="575" w:type="dxa"/>
           </w:tcPr>
           <w:p>
             <w:r>
@@ -1905,7 +2041,8 @@
         </w:tc>
         <w:tc>
           <w:tcPr>
-            <w:tcW w:w="1724" w:type="dxa"/>
+            <w:tcW w:w="2569" w:type="dxa"/>
+            <w:gridSpan w:val="2"/>
           </w:tcPr>
           <w:p>
             <w:r>
@@ -1916,6 +2053,7 @@
         <w:tc>
           <w:tcPr>
             <w:tcW w:w="9246" w:type="dxa"/>
+            <w:gridSpan w:val="4"/>
           </w:tcPr>
           <w:p>
             <w:pPr>
@@ -1949,6 +2087,7 @@
         <w:tc>
           <w:tcPr>
             <w:tcW w:w="761" w:type="dxa"/>
+            <w:gridSpan w:val="2"/>
           </w:tcPr>
           <w:p>
             <w:r>
@@ -1968,7 +2107,7 @@
         </w:tc>
         <w:tc>
           <w:tcPr>
-            <w:tcW w:w="1419" w:type="dxa"/>
+            <w:tcW w:w="575" w:type="dxa"/>
           </w:tcPr>
           <w:p>
             <w:r>
@@ -1978,7 +2117,8 @@
         </w:tc>
         <w:tc>
           <w:tcPr>
-            <w:tcW w:w="1724" w:type="dxa"/>
+            <w:tcW w:w="2569" w:type="dxa"/>
+            <w:gridSpan w:val="2"/>
           </w:tcPr>
           <w:p>
             <w:r>
@@ -1989,6 +2129,7 @@
         <w:tc>
           <w:tcPr>
             <w:tcW w:w="9246" w:type="dxa"/>
+            <w:gridSpan w:val="4"/>
           </w:tcPr>
           <w:p>
             <w:pPr>
@@ -2022,6 +2163,7 @@
         <w:tc>
           <w:tcPr>
             <w:tcW w:w="761" w:type="dxa"/>
+            <w:gridSpan w:val="2"/>
           </w:tcPr>
           <w:p>
             <w:r>
@@ -2041,7 +2183,7 @@
         </w:tc>
         <w:tc>
           <w:tcPr>
-            <w:tcW w:w="1419" w:type="dxa"/>
+            <w:tcW w:w="575" w:type="dxa"/>
           </w:tcPr>
           <w:p>
             <w:r>
@@ -2051,7 +2193,8 @@
         </w:tc>
         <w:tc>
           <w:tcPr>
-            <w:tcW w:w="1724" w:type="dxa"/>
+            <w:tcW w:w="2569" w:type="dxa"/>
+            <w:gridSpan w:val="2"/>
           </w:tcPr>
           <w:p>
             <w:r>
@@ -2062,6 +2205,7 @@
         <w:tc>
           <w:tcPr>
             <w:tcW w:w="9246" w:type="dxa"/>
+            <w:gridSpan w:val="4"/>
           </w:tcPr>
           <w:p>
             <w:pPr>
@@ -2105,6 +2249,7 @@
         <w:tc>
           <w:tcPr>
             <w:tcW w:w="761" w:type="dxa"/>
+            <w:gridSpan w:val="2"/>
           </w:tcPr>
           <w:p>
             <w:r>
@@ -2124,7 +2269,7 @@
         </w:tc>
         <w:tc>
           <w:tcPr>
-            <w:tcW w:w="1419" w:type="dxa"/>
+            <w:tcW w:w="575" w:type="dxa"/>
           </w:tcPr>
           <w:p>
             <w:r>
@@ -2134,7 +2279,8 @@
         </w:tc>
         <w:tc>
           <w:tcPr>
-            <w:tcW w:w="1724" w:type="dxa"/>
+            <w:tcW w:w="2569" w:type="dxa"/>
+            <w:gridSpan w:val="2"/>
           </w:tcPr>
           <w:p>
             <w:r>
@@ -2153,6 +2299,7 @@
         <w:tc>
           <w:tcPr>
             <w:tcW w:w="9246" w:type="dxa"/>
+            <w:gridSpan w:val="4"/>
           </w:tcPr>
           <w:p>
             <w:pPr>
@@ -2186,6 +2333,7 @@
         <w:tc>
           <w:tcPr>
             <w:tcW w:w="761" w:type="dxa"/>
+            <w:gridSpan w:val="2"/>
           </w:tcPr>
           <w:p>
             <w:r>
@@ -2205,7 +2353,7 @@
         </w:tc>
         <w:tc>
           <w:tcPr>
-            <w:tcW w:w="1419" w:type="dxa"/>
+            <w:tcW w:w="575" w:type="dxa"/>
           </w:tcPr>
           <w:p>
             <w:r>
@@ -2215,7 +2363,8 @@
         </w:tc>
         <w:tc>
           <w:tcPr>
-            <w:tcW w:w="1724" w:type="dxa"/>
+            <w:tcW w:w="2569" w:type="dxa"/>
+            <w:gridSpan w:val="2"/>
           </w:tcPr>
           <w:p>
             <w:r>
@@ -2226,6 +2375,7 @@
         <w:tc>
           <w:tcPr>
             <w:tcW w:w="9246" w:type="dxa"/>
+            <w:gridSpan w:val="4"/>
           </w:tcPr>
           <w:p>
             <w:pPr>
@@ -2247,7 +2397,63 @@
                 <w:szCs w:val="21"/>
                 <w:lang w:eastAsia="en-NZ"/>
               </w:rPr>
-              <w:t>Changed code from self.change_x to self.center += x</w:t>
+              <w:t xml:space="preserve">Changed code from </w:t>
+            </w:r>
+            <w:proofErr w:type="spellStart"/>
+            <w:proofErr w:type="gramStart"/>
+            <w:r>
+              <w:rPr>
+                <w:rFonts w:ascii="Consolas" w:eastAsia="Times New Roman" w:hAnsi="Consolas" w:cs="Times New Roman"/>
+                <w:color w:val="CCCCCC"/>
+                <w:sz w:val="21"/>
+                <w:szCs w:val="21"/>
+                <w:lang w:eastAsia="en-NZ"/>
+              </w:rPr>
+              <w:t>self.change</w:t>
+            </w:r>
+            <w:proofErr w:type="gramEnd"/>
+            <w:r>
+              <w:rPr>
+                <w:rFonts w:ascii="Consolas" w:eastAsia="Times New Roman" w:hAnsi="Consolas" w:cs="Times New Roman"/>
+                <w:color w:val="CCCCCC"/>
+                <w:sz w:val="21"/>
+                <w:szCs w:val="21"/>
+                <w:lang w:eastAsia="en-NZ"/>
+              </w:rPr>
+              <w:t>_x</w:t>
+            </w:r>
+            <w:proofErr w:type="spellEnd"/>
+            <w:r>
+              <w:rPr>
+                <w:rFonts w:ascii="Consolas" w:eastAsia="Times New Roman" w:hAnsi="Consolas" w:cs="Times New Roman"/>
+                <w:color w:val="CCCCCC"/>
+                <w:sz w:val="21"/>
+                <w:szCs w:val="21"/>
+                <w:lang w:eastAsia="en-NZ"/>
+              </w:rPr>
+              <w:t xml:space="preserve"> to </w:t>
+            </w:r>
+            <w:proofErr w:type="spellStart"/>
+            <w:r>
+              <w:rPr>
+                <w:rFonts w:ascii="Consolas" w:eastAsia="Times New Roman" w:hAnsi="Consolas" w:cs="Times New Roman"/>
+                <w:color w:val="CCCCCC"/>
+                <w:sz w:val="21"/>
+                <w:szCs w:val="21"/>
+                <w:lang w:eastAsia="en-NZ"/>
+              </w:rPr>
+              <w:t>self.center</w:t>
+            </w:r>
+            <w:proofErr w:type="spellEnd"/>
+            <w:r>
+              <w:rPr>
+                <w:rFonts w:ascii="Consolas" w:eastAsia="Times New Roman" w:hAnsi="Consolas" w:cs="Times New Roman"/>
+                <w:color w:val="CCCCCC"/>
+                <w:sz w:val="21"/>
+                <w:szCs w:val="21"/>
+                <w:lang w:eastAsia="en-NZ"/>
+              </w:rPr>
+              <w:t xml:space="preserve"> += x</w:t>
             </w:r>
           </w:p>
         </w:tc>
@@ -2259,6 +2465,7 @@
         <w:tc>
           <w:tcPr>
             <w:tcW w:w="761" w:type="dxa"/>
+            <w:gridSpan w:val="2"/>
           </w:tcPr>
           <w:p>
             <w:r>
@@ -2278,32 +2485,34 @@
         </w:tc>
         <w:tc>
           <w:tcPr>
-            <w:tcW w:w="1419" w:type="dxa"/>
-          </w:tcPr>
-          <w:p>
-            <w:r>
-              <w:t xml:space="preserve">Enemy sprite moves in a </w:t>
-            </w:r>
-            <w:r>
-              <w:lastRenderedPageBreak/>
-              <w:t>random direction</w:t>
-            </w:r>
-          </w:p>
-        </w:tc>
-        <w:tc>
-          <w:tcPr>
-            <w:tcW w:w="1724" w:type="dxa"/>
-          </w:tcPr>
-          <w:p>
-            <w:r>
-              <w:lastRenderedPageBreak/>
-              <w:t>Enemy sprites moves</w:t>
-            </w:r>
+            <w:tcW w:w="575" w:type="dxa"/>
+          </w:tcPr>
+          <w:p>
+            <w:r>
+              <w:t>Enemy sprite moves in a random direction</w:t>
+            </w:r>
+          </w:p>
+        </w:tc>
+        <w:tc>
+          <w:tcPr>
+            <w:tcW w:w="2569" w:type="dxa"/>
+            <w:gridSpan w:val="2"/>
+          </w:tcPr>
+          <w:p>
+            <w:r>
+              <w:t xml:space="preserve">Enemy sprites </w:t>
+            </w:r>
+            <w:proofErr w:type="gramStart"/>
+            <w:r>
+              <w:t>moves</w:t>
+            </w:r>
+            <w:proofErr w:type="gramEnd"/>
           </w:p>
         </w:tc>
         <w:tc>
           <w:tcPr>
             <w:tcW w:w="9246" w:type="dxa"/>
+            <w:gridSpan w:val="4"/>
           </w:tcPr>
           <w:p>
             <w:pPr>
@@ -2337,9 +2546,11 @@
         <w:tc>
           <w:tcPr>
             <w:tcW w:w="761" w:type="dxa"/>
-          </w:tcPr>
-          <w:p>
-            <w:r>
+            <w:gridSpan w:val="2"/>
+          </w:tcPr>
+          <w:p>
+            <w:r>
+              <w:lastRenderedPageBreak/>
               <w:t>20/4</w:t>
             </w:r>
           </w:p>
@@ -2350,23 +2561,37 @@
           </w:tcPr>
           <w:p>
             <w:r>
-              <w:t>Enemy sprite movment</w:t>
-            </w:r>
-          </w:p>
-        </w:tc>
-        <w:tc>
-          <w:tcPr>
-            <w:tcW w:w="1419" w:type="dxa"/>
-          </w:tcPr>
-          <w:p>
-            <w:r>
-              <w:t xml:space="preserve">Enemy enemy sprites make small movements left and right and jump </w:t>
-            </w:r>
-          </w:p>
-        </w:tc>
-        <w:tc>
-          <w:tcPr>
-            <w:tcW w:w="1724" w:type="dxa"/>
+              <w:t xml:space="preserve">Enemy sprite </w:t>
+            </w:r>
+            <w:proofErr w:type="spellStart"/>
+            <w:r>
+              <w:t>movment</w:t>
+            </w:r>
+            <w:proofErr w:type="spellEnd"/>
+          </w:p>
+        </w:tc>
+        <w:tc>
+          <w:tcPr>
+            <w:tcW w:w="575" w:type="dxa"/>
+          </w:tcPr>
+          <w:p>
+            <w:r>
+              <w:t xml:space="preserve">Enemy </w:t>
+            </w:r>
+            <w:proofErr w:type="spellStart"/>
+            <w:r>
+              <w:t>enemy</w:t>
+            </w:r>
+            <w:proofErr w:type="spellEnd"/>
+            <w:r>
+              <w:t xml:space="preserve"> sprites make small movements left and right and jump </w:t>
+            </w:r>
+          </w:p>
+        </w:tc>
+        <w:tc>
+          <w:tcPr>
+            <w:tcW w:w="2569" w:type="dxa"/>
+            <w:gridSpan w:val="2"/>
           </w:tcPr>
           <w:p>
             <w:r>
@@ -2377,6 +2602,7 @@
         <w:tc>
           <w:tcPr>
             <w:tcW w:w="9246" w:type="dxa"/>
+            <w:gridSpan w:val="4"/>
           </w:tcPr>
           <w:p>
             <w:pPr>
@@ -2410,6 +2636,7 @@
         <w:tc>
           <w:tcPr>
             <w:tcW w:w="761" w:type="dxa"/>
+            <w:gridSpan w:val="2"/>
           </w:tcPr>
           <w:p>
             <w:r>
@@ -2429,7 +2656,7 @@
         </w:tc>
         <w:tc>
           <w:tcPr>
-            <w:tcW w:w="1419" w:type="dxa"/>
+            <w:tcW w:w="575" w:type="dxa"/>
           </w:tcPr>
           <w:p>
             <w:r>
@@ -2439,7 +2666,8 @@
         </w:tc>
         <w:tc>
           <w:tcPr>
-            <w:tcW w:w="1724" w:type="dxa"/>
+            <w:tcW w:w="2569" w:type="dxa"/>
+            <w:gridSpan w:val="2"/>
           </w:tcPr>
           <w:p>
             <w:r>
@@ -2450,6 +2678,7 @@
         <w:tc>
           <w:tcPr>
             <w:tcW w:w="9246" w:type="dxa"/>
+            <w:gridSpan w:val="4"/>
           </w:tcPr>
           <w:p>
             <w:pPr>
@@ -2483,6 +2712,7 @@
         <w:tc>
           <w:tcPr>
             <w:tcW w:w="761" w:type="dxa"/>
+            <w:gridSpan w:val="2"/>
           </w:tcPr>
           <w:p>
             <w:r>
@@ -2502,7 +2732,7 @@
         </w:tc>
         <w:tc>
           <w:tcPr>
-            <w:tcW w:w="1419" w:type="dxa"/>
+            <w:tcW w:w="575" w:type="dxa"/>
           </w:tcPr>
           <w:p>
             <w:r>
@@ -2512,7 +2742,8 @@
         </w:tc>
         <w:tc>
           <w:tcPr>
-            <w:tcW w:w="1724" w:type="dxa"/>
+            <w:tcW w:w="2569" w:type="dxa"/>
+            <w:gridSpan w:val="2"/>
           </w:tcPr>
           <w:p>
             <w:r>
@@ -2523,6 +2754,7 @@
         <w:tc>
           <w:tcPr>
             <w:tcW w:w="9246" w:type="dxa"/>
+            <w:gridSpan w:val="4"/>
           </w:tcPr>
           <w:p>
             <w:pPr>
@@ -2536,6 +2768,7 @@
                 <w:lang w:eastAsia="en-NZ"/>
               </w:rPr>
             </w:pPr>
+            <w:proofErr w:type="spellStart"/>
             <w:r>
               <w:rPr>
                 <w:rFonts w:ascii="Consolas" w:eastAsia="Times New Roman" w:hAnsi="Consolas" w:cs="Times New Roman"/>
@@ -2546,6 +2779,7 @@
               </w:rPr>
               <w:t>elif</w:t>
             </w:r>
+            <w:proofErr w:type="spellEnd"/>
             <w:r>
               <w:rPr>
                 <w:rFonts w:ascii="Consolas" w:eastAsia="Times New Roman" w:hAnsi="Consolas" w:cs="Times New Roman"/>
@@ -2556,6 +2790,8 @@
               </w:rPr>
               <w:t xml:space="preserve"> </w:t>
             </w:r>
+            <w:proofErr w:type="spellStart"/>
+            <w:proofErr w:type="gramStart"/>
             <w:r>
               <w:rPr>
                 <w:rFonts w:ascii="Consolas" w:eastAsia="Times New Roman" w:hAnsi="Consolas" w:cs="Times New Roman"/>
@@ -2586,6 +2822,8 @@
               </w:rPr>
               <w:t>direction</w:t>
             </w:r>
+            <w:proofErr w:type="spellEnd"/>
+            <w:proofErr w:type="gramEnd"/>
             <w:r>
               <w:rPr>
                 <w:rFonts w:ascii="Consolas" w:eastAsia="Times New Roman" w:hAnsi="Consolas" w:cs="Times New Roman"/>
@@ -2659,6 +2897,8 @@
               </w:rPr>
               <w:t xml:space="preserve">            </w:t>
             </w:r>
+            <w:proofErr w:type="spellStart"/>
+            <w:proofErr w:type="gramStart"/>
             <w:r>
               <w:rPr>
                 <w:rFonts w:ascii="Consolas" w:eastAsia="Times New Roman" w:hAnsi="Consolas" w:cs="Times New Roman"/>
@@ -2687,8 +2927,20 @@
                 <w:szCs w:val="21"/>
                 <w:lang w:eastAsia="en-NZ"/>
               </w:rPr>
-              <w:t>change_x</w:t>
-            </w:r>
+              <w:t>change</w:t>
+            </w:r>
+            <w:proofErr w:type="gramEnd"/>
+            <w:r>
+              <w:rPr>
+                <w:rFonts w:ascii="Consolas" w:eastAsia="Times New Roman" w:hAnsi="Consolas" w:cs="Times New Roman"/>
+                <w:color w:val="9CDCFE"/>
+                <w:sz w:val="21"/>
+                <w:szCs w:val="21"/>
+                <w:lang w:eastAsia="en-NZ"/>
+              </w:rPr>
+              <w:t>_x</w:t>
+            </w:r>
+            <w:proofErr w:type="spellEnd"/>
             <w:r>
               <w:rPr>
                 <w:rFonts w:ascii="Consolas" w:eastAsia="Times New Roman" w:hAnsi="Consolas" w:cs="Times New Roman"/>
@@ -2732,6 +2984,7 @@
         <w:tc>
           <w:tcPr>
             <w:tcW w:w="761" w:type="dxa"/>
+            <w:gridSpan w:val="2"/>
           </w:tcPr>
           <w:p>
             <w:r>
@@ -2751,7 +3004,7 @@
         </w:tc>
         <w:tc>
           <w:tcPr>
-            <w:tcW w:w="1419" w:type="dxa"/>
+            <w:tcW w:w="575" w:type="dxa"/>
           </w:tcPr>
           <w:p>
             <w:r>
@@ -2761,7 +3014,8 @@
         </w:tc>
         <w:tc>
           <w:tcPr>
-            <w:tcW w:w="1724" w:type="dxa"/>
+            <w:tcW w:w="2569" w:type="dxa"/>
+            <w:gridSpan w:val="2"/>
           </w:tcPr>
           <w:p>
             <w:r>
@@ -2772,6 +3026,7 @@
         <w:tc>
           <w:tcPr>
             <w:tcW w:w="9246" w:type="dxa"/>
+            <w:gridSpan w:val="4"/>
           </w:tcPr>
           <w:p>
             <w:pPr>
@@ -2815,6 +3070,7 @@
         <w:tc>
           <w:tcPr>
             <w:tcW w:w="761" w:type="dxa"/>
+            <w:gridSpan w:val="2"/>
           </w:tcPr>
           <w:p>
             <w:r>
@@ -2840,7 +3096,7 @@
         </w:tc>
         <w:tc>
           <w:tcPr>
-            <w:tcW w:w="1419" w:type="dxa"/>
+            <w:tcW w:w="575" w:type="dxa"/>
           </w:tcPr>
           <w:p>
             <w:r>
@@ -2850,7 +3106,8 @@
         </w:tc>
         <w:tc>
           <w:tcPr>
-            <w:tcW w:w="1724" w:type="dxa"/>
+            <w:tcW w:w="2569" w:type="dxa"/>
+            <w:gridSpan w:val="2"/>
           </w:tcPr>
           <w:p>
             <w:r>
@@ -2861,6 +3118,7 @@
         <w:tc>
           <w:tcPr>
             <w:tcW w:w="9246" w:type="dxa"/>
+            <w:gridSpan w:val="4"/>
           </w:tcPr>
           <w:p>
             <w:pPr>
@@ -2874,6 +3132,7 @@
                 <w:lang w:eastAsia="en-NZ"/>
               </w:rPr>
             </w:pPr>
+            <w:proofErr w:type="gramStart"/>
             <w:r>
               <w:rPr>
                 <w:rFonts w:ascii="Consolas" w:eastAsia="Times New Roman" w:hAnsi="Consolas" w:cs="Times New Roman"/>
@@ -2882,7 +3141,62 @@
                 <w:szCs w:val="21"/>
                 <w:lang w:eastAsia="en-NZ"/>
               </w:rPr>
-              <w:t>Changed .change_x -= 3 to  .change_x = -3</w:t>
+              <w:t>Changed .</w:t>
+            </w:r>
+            <w:proofErr w:type="spellStart"/>
+            <w:r>
+              <w:rPr>
+                <w:rFonts w:ascii="Consolas" w:eastAsia="Times New Roman" w:hAnsi="Consolas" w:cs="Times New Roman"/>
+                <w:color w:val="C586C0"/>
+                <w:sz w:val="21"/>
+                <w:szCs w:val="21"/>
+                <w:lang w:eastAsia="en-NZ"/>
+              </w:rPr>
+              <w:t>change</w:t>
+            </w:r>
+            <w:proofErr w:type="gramEnd"/>
+            <w:r>
+              <w:rPr>
+                <w:rFonts w:ascii="Consolas" w:eastAsia="Times New Roman" w:hAnsi="Consolas" w:cs="Times New Roman"/>
+                <w:color w:val="C586C0"/>
+                <w:sz w:val="21"/>
+                <w:szCs w:val="21"/>
+                <w:lang w:eastAsia="en-NZ"/>
+              </w:rPr>
+              <w:t>_x</w:t>
+            </w:r>
+            <w:proofErr w:type="spellEnd"/>
+            <w:r>
+              <w:rPr>
+                <w:rFonts w:ascii="Consolas" w:eastAsia="Times New Roman" w:hAnsi="Consolas" w:cs="Times New Roman"/>
+                <w:color w:val="C586C0"/>
+                <w:sz w:val="21"/>
+                <w:szCs w:val="21"/>
+                <w:lang w:eastAsia="en-NZ"/>
+              </w:rPr>
+              <w:t xml:space="preserve"> -= 3 to  .</w:t>
+            </w:r>
+            <w:proofErr w:type="spellStart"/>
+            <w:r>
+              <w:rPr>
+                <w:rFonts w:ascii="Consolas" w:eastAsia="Times New Roman" w:hAnsi="Consolas" w:cs="Times New Roman"/>
+                <w:color w:val="C586C0"/>
+                <w:sz w:val="21"/>
+                <w:szCs w:val="21"/>
+                <w:lang w:eastAsia="en-NZ"/>
+              </w:rPr>
+              <w:t>change_x</w:t>
+            </w:r>
+            <w:proofErr w:type="spellEnd"/>
+            <w:r>
+              <w:rPr>
+                <w:rFonts w:ascii="Consolas" w:eastAsia="Times New Roman" w:hAnsi="Consolas" w:cs="Times New Roman"/>
+                <w:color w:val="C586C0"/>
+                <w:sz w:val="21"/>
+                <w:szCs w:val="21"/>
+                <w:lang w:eastAsia="en-NZ"/>
+              </w:rPr>
+              <w:t xml:space="preserve"> = -3</w:t>
             </w:r>
           </w:p>
         </w:tc>
@@ -2894,6 +3208,7 @@
         <w:tc>
           <w:tcPr>
             <w:tcW w:w="761" w:type="dxa"/>
+            <w:gridSpan w:val="2"/>
           </w:tcPr>
           <w:p>
             <w:r>
@@ -2913,7 +3228,7 @@
         </w:tc>
         <w:tc>
           <w:tcPr>
-            <w:tcW w:w="1419" w:type="dxa"/>
+            <w:tcW w:w="575" w:type="dxa"/>
           </w:tcPr>
           <w:p>
             <w:r>
@@ -2923,7 +3238,8 @@
         </w:tc>
         <w:tc>
           <w:tcPr>
-            <w:tcW w:w="1724" w:type="dxa"/>
+            <w:tcW w:w="2569" w:type="dxa"/>
+            <w:gridSpan w:val="2"/>
           </w:tcPr>
           <w:p>
             <w:r>
@@ -2934,6 +3250,7 @@
         <w:tc>
           <w:tcPr>
             <w:tcW w:w="9246" w:type="dxa"/>
+            <w:gridSpan w:val="4"/>
           </w:tcPr>
           <w:p>
             <w:pPr>
@@ -2967,6 +3284,7 @@
         <w:tc>
           <w:tcPr>
             <w:tcW w:w="761" w:type="dxa"/>
+            <w:gridSpan w:val="2"/>
           </w:tcPr>
           <w:p>
             <w:r>
@@ -2986,7 +3304,7 @@
         </w:tc>
         <w:tc>
           <w:tcPr>
-            <w:tcW w:w="1419" w:type="dxa"/>
+            <w:tcW w:w="575" w:type="dxa"/>
           </w:tcPr>
           <w:p>
             <w:r>
@@ -2996,7 +3314,8 @@
         </w:tc>
         <w:tc>
           <w:tcPr>
-            <w:tcW w:w="1724" w:type="dxa"/>
+            <w:tcW w:w="2569" w:type="dxa"/>
+            <w:gridSpan w:val="2"/>
           </w:tcPr>
           <w:p>
             <w:r>
@@ -3007,6 +3326,7 @@
         <w:tc>
           <w:tcPr>
             <w:tcW w:w="9246" w:type="dxa"/>
+            <w:gridSpan w:val="4"/>
           </w:tcPr>
           <w:p>
             <w:pPr>
@@ -3040,6 +3360,7 @@
         <w:tc>
           <w:tcPr>
             <w:tcW w:w="761" w:type="dxa"/>
+            <w:gridSpan w:val="2"/>
           </w:tcPr>
           <w:p>
             <w:r>
@@ -3059,7 +3380,7 @@
         </w:tc>
         <w:tc>
           <w:tcPr>
-            <w:tcW w:w="1419" w:type="dxa"/>
+            <w:tcW w:w="575" w:type="dxa"/>
           </w:tcPr>
           <w:p>
             <w:r>
@@ -3069,7 +3390,8 @@
         </w:tc>
         <w:tc>
           <w:tcPr>
-            <w:tcW w:w="1724" w:type="dxa"/>
+            <w:tcW w:w="2569" w:type="dxa"/>
+            <w:gridSpan w:val="2"/>
           </w:tcPr>
           <w:p>
             <w:r>
@@ -3080,6 +3402,7 @@
         <w:tc>
           <w:tcPr>
             <w:tcW w:w="9246" w:type="dxa"/>
+            <w:gridSpan w:val="4"/>
           </w:tcPr>
           <w:p>
             <w:pPr>
@@ -3103,6 +3426,7 @@
               </w:rPr>
               <w:t> </w:t>
             </w:r>
+            <w:proofErr w:type="spellStart"/>
             <w:r>
               <w:rPr>
                 <w:rFonts w:ascii="Consolas" w:eastAsia="Times New Roman" w:hAnsi="Consolas" w:cs="Times New Roman"/>
@@ -3113,6 +3437,7 @@
               </w:rPr>
               <w:t>elif</w:t>
             </w:r>
+            <w:proofErr w:type="spellEnd"/>
             <w:r>
               <w:rPr>
                 <w:rFonts w:ascii="Consolas" w:eastAsia="Times New Roman" w:hAnsi="Consolas" w:cs="Times New Roman"/>
@@ -3163,6 +3488,8 @@
               </w:rPr>
               <w:t xml:space="preserve"> </w:t>
             </w:r>
+            <w:proofErr w:type="spellStart"/>
+            <w:proofErr w:type="gramStart"/>
             <w:r>
               <w:rPr>
                 <w:rFonts w:ascii="Consolas" w:eastAsia="Times New Roman" w:hAnsi="Consolas" w:cs="Times New Roman"/>
@@ -3213,6 +3540,8 @@
               </w:rPr>
               <w:t>SPACE</w:t>
             </w:r>
+            <w:proofErr w:type="spellEnd"/>
+            <w:proofErr w:type="gramEnd"/>
             <w:r>
               <w:rPr>
                 <w:rFonts w:ascii="Consolas" w:eastAsia="Times New Roman" w:hAnsi="Consolas" w:cs="Times New Roman"/>
@@ -3246,6 +3575,8 @@
               </w:rPr>
               <w:t>   </w:t>
             </w:r>
+            <w:proofErr w:type="spellStart"/>
+            <w:proofErr w:type="gramStart"/>
             <w:r>
               <w:rPr>
                 <w:rFonts w:ascii="Consolas" w:eastAsia="Times New Roman" w:hAnsi="Consolas" w:cs="Times New Roman"/>
@@ -3274,7 +3605,18 @@
                 <w:szCs w:val="21"/>
                 <w:lang w:eastAsia="en-NZ"/>
               </w:rPr>
-              <w:t>enemy_sprite</w:t>
+              <w:t>enemy</w:t>
+            </w:r>
+            <w:proofErr w:type="gramEnd"/>
+            <w:r>
+              <w:rPr>
+                <w:rFonts w:ascii="Consolas" w:eastAsia="Times New Roman" w:hAnsi="Consolas" w:cs="Times New Roman"/>
+                <w:color w:val="9CDCFE"/>
+                <w:sz w:val="21"/>
+                <w:szCs w:val="21"/>
+                <w:lang w:eastAsia="en-NZ"/>
+              </w:rPr>
+              <w:t>_sprite</w:t>
             </w:r>
             <w:r>
               <w:rPr>
@@ -3296,6 +3638,7 @@
               </w:rPr>
               <w:t>attack</w:t>
             </w:r>
+            <w:proofErr w:type="spellEnd"/>
             <w:r>
               <w:rPr>
                 <w:rFonts w:ascii="Consolas" w:eastAsia="Times New Roman" w:hAnsi="Consolas" w:cs="Times New Roman"/>
@@ -3359,6 +3702,7 @@
         <w:tc>
           <w:tcPr>
             <w:tcW w:w="761" w:type="dxa"/>
+            <w:gridSpan w:val="2"/>
           </w:tcPr>
           <w:p>
             <w:r>
@@ -3378,36 +3722,29 @@
         </w:tc>
         <w:tc>
           <w:tcPr>
-            <w:tcW w:w="1419" w:type="dxa"/>
-          </w:tcPr>
-          <w:p>
-            <w:r>
-              <w:t xml:space="preserve">Sprites play animation when space </w:t>
-            </w:r>
-            <w:r>
-              <w:lastRenderedPageBreak/>
-              <w:t xml:space="preserve">bar is pressed </w:t>
-            </w:r>
-          </w:p>
-        </w:tc>
-        <w:tc>
-          <w:tcPr>
-            <w:tcW w:w="1724" w:type="dxa"/>
-          </w:tcPr>
-          <w:p>
-            <w:r>
-              <w:lastRenderedPageBreak/>
-              <w:t xml:space="preserve">Animation plays too quickly and </w:t>
-            </w:r>
-            <w:r>
-              <w:lastRenderedPageBreak/>
-              <w:t>doesn’t reset to idle animation</w:t>
+            <w:tcW w:w="575" w:type="dxa"/>
+          </w:tcPr>
+          <w:p>
+            <w:r>
+              <w:t xml:space="preserve">Sprites play animation when space bar is pressed </w:t>
+            </w:r>
+          </w:p>
+        </w:tc>
+        <w:tc>
+          <w:tcPr>
+            <w:tcW w:w="2569" w:type="dxa"/>
+            <w:gridSpan w:val="2"/>
+          </w:tcPr>
+          <w:p>
+            <w:r>
+              <w:t>Animation plays too quickly and doesn’t reset to idle animation</w:t>
             </w:r>
           </w:p>
         </w:tc>
         <w:tc>
           <w:tcPr>
             <w:tcW w:w="9246" w:type="dxa"/>
+            <w:gridSpan w:val="4"/>
           </w:tcPr>
           <w:p>
             <w:pPr>
@@ -3429,8 +3766,31 @@
                 <w:szCs w:val="21"/>
                 <w:lang w:eastAsia="en-NZ"/>
               </w:rPr>
-              <w:lastRenderedPageBreak/>
-              <w:t>Added time.sleep(1)</w:t>
+              <w:t xml:space="preserve">Added </w:t>
+            </w:r>
+            <w:proofErr w:type="spellStart"/>
+            <w:proofErr w:type="gramStart"/>
+            <w:r>
+              <w:rPr>
+                <w:rFonts w:ascii="Consolas" w:eastAsia="Times New Roman" w:hAnsi="Consolas" w:cs="Times New Roman"/>
+                <w:color w:val="CCCCCC"/>
+                <w:sz w:val="21"/>
+                <w:szCs w:val="21"/>
+                <w:lang w:eastAsia="en-NZ"/>
+              </w:rPr>
+              <w:t>time.sleep</w:t>
+            </w:r>
+            <w:proofErr w:type="spellEnd"/>
+            <w:proofErr w:type="gramEnd"/>
+            <w:r>
+              <w:rPr>
+                <w:rFonts w:ascii="Consolas" w:eastAsia="Times New Roman" w:hAnsi="Consolas" w:cs="Times New Roman"/>
+                <w:color w:val="CCCCCC"/>
+                <w:sz w:val="21"/>
+                <w:szCs w:val="21"/>
+                <w:lang w:eastAsia="en-NZ"/>
+              </w:rPr>
+              <w:t>(1)</w:t>
             </w:r>
           </w:p>
         </w:tc>
@@ -3442,9 +3802,11 @@
         <w:tc>
           <w:tcPr>
             <w:tcW w:w="761" w:type="dxa"/>
-          </w:tcPr>
-          <w:p>
-            <w:r>
+            <w:gridSpan w:val="2"/>
+          </w:tcPr>
+          <w:p>
+            <w:r>
+              <w:lastRenderedPageBreak/>
               <w:t>22/4</w:t>
             </w:r>
           </w:p>
@@ -3461,7 +3823,7 @@
         </w:tc>
         <w:tc>
           <w:tcPr>
-            <w:tcW w:w="1419" w:type="dxa"/>
+            <w:tcW w:w="575" w:type="dxa"/>
           </w:tcPr>
           <w:p>
             <w:r>
@@ -3471,7 +3833,8 @@
         </w:tc>
         <w:tc>
           <w:tcPr>
-            <w:tcW w:w="1724" w:type="dxa"/>
+            <w:tcW w:w="2569" w:type="dxa"/>
+            <w:gridSpan w:val="2"/>
           </w:tcPr>
           <w:p>
             <w:r>
@@ -3482,6 +3845,7 @@
         <w:tc>
           <w:tcPr>
             <w:tcW w:w="9246" w:type="dxa"/>
+            <w:gridSpan w:val="4"/>
           </w:tcPr>
           <w:p>
             <w:pPr>
@@ -3557,6 +3921,7 @@
         <w:tc>
           <w:tcPr>
             <w:tcW w:w="761" w:type="dxa"/>
+            <w:gridSpan w:val="2"/>
           </w:tcPr>
           <w:p>
             <w:r>
@@ -3576,7 +3941,7 @@
         </w:tc>
         <w:tc>
           <w:tcPr>
-            <w:tcW w:w="1419" w:type="dxa"/>
+            <w:tcW w:w="575" w:type="dxa"/>
           </w:tcPr>
           <w:p>
             <w:r>
@@ -3586,7 +3951,8 @@
         </w:tc>
         <w:tc>
           <w:tcPr>
-            <w:tcW w:w="1724" w:type="dxa"/>
+            <w:tcW w:w="2569" w:type="dxa"/>
+            <w:gridSpan w:val="2"/>
           </w:tcPr>
           <w:p>
             <w:r>
@@ -3597,6 +3963,7 @@
         <w:tc>
           <w:tcPr>
             <w:tcW w:w="9246" w:type="dxa"/>
+            <w:gridSpan w:val="4"/>
           </w:tcPr>
           <w:p>
             <w:pPr>
@@ -3618,7 +3985,51 @@
                 <w:szCs w:val="21"/>
                 <w:lang w:eastAsia="en-NZ"/>
               </w:rPr>
-              <w:t>Reset self.cur_texture when self attack == “attack</w:t>
+              <w:t xml:space="preserve">Reset </w:t>
+            </w:r>
+            <w:proofErr w:type="spellStart"/>
+            <w:r>
+              <w:rPr>
+                <w:rFonts w:ascii="Consolas" w:eastAsia="Times New Roman" w:hAnsi="Consolas" w:cs="Times New Roman"/>
+                <w:color w:val="CCCCCC"/>
+                <w:sz w:val="21"/>
+                <w:szCs w:val="21"/>
+                <w:lang w:eastAsia="en-NZ"/>
+              </w:rPr>
+              <w:t>self.cur_texture</w:t>
+            </w:r>
+            <w:proofErr w:type="spellEnd"/>
+            <w:r>
+              <w:rPr>
+                <w:rFonts w:ascii="Consolas" w:eastAsia="Times New Roman" w:hAnsi="Consolas" w:cs="Times New Roman"/>
+                <w:color w:val="CCCCCC"/>
+                <w:sz w:val="21"/>
+                <w:szCs w:val="21"/>
+                <w:lang w:eastAsia="en-NZ"/>
+              </w:rPr>
+              <w:t xml:space="preserve"> when </w:t>
+            </w:r>
+            <w:proofErr w:type="spellStart"/>
+            <w:r>
+              <w:rPr>
+                <w:rFonts w:ascii="Consolas" w:eastAsia="Times New Roman" w:hAnsi="Consolas" w:cs="Times New Roman"/>
+                <w:color w:val="CCCCCC"/>
+                <w:sz w:val="21"/>
+                <w:szCs w:val="21"/>
+                <w:lang w:eastAsia="en-NZ"/>
+              </w:rPr>
+              <w:t>self attack</w:t>
+            </w:r>
+            <w:proofErr w:type="spellEnd"/>
+            <w:r>
+              <w:rPr>
+                <w:rFonts w:ascii="Consolas" w:eastAsia="Times New Roman" w:hAnsi="Consolas" w:cs="Times New Roman"/>
+                <w:color w:val="CCCCCC"/>
+                <w:sz w:val="21"/>
+                <w:szCs w:val="21"/>
+                <w:lang w:eastAsia="en-NZ"/>
+              </w:rPr>
+              <w:t xml:space="preserve"> == “attack</w:t>
             </w:r>
           </w:p>
         </w:tc>
@@ -3630,6 +4041,7 @@
         <w:tc>
           <w:tcPr>
             <w:tcW w:w="761" w:type="dxa"/>
+            <w:gridSpan w:val="2"/>
           </w:tcPr>
           <w:p>
             <w:r>
@@ -3652,7 +4064,7 @@
         </w:tc>
         <w:tc>
           <w:tcPr>
-            <w:tcW w:w="1419" w:type="dxa"/>
+            <w:tcW w:w="575" w:type="dxa"/>
           </w:tcPr>
           <w:p>
             <w:r>
@@ -3662,17 +4074,24 @@
         </w:tc>
         <w:tc>
           <w:tcPr>
-            <w:tcW w:w="1724" w:type="dxa"/>
-          </w:tcPr>
-          <w:p>
-            <w:r>
-              <w:t>Self.cur_texture is not being updated</w:t>
+            <w:tcW w:w="2569" w:type="dxa"/>
+            <w:gridSpan w:val="2"/>
+          </w:tcPr>
+          <w:p>
+            <w:proofErr w:type="spellStart"/>
+            <w:r>
+              <w:t>Self.cur_texture</w:t>
+            </w:r>
+            <w:proofErr w:type="spellEnd"/>
+            <w:r>
+              <w:t xml:space="preserve"> is not being updated</w:t>
             </w:r>
           </w:p>
         </w:tc>
         <w:tc>
           <w:tcPr>
             <w:tcW w:w="9246" w:type="dxa"/>
+            <w:gridSpan w:val="4"/>
           </w:tcPr>
           <w:p>
             <w:pPr>
@@ -3741,6 +4160,7 @@
         <w:tc>
           <w:tcPr>
             <w:tcW w:w="761" w:type="dxa"/>
+            <w:gridSpan w:val="2"/>
           </w:tcPr>
           <w:p>
             <w:r>
@@ -3763,7 +4183,7 @@
         </w:tc>
         <w:tc>
           <w:tcPr>
-            <w:tcW w:w="1419" w:type="dxa"/>
+            <w:tcW w:w="575" w:type="dxa"/>
           </w:tcPr>
           <w:p>
             <w:r>
@@ -3773,7 +4193,8 @@
         </w:tc>
         <w:tc>
           <w:tcPr>
-            <w:tcW w:w="1724" w:type="dxa"/>
+            <w:tcW w:w="2569" w:type="dxa"/>
+            <w:gridSpan w:val="2"/>
           </w:tcPr>
           <w:p>
             <w:r>
@@ -3784,6 +4205,7 @@
         <w:tc>
           <w:tcPr>
             <w:tcW w:w="9246" w:type="dxa"/>
+            <w:gridSpan w:val="4"/>
           </w:tcPr>
           <w:p>
             <w:pPr>
@@ -3817,6 +4239,7 @@
         <w:tc>
           <w:tcPr>
             <w:tcW w:w="761" w:type="dxa"/>
+            <w:gridSpan w:val="2"/>
           </w:tcPr>
           <w:p>
             <w:r>
@@ -3839,7 +4262,7 @@
         </w:tc>
         <w:tc>
           <w:tcPr>
-            <w:tcW w:w="1419" w:type="dxa"/>
+            <w:tcW w:w="575" w:type="dxa"/>
           </w:tcPr>
           <w:p>
             <w:r>
@@ -3849,7 +4272,8 @@
         </w:tc>
         <w:tc>
           <w:tcPr>
-            <w:tcW w:w="1724" w:type="dxa"/>
+            <w:tcW w:w="2569" w:type="dxa"/>
+            <w:gridSpan w:val="2"/>
           </w:tcPr>
           <w:p>
             <w:r>
@@ -3860,6 +4284,7 @@
         <w:tc>
           <w:tcPr>
             <w:tcW w:w="9246" w:type="dxa"/>
+            <w:gridSpan w:val="4"/>
           </w:tcPr>
           <w:p>
             <w:pPr>
@@ -3893,6 +4318,7 @@
         <w:tc>
           <w:tcPr>
             <w:tcW w:w="761" w:type="dxa"/>
+            <w:gridSpan w:val="2"/>
           </w:tcPr>
           <w:p>
             <w:r>
@@ -3915,7 +4341,7 @@
         </w:tc>
         <w:tc>
           <w:tcPr>
-            <w:tcW w:w="1419" w:type="dxa"/>
+            <w:tcW w:w="575" w:type="dxa"/>
           </w:tcPr>
           <w:p>
             <w:r>
@@ -3925,7 +4351,8 @@
         </w:tc>
         <w:tc>
           <w:tcPr>
-            <w:tcW w:w="1724" w:type="dxa"/>
+            <w:tcW w:w="2569" w:type="dxa"/>
+            <w:gridSpan w:val="2"/>
           </w:tcPr>
           <w:p>
             <w:r>
@@ -3936,6 +4363,7 @@
         <w:tc>
           <w:tcPr>
             <w:tcW w:w="9246" w:type="dxa"/>
+            <w:gridSpan w:val="4"/>
           </w:tcPr>
           <w:p>
             <w:pPr>
@@ -3957,7 +4385,75 @@
                 <w:szCs w:val="21"/>
                 <w:lang w:eastAsia="en-NZ"/>
               </w:rPr>
-              <w:t>Removed the code from on key_release that stops the animation code from running and made self.attack = “” when the animation hd played.</w:t>
+              <w:t xml:space="preserve">Removed the code from on </w:t>
+            </w:r>
+            <w:proofErr w:type="spellStart"/>
+            <w:r>
+              <w:rPr>
+                <w:rFonts w:ascii="Consolas" w:eastAsia="Times New Roman" w:hAnsi="Consolas" w:cs="Times New Roman"/>
+                <w:color w:val="CCCCCC"/>
+                <w:sz w:val="21"/>
+                <w:szCs w:val="21"/>
+                <w:lang w:eastAsia="en-NZ"/>
+              </w:rPr>
+              <w:t>key_release</w:t>
+            </w:r>
+            <w:proofErr w:type="spellEnd"/>
+            <w:r>
+              <w:rPr>
+                <w:rFonts w:ascii="Consolas" w:eastAsia="Times New Roman" w:hAnsi="Consolas" w:cs="Times New Roman"/>
+                <w:color w:val="CCCCCC"/>
+                <w:sz w:val="21"/>
+                <w:szCs w:val="21"/>
+                <w:lang w:eastAsia="en-NZ"/>
+              </w:rPr>
+              <w:t xml:space="preserve"> that stops the animation code from running and made </w:t>
+            </w:r>
+            <w:proofErr w:type="spellStart"/>
+            <w:proofErr w:type="gramStart"/>
+            <w:r>
+              <w:rPr>
+                <w:rFonts w:ascii="Consolas" w:eastAsia="Times New Roman" w:hAnsi="Consolas" w:cs="Times New Roman"/>
+                <w:color w:val="CCCCCC"/>
+                <w:sz w:val="21"/>
+                <w:szCs w:val="21"/>
+                <w:lang w:eastAsia="en-NZ"/>
+              </w:rPr>
+              <w:t>self.attack</w:t>
+            </w:r>
+            <w:proofErr w:type="spellEnd"/>
+            <w:proofErr w:type="gramEnd"/>
+            <w:r>
+              <w:rPr>
+                <w:rFonts w:ascii="Consolas" w:eastAsia="Times New Roman" w:hAnsi="Consolas" w:cs="Times New Roman"/>
+                <w:color w:val="CCCCCC"/>
+                <w:sz w:val="21"/>
+                <w:szCs w:val="21"/>
+                <w:lang w:eastAsia="en-NZ"/>
+              </w:rPr>
+              <w:t xml:space="preserve"> = “” when the animation </w:t>
+            </w:r>
+            <w:proofErr w:type="spellStart"/>
+            <w:r>
+              <w:rPr>
+                <w:rFonts w:ascii="Consolas" w:eastAsia="Times New Roman" w:hAnsi="Consolas" w:cs="Times New Roman"/>
+                <w:color w:val="CCCCCC"/>
+                <w:sz w:val="21"/>
+                <w:szCs w:val="21"/>
+                <w:lang w:eastAsia="en-NZ"/>
+              </w:rPr>
+              <w:t>hd</w:t>
+            </w:r>
+            <w:proofErr w:type="spellEnd"/>
+            <w:r>
+              <w:rPr>
+                <w:rFonts w:ascii="Consolas" w:eastAsia="Times New Roman" w:hAnsi="Consolas" w:cs="Times New Roman"/>
+                <w:color w:val="CCCCCC"/>
+                <w:sz w:val="21"/>
+                <w:szCs w:val="21"/>
+                <w:lang w:eastAsia="en-NZ"/>
+              </w:rPr>
+              <w:t xml:space="preserve"> played.</w:t>
             </w:r>
           </w:p>
         </w:tc>
@@ -3969,6 +4465,7 @@
         <w:tc>
           <w:tcPr>
             <w:tcW w:w="761" w:type="dxa"/>
+            <w:gridSpan w:val="2"/>
           </w:tcPr>
           <w:p>
             <w:r>
@@ -3991,7 +4488,7 @@
         </w:tc>
         <w:tc>
           <w:tcPr>
-            <w:tcW w:w="1419" w:type="dxa"/>
+            <w:tcW w:w="575" w:type="dxa"/>
           </w:tcPr>
           <w:p>
             <w:r>
@@ -4001,7 +4498,8 @@
         </w:tc>
         <w:tc>
           <w:tcPr>
-            <w:tcW w:w="1724" w:type="dxa"/>
+            <w:tcW w:w="2569" w:type="dxa"/>
+            <w:gridSpan w:val="2"/>
           </w:tcPr>
           <w:p>
             <w:r>
@@ -4012,6 +4510,7 @@
         <w:tc>
           <w:tcPr>
             <w:tcW w:w="9246" w:type="dxa"/>
+            <w:gridSpan w:val="4"/>
           </w:tcPr>
           <w:p>
             <w:pPr>
@@ -4080,6 +4579,7 @@
         <w:tc>
           <w:tcPr>
             <w:tcW w:w="761" w:type="dxa"/>
+            <w:gridSpan w:val="2"/>
           </w:tcPr>
           <w:p>
             <w:r>
@@ -4103,7 +4603,7 @@
         </w:tc>
         <w:tc>
           <w:tcPr>
-            <w:tcW w:w="1419" w:type="dxa"/>
+            <w:tcW w:w="575" w:type="dxa"/>
           </w:tcPr>
           <w:p>
             <w:r>
@@ -4113,7 +4613,8 @@
         </w:tc>
         <w:tc>
           <w:tcPr>
-            <w:tcW w:w="1724" w:type="dxa"/>
+            <w:tcW w:w="2569" w:type="dxa"/>
+            <w:gridSpan w:val="2"/>
           </w:tcPr>
           <w:p>
             <w:r>
@@ -4124,6 +4625,7 @@
         <w:tc>
           <w:tcPr>
             <w:tcW w:w="9246" w:type="dxa"/>
+            <w:gridSpan w:val="4"/>
           </w:tcPr>
           <w:p>
             <w:pPr>
@@ -4192,6 +4694,7 @@
         <w:tc>
           <w:tcPr>
             <w:tcW w:w="761" w:type="dxa"/>
+            <w:gridSpan w:val="2"/>
           </w:tcPr>
           <w:p>
             <w:r>
@@ -4214,7 +4717,7 @@
         </w:tc>
         <w:tc>
           <w:tcPr>
-            <w:tcW w:w="1419" w:type="dxa"/>
+            <w:tcW w:w="575" w:type="dxa"/>
           </w:tcPr>
           <w:p>
             <w:r>
@@ -4224,7 +4727,8 @@
         </w:tc>
         <w:tc>
           <w:tcPr>
-            <w:tcW w:w="1724" w:type="dxa"/>
+            <w:tcW w:w="2569" w:type="dxa"/>
+            <w:gridSpan w:val="2"/>
           </w:tcPr>
           <w:p>
             <w:r>
@@ -4235,6 +4739,7 @@
         <w:tc>
           <w:tcPr>
             <w:tcW w:w="9246" w:type="dxa"/>
+            <w:gridSpan w:val="4"/>
           </w:tcPr>
           <w:p>
             <w:pPr>
@@ -4256,8 +4761,20 @@
                 <w:szCs w:val="21"/>
                 <w:lang w:eastAsia="en-NZ"/>
               </w:rPr>
-              <w:t>Attack animation repeats when the sprites move</w:t>
-            </w:r>
+              <w:t xml:space="preserve">Attack animation repeats when the sprites </w:t>
+            </w:r>
+            <w:proofErr w:type="gramStart"/>
+            <w:r>
+              <w:rPr>
+                <w:rFonts w:ascii="Consolas" w:eastAsia="Times New Roman" w:hAnsi="Consolas" w:cs="Times New Roman"/>
+                <w:color w:val="CCCCCC"/>
+                <w:sz w:val="21"/>
+                <w:szCs w:val="21"/>
+                <w:lang w:eastAsia="en-NZ"/>
+              </w:rPr>
+              <w:t>move</w:t>
+            </w:r>
+            <w:proofErr w:type="gramEnd"/>
           </w:p>
           <w:p>
             <w:pPr>
@@ -4271,15 +4788,27 @@
                 <w:lang w:eastAsia="en-NZ"/>
               </w:rPr>
             </w:pPr>
-            <w:r>
-              <w:rPr>
-                <w:rFonts w:ascii="Consolas" w:eastAsia="Times New Roman" w:hAnsi="Consolas" w:cs="Times New Roman"/>
-                <w:color w:val="CCCCCC"/>
-                <w:sz w:val="21"/>
-                <w:szCs w:val="21"/>
-                <w:lang w:eastAsia="en-NZ"/>
-              </w:rPr>
-              <w:t>So I stopped the enemy sprite movement when attack</w:t>
+            <w:proofErr w:type="gramStart"/>
+            <w:r>
+              <w:rPr>
+                <w:rFonts w:ascii="Consolas" w:eastAsia="Times New Roman" w:hAnsi="Consolas" w:cs="Times New Roman"/>
+                <w:color w:val="CCCCCC"/>
+                <w:sz w:val="21"/>
+                <w:szCs w:val="21"/>
+                <w:lang w:eastAsia="en-NZ"/>
+              </w:rPr>
+              <w:t>So</w:t>
+            </w:r>
+            <w:proofErr w:type="gramEnd"/>
+            <w:r>
+              <w:rPr>
+                <w:rFonts w:ascii="Consolas" w:eastAsia="Times New Roman" w:hAnsi="Consolas" w:cs="Times New Roman"/>
+                <w:color w:val="CCCCCC"/>
+                <w:sz w:val="21"/>
+                <w:szCs w:val="21"/>
+                <w:lang w:eastAsia="en-NZ"/>
+              </w:rPr>
+              <w:t xml:space="preserve"> I stopped the enemy sprite movement when attack</w:t>
             </w:r>
           </w:p>
           <w:p>
@@ -4314,6 +4843,7 @@
         <w:tc>
           <w:tcPr>
             <w:tcW w:w="761" w:type="dxa"/>
+            <w:gridSpan w:val="2"/>
           </w:tcPr>
           <w:p>
             <w:r>
@@ -4336,7 +4866,7 @@
         </w:tc>
         <w:tc>
           <w:tcPr>
-            <w:tcW w:w="1419" w:type="dxa"/>
+            <w:tcW w:w="575" w:type="dxa"/>
           </w:tcPr>
           <w:p>
             <w:r>
@@ -4346,7 +4876,8 @@
         </w:tc>
         <w:tc>
           <w:tcPr>
-            <w:tcW w:w="1724" w:type="dxa"/>
+            <w:tcW w:w="2569" w:type="dxa"/>
+            <w:gridSpan w:val="2"/>
           </w:tcPr>
           <w:p>
             <w:r>
@@ -4357,6 +4888,7 @@
         <w:tc>
           <w:tcPr>
             <w:tcW w:w="9246" w:type="dxa"/>
+            <w:gridSpan w:val="4"/>
           </w:tcPr>
           <w:p>
             <w:pPr>
@@ -4390,6 +4922,7 @@
         <w:tc>
           <w:tcPr>
             <w:tcW w:w="761" w:type="dxa"/>
+            <w:gridSpan w:val="2"/>
           </w:tcPr>
           <w:p>
             <w:r>
@@ -4409,7 +4942,7 @@
         </w:tc>
         <w:tc>
           <w:tcPr>
-            <w:tcW w:w="1419" w:type="dxa"/>
+            <w:tcW w:w="575" w:type="dxa"/>
           </w:tcPr>
           <w:p>
             <w:r>
@@ -4419,7 +4952,8 @@
         </w:tc>
         <w:tc>
           <w:tcPr>
-            <w:tcW w:w="1724" w:type="dxa"/>
+            <w:tcW w:w="2569" w:type="dxa"/>
+            <w:gridSpan w:val="2"/>
           </w:tcPr>
           <w:p>
             <w:r>
@@ -4430,6 +4964,7 @@
         <w:tc>
           <w:tcPr>
             <w:tcW w:w="9246" w:type="dxa"/>
+            <w:gridSpan w:val="4"/>
           </w:tcPr>
           <w:p>
             <w:pPr>
@@ -4453,6 +4988,7 @@
         <w:tc>
           <w:tcPr>
             <w:tcW w:w="761" w:type="dxa"/>
+            <w:gridSpan w:val="2"/>
           </w:tcPr>
           <w:p>
             <w:r>
@@ -4472,7 +5008,7 @@
         </w:tc>
         <w:tc>
           <w:tcPr>
-            <w:tcW w:w="1419" w:type="dxa"/>
+            <w:tcW w:w="575" w:type="dxa"/>
           </w:tcPr>
           <w:p>
             <w:r>
@@ -4482,17 +5018,27 @@
         </w:tc>
         <w:tc>
           <w:tcPr>
-            <w:tcW w:w="1724" w:type="dxa"/>
-          </w:tcPr>
-          <w:p>
-            <w:r>
-              <w:t>Animation doesn’t work for other enemy sprite</w:t>
+            <w:tcW w:w="2569" w:type="dxa"/>
+            <w:gridSpan w:val="2"/>
+          </w:tcPr>
+          <w:p>
+            <w:r>
+              <w:t xml:space="preserve">Animation doesn’t work for </w:t>
+            </w:r>
+            <w:proofErr w:type="gramStart"/>
+            <w:r>
+              <w:t>other</w:t>
+            </w:r>
+            <w:proofErr w:type="gramEnd"/>
+            <w:r>
+              <w:t xml:space="preserve"> enemy sprite</w:t>
             </w:r>
           </w:p>
         </w:tc>
         <w:tc>
           <w:tcPr>
             <w:tcW w:w="9246" w:type="dxa"/>
+            <w:gridSpan w:val="4"/>
           </w:tcPr>
           <w:p>
             <w:pPr>
@@ -4507,6 +5053,385 @@
               </w:rPr>
             </w:pPr>
           </w:p>
+        </w:tc>
+      </w:tr>
+      <w:tr>
+        <w:trPr>
+          <w:gridAfter w:val="1"/>
+          <w:wAfter w:w="3877" w:type="dxa"/>
+        </w:trPr>
+        <w:tc>
+          <w:tcPr>
+            <w:tcW w:w="709" w:type="dxa"/>
+          </w:tcPr>
+          <w:p>
+            <w:r>
+              <w:t xml:space="preserve">Date </w:t>
+            </w:r>
+          </w:p>
+        </w:tc>
+        <w:tc>
+          <w:tcPr>
+            <w:tcW w:w="1985" w:type="dxa"/>
+            <w:gridSpan w:val="3"/>
+          </w:tcPr>
+          <w:p>
+            <w:r>
+              <w:t>What is being tested</w:t>
+            </w:r>
+          </w:p>
+        </w:tc>
+        <w:tc>
+          <w:tcPr>
+            <w:tcW w:w="2002" w:type="dxa"/>
+          </w:tcPr>
+          <w:p>
+            <w:r>
+              <w:t>Type of test</w:t>
+            </w:r>
+          </w:p>
+        </w:tc>
+        <w:tc>
+          <w:tcPr>
+            <w:tcW w:w="1288" w:type="dxa"/>
+            <w:gridSpan w:val="2"/>
+          </w:tcPr>
+          <w:p>
+            <w:r>
+              <w:t xml:space="preserve">What is expected </w:t>
+            </w:r>
+          </w:p>
+        </w:tc>
+        <w:tc>
+          <w:tcPr>
+            <w:tcW w:w="1288" w:type="dxa"/>
+          </w:tcPr>
+          <w:p>
+            <w:r>
+              <w:t xml:space="preserve">What </w:t>
+            </w:r>
+            <w:r>
+              <w:t>happened</w:t>
+            </w:r>
+          </w:p>
+        </w:tc>
+        <w:tc>
+          <w:tcPr>
+            <w:tcW w:w="3360" w:type="dxa"/>
+          </w:tcPr>
+          <w:p>
+            <w:r>
+              <w:t>Changes made</w:t>
+            </w:r>
+          </w:p>
+        </w:tc>
+      </w:tr>
+      <w:tr>
+        <w:trPr>
+          <w:gridAfter w:val="1"/>
+          <w:wAfter w:w="3877" w:type="dxa"/>
+        </w:trPr>
+        <w:tc>
+          <w:tcPr>
+            <w:tcW w:w="709" w:type="dxa"/>
+          </w:tcPr>
+          <w:p/>
+        </w:tc>
+        <w:tc>
+          <w:tcPr>
+            <w:tcW w:w="1985" w:type="dxa"/>
+            <w:gridSpan w:val="3"/>
+          </w:tcPr>
+          <w:p/>
+        </w:tc>
+        <w:tc>
+          <w:tcPr>
+            <w:tcW w:w="2002" w:type="dxa"/>
+          </w:tcPr>
+          <w:p/>
+        </w:tc>
+        <w:tc>
+          <w:tcPr>
+            <w:tcW w:w="1288" w:type="dxa"/>
+            <w:gridSpan w:val="2"/>
+          </w:tcPr>
+          <w:p/>
+        </w:tc>
+        <w:tc>
+          <w:tcPr>
+            <w:tcW w:w="1288" w:type="dxa"/>
+          </w:tcPr>
+          <w:p/>
+        </w:tc>
+        <w:tc>
+          <w:tcPr>
+            <w:tcW w:w="3360" w:type="dxa"/>
+          </w:tcPr>
+          <w:p/>
+        </w:tc>
+      </w:tr>
+      <w:tr>
+        <w:trPr>
+          <w:gridAfter w:val="1"/>
+          <w:wAfter w:w="3877" w:type="dxa"/>
+        </w:trPr>
+        <w:tc>
+          <w:tcPr>
+            <w:tcW w:w="709" w:type="dxa"/>
+          </w:tcPr>
+          <w:p/>
+        </w:tc>
+        <w:tc>
+          <w:tcPr>
+            <w:tcW w:w="1985" w:type="dxa"/>
+            <w:gridSpan w:val="3"/>
+          </w:tcPr>
+          <w:p/>
+        </w:tc>
+        <w:tc>
+          <w:tcPr>
+            <w:tcW w:w="2002" w:type="dxa"/>
+          </w:tcPr>
+          <w:p/>
+        </w:tc>
+        <w:tc>
+          <w:tcPr>
+            <w:tcW w:w="1288" w:type="dxa"/>
+            <w:gridSpan w:val="2"/>
+          </w:tcPr>
+          <w:p/>
+        </w:tc>
+        <w:tc>
+          <w:tcPr>
+            <w:tcW w:w="1288" w:type="dxa"/>
+          </w:tcPr>
+          <w:p/>
+        </w:tc>
+        <w:tc>
+          <w:tcPr>
+            <w:tcW w:w="3360" w:type="dxa"/>
+          </w:tcPr>
+          <w:p/>
+        </w:tc>
+      </w:tr>
+      <w:tr>
+        <w:trPr>
+          <w:gridAfter w:val="1"/>
+          <w:wAfter w:w="3877" w:type="dxa"/>
+        </w:trPr>
+        <w:tc>
+          <w:tcPr>
+            <w:tcW w:w="709" w:type="dxa"/>
+          </w:tcPr>
+          <w:p/>
+        </w:tc>
+        <w:tc>
+          <w:tcPr>
+            <w:tcW w:w="1985" w:type="dxa"/>
+            <w:gridSpan w:val="3"/>
+          </w:tcPr>
+          <w:p/>
+        </w:tc>
+        <w:tc>
+          <w:tcPr>
+            <w:tcW w:w="2002" w:type="dxa"/>
+          </w:tcPr>
+          <w:p/>
+        </w:tc>
+        <w:tc>
+          <w:tcPr>
+            <w:tcW w:w="1288" w:type="dxa"/>
+            <w:gridSpan w:val="2"/>
+          </w:tcPr>
+          <w:p/>
+        </w:tc>
+        <w:tc>
+          <w:tcPr>
+            <w:tcW w:w="1288" w:type="dxa"/>
+          </w:tcPr>
+          <w:p/>
+        </w:tc>
+        <w:tc>
+          <w:tcPr>
+            <w:tcW w:w="3360" w:type="dxa"/>
+          </w:tcPr>
+          <w:p/>
+        </w:tc>
+      </w:tr>
+      <w:tr>
+        <w:trPr>
+          <w:gridAfter w:val="1"/>
+          <w:wAfter w:w="3877" w:type="dxa"/>
+        </w:trPr>
+        <w:tc>
+          <w:tcPr>
+            <w:tcW w:w="709" w:type="dxa"/>
+          </w:tcPr>
+          <w:p/>
+        </w:tc>
+        <w:tc>
+          <w:tcPr>
+            <w:tcW w:w="1985" w:type="dxa"/>
+            <w:gridSpan w:val="3"/>
+          </w:tcPr>
+          <w:p/>
+        </w:tc>
+        <w:tc>
+          <w:tcPr>
+            <w:tcW w:w="2002" w:type="dxa"/>
+          </w:tcPr>
+          <w:p/>
+        </w:tc>
+        <w:tc>
+          <w:tcPr>
+            <w:tcW w:w="1288" w:type="dxa"/>
+            <w:gridSpan w:val="2"/>
+          </w:tcPr>
+          <w:p/>
+        </w:tc>
+        <w:tc>
+          <w:tcPr>
+            <w:tcW w:w="1288" w:type="dxa"/>
+          </w:tcPr>
+          <w:p/>
+        </w:tc>
+        <w:tc>
+          <w:tcPr>
+            <w:tcW w:w="3360" w:type="dxa"/>
+          </w:tcPr>
+          <w:p/>
+        </w:tc>
+      </w:tr>
+      <w:tr>
+        <w:trPr>
+          <w:gridAfter w:val="1"/>
+          <w:wAfter w:w="3877" w:type="dxa"/>
+        </w:trPr>
+        <w:tc>
+          <w:tcPr>
+            <w:tcW w:w="709" w:type="dxa"/>
+          </w:tcPr>
+          <w:p/>
+        </w:tc>
+        <w:tc>
+          <w:tcPr>
+            <w:tcW w:w="1985" w:type="dxa"/>
+            <w:gridSpan w:val="3"/>
+          </w:tcPr>
+          <w:p/>
+        </w:tc>
+        <w:tc>
+          <w:tcPr>
+            <w:tcW w:w="2002" w:type="dxa"/>
+          </w:tcPr>
+          <w:p/>
+        </w:tc>
+        <w:tc>
+          <w:tcPr>
+            <w:tcW w:w="1288" w:type="dxa"/>
+            <w:gridSpan w:val="2"/>
+          </w:tcPr>
+          <w:p/>
+        </w:tc>
+        <w:tc>
+          <w:tcPr>
+            <w:tcW w:w="1288" w:type="dxa"/>
+          </w:tcPr>
+          <w:p/>
+        </w:tc>
+        <w:tc>
+          <w:tcPr>
+            <w:tcW w:w="3360" w:type="dxa"/>
+          </w:tcPr>
+          <w:p/>
+        </w:tc>
+      </w:tr>
+      <w:tr>
+        <w:trPr>
+          <w:gridAfter w:val="1"/>
+          <w:wAfter w:w="3877" w:type="dxa"/>
+        </w:trPr>
+        <w:tc>
+          <w:tcPr>
+            <w:tcW w:w="709" w:type="dxa"/>
+          </w:tcPr>
+          <w:p/>
+        </w:tc>
+        <w:tc>
+          <w:tcPr>
+            <w:tcW w:w="1985" w:type="dxa"/>
+            <w:gridSpan w:val="3"/>
+          </w:tcPr>
+          <w:p/>
+        </w:tc>
+        <w:tc>
+          <w:tcPr>
+            <w:tcW w:w="2002" w:type="dxa"/>
+          </w:tcPr>
+          <w:p/>
+        </w:tc>
+        <w:tc>
+          <w:tcPr>
+            <w:tcW w:w="1288" w:type="dxa"/>
+            <w:gridSpan w:val="2"/>
+          </w:tcPr>
+          <w:p/>
+        </w:tc>
+        <w:tc>
+          <w:tcPr>
+            <w:tcW w:w="1288" w:type="dxa"/>
+          </w:tcPr>
+          <w:p/>
+        </w:tc>
+        <w:tc>
+          <w:tcPr>
+            <w:tcW w:w="3360" w:type="dxa"/>
+          </w:tcPr>
+          <w:p/>
+        </w:tc>
+      </w:tr>
+      <w:tr>
+        <w:trPr>
+          <w:gridAfter w:val="1"/>
+          <w:wAfter w:w="3877" w:type="dxa"/>
+        </w:trPr>
+        <w:tc>
+          <w:tcPr>
+            <w:tcW w:w="709" w:type="dxa"/>
+          </w:tcPr>
+          <w:p/>
+        </w:tc>
+        <w:tc>
+          <w:tcPr>
+            <w:tcW w:w="1985" w:type="dxa"/>
+            <w:gridSpan w:val="3"/>
+          </w:tcPr>
+          <w:p/>
+        </w:tc>
+        <w:tc>
+          <w:tcPr>
+            <w:tcW w:w="2002" w:type="dxa"/>
+          </w:tcPr>
+          <w:p/>
+        </w:tc>
+        <w:tc>
+          <w:tcPr>
+            <w:tcW w:w="1288" w:type="dxa"/>
+            <w:gridSpan w:val="2"/>
+          </w:tcPr>
+          <w:p/>
+        </w:tc>
+        <w:tc>
+          <w:tcPr>
+            <w:tcW w:w="1288" w:type="dxa"/>
+          </w:tcPr>
+          <w:p/>
+        </w:tc>
+        <w:tc>
+          <w:tcPr>
+            <w:tcW w:w="3360" w:type="dxa"/>
+          </w:tcPr>
+          <w:p/>
         </w:tc>
       </w:tr>
     </w:tbl>

</xml_diff>

<commit_message>
can't get check if hit to work
</commit_message>
<xml_diff>
--- a/documentation/ongoing_testing.docx
+++ b/documentation/ongoing_testing.docx
@@ -5,7 +5,7 @@
     <w:tbl>
       <w:tblPr>
         <w:tblStyle w:val="TableGrid"/>
-        <w:tblW w:w="14508" w:type="dxa"/>
+        <w:tblW w:w="14823" w:type="dxa"/>
         <w:tblInd w:w="-856" w:type="dxa"/>
         <w:tblLook w:val="04A0" w:firstRow="1" w:lastRow="0" w:firstColumn="1" w:lastColumn="0" w:noHBand="0" w:noVBand="1"/>
       </w:tblPr>
@@ -13,8 +13,12 @@
         <w:gridCol w:w="761"/>
         <w:gridCol w:w="1358"/>
         <w:gridCol w:w="1419"/>
-        <w:gridCol w:w="1724"/>
-        <w:gridCol w:w="9246"/>
+        <w:gridCol w:w="1417"/>
+        <w:gridCol w:w="462"/>
+        <w:gridCol w:w="1653"/>
+        <w:gridCol w:w="1178"/>
+        <w:gridCol w:w="3360"/>
+        <w:gridCol w:w="3215"/>
       </w:tblGrid>
       <w:tr>
         <w:tc>
@@ -39,7 +43,7 @@
         </w:tc>
         <w:tc>
           <w:tcPr>
-            <w:tcW w:w="1419" w:type="dxa"/>
+            <w:tcW w:w="1284" w:type="dxa"/>
           </w:tcPr>
           <w:p>
             <w:r>
@@ -49,7 +53,8 @@
         </w:tc>
         <w:tc>
           <w:tcPr>
-            <w:tcW w:w="1724" w:type="dxa"/>
+            <w:tcW w:w="1946" w:type="dxa"/>
+            <w:gridSpan w:val="2"/>
           </w:tcPr>
           <w:p>
             <w:r>
@@ -59,7 +64,8 @@
         </w:tc>
         <w:tc>
           <w:tcPr>
-            <w:tcW w:w="9246" w:type="dxa"/>
+            <w:tcW w:w="9474" w:type="dxa"/>
+            <w:gridSpan w:val="4"/>
           </w:tcPr>
           <w:p>
             <w:r>
@@ -91,7 +97,7 @@
         </w:tc>
         <w:tc>
           <w:tcPr>
-            <w:tcW w:w="1419" w:type="dxa"/>
+            <w:tcW w:w="1284" w:type="dxa"/>
           </w:tcPr>
           <w:p>
             <w:r>
@@ -101,7 +107,8 @@
         </w:tc>
         <w:tc>
           <w:tcPr>
-            <w:tcW w:w="1724" w:type="dxa"/>
+            <w:tcW w:w="1946" w:type="dxa"/>
+            <w:gridSpan w:val="2"/>
           </w:tcPr>
           <w:p>
             <w:r>
@@ -119,7 +126,8 @@
         </w:tc>
         <w:tc>
           <w:tcPr>
-            <w:tcW w:w="9246" w:type="dxa"/>
+            <w:tcW w:w="9474" w:type="dxa"/>
+            <w:gridSpan w:val="4"/>
           </w:tcPr>
           <w:p>
             <w:r>
@@ -156,7 +164,7 @@
         </w:tc>
         <w:tc>
           <w:tcPr>
-            <w:tcW w:w="1419" w:type="dxa"/>
+            <w:tcW w:w="1284" w:type="dxa"/>
           </w:tcPr>
           <w:p>
             <w:r>
@@ -166,7 +174,8 @@
         </w:tc>
         <w:tc>
           <w:tcPr>
-            <w:tcW w:w="1724" w:type="dxa"/>
+            <w:tcW w:w="1946" w:type="dxa"/>
+            <w:gridSpan w:val="2"/>
           </w:tcPr>
           <w:p>
             <w:r>
@@ -176,7 +185,8 @@
         </w:tc>
         <w:tc>
           <w:tcPr>
-            <w:tcW w:w="9246" w:type="dxa"/>
+            <w:tcW w:w="9474" w:type="dxa"/>
+            <w:gridSpan w:val="4"/>
           </w:tcPr>
           <w:p>
             <w:r>
@@ -208,7 +218,7 @@
         </w:tc>
         <w:tc>
           <w:tcPr>
-            <w:tcW w:w="1419" w:type="dxa"/>
+            <w:tcW w:w="1284" w:type="dxa"/>
           </w:tcPr>
           <w:p>
             <w:r>
@@ -218,7 +228,8 @@
         </w:tc>
         <w:tc>
           <w:tcPr>
-            <w:tcW w:w="1724" w:type="dxa"/>
+            <w:tcW w:w="1946" w:type="dxa"/>
+            <w:gridSpan w:val="2"/>
           </w:tcPr>
           <w:p>
             <w:r>
@@ -228,7 +239,8 @@
         </w:tc>
         <w:tc>
           <w:tcPr>
-            <w:tcW w:w="9246" w:type="dxa"/>
+            <w:tcW w:w="9474" w:type="dxa"/>
+            <w:gridSpan w:val="4"/>
           </w:tcPr>
           <w:p>
             <w:r>
@@ -260,7 +272,7 @@
         </w:tc>
         <w:tc>
           <w:tcPr>
-            <w:tcW w:w="1419" w:type="dxa"/>
+            <w:tcW w:w="1284" w:type="dxa"/>
           </w:tcPr>
           <w:p>
             <w:r>
@@ -270,20 +282,19 @@
         </w:tc>
         <w:tc>
           <w:tcPr>
-            <w:tcW w:w="1724" w:type="dxa"/>
-          </w:tcPr>
-          <w:p>
-            <w:r>
-              <w:t>Syntax error</w:t>
-            </w:r>
-            <w:r>
-              <w:t xml:space="preserve"> can’t locate resource</w:t>
-            </w:r>
-          </w:p>
-        </w:tc>
-        <w:tc>
-          <w:tcPr>
-            <w:tcW w:w="9246" w:type="dxa"/>
+            <w:tcW w:w="1946" w:type="dxa"/>
+            <w:gridSpan w:val="2"/>
+          </w:tcPr>
+          <w:p>
+            <w:r>
+              <w:t>Syntax error can’t locate resource</w:t>
+            </w:r>
+          </w:p>
+        </w:tc>
+        <w:tc>
+          <w:tcPr>
+            <w:tcW w:w="9474" w:type="dxa"/>
+            <w:gridSpan w:val="4"/>
           </w:tcPr>
           <w:p/>
         </w:tc>
@@ -311,7 +322,7 @@
         </w:tc>
         <w:tc>
           <w:tcPr>
-            <w:tcW w:w="1419" w:type="dxa"/>
+            <w:tcW w:w="1284" w:type="dxa"/>
           </w:tcPr>
           <w:p>
             <w:r>
@@ -321,7 +332,8 @@
         </w:tc>
         <w:tc>
           <w:tcPr>
-            <w:tcW w:w="1724" w:type="dxa"/>
+            <w:tcW w:w="1946" w:type="dxa"/>
+            <w:gridSpan w:val="2"/>
           </w:tcPr>
           <w:p>
             <w:r>
@@ -331,7 +343,8 @@
         </w:tc>
         <w:tc>
           <w:tcPr>
-            <w:tcW w:w="9246" w:type="dxa"/>
+            <w:tcW w:w="9474" w:type="dxa"/>
+            <w:gridSpan w:val="4"/>
           </w:tcPr>
           <w:p>
             <w:pPr>
@@ -465,7 +478,7 @@
         </w:tc>
         <w:tc>
           <w:tcPr>
-            <w:tcW w:w="1419" w:type="dxa"/>
+            <w:tcW w:w="1284" w:type="dxa"/>
           </w:tcPr>
           <w:p>
             <w:r>
@@ -475,7 +488,8 @@
         </w:tc>
         <w:tc>
           <w:tcPr>
-            <w:tcW w:w="1724" w:type="dxa"/>
+            <w:tcW w:w="1946" w:type="dxa"/>
+            <w:gridSpan w:val="2"/>
           </w:tcPr>
           <w:p>
             <w:r>
@@ -485,7 +499,8 @@
         </w:tc>
         <w:tc>
           <w:tcPr>
-            <w:tcW w:w="9246" w:type="dxa"/>
+            <w:tcW w:w="9474" w:type="dxa"/>
+            <w:gridSpan w:val="4"/>
           </w:tcPr>
           <w:p>
             <w:r>
@@ -787,7 +802,7 @@
         </w:tc>
         <w:tc>
           <w:tcPr>
-            <w:tcW w:w="1419" w:type="dxa"/>
+            <w:tcW w:w="1284" w:type="dxa"/>
           </w:tcPr>
           <w:p>
             <w:r>
@@ -797,7 +812,8 @@
         </w:tc>
         <w:tc>
           <w:tcPr>
-            <w:tcW w:w="1724" w:type="dxa"/>
+            <w:tcW w:w="1946" w:type="dxa"/>
+            <w:gridSpan w:val="2"/>
           </w:tcPr>
           <w:p>
             <w:r>
@@ -807,7 +823,8 @@
         </w:tc>
         <w:tc>
           <w:tcPr>
-            <w:tcW w:w="9246" w:type="dxa"/>
+            <w:tcW w:w="9474" w:type="dxa"/>
+            <w:gridSpan w:val="4"/>
           </w:tcPr>
           <w:p>
             <w:r>
@@ -839,7 +856,7 @@
         </w:tc>
         <w:tc>
           <w:tcPr>
-            <w:tcW w:w="1419" w:type="dxa"/>
+            <w:tcW w:w="1284" w:type="dxa"/>
           </w:tcPr>
           <w:p>
             <w:r>
@@ -849,7 +866,8 @@
         </w:tc>
         <w:tc>
           <w:tcPr>
-            <w:tcW w:w="1724" w:type="dxa"/>
+            <w:tcW w:w="1946" w:type="dxa"/>
+            <w:gridSpan w:val="2"/>
           </w:tcPr>
           <w:p>
             <w:r>
@@ -859,7 +877,8 @@
         </w:tc>
         <w:tc>
           <w:tcPr>
-            <w:tcW w:w="9246" w:type="dxa"/>
+            <w:tcW w:w="9474" w:type="dxa"/>
+            <w:gridSpan w:val="4"/>
           </w:tcPr>
           <w:p>
             <w:r>
@@ -891,7 +910,7 @@
         </w:tc>
         <w:tc>
           <w:tcPr>
-            <w:tcW w:w="1419" w:type="dxa"/>
+            <w:tcW w:w="1284" w:type="dxa"/>
           </w:tcPr>
           <w:p>
             <w:r>
@@ -901,7 +920,8 @@
         </w:tc>
         <w:tc>
           <w:tcPr>
-            <w:tcW w:w="1724" w:type="dxa"/>
+            <w:tcW w:w="1946" w:type="dxa"/>
+            <w:gridSpan w:val="2"/>
           </w:tcPr>
           <w:p>
             <w:r>
@@ -911,7 +931,8 @@
         </w:tc>
         <w:tc>
           <w:tcPr>
-            <w:tcW w:w="9246" w:type="dxa"/>
+            <w:tcW w:w="9474" w:type="dxa"/>
+            <w:gridSpan w:val="4"/>
           </w:tcPr>
           <w:p>
             <w:r>
@@ -951,7 +972,7 @@
         </w:tc>
         <w:tc>
           <w:tcPr>
-            <w:tcW w:w="1419" w:type="dxa"/>
+            <w:tcW w:w="1284" w:type="dxa"/>
           </w:tcPr>
           <w:p>
             <w:r>
@@ -965,7 +986,8 @@
         </w:tc>
         <w:tc>
           <w:tcPr>
-            <w:tcW w:w="1724" w:type="dxa"/>
+            <w:tcW w:w="1946" w:type="dxa"/>
+            <w:gridSpan w:val="2"/>
           </w:tcPr>
           <w:p>
             <w:r>
@@ -976,7 +998,8 @@
         </w:tc>
         <w:tc>
           <w:tcPr>
-            <w:tcW w:w="9246" w:type="dxa"/>
+            <w:tcW w:w="9474" w:type="dxa"/>
+            <w:gridSpan w:val="4"/>
           </w:tcPr>
           <w:p>
             <w:r>
@@ -993,10 +1016,7 @@
           </w:tcPr>
           <w:p>
             <w:r>
-              <w:t>18/0</w:t>
-            </w:r>
-            <w:r>
-              <w:t>3</w:t>
+              <w:t>18/03</w:t>
             </w:r>
           </w:p>
         </w:tc>
@@ -1012,7 +1032,7 @@
         </w:tc>
         <w:tc>
           <w:tcPr>
-            <w:tcW w:w="1419" w:type="dxa"/>
+            <w:tcW w:w="1284" w:type="dxa"/>
           </w:tcPr>
           <w:p>
             <w:r>
@@ -1022,7 +1042,8 @@
         </w:tc>
         <w:tc>
           <w:tcPr>
-            <w:tcW w:w="1724" w:type="dxa"/>
+            <w:tcW w:w="1946" w:type="dxa"/>
+            <w:gridSpan w:val="2"/>
           </w:tcPr>
           <w:p>
             <w:r>
@@ -1032,7 +1053,8 @@
         </w:tc>
         <w:tc>
           <w:tcPr>
-            <w:tcW w:w="9246" w:type="dxa"/>
+            <w:tcW w:w="9474" w:type="dxa"/>
+            <w:gridSpan w:val="4"/>
           </w:tcPr>
           <w:p>
             <w:pPr>
@@ -1705,10 +1727,7 @@
           </w:tcPr>
           <w:p>
             <w:r>
-              <w:t>18/0</w:t>
-            </w:r>
-            <w:r>
-              <w:t>3</w:t>
+              <w:t>18/03</w:t>
             </w:r>
           </w:p>
         </w:tc>
@@ -1724,7 +1743,7 @@
         </w:tc>
         <w:tc>
           <w:tcPr>
-            <w:tcW w:w="1419" w:type="dxa"/>
+            <w:tcW w:w="1284" w:type="dxa"/>
           </w:tcPr>
           <w:p>
             <w:r>
@@ -1734,7 +1753,8 @@
         </w:tc>
         <w:tc>
           <w:tcPr>
-            <w:tcW w:w="1724" w:type="dxa"/>
+            <w:tcW w:w="1946" w:type="dxa"/>
+            <w:gridSpan w:val="2"/>
           </w:tcPr>
           <w:p>
             <w:r>
@@ -1744,7 +1764,8 @@
         </w:tc>
         <w:tc>
           <w:tcPr>
-            <w:tcW w:w="9246" w:type="dxa"/>
+            <w:tcW w:w="9474" w:type="dxa"/>
+            <w:gridSpan w:val="4"/>
           </w:tcPr>
           <w:p>
             <w:pPr>
@@ -1768,10 +1789,7 @@
           </w:tcPr>
           <w:p>
             <w:r>
-              <w:t>18/0</w:t>
-            </w:r>
-            <w:r>
-              <w:t>3</w:t>
+              <w:t>18/03</w:t>
             </w:r>
           </w:p>
         </w:tc>
@@ -1787,7 +1805,7 @@
         </w:tc>
         <w:tc>
           <w:tcPr>
-            <w:tcW w:w="1419" w:type="dxa"/>
+            <w:tcW w:w="1284" w:type="dxa"/>
           </w:tcPr>
           <w:p>
             <w:r>
@@ -1797,7 +1815,8 @@
         </w:tc>
         <w:tc>
           <w:tcPr>
-            <w:tcW w:w="1724" w:type="dxa"/>
+            <w:tcW w:w="1946" w:type="dxa"/>
+            <w:gridSpan w:val="2"/>
           </w:tcPr>
           <w:p>
             <w:r>
@@ -1807,7 +1826,8 @@
         </w:tc>
         <w:tc>
           <w:tcPr>
-            <w:tcW w:w="9246" w:type="dxa"/>
+            <w:tcW w:w="9474" w:type="dxa"/>
+            <w:gridSpan w:val="4"/>
           </w:tcPr>
           <w:p>
             <w:pPr>
@@ -1841,10 +1861,10 @@
                 <w:lang w:eastAsia="en-NZ"/>
               </w:rPr>
               <w:drawing>
-                <wp:inline distT="0" distB="0" distL="0" distR="0" wp14:anchorId="13DCFD48" wp14:editId="1FED5D0B">
+                <wp:inline distT="0" distB="0" distL="0" distR="0" wp14:anchorId="024767D1" wp14:editId="08665E59">
                   <wp:extent cx="4591691" cy="1305107"/>
                   <wp:effectExtent l="0" t="0" r="0" b="9525"/>
-                  <wp:docPr id="1854480239" name="Picture 1"/>
+                  <wp:docPr id="1854480239" name="Picture 1" descr="A screen shot of a computer program&#10;&#10;Description automatically generated"/>
                   <wp:cNvGraphicFramePr>
                     <a:graphicFrameLocks xmlns:a="http://schemas.openxmlformats.org/drawingml/2006/main" noChangeAspect="1"/>
                   </wp:cNvGraphicFramePr>
@@ -1852,7 +1872,7 @@
                     <a:graphicData uri="http://schemas.openxmlformats.org/drawingml/2006/picture">
                       <pic:pic xmlns:pic="http://schemas.openxmlformats.org/drawingml/2006/picture">
                         <pic:nvPicPr>
-                          <pic:cNvPr id="1854480239" name=""/>
+                          <pic:cNvPr id="1854480239" name="Picture 1" descr="A screen shot of a computer program&#10;&#10;Description automatically generated"/>
                           <pic:cNvPicPr/>
                         </pic:nvPicPr>
                         <pic:blipFill>
@@ -1889,13 +1909,7 @@
           </w:tcPr>
           <w:p>
             <w:r>
-              <w:t>1</w:t>
-            </w:r>
-            <w:r>
-              <w:t>9</w:t>
-            </w:r>
-            <w:r>
-              <w:t>/04</w:t>
+              <w:t>19/04</w:t>
             </w:r>
           </w:p>
         </w:tc>
@@ -1911,7 +1925,7 @@
         </w:tc>
         <w:tc>
           <w:tcPr>
-            <w:tcW w:w="1419" w:type="dxa"/>
+            <w:tcW w:w="1284" w:type="dxa"/>
           </w:tcPr>
           <w:p>
             <w:r>
@@ -1921,7 +1935,8 @@
         </w:tc>
         <w:tc>
           <w:tcPr>
-            <w:tcW w:w="1724" w:type="dxa"/>
+            <w:tcW w:w="1946" w:type="dxa"/>
+            <w:gridSpan w:val="2"/>
           </w:tcPr>
           <w:p>
             <w:r>
@@ -1931,7 +1946,8 @@
         </w:tc>
         <w:tc>
           <w:tcPr>
-            <w:tcW w:w="9246" w:type="dxa"/>
+            <w:tcW w:w="9474" w:type="dxa"/>
+            <w:gridSpan w:val="4"/>
           </w:tcPr>
           <w:p>
             <w:pPr>
@@ -1984,7 +2000,7 @@
         </w:tc>
         <w:tc>
           <w:tcPr>
-            <w:tcW w:w="1419" w:type="dxa"/>
+            <w:tcW w:w="1284" w:type="dxa"/>
           </w:tcPr>
           <w:p>
             <w:r>
@@ -1994,7 +2010,8 @@
         </w:tc>
         <w:tc>
           <w:tcPr>
-            <w:tcW w:w="1724" w:type="dxa"/>
+            <w:tcW w:w="1946" w:type="dxa"/>
+            <w:gridSpan w:val="2"/>
           </w:tcPr>
           <w:p>
             <w:r>
@@ -2004,7 +2021,8 @@
         </w:tc>
         <w:tc>
           <w:tcPr>
-            <w:tcW w:w="9246" w:type="dxa"/>
+            <w:tcW w:w="9474" w:type="dxa"/>
+            <w:gridSpan w:val="4"/>
           </w:tcPr>
           <w:p>
             <w:pPr>
@@ -2057,7 +2075,7 @@
         </w:tc>
         <w:tc>
           <w:tcPr>
-            <w:tcW w:w="1419" w:type="dxa"/>
+            <w:tcW w:w="1284" w:type="dxa"/>
           </w:tcPr>
           <w:p>
             <w:r>
@@ -2067,7 +2085,8 @@
         </w:tc>
         <w:tc>
           <w:tcPr>
-            <w:tcW w:w="1724" w:type="dxa"/>
+            <w:tcW w:w="1946" w:type="dxa"/>
+            <w:gridSpan w:val="2"/>
           </w:tcPr>
           <w:p>
             <w:r>
@@ -2077,7 +2096,8 @@
         </w:tc>
         <w:tc>
           <w:tcPr>
-            <w:tcW w:w="9246" w:type="dxa"/>
+            <w:tcW w:w="9474" w:type="dxa"/>
+            <w:gridSpan w:val="4"/>
           </w:tcPr>
           <w:p>
             <w:pPr>
@@ -2130,7 +2150,7 @@
         </w:tc>
         <w:tc>
           <w:tcPr>
-            <w:tcW w:w="1419" w:type="dxa"/>
+            <w:tcW w:w="1284" w:type="dxa"/>
           </w:tcPr>
           <w:p>
             <w:r>
@@ -2140,7 +2160,8 @@
         </w:tc>
         <w:tc>
           <w:tcPr>
-            <w:tcW w:w="1724" w:type="dxa"/>
+            <w:tcW w:w="1946" w:type="dxa"/>
+            <w:gridSpan w:val="2"/>
           </w:tcPr>
           <w:p>
             <w:r>
@@ -2150,7 +2171,8 @@
         </w:tc>
         <w:tc>
           <w:tcPr>
-            <w:tcW w:w="9246" w:type="dxa"/>
+            <w:tcW w:w="9474" w:type="dxa"/>
+            <w:gridSpan w:val="4"/>
           </w:tcPr>
           <w:p>
             <w:pPr>
@@ -2172,17 +2194,7 @@
                 <w:szCs w:val="21"/>
                 <w:lang w:eastAsia="en-NZ"/>
               </w:rPr>
-              <w:t>N</w:t>
-            </w:r>
-            <w:r>
-              <w:rPr>
-                <w:rFonts w:ascii="Consolas" w:eastAsia="Times New Roman" w:hAnsi="Consolas" w:cs="Times New Roman"/>
-                <w:color w:val="CCCCCC"/>
-                <w:sz w:val="21"/>
-                <w:szCs w:val="21"/>
-                <w:lang w:eastAsia="en-NZ"/>
-              </w:rPr>
-              <w:t>one</w:t>
+              <w:t>None</w:t>
             </w:r>
           </w:p>
         </w:tc>
@@ -2213,7 +2225,7 @@
         </w:tc>
         <w:tc>
           <w:tcPr>
-            <w:tcW w:w="1419" w:type="dxa"/>
+            <w:tcW w:w="1284" w:type="dxa"/>
           </w:tcPr>
           <w:p>
             <w:r>
@@ -2223,14 +2235,12 @@
         </w:tc>
         <w:tc>
           <w:tcPr>
-            <w:tcW w:w="1724" w:type="dxa"/>
-          </w:tcPr>
-          <w:p>
-            <w:r>
-              <w:t xml:space="preserve">Game doesn’t </w:t>
-            </w:r>
-            <w:r>
-              <w:t>run.</w:t>
+            <w:tcW w:w="1946" w:type="dxa"/>
+            <w:gridSpan w:val="2"/>
+          </w:tcPr>
+          <w:p>
+            <w:r>
+              <w:t>Game doesn’t run.</w:t>
             </w:r>
           </w:p>
           <w:p>
@@ -2241,7 +2251,8 @@
         </w:tc>
         <w:tc>
           <w:tcPr>
-            <w:tcW w:w="9246" w:type="dxa"/>
+            <w:tcW w:w="9474" w:type="dxa"/>
+            <w:gridSpan w:val="4"/>
           </w:tcPr>
           <w:p>
             <w:pPr>
@@ -2294,7 +2305,7 @@
         </w:tc>
         <w:tc>
           <w:tcPr>
-            <w:tcW w:w="1419" w:type="dxa"/>
+            <w:tcW w:w="1284" w:type="dxa"/>
           </w:tcPr>
           <w:p>
             <w:r>
@@ -2304,7 +2315,8 @@
         </w:tc>
         <w:tc>
           <w:tcPr>
-            <w:tcW w:w="1724" w:type="dxa"/>
+            <w:tcW w:w="1946" w:type="dxa"/>
+            <w:gridSpan w:val="2"/>
           </w:tcPr>
           <w:p>
             <w:r>
@@ -2314,7 +2326,8 @@
         </w:tc>
         <w:tc>
           <w:tcPr>
-            <w:tcW w:w="9246" w:type="dxa"/>
+            <w:tcW w:w="9474" w:type="dxa"/>
+            <w:gridSpan w:val="4"/>
           </w:tcPr>
           <w:p>
             <w:pPr>
@@ -2423,25 +2436,21 @@
         </w:tc>
         <w:tc>
           <w:tcPr>
-            <w:tcW w:w="1419" w:type="dxa"/>
-          </w:tcPr>
-          <w:p>
-            <w:r>
-              <w:t xml:space="preserve">Enemy sprite moves in a </w:t>
-            </w:r>
-            <w:r>
-              <w:lastRenderedPageBreak/>
-              <w:t>random direction</w:t>
-            </w:r>
-          </w:p>
-        </w:tc>
-        <w:tc>
-          <w:tcPr>
-            <w:tcW w:w="1724" w:type="dxa"/>
-          </w:tcPr>
-          <w:p>
-            <w:r>
-              <w:lastRenderedPageBreak/>
+            <w:tcW w:w="1284" w:type="dxa"/>
+          </w:tcPr>
+          <w:p>
+            <w:r>
+              <w:t>Enemy sprite moves in a random direction</w:t>
+            </w:r>
+          </w:p>
+        </w:tc>
+        <w:tc>
+          <w:tcPr>
+            <w:tcW w:w="1946" w:type="dxa"/>
+            <w:gridSpan w:val="2"/>
+          </w:tcPr>
+          <w:p>
+            <w:r>
               <w:t xml:space="preserve">Enemy sprites </w:t>
             </w:r>
             <w:proofErr w:type="gramStart"/>
@@ -2453,7 +2462,8 @@
         </w:tc>
         <w:tc>
           <w:tcPr>
-            <w:tcW w:w="9246" w:type="dxa"/>
+            <w:tcW w:w="9474" w:type="dxa"/>
+            <w:gridSpan w:val="4"/>
           </w:tcPr>
           <w:p>
             <w:pPr>
@@ -2490,6 +2500,7 @@
           </w:tcPr>
           <w:p>
             <w:r>
+              <w:lastRenderedPageBreak/>
               <w:t>20/4</w:t>
             </w:r>
           </w:p>
@@ -2511,7 +2522,7 @@
         </w:tc>
         <w:tc>
           <w:tcPr>
-            <w:tcW w:w="1419" w:type="dxa"/>
+            <w:tcW w:w="1284" w:type="dxa"/>
           </w:tcPr>
           <w:p>
             <w:r>
@@ -2529,7 +2540,8 @@
         </w:tc>
         <w:tc>
           <w:tcPr>
-            <w:tcW w:w="1724" w:type="dxa"/>
+            <w:tcW w:w="1946" w:type="dxa"/>
+            <w:gridSpan w:val="2"/>
           </w:tcPr>
           <w:p>
             <w:r>
@@ -2539,7 +2551,8 @@
         </w:tc>
         <w:tc>
           <w:tcPr>
-            <w:tcW w:w="9246" w:type="dxa"/>
+            <w:tcW w:w="9474" w:type="dxa"/>
+            <w:gridSpan w:val="4"/>
           </w:tcPr>
           <w:p>
             <w:pPr>
@@ -2592,7 +2605,7 @@
         </w:tc>
         <w:tc>
           <w:tcPr>
-            <w:tcW w:w="1419" w:type="dxa"/>
+            <w:tcW w:w="1284" w:type="dxa"/>
           </w:tcPr>
           <w:p>
             <w:r>
@@ -2602,7 +2615,8 @@
         </w:tc>
         <w:tc>
           <w:tcPr>
-            <w:tcW w:w="1724" w:type="dxa"/>
+            <w:tcW w:w="1946" w:type="dxa"/>
+            <w:gridSpan w:val="2"/>
           </w:tcPr>
           <w:p>
             <w:r>
@@ -2612,7 +2626,8 @@
         </w:tc>
         <w:tc>
           <w:tcPr>
-            <w:tcW w:w="9246" w:type="dxa"/>
+            <w:tcW w:w="9474" w:type="dxa"/>
+            <w:gridSpan w:val="4"/>
           </w:tcPr>
           <w:p>
             <w:pPr>
@@ -2665,7 +2680,7 @@
         </w:tc>
         <w:tc>
           <w:tcPr>
-            <w:tcW w:w="1419" w:type="dxa"/>
+            <w:tcW w:w="1284" w:type="dxa"/>
           </w:tcPr>
           <w:p>
             <w:r>
@@ -2675,7 +2690,8 @@
         </w:tc>
         <w:tc>
           <w:tcPr>
-            <w:tcW w:w="1724" w:type="dxa"/>
+            <w:tcW w:w="1946" w:type="dxa"/>
+            <w:gridSpan w:val="2"/>
           </w:tcPr>
           <w:p>
             <w:r>
@@ -2685,7 +2701,8 @@
         </w:tc>
         <w:tc>
           <w:tcPr>
-            <w:tcW w:w="9246" w:type="dxa"/>
+            <w:tcW w:w="9474" w:type="dxa"/>
+            <w:gridSpan w:val="4"/>
           </w:tcPr>
           <w:p>
             <w:pPr>
@@ -2934,7 +2951,7 @@
         </w:tc>
         <w:tc>
           <w:tcPr>
-            <w:tcW w:w="1419" w:type="dxa"/>
+            <w:tcW w:w="1284" w:type="dxa"/>
           </w:tcPr>
           <w:p>
             <w:r>
@@ -2944,7 +2961,8 @@
         </w:tc>
         <w:tc>
           <w:tcPr>
-            <w:tcW w:w="1724" w:type="dxa"/>
+            <w:tcW w:w="1946" w:type="dxa"/>
+            <w:gridSpan w:val="2"/>
           </w:tcPr>
           <w:p>
             <w:r>
@@ -2954,7 +2972,8 @@
         </w:tc>
         <w:tc>
           <w:tcPr>
-            <w:tcW w:w="9246" w:type="dxa"/>
+            <w:tcW w:w="9474" w:type="dxa"/>
+            <w:gridSpan w:val="4"/>
           </w:tcPr>
           <w:p>
             <w:pPr>
@@ -2976,17 +2995,7 @@
                 <w:szCs w:val="21"/>
                 <w:lang w:eastAsia="en-NZ"/>
               </w:rPr>
-              <w:t xml:space="preserve">Added code that pushes sprite </w:t>
-            </w:r>
-            <w:r>
-              <w:rPr>
-                <w:rFonts w:ascii="Consolas" w:eastAsia="Times New Roman" w:hAnsi="Consolas" w:cs="Times New Roman"/>
-                <w:color w:val="C586C0"/>
-                <w:sz w:val="21"/>
-                <w:szCs w:val="21"/>
-                <w:lang w:eastAsia="en-NZ"/>
-              </w:rPr>
-              <w:t>left or right if their change in x is 0</w:t>
+              <w:t>Added code that pushes sprite left or right if their change in x is 0</w:t>
             </w:r>
           </w:p>
         </w:tc>
@@ -3001,13 +3010,7 @@
           </w:tcPr>
           <w:p>
             <w:r>
-              <w:t>2</w:t>
-            </w:r>
-            <w:r>
-              <w:t>1</w:t>
-            </w:r>
-            <w:r>
-              <w:t>/4</w:t>
+              <w:t>21/4</w:t>
             </w:r>
           </w:p>
         </w:tc>
@@ -3023,7 +3026,7 @@
         </w:tc>
         <w:tc>
           <w:tcPr>
-            <w:tcW w:w="1419" w:type="dxa"/>
+            <w:tcW w:w="1284" w:type="dxa"/>
           </w:tcPr>
           <w:p>
             <w:r>
@@ -3033,7 +3036,8 @@
         </w:tc>
         <w:tc>
           <w:tcPr>
-            <w:tcW w:w="1724" w:type="dxa"/>
+            <w:tcW w:w="1946" w:type="dxa"/>
+            <w:gridSpan w:val="2"/>
           </w:tcPr>
           <w:p>
             <w:r>
@@ -3043,7 +3047,8 @@
         </w:tc>
         <w:tc>
           <w:tcPr>
-            <w:tcW w:w="9246" w:type="dxa"/>
+            <w:tcW w:w="9474" w:type="dxa"/>
+            <w:gridSpan w:val="4"/>
           </w:tcPr>
           <w:p>
             <w:pPr>
@@ -3152,7 +3157,7 @@
         </w:tc>
         <w:tc>
           <w:tcPr>
-            <w:tcW w:w="1419" w:type="dxa"/>
+            <w:tcW w:w="1284" w:type="dxa"/>
           </w:tcPr>
           <w:p>
             <w:r>
@@ -3162,7 +3167,8 @@
         </w:tc>
         <w:tc>
           <w:tcPr>
-            <w:tcW w:w="1724" w:type="dxa"/>
+            <w:tcW w:w="1946" w:type="dxa"/>
+            <w:gridSpan w:val="2"/>
           </w:tcPr>
           <w:p>
             <w:r>
@@ -3172,7 +3178,8 @@
         </w:tc>
         <w:tc>
           <w:tcPr>
-            <w:tcW w:w="9246" w:type="dxa"/>
+            <w:tcW w:w="9474" w:type="dxa"/>
+            <w:gridSpan w:val="4"/>
           </w:tcPr>
           <w:p>
             <w:pPr>
@@ -3225,7 +3232,7 @@
         </w:tc>
         <w:tc>
           <w:tcPr>
-            <w:tcW w:w="1419" w:type="dxa"/>
+            <w:tcW w:w="1284" w:type="dxa"/>
           </w:tcPr>
           <w:p>
             <w:r>
@@ -3235,7 +3242,8 @@
         </w:tc>
         <w:tc>
           <w:tcPr>
-            <w:tcW w:w="1724" w:type="dxa"/>
+            <w:tcW w:w="1946" w:type="dxa"/>
+            <w:gridSpan w:val="2"/>
           </w:tcPr>
           <w:p>
             <w:r>
@@ -3245,7 +3253,8 @@
         </w:tc>
         <w:tc>
           <w:tcPr>
-            <w:tcW w:w="9246" w:type="dxa"/>
+            <w:tcW w:w="9474" w:type="dxa"/>
+            <w:gridSpan w:val="4"/>
           </w:tcPr>
           <w:p>
             <w:pPr>
@@ -3298,7 +3307,7 @@
         </w:tc>
         <w:tc>
           <w:tcPr>
-            <w:tcW w:w="1419" w:type="dxa"/>
+            <w:tcW w:w="1284" w:type="dxa"/>
           </w:tcPr>
           <w:p>
             <w:r>
@@ -3308,7 +3317,8 @@
         </w:tc>
         <w:tc>
           <w:tcPr>
-            <w:tcW w:w="1724" w:type="dxa"/>
+            <w:tcW w:w="1946" w:type="dxa"/>
+            <w:gridSpan w:val="2"/>
           </w:tcPr>
           <w:p>
             <w:r>
@@ -3318,7 +3328,8 @@
         </w:tc>
         <w:tc>
           <w:tcPr>
-            <w:tcW w:w="9246" w:type="dxa"/>
+            <w:tcW w:w="9474" w:type="dxa"/>
+            <w:gridSpan w:val="4"/>
           </w:tcPr>
           <w:p>
             <w:pPr>
@@ -3637,36 +3648,29 @@
         </w:tc>
         <w:tc>
           <w:tcPr>
-            <w:tcW w:w="1419" w:type="dxa"/>
-          </w:tcPr>
-          <w:p>
-            <w:r>
-              <w:t xml:space="preserve">Sprites play animation when space </w:t>
-            </w:r>
-            <w:r>
-              <w:lastRenderedPageBreak/>
-              <w:t xml:space="preserve">bar is pressed </w:t>
-            </w:r>
-          </w:p>
-        </w:tc>
-        <w:tc>
-          <w:tcPr>
-            <w:tcW w:w="1724" w:type="dxa"/>
-          </w:tcPr>
-          <w:p>
-            <w:r>
-              <w:lastRenderedPageBreak/>
-              <w:t xml:space="preserve">Animation plays too quickly and </w:t>
-            </w:r>
-            <w:r>
-              <w:lastRenderedPageBreak/>
-              <w:t>doesn’t reset to idle animation</w:t>
-            </w:r>
-          </w:p>
-        </w:tc>
-        <w:tc>
-          <w:tcPr>
-            <w:tcW w:w="9246" w:type="dxa"/>
+            <w:tcW w:w="1284" w:type="dxa"/>
+          </w:tcPr>
+          <w:p>
+            <w:r>
+              <w:t xml:space="preserve">Sprites play animation when space bar is pressed </w:t>
+            </w:r>
+          </w:p>
+        </w:tc>
+        <w:tc>
+          <w:tcPr>
+            <w:tcW w:w="1946" w:type="dxa"/>
+            <w:gridSpan w:val="2"/>
+          </w:tcPr>
+          <w:p>
+            <w:r>
+              <w:t>Animation plays too quickly and doesn’t reset to idle animation</w:t>
+            </w:r>
+          </w:p>
+        </w:tc>
+        <w:tc>
+          <w:tcPr>
+            <w:tcW w:w="9474" w:type="dxa"/>
+            <w:gridSpan w:val="4"/>
           </w:tcPr>
           <w:p>
             <w:pPr>
@@ -3688,7 +3692,6 @@
                 <w:szCs w:val="21"/>
                 <w:lang w:eastAsia="en-NZ"/>
               </w:rPr>
-              <w:lastRenderedPageBreak/>
               <w:t xml:space="preserve">Added </w:t>
             </w:r>
             <w:proofErr w:type="spellStart"/>
@@ -3728,6 +3731,7 @@
           </w:tcPr>
           <w:p>
             <w:r>
+              <w:lastRenderedPageBreak/>
               <w:t>22/4</w:t>
             </w:r>
           </w:p>
@@ -3744,7 +3748,7 @@
         </w:tc>
         <w:tc>
           <w:tcPr>
-            <w:tcW w:w="1419" w:type="dxa"/>
+            <w:tcW w:w="1284" w:type="dxa"/>
           </w:tcPr>
           <w:p>
             <w:r>
@@ -3754,7 +3758,8 @@
         </w:tc>
         <w:tc>
           <w:tcPr>
-            <w:tcW w:w="1724" w:type="dxa"/>
+            <w:tcW w:w="1946" w:type="dxa"/>
+            <w:gridSpan w:val="2"/>
           </w:tcPr>
           <w:p>
             <w:r>
@@ -3764,7 +3769,8 @@
         </w:tc>
         <w:tc>
           <w:tcPr>
-            <w:tcW w:w="9246" w:type="dxa"/>
+            <w:tcW w:w="9474" w:type="dxa"/>
+            <w:gridSpan w:val="4"/>
           </w:tcPr>
           <w:p>
             <w:pPr>
@@ -3788,10 +3794,10 @@
                 <w:lang w:eastAsia="en-NZ"/>
               </w:rPr>
               <w:drawing>
-                <wp:inline distT="0" distB="0" distL="0" distR="0" wp14:anchorId="431E6AD5" wp14:editId="7879E9C1">
+                <wp:inline distT="0" distB="0" distL="0" distR="0" wp14:anchorId="5A3E3042" wp14:editId="1ECE4017">
                   <wp:extent cx="3245485" cy="1388365"/>
                   <wp:effectExtent l="0" t="0" r="0" b="2540"/>
-                  <wp:docPr id="1048499113" name="Picture 1"/>
+                  <wp:docPr id="1048499113" name="Picture 1" descr="A screen shot of a computer program&#10;&#10;Description automatically generated"/>
                   <wp:cNvGraphicFramePr>
                     <a:graphicFrameLocks xmlns:a="http://schemas.openxmlformats.org/drawingml/2006/main" noChangeAspect="1"/>
                   </wp:cNvGraphicFramePr>
@@ -3799,7 +3805,7 @@
                     <a:graphicData uri="http://schemas.openxmlformats.org/drawingml/2006/picture">
                       <pic:pic xmlns:pic="http://schemas.openxmlformats.org/drawingml/2006/picture">
                         <pic:nvPicPr>
-                          <pic:cNvPr id="1048499113" name=""/>
+                          <pic:cNvPr id="1048499113" name="Picture 1" descr="A screen shot of a computer program&#10;&#10;Description automatically generated"/>
                           <pic:cNvPicPr/>
                         </pic:nvPicPr>
                         <pic:blipFill rotWithShape="1">
@@ -3859,7 +3865,7 @@
         </w:tc>
         <w:tc>
           <w:tcPr>
-            <w:tcW w:w="1419" w:type="dxa"/>
+            <w:tcW w:w="1284" w:type="dxa"/>
           </w:tcPr>
           <w:p>
             <w:r>
@@ -3869,7 +3875,8 @@
         </w:tc>
         <w:tc>
           <w:tcPr>
-            <w:tcW w:w="1724" w:type="dxa"/>
+            <w:tcW w:w="1946" w:type="dxa"/>
+            <w:gridSpan w:val="2"/>
           </w:tcPr>
           <w:p>
             <w:r>
@@ -3879,7 +3886,8 @@
         </w:tc>
         <w:tc>
           <w:tcPr>
-            <w:tcW w:w="9246" w:type="dxa"/>
+            <w:tcW w:w="9474" w:type="dxa"/>
+            <w:gridSpan w:val="4"/>
           </w:tcPr>
           <w:p>
             <w:pPr>
@@ -3960,10 +3968,7 @@
           </w:tcPr>
           <w:p>
             <w:r>
-              <w:t>22/</w:t>
-            </w:r>
-            <w:r>
-              <w:t>3</w:t>
+              <w:t>22/3</w:t>
             </w:r>
           </w:p>
         </w:tc>
@@ -3979,7 +3984,7 @@
         </w:tc>
         <w:tc>
           <w:tcPr>
-            <w:tcW w:w="1419" w:type="dxa"/>
+            <w:tcW w:w="1284" w:type="dxa"/>
           </w:tcPr>
           <w:p>
             <w:r>
@@ -3989,7 +3994,8 @@
         </w:tc>
         <w:tc>
           <w:tcPr>
-            <w:tcW w:w="1724" w:type="dxa"/>
+            <w:tcW w:w="1946" w:type="dxa"/>
+            <w:gridSpan w:val="2"/>
           </w:tcPr>
           <w:p>
             <w:proofErr w:type="spellStart"/>
@@ -4004,7 +4010,8 @@
         </w:tc>
         <w:tc>
           <w:tcPr>
-            <w:tcW w:w="9246" w:type="dxa"/>
+            <w:tcW w:w="9474" w:type="dxa"/>
+            <w:gridSpan w:val="4"/>
           </w:tcPr>
           <w:p>
             <w:pPr>
@@ -4028,10 +4035,10 @@
                 <w:lang w:eastAsia="en-NZ"/>
               </w:rPr>
               <w:drawing>
-                <wp:inline distT="0" distB="0" distL="0" distR="0" wp14:anchorId="45480C1D" wp14:editId="78058036">
+                <wp:inline distT="0" distB="0" distL="0" distR="0" wp14:anchorId="697D8107" wp14:editId="0ECBDF1C">
                   <wp:extent cx="5725324" cy="1790950"/>
                   <wp:effectExtent l="0" t="0" r="8890" b="0"/>
-                  <wp:docPr id="441823052" name="Picture 1"/>
+                  <wp:docPr id="441823052" name="Picture 1" descr="A computer screen with white text&#10;&#10;Description automatically generated"/>
                   <wp:cNvGraphicFramePr>
                     <a:graphicFrameLocks xmlns:a="http://schemas.openxmlformats.org/drawingml/2006/main" noChangeAspect="1"/>
                   </wp:cNvGraphicFramePr>
@@ -4039,7 +4046,7 @@
                     <a:graphicData uri="http://schemas.openxmlformats.org/drawingml/2006/picture">
                       <pic:pic xmlns:pic="http://schemas.openxmlformats.org/drawingml/2006/picture">
                         <pic:nvPicPr>
-                          <pic:cNvPr id="441823052" name=""/>
+                          <pic:cNvPr id="441823052" name="Picture 1" descr="A computer screen with white text&#10;&#10;Description automatically generated"/>
                           <pic:cNvPicPr/>
                         </pic:nvPicPr>
                         <pic:blipFill>
@@ -4076,10 +4083,7 @@
           </w:tcPr>
           <w:p>
             <w:r>
-              <w:t>22/</w:t>
-            </w:r>
-            <w:r>
-              <w:t>3</w:t>
+              <w:t>22/3</w:t>
             </w:r>
           </w:p>
         </w:tc>
@@ -4095,7 +4099,7 @@
         </w:tc>
         <w:tc>
           <w:tcPr>
-            <w:tcW w:w="1419" w:type="dxa"/>
+            <w:tcW w:w="1284" w:type="dxa"/>
           </w:tcPr>
           <w:p>
             <w:r>
@@ -4105,7 +4109,8 @@
         </w:tc>
         <w:tc>
           <w:tcPr>
-            <w:tcW w:w="1724" w:type="dxa"/>
+            <w:tcW w:w="1946" w:type="dxa"/>
+            <w:gridSpan w:val="2"/>
           </w:tcPr>
           <w:p>
             <w:r>
@@ -4115,7 +4120,8 @@
         </w:tc>
         <w:tc>
           <w:tcPr>
-            <w:tcW w:w="9246" w:type="dxa"/>
+            <w:tcW w:w="9474" w:type="dxa"/>
+            <w:gridSpan w:val="4"/>
           </w:tcPr>
           <w:p>
             <w:pPr>
@@ -4152,10 +4158,7 @@
           </w:tcPr>
           <w:p>
             <w:r>
-              <w:t>22/</w:t>
-            </w:r>
-            <w:r>
-              <w:t>3</w:t>
+              <w:t>22/3</w:t>
             </w:r>
           </w:p>
         </w:tc>
@@ -4171,7 +4174,7 @@
         </w:tc>
         <w:tc>
           <w:tcPr>
-            <w:tcW w:w="1419" w:type="dxa"/>
+            <w:tcW w:w="1284" w:type="dxa"/>
           </w:tcPr>
           <w:p>
             <w:r>
@@ -4181,7 +4184,8 @@
         </w:tc>
         <w:tc>
           <w:tcPr>
-            <w:tcW w:w="1724" w:type="dxa"/>
+            <w:tcW w:w="1946" w:type="dxa"/>
+            <w:gridSpan w:val="2"/>
           </w:tcPr>
           <w:p>
             <w:r>
@@ -4191,7 +4195,8 @@
         </w:tc>
         <w:tc>
           <w:tcPr>
-            <w:tcW w:w="9246" w:type="dxa"/>
+            <w:tcW w:w="9474" w:type="dxa"/>
+            <w:gridSpan w:val="4"/>
           </w:tcPr>
           <w:p>
             <w:pPr>
@@ -4228,10 +4233,7 @@
           </w:tcPr>
           <w:p>
             <w:r>
-              <w:t>22/</w:t>
-            </w:r>
-            <w:r>
-              <w:t>3</w:t>
+              <w:t>22/3</w:t>
             </w:r>
           </w:p>
         </w:tc>
@@ -4247,7 +4249,7 @@
         </w:tc>
         <w:tc>
           <w:tcPr>
-            <w:tcW w:w="1419" w:type="dxa"/>
+            <w:tcW w:w="1284" w:type="dxa"/>
           </w:tcPr>
           <w:p>
             <w:r>
@@ -4257,7 +4259,8 @@
         </w:tc>
         <w:tc>
           <w:tcPr>
-            <w:tcW w:w="1724" w:type="dxa"/>
+            <w:tcW w:w="1946" w:type="dxa"/>
+            <w:gridSpan w:val="2"/>
           </w:tcPr>
           <w:p>
             <w:r>
@@ -4267,7 +4270,8 @@
         </w:tc>
         <w:tc>
           <w:tcPr>
-            <w:tcW w:w="9246" w:type="dxa"/>
+            <w:tcW w:w="9474" w:type="dxa"/>
+            <w:gridSpan w:val="4"/>
           </w:tcPr>
           <w:p>
             <w:pPr>
@@ -4372,10 +4376,7 @@
           </w:tcPr>
           <w:p>
             <w:r>
-              <w:t>22/</w:t>
-            </w:r>
-            <w:r>
-              <w:t>3</w:t>
+              <w:t>22/3</w:t>
             </w:r>
           </w:p>
         </w:tc>
@@ -4391,7 +4392,7 @@
         </w:tc>
         <w:tc>
           <w:tcPr>
-            <w:tcW w:w="1419" w:type="dxa"/>
+            <w:tcW w:w="1284" w:type="dxa"/>
           </w:tcPr>
           <w:p>
             <w:r>
@@ -4401,7 +4402,8 @@
         </w:tc>
         <w:tc>
           <w:tcPr>
-            <w:tcW w:w="1724" w:type="dxa"/>
+            <w:tcW w:w="1946" w:type="dxa"/>
+            <w:gridSpan w:val="2"/>
           </w:tcPr>
           <w:p>
             <w:r>
@@ -4411,7 +4413,8 @@
         </w:tc>
         <w:tc>
           <w:tcPr>
-            <w:tcW w:w="9246" w:type="dxa"/>
+            <w:tcW w:w="9474" w:type="dxa"/>
+            <w:gridSpan w:val="4"/>
           </w:tcPr>
           <w:p>
             <w:pPr>
@@ -4435,10 +4438,10 @@
                 <w:lang w:eastAsia="en-NZ"/>
               </w:rPr>
               <w:drawing>
-                <wp:inline distT="0" distB="0" distL="0" distR="0" wp14:anchorId="146302C7" wp14:editId="356E508E">
+                <wp:inline distT="0" distB="0" distL="0" distR="0" wp14:anchorId="3E3AE86C" wp14:editId="74F35A5D">
                   <wp:extent cx="5630061" cy="1514686"/>
                   <wp:effectExtent l="0" t="0" r="8890" b="9525"/>
-                  <wp:docPr id="616047744" name="Picture 1"/>
+                  <wp:docPr id="616047744" name="Picture 1" descr="A screen shot of a computer&#10;&#10;Description automatically generated"/>
                   <wp:cNvGraphicFramePr>
                     <a:graphicFrameLocks xmlns:a="http://schemas.openxmlformats.org/drawingml/2006/main" noChangeAspect="1"/>
                   </wp:cNvGraphicFramePr>
@@ -4446,7 +4449,7 @@
                     <a:graphicData uri="http://schemas.openxmlformats.org/drawingml/2006/picture">
                       <pic:pic xmlns:pic="http://schemas.openxmlformats.org/drawingml/2006/picture">
                         <pic:nvPicPr>
-                          <pic:cNvPr id="616047744" name=""/>
+                          <pic:cNvPr id="616047744" name="Picture 1" descr="A screen shot of a computer&#10;&#10;Description automatically generated"/>
                           <pic:cNvPicPr/>
                         </pic:nvPicPr>
                         <pic:blipFill>
@@ -4484,10 +4487,7 @@
           <w:p>
             <w:r>
               <w:lastRenderedPageBreak/>
-              <w:t>22/</w:t>
-            </w:r>
-            <w:r>
-              <w:t>3</w:t>
+              <w:t>22/3</w:t>
             </w:r>
           </w:p>
         </w:tc>
@@ -4503,7 +4503,7 @@
         </w:tc>
         <w:tc>
           <w:tcPr>
-            <w:tcW w:w="1419" w:type="dxa"/>
+            <w:tcW w:w="1284" w:type="dxa"/>
           </w:tcPr>
           <w:p>
             <w:r>
@@ -4513,7 +4513,8 @@
         </w:tc>
         <w:tc>
           <w:tcPr>
-            <w:tcW w:w="1724" w:type="dxa"/>
+            <w:tcW w:w="1946" w:type="dxa"/>
+            <w:gridSpan w:val="2"/>
           </w:tcPr>
           <w:p>
             <w:r>
@@ -4523,7 +4524,8 @@
         </w:tc>
         <w:tc>
           <w:tcPr>
-            <w:tcW w:w="9246" w:type="dxa"/>
+            <w:tcW w:w="9474" w:type="dxa"/>
+            <w:gridSpan w:val="4"/>
           </w:tcPr>
           <w:p>
             <w:pPr>
@@ -4547,10 +4549,10 @@
                 <w:lang w:eastAsia="en-NZ"/>
               </w:rPr>
               <w:drawing>
-                <wp:inline distT="0" distB="0" distL="0" distR="0" wp14:anchorId="0B178B3D" wp14:editId="21455151">
+                <wp:inline distT="0" distB="0" distL="0" distR="0" wp14:anchorId="36DE878A" wp14:editId="12028663">
                   <wp:extent cx="5525271" cy="1667108"/>
                   <wp:effectExtent l="0" t="0" r="0" b="9525"/>
-                  <wp:docPr id="1461391971" name="Picture 1"/>
+                  <wp:docPr id="1461391971" name="Picture 1" descr="A computer screen shot of a black screen&#10;&#10;Description automatically generated"/>
                   <wp:cNvGraphicFramePr>
                     <a:graphicFrameLocks xmlns:a="http://schemas.openxmlformats.org/drawingml/2006/main" noChangeAspect="1"/>
                   </wp:cNvGraphicFramePr>
@@ -4558,7 +4560,7 @@
                     <a:graphicData uri="http://schemas.openxmlformats.org/drawingml/2006/picture">
                       <pic:pic xmlns:pic="http://schemas.openxmlformats.org/drawingml/2006/picture">
                         <pic:nvPicPr>
-                          <pic:cNvPr id="1461391971" name=""/>
+                          <pic:cNvPr id="1461391971" name="Picture 1" descr="A computer screen shot of a black screen&#10;&#10;Description automatically generated"/>
                           <pic:cNvPicPr/>
                         </pic:nvPicPr>
                         <pic:blipFill>
@@ -4595,10 +4597,7 @@
           </w:tcPr>
           <w:p>
             <w:r>
-              <w:t>22/</w:t>
-            </w:r>
-            <w:r>
-              <w:t>3</w:t>
+              <w:t>22/3</w:t>
             </w:r>
           </w:p>
         </w:tc>
@@ -4614,7 +4613,7 @@
         </w:tc>
         <w:tc>
           <w:tcPr>
-            <w:tcW w:w="1419" w:type="dxa"/>
+            <w:tcW w:w="1284" w:type="dxa"/>
           </w:tcPr>
           <w:p>
             <w:r>
@@ -4624,7 +4623,8 @@
         </w:tc>
         <w:tc>
           <w:tcPr>
-            <w:tcW w:w="1724" w:type="dxa"/>
+            <w:tcW w:w="1946" w:type="dxa"/>
+            <w:gridSpan w:val="2"/>
           </w:tcPr>
           <w:p>
             <w:r>
@@ -4634,7 +4634,8 @@
         </w:tc>
         <w:tc>
           <w:tcPr>
-            <w:tcW w:w="9246" w:type="dxa"/>
+            <w:tcW w:w="9474" w:type="dxa"/>
+            <w:gridSpan w:val="4"/>
           </w:tcPr>
           <w:p>
             <w:pPr>
@@ -4741,10 +4742,7 @@
           </w:tcPr>
           <w:p>
             <w:r>
-              <w:t>22/</w:t>
-            </w:r>
-            <w:r>
-              <w:t>3</w:t>
+              <w:t>22/3</w:t>
             </w:r>
           </w:p>
         </w:tc>
@@ -4760,7 +4758,7 @@
         </w:tc>
         <w:tc>
           <w:tcPr>
-            <w:tcW w:w="1419" w:type="dxa"/>
+            <w:tcW w:w="1284" w:type="dxa"/>
           </w:tcPr>
           <w:p>
             <w:r>
@@ -4770,7 +4768,8 @@
         </w:tc>
         <w:tc>
           <w:tcPr>
-            <w:tcW w:w="1724" w:type="dxa"/>
+            <w:tcW w:w="1946" w:type="dxa"/>
+            <w:gridSpan w:val="2"/>
           </w:tcPr>
           <w:p>
             <w:r>
@@ -4780,7 +4779,8 @@
         </w:tc>
         <w:tc>
           <w:tcPr>
-            <w:tcW w:w="9246" w:type="dxa"/>
+            <w:tcW w:w="9474" w:type="dxa"/>
+            <w:gridSpan w:val="4"/>
           </w:tcPr>
           <w:p>
             <w:pPr>
@@ -4833,7 +4833,7 @@
         </w:tc>
         <w:tc>
           <w:tcPr>
-            <w:tcW w:w="1419" w:type="dxa"/>
+            <w:tcW w:w="1284" w:type="dxa"/>
           </w:tcPr>
           <w:p>
             <w:r>
@@ -4843,7 +4843,8 @@
         </w:tc>
         <w:tc>
           <w:tcPr>
-            <w:tcW w:w="1724" w:type="dxa"/>
+            <w:tcW w:w="1946" w:type="dxa"/>
+            <w:gridSpan w:val="2"/>
           </w:tcPr>
           <w:p>
             <w:r>
@@ -4853,7 +4854,8 @@
         </w:tc>
         <w:tc>
           <w:tcPr>
-            <w:tcW w:w="9246" w:type="dxa"/>
+            <w:tcW w:w="9474" w:type="dxa"/>
+            <w:gridSpan w:val="4"/>
           </w:tcPr>
           <w:p>
             <w:pPr>
@@ -4896,7 +4898,7 @@
         </w:tc>
         <w:tc>
           <w:tcPr>
-            <w:tcW w:w="1419" w:type="dxa"/>
+            <w:tcW w:w="1284" w:type="dxa"/>
           </w:tcPr>
           <w:p>
             <w:r>
@@ -4906,7 +4908,8 @@
         </w:tc>
         <w:tc>
           <w:tcPr>
-            <w:tcW w:w="1724" w:type="dxa"/>
+            <w:tcW w:w="1946" w:type="dxa"/>
+            <w:gridSpan w:val="2"/>
           </w:tcPr>
           <w:p>
             <w:r>
@@ -4924,7 +4927,8 @@
         </w:tc>
         <w:tc>
           <w:tcPr>
-            <w:tcW w:w="9246" w:type="dxa"/>
+            <w:tcW w:w="9474" w:type="dxa"/>
+            <w:gridSpan w:val="4"/>
           </w:tcPr>
           <w:p>
             <w:pPr>
@@ -4938,54 +4942,448 @@
                 <w:lang w:eastAsia="en-NZ"/>
               </w:rPr>
             </w:pPr>
-            <w:r>
-              <w:rPr>
-                <w:rFonts w:ascii="Consolas" w:eastAsia="Times New Roman" w:hAnsi="Consolas" w:cs="Times New Roman"/>
-                <w:color w:val="CCCCCC"/>
-                <w:sz w:val="21"/>
-                <w:szCs w:val="21"/>
-                <w:lang w:eastAsia="en-NZ"/>
-              </w:rPr>
-              <w:drawing>
-                <wp:inline distT="0" distB="0" distL="0" distR="0" wp14:anchorId="71A45CC0" wp14:editId="498719D3">
-                  <wp:extent cx="5731510" cy="1204595"/>
-                  <wp:effectExtent l="0" t="0" r="2540" b="0"/>
-                  <wp:docPr id="1395630973" name="Picture 1"/>
-                  <wp:cNvGraphicFramePr>
-                    <a:graphicFrameLocks xmlns:a="http://schemas.openxmlformats.org/drawingml/2006/main" noChangeAspect="1"/>
-                  </wp:cNvGraphicFramePr>
-                  <a:graphic xmlns:a="http://schemas.openxmlformats.org/drawingml/2006/main">
-                    <a:graphicData uri="http://schemas.openxmlformats.org/drawingml/2006/picture">
-                      <pic:pic xmlns:pic="http://schemas.openxmlformats.org/drawingml/2006/picture">
-                        <pic:nvPicPr>
-                          <pic:cNvPr id="1395630973" name=""/>
-                          <pic:cNvPicPr/>
-                        </pic:nvPicPr>
-                        <pic:blipFill>
-                          <a:blip r:embed="rId9"/>
-                          <a:stretch>
-                            <a:fillRect/>
-                          </a:stretch>
-                        </pic:blipFill>
-                        <pic:spPr>
-                          <a:xfrm>
-                            <a:off x="0" y="0"/>
-                            <a:ext cx="5731510" cy="1204595"/>
-                          </a:xfrm>
-                          <a:prstGeom prst="rect">
-                            <a:avLst/>
-                          </a:prstGeom>
-                        </pic:spPr>
-                      </pic:pic>
-                    </a:graphicData>
-                  </a:graphic>
-                </wp:inline>
-              </w:drawing>
-            </w:r>
-          </w:p>
+          </w:p>
+        </w:tc>
+      </w:tr>
+      <w:tr>
+        <w:trPr>
+          <w:gridAfter w:val="1"/>
+          <w:wAfter w:w="3283" w:type="dxa"/>
+        </w:trPr>
+        <w:tc>
+          <w:tcPr>
+            <w:tcW w:w="761" w:type="dxa"/>
+          </w:tcPr>
+          <w:p>
+            <w:r>
+              <w:t xml:space="preserve">Date </w:t>
+            </w:r>
+          </w:p>
+        </w:tc>
+        <w:tc>
+          <w:tcPr>
+            <w:tcW w:w="2642" w:type="dxa"/>
+            <w:gridSpan w:val="2"/>
+          </w:tcPr>
+          <w:p>
+            <w:r>
+              <w:t>What is being tested</w:t>
+            </w:r>
+          </w:p>
+        </w:tc>
+        <w:tc>
+          <w:tcPr>
+            <w:tcW w:w="1417" w:type="dxa"/>
+          </w:tcPr>
+          <w:p>
+            <w:r>
+              <w:t>Type of test</w:t>
+            </w:r>
+          </w:p>
+        </w:tc>
+        <w:tc>
+          <w:tcPr>
+            <w:tcW w:w="2182" w:type="dxa"/>
+            <w:gridSpan w:val="2"/>
+          </w:tcPr>
+          <w:p>
+            <w:r>
+              <w:t xml:space="preserve">What is expected </w:t>
+            </w:r>
+          </w:p>
+        </w:tc>
+        <w:tc>
+          <w:tcPr>
+            <w:tcW w:w="1178" w:type="dxa"/>
+          </w:tcPr>
+          <w:p>
+            <w:r>
+              <w:t>What happened</w:t>
+            </w:r>
+          </w:p>
+        </w:tc>
+        <w:tc>
+          <w:tcPr>
+            <w:tcW w:w="3360" w:type="dxa"/>
+          </w:tcPr>
+          <w:p>
+            <w:r>
+              <w:t>Changes made</w:t>
+            </w:r>
+          </w:p>
+        </w:tc>
+      </w:tr>
+      <w:tr>
+        <w:trPr>
+          <w:gridAfter w:val="1"/>
+          <w:wAfter w:w="3283" w:type="dxa"/>
+        </w:trPr>
+        <w:tc>
+          <w:tcPr>
+            <w:tcW w:w="761" w:type="dxa"/>
+          </w:tcPr>
+          <w:p>
+            <w:r>
+              <w:t>28/03</w:t>
+            </w:r>
+          </w:p>
+        </w:tc>
+        <w:tc>
+          <w:tcPr>
+            <w:tcW w:w="2642" w:type="dxa"/>
+            <w:gridSpan w:val="2"/>
+          </w:tcPr>
+          <w:p>
+            <w:r>
+              <w:t>Enemy sprite damage taken</w:t>
+            </w:r>
+          </w:p>
+        </w:tc>
+        <w:tc>
+          <w:tcPr>
+            <w:tcW w:w="1417" w:type="dxa"/>
+          </w:tcPr>
+          <w:p>
+            <w:r>
+              <w:t>Expected</w:t>
+            </w:r>
+          </w:p>
+        </w:tc>
+        <w:tc>
+          <w:tcPr>
+            <w:tcW w:w="2182" w:type="dxa"/>
+            <w:gridSpan w:val="2"/>
+          </w:tcPr>
+          <w:p>
+            <w:r>
+              <w:t>Player takes damage when the colliding with the enemy on the attack frame</w:t>
+            </w:r>
+          </w:p>
+        </w:tc>
+        <w:tc>
+          <w:tcPr>
+            <w:tcW w:w="1178" w:type="dxa"/>
+          </w:tcPr>
+          <w:p>
+            <w:r>
+              <w:t>Player doesn’t take damage</w:t>
+            </w:r>
+          </w:p>
+        </w:tc>
+        <w:tc>
+          <w:tcPr>
+            <w:tcW w:w="3360" w:type="dxa"/>
+          </w:tcPr>
+          <w:p/>
+        </w:tc>
+      </w:tr>
+      <w:tr>
+        <w:trPr>
+          <w:gridAfter w:val="1"/>
+          <w:wAfter w:w="3283" w:type="dxa"/>
+        </w:trPr>
+        <w:tc>
+          <w:tcPr>
+            <w:tcW w:w="761" w:type="dxa"/>
+          </w:tcPr>
+          <w:p>
+            <w:r>
+              <w:t>28/03</w:t>
+            </w:r>
+          </w:p>
+        </w:tc>
+        <w:tc>
+          <w:tcPr>
+            <w:tcW w:w="2642" w:type="dxa"/>
+            <w:gridSpan w:val="2"/>
+          </w:tcPr>
+          <w:p>
+            <w:r>
+              <w:t>Check if hit function</w:t>
+            </w:r>
+          </w:p>
+        </w:tc>
+        <w:tc>
+          <w:tcPr>
+            <w:tcW w:w="1417" w:type="dxa"/>
+          </w:tcPr>
+          <w:p>
+            <w:r>
+              <w:t>Expected</w:t>
+            </w:r>
+          </w:p>
+        </w:tc>
+        <w:tc>
+          <w:tcPr>
+            <w:tcW w:w="2182" w:type="dxa"/>
+            <w:gridSpan w:val="2"/>
+          </w:tcPr>
+          <w:p>
+            <w:r>
+              <w:t>Function variables are true</w:t>
+            </w:r>
+          </w:p>
+        </w:tc>
+        <w:tc>
+          <w:tcPr>
+            <w:tcW w:w="1178" w:type="dxa"/>
+          </w:tcPr>
+          <w:p>
+            <w:r>
+              <w:t>Attack frame isn’t changed to true when the final frame is played</w:t>
+            </w:r>
+          </w:p>
+        </w:tc>
+        <w:tc>
+          <w:tcPr>
+            <w:tcW w:w="3360" w:type="dxa"/>
+          </w:tcPr>
+          <w:p>
+            <w:r>
+              <w:t>Function wasn’t called properly called function properly</w:t>
+            </w:r>
+          </w:p>
+        </w:tc>
+      </w:tr>
+      <w:tr>
+        <w:trPr>
+          <w:gridAfter w:val="1"/>
+          <w:wAfter w:w="3283" w:type="dxa"/>
+        </w:trPr>
+        <w:tc>
+          <w:tcPr>
+            <w:tcW w:w="761" w:type="dxa"/>
+          </w:tcPr>
+          <w:p>
+            <w:r>
+              <w:lastRenderedPageBreak/>
+              <w:t>28/03</w:t>
+            </w:r>
+          </w:p>
+        </w:tc>
+        <w:tc>
+          <w:tcPr>
+            <w:tcW w:w="2642" w:type="dxa"/>
+            <w:gridSpan w:val="2"/>
+          </w:tcPr>
+          <w:p>
+            <w:r>
+              <w:t>Enemy sprite damage taken</w:t>
+            </w:r>
+          </w:p>
+        </w:tc>
+        <w:tc>
+          <w:tcPr>
+            <w:tcW w:w="1417" w:type="dxa"/>
+          </w:tcPr>
+          <w:p>
+            <w:r>
+              <w:t>Expected</w:t>
+            </w:r>
+          </w:p>
+        </w:tc>
+        <w:tc>
+          <w:tcPr>
+            <w:tcW w:w="2182" w:type="dxa"/>
+            <w:gridSpan w:val="2"/>
+          </w:tcPr>
+          <w:p>
+            <w:r>
+              <w:t>Player takes damage when the colliding with the enemy on the attack frame</w:t>
+            </w:r>
+          </w:p>
+        </w:tc>
+        <w:tc>
+          <w:tcPr>
+            <w:tcW w:w="1178" w:type="dxa"/>
+          </w:tcPr>
+          <w:p/>
+        </w:tc>
+        <w:tc>
+          <w:tcPr>
+            <w:tcW w:w="3360" w:type="dxa"/>
+          </w:tcPr>
+          <w:p/>
+        </w:tc>
+      </w:tr>
+      <w:tr>
+        <w:trPr>
+          <w:gridAfter w:val="1"/>
+          <w:wAfter w:w="3283" w:type="dxa"/>
+        </w:trPr>
+        <w:tc>
+          <w:tcPr>
+            <w:tcW w:w="761" w:type="dxa"/>
+          </w:tcPr>
+          <w:p/>
+        </w:tc>
+        <w:tc>
+          <w:tcPr>
+            <w:tcW w:w="2642" w:type="dxa"/>
+            <w:gridSpan w:val="2"/>
+          </w:tcPr>
+          <w:p/>
+        </w:tc>
+        <w:tc>
+          <w:tcPr>
+            <w:tcW w:w="1417" w:type="dxa"/>
+          </w:tcPr>
+          <w:p/>
+        </w:tc>
+        <w:tc>
+          <w:tcPr>
+            <w:tcW w:w="2182" w:type="dxa"/>
+            <w:gridSpan w:val="2"/>
+          </w:tcPr>
+          <w:p/>
+        </w:tc>
+        <w:tc>
+          <w:tcPr>
+            <w:tcW w:w="1178" w:type="dxa"/>
+          </w:tcPr>
+          <w:p/>
+        </w:tc>
+        <w:tc>
+          <w:tcPr>
+            <w:tcW w:w="3360" w:type="dxa"/>
+          </w:tcPr>
+          <w:p/>
+        </w:tc>
+      </w:tr>
+      <w:tr>
+        <w:trPr>
+          <w:gridAfter w:val="1"/>
+          <w:wAfter w:w="3283" w:type="dxa"/>
+        </w:trPr>
+        <w:tc>
+          <w:tcPr>
+            <w:tcW w:w="761" w:type="dxa"/>
+          </w:tcPr>
+          <w:p/>
+        </w:tc>
+        <w:tc>
+          <w:tcPr>
+            <w:tcW w:w="2642" w:type="dxa"/>
+            <w:gridSpan w:val="2"/>
+          </w:tcPr>
+          <w:p/>
+        </w:tc>
+        <w:tc>
+          <w:tcPr>
+            <w:tcW w:w="1417" w:type="dxa"/>
+          </w:tcPr>
+          <w:p/>
+        </w:tc>
+        <w:tc>
+          <w:tcPr>
+            <w:tcW w:w="2182" w:type="dxa"/>
+            <w:gridSpan w:val="2"/>
+          </w:tcPr>
+          <w:p/>
+        </w:tc>
+        <w:tc>
+          <w:tcPr>
+            <w:tcW w:w="1178" w:type="dxa"/>
+          </w:tcPr>
+          <w:p/>
+        </w:tc>
+        <w:tc>
+          <w:tcPr>
+            <w:tcW w:w="3360" w:type="dxa"/>
+          </w:tcPr>
+          <w:p/>
+        </w:tc>
+      </w:tr>
+      <w:tr>
+        <w:trPr>
+          <w:gridAfter w:val="1"/>
+          <w:wAfter w:w="3283" w:type="dxa"/>
+        </w:trPr>
+        <w:tc>
+          <w:tcPr>
+            <w:tcW w:w="761" w:type="dxa"/>
+          </w:tcPr>
+          <w:p/>
+        </w:tc>
+        <w:tc>
+          <w:tcPr>
+            <w:tcW w:w="2642" w:type="dxa"/>
+            <w:gridSpan w:val="2"/>
+          </w:tcPr>
+          <w:p/>
+        </w:tc>
+        <w:tc>
+          <w:tcPr>
+            <w:tcW w:w="1417" w:type="dxa"/>
+          </w:tcPr>
+          <w:p/>
+        </w:tc>
+        <w:tc>
+          <w:tcPr>
+            <w:tcW w:w="2182" w:type="dxa"/>
+            <w:gridSpan w:val="2"/>
+          </w:tcPr>
+          <w:p/>
+        </w:tc>
+        <w:tc>
+          <w:tcPr>
+            <w:tcW w:w="1178" w:type="dxa"/>
+          </w:tcPr>
+          <w:p/>
+        </w:tc>
+        <w:tc>
+          <w:tcPr>
+            <w:tcW w:w="3360" w:type="dxa"/>
+          </w:tcPr>
+          <w:p/>
+        </w:tc>
+      </w:tr>
+      <w:tr>
+        <w:trPr>
+          <w:gridAfter w:val="1"/>
+          <w:wAfter w:w="3283" w:type="dxa"/>
+        </w:trPr>
+        <w:tc>
+          <w:tcPr>
+            <w:tcW w:w="761" w:type="dxa"/>
+          </w:tcPr>
+          <w:p/>
+        </w:tc>
+        <w:tc>
+          <w:tcPr>
+            <w:tcW w:w="2642" w:type="dxa"/>
+            <w:gridSpan w:val="2"/>
+          </w:tcPr>
+          <w:p/>
+        </w:tc>
+        <w:tc>
+          <w:tcPr>
+            <w:tcW w:w="1417" w:type="dxa"/>
+          </w:tcPr>
+          <w:p/>
+        </w:tc>
+        <w:tc>
+          <w:tcPr>
+            <w:tcW w:w="2182" w:type="dxa"/>
+            <w:gridSpan w:val="2"/>
+          </w:tcPr>
+          <w:p/>
+        </w:tc>
+        <w:tc>
+          <w:tcPr>
+            <w:tcW w:w="1178" w:type="dxa"/>
+          </w:tcPr>
+          <w:p/>
+        </w:tc>
+        <w:tc>
+          <w:tcPr>
+            <w:tcW w:w="3360" w:type="dxa"/>
+          </w:tcPr>
+          <w:p/>
         </w:tc>
       </w:tr>
     </w:tbl>
+    <w:p/>
     <w:p/>
     <w:sectPr>
       <w:pgSz w:w="11906" w:h="16838"/>

</xml_diff>

<commit_message>
might put a getter in
</commit_message>
<xml_diff>
--- a/documentation/ongoing_testing.docx
+++ b/documentation/ongoing_testing.docx
@@ -5197,7 +5197,11 @@
           <w:tcPr>
             <w:tcW w:w="1178" w:type="dxa"/>
           </w:tcPr>
-          <w:p/>
+          <w:p>
+            <w:r>
+              <w:t>Syntax error function calling isn’t working</w:t>
+            </w:r>
+          </w:p>
         </w:tc>
         <w:tc>
           <w:tcPr>

</xml_diff>

<commit_message>
Got hit texture to work
</commit_message>
<xml_diff>
--- a/documentation/ongoing_testing.docx
+++ b/documentation/ongoing_testing.docx
@@ -14,11 +14,11 @@
         <w:gridCol w:w="1358"/>
         <w:gridCol w:w="1419"/>
         <w:gridCol w:w="1417"/>
-        <w:gridCol w:w="462"/>
-        <w:gridCol w:w="1653"/>
-        <w:gridCol w:w="1178"/>
-        <w:gridCol w:w="3360"/>
-        <w:gridCol w:w="3215"/>
+        <w:gridCol w:w="331"/>
+        <w:gridCol w:w="1213"/>
+        <w:gridCol w:w="1199"/>
+        <w:gridCol w:w="5556"/>
+        <w:gridCol w:w="1569"/>
       </w:tblGrid>
       <w:tr>
         <w:tc>
@@ -43,7 +43,7 @@
         </w:tc>
         <w:tc>
           <w:tcPr>
-            <w:tcW w:w="1284" w:type="dxa"/>
+            <w:tcW w:w="1419" w:type="dxa"/>
           </w:tcPr>
           <w:p>
             <w:r>
@@ -53,7 +53,7 @@
         </w:tc>
         <w:tc>
           <w:tcPr>
-            <w:tcW w:w="1946" w:type="dxa"/>
+            <w:tcW w:w="1748" w:type="dxa"/>
             <w:gridSpan w:val="2"/>
           </w:tcPr>
           <w:p>
@@ -64,7 +64,7 @@
         </w:tc>
         <w:tc>
           <w:tcPr>
-            <w:tcW w:w="9474" w:type="dxa"/>
+            <w:tcW w:w="9537" w:type="dxa"/>
             <w:gridSpan w:val="4"/>
           </w:tcPr>
           <w:p>
@@ -97,7 +97,7 @@
         </w:tc>
         <w:tc>
           <w:tcPr>
-            <w:tcW w:w="1284" w:type="dxa"/>
+            <w:tcW w:w="1419" w:type="dxa"/>
           </w:tcPr>
           <w:p>
             <w:r>
@@ -107,37 +107,24 @@
         </w:tc>
         <w:tc>
           <w:tcPr>
-            <w:tcW w:w="1946" w:type="dxa"/>
+            <w:tcW w:w="1748" w:type="dxa"/>
             <w:gridSpan w:val="2"/>
           </w:tcPr>
           <w:p>
             <w:r>
-              <w:t xml:space="preserve">Vs code complains about </w:t>
-            </w:r>
-            <w:proofErr w:type="spellStart"/>
-            <w:r>
-              <w:t>vstd</w:t>
-            </w:r>
-            <w:proofErr w:type="spellEnd"/>
-            <w:r>
-              <w:t xml:space="preserve"> compression</w:t>
-            </w:r>
-          </w:p>
-        </w:tc>
-        <w:tc>
-          <w:tcPr>
-            <w:tcW w:w="9474" w:type="dxa"/>
+              <w:t>Vs code complains about vstd compression</w:t>
+            </w:r>
+          </w:p>
+        </w:tc>
+        <w:tc>
+          <w:tcPr>
+            <w:tcW w:w="9537" w:type="dxa"/>
             <w:gridSpan w:val="4"/>
           </w:tcPr>
           <w:p>
             <w:r>
-              <w:t xml:space="preserve">Changed compression type to </w:t>
-            </w:r>
-            <w:proofErr w:type="spellStart"/>
-            <w:r>
-              <w:t>zlib</w:t>
-            </w:r>
-            <w:proofErr w:type="spellEnd"/>
+              <w:t>Changed compression type to zlib</w:t>
+            </w:r>
           </w:p>
         </w:tc>
       </w:tr>
@@ -164,7 +151,7 @@
         </w:tc>
         <w:tc>
           <w:tcPr>
-            <w:tcW w:w="1284" w:type="dxa"/>
+            <w:tcW w:w="1419" w:type="dxa"/>
           </w:tcPr>
           <w:p>
             <w:r>
@@ -174,7 +161,7 @@
         </w:tc>
         <w:tc>
           <w:tcPr>
-            <w:tcW w:w="1946" w:type="dxa"/>
+            <w:tcW w:w="1748" w:type="dxa"/>
             <w:gridSpan w:val="2"/>
           </w:tcPr>
           <w:p>
@@ -185,7 +172,7 @@
         </w:tc>
         <w:tc>
           <w:tcPr>
-            <w:tcW w:w="9474" w:type="dxa"/>
+            <w:tcW w:w="9537" w:type="dxa"/>
             <w:gridSpan w:val="4"/>
           </w:tcPr>
           <w:p>
@@ -218,7 +205,7 @@
         </w:tc>
         <w:tc>
           <w:tcPr>
-            <w:tcW w:w="1284" w:type="dxa"/>
+            <w:tcW w:w="1419" w:type="dxa"/>
           </w:tcPr>
           <w:p>
             <w:r>
@@ -228,7 +215,7 @@
         </w:tc>
         <w:tc>
           <w:tcPr>
-            <w:tcW w:w="1946" w:type="dxa"/>
+            <w:tcW w:w="1748" w:type="dxa"/>
             <w:gridSpan w:val="2"/>
           </w:tcPr>
           <w:p>
@@ -239,7 +226,7 @@
         </w:tc>
         <w:tc>
           <w:tcPr>
-            <w:tcW w:w="9474" w:type="dxa"/>
+            <w:tcW w:w="9537" w:type="dxa"/>
             <w:gridSpan w:val="4"/>
           </w:tcPr>
           <w:p>
@@ -272,7 +259,7 @@
         </w:tc>
         <w:tc>
           <w:tcPr>
-            <w:tcW w:w="1284" w:type="dxa"/>
+            <w:tcW w:w="1419" w:type="dxa"/>
           </w:tcPr>
           <w:p>
             <w:r>
@@ -282,7 +269,7 @@
         </w:tc>
         <w:tc>
           <w:tcPr>
-            <w:tcW w:w="1946" w:type="dxa"/>
+            <w:tcW w:w="1748" w:type="dxa"/>
             <w:gridSpan w:val="2"/>
           </w:tcPr>
           <w:p>
@@ -293,7 +280,7 @@
         </w:tc>
         <w:tc>
           <w:tcPr>
-            <w:tcW w:w="9474" w:type="dxa"/>
+            <w:tcW w:w="9537" w:type="dxa"/>
             <w:gridSpan w:val="4"/>
           </w:tcPr>
           <w:p/>
@@ -322,7 +309,7 @@
         </w:tc>
         <w:tc>
           <w:tcPr>
-            <w:tcW w:w="1284" w:type="dxa"/>
+            <w:tcW w:w="1419" w:type="dxa"/>
           </w:tcPr>
           <w:p>
             <w:r>
@@ -332,7 +319,7 @@
         </w:tc>
         <w:tc>
           <w:tcPr>
-            <w:tcW w:w="1946" w:type="dxa"/>
+            <w:tcW w:w="1748" w:type="dxa"/>
             <w:gridSpan w:val="2"/>
           </w:tcPr>
           <w:p>
@@ -343,7 +330,7 @@
         </w:tc>
         <w:tc>
           <w:tcPr>
-            <w:tcW w:w="9474" w:type="dxa"/>
+            <w:tcW w:w="9537" w:type="dxa"/>
             <w:gridSpan w:val="4"/>
           </w:tcPr>
           <w:p>
@@ -367,7 +354,6 @@
                 <w:lang w:eastAsia="en-NZ"/>
               </w:rPr>
             </w:pPr>
-            <w:proofErr w:type="spellStart"/>
             <w:r>
               <w:rPr>
                 <w:rFonts w:ascii="Consolas" w:eastAsia="Times New Roman" w:hAnsi="Consolas" w:cs="Times New Roman"/>
@@ -398,7 +384,6 @@
               </w:rPr>
               <w:t>hit_box</w:t>
             </w:r>
-            <w:proofErr w:type="spellEnd"/>
             <w:r>
               <w:rPr>
                 <w:rFonts w:ascii="Consolas" w:eastAsia="Times New Roman" w:hAnsi="Consolas" w:cs="Times New Roman"/>
@@ -409,7 +394,6 @@
               </w:rPr>
               <w:t xml:space="preserve"> = </w:t>
             </w:r>
-            <w:proofErr w:type="spellStart"/>
             <w:r>
               <w:rPr>
                 <w:rFonts w:ascii="Consolas" w:eastAsia="Times New Roman" w:hAnsi="Consolas" w:cs="Times New Roman"/>
@@ -450,7 +434,6 @@
               </w:rPr>
               <w:t>.hit_box_points</w:t>
             </w:r>
-            <w:proofErr w:type="spellEnd"/>
           </w:p>
           <w:p/>
         </w:tc>
@@ -478,7 +461,7 @@
         </w:tc>
         <w:tc>
           <w:tcPr>
-            <w:tcW w:w="1284" w:type="dxa"/>
+            <w:tcW w:w="1419" w:type="dxa"/>
           </w:tcPr>
           <w:p>
             <w:r>
@@ -488,7 +471,7 @@
         </w:tc>
         <w:tc>
           <w:tcPr>
-            <w:tcW w:w="1946" w:type="dxa"/>
+            <w:tcW w:w="1748" w:type="dxa"/>
             <w:gridSpan w:val="2"/>
           </w:tcPr>
           <w:p>
@@ -499,7 +482,7 @@
         </w:tc>
         <w:tc>
           <w:tcPr>
-            <w:tcW w:w="9474" w:type="dxa"/>
+            <w:tcW w:w="9537" w:type="dxa"/>
             <w:gridSpan w:val="4"/>
           </w:tcPr>
           <w:p>
@@ -542,8 +525,6 @@
               </w:rPr>
               <w:t xml:space="preserve">        </w:t>
             </w:r>
-            <w:proofErr w:type="spellStart"/>
-            <w:proofErr w:type="gramStart"/>
             <w:r>
               <w:rPr>
                 <w:rFonts w:ascii="Consolas" w:eastAsia="Times New Roman" w:hAnsi="Consolas" w:cs="Times New Roman"/>
@@ -572,9 +553,18 @@
                 <w:szCs w:val="21"/>
                 <w:lang w:eastAsia="en-NZ"/>
               </w:rPr>
-              <w:t>hitbox</w:t>
-            </w:r>
-            <w:proofErr w:type="gramEnd"/>
+              <w:t>hitbox_texture</w:t>
+            </w:r>
+            <w:r>
+              <w:rPr>
+                <w:rFonts w:ascii="Consolas" w:eastAsia="Times New Roman" w:hAnsi="Consolas" w:cs="Times New Roman"/>
+                <w:color w:val="D4D4D4"/>
+                <w:sz w:val="21"/>
+                <w:szCs w:val="21"/>
+                <w:lang w:eastAsia="en-NZ"/>
+              </w:rPr>
+              <w:t xml:space="preserve"> = </w:t>
+            </w:r>
             <w:r>
               <w:rPr>
                 <w:rFonts w:ascii="Consolas" w:eastAsia="Times New Roman" w:hAnsi="Consolas" w:cs="Times New Roman"/>
@@ -583,9 +573,8 @@
                 <w:szCs w:val="21"/>
                 <w:lang w:eastAsia="en-NZ"/>
               </w:rPr>
-              <w:t>_texture</w:t>
-            </w:r>
-            <w:proofErr w:type="spellEnd"/>
+              <w:t>self</w:t>
+            </w:r>
             <w:r>
               <w:rPr>
                 <w:rFonts w:ascii="Consolas" w:eastAsia="Times New Roman" w:hAnsi="Consolas" w:cs="Times New Roman"/>
@@ -594,9 +583,8 @@
                 <w:szCs w:val="21"/>
                 <w:lang w:eastAsia="en-NZ"/>
               </w:rPr>
-              <w:t xml:space="preserve"> = </w:t>
-            </w:r>
-            <w:proofErr w:type="spellStart"/>
+              <w:t>.</w:t>
+            </w:r>
             <w:r>
               <w:rPr>
                 <w:rFonts w:ascii="Consolas" w:eastAsia="Times New Roman" w:hAnsi="Consolas" w:cs="Times New Roman"/>
@@ -605,29 +593,8 @@
                 <w:szCs w:val="21"/>
                 <w:lang w:eastAsia="en-NZ"/>
               </w:rPr>
-              <w:t>self</w:t>
-            </w:r>
-            <w:r>
-              <w:rPr>
-                <w:rFonts w:ascii="Consolas" w:eastAsia="Times New Roman" w:hAnsi="Consolas" w:cs="Times New Roman"/>
-                <w:color w:val="D4D4D4"/>
-                <w:sz w:val="21"/>
-                <w:szCs w:val="21"/>
-                <w:lang w:eastAsia="en-NZ"/>
-              </w:rPr>
-              <w:t>.</w:t>
-            </w:r>
-            <w:r>
-              <w:rPr>
-                <w:rFonts w:ascii="Consolas" w:eastAsia="Times New Roman" w:hAnsi="Consolas" w:cs="Times New Roman"/>
-                <w:color w:val="9CDCFE"/>
-                <w:sz w:val="21"/>
-                <w:szCs w:val="21"/>
-                <w:lang w:eastAsia="en-NZ"/>
-              </w:rPr>
               <w:t>idle_texture_pair</w:t>
             </w:r>
-            <w:proofErr w:type="spellEnd"/>
             <w:r>
               <w:rPr>
                 <w:rFonts w:ascii="Consolas" w:eastAsia="Times New Roman" w:hAnsi="Consolas" w:cs="Times New Roman"/>
@@ -681,7 +648,6 @@
               </w:rPr>
               <w:t xml:space="preserve">        </w:t>
             </w:r>
-            <w:proofErr w:type="spellStart"/>
             <w:r>
               <w:rPr>
                 <w:rFonts w:ascii="Consolas" w:eastAsia="Times New Roman" w:hAnsi="Consolas" w:cs="Times New Roman"/>
@@ -712,7 +678,6 @@
               </w:rPr>
               <w:t>hit_box</w:t>
             </w:r>
-            <w:proofErr w:type="spellEnd"/>
             <w:r>
               <w:rPr>
                 <w:rFonts w:ascii="Consolas" w:eastAsia="Times New Roman" w:hAnsi="Consolas" w:cs="Times New Roman"/>
@@ -723,7 +688,6 @@
               </w:rPr>
               <w:t xml:space="preserve"> = </w:t>
             </w:r>
-            <w:proofErr w:type="spellStart"/>
             <w:r>
               <w:rPr>
                 <w:rFonts w:ascii="Consolas" w:eastAsia="Times New Roman" w:hAnsi="Consolas" w:cs="Times New Roman"/>
@@ -774,7 +738,6 @@
               </w:rPr>
               <w:t>hit_box_points</w:t>
             </w:r>
-            <w:proofErr w:type="spellEnd"/>
           </w:p>
           <w:p/>
         </w:tc>
@@ -802,7 +765,7 @@
         </w:tc>
         <w:tc>
           <w:tcPr>
-            <w:tcW w:w="1284" w:type="dxa"/>
+            <w:tcW w:w="1419" w:type="dxa"/>
           </w:tcPr>
           <w:p>
             <w:r>
@@ -812,7 +775,7 @@
         </w:tc>
         <w:tc>
           <w:tcPr>
-            <w:tcW w:w="1946" w:type="dxa"/>
+            <w:tcW w:w="1748" w:type="dxa"/>
             <w:gridSpan w:val="2"/>
           </w:tcPr>
           <w:p>
@@ -823,7 +786,7 @@
         </w:tc>
         <w:tc>
           <w:tcPr>
-            <w:tcW w:w="9474" w:type="dxa"/>
+            <w:tcW w:w="9537" w:type="dxa"/>
             <w:gridSpan w:val="4"/>
           </w:tcPr>
           <w:p>
@@ -856,7 +819,7 @@
         </w:tc>
         <w:tc>
           <w:tcPr>
-            <w:tcW w:w="1284" w:type="dxa"/>
+            <w:tcW w:w="1419" w:type="dxa"/>
           </w:tcPr>
           <w:p>
             <w:r>
@@ -866,7 +829,7 @@
         </w:tc>
         <w:tc>
           <w:tcPr>
-            <w:tcW w:w="1946" w:type="dxa"/>
+            <w:tcW w:w="1748" w:type="dxa"/>
             <w:gridSpan w:val="2"/>
           </w:tcPr>
           <w:p>
@@ -877,7 +840,7 @@
         </w:tc>
         <w:tc>
           <w:tcPr>
-            <w:tcW w:w="9474" w:type="dxa"/>
+            <w:tcW w:w="9537" w:type="dxa"/>
             <w:gridSpan w:val="4"/>
           </w:tcPr>
           <w:p>
@@ -910,7 +873,7 @@
         </w:tc>
         <w:tc>
           <w:tcPr>
-            <w:tcW w:w="1284" w:type="dxa"/>
+            <w:tcW w:w="1419" w:type="dxa"/>
           </w:tcPr>
           <w:p>
             <w:r>
@@ -920,7 +883,7 @@
         </w:tc>
         <w:tc>
           <w:tcPr>
-            <w:tcW w:w="1946" w:type="dxa"/>
+            <w:tcW w:w="1748" w:type="dxa"/>
             <w:gridSpan w:val="2"/>
           </w:tcPr>
           <w:p>
@@ -931,20 +894,12 @@
         </w:tc>
         <w:tc>
           <w:tcPr>
-            <w:tcW w:w="9474" w:type="dxa"/>
+            <w:tcW w:w="9537" w:type="dxa"/>
             <w:gridSpan w:val="4"/>
           </w:tcPr>
           <w:p>
             <w:r>
-              <w:t xml:space="preserve">Called function in </w:t>
-            </w:r>
-            <w:proofErr w:type="spellStart"/>
-            <w:r>
-              <w:t>on_update</w:t>
-            </w:r>
-            <w:proofErr w:type="spellEnd"/>
-            <w:r>
-              <w:t xml:space="preserve"> function</w:t>
+              <w:t>Called function in on_update function</w:t>
             </w:r>
           </w:p>
         </w:tc>
@@ -972,7 +927,7 @@
         </w:tc>
         <w:tc>
           <w:tcPr>
-            <w:tcW w:w="1284" w:type="dxa"/>
+            <w:tcW w:w="1419" w:type="dxa"/>
           </w:tcPr>
           <w:p>
             <w:r>
@@ -986,7 +941,7 @@
         </w:tc>
         <w:tc>
           <w:tcPr>
-            <w:tcW w:w="1946" w:type="dxa"/>
+            <w:tcW w:w="1748" w:type="dxa"/>
             <w:gridSpan w:val="2"/>
           </w:tcPr>
           <w:p>
@@ -998,7 +953,7 @@
         </w:tc>
         <w:tc>
           <w:tcPr>
-            <w:tcW w:w="9474" w:type="dxa"/>
+            <w:tcW w:w="9537" w:type="dxa"/>
             <w:gridSpan w:val="4"/>
           </w:tcPr>
           <w:p>
@@ -1032,7 +987,7 @@
         </w:tc>
         <w:tc>
           <w:tcPr>
-            <w:tcW w:w="1284" w:type="dxa"/>
+            <w:tcW w:w="1419" w:type="dxa"/>
           </w:tcPr>
           <w:p>
             <w:r>
@@ -1042,7 +997,7 @@
         </w:tc>
         <w:tc>
           <w:tcPr>
-            <w:tcW w:w="1946" w:type="dxa"/>
+            <w:tcW w:w="1748" w:type="dxa"/>
             <w:gridSpan w:val="2"/>
           </w:tcPr>
           <w:p>
@@ -1053,7 +1008,7 @@
         </w:tc>
         <w:tc>
           <w:tcPr>
-            <w:tcW w:w="9474" w:type="dxa"/>
+            <w:tcW w:w="9537" w:type="dxa"/>
             <w:gridSpan w:val="4"/>
           </w:tcPr>
           <w:p>
@@ -1088,8 +1043,6 @@
               </w:rPr>
               <w:t xml:space="preserve"> </w:t>
             </w:r>
-            <w:proofErr w:type="spellStart"/>
-            <w:proofErr w:type="gramStart"/>
             <w:r>
               <w:rPr>
                 <w:rFonts w:ascii="Consolas" w:eastAsia="Times New Roman" w:hAnsi="Consolas" w:cs="Times New Roman"/>
@@ -1118,20 +1071,8 @@
                 <w:szCs w:val="21"/>
                 <w:lang w:eastAsia="en-NZ"/>
               </w:rPr>
-              <w:t>change</w:t>
-            </w:r>
-            <w:proofErr w:type="gramEnd"/>
-            <w:r>
-              <w:rPr>
-                <w:rFonts w:ascii="Consolas" w:eastAsia="Times New Roman" w:hAnsi="Consolas" w:cs="Times New Roman"/>
-                <w:color w:val="9CDCFE"/>
-                <w:sz w:val="21"/>
-                <w:szCs w:val="21"/>
-                <w:lang w:eastAsia="en-NZ"/>
-              </w:rPr>
-              <w:t>_y</w:t>
-            </w:r>
-            <w:proofErr w:type="spellEnd"/>
+              <w:t>change_y</w:t>
+            </w:r>
             <w:r>
               <w:rPr>
                 <w:rFonts w:ascii="Consolas" w:eastAsia="Times New Roman" w:hAnsi="Consolas" w:cs="Times New Roman"/>
@@ -1205,8 +1146,6 @@
               </w:rPr>
               <w:t xml:space="preserve">            </w:t>
             </w:r>
-            <w:proofErr w:type="spellStart"/>
-            <w:proofErr w:type="gramStart"/>
             <w:r>
               <w:rPr>
                 <w:rFonts w:ascii="Consolas" w:eastAsia="Times New Roman" w:hAnsi="Consolas" w:cs="Times New Roman"/>
@@ -1237,8 +1176,6 @@
               </w:rPr>
               <w:t>texture</w:t>
             </w:r>
-            <w:proofErr w:type="spellEnd"/>
-            <w:proofErr w:type="gramEnd"/>
             <w:r>
               <w:rPr>
                 <w:rFonts w:ascii="Consolas" w:eastAsia="Times New Roman" w:hAnsi="Consolas" w:cs="Times New Roman"/>
@@ -1269,7 +1206,6 @@
               </w:rPr>
               <w:t xml:space="preserve"> </w:t>
             </w:r>
-            <w:proofErr w:type="spellStart"/>
             <w:r>
               <w:rPr>
                 <w:rFonts w:ascii="Consolas" w:eastAsia="Times New Roman" w:hAnsi="Consolas" w:cs="Times New Roman"/>
@@ -1300,7 +1236,6 @@
               </w:rPr>
               <w:t>fall_textures</w:t>
             </w:r>
-            <w:proofErr w:type="spellEnd"/>
             <w:r>
               <w:rPr>
                 <w:rFonts w:ascii="Consolas" w:eastAsia="Times New Roman" w:hAnsi="Consolas" w:cs="Times New Roman"/>
@@ -1331,7 +1266,6 @@
               </w:rPr>
               <w:t>][</w:t>
             </w:r>
-            <w:proofErr w:type="spellStart"/>
             <w:r>
               <w:rPr>
                 <w:rFonts w:ascii="Consolas" w:eastAsia="Times New Roman" w:hAnsi="Consolas" w:cs="Times New Roman"/>
@@ -1362,7 +1296,6 @@
               </w:rPr>
               <w:t>character_face_direction</w:t>
             </w:r>
-            <w:proofErr w:type="spellEnd"/>
             <w:r>
               <w:rPr>
                 <w:rFonts w:ascii="Consolas" w:eastAsia="Times New Roman" w:hAnsi="Consolas" w:cs="Times New Roman"/>
@@ -1416,8 +1349,6 @@
               </w:rPr>
               <w:t xml:space="preserve"> </w:t>
             </w:r>
-            <w:proofErr w:type="spellStart"/>
-            <w:proofErr w:type="gramStart"/>
             <w:r>
               <w:rPr>
                 <w:rFonts w:ascii="Consolas" w:eastAsia="Times New Roman" w:hAnsi="Consolas" w:cs="Times New Roman"/>
@@ -1446,20 +1377,8 @@
                 <w:szCs w:val="21"/>
                 <w:lang w:eastAsia="en-NZ"/>
               </w:rPr>
-              <w:t>change</w:t>
-            </w:r>
-            <w:proofErr w:type="gramEnd"/>
-            <w:r>
-              <w:rPr>
-                <w:rFonts w:ascii="Consolas" w:eastAsia="Times New Roman" w:hAnsi="Consolas" w:cs="Times New Roman"/>
-                <w:color w:val="9CDCFE"/>
-                <w:sz w:val="21"/>
-                <w:szCs w:val="21"/>
-                <w:lang w:eastAsia="en-NZ"/>
-              </w:rPr>
-              <w:t>_y</w:t>
-            </w:r>
-            <w:proofErr w:type="spellEnd"/>
+              <w:t>change_y</w:t>
+            </w:r>
             <w:r>
               <w:rPr>
                 <w:rFonts w:ascii="Consolas" w:eastAsia="Times New Roman" w:hAnsi="Consolas" w:cs="Times New Roman"/>
@@ -1543,8 +1462,6 @@
               </w:rPr>
               <w:t xml:space="preserve">            </w:t>
             </w:r>
-            <w:proofErr w:type="spellStart"/>
-            <w:proofErr w:type="gramStart"/>
             <w:r>
               <w:rPr>
                 <w:rFonts w:ascii="Consolas" w:eastAsia="Times New Roman" w:hAnsi="Consolas" w:cs="Times New Roman"/>
@@ -1575,8 +1492,6 @@
               </w:rPr>
               <w:t>texture</w:t>
             </w:r>
-            <w:proofErr w:type="spellEnd"/>
-            <w:proofErr w:type="gramEnd"/>
             <w:r>
               <w:rPr>
                 <w:rFonts w:ascii="Consolas" w:eastAsia="Times New Roman" w:hAnsi="Consolas" w:cs="Times New Roman"/>
@@ -1607,7 +1522,6 @@
               </w:rPr>
               <w:t xml:space="preserve"> </w:t>
             </w:r>
-            <w:proofErr w:type="spellStart"/>
             <w:r>
               <w:rPr>
                 <w:rFonts w:ascii="Consolas" w:eastAsia="Times New Roman" w:hAnsi="Consolas" w:cs="Times New Roman"/>
@@ -1638,7 +1552,6 @@
               </w:rPr>
               <w:t>fall_textures</w:t>
             </w:r>
-            <w:proofErr w:type="spellEnd"/>
             <w:r>
               <w:rPr>
                 <w:rFonts w:ascii="Consolas" w:eastAsia="Times New Roman" w:hAnsi="Consolas" w:cs="Times New Roman"/>
@@ -1669,7 +1582,6 @@
               </w:rPr>
               <w:t>][</w:t>
             </w:r>
-            <w:proofErr w:type="spellStart"/>
             <w:r>
               <w:rPr>
                 <w:rFonts w:ascii="Consolas" w:eastAsia="Times New Roman" w:hAnsi="Consolas" w:cs="Times New Roman"/>
@@ -1700,7 +1612,6 @@
               </w:rPr>
               <w:t>character_face_direction</w:t>
             </w:r>
-            <w:proofErr w:type="spellEnd"/>
             <w:r>
               <w:rPr>
                 <w:rFonts w:ascii="Consolas" w:eastAsia="Times New Roman" w:hAnsi="Consolas" w:cs="Times New Roman"/>
@@ -1743,7 +1654,7 @@
         </w:tc>
         <w:tc>
           <w:tcPr>
-            <w:tcW w:w="1284" w:type="dxa"/>
+            <w:tcW w:w="1419" w:type="dxa"/>
           </w:tcPr>
           <w:p>
             <w:r>
@@ -1753,7 +1664,7 @@
         </w:tc>
         <w:tc>
           <w:tcPr>
-            <w:tcW w:w="1946" w:type="dxa"/>
+            <w:tcW w:w="1748" w:type="dxa"/>
             <w:gridSpan w:val="2"/>
           </w:tcPr>
           <w:p>
@@ -1764,7 +1675,7 @@
         </w:tc>
         <w:tc>
           <w:tcPr>
-            <w:tcW w:w="9474" w:type="dxa"/>
+            <w:tcW w:w="9537" w:type="dxa"/>
             <w:gridSpan w:val="4"/>
           </w:tcPr>
           <w:p>
@@ -1805,7 +1716,7 @@
         </w:tc>
         <w:tc>
           <w:tcPr>
-            <w:tcW w:w="1284" w:type="dxa"/>
+            <w:tcW w:w="1419" w:type="dxa"/>
           </w:tcPr>
           <w:p>
             <w:r>
@@ -1815,7 +1726,7 @@
         </w:tc>
         <w:tc>
           <w:tcPr>
-            <w:tcW w:w="1946" w:type="dxa"/>
+            <w:tcW w:w="1748" w:type="dxa"/>
             <w:gridSpan w:val="2"/>
           </w:tcPr>
           <w:p>
@@ -1826,7 +1737,7 @@
         </w:tc>
         <w:tc>
           <w:tcPr>
-            <w:tcW w:w="9474" w:type="dxa"/>
+            <w:tcW w:w="9537" w:type="dxa"/>
             <w:gridSpan w:val="4"/>
           </w:tcPr>
           <w:p>
@@ -1925,7 +1836,7 @@
         </w:tc>
         <w:tc>
           <w:tcPr>
-            <w:tcW w:w="1284" w:type="dxa"/>
+            <w:tcW w:w="1419" w:type="dxa"/>
           </w:tcPr>
           <w:p>
             <w:r>
@@ -1935,7 +1846,7 @@
         </w:tc>
         <w:tc>
           <w:tcPr>
-            <w:tcW w:w="1946" w:type="dxa"/>
+            <w:tcW w:w="1748" w:type="dxa"/>
             <w:gridSpan w:val="2"/>
           </w:tcPr>
           <w:p>
@@ -1946,7 +1857,7 @@
         </w:tc>
         <w:tc>
           <w:tcPr>
-            <w:tcW w:w="9474" w:type="dxa"/>
+            <w:tcW w:w="9537" w:type="dxa"/>
             <w:gridSpan w:val="4"/>
           </w:tcPr>
           <w:p>
@@ -2000,7 +1911,7 @@
         </w:tc>
         <w:tc>
           <w:tcPr>
-            <w:tcW w:w="1284" w:type="dxa"/>
+            <w:tcW w:w="1419" w:type="dxa"/>
           </w:tcPr>
           <w:p>
             <w:r>
@@ -2010,7 +1921,7 @@
         </w:tc>
         <w:tc>
           <w:tcPr>
-            <w:tcW w:w="1946" w:type="dxa"/>
+            <w:tcW w:w="1748" w:type="dxa"/>
             <w:gridSpan w:val="2"/>
           </w:tcPr>
           <w:p>
@@ -2021,7 +1932,7 @@
         </w:tc>
         <w:tc>
           <w:tcPr>
-            <w:tcW w:w="9474" w:type="dxa"/>
+            <w:tcW w:w="9537" w:type="dxa"/>
             <w:gridSpan w:val="4"/>
           </w:tcPr>
           <w:p>
@@ -2075,7 +1986,7 @@
         </w:tc>
         <w:tc>
           <w:tcPr>
-            <w:tcW w:w="1284" w:type="dxa"/>
+            <w:tcW w:w="1419" w:type="dxa"/>
           </w:tcPr>
           <w:p>
             <w:r>
@@ -2085,7 +1996,7 @@
         </w:tc>
         <w:tc>
           <w:tcPr>
-            <w:tcW w:w="1946" w:type="dxa"/>
+            <w:tcW w:w="1748" w:type="dxa"/>
             <w:gridSpan w:val="2"/>
           </w:tcPr>
           <w:p>
@@ -2096,7 +2007,7 @@
         </w:tc>
         <w:tc>
           <w:tcPr>
-            <w:tcW w:w="9474" w:type="dxa"/>
+            <w:tcW w:w="9537" w:type="dxa"/>
             <w:gridSpan w:val="4"/>
           </w:tcPr>
           <w:p>
@@ -2150,7 +2061,7 @@
         </w:tc>
         <w:tc>
           <w:tcPr>
-            <w:tcW w:w="1284" w:type="dxa"/>
+            <w:tcW w:w="1419" w:type="dxa"/>
           </w:tcPr>
           <w:p>
             <w:r>
@@ -2160,7 +2071,7 @@
         </w:tc>
         <w:tc>
           <w:tcPr>
-            <w:tcW w:w="1946" w:type="dxa"/>
+            <w:tcW w:w="1748" w:type="dxa"/>
             <w:gridSpan w:val="2"/>
           </w:tcPr>
           <w:p>
@@ -2171,7 +2082,7 @@
         </w:tc>
         <w:tc>
           <w:tcPr>
-            <w:tcW w:w="9474" w:type="dxa"/>
+            <w:tcW w:w="9537" w:type="dxa"/>
             <w:gridSpan w:val="4"/>
           </w:tcPr>
           <w:p>
@@ -2225,7 +2136,7 @@
         </w:tc>
         <w:tc>
           <w:tcPr>
-            <w:tcW w:w="1284" w:type="dxa"/>
+            <w:tcW w:w="1419" w:type="dxa"/>
           </w:tcPr>
           <w:p>
             <w:r>
@@ -2235,7 +2146,7 @@
         </w:tc>
         <w:tc>
           <w:tcPr>
-            <w:tcW w:w="1946" w:type="dxa"/>
+            <w:tcW w:w="1748" w:type="dxa"/>
             <w:gridSpan w:val="2"/>
           </w:tcPr>
           <w:p>
@@ -2251,7 +2162,7 @@
         </w:tc>
         <w:tc>
           <w:tcPr>
-            <w:tcW w:w="9474" w:type="dxa"/>
+            <w:tcW w:w="9537" w:type="dxa"/>
             <w:gridSpan w:val="4"/>
           </w:tcPr>
           <w:p>
@@ -2305,7 +2216,7 @@
         </w:tc>
         <w:tc>
           <w:tcPr>
-            <w:tcW w:w="1284" w:type="dxa"/>
+            <w:tcW w:w="1419" w:type="dxa"/>
           </w:tcPr>
           <w:p>
             <w:r>
@@ -2315,7 +2226,7 @@
         </w:tc>
         <w:tc>
           <w:tcPr>
-            <w:tcW w:w="1946" w:type="dxa"/>
+            <w:tcW w:w="1748" w:type="dxa"/>
             <w:gridSpan w:val="2"/>
           </w:tcPr>
           <w:p>
@@ -2326,7 +2237,7 @@
         </w:tc>
         <w:tc>
           <w:tcPr>
-            <w:tcW w:w="9474" w:type="dxa"/>
+            <w:tcW w:w="9537" w:type="dxa"/>
             <w:gridSpan w:val="4"/>
           </w:tcPr>
           <w:p>
@@ -2349,63 +2260,7 @@
                 <w:szCs w:val="21"/>
                 <w:lang w:eastAsia="en-NZ"/>
               </w:rPr>
-              <w:t xml:space="preserve">Changed code from </w:t>
-            </w:r>
-            <w:proofErr w:type="spellStart"/>
-            <w:proofErr w:type="gramStart"/>
-            <w:r>
-              <w:rPr>
-                <w:rFonts w:ascii="Consolas" w:eastAsia="Times New Roman" w:hAnsi="Consolas" w:cs="Times New Roman"/>
-                <w:color w:val="CCCCCC"/>
-                <w:sz w:val="21"/>
-                <w:szCs w:val="21"/>
-                <w:lang w:eastAsia="en-NZ"/>
-              </w:rPr>
-              <w:t>self.change</w:t>
-            </w:r>
-            <w:proofErr w:type="gramEnd"/>
-            <w:r>
-              <w:rPr>
-                <w:rFonts w:ascii="Consolas" w:eastAsia="Times New Roman" w:hAnsi="Consolas" w:cs="Times New Roman"/>
-                <w:color w:val="CCCCCC"/>
-                <w:sz w:val="21"/>
-                <w:szCs w:val="21"/>
-                <w:lang w:eastAsia="en-NZ"/>
-              </w:rPr>
-              <w:t>_x</w:t>
-            </w:r>
-            <w:proofErr w:type="spellEnd"/>
-            <w:r>
-              <w:rPr>
-                <w:rFonts w:ascii="Consolas" w:eastAsia="Times New Roman" w:hAnsi="Consolas" w:cs="Times New Roman"/>
-                <w:color w:val="CCCCCC"/>
-                <w:sz w:val="21"/>
-                <w:szCs w:val="21"/>
-                <w:lang w:eastAsia="en-NZ"/>
-              </w:rPr>
-              <w:t xml:space="preserve"> to </w:t>
-            </w:r>
-            <w:proofErr w:type="spellStart"/>
-            <w:r>
-              <w:rPr>
-                <w:rFonts w:ascii="Consolas" w:eastAsia="Times New Roman" w:hAnsi="Consolas" w:cs="Times New Roman"/>
-                <w:color w:val="CCCCCC"/>
-                <w:sz w:val="21"/>
-                <w:szCs w:val="21"/>
-                <w:lang w:eastAsia="en-NZ"/>
-              </w:rPr>
-              <w:t>self.center</w:t>
-            </w:r>
-            <w:proofErr w:type="spellEnd"/>
-            <w:r>
-              <w:rPr>
-                <w:rFonts w:ascii="Consolas" w:eastAsia="Times New Roman" w:hAnsi="Consolas" w:cs="Times New Roman"/>
-                <w:color w:val="CCCCCC"/>
-                <w:sz w:val="21"/>
-                <w:szCs w:val="21"/>
-                <w:lang w:eastAsia="en-NZ"/>
-              </w:rPr>
-              <w:t xml:space="preserve"> += x</w:t>
+              <w:t>Changed code from self.change_x to self.center += x</w:t>
             </w:r>
           </w:p>
         </w:tc>
@@ -2436,7 +2291,7 @@
         </w:tc>
         <w:tc>
           <w:tcPr>
-            <w:tcW w:w="1284" w:type="dxa"/>
+            <w:tcW w:w="1419" w:type="dxa"/>
           </w:tcPr>
           <w:p>
             <w:r>
@@ -2446,23 +2301,18 @@
         </w:tc>
         <w:tc>
           <w:tcPr>
-            <w:tcW w:w="1946" w:type="dxa"/>
+            <w:tcW w:w="1748" w:type="dxa"/>
             <w:gridSpan w:val="2"/>
           </w:tcPr>
           <w:p>
             <w:r>
-              <w:t xml:space="preserve">Enemy sprites </w:t>
-            </w:r>
-            <w:proofErr w:type="gramStart"/>
-            <w:r>
-              <w:t>moves</w:t>
-            </w:r>
-            <w:proofErr w:type="gramEnd"/>
-          </w:p>
-        </w:tc>
-        <w:tc>
-          <w:tcPr>
-            <w:tcW w:w="9474" w:type="dxa"/>
+              <w:t>Enemy sprites moves</w:t>
+            </w:r>
+          </w:p>
+        </w:tc>
+        <w:tc>
+          <w:tcPr>
+            <w:tcW w:w="9537" w:type="dxa"/>
             <w:gridSpan w:val="4"/>
           </w:tcPr>
           <w:p>
@@ -2511,36 +2361,23 @@
           </w:tcPr>
           <w:p>
             <w:r>
-              <w:t xml:space="preserve">Enemy sprite </w:t>
-            </w:r>
-            <w:proofErr w:type="spellStart"/>
-            <w:r>
-              <w:t>movment</w:t>
-            </w:r>
-            <w:proofErr w:type="spellEnd"/>
-          </w:p>
-        </w:tc>
-        <w:tc>
-          <w:tcPr>
-            <w:tcW w:w="1284" w:type="dxa"/>
-          </w:tcPr>
-          <w:p>
-            <w:r>
-              <w:t xml:space="preserve">Enemy </w:t>
-            </w:r>
-            <w:proofErr w:type="spellStart"/>
-            <w:r>
-              <w:t>enemy</w:t>
-            </w:r>
-            <w:proofErr w:type="spellEnd"/>
-            <w:r>
-              <w:t xml:space="preserve"> sprites make small movements left and right and jump </w:t>
-            </w:r>
-          </w:p>
-        </w:tc>
-        <w:tc>
-          <w:tcPr>
-            <w:tcW w:w="1946" w:type="dxa"/>
+              <w:t>Enemy sprite movment</w:t>
+            </w:r>
+          </w:p>
+        </w:tc>
+        <w:tc>
+          <w:tcPr>
+            <w:tcW w:w="1419" w:type="dxa"/>
+          </w:tcPr>
+          <w:p>
+            <w:r>
+              <w:t xml:space="preserve">Enemy enemy sprites make small movements left and right and jump </w:t>
+            </w:r>
+          </w:p>
+        </w:tc>
+        <w:tc>
+          <w:tcPr>
+            <w:tcW w:w="1748" w:type="dxa"/>
             <w:gridSpan w:val="2"/>
           </w:tcPr>
           <w:p>
@@ -2551,7 +2388,7 @@
         </w:tc>
         <w:tc>
           <w:tcPr>
-            <w:tcW w:w="9474" w:type="dxa"/>
+            <w:tcW w:w="9537" w:type="dxa"/>
             <w:gridSpan w:val="4"/>
           </w:tcPr>
           <w:p>
@@ -2605,7 +2442,7 @@
         </w:tc>
         <w:tc>
           <w:tcPr>
-            <w:tcW w:w="1284" w:type="dxa"/>
+            <w:tcW w:w="1419" w:type="dxa"/>
           </w:tcPr>
           <w:p>
             <w:r>
@@ -2615,7 +2452,7 @@
         </w:tc>
         <w:tc>
           <w:tcPr>
-            <w:tcW w:w="1946" w:type="dxa"/>
+            <w:tcW w:w="1748" w:type="dxa"/>
             <w:gridSpan w:val="2"/>
           </w:tcPr>
           <w:p>
@@ -2626,7 +2463,7 @@
         </w:tc>
         <w:tc>
           <w:tcPr>
-            <w:tcW w:w="9474" w:type="dxa"/>
+            <w:tcW w:w="9537" w:type="dxa"/>
             <w:gridSpan w:val="4"/>
           </w:tcPr>
           <w:p>
@@ -2680,7 +2517,7 @@
         </w:tc>
         <w:tc>
           <w:tcPr>
-            <w:tcW w:w="1284" w:type="dxa"/>
+            <w:tcW w:w="1419" w:type="dxa"/>
           </w:tcPr>
           <w:p>
             <w:r>
@@ -2690,7 +2527,7 @@
         </w:tc>
         <w:tc>
           <w:tcPr>
-            <w:tcW w:w="1946" w:type="dxa"/>
+            <w:tcW w:w="1748" w:type="dxa"/>
             <w:gridSpan w:val="2"/>
           </w:tcPr>
           <w:p>
@@ -2701,7 +2538,7 @@
         </w:tc>
         <w:tc>
           <w:tcPr>
-            <w:tcW w:w="9474" w:type="dxa"/>
+            <w:tcW w:w="9537" w:type="dxa"/>
             <w:gridSpan w:val="4"/>
           </w:tcPr>
           <w:p>
@@ -2716,7 +2553,6 @@
                 <w:lang w:eastAsia="en-NZ"/>
               </w:rPr>
             </w:pPr>
-            <w:proofErr w:type="spellStart"/>
             <w:r>
               <w:rPr>
                 <w:rFonts w:ascii="Consolas" w:eastAsia="Times New Roman" w:hAnsi="Consolas" w:cs="Times New Roman"/>
@@ -2727,7 +2563,6 @@
               </w:rPr>
               <w:t>elif</w:t>
             </w:r>
-            <w:proofErr w:type="spellEnd"/>
             <w:r>
               <w:rPr>
                 <w:rFonts w:ascii="Consolas" w:eastAsia="Times New Roman" w:hAnsi="Consolas" w:cs="Times New Roman"/>
@@ -2738,8 +2573,6 @@
               </w:rPr>
               <w:t xml:space="preserve"> </w:t>
             </w:r>
-            <w:proofErr w:type="spellStart"/>
-            <w:proofErr w:type="gramStart"/>
             <w:r>
               <w:rPr>
                 <w:rFonts w:ascii="Consolas" w:eastAsia="Times New Roman" w:hAnsi="Consolas" w:cs="Times New Roman"/>
@@ -2770,8 +2603,6 @@
               </w:rPr>
               <w:t>direction</w:t>
             </w:r>
-            <w:proofErr w:type="spellEnd"/>
-            <w:proofErr w:type="gramEnd"/>
             <w:r>
               <w:rPr>
                 <w:rFonts w:ascii="Consolas" w:eastAsia="Times New Roman" w:hAnsi="Consolas" w:cs="Times New Roman"/>
@@ -2845,8 +2676,6 @@
               </w:rPr>
               <w:t xml:space="preserve">            </w:t>
             </w:r>
-            <w:proofErr w:type="spellStart"/>
-            <w:proofErr w:type="gramStart"/>
             <w:r>
               <w:rPr>
                 <w:rFonts w:ascii="Consolas" w:eastAsia="Times New Roman" w:hAnsi="Consolas" w:cs="Times New Roman"/>
@@ -2875,20 +2704,8 @@
                 <w:szCs w:val="21"/>
                 <w:lang w:eastAsia="en-NZ"/>
               </w:rPr>
-              <w:t>change</w:t>
-            </w:r>
-            <w:proofErr w:type="gramEnd"/>
-            <w:r>
-              <w:rPr>
-                <w:rFonts w:ascii="Consolas" w:eastAsia="Times New Roman" w:hAnsi="Consolas" w:cs="Times New Roman"/>
-                <w:color w:val="9CDCFE"/>
-                <w:sz w:val="21"/>
-                <w:szCs w:val="21"/>
-                <w:lang w:eastAsia="en-NZ"/>
-              </w:rPr>
-              <w:t>_x</w:t>
-            </w:r>
-            <w:proofErr w:type="spellEnd"/>
+              <w:t>change_x</w:t>
+            </w:r>
             <w:r>
               <w:rPr>
                 <w:rFonts w:ascii="Consolas" w:eastAsia="Times New Roman" w:hAnsi="Consolas" w:cs="Times New Roman"/>
@@ -2951,7 +2768,7 @@
         </w:tc>
         <w:tc>
           <w:tcPr>
-            <w:tcW w:w="1284" w:type="dxa"/>
+            <w:tcW w:w="1419" w:type="dxa"/>
           </w:tcPr>
           <w:p>
             <w:r>
@@ -2961,7 +2778,7 @@
         </w:tc>
         <w:tc>
           <w:tcPr>
-            <w:tcW w:w="1946" w:type="dxa"/>
+            <w:tcW w:w="1748" w:type="dxa"/>
             <w:gridSpan w:val="2"/>
           </w:tcPr>
           <w:p>
@@ -2972,7 +2789,7 @@
         </w:tc>
         <w:tc>
           <w:tcPr>
-            <w:tcW w:w="9474" w:type="dxa"/>
+            <w:tcW w:w="9537" w:type="dxa"/>
             <w:gridSpan w:val="4"/>
           </w:tcPr>
           <w:p>
@@ -3026,7 +2843,7 @@
         </w:tc>
         <w:tc>
           <w:tcPr>
-            <w:tcW w:w="1284" w:type="dxa"/>
+            <w:tcW w:w="1419" w:type="dxa"/>
           </w:tcPr>
           <w:p>
             <w:r>
@@ -3036,7 +2853,7 @@
         </w:tc>
         <w:tc>
           <w:tcPr>
-            <w:tcW w:w="1946" w:type="dxa"/>
+            <w:tcW w:w="1748" w:type="dxa"/>
             <w:gridSpan w:val="2"/>
           </w:tcPr>
           <w:p>
@@ -3047,7 +2864,7 @@
         </w:tc>
         <w:tc>
           <w:tcPr>
-            <w:tcW w:w="9474" w:type="dxa"/>
+            <w:tcW w:w="9537" w:type="dxa"/>
             <w:gridSpan w:val="4"/>
           </w:tcPr>
           <w:p>
@@ -3062,7 +2879,6 @@
                 <w:lang w:eastAsia="en-NZ"/>
               </w:rPr>
             </w:pPr>
-            <w:proofErr w:type="gramStart"/>
             <w:r>
               <w:rPr>
                 <w:rFonts w:ascii="Consolas" w:eastAsia="Times New Roman" w:hAnsi="Consolas" w:cs="Times New Roman"/>
@@ -3071,62 +2887,7 @@
                 <w:szCs w:val="21"/>
                 <w:lang w:eastAsia="en-NZ"/>
               </w:rPr>
-              <w:t>Changed .</w:t>
-            </w:r>
-            <w:proofErr w:type="spellStart"/>
-            <w:r>
-              <w:rPr>
-                <w:rFonts w:ascii="Consolas" w:eastAsia="Times New Roman" w:hAnsi="Consolas" w:cs="Times New Roman"/>
-                <w:color w:val="C586C0"/>
-                <w:sz w:val="21"/>
-                <w:szCs w:val="21"/>
-                <w:lang w:eastAsia="en-NZ"/>
-              </w:rPr>
-              <w:t>change</w:t>
-            </w:r>
-            <w:proofErr w:type="gramEnd"/>
-            <w:r>
-              <w:rPr>
-                <w:rFonts w:ascii="Consolas" w:eastAsia="Times New Roman" w:hAnsi="Consolas" w:cs="Times New Roman"/>
-                <w:color w:val="C586C0"/>
-                <w:sz w:val="21"/>
-                <w:szCs w:val="21"/>
-                <w:lang w:eastAsia="en-NZ"/>
-              </w:rPr>
-              <w:t>_x</w:t>
-            </w:r>
-            <w:proofErr w:type="spellEnd"/>
-            <w:r>
-              <w:rPr>
-                <w:rFonts w:ascii="Consolas" w:eastAsia="Times New Roman" w:hAnsi="Consolas" w:cs="Times New Roman"/>
-                <w:color w:val="C586C0"/>
-                <w:sz w:val="21"/>
-                <w:szCs w:val="21"/>
-                <w:lang w:eastAsia="en-NZ"/>
-              </w:rPr>
-              <w:t xml:space="preserve"> -= 3 to  .</w:t>
-            </w:r>
-            <w:proofErr w:type="spellStart"/>
-            <w:r>
-              <w:rPr>
-                <w:rFonts w:ascii="Consolas" w:eastAsia="Times New Roman" w:hAnsi="Consolas" w:cs="Times New Roman"/>
-                <w:color w:val="C586C0"/>
-                <w:sz w:val="21"/>
-                <w:szCs w:val="21"/>
-                <w:lang w:eastAsia="en-NZ"/>
-              </w:rPr>
-              <w:t>change_x</w:t>
-            </w:r>
-            <w:proofErr w:type="spellEnd"/>
-            <w:r>
-              <w:rPr>
-                <w:rFonts w:ascii="Consolas" w:eastAsia="Times New Roman" w:hAnsi="Consolas" w:cs="Times New Roman"/>
-                <w:color w:val="C586C0"/>
-                <w:sz w:val="21"/>
-                <w:szCs w:val="21"/>
-                <w:lang w:eastAsia="en-NZ"/>
-              </w:rPr>
-              <w:t xml:space="preserve"> = -3</w:t>
+              <w:t>Changed .change_x -= 3 to  .change_x = -3</w:t>
             </w:r>
           </w:p>
         </w:tc>
@@ -3157,7 +2918,7 @@
         </w:tc>
         <w:tc>
           <w:tcPr>
-            <w:tcW w:w="1284" w:type="dxa"/>
+            <w:tcW w:w="1419" w:type="dxa"/>
           </w:tcPr>
           <w:p>
             <w:r>
@@ -3167,7 +2928,7 @@
         </w:tc>
         <w:tc>
           <w:tcPr>
-            <w:tcW w:w="1946" w:type="dxa"/>
+            <w:tcW w:w="1748" w:type="dxa"/>
             <w:gridSpan w:val="2"/>
           </w:tcPr>
           <w:p>
@@ -3178,7 +2939,7 @@
         </w:tc>
         <w:tc>
           <w:tcPr>
-            <w:tcW w:w="9474" w:type="dxa"/>
+            <w:tcW w:w="9537" w:type="dxa"/>
             <w:gridSpan w:val="4"/>
           </w:tcPr>
           <w:p>
@@ -3232,7 +2993,7 @@
         </w:tc>
         <w:tc>
           <w:tcPr>
-            <w:tcW w:w="1284" w:type="dxa"/>
+            <w:tcW w:w="1419" w:type="dxa"/>
           </w:tcPr>
           <w:p>
             <w:r>
@@ -3242,7 +3003,7 @@
         </w:tc>
         <w:tc>
           <w:tcPr>
-            <w:tcW w:w="1946" w:type="dxa"/>
+            <w:tcW w:w="1748" w:type="dxa"/>
             <w:gridSpan w:val="2"/>
           </w:tcPr>
           <w:p>
@@ -3253,7 +3014,7 @@
         </w:tc>
         <w:tc>
           <w:tcPr>
-            <w:tcW w:w="9474" w:type="dxa"/>
+            <w:tcW w:w="9537" w:type="dxa"/>
             <w:gridSpan w:val="4"/>
           </w:tcPr>
           <w:p>
@@ -3307,7 +3068,7 @@
         </w:tc>
         <w:tc>
           <w:tcPr>
-            <w:tcW w:w="1284" w:type="dxa"/>
+            <w:tcW w:w="1419" w:type="dxa"/>
           </w:tcPr>
           <w:p>
             <w:r>
@@ -3317,7 +3078,7 @@
         </w:tc>
         <w:tc>
           <w:tcPr>
-            <w:tcW w:w="1946" w:type="dxa"/>
+            <w:tcW w:w="1748" w:type="dxa"/>
             <w:gridSpan w:val="2"/>
           </w:tcPr>
           <w:p>
@@ -3328,7 +3089,7 @@
         </w:tc>
         <w:tc>
           <w:tcPr>
-            <w:tcW w:w="9474" w:type="dxa"/>
+            <w:tcW w:w="9537" w:type="dxa"/>
             <w:gridSpan w:val="4"/>
           </w:tcPr>
           <w:p>
@@ -3353,7 +3114,6 @@
               </w:rPr>
               <w:t> </w:t>
             </w:r>
-            <w:proofErr w:type="spellStart"/>
             <w:r>
               <w:rPr>
                 <w:rFonts w:ascii="Consolas" w:eastAsia="Times New Roman" w:hAnsi="Consolas" w:cs="Times New Roman"/>
@@ -3364,7 +3124,6 @@
               </w:rPr>
               <w:t>elif</w:t>
             </w:r>
-            <w:proofErr w:type="spellEnd"/>
             <w:r>
               <w:rPr>
                 <w:rFonts w:ascii="Consolas" w:eastAsia="Times New Roman" w:hAnsi="Consolas" w:cs="Times New Roman"/>
@@ -3415,8 +3174,6 @@
               </w:rPr>
               <w:t xml:space="preserve"> </w:t>
             </w:r>
-            <w:proofErr w:type="spellStart"/>
-            <w:proofErr w:type="gramStart"/>
             <w:r>
               <w:rPr>
                 <w:rFonts w:ascii="Consolas" w:eastAsia="Times New Roman" w:hAnsi="Consolas" w:cs="Times New Roman"/>
@@ -3467,8 +3224,6 @@
               </w:rPr>
               <w:t>SPACE</w:t>
             </w:r>
-            <w:proofErr w:type="spellEnd"/>
-            <w:proofErr w:type="gramEnd"/>
             <w:r>
               <w:rPr>
                 <w:rFonts w:ascii="Consolas" w:eastAsia="Times New Roman" w:hAnsi="Consolas" w:cs="Times New Roman"/>
@@ -3502,8 +3257,6 @@
               </w:rPr>
               <w:t>   </w:t>
             </w:r>
-            <w:proofErr w:type="spellStart"/>
-            <w:proofErr w:type="gramStart"/>
             <w:r>
               <w:rPr>
                 <w:rFonts w:ascii="Consolas" w:eastAsia="Times New Roman" w:hAnsi="Consolas" w:cs="Times New Roman"/>
@@ -3532,9 +3285,18 @@
                 <w:szCs w:val="21"/>
                 <w:lang w:eastAsia="en-NZ"/>
               </w:rPr>
-              <w:t>enemy</w:t>
-            </w:r>
-            <w:proofErr w:type="gramEnd"/>
+              <w:t>enemy_sprite</w:t>
+            </w:r>
+            <w:r>
+              <w:rPr>
+                <w:rFonts w:ascii="Consolas" w:eastAsia="Times New Roman" w:hAnsi="Consolas" w:cs="Times New Roman"/>
+                <w:color w:val="CCCCCC"/>
+                <w:sz w:val="21"/>
+                <w:szCs w:val="21"/>
+                <w:lang w:eastAsia="en-NZ"/>
+              </w:rPr>
+              <w:t>.</w:t>
+            </w:r>
             <w:r>
               <w:rPr>
                 <w:rFonts w:ascii="Consolas" w:eastAsia="Times New Roman" w:hAnsi="Consolas" w:cs="Times New Roman"/>
@@ -3543,29 +3305,8 @@
                 <w:szCs w:val="21"/>
                 <w:lang w:eastAsia="en-NZ"/>
               </w:rPr>
-              <w:t>_sprite</w:t>
-            </w:r>
-            <w:r>
-              <w:rPr>
-                <w:rFonts w:ascii="Consolas" w:eastAsia="Times New Roman" w:hAnsi="Consolas" w:cs="Times New Roman"/>
-                <w:color w:val="CCCCCC"/>
-                <w:sz w:val="21"/>
-                <w:szCs w:val="21"/>
-                <w:lang w:eastAsia="en-NZ"/>
-              </w:rPr>
-              <w:t>.</w:t>
-            </w:r>
-            <w:r>
-              <w:rPr>
-                <w:rFonts w:ascii="Consolas" w:eastAsia="Times New Roman" w:hAnsi="Consolas" w:cs="Times New Roman"/>
-                <w:color w:val="9CDCFE"/>
-                <w:sz w:val="21"/>
-                <w:szCs w:val="21"/>
-                <w:lang w:eastAsia="en-NZ"/>
-              </w:rPr>
               <w:t>attack</w:t>
             </w:r>
-            <w:proofErr w:type="spellEnd"/>
             <w:r>
               <w:rPr>
                 <w:rFonts w:ascii="Consolas" w:eastAsia="Times New Roman" w:hAnsi="Consolas" w:cs="Times New Roman"/>
@@ -3648,7 +3389,7 @@
         </w:tc>
         <w:tc>
           <w:tcPr>
-            <w:tcW w:w="1284" w:type="dxa"/>
+            <w:tcW w:w="1419" w:type="dxa"/>
           </w:tcPr>
           <w:p>
             <w:r>
@@ -3658,7 +3399,7 @@
         </w:tc>
         <w:tc>
           <w:tcPr>
-            <w:tcW w:w="1946" w:type="dxa"/>
+            <w:tcW w:w="1748" w:type="dxa"/>
             <w:gridSpan w:val="2"/>
           </w:tcPr>
           <w:p>
@@ -3669,7 +3410,7 @@
         </w:tc>
         <w:tc>
           <w:tcPr>
-            <w:tcW w:w="9474" w:type="dxa"/>
+            <w:tcW w:w="9537" w:type="dxa"/>
             <w:gridSpan w:val="4"/>
           </w:tcPr>
           <w:p>
@@ -3692,31 +3433,7 @@
                 <w:szCs w:val="21"/>
                 <w:lang w:eastAsia="en-NZ"/>
               </w:rPr>
-              <w:t xml:space="preserve">Added </w:t>
-            </w:r>
-            <w:proofErr w:type="spellStart"/>
-            <w:proofErr w:type="gramStart"/>
-            <w:r>
-              <w:rPr>
-                <w:rFonts w:ascii="Consolas" w:eastAsia="Times New Roman" w:hAnsi="Consolas" w:cs="Times New Roman"/>
-                <w:color w:val="CCCCCC"/>
-                <w:sz w:val="21"/>
-                <w:szCs w:val="21"/>
-                <w:lang w:eastAsia="en-NZ"/>
-              </w:rPr>
-              <w:t>time.sleep</w:t>
-            </w:r>
-            <w:proofErr w:type="spellEnd"/>
-            <w:proofErr w:type="gramEnd"/>
-            <w:r>
-              <w:rPr>
-                <w:rFonts w:ascii="Consolas" w:eastAsia="Times New Roman" w:hAnsi="Consolas" w:cs="Times New Roman"/>
-                <w:color w:val="CCCCCC"/>
-                <w:sz w:val="21"/>
-                <w:szCs w:val="21"/>
-                <w:lang w:eastAsia="en-NZ"/>
-              </w:rPr>
-              <w:t>(1)</w:t>
+              <w:t>Added time.sleep(1)</w:t>
             </w:r>
           </w:p>
         </w:tc>
@@ -3748,7 +3465,7 @@
         </w:tc>
         <w:tc>
           <w:tcPr>
-            <w:tcW w:w="1284" w:type="dxa"/>
+            <w:tcW w:w="1419" w:type="dxa"/>
           </w:tcPr>
           <w:p>
             <w:r>
@@ -3758,7 +3475,7 @@
         </w:tc>
         <w:tc>
           <w:tcPr>
-            <w:tcW w:w="1946" w:type="dxa"/>
+            <w:tcW w:w="1748" w:type="dxa"/>
             <w:gridSpan w:val="2"/>
           </w:tcPr>
           <w:p>
@@ -3769,7 +3486,7 @@
         </w:tc>
         <w:tc>
           <w:tcPr>
-            <w:tcW w:w="9474" w:type="dxa"/>
+            <w:tcW w:w="9537" w:type="dxa"/>
             <w:gridSpan w:val="4"/>
           </w:tcPr>
           <w:p>
@@ -3865,7 +3582,7 @@
         </w:tc>
         <w:tc>
           <w:tcPr>
-            <w:tcW w:w="1284" w:type="dxa"/>
+            <w:tcW w:w="1419" w:type="dxa"/>
           </w:tcPr>
           <w:p>
             <w:r>
@@ -3875,7 +3592,7 @@
         </w:tc>
         <w:tc>
           <w:tcPr>
-            <w:tcW w:w="1946" w:type="dxa"/>
+            <w:tcW w:w="1748" w:type="dxa"/>
             <w:gridSpan w:val="2"/>
           </w:tcPr>
           <w:p>
@@ -3886,7 +3603,7 @@
         </w:tc>
         <w:tc>
           <w:tcPr>
-            <w:tcW w:w="9474" w:type="dxa"/>
+            <w:tcW w:w="9537" w:type="dxa"/>
             <w:gridSpan w:val="4"/>
           </w:tcPr>
           <w:p>
@@ -3909,51 +3626,7 @@
                 <w:szCs w:val="21"/>
                 <w:lang w:eastAsia="en-NZ"/>
               </w:rPr>
-              <w:t xml:space="preserve">Reset </w:t>
-            </w:r>
-            <w:proofErr w:type="spellStart"/>
-            <w:r>
-              <w:rPr>
-                <w:rFonts w:ascii="Consolas" w:eastAsia="Times New Roman" w:hAnsi="Consolas" w:cs="Times New Roman"/>
-                <w:color w:val="CCCCCC"/>
-                <w:sz w:val="21"/>
-                <w:szCs w:val="21"/>
-                <w:lang w:eastAsia="en-NZ"/>
-              </w:rPr>
-              <w:t>self.cur_texture</w:t>
-            </w:r>
-            <w:proofErr w:type="spellEnd"/>
-            <w:r>
-              <w:rPr>
-                <w:rFonts w:ascii="Consolas" w:eastAsia="Times New Roman" w:hAnsi="Consolas" w:cs="Times New Roman"/>
-                <w:color w:val="CCCCCC"/>
-                <w:sz w:val="21"/>
-                <w:szCs w:val="21"/>
-                <w:lang w:eastAsia="en-NZ"/>
-              </w:rPr>
-              <w:t xml:space="preserve"> when </w:t>
-            </w:r>
-            <w:proofErr w:type="spellStart"/>
-            <w:r>
-              <w:rPr>
-                <w:rFonts w:ascii="Consolas" w:eastAsia="Times New Roman" w:hAnsi="Consolas" w:cs="Times New Roman"/>
-                <w:color w:val="CCCCCC"/>
-                <w:sz w:val="21"/>
-                <w:szCs w:val="21"/>
-                <w:lang w:eastAsia="en-NZ"/>
-              </w:rPr>
-              <w:t>self attack</w:t>
-            </w:r>
-            <w:proofErr w:type="spellEnd"/>
-            <w:r>
-              <w:rPr>
-                <w:rFonts w:ascii="Consolas" w:eastAsia="Times New Roman" w:hAnsi="Consolas" w:cs="Times New Roman"/>
-                <w:color w:val="CCCCCC"/>
-                <w:sz w:val="21"/>
-                <w:szCs w:val="21"/>
-                <w:lang w:eastAsia="en-NZ"/>
-              </w:rPr>
-              <w:t xml:space="preserve"> == “attack</w:t>
+              <w:t>Reset self.cur_texture when self attack == “attack</w:t>
             </w:r>
           </w:p>
         </w:tc>
@@ -3984,7 +3657,7 @@
         </w:tc>
         <w:tc>
           <w:tcPr>
-            <w:tcW w:w="1284" w:type="dxa"/>
+            <w:tcW w:w="1419" w:type="dxa"/>
           </w:tcPr>
           <w:p>
             <w:r>
@@ -3994,23 +3667,18 @@
         </w:tc>
         <w:tc>
           <w:tcPr>
-            <w:tcW w:w="1946" w:type="dxa"/>
+            <w:tcW w:w="1748" w:type="dxa"/>
             <w:gridSpan w:val="2"/>
           </w:tcPr>
           <w:p>
-            <w:proofErr w:type="spellStart"/>
-            <w:r>
-              <w:t>Self.cur_texture</w:t>
-            </w:r>
-            <w:proofErr w:type="spellEnd"/>
-            <w:r>
-              <w:t xml:space="preserve"> is not being updated</w:t>
-            </w:r>
-          </w:p>
-        </w:tc>
-        <w:tc>
-          <w:tcPr>
-            <w:tcW w:w="9474" w:type="dxa"/>
+            <w:r>
+              <w:t>Self.cur_texture is not being updated</w:t>
+            </w:r>
+          </w:p>
+        </w:tc>
+        <w:tc>
+          <w:tcPr>
+            <w:tcW w:w="9537" w:type="dxa"/>
             <w:gridSpan w:val="4"/>
           </w:tcPr>
           <w:p>
@@ -4099,7 +3767,7 @@
         </w:tc>
         <w:tc>
           <w:tcPr>
-            <w:tcW w:w="1284" w:type="dxa"/>
+            <w:tcW w:w="1419" w:type="dxa"/>
           </w:tcPr>
           <w:p>
             <w:r>
@@ -4109,7 +3777,7 @@
         </w:tc>
         <w:tc>
           <w:tcPr>
-            <w:tcW w:w="1946" w:type="dxa"/>
+            <w:tcW w:w="1748" w:type="dxa"/>
             <w:gridSpan w:val="2"/>
           </w:tcPr>
           <w:p>
@@ -4120,7 +3788,7 @@
         </w:tc>
         <w:tc>
           <w:tcPr>
-            <w:tcW w:w="9474" w:type="dxa"/>
+            <w:tcW w:w="9537" w:type="dxa"/>
             <w:gridSpan w:val="4"/>
           </w:tcPr>
           <w:p>
@@ -4174,7 +3842,7 @@
         </w:tc>
         <w:tc>
           <w:tcPr>
-            <w:tcW w:w="1284" w:type="dxa"/>
+            <w:tcW w:w="1419" w:type="dxa"/>
           </w:tcPr>
           <w:p>
             <w:r>
@@ -4184,7 +3852,7 @@
         </w:tc>
         <w:tc>
           <w:tcPr>
-            <w:tcW w:w="1946" w:type="dxa"/>
+            <w:tcW w:w="1748" w:type="dxa"/>
             <w:gridSpan w:val="2"/>
           </w:tcPr>
           <w:p>
@@ -4195,7 +3863,7 @@
         </w:tc>
         <w:tc>
           <w:tcPr>
-            <w:tcW w:w="9474" w:type="dxa"/>
+            <w:tcW w:w="9537" w:type="dxa"/>
             <w:gridSpan w:val="4"/>
           </w:tcPr>
           <w:p>
@@ -4249,7 +3917,7 @@
         </w:tc>
         <w:tc>
           <w:tcPr>
-            <w:tcW w:w="1284" w:type="dxa"/>
+            <w:tcW w:w="1419" w:type="dxa"/>
           </w:tcPr>
           <w:p>
             <w:r>
@@ -4259,7 +3927,7 @@
         </w:tc>
         <w:tc>
           <w:tcPr>
-            <w:tcW w:w="1946" w:type="dxa"/>
+            <w:tcW w:w="1748" w:type="dxa"/>
             <w:gridSpan w:val="2"/>
           </w:tcPr>
           <w:p>
@@ -4270,7 +3938,7 @@
         </w:tc>
         <w:tc>
           <w:tcPr>
-            <w:tcW w:w="9474" w:type="dxa"/>
+            <w:tcW w:w="9537" w:type="dxa"/>
             <w:gridSpan w:val="4"/>
           </w:tcPr>
           <w:p>
@@ -4293,75 +3961,7 @@
                 <w:szCs w:val="21"/>
                 <w:lang w:eastAsia="en-NZ"/>
               </w:rPr>
-              <w:t xml:space="preserve">Removed the code from on </w:t>
-            </w:r>
-            <w:proofErr w:type="spellStart"/>
-            <w:r>
-              <w:rPr>
-                <w:rFonts w:ascii="Consolas" w:eastAsia="Times New Roman" w:hAnsi="Consolas" w:cs="Times New Roman"/>
-                <w:color w:val="CCCCCC"/>
-                <w:sz w:val="21"/>
-                <w:szCs w:val="21"/>
-                <w:lang w:eastAsia="en-NZ"/>
-              </w:rPr>
-              <w:t>key_release</w:t>
-            </w:r>
-            <w:proofErr w:type="spellEnd"/>
-            <w:r>
-              <w:rPr>
-                <w:rFonts w:ascii="Consolas" w:eastAsia="Times New Roman" w:hAnsi="Consolas" w:cs="Times New Roman"/>
-                <w:color w:val="CCCCCC"/>
-                <w:sz w:val="21"/>
-                <w:szCs w:val="21"/>
-                <w:lang w:eastAsia="en-NZ"/>
-              </w:rPr>
-              <w:t xml:space="preserve"> that stops the animation code from running and made </w:t>
-            </w:r>
-            <w:proofErr w:type="spellStart"/>
-            <w:proofErr w:type="gramStart"/>
-            <w:r>
-              <w:rPr>
-                <w:rFonts w:ascii="Consolas" w:eastAsia="Times New Roman" w:hAnsi="Consolas" w:cs="Times New Roman"/>
-                <w:color w:val="CCCCCC"/>
-                <w:sz w:val="21"/>
-                <w:szCs w:val="21"/>
-                <w:lang w:eastAsia="en-NZ"/>
-              </w:rPr>
-              <w:t>self.attack</w:t>
-            </w:r>
-            <w:proofErr w:type="spellEnd"/>
-            <w:proofErr w:type="gramEnd"/>
-            <w:r>
-              <w:rPr>
-                <w:rFonts w:ascii="Consolas" w:eastAsia="Times New Roman" w:hAnsi="Consolas" w:cs="Times New Roman"/>
-                <w:color w:val="CCCCCC"/>
-                <w:sz w:val="21"/>
-                <w:szCs w:val="21"/>
-                <w:lang w:eastAsia="en-NZ"/>
-              </w:rPr>
-              <w:t xml:space="preserve"> = “” when the animation </w:t>
-            </w:r>
-            <w:proofErr w:type="spellStart"/>
-            <w:r>
-              <w:rPr>
-                <w:rFonts w:ascii="Consolas" w:eastAsia="Times New Roman" w:hAnsi="Consolas" w:cs="Times New Roman"/>
-                <w:color w:val="CCCCCC"/>
-                <w:sz w:val="21"/>
-                <w:szCs w:val="21"/>
-                <w:lang w:eastAsia="en-NZ"/>
-              </w:rPr>
-              <w:t>hd</w:t>
-            </w:r>
-            <w:proofErr w:type="spellEnd"/>
-            <w:r>
-              <w:rPr>
-                <w:rFonts w:ascii="Consolas" w:eastAsia="Times New Roman" w:hAnsi="Consolas" w:cs="Times New Roman"/>
-                <w:color w:val="CCCCCC"/>
-                <w:sz w:val="21"/>
-                <w:szCs w:val="21"/>
-                <w:lang w:eastAsia="en-NZ"/>
-              </w:rPr>
-              <w:t xml:space="preserve"> played.</w:t>
+              <w:t>Removed the code from on key_release that stops the animation code from running and made self.attack = “” when the animation hd played.</w:t>
             </w:r>
           </w:p>
         </w:tc>
@@ -4392,7 +3992,7 @@
         </w:tc>
         <w:tc>
           <w:tcPr>
-            <w:tcW w:w="1284" w:type="dxa"/>
+            <w:tcW w:w="1419" w:type="dxa"/>
           </w:tcPr>
           <w:p>
             <w:r>
@@ -4402,7 +4002,7 @@
         </w:tc>
         <w:tc>
           <w:tcPr>
-            <w:tcW w:w="1946" w:type="dxa"/>
+            <w:tcW w:w="1748" w:type="dxa"/>
             <w:gridSpan w:val="2"/>
           </w:tcPr>
           <w:p>
@@ -4413,7 +4013,7 @@
         </w:tc>
         <w:tc>
           <w:tcPr>
-            <w:tcW w:w="9474" w:type="dxa"/>
+            <w:tcW w:w="9537" w:type="dxa"/>
             <w:gridSpan w:val="4"/>
           </w:tcPr>
           <w:p>
@@ -4503,7 +4103,7 @@
         </w:tc>
         <w:tc>
           <w:tcPr>
-            <w:tcW w:w="1284" w:type="dxa"/>
+            <w:tcW w:w="1419" w:type="dxa"/>
           </w:tcPr>
           <w:p>
             <w:r>
@@ -4513,7 +4113,7 @@
         </w:tc>
         <w:tc>
           <w:tcPr>
-            <w:tcW w:w="1946" w:type="dxa"/>
+            <w:tcW w:w="1748" w:type="dxa"/>
             <w:gridSpan w:val="2"/>
           </w:tcPr>
           <w:p>
@@ -4524,7 +4124,7 @@
         </w:tc>
         <w:tc>
           <w:tcPr>
-            <w:tcW w:w="9474" w:type="dxa"/>
+            <w:tcW w:w="9537" w:type="dxa"/>
             <w:gridSpan w:val="4"/>
           </w:tcPr>
           <w:p>
@@ -4613,7 +4213,7 @@
         </w:tc>
         <w:tc>
           <w:tcPr>
-            <w:tcW w:w="1284" w:type="dxa"/>
+            <w:tcW w:w="1419" w:type="dxa"/>
           </w:tcPr>
           <w:p>
             <w:r>
@@ -4623,7 +4223,7 @@
         </w:tc>
         <w:tc>
           <w:tcPr>
-            <w:tcW w:w="1946" w:type="dxa"/>
+            <w:tcW w:w="1748" w:type="dxa"/>
             <w:gridSpan w:val="2"/>
           </w:tcPr>
           <w:p>
@@ -4634,7 +4234,7 @@
         </w:tc>
         <w:tc>
           <w:tcPr>
-            <w:tcW w:w="9474" w:type="dxa"/>
+            <w:tcW w:w="9537" w:type="dxa"/>
             <w:gridSpan w:val="4"/>
           </w:tcPr>
           <w:p>
@@ -4657,20 +4257,8 @@
                 <w:szCs w:val="21"/>
                 <w:lang w:eastAsia="en-NZ"/>
               </w:rPr>
-              <w:t xml:space="preserve">Attack animation repeats when the sprites </w:t>
-            </w:r>
-            <w:proofErr w:type="gramStart"/>
-            <w:r>
-              <w:rPr>
-                <w:rFonts w:ascii="Consolas" w:eastAsia="Times New Roman" w:hAnsi="Consolas" w:cs="Times New Roman"/>
-                <w:color w:val="CCCCCC"/>
-                <w:sz w:val="21"/>
-                <w:szCs w:val="21"/>
-                <w:lang w:eastAsia="en-NZ"/>
-              </w:rPr>
-              <w:t>move</w:t>
-            </w:r>
-            <w:proofErr w:type="gramEnd"/>
+              <w:t>Attack animation repeats when the sprites move</w:t>
+            </w:r>
           </w:p>
           <w:p>
             <w:pPr>
@@ -4684,27 +4272,15 @@
                 <w:lang w:eastAsia="en-NZ"/>
               </w:rPr>
             </w:pPr>
-            <w:proofErr w:type="gramStart"/>
-            <w:r>
-              <w:rPr>
-                <w:rFonts w:ascii="Consolas" w:eastAsia="Times New Roman" w:hAnsi="Consolas" w:cs="Times New Roman"/>
-                <w:color w:val="CCCCCC"/>
-                <w:sz w:val="21"/>
-                <w:szCs w:val="21"/>
-                <w:lang w:eastAsia="en-NZ"/>
-              </w:rPr>
-              <w:t>So</w:t>
-            </w:r>
-            <w:proofErr w:type="gramEnd"/>
-            <w:r>
-              <w:rPr>
-                <w:rFonts w:ascii="Consolas" w:eastAsia="Times New Roman" w:hAnsi="Consolas" w:cs="Times New Roman"/>
-                <w:color w:val="CCCCCC"/>
-                <w:sz w:val="21"/>
-                <w:szCs w:val="21"/>
-                <w:lang w:eastAsia="en-NZ"/>
-              </w:rPr>
-              <w:t xml:space="preserve"> I stopped the enemy sprite movement when attack</w:t>
+            <w:r>
+              <w:rPr>
+                <w:rFonts w:ascii="Consolas" w:eastAsia="Times New Roman" w:hAnsi="Consolas" w:cs="Times New Roman"/>
+                <w:color w:val="CCCCCC"/>
+                <w:sz w:val="21"/>
+                <w:szCs w:val="21"/>
+                <w:lang w:eastAsia="en-NZ"/>
+              </w:rPr>
+              <w:t>So I stopped the enemy sprite movement when attack</w:t>
             </w:r>
           </w:p>
           <w:p>
@@ -4758,7 +4334,7 @@
         </w:tc>
         <w:tc>
           <w:tcPr>
-            <w:tcW w:w="1284" w:type="dxa"/>
+            <w:tcW w:w="1419" w:type="dxa"/>
           </w:tcPr>
           <w:p>
             <w:r>
@@ -4768,7 +4344,7 @@
         </w:tc>
         <w:tc>
           <w:tcPr>
-            <w:tcW w:w="1946" w:type="dxa"/>
+            <w:tcW w:w="1748" w:type="dxa"/>
             <w:gridSpan w:val="2"/>
           </w:tcPr>
           <w:p>
@@ -4779,7 +4355,7 @@
         </w:tc>
         <w:tc>
           <w:tcPr>
-            <w:tcW w:w="9474" w:type="dxa"/>
+            <w:tcW w:w="9537" w:type="dxa"/>
             <w:gridSpan w:val="4"/>
           </w:tcPr>
           <w:p>
@@ -4833,7 +4409,7 @@
         </w:tc>
         <w:tc>
           <w:tcPr>
-            <w:tcW w:w="1284" w:type="dxa"/>
+            <w:tcW w:w="1419" w:type="dxa"/>
           </w:tcPr>
           <w:p>
             <w:r>
@@ -4843,7 +4419,7 @@
         </w:tc>
         <w:tc>
           <w:tcPr>
-            <w:tcW w:w="1946" w:type="dxa"/>
+            <w:tcW w:w="1748" w:type="dxa"/>
             <w:gridSpan w:val="2"/>
           </w:tcPr>
           <w:p>
@@ -4854,7 +4430,7 @@
         </w:tc>
         <w:tc>
           <w:tcPr>
-            <w:tcW w:w="9474" w:type="dxa"/>
+            <w:tcW w:w="9537" w:type="dxa"/>
             <w:gridSpan w:val="4"/>
           </w:tcPr>
           <w:p>
@@ -4898,7 +4474,7 @@
         </w:tc>
         <w:tc>
           <w:tcPr>
-            <w:tcW w:w="1284" w:type="dxa"/>
+            <w:tcW w:w="1419" w:type="dxa"/>
           </w:tcPr>
           <w:p>
             <w:r>
@@ -4908,26 +4484,18 @@
         </w:tc>
         <w:tc>
           <w:tcPr>
-            <w:tcW w:w="1946" w:type="dxa"/>
+            <w:tcW w:w="1748" w:type="dxa"/>
             <w:gridSpan w:val="2"/>
           </w:tcPr>
           <w:p>
             <w:r>
-              <w:t xml:space="preserve">Animation doesn’t work for </w:t>
-            </w:r>
-            <w:proofErr w:type="gramStart"/>
-            <w:r>
-              <w:t>other</w:t>
-            </w:r>
-            <w:proofErr w:type="gramEnd"/>
-            <w:r>
-              <w:t xml:space="preserve"> enemy sprite</w:t>
-            </w:r>
-          </w:p>
-        </w:tc>
-        <w:tc>
-          <w:tcPr>
-            <w:tcW w:w="9474" w:type="dxa"/>
+              <w:t>Animation doesn’t work for other enemy sprite</w:t>
+            </w:r>
+          </w:p>
+        </w:tc>
+        <w:tc>
+          <w:tcPr>
+            <w:tcW w:w="9537" w:type="dxa"/>
             <w:gridSpan w:val="4"/>
           </w:tcPr>
           <w:p>
@@ -4948,7 +4516,7 @@
       <w:tr>
         <w:trPr>
           <w:gridAfter w:val="1"/>
-          <w:wAfter w:w="3283" w:type="dxa"/>
+          <w:wAfter w:w="1569" w:type="dxa"/>
         </w:trPr>
         <w:tc>
           <w:tcPr>
@@ -4962,7 +4530,7 @@
         </w:tc>
         <w:tc>
           <w:tcPr>
-            <w:tcW w:w="2642" w:type="dxa"/>
+            <w:tcW w:w="2777" w:type="dxa"/>
             <w:gridSpan w:val="2"/>
           </w:tcPr>
           <w:p>
@@ -4983,7 +4551,7 @@
         </w:tc>
         <w:tc>
           <w:tcPr>
-            <w:tcW w:w="2182" w:type="dxa"/>
+            <w:tcW w:w="1544" w:type="dxa"/>
             <w:gridSpan w:val="2"/>
           </w:tcPr>
           <w:p>
@@ -4994,7 +4562,7 @@
         </w:tc>
         <w:tc>
           <w:tcPr>
-            <w:tcW w:w="1178" w:type="dxa"/>
+            <w:tcW w:w="1199" w:type="dxa"/>
           </w:tcPr>
           <w:p>
             <w:r>
@@ -5004,7 +4572,7 @@
         </w:tc>
         <w:tc>
           <w:tcPr>
-            <w:tcW w:w="3360" w:type="dxa"/>
+            <w:tcW w:w="5556" w:type="dxa"/>
           </w:tcPr>
           <w:p>
             <w:r>
@@ -5016,7 +4584,7 @@
       <w:tr>
         <w:trPr>
           <w:gridAfter w:val="1"/>
-          <w:wAfter w:w="3283" w:type="dxa"/>
+          <w:wAfter w:w="1569" w:type="dxa"/>
         </w:trPr>
         <w:tc>
           <w:tcPr>
@@ -5030,7 +4598,7 @@
         </w:tc>
         <w:tc>
           <w:tcPr>
-            <w:tcW w:w="2642" w:type="dxa"/>
+            <w:tcW w:w="2777" w:type="dxa"/>
             <w:gridSpan w:val="2"/>
           </w:tcPr>
           <w:p>
@@ -5051,7 +4619,7 @@
         </w:tc>
         <w:tc>
           <w:tcPr>
-            <w:tcW w:w="2182" w:type="dxa"/>
+            <w:tcW w:w="1544" w:type="dxa"/>
             <w:gridSpan w:val="2"/>
           </w:tcPr>
           <w:p>
@@ -5062,7 +4630,7 @@
         </w:tc>
         <w:tc>
           <w:tcPr>
-            <w:tcW w:w="1178" w:type="dxa"/>
+            <w:tcW w:w="1199" w:type="dxa"/>
           </w:tcPr>
           <w:p>
             <w:r>
@@ -5072,7 +4640,7 @@
         </w:tc>
         <w:tc>
           <w:tcPr>
-            <w:tcW w:w="3360" w:type="dxa"/>
+            <w:tcW w:w="5556" w:type="dxa"/>
           </w:tcPr>
           <w:p/>
         </w:tc>
@@ -5080,7 +4648,7 @@
       <w:tr>
         <w:trPr>
           <w:gridAfter w:val="1"/>
-          <w:wAfter w:w="3283" w:type="dxa"/>
+          <w:wAfter w:w="1569" w:type="dxa"/>
         </w:trPr>
         <w:tc>
           <w:tcPr>
@@ -5094,7 +4662,7 @@
         </w:tc>
         <w:tc>
           <w:tcPr>
-            <w:tcW w:w="2642" w:type="dxa"/>
+            <w:tcW w:w="2777" w:type="dxa"/>
             <w:gridSpan w:val="2"/>
           </w:tcPr>
           <w:p>
@@ -5115,7 +4683,7 @@
         </w:tc>
         <w:tc>
           <w:tcPr>
-            <w:tcW w:w="2182" w:type="dxa"/>
+            <w:tcW w:w="1544" w:type="dxa"/>
             <w:gridSpan w:val="2"/>
           </w:tcPr>
           <w:p>
@@ -5126,20 +4694,25 @@
         </w:tc>
         <w:tc>
           <w:tcPr>
-            <w:tcW w:w="1178" w:type="dxa"/>
-          </w:tcPr>
-          <w:p>
-            <w:r>
-              <w:t>Attack frame isn’t changed to true when the final frame is played</w:t>
-            </w:r>
-          </w:p>
-        </w:tc>
-        <w:tc>
-          <w:tcPr>
-            <w:tcW w:w="3360" w:type="dxa"/>
-          </w:tcPr>
-          <w:p>
-            <w:r>
+            <w:tcW w:w="1199" w:type="dxa"/>
+          </w:tcPr>
+          <w:p>
+            <w:r>
+              <w:t xml:space="preserve">Attack frame isn’t changed to true when the final </w:t>
+            </w:r>
+            <w:r>
+              <w:lastRenderedPageBreak/>
+              <w:t>frame is played</w:t>
+            </w:r>
+          </w:p>
+        </w:tc>
+        <w:tc>
+          <w:tcPr>
+            <w:tcW w:w="5556" w:type="dxa"/>
+          </w:tcPr>
+          <w:p>
+            <w:r>
+              <w:lastRenderedPageBreak/>
               <w:t>Function wasn’t called properly called function properly</w:t>
             </w:r>
           </w:p>
@@ -5148,7 +4721,7 @@
       <w:tr>
         <w:trPr>
           <w:gridAfter w:val="1"/>
-          <w:wAfter w:w="3283" w:type="dxa"/>
+          <w:wAfter w:w="1569" w:type="dxa"/>
         </w:trPr>
         <w:tc>
           <w:tcPr>
@@ -5156,14 +4729,13 @@
           </w:tcPr>
           <w:p>
             <w:r>
-              <w:lastRenderedPageBreak/>
               <w:t>28/03</w:t>
             </w:r>
           </w:p>
         </w:tc>
         <w:tc>
           <w:tcPr>
-            <w:tcW w:w="2642" w:type="dxa"/>
+            <w:tcW w:w="2777" w:type="dxa"/>
             <w:gridSpan w:val="2"/>
           </w:tcPr>
           <w:p>
@@ -5184,7 +4756,7 @@
         </w:tc>
         <w:tc>
           <w:tcPr>
-            <w:tcW w:w="2182" w:type="dxa"/>
+            <w:tcW w:w="1544" w:type="dxa"/>
             <w:gridSpan w:val="2"/>
           </w:tcPr>
           <w:p>
@@ -5195,7 +4767,7 @@
         </w:tc>
         <w:tc>
           <w:tcPr>
-            <w:tcW w:w="1178" w:type="dxa"/>
+            <w:tcW w:w="1199" w:type="dxa"/>
           </w:tcPr>
           <w:p>
             <w:r>
@@ -5205,185 +4777,541 @@
         </w:tc>
         <w:tc>
           <w:tcPr>
-            <w:tcW w:w="3360" w:type="dxa"/>
-          </w:tcPr>
-          <w:p/>
+            <w:tcW w:w="5556" w:type="dxa"/>
+          </w:tcPr>
+          <w:p>
+            <w:r>
+              <w:rPr>
+                <w:noProof/>
+              </w:rPr>
+              <w:drawing>
+                <wp:inline distT="0" distB="0" distL="0" distR="0" wp14:anchorId="4BAFE237" wp14:editId="35862648">
+                  <wp:extent cx="3391373" cy="1028844"/>
+                  <wp:effectExtent l="0" t="0" r="0" b="0"/>
+                  <wp:docPr id="1772900573" name="Picture 1"/>
+                  <wp:cNvGraphicFramePr>
+                    <a:graphicFrameLocks xmlns:a="http://schemas.openxmlformats.org/drawingml/2006/main" noChangeAspect="1"/>
+                  </wp:cNvGraphicFramePr>
+                  <a:graphic xmlns:a="http://schemas.openxmlformats.org/drawingml/2006/main">
+                    <a:graphicData uri="http://schemas.openxmlformats.org/drawingml/2006/picture">
+                      <pic:pic xmlns:pic="http://schemas.openxmlformats.org/drawingml/2006/picture">
+                        <pic:nvPicPr>
+                          <pic:cNvPr id="1772900573" name=""/>
+                          <pic:cNvPicPr/>
+                        </pic:nvPicPr>
+                        <pic:blipFill>
+                          <a:blip r:embed="rId9"/>
+                          <a:stretch>
+                            <a:fillRect/>
+                          </a:stretch>
+                        </pic:blipFill>
+                        <pic:spPr>
+                          <a:xfrm>
+                            <a:off x="0" y="0"/>
+                            <a:ext cx="3391373" cy="1028844"/>
+                          </a:xfrm>
+                          <a:prstGeom prst="rect">
+                            <a:avLst/>
+                          </a:prstGeom>
+                        </pic:spPr>
+                      </pic:pic>
+                    </a:graphicData>
+                  </a:graphic>
+                </wp:inline>
+              </w:drawing>
+            </w:r>
+          </w:p>
         </w:tc>
       </w:tr>
       <w:tr>
         <w:trPr>
           <w:gridAfter w:val="1"/>
-          <w:wAfter w:w="3283" w:type="dxa"/>
+          <w:wAfter w:w="1569" w:type="dxa"/>
         </w:trPr>
         <w:tc>
           <w:tcPr>
             <w:tcW w:w="761" w:type="dxa"/>
           </w:tcPr>
-          <w:p/>
-        </w:tc>
-        <w:tc>
-          <w:tcPr>
-            <w:tcW w:w="2642" w:type="dxa"/>
+          <w:p>
+            <w:r>
+              <w:t>28/03</w:t>
+            </w:r>
+          </w:p>
+        </w:tc>
+        <w:tc>
+          <w:tcPr>
+            <w:tcW w:w="2777" w:type="dxa"/>
             <w:gridSpan w:val="2"/>
           </w:tcPr>
-          <w:p/>
+          <w:p>
+            <w:r>
+              <w:t>Enemy sprite damage taken</w:t>
+            </w:r>
+          </w:p>
         </w:tc>
         <w:tc>
           <w:tcPr>
             <w:tcW w:w="1417" w:type="dxa"/>
           </w:tcPr>
-          <w:p/>
-        </w:tc>
-        <w:tc>
-          <w:tcPr>
-            <w:tcW w:w="2182" w:type="dxa"/>
+          <w:p>
+            <w:r>
+              <w:t>Expected</w:t>
+            </w:r>
+          </w:p>
+        </w:tc>
+        <w:tc>
+          <w:tcPr>
+            <w:tcW w:w="1544" w:type="dxa"/>
             <w:gridSpan w:val="2"/>
           </w:tcPr>
-          <w:p/>
-        </w:tc>
-        <w:tc>
-          <w:tcPr>
-            <w:tcW w:w="1178" w:type="dxa"/>
-          </w:tcPr>
-          <w:p/>
-        </w:tc>
-        <w:tc>
-          <w:tcPr>
-            <w:tcW w:w="3360" w:type="dxa"/>
-          </w:tcPr>
-          <w:p/>
+          <w:p>
+            <w:r>
+              <w:t>Player takes damage when the colliding with the enemy on the attack frame</w:t>
+            </w:r>
+          </w:p>
+        </w:tc>
+        <w:tc>
+          <w:tcPr>
+            <w:tcW w:w="1199" w:type="dxa"/>
+          </w:tcPr>
+          <w:p>
+            <w:r>
+              <w:t>Player is tak</w:t>
+            </w:r>
+            <w:r>
+              <w:t xml:space="preserve">ing too much damage </w:t>
+            </w:r>
+          </w:p>
+        </w:tc>
+        <w:tc>
+          <w:tcPr>
+            <w:tcW w:w="5556" w:type="dxa"/>
+          </w:tcPr>
+          <w:p>
+            <w:r>
+              <w:t>Added a counter that decreases the players health once it reaches ten</w:t>
+            </w:r>
+          </w:p>
         </w:tc>
       </w:tr>
       <w:tr>
         <w:trPr>
           <w:gridAfter w:val="1"/>
-          <w:wAfter w:w="3283" w:type="dxa"/>
+          <w:wAfter w:w="1569" w:type="dxa"/>
         </w:trPr>
         <w:tc>
           <w:tcPr>
             <w:tcW w:w="761" w:type="dxa"/>
           </w:tcPr>
-          <w:p/>
-        </w:tc>
-        <w:tc>
-          <w:tcPr>
-            <w:tcW w:w="2642" w:type="dxa"/>
+          <w:p>
+            <w:r>
+              <w:t>28/03</w:t>
+            </w:r>
+          </w:p>
+        </w:tc>
+        <w:tc>
+          <w:tcPr>
+            <w:tcW w:w="2777" w:type="dxa"/>
             <w:gridSpan w:val="2"/>
           </w:tcPr>
-          <w:p/>
+          <w:p>
+            <w:r>
+              <w:t>Enemy sprite damage taken</w:t>
+            </w:r>
+          </w:p>
         </w:tc>
         <w:tc>
           <w:tcPr>
             <w:tcW w:w="1417" w:type="dxa"/>
           </w:tcPr>
-          <w:p/>
-        </w:tc>
-        <w:tc>
-          <w:tcPr>
-            <w:tcW w:w="2182" w:type="dxa"/>
+          <w:p>
+            <w:r>
+              <w:t>Expected</w:t>
+            </w:r>
+          </w:p>
+        </w:tc>
+        <w:tc>
+          <w:tcPr>
+            <w:tcW w:w="1544" w:type="dxa"/>
             <w:gridSpan w:val="2"/>
           </w:tcPr>
-          <w:p/>
-        </w:tc>
-        <w:tc>
-          <w:tcPr>
-            <w:tcW w:w="1178" w:type="dxa"/>
-          </w:tcPr>
-          <w:p/>
-        </w:tc>
-        <w:tc>
-          <w:tcPr>
-            <w:tcW w:w="3360" w:type="dxa"/>
-          </w:tcPr>
-          <w:p/>
+          <w:p>
+            <w:r>
+              <w:t>Player takes damage when the colliding with the enemy on the attack frame</w:t>
+            </w:r>
+          </w:p>
+        </w:tc>
+        <w:tc>
+          <w:tcPr>
+            <w:tcW w:w="1199" w:type="dxa"/>
+          </w:tcPr>
+          <w:p>
+            <w:r>
+              <w:t>Counter isn’t increasing</w:t>
+            </w:r>
+          </w:p>
+        </w:tc>
+        <w:tc>
+          <w:tcPr>
+            <w:tcW w:w="5556" w:type="dxa"/>
+          </w:tcPr>
+          <w:p>
+            <w:r>
+              <w:t>Defined self in init</w:t>
+            </w:r>
+          </w:p>
         </w:tc>
       </w:tr>
       <w:tr>
         <w:trPr>
           <w:gridAfter w:val="1"/>
-          <w:wAfter w:w="3283" w:type="dxa"/>
+          <w:wAfter w:w="1569" w:type="dxa"/>
         </w:trPr>
         <w:tc>
           <w:tcPr>
             <w:tcW w:w="761" w:type="dxa"/>
           </w:tcPr>
-          <w:p/>
-        </w:tc>
-        <w:tc>
-          <w:tcPr>
-            <w:tcW w:w="2642" w:type="dxa"/>
+          <w:p>
+            <w:r>
+              <w:t>28/03</w:t>
+            </w:r>
+          </w:p>
+        </w:tc>
+        <w:tc>
+          <w:tcPr>
+            <w:tcW w:w="2777" w:type="dxa"/>
             <w:gridSpan w:val="2"/>
           </w:tcPr>
-          <w:p/>
+          <w:p>
+            <w:r>
+              <w:t>Enemy sprite damage taken</w:t>
+            </w:r>
+          </w:p>
         </w:tc>
         <w:tc>
           <w:tcPr>
             <w:tcW w:w="1417" w:type="dxa"/>
           </w:tcPr>
-          <w:p/>
-        </w:tc>
-        <w:tc>
-          <w:tcPr>
-            <w:tcW w:w="2182" w:type="dxa"/>
+          <w:p>
+            <w:r>
+              <w:t>Expected</w:t>
+            </w:r>
+          </w:p>
+        </w:tc>
+        <w:tc>
+          <w:tcPr>
+            <w:tcW w:w="1544" w:type="dxa"/>
             <w:gridSpan w:val="2"/>
           </w:tcPr>
-          <w:p/>
-        </w:tc>
-        <w:tc>
-          <w:tcPr>
-            <w:tcW w:w="1178" w:type="dxa"/>
-          </w:tcPr>
-          <w:p/>
-        </w:tc>
-        <w:tc>
-          <w:tcPr>
-            <w:tcW w:w="3360" w:type="dxa"/>
-          </w:tcPr>
-          <w:p/>
+          <w:p>
+            <w:r>
+              <w:t>Player takes damage when the colliding with the enemy on the attack frame</w:t>
+            </w:r>
+          </w:p>
+        </w:tc>
+        <w:tc>
+          <w:tcPr>
+            <w:tcW w:w="1199" w:type="dxa"/>
+          </w:tcPr>
+          <w:p>
+            <w:r>
+              <w:t>Player takes damage</w:t>
+            </w:r>
+          </w:p>
+        </w:tc>
+        <w:tc>
+          <w:tcPr>
+            <w:tcW w:w="5556" w:type="dxa"/>
+          </w:tcPr>
+          <w:p>
+            <w:r>
+              <w:t>None</w:t>
+            </w:r>
+          </w:p>
         </w:tc>
       </w:tr>
       <w:tr>
         <w:trPr>
           <w:gridAfter w:val="1"/>
-          <w:wAfter w:w="3283" w:type="dxa"/>
+          <w:wAfter w:w="1569" w:type="dxa"/>
         </w:trPr>
         <w:tc>
           <w:tcPr>
             <w:tcW w:w="761" w:type="dxa"/>
           </w:tcPr>
+          <w:p>
+            <w:r>
+              <w:t>28/03</w:t>
+            </w:r>
+          </w:p>
+        </w:tc>
+        <w:tc>
+          <w:tcPr>
+            <w:tcW w:w="2777" w:type="dxa"/>
+            <w:gridSpan w:val="2"/>
+          </w:tcPr>
+          <w:p>
+            <w:r>
+              <w:t>Enemy death animation</w:t>
+            </w:r>
+          </w:p>
+        </w:tc>
+        <w:tc>
+          <w:tcPr>
+            <w:tcW w:w="1417" w:type="dxa"/>
+          </w:tcPr>
+          <w:p>
+            <w:r>
+              <w:t>Expected</w:t>
+            </w:r>
+          </w:p>
+        </w:tc>
+        <w:tc>
+          <w:tcPr>
+            <w:tcW w:w="1544" w:type="dxa"/>
+            <w:gridSpan w:val="2"/>
+          </w:tcPr>
+          <w:p>
+            <w:r>
+              <w:t>When player health is 0 death animation is played</w:t>
+            </w:r>
+          </w:p>
+        </w:tc>
+        <w:tc>
+          <w:tcPr>
+            <w:tcW w:w="1199" w:type="dxa"/>
+          </w:tcPr>
+          <w:p>
+            <w:r>
+              <w:t>Player animation works</w:t>
+            </w:r>
+          </w:p>
+        </w:tc>
+        <w:tc>
+          <w:tcPr>
+            <w:tcW w:w="5556" w:type="dxa"/>
+          </w:tcPr>
+          <w:p>
+            <w:r>
+              <w:t>None</w:t>
+            </w:r>
+          </w:p>
+        </w:tc>
+      </w:tr>
+      <w:tr>
+        <w:trPr>
+          <w:gridAfter w:val="1"/>
+          <w:wAfter w:w="1569" w:type="dxa"/>
+        </w:trPr>
+        <w:tc>
+          <w:tcPr>
+            <w:tcW w:w="761" w:type="dxa"/>
+          </w:tcPr>
+          <w:p>
+            <w:r>
+              <w:t>28/03</w:t>
+            </w:r>
+          </w:p>
+        </w:tc>
+        <w:tc>
+          <w:tcPr>
+            <w:tcW w:w="2777" w:type="dxa"/>
+            <w:gridSpan w:val="2"/>
+          </w:tcPr>
+          <w:p>
+            <w:r>
+              <w:t>Enemy hit animation</w:t>
+            </w:r>
+          </w:p>
+        </w:tc>
+        <w:tc>
+          <w:tcPr>
+            <w:tcW w:w="1417" w:type="dxa"/>
+          </w:tcPr>
+          <w:p>
+            <w:r>
+              <w:t xml:space="preserve">Expected </w:t>
+            </w:r>
+          </w:p>
+        </w:tc>
+        <w:tc>
+          <w:tcPr>
+            <w:tcW w:w="1544" w:type="dxa"/>
+            <w:gridSpan w:val="2"/>
+          </w:tcPr>
+          <w:p>
+            <w:r>
+              <w:t>Hit animation plays when player is hit by enemy</w:t>
+            </w:r>
+          </w:p>
+        </w:tc>
+        <w:tc>
+          <w:tcPr>
+            <w:tcW w:w="1199" w:type="dxa"/>
+          </w:tcPr>
+          <w:p>
+            <w:r>
+              <w:t>Code is running but textures aren’t changing</w:t>
+            </w:r>
+          </w:p>
+        </w:tc>
+        <w:tc>
+          <w:tcPr>
+            <w:tcW w:w="5556" w:type="dxa"/>
+          </w:tcPr>
           <w:p/>
         </w:tc>
-        <w:tc>
-          <w:tcPr>
-            <w:tcW w:w="2642" w:type="dxa"/>
+      </w:tr>
+      <w:tr>
+        <w:trPr>
+          <w:gridAfter w:val="1"/>
+          <w:wAfter w:w="1569" w:type="dxa"/>
+        </w:trPr>
+        <w:tc>
+          <w:tcPr>
+            <w:tcW w:w="761" w:type="dxa"/>
+          </w:tcPr>
+          <w:p>
+            <w:r>
+              <w:t>28/03</w:t>
+            </w:r>
+          </w:p>
+        </w:tc>
+        <w:tc>
+          <w:tcPr>
+            <w:tcW w:w="2777" w:type="dxa"/>
             <w:gridSpan w:val="2"/>
           </w:tcPr>
-          <w:p/>
+          <w:p>
+            <w:r>
+              <w:t>Enemy hit animation</w:t>
+            </w:r>
+          </w:p>
         </w:tc>
         <w:tc>
           <w:tcPr>
             <w:tcW w:w="1417" w:type="dxa"/>
           </w:tcPr>
-          <w:p/>
-        </w:tc>
-        <w:tc>
-          <w:tcPr>
-            <w:tcW w:w="2182" w:type="dxa"/>
+          <w:p>
+            <w:r>
+              <w:t xml:space="preserve">Expected </w:t>
+            </w:r>
+          </w:p>
+        </w:tc>
+        <w:tc>
+          <w:tcPr>
+            <w:tcW w:w="1544" w:type="dxa"/>
             <w:gridSpan w:val="2"/>
           </w:tcPr>
-          <w:p/>
-        </w:tc>
-        <w:tc>
-          <w:tcPr>
-            <w:tcW w:w="1178" w:type="dxa"/>
-          </w:tcPr>
-          <w:p/>
-        </w:tc>
-        <w:tc>
-          <w:tcPr>
-            <w:tcW w:w="3360" w:type="dxa"/>
-          </w:tcPr>
-          <w:p/>
+          <w:p>
+            <w:r>
+              <w:t>Hit animation plays when player is hit by enemy</w:t>
+            </w:r>
+          </w:p>
+        </w:tc>
+        <w:tc>
+          <w:tcPr>
+            <w:tcW w:w="1199" w:type="dxa"/>
+          </w:tcPr>
+          <w:p>
+            <w:r>
+              <w:t>Texture only changes when player sprite moves</w:t>
+            </w:r>
+          </w:p>
+        </w:tc>
+        <w:tc>
+          <w:tcPr>
+            <w:tcW w:w="5556" w:type="dxa"/>
+          </w:tcPr>
+          <w:p>
+            <w:r>
+              <w:t>Made the hit texture run if the player sprite was standing still.</w:t>
+            </w:r>
+          </w:p>
+        </w:tc>
+      </w:tr>
+      <w:tr>
+        <w:trPr>
+          <w:gridAfter w:val="1"/>
+          <w:wAfter w:w="1569" w:type="dxa"/>
+        </w:trPr>
+        <w:tc>
+          <w:tcPr>
+            <w:tcW w:w="761" w:type="dxa"/>
+          </w:tcPr>
+          <w:p>
+            <w:r>
+              <w:t>28/03</w:t>
+            </w:r>
+          </w:p>
+        </w:tc>
+        <w:tc>
+          <w:tcPr>
+            <w:tcW w:w="2777" w:type="dxa"/>
+            <w:gridSpan w:val="2"/>
+          </w:tcPr>
+          <w:p>
+            <w:r>
+              <w:t>Enemy hit animation</w:t>
+            </w:r>
+          </w:p>
+        </w:tc>
+        <w:tc>
+          <w:tcPr>
+            <w:tcW w:w="1417" w:type="dxa"/>
+          </w:tcPr>
+          <w:p>
+            <w:r>
+              <w:t xml:space="preserve">Expected </w:t>
+            </w:r>
+          </w:p>
+        </w:tc>
+        <w:tc>
+          <w:tcPr>
+            <w:tcW w:w="1544" w:type="dxa"/>
+            <w:gridSpan w:val="2"/>
+          </w:tcPr>
+          <w:p>
+            <w:r>
+              <w:t xml:space="preserve">Hit animation plays </w:t>
+            </w:r>
+            <w:r>
+              <w:t xml:space="preserve">when </w:t>
+            </w:r>
+            <w:r>
+              <w:lastRenderedPageBreak/>
+              <w:t>player</w:t>
+            </w:r>
+            <w:r>
+              <w:t xml:space="preserve"> is hit by enemy</w:t>
+            </w:r>
+          </w:p>
+        </w:tc>
+        <w:tc>
+          <w:tcPr>
+            <w:tcW w:w="1199" w:type="dxa"/>
+          </w:tcPr>
+          <w:p>
+            <w:r>
+              <w:lastRenderedPageBreak/>
+              <w:t xml:space="preserve">Texture plays correctly </w:t>
+            </w:r>
+            <w:r>
+              <w:lastRenderedPageBreak/>
+              <w:t>when player is hit</w:t>
+            </w:r>
+          </w:p>
+        </w:tc>
+        <w:tc>
+          <w:tcPr>
+            <w:tcW w:w="5556" w:type="dxa"/>
+          </w:tcPr>
+          <w:p>
+            <w:r>
+              <w:lastRenderedPageBreak/>
+              <w:t>None</w:t>
+            </w:r>
+          </w:p>
         </w:tc>
       </w:tr>
     </w:tbl>

</xml_diff>

<commit_message>
added player animations enemy death animations and made enemy code more compact
</commit_message>
<xml_diff>
--- a/documentation/ongoing_testing.docx
+++ b/documentation/ongoing_testing.docx
@@ -10,20 +10,20 @@
         <w:tblLook w:val="04A0" w:firstRow="1" w:lastRow="0" w:firstColumn="1" w:lastColumn="0" w:noHBand="0" w:noVBand="1"/>
       </w:tblPr>
       <w:tblGrid>
-        <w:gridCol w:w="761"/>
+        <w:gridCol w:w="762"/>
         <w:gridCol w:w="1358"/>
         <w:gridCol w:w="1419"/>
         <w:gridCol w:w="1417"/>
-        <w:gridCol w:w="331"/>
-        <w:gridCol w:w="1213"/>
-        <w:gridCol w:w="1199"/>
-        <w:gridCol w:w="5556"/>
-        <w:gridCol w:w="1569"/>
+        <w:gridCol w:w="312"/>
+        <w:gridCol w:w="1030"/>
+        <w:gridCol w:w="1298"/>
+        <w:gridCol w:w="6291"/>
+        <w:gridCol w:w="936"/>
       </w:tblGrid>
       <w:tr>
         <w:tc>
           <w:tcPr>
-            <w:tcW w:w="761" w:type="dxa"/>
+            <w:tcW w:w="762" w:type="dxa"/>
           </w:tcPr>
           <w:p>
             <w:r>
@@ -53,7 +53,7 @@
         </w:tc>
         <w:tc>
           <w:tcPr>
-            <w:tcW w:w="1748" w:type="dxa"/>
+            <w:tcW w:w="1729" w:type="dxa"/>
             <w:gridSpan w:val="2"/>
           </w:tcPr>
           <w:p>
@@ -64,7 +64,7 @@
         </w:tc>
         <w:tc>
           <w:tcPr>
-            <w:tcW w:w="9537" w:type="dxa"/>
+            <w:tcW w:w="9555" w:type="dxa"/>
             <w:gridSpan w:val="4"/>
           </w:tcPr>
           <w:p>
@@ -77,7 +77,7 @@
       <w:tr>
         <w:tc>
           <w:tcPr>
-            <w:tcW w:w="761" w:type="dxa"/>
+            <w:tcW w:w="762" w:type="dxa"/>
           </w:tcPr>
           <w:p>
             <w:r>
@@ -107,7 +107,7 @@
         </w:tc>
         <w:tc>
           <w:tcPr>
-            <w:tcW w:w="1748" w:type="dxa"/>
+            <w:tcW w:w="1729" w:type="dxa"/>
             <w:gridSpan w:val="2"/>
           </w:tcPr>
           <w:p>
@@ -118,7 +118,7 @@
         </w:tc>
         <w:tc>
           <w:tcPr>
-            <w:tcW w:w="9537" w:type="dxa"/>
+            <w:tcW w:w="9555" w:type="dxa"/>
             <w:gridSpan w:val="4"/>
           </w:tcPr>
           <w:p>
@@ -131,7 +131,7 @@
       <w:tr>
         <w:tc>
           <w:tcPr>
-            <w:tcW w:w="761" w:type="dxa"/>
+            <w:tcW w:w="762" w:type="dxa"/>
           </w:tcPr>
           <w:p>
             <w:r>
@@ -161,7 +161,7 @@
         </w:tc>
         <w:tc>
           <w:tcPr>
-            <w:tcW w:w="1748" w:type="dxa"/>
+            <w:tcW w:w="1729" w:type="dxa"/>
             <w:gridSpan w:val="2"/>
           </w:tcPr>
           <w:p>
@@ -172,7 +172,7 @@
         </w:tc>
         <w:tc>
           <w:tcPr>
-            <w:tcW w:w="9537" w:type="dxa"/>
+            <w:tcW w:w="9555" w:type="dxa"/>
             <w:gridSpan w:val="4"/>
           </w:tcPr>
           <w:p>
@@ -185,7 +185,7 @@
       <w:tr>
         <w:tc>
           <w:tcPr>
-            <w:tcW w:w="761" w:type="dxa"/>
+            <w:tcW w:w="762" w:type="dxa"/>
           </w:tcPr>
           <w:p>
             <w:r>
@@ -215,7 +215,7 @@
         </w:tc>
         <w:tc>
           <w:tcPr>
-            <w:tcW w:w="1748" w:type="dxa"/>
+            <w:tcW w:w="1729" w:type="dxa"/>
             <w:gridSpan w:val="2"/>
           </w:tcPr>
           <w:p>
@@ -226,7 +226,7 @@
         </w:tc>
         <w:tc>
           <w:tcPr>
-            <w:tcW w:w="9537" w:type="dxa"/>
+            <w:tcW w:w="9555" w:type="dxa"/>
             <w:gridSpan w:val="4"/>
           </w:tcPr>
           <w:p>
@@ -239,7 +239,7 @@
       <w:tr>
         <w:tc>
           <w:tcPr>
-            <w:tcW w:w="761" w:type="dxa"/>
+            <w:tcW w:w="762" w:type="dxa"/>
           </w:tcPr>
           <w:p>
             <w:r>
@@ -269,7 +269,7 @@
         </w:tc>
         <w:tc>
           <w:tcPr>
-            <w:tcW w:w="1748" w:type="dxa"/>
+            <w:tcW w:w="1729" w:type="dxa"/>
             <w:gridSpan w:val="2"/>
           </w:tcPr>
           <w:p>
@@ -280,7 +280,7 @@
         </w:tc>
         <w:tc>
           <w:tcPr>
-            <w:tcW w:w="9537" w:type="dxa"/>
+            <w:tcW w:w="9555" w:type="dxa"/>
             <w:gridSpan w:val="4"/>
           </w:tcPr>
           <w:p/>
@@ -289,7 +289,7 @@
       <w:tr>
         <w:tc>
           <w:tcPr>
-            <w:tcW w:w="761" w:type="dxa"/>
+            <w:tcW w:w="762" w:type="dxa"/>
           </w:tcPr>
           <w:p>
             <w:r>
@@ -319,7 +319,7 @@
         </w:tc>
         <w:tc>
           <w:tcPr>
-            <w:tcW w:w="1748" w:type="dxa"/>
+            <w:tcW w:w="1729" w:type="dxa"/>
             <w:gridSpan w:val="2"/>
           </w:tcPr>
           <w:p>
@@ -330,7 +330,7 @@
         </w:tc>
         <w:tc>
           <w:tcPr>
-            <w:tcW w:w="9537" w:type="dxa"/>
+            <w:tcW w:w="9555" w:type="dxa"/>
             <w:gridSpan w:val="4"/>
           </w:tcPr>
           <w:p>
@@ -441,7 +441,7 @@
       <w:tr>
         <w:tc>
           <w:tcPr>
-            <w:tcW w:w="761" w:type="dxa"/>
+            <w:tcW w:w="762" w:type="dxa"/>
           </w:tcPr>
           <w:p>
             <w:r>
@@ -471,7 +471,7 @@
         </w:tc>
         <w:tc>
           <w:tcPr>
-            <w:tcW w:w="1748" w:type="dxa"/>
+            <w:tcW w:w="1729" w:type="dxa"/>
             <w:gridSpan w:val="2"/>
           </w:tcPr>
           <w:p>
@@ -482,7 +482,7 @@
         </w:tc>
         <w:tc>
           <w:tcPr>
-            <w:tcW w:w="9537" w:type="dxa"/>
+            <w:tcW w:w="9555" w:type="dxa"/>
             <w:gridSpan w:val="4"/>
           </w:tcPr>
           <w:p>
@@ -745,7 +745,7 @@
       <w:tr>
         <w:tc>
           <w:tcPr>
-            <w:tcW w:w="761" w:type="dxa"/>
+            <w:tcW w:w="762" w:type="dxa"/>
           </w:tcPr>
           <w:p>
             <w:r>
@@ -775,7 +775,7 @@
         </w:tc>
         <w:tc>
           <w:tcPr>
-            <w:tcW w:w="1748" w:type="dxa"/>
+            <w:tcW w:w="1729" w:type="dxa"/>
             <w:gridSpan w:val="2"/>
           </w:tcPr>
           <w:p>
@@ -786,7 +786,7 @@
         </w:tc>
         <w:tc>
           <w:tcPr>
-            <w:tcW w:w="9537" w:type="dxa"/>
+            <w:tcW w:w="9555" w:type="dxa"/>
             <w:gridSpan w:val="4"/>
           </w:tcPr>
           <w:p>
@@ -799,7 +799,7 @@
       <w:tr>
         <w:tc>
           <w:tcPr>
-            <w:tcW w:w="761" w:type="dxa"/>
+            <w:tcW w:w="762" w:type="dxa"/>
           </w:tcPr>
           <w:p>
             <w:r>
@@ -829,7 +829,7 @@
         </w:tc>
         <w:tc>
           <w:tcPr>
-            <w:tcW w:w="1748" w:type="dxa"/>
+            <w:tcW w:w="1729" w:type="dxa"/>
             <w:gridSpan w:val="2"/>
           </w:tcPr>
           <w:p>
@@ -840,7 +840,7 @@
         </w:tc>
         <w:tc>
           <w:tcPr>
-            <w:tcW w:w="9537" w:type="dxa"/>
+            <w:tcW w:w="9555" w:type="dxa"/>
             <w:gridSpan w:val="4"/>
           </w:tcPr>
           <w:p>
@@ -853,7 +853,7 @@
       <w:tr>
         <w:tc>
           <w:tcPr>
-            <w:tcW w:w="761" w:type="dxa"/>
+            <w:tcW w:w="762" w:type="dxa"/>
           </w:tcPr>
           <w:p>
             <w:r>
@@ -883,7 +883,7 @@
         </w:tc>
         <w:tc>
           <w:tcPr>
-            <w:tcW w:w="1748" w:type="dxa"/>
+            <w:tcW w:w="1729" w:type="dxa"/>
             <w:gridSpan w:val="2"/>
           </w:tcPr>
           <w:p>
@@ -894,7 +894,7 @@
         </w:tc>
         <w:tc>
           <w:tcPr>
-            <w:tcW w:w="9537" w:type="dxa"/>
+            <w:tcW w:w="9555" w:type="dxa"/>
             <w:gridSpan w:val="4"/>
           </w:tcPr>
           <w:p>
@@ -907,7 +907,7 @@
       <w:tr>
         <w:tc>
           <w:tcPr>
-            <w:tcW w:w="761" w:type="dxa"/>
+            <w:tcW w:w="762" w:type="dxa"/>
           </w:tcPr>
           <w:p>
             <w:r>
@@ -941,7 +941,7 @@
         </w:tc>
         <w:tc>
           <w:tcPr>
-            <w:tcW w:w="1748" w:type="dxa"/>
+            <w:tcW w:w="1729" w:type="dxa"/>
             <w:gridSpan w:val="2"/>
           </w:tcPr>
           <w:p>
@@ -953,7 +953,7 @@
         </w:tc>
         <w:tc>
           <w:tcPr>
-            <w:tcW w:w="9537" w:type="dxa"/>
+            <w:tcW w:w="9555" w:type="dxa"/>
             <w:gridSpan w:val="4"/>
           </w:tcPr>
           <w:p>
@@ -967,7 +967,7 @@
       <w:tr>
         <w:tc>
           <w:tcPr>
-            <w:tcW w:w="761" w:type="dxa"/>
+            <w:tcW w:w="762" w:type="dxa"/>
           </w:tcPr>
           <w:p>
             <w:r>
@@ -997,7 +997,7 @@
         </w:tc>
         <w:tc>
           <w:tcPr>
-            <w:tcW w:w="1748" w:type="dxa"/>
+            <w:tcW w:w="1729" w:type="dxa"/>
             <w:gridSpan w:val="2"/>
           </w:tcPr>
           <w:p>
@@ -1008,7 +1008,7 @@
         </w:tc>
         <w:tc>
           <w:tcPr>
-            <w:tcW w:w="9537" w:type="dxa"/>
+            <w:tcW w:w="9555" w:type="dxa"/>
             <w:gridSpan w:val="4"/>
           </w:tcPr>
           <w:p>
@@ -1634,7 +1634,7 @@
       <w:tr>
         <w:tc>
           <w:tcPr>
-            <w:tcW w:w="761" w:type="dxa"/>
+            <w:tcW w:w="762" w:type="dxa"/>
           </w:tcPr>
           <w:p>
             <w:r>
@@ -1664,7 +1664,7 @@
         </w:tc>
         <w:tc>
           <w:tcPr>
-            <w:tcW w:w="1748" w:type="dxa"/>
+            <w:tcW w:w="1729" w:type="dxa"/>
             <w:gridSpan w:val="2"/>
           </w:tcPr>
           <w:p>
@@ -1675,7 +1675,7 @@
         </w:tc>
         <w:tc>
           <w:tcPr>
-            <w:tcW w:w="9537" w:type="dxa"/>
+            <w:tcW w:w="9555" w:type="dxa"/>
             <w:gridSpan w:val="4"/>
           </w:tcPr>
           <w:p>
@@ -1696,7 +1696,7 @@
       <w:tr>
         <w:tc>
           <w:tcPr>
-            <w:tcW w:w="761" w:type="dxa"/>
+            <w:tcW w:w="762" w:type="dxa"/>
           </w:tcPr>
           <w:p>
             <w:r>
@@ -1726,7 +1726,7 @@
         </w:tc>
         <w:tc>
           <w:tcPr>
-            <w:tcW w:w="1748" w:type="dxa"/>
+            <w:tcW w:w="1729" w:type="dxa"/>
             <w:gridSpan w:val="2"/>
           </w:tcPr>
           <w:p>
@@ -1737,7 +1737,7 @@
         </w:tc>
         <w:tc>
           <w:tcPr>
-            <w:tcW w:w="9537" w:type="dxa"/>
+            <w:tcW w:w="9555" w:type="dxa"/>
             <w:gridSpan w:val="4"/>
           </w:tcPr>
           <w:p>
@@ -1816,7 +1816,7 @@
         </w:trPr>
         <w:tc>
           <w:tcPr>
-            <w:tcW w:w="761" w:type="dxa"/>
+            <w:tcW w:w="762" w:type="dxa"/>
           </w:tcPr>
           <w:p>
             <w:r>
@@ -1846,7 +1846,7 @@
         </w:tc>
         <w:tc>
           <w:tcPr>
-            <w:tcW w:w="1748" w:type="dxa"/>
+            <w:tcW w:w="1729" w:type="dxa"/>
             <w:gridSpan w:val="2"/>
           </w:tcPr>
           <w:p>
@@ -1857,7 +1857,7 @@
         </w:tc>
         <w:tc>
           <w:tcPr>
-            <w:tcW w:w="9537" w:type="dxa"/>
+            <w:tcW w:w="9555" w:type="dxa"/>
             <w:gridSpan w:val="4"/>
           </w:tcPr>
           <w:p>
@@ -1891,7 +1891,7 @@
         </w:trPr>
         <w:tc>
           <w:tcPr>
-            <w:tcW w:w="761" w:type="dxa"/>
+            <w:tcW w:w="762" w:type="dxa"/>
           </w:tcPr>
           <w:p>
             <w:r>
@@ -1921,7 +1921,7 @@
         </w:tc>
         <w:tc>
           <w:tcPr>
-            <w:tcW w:w="1748" w:type="dxa"/>
+            <w:tcW w:w="1729" w:type="dxa"/>
             <w:gridSpan w:val="2"/>
           </w:tcPr>
           <w:p>
@@ -1932,7 +1932,7 @@
         </w:tc>
         <w:tc>
           <w:tcPr>
-            <w:tcW w:w="9537" w:type="dxa"/>
+            <w:tcW w:w="9555" w:type="dxa"/>
             <w:gridSpan w:val="4"/>
           </w:tcPr>
           <w:p>
@@ -1966,7 +1966,7 @@
         </w:trPr>
         <w:tc>
           <w:tcPr>
-            <w:tcW w:w="761" w:type="dxa"/>
+            <w:tcW w:w="762" w:type="dxa"/>
           </w:tcPr>
           <w:p>
             <w:r>
@@ -1996,7 +1996,7 @@
         </w:tc>
         <w:tc>
           <w:tcPr>
-            <w:tcW w:w="1748" w:type="dxa"/>
+            <w:tcW w:w="1729" w:type="dxa"/>
             <w:gridSpan w:val="2"/>
           </w:tcPr>
           <w:p>
@@ -2007,7 +2007,7 @@
         </w:tc>
         <w:tc>
           <w:tcPr>
-            <w:tcW w:w="9537" w:type="dxa"/>
+            <w:tcW w:w="9555" w:type="dxa"/>
             <w:gridSpan w:val="4"/>
           </w:tcPr>
           <w:p>
@@ -2041,7 +2041,7 @@
         </w:trPr>
         <w:tc>
           <w:tcPr>
-            <w:tcW w:w="761" w:type="dxa"/>
+            <w:tcW w:w="762" w:type="dxa"/>
           </w:tcPr>
           <w:p>
             <w:r>
@@ -2071,7 +2071,7 @@
         </w:tc>
         <w:tc>
           <w:tcPr>
-            <w:tcW w:w="1748" w:type="dxa"/>
+            <w:tcW w:w="1729" w:type="dxa"/>
             <w:gridSpan w:val="2"/>
           </w:tcPr>
           <w:p>
@@ -2082,7 +2082,7 @@
         </w:tc>
         <w:tc>
           <w:tcPr>
-            <w:tcW w:w="9537" w:type="dxa"/>
+            <w:tcW w:w="9555" w:type="dxa"/>
             <w:gridSpan w:val="4"/>
           </w:tcPr>
           <w:p>
@@ -2116,7 +2116,7 @@
         </w:trPr>
         <w:tc>
           <w:tcPr>
-            <w:tcW w:w="761" w:type="dxa"/>
+            <w:tcW w:w="762" w:type="dxa"/>
           </w:tcPr>
           <w:p>
             <w:r>
@@ -2146,7 +2146,7 @@
         </w:tc>
         <w:tc>
           <w:tcPr>
-            <w:tcW w:w="1748" w:type="dxa"/>
+            <w:tcW w:w="1729" w:type="dxa"/>
             <w:gridSpan w:val="2"/>
           </w:tcPr>
           <w:p>
@@ -2162,7 +2162,7 @@
         </w:tc>
         <w:tc>
           <w:tcPr>
-            <w:tcW w:w="9537" w:type="dxa"/>
+            <w:tcW w:w="9555" w:type="dxa"/>
             <w:gridSpan w:val="4"/>
           </w:tcPr>
           <w:p>
@@ -2196,7 +2196,7 @@
         </w:trPr>
         <w:tc>
           <w:tcPr>
-            <w:tcW w:w="761" w:type="dxa"/>
+            <w:tcW w:w="762" w:type="dxa"/>
           </w:tcPr>
           <w:p>
             <w:r>
@@ -2226,7 +2226,7 @@
         </w:tc>
         <w:tc>
           <w:tcPr>
-            <w:tcW w:w="1748" w:type="dxa"/>
+            <w:tcW w:w="1729" w:type="dxa"/>
             <w:gridSpan w:val="2"/>
           </w:tcPr>
           <w:p>
@@ -2237,7 +2237,7 @@
         </w:tc>
         <w:tc>
           <w:tcPr>
-            <w:tcW w:w="9537" w:type="dxa"/>
+            <w:tcW w:w="9555" w:type="dxa"/>
             <w:gridSpan w:val="4"/>
           </w:tcPr>
           <w:p>
@@ -2271,7 +2271,7 @@
         </w:trPr>
         <w:tc>
           <w:tcPr>
-            <w:tcW w:w="761" w:type="dxa"/>
+            <w:tcW w:w="762" w:type="dxa"/>
           </w:tcPr>
           <w:p>
             <w:r>
@@ -2301,7 +2301,7 @@
         </w:tc>
         <w:tc>
           <w:tcPr>
-            <w:tcW w:w="1748" w:type="dxa"/>
+            <w:tcW w:w="1729" w:type="dxa"/>
             <w:gridSpan w:val="2"/>
           </w:tcPr>
           <w:p>
@@ -2312,7 +2312,7 @@
         </w:tc>
         <w:tc>
           <w:tcPr>
-            <w:tcW w:w="9537" w:type="dxa"/>
+            <w:tcW w:w="9555" w:type="dxa"/>
             <w:gridSpan w:val="4"/>
           </w:tcPr>
           <w:p>
@@ -2346,7 +2346,7 @@
         </w:trPr>
         <w:tc>
           <w:tcPr>
-            <w:tcW w:w="761" w:type="dxa"/>
+            <w:tcW w:w="762" w:type="dxa"/>
           </w:tcPr>
           <w:p>
             <w:r>
@@ -2377,7 +2377,7 @@
         </w:tc>
         <w:tc>
           <w:tcPr>
-            <w:tcW w:w="1748" w:type="dxa"/>
+            <w:tcW w:w="1729" w:type="dxa"/>
             <w:gridSpan w:val="2"/>
           </w:tcPr>
           <w:p>
@@ -2388,7 +2388,7 @@
         </w:tc>
         <w:tc>
           <w:tcPr>
-            <w:tcW w:w="9537" w:type="dxa"/>
+            <w:tcW w:w="9555" w:type="dxa"/>
             <w:gridSpan w:val="4"/>
           </w:tcPr>
           <w:p>
@@ -2422,7 +2422,7 @@
         </w:trPr>
         <w:tc>
           <w:tcPr>
-            <w:tcW w:w="761" w:type="dxa"/>
+            <w:tcW w:w="762" w:type="dxa"/>
           </w:tcPr>
           <w:p>
             <w:r>
@@ -2452,7 +2452,7 @@
         </w:tc>
         <w:tc>
           <w:tcPr>
-            <w:tcW w:w="1748" w:type="dxa"/>
+            <w:tcW w:w="1729" w:type="dxa"/>
             <w:gridSpan w:val="2"/>
           </w:tcPr>
           <w:p>
@@ -2463,7 +2463,7 @@
         </w:tc>
         <w:tc>
           <w:tcPr>
-            <w:tcW w:w="9537" w:type="dxa"/>
+            <w:tcW w:w="9555" w:type="dxa"/>
             <w:gridSpan w:val="4"/>
           </w:tcPr>
           <w:p>
@@ -2497,7 +2497,7 @@
         </w:trPr>
         <w:tc>
           <w:tcPr>
-            <w:tcW w:w="761" w:type="dxa"/>
+            <w:tcW w:w="762" w:type="dxa"/>
           </w:tcPr>
           <w:p>
             <w:r>
@@ -2527,7 +2527,7 @@
         </w:tc>
         <w:tc>
           <w:tcPr>
-            <w:tcW w:w="1748" w:type="dxa"/>
+            <w:tcW w:w="1729" w:type="dxa"/>
             <w:gridSpan w:val="2"/>
           </w:tcPr>
           <w:p>
@@ -2538,7 +2538,7 @@
         </w:tc>
         <w:tc>
           <w:tcPr>
-            <w:tcW w:w="9537" w:type="dxa"/>
+            <w:tcW w:w="9555" w:type="dxa"/>
             <w:gridSpan w:val="4"/>
           </w:tcPr>
           <w:p>
@@ -2748,7 +2748,7 @@
         </w:trPr>
         <w:tc>
           <w:tcPr>
-            <w:tcW w:w="761" w:type="dxa"/>
+            <w:tcW w:w="762" w:type="dxa"/>
           </w:tcPr>
           <w:p>
             <w:r>
@@ -2778,7 +2778,7 @@
         </w:tc>
         <w:tc>
           <w:tcPr>
-            <w:tcW w:w="1748" w:type="dxa"/>
+            <w:tcW w:w="1729" w:type="dxa"/>
             <w:gridSpan w:val="2"/>
           </w:tcPr>
           <w:p>
@@ -2789,7 +2789,7 @@
         </w:tc>
         <w:tc>
           <w:tcPr>
-            <w:tcW w:w="9537" w:type="dxa"/>
+            <w:tcW w:w="9555" w:type="dxa"/>
             <w:gridSpan w:val="4"/>
           </w:tcPr>
           <w:p>
@@ -2823,7 +2823,7 @@
         </w:trPr>
         <w:tc>
           <w:tcPr>
-            <w:tcW w:w="761" w:type="dxa"/>
+            <w:tcW w:w="762" w:type="dxa"/>
           </w:tcPr>
           <w:p>
             <w:r>
@@ -2853,7 +2853,7 @@
         </w:tc>
         <w:tc>
           <w:tcPr>
-            <w:tcW w:w="1748" w:type="dxa"/>
+            <w:tcW w:w="1729" w:type="dxa"/>
             <w:gridSpan w:val="2"/>
           </w:tcPr>
           <w:p>
@@ -2864,7 +2864,7 @@
         </w:tc>
         <w:tc>
           <w:tcPr>
-            <w:tcW w:w="9537" w:type="dxa"/>
+            <w:tcW w:w="9555" w:type="dxa"/>
             <w:gridSpan w:val="4"/>
           </w:tcPr>
           <w:p>
@@ -2898,7 +2898,7 @@
         </w:trPr>
         <w:tc>
           <w:tcPr>
-            <w:tcW w:w="761" w:type="dxa"/>
+            <w:tcW w:w="762" w:type="dxa"/>
           </w:tcPr>
           <w:p>
             <w:r>
@@ -2928,7 +2928,7 @@
         </w:tc>
         <w:tc>
           <w:tcPr>
-            <w:tcW w:w="1748" w:type="dxa"/>
+            <w:tcW w:w="1729" w:type="dxa"/>
             <w:gridSpan w:val="2"/>
           </w:tcPr>
           <w:p>
@@ -2939,7 +2939,7 @@
         </w:tc>
         <w:tc>
           <w:tcPr>
-            <w:tcW w:w="9537" w:type="dxa"/>
+            <w:tcW w:w="9555" w:type="dxa"/>
             <w:gridSpan w:val="4"/>
           </w:tcPr>
           <w:p>
@@ -2973,7 +2973,7 @@
         </w:trPr>
         <w:tc>
           <w:tcPr>
-            <w:tcW w:w="761" w:type="dxa"/>
+            <w:tcW w:w="762" w:type="dxa"/>
           </w:tcPr>
           <w:p>
             <w:r>
@@ -3003,7 +3003,7 @@
         </w:tc>
         <w:tc>
           <w:tcPr>
-            <w:tcW w:w="1748" w:type="dxa"/>
+            <w:tcW w:w="1729" w:type="dxa"/>
             <w:gridSpan w:val="2"/>
           </w:tcPr>
           <w:p>
@@ -3014,7 +3014,7 @@
         </w:tc>
         <w:tc>
           <w:tcPr>
-            <w:tcW w:w="9537" w:type="dxa"/>
+            <w:tcW w:w="9555" w:type="dxa"/>
             <w:gridSpan w:val="4"/>
           </w:tcPr>
           <w:p>
@@ -3048,7 +3048,7 @@
         </w:trPr>
         <w:tc>
           <w:tcPr>
-            <w:tcW w:w="761" w:type="dxa"/>
+            <w:tcW w:w="762" w:type="dxa"/>
           </w:tcPr>
           <w:p>
             <w:r>
@@ -3078,7 +3078,7 @@
         </w:tc>
         <w:tc>
           <w:tcPr>
-            <w:tcW w:w="1748" w:type="dxa"/>
+            <w:tcW w:w="1729" w:type="dxa"/>
             <w:gridSpan w:val="2"/>
           </w:tcPr>
           <w:p>
@@ -3089,7 +3089,7 @@
         </w:tc>
         <w:tc>
           <w:tcPr>
-            <w:tcW w:w="9537" w:type="dxa"/>
+            <w:tcW w:w="9555" w:type="dxa"/>
             <w:gridSpan w:val="4"/>
           </w:tcPr>
           <w:p>
@@ -3369,7 +3369,7 @@
         </w:trPr>
         <w:tc>
           <w:tcPr>
-            <w:tcW w:w="761" w:type="dxa"/>
+            <w:tcW w:w="762" w:type="dxa"/>
           </w:tcPr>
           <w:p>
             <w:r>
@@ -3399,7 +3399,7 @@
         </w:tc>
         <w:tc>
           <w:tcPr>
-            <w:tcW w:w="1748" w:type="dxa"/>
+            <w:tcW w:w="1729" w:type="dxa"/>
             <w:gridSpan w:val="2"/>
           </w:tcPr>
           <w:p>
@@ -3410,7 +3410,7 @@
         </w:tc>
         <w:tc>
           <w:tcPr>
-            <w:tcW w:w="9537" w:type="dxa"/>
+            <w:tcW w:w="9555" w:type="dxa"/>
             <w:gridSpan w:val="4"/>
           </w:tcPr>
           <w:p>
@@ -3444,7 +3444,7 @@
         </w:trPr>
         <w:tc>
           <w:tcPr>
-            <w:tcW w:w="761" w:type="dxa"/>
+            <w:tcW w:w="762" w:type="dxa"/>
           </w:tcPr>
           <w:p>
             <w:r>
@@ -3475,7 +3475,7 @@
         </w:tc>
         <w:tc>
           <w:tcPr>
-            <w:tcW w:w="1748" w:type="dxa"/>
+            <w:tcW w:w="1729" w:type="dxa"/>
             <w:gridSpan w:val="2"/>
           </w:tcPr>
           <w:p>
@@ -3486,7 +3486,7 @@
         </w:tc>
         <w:tc>
           <w:tcPr>
-            <w:tcW w:w="9537" w:type="dxa"/>
+            <w:tcW w:w="9555" w:type="dxa"/>
             <w:gridSpan w:val="4"/>
           </w:tcPr>
           <w:p>
@@ -3562,7 +3562,7 @@
         </w:trPr>
         <w:tc>
           <w:tcPr>
-            <w:tcW w:w="761" w:type="dxa"/>
+            <w:tcW w:w="762" w:type="dxa"/>
           </w:tcPr>
           <w:p>
             <w:r>
@@ -3592,7 +3592,7 @@
         </w:tc>
         <w:tc>
           <w:tcPr>
-            <w:tcW w:w="1748" w:type="dxa"/>
+            <w:tcW w:w="1729" w:type="dxa"/>
             <w:gridSpan w:val="2"/>
           </w:tcPr>
           <w:p>
@@ -3603,7 +3603,7 @@
         </w:tc>
         <w:tc>
           <w:tcPr>
-            <w:tcW w:w="9537" w:type="dxa"/>
+            <w:tcW w:w="9555" w:type="dxa"/>
             <w:gridSpan w:val="4"/>
           </w:tcPr>
           <w:p>
@@ -3637,7 +3637,7 @@
         </w:trPr>
         <w:tc>
           <w:tcPr>
-            <w:tcW w:w="761" w:type="dxa"/>
+            <w:tcW w:w="762" w:type="dxa"/>
           </w:tcPr>
           <w:p>
             <w:r>
@@ -3667,7 +3667,7 @@
         </w:tc>
         <w:tc>
           <w:tcPr>
-            <w:tcW w:w="1748" w:type="dxa"/>
+            <w:tcW w:w="1729" w:type="dxa"/>
             <w:gridSpan w:val="2"/>
           </w:tcPr>
           <w:p>
@@ -3678,7 +3678,7 @@
         </w:tc>
         <w:tc>
           <w:tcPr>
-            <w:tcW w:w="9537" w:type="dxa"/>
+            <w:tcW w:w="9555" w:type="dxa"/>
             <w:gridSpan w:val="4"/>
           </w:tcPr>
           <w:p>
@@ -3747,7 +3747,7 @@
         </w:trPr>
         <w:tc>
           <w:tcPr>
-            <w:tcW w:w="761" w:type="dxa"/>
+            <w:tcW w:w="762" w:type="dxa"/>
           </w:tcPr>
           <w:p>
             <w:r>
@@ -3777,7 +3777,7 @@
         </w:tc>
         <w:tc>
           <w:tcPr>
-            <w:tcW w:w="1748" w:type="dxa"/>
+            <w:tcW w:w="1729" w:type="dxa"/>
             <w:gridSpan w:val="2"/>
           </w:tcPr>
           <w:p>
@@ -3788,7 +3788,7 @@
         </w:tc>
         <w:tc>
           <w:tcPr>
-            <w:tcW w:w="9537" w:type="dxa"/>
+            <w:tcW w:w="9555" w:type="dxa"/>
             <w:gridSpan w:val="4"/>
           </w:tcPr>
           <w:p>
@@ -3822,7 +3822,7 @@
         </w:trPr>
         <w:tc>
           <w:tcPr>
-            <w:tcW w:w="761" w:type="dxa"/>
+            <w:tcW w:w="762" w:type="dxa"/>
           </w:tcPr>
           <w:p>
             <w:r>
@@ -3852,7 +3852,7 @@
         </w:tc>
         <w:tc>
           <w:tcPr>
-            <w:tcW w:w="1748" w:type="dxa"/>
+            <w:tcW w:w="1729" w:type="dxa"/>
             <w:gridSpan w:val="2"/>
           </w:tcPr>
           <w:p>
@@ -3863,7 +3863,7 @@
         </w:tc>
         <w:tc>
           <w:tcPr>
-            <w:tcW w:w="9537" w:type="dxa"/>
+            <w:tcW w:w="9555" w:type="dxa"/>
             <w:gridSpan w:val="4"/>
           </w:tcPr>
           <w:p>
@@ -3897,7 +3897,7 @@
         </w:trPr>
         <w:tc>
           <w:tcPr>
-            <w:tcW w:w="761" w:type="dxa"/>
+            <w:tcW w:w="762" w:type="dxa"/>
           </w:tcPr>
           <w:p>
             <w:r>
@@ -3927,7 +3927,7 @@
         </w:tc>
         <w:tc>
           <w:tcPr>
-            <w:tcW w:w="1748" w:type="dxa"/>
+            <w:tcW w:w="1729" w:type="dxa"/>
             <w:gridSpan w:val="2"/>
           </w:tcPr>
           <w:p>
@@ -3938,7 +3938,7 @@
         </w:tc>
         <w:tc>
           <w:tcPr>
-            <w:tcW w:w="9537" w:type="dxa"/>
+            <w:tcW w:w="9555" w:type="dxa"/>
             <w:gridSpan w:val="4"/>
           </w:tcPr>
           <w:p>
@@ -3972,7 +3972,7 @@
         </w:trPr>
         <w:tc>
           <w:tcPr>
-            <w:tcW w:w="761" w:type="dxa"/>
+            <w:tcW w:w="762" w:type="dxa"/>
           </w:tcPr>
           <w:p>
             <w:r>
@@ -4002,7 +4002,7 @@
         </w:tc>
         <w:tc>
           <w:tcPr>
-            <w:tcW w:w="1748" w:type="dxa"/>
+            <w:tcW w:w="1729" w:type="dxa"/>
             <w:gridSpan w:val="2"/>
           </w:tcPr>
           <w:p>
@@ -4013,7 +4013,7 @@
         </w:tc>
         <w:tc>
           <w:tcPr>
-            <w:tcW w:w="9537" w:type="dxa"/>
+            <w:tcW w:w="9555" w:type="dxa"/>
             <w:gridSpan w:val="4"/>
           </w:tcPr>
           <w:p>
@@ -4082,7 +4082,7 @@
         </w:trPr>
         <w:tc>
           <w:tcPr>
-            <w:tcW w:w="761" w:type="dxa"/>
+            <w:tcW w:w="762" w:type="dxa"/>
           </w:tcPr>
           <w:p>
             <w:r>
@@ -4113,7 +4113,7 @@
         </w:tc>
         <w:tc>
           <w:tcPr>
-            <w:tcW w:w="1748" w:type="dxa"/>
+            <w:tcW w:w="1729" w:type="dxa"/>
             <w:gridSpan w:val="2"/>
           </w:tcPr>
           <w:p>
@@ -4124,7 +4124,7 @@
         </w:tc>
         <w:tc>
           <w:tcPr>
-            <w:tcW w:w="9537" w:type="dxa"/>
+            <w:tcW w:w="9555" w:type="dxa"/>
             <w:gridSpan w:val="4"/>
           </w:tcPr>
           <w:p>
@@ -4193,7 +4193,7 @@
         </w:trPr>
         <w:tc>
           <w:tcPr>
-            <w:tcW w:w="761" w:type="dxa"/>
+            <w:tcW w:w="762" w:type="dxa"/>
           </w:tcPr>
           <w:p>
             <w:r>
@@ -4223,7 +4223,7 @@
         </w:tc>
         <w:tc>
           <w:tcPr>
-            <w:tcW w:w="1748" w:type="dxa"/>
+            <w:tcW w:w="1729" w:type="dxa"/>
             <w:gridSpan w:val="2"/>
           </w:tcPr>
           <w:p>
@@ -4234,7 +4234,7 @@
         </w:tc>
         <w:tc>
           <w:tcPr>
-            <w:tcW w:w="9537" w:type="dxa"/>
+            <w:tcW w:w="9555" w:type="dxa"/>
             <w:gridSpan w:val="4"/>
           </w:tcPr>
           <w:p>
@@ -4314,7 +4314,7 @@
         </w:trPr>
         <w:tc>
           <w:tcPr>
-            <w:tcW w:w="761" w:type="dxa"/>
+            <w:tcW w:w="762" w:type="dxa"/>
           </w:tcPr>
           <w:p>
             <w:r>
@@ -4344,7 +4344,7 @@
         </w:tc>
         <w:tc>
           <w:tcPr>
-            <w:tcW w:w="1748" w:type="dxa"/>
+            <w:tcW w:w="1729" w:type="dxa"/>
             <w:gridSpan w:val="2"/>
           </w:tcPr>
           <w:p>
@@ -4355,7 +4355,7 @@
         </w:tc>
         <w:tc>
           <w:tcPr>
-            <w:tcW w:w="9537" w:type="dxa"/>
+            <w:tcW w:w="9555" w:type="dxa"/>
             <w:gridSpan w:val="4"/>
           </w:tcPr>
           <w:p>
@@ -4389,7 +4389,7 @@
         </w:trPr>
         <w:tc>
           <w:tcPr>
-            <w:tcW w:w="761" w:type="dxa"/>
+            <w:tcW w:w="762" w:type="dxa"/>
           </w:tcPr>
           <w:p>
             <w:r>
@@ -4419,7 +4419,7 @@
         </w:tc>
         <w:tc>
           <w:tcPr>
-            <w:tcW w:w="1748" w:type="dxa"/>
+            <w:tcW w:w="1729" w:type="dxa"/>
             <w:gridSpan w:val="2"/>
           </w:tcPr>
           <w:p>
@@ -4430,7 +4430,7 @@
         </w:tc>
         <w:tc>
           <w:tcPr>
-            <w:tcW w:w="9537" w:type="dxa"/>
+            <w:tcW w:w="9555" w:type="dxa"/>
             <w:gridSpan w:val="4"/>
           </w:tcPr>
           <w:p>
@@ -4454,7 +4454,7 @@
         </w:trPr>
         <w:tc>
           <w:tcPr>
-            <w:tcW w:w="761" w:type="dxa"/>
+            <w:tcW w:w="762" w:type="dxa"/>
           </w:tcPr>
           <w:p>
             <w:r>
@@ -4484,7 +4484,7 @@
         </w:tc>
         <w:tc>
           <w:tcPr>
-            <w:tcW w:w="1748" w:type="dxa"/>
+            <w:tcW w:w="1729" w:type="dxa"/>
             <w:gridSpan w:val="2"/>
           </w:tcPr>
           <w:p>
@@ -4495,7 +4495,7 @@
         </w:tc>
         <w:tc>
           <w:tcPr>
-            <w:tcW w:w="9537" w:type="dxa"/>
+            <w:tcW w:w="9555" w:type="dxa"/>
             <w:gridSpan w:val="4"/>
           </w:tcPr>
           <w:p>
@@ -4516,11 +4516,11 @@
       <w:tr>
         <w:trPr>
           <w:gridAfter w:val="1"/>
-          <w:wAfter w:w="1569" w:type="dxa"/>
+          <w:wAfter w:w="936" w:type="dxa"/>
         </w:trPr>
         <w:tc>
           <w:tcPr>
-            <w:tcW w:w="761" w:type="dxa"/>
+            <w:tcW w:w="762" w:type="dxa"/>
           </w:tcPr>
           <w:p>
             <w:r>
@@ -4551,7 +4551,7 @@
         </w:tc>
         <w:tc>
           <w:tcPr>
-            <w:tcW w:w="1544" w:type="dxa"/>
+            <w:tcW w:w="1342" w:type="dxa"/>
             <w:gridSpan w:val="2"/>
           </w:tcPr>
           <w:p>
@@ -4562,7 +4562,7 @@
         </w:tc>
         <w:tc>
           <w:tcPr>
-            <w:tcW w:w="1199" w:type="dxa"/>
+            <w:tcW w:w="1298" w:type="dxa"/>
           </w:tcPr>
           <w:p>
             <w:r>
@@ -4572,7 +4572,7 @@
         </w:tc>
         <w:tc>
           <w:tcPr>
-            <w:tcW w:w="5556" w:type="dxa"/>
+            <w:tcW w:w="6291" w:type="dxa"/>
           </w:tcPr>
           <w:p>
             <w:r>
@@ -4584,11 +4584,11 @@
       <w:tr>
         <w:trPr>
           <w:gridAfter w:val="1"/>
-          <w:wAfter w:w="1569" w:type="dxa"/>
+          <w:wAfter w:w="936" w:type="dxa"/>
         </w:trPr>
         <w:tc>
           <w:tcPr>
-            <w:tcW w:w="761" w:type="dxa"/>
+            <w:tcW w:w="762" w:type="dxa"/>
           </w:tcPr>
           <w:p>
             <w:r>
@@ -4619,7 +4619,7 @@
         </w:tc>
         <w:tc>
           <w:tcPr>
-            <w:tcW w:w="1544" w:type="dxa"/>
+            <w:tcW w:w="1342" w:type="dxa"/>
             <w:gridSpan w:val="2"/>
           </w:tcPr>
           <w:p>
@@ -4630,7 +4630,7 @@
         </w:tc>
         <w:tc>
           <w:tcPr>
-            <w:tcW w:w="1199" w:type="dxa"/>
+            <w:tcW w:w="1298" w:type="dxa"/>
           </w:tcPr>
           <w:p>
             <w:r>
@@ -4640,7 +4640,7 @@
         </w:tc>
         <w:tc>
           <w:tcPr>
-            <w:tcW w:w="5556" w:type="dxa"/>
+            <w:tcW w:w="6291" w:type="dxa"/>
           </w:tcPr>
           <w:p/>
         </w:tc>
@@ -4648,11 +4648,11 @@
       <w:tr>
         <w:trPr>
           <w:gridAfter w:val="1"/>
-          <w:wAfter w:w="1569" w:type="dxa"/>
+          <w:wAfter w:w="936" w:type="dxa"/>
         </w:trPr>
         <w:tc>
           <w:tcPr>
-            <w:tcW w:w="761" w:type="dxa"/>
+            <w:tcW w:w="762" w:type="dxa"/>
           </w:tcPr>
           <w:p>
             <w:r>
@@ -4683,7 +4683,7 @@
         </w:tc>
         <w:tc>
           <w:tcPr>
-            <w:tcW w:w="1544" w:type="dxa"/>
+            <w:tcW w:w="1342" w:type="dxa"/>
             <w:gridSpan w:val="2"/>
           </w:tcPr>
           <w:p>
@@ -4694,7 +4694,7 @@
         </w:tc>
         <w:tc>
           <w:tcPr>
-            <w:tcW w:w="1199" w:type="dxa"/>
+            <w:tcW w:w="1298" w:type="dxa"/>
           </w:tcPr>
           <w:p>
             <w:r>
@@ -4708,7 +4708,7 @@
         </w:tc>
         <w:tc>
           <w:tcPr>
-            <w:tcW w:w="5556" w:type="dxa"/>
+            <w:tcW w:w="6291" w:type="dxa"/>
           </w:tcPr>
           <w:p>
             <w:r>
@@ -4721,11 +4721,11 @@
       <w:tr>
         <w:trPr>
           <w:gridAfter w:val="1"/>
-          <w:wAfter w:w="1569" w:type="dxa"/>
+          <w:wAfter w:w="936" w:type="dxa"/>
         </w:trPr>
         <w:tc>
           <w:tcPr>
-            <w:tcW w:w="761" w:type="dxa"/>
+            <w:tcW w:w="762" w:type="dxa"/>
           </w:tcPr>
           <w:p>
             <w:r>
@@ -4756,7 +4756,7 @@
         </w:tc>
         <w:tc>
           <w:tcPr>
-            <w:tcW w:w="1544" w:type="dxa"/>
+            <w:tcW w:w="1342" w:type="dxa"/>
             <w:gridSpan w:val="2"/>
           </w:tcPr>
           <w:p>
@@ -4767,7 +4767,7 @@
         </w:tc>
         <w:tc>
           <w:tcPr>
-            <w:tcW w:w="1199" w:type="dxa"/>
+            <w:tcW w:w="1298" w:type="dxa"/>
           </w:tcPr>
           <w:p>
             <w:r>
@@ -4777,7 +4777,7 @@
         </w:tc>
         <w:tc>
           <w:tcPr>
-            <w:tcW w:w="5556" w:type="dxa"/>
+            <w:tcW w:w="6291" w:type="dxa"/>
           </w:tcPr>
           <w:p>
             <w:r>
@@ -4826,11 +4826,11 @@
       <w:tr>
         <w:trPr>
           <w:gridAfter w:val="1"/>
-          <w:wAfter w:w="1569" w:type="dxa"/>
+          <w:wAfter w:w="936" w:type="dxa"/>
         </w:trPr>
         <w:tc>
           <w:tcPr>
-            <w:tcW w:w="761" w:type="dxa"/>
+            <w:tcW w:w="762" w:type="dxa"/>
           </w:tcPr>
           <w:p>
             <w:r>
@@ -4861,7 +4861,7 @@
         </w:tc>
         <w:tc>
           <w:tcPr>
-            <w:tcW w:w="1544" w:type="dxa"/>
+            <w:tcW w:w="1342" w:type="dxa"/>
             <w:gridSpan w:val="2"/>
           </w:tcPr>
           <w:p>
@@ -4872,7 +4872,7 @@
         </w:tc>
         <w:tc>
           <w:tcPr>
-            <w:tcW w:w="1199" w:type="dxa"/>
+            <w:tcW w:w="1298" w:type="dxa"/>
           </w:tcPr>
           <w:p>
             <w:r>
@@ -4885,7 +4885,7 @@
         </w:tc>
         <w:tc>
           <w:tcPr>
-            <w:tcW w:w="5556" w:type="dxa"/>
+            <w:tcW w:w="6291" w:type="dxa"/>
           </w:tcPr>
           <w:p>
             <w:r>
@@ -4897,11 +4897,11 @@
       <w:tr>
         <w:trPr>
           <w:gridAfter w:val="1"/>
-          <w:wAfter w:w="1569" w:type="dxa"/>
+          <w:wAfter w:w="936" w:type="dxa"/>
         </w:trPr>
         <w:tc>
           <w:tcPr>
-            <w:tcW w:w="761" w:type="dxa"/>
+            <w:tcW w:w="762" w:type="dxa"/>
           </w:tcPr>
           <w:p>
             <w:r>
@@ -4932,7 +4932,7 @@
         </w:tc>
         <w:tc>
           <w:tcPr>
-            <w:tcW w:w="1544" w:type="dxa"/>
+            <w:tcW w:w="1342" w:type="dxa"/>
             <w:gridSpan w:val="2"/>
           </w:tcPr>
           <w:p>
@@ -4943,7 +4943,7 @@
         </w:tc>
         <w:tc>
           <w:tcPr>
-            <w:tcW w:w="1199" w:type="dxa"/>
+            <w:tcW w:w="1298" w:type="dxa"/>
           </w:tcPr>
           <w:p>
             <w:r>
@@ -4953,7 +4953,7 @@
         </w:tc>
         <w:tc>
           <w:tcPr>
-            <w:tcW w:w="5556" w:type="dxa"/>
+            <w:tcW w:w="6291" w:type="dxa"/>
           </w:tcPr>
           <w:p>
             <w:r>
@@ -4965,11 +4965,11 @@
       <w:tr>
         <w:trPr>
           <w:gridAfter w:val="1"/>
-          <w:wAfter w:w="1569" w:type="dxa"/>
+          <w:wAfter w:w="936" w:type="dxa"/>
         </w:trPr>
         <w:tc>
           <w:tcPr>
-            <w:tcW w:w="761" w:type="dxa"/>
+            <w:tcW w:w="762" w:type="dxa"/>
           </w:tcPr>
           <w:p>
             <w:r>
@@ -5000,7 +5000,7 @@
         </w:tc>
         <w:tc>
           <w:tcPr>
-            <w:tcW w:w="1544" w:type="dxa"/>
+            <w:tcW w:w="1342" w:type="dxa"/>
             <w:gridSpan w:val="2"/>
           </w:tcPr>
           <w:p>
@@ -5011,7 +5011,7 @@
         </w:tc>
         <w:tc>
           <w:tcPr>
-            <w:tcW w:w="1199" w:type="dxa"/>
+            <w:tcW w:w="1298" w:type="dxa"/>
           </w:tcPr>
           <w:p>
             <w:r>
@@ -5021,7 +5021,7 @@
         </w:tc>
         <w:tc>
           <w:tcPr>
-            <w:tcW w:w="5556" w:type="dxa"/>
+            <w:tcW w:w="6291" w:type="dxa"/>
           </w:tcPr>
           <w:p>
             <w:r>
@@ -5033,11 +5033,11 @@
       <w:tr>
         <w:trPr>
           <w:gridAfter w:val="1"/>
-          <w:wAfter w:w="1569" w:type="dxa"/>
+          <w:wAfter w:w="936" w:type="dxa"/>
         </w:trPr>
         <w:tc>
           <w:tcPr>
-            <w:tcW w:w="761" w:type="dxa"/>
+            <w:tcW w:w="762" w:type="dxa"/>
           </w:tcPr>
           <w:p>
             <w:r>
@@ -5068,7 +5068,7 @@
         </w:tc>
         <w:tc>
           <w:tcPr>
-            <w:tcW w:w="1544" w:type="dxa"/>
+            <w:tcW w:w="1342" w:type="dxa"/>
             <w:gridSpan w:val="2"/>
           </w:tcPr>
           <w:p>
@@ -5079,7 +5079,7 @@
         </w:tc>
         <w:tc>
           <w:tcPr>
-            <w:tcW w:w="1199" w:type="dxa"/>
+            <w:tcW w:w="1298" w:type="dxa"/>
           </w:tcPr>
           <w:p>
             <w:r>
@@ -5089,7 +5089,7 @@
         </w:tc>
         <w:tc>
           <w:tcPr>
-            <w:tcW w:w="5556" w:type="dxa"/>
+            <w:tcW w:w="6291" w:type="dxa"/>
           </w:tcPr>
           <w:p>
             <w:r>
@@ -5101,11 +5101,11 @@
       <w:tr>
         <w:trPr>
           <w:gridAfter w:val="1"/>
-          <w:wAfter w:w="1569" w:type="dxa"/>
+          <w:wAfter w:w="936" w:type="dxa"/>
         </w:trPr>
         <w:tc>
           <w:tcPr>
-            <w:tcW w:w="761" w:type="dxa"/>
+            <w:tcW w:w="762" w:type="dxa"/>
           </w:tcPr>
           <w:p>
             <w:r>
@@ -5136,7 +5136,7 @@
         </w:tc>
         <w:tc>
           <w:tcPr>
-            <w:tcW w:w="1544" w:type="dxa"/>
+            <w:tcW w:w="1342" w:type="dxa"/>
             <w:gridSpan w:val="2"/>
           </w:tcPr>
           <w:p>
@@ -5147,7 +5147,7 @@
         </w:tc>
         <w:tc>
           <w:tcPr>
-            <w:tcW w:w="1199" w:type="dxa"/>
+            <w:tcW w:w="1298" w:type="dxa"/>
           </w:tcPr>
           <w:p>
             <w:r>
@@ -5157,7 +5157,7 @@
         </w:tc>
         <w:tc>
           <w:tcPr>
-            <w:tcW w:w="5556" w:type="dxa"/>
+            <w:tcW w:w="6291" w:type="dxa"/>
           </w:tcPr>
           <w:p/>
         </w:tc>
@@ -5165,11 +5165,11 @@
       <w:tr>
         <w:trPr>
           <w:gridAfter w:val="1"/>
-          <w:wAfter w:w="1569" w:type="dxa"/>
+          <w:wAfter w:w="936" w:type="dxa"/>
         </w:trPr>
         <w:tc>
           <w:tcPr>
-            <w:tcW w:w="761" w:type="dxa"/>
+            <w:tcW w:w="762" w:type="dxa"/>
           </w:tcPr>
           <w:p>
             <w:r>
@@ -5200,31 +5200,41 @@
         </w:tc>
         <w:tc>
           <w:tcPr>
-            <w:tcW w:w="1544" w:type="dxa"/>
-            <w:gridSpan w:val="2"/>
-          </w:tcPr>
-          <w:p>
-            <w:r>
-              <w:t>Hit animation plays when player is hit by enemy</w:t>
-            </w:r>
-          </w:p>
-        </w:tc>
-        <w:tc>
-          <w:tcPr>
-            <w:tcW w:w="1199" w:type="dxa"/>
-          </w:tcPr>
-          <w:p>
-            <w:r>
-              <w:t>Texture only changes when player sprite moves</w:t>
-            </w:r>
-          </w:p>
-        </w:tc>
-        <w:tc>
-          <w:tcPr>
-            <w:tcW w:w="5556" w:type="dxa"/>
-          </w:tcPr>
-          <w:p>
-            <w:r>
+            <w:tcW w:w="1342" w:type="dxa"/>
+            <w:gridSpan w:val="2"/>
+          </w:tcPr>
+          <w:p>
+            <w:r>
+              <w:t xml:space="preserve">Hit animation </w:t>
+            </w:r>
+            <w:r>
+              <w:lastRenderedPageBreak/>
+              <w:t>plays when player is hit by enemy</w:t>
+            </w:r>
+          </w:p>
+        </w:tc>
+        <w:tc>
+          <w:tcPr>
+            <w:tcW w:w="1298" w:type="dxa"/>
+          </w:tcPr>
+          <w:p>
+            <w:r>
+              <w:lastRenderedPageBreak/>
+              <w:t xml:space="preserve">Texture only </w:t>
+            </w:r>
+            <w:r>
+              <w:lastRenderedPageBreak/>
+              <w:t>changes when player sprite moves</w:t>
+            </w:r>
+          </w:p>
+        </w:tc>
+        <w:tc>
+          <w:tcPr>
+            <w:tcW w:w="6291" w:type="dxa"/>
+          </w:tcPr>
+          <w:p>
+            <w:r>
+              <w:lastRenderedPageBreak/>
               <w:t>Made the hit texture run if the player sprite was standing still.</w:t>
             </w:r>
           </w:p>
@@ -5233,11 +5243,11 @@
       <w:tr>
         <w:trPr>
           <w:gridAfter w:val="1"/>
-          <w:wAfter w:w="1569" w:type="dxa"/>
+          <w:wAfter w:w="936" w:type="dxa"/>
         </w:trPr>
         <w:tc>
           <w:tcPr>
-            <w:tcW w:w="761" w:type="dxa"/>
+            <w:tcW w:w="762" w:type="dxa"/>
           </w:tcPr>
           <w:p>
             <w:r>
@@ -5268,7 +5278,7 @@
         </w:tc>
         <w:tc>
           <w:tcPr>
-            <w:tcW w:w="1544" w:type="dxa"/>
+            <w:tcW w:w="1342" w:type="dxa"/>
             <w:gridSpan w:val="2"/>
           </w:tcPr>
           <w:p>
@@ -5276,11 +5286,7 @@
               <w:t xml:space="preserve">Hit animation plays </w:t>
             </w:r>
             <w:r>
-              <w:t xml:space="preserve">when </w:t>
-            </w:r>
-            <w:r>
-              <w:lastRenderedPageBreak/>
-              <w:t>player</w:t>
+              <w:t>when player</w:t>
             </w:r>
             <w:r>
               <w:t xml:space="preserve"> is hit by enemy</w:t>
@@ -5289,26 +5295,597 @@
         </w:tc>
         <w:tc>
           <w:tcPr>
-            <w:tcW w:w="1199" w:type="dxa"/>
-          </w:tcPr>
-          <w:p>
-            <w:r>
-              <w:lastRenderedPageBreak/>
-              <w:t xml:space="preserve">Texture plays correctly </w:t>
-            </w:r>
-            <w:r>
-              <w:lastRenderedPageBreak/>
-              <w:t>when player is hit</w:t>
-            </w:r>
-          </w:p>
-        </w:tc>
-        <w:tc>
-          <w:tcPr>
-            <w:tcW w:w="5556" w:type="dxa"/>
-          </w:tcPr>
-          <w:p>
-            <w:r>
-              <w:lastRenderedPageBreak/>
+            <w:tcW w:w="1298" w:type="dxa"/>
+          </w:tcPr>
+          <w:p>
+            <w:r>
+              <w:t>Texture plays correctly when player is hit</w:t>
+            </w:r>
+          </w:p>
+        </w:tc>
+        <w:tc>
+          <w:tcPr>
+            <w:tcW w:w="6291" w:type="dxa"/>
+          </w:tcPr>
+          <w:p>
+            <w:r>
+              <w:t>None</w:t>
+            </w:r>
+          </w:p>
+        </w:tc>
+      </w:tr>
+      <w:tr>
+        <w:trPr>
+          <w:gridAfter w:val="1"/>
+          <w:wAfter w:w="936" w:type="dxa"/>
+        </w:trPr>
+        <w:tc>
+          <w:tcPr>
+            <w:tcW w:w="762" w:type="dxa"/>
+          </w:tcPr>
+          <w:p>
+            <w:r>
+              <w:t>28/03</w:t>
+            </w:r>
+          </w:p>
+        </w:tc>
+        <w:tc>
+          <w:tcPr>
+            <w:tcW w:w="2777" w:type="dxa"/>
+            <w:gridSpan w:val="2"/>
+          </w:tcPr>
+          <w:p>
+            <w:r>
+              <w:t>Enemy hit animation</w:t>
+            </w:r>
+          </w:p>
+        </w:tc>
+        <w:tc>
+          <w:tcPr>
+            <w:tcW w:w="1417" w:type="dxa"/>
+          </w:tcPr>
+          <w:p>
+            <w:r>
+              <w:t xml:space="preserve">Expected </w:t>
+            </w:r>
+          </w:p>
+        </w:tc>
+        <w:tc>
+          <w:tcPr>
+            <w:tcW w:w="1342" w:type="dxa"/>
+            <w:gridSpan w:val="2"/>
+          </w:tcPr>
+          <w:p>
+            <w:r>
+              <w:t xml:space="preserve">Hit animation </w:t>
+            </w:r>
+            <w:r>
+              <w:t>plays when enemy is hit</w:t>
+            </w:r>
+          </w:p>
+        </w:tc>
+        <w:tc>
+          <w:tcPr>
+            <w:tcW w:w="1298" w:type="dxa"/>
+          </w:tcPr>
+          <w:p>
+            <w:r>
+              <w:t>Animation is  a bit buggy</w:t>
+            </w:r>
+          </w:p>
+        </w:tc>
+        <w:tc>
+          <w:tcPr>
+            <w:tcW w:w="6291" w:type="dxa"/>
+          </w:tcPr>
+          <w:p>
+            <w:r>
+              <w:t>Made the normal idle and walking animation only run if self.if-hit wasn’t true</w:t>
+            </w:r>
+          </w:p>
+        </w:tc>
+      </w:tr>
+      <w:tr>
+        <w:trPr>
+          <w:gridAfter w:val="1"/>
+          <w:wAfter w:w="936" w:type="dxa"/>
+        </w:trPr>
+        <w:tc>
+          <w:tcPr>
+            <w:tcW w:w="762" w:type="dxa"/>
+          </w:tcPr>
+          <w:p>
+            <w:r>
+              <w:t>28/03</w:t>
+            </w:r>
+          </w:p>
+        </w:tc>
+        <w:tc>
+          <w:tcPr>
+            <w:tcW w:w="2777" w:type="dxa"/>
+            <w:gridSpan w:val="2"/>
+          </w:tcPr>
+          <w:p>
+            <w:r>
+              <w:t>Enemy hit animation</w:t>
+            </w:r>
+          </w:p>
+        </w:tc>
+        <w:tc>
+          <w:tcPr>
+            <w:tcW w:w="1417" w:type="dxa"/>
+          </w:tcPr>
+          <w:p>
+            <w:r>
+              <w:t xml:space="preserve">Expected </w:t>
+            </w:r>
+          </w:p>
+        </w:tc>
+        <w:tc>
+          <w:tcPr>
+            <w:tcW w:w="1342" w:type="dxa"/>
+            <w:gridSpan w:val="2"/>
+          </w:tcPr>
+          <w:p>
+            <w:r>
+              <w:t>Hit animation plays when enemy is hit</w:t>
+            </w:r>
+          </w:p>
+        </w:tc>
+        <w:tc>
+          <w:tcPr>
+            <w:tcW w:w="1298" w:type="dxa"/>
+          </w:tcPr>
+          <w:p>
+            <w:r>
+              <w:t>Animations work as expected</w:t>
+            </w:r>
+          </w:p>
+        </w:tc>
+        <w:tc>
+          <w:tcPr>
+            <w:tcW w:w="6291" w:type="dxa"/>
+          </w:tcPr>
+          <w:p>
+            <w:r>
+              <w:t>None</w:t>
+            </w:r>
+          </w:p>
+        </w:tc>
+      </w:tr>
+      <w:tr>
+        <w:trPr>
+          <w:gridAfter w:val="1"/>
+          <w:wAfter w:w="936" w:type="dxa"/>
+        </w:trPr>
+        <w:tc>
+          <w:tcPr>
+            <w:tcW w:w="762" w:type="dxa"/>
+          </w:tcPr>
+          <w:p>
+            <w:r>
+              <w:t>29/03</w:t>
+            </w:r>
+          </w:p>
+        </w:tc>
+        <w:tc>
+          <w:tcPr>
+            <w:tcW w:w="2777" w:type="dxa"/>
+            <w:gridSpan w:val="2"/>
+          </w:tcPr>
+          <w:p>
+            <w:r>
+              <w:t>Player attack animation</w:t>
+            </w:r>
+          </w:p>
+        </w:tc>
+        <w:tc>
+          <w:tcPr>
+            <w:tcW w:w="1417" w:type="dxa"/>
+          </w:tcPr>
+          <w:p>
+            <w:r>
+              <w:t xml:space="preserve">Expected </w:t>
+            </w:r>
+          </w:p>
+        </w:tc>
+        <w:tc>
+          <w:tcPr>
+            <w:tcW w:w="1342" w:type="dxa"/>
+            <w:gridSpan w:val="2"/>
+          </w:tcPr>
+          <w:p>
+            <w:r>
+              <w:t>Attack animation plays once when space is pressed</w:t>
+            </w:r>
+          </w:p>
+        </w:tc>
+        <w:tc>
+          <w:tcPr>
+            <w:tcW w:w="1298" w:type="dxa"/>
+          </w:tcPr>
+          <w:p>
+            <w:r>
+              <w:t>Animation bugs out</w:t>
+            </w:r>
+          </w:p>
+        </w:tc>
+        <w:tc>
+          <w:tcPr>
+            <w:tcW w:w="6291" w:type="dxa"/>
+          </w:tcPr>
+          <w:p>
+            <w:r>
+              <w:t>Made it so all other animations don’t run if the player is attacking</w:t>
+            </w:r>
+          </w:p>
+        </w:tc>
+      </w:tr>
+      <w:tr>
+        <w:trPr>
+          <w:gridAfter w:val="1"/>
+          <w:wAfter w:w="936" w:type="dxa"/>
+        </w:trPr>
+        <w:tc>
+          <w:tcPr>
+            <w:tcW w:w="762" w:type="dxa"/>
+          </w:tcPr>
+          <w:p>
+            <w:r>
+              <w:t>29/03</w:t>
+            </w:r>
+          </w:p>
+        </w:tc>
+        <w:tc>
+          <w:tcPr>
+            <w:tcW w:w="2777" w:type="dxa"/>
+            <w:gridSpan w:val="2"/>
+          </w:tcPr>
+          <w:p>
+            <w:r>
+              <w:t>Player attack animation</w:t>
+            </w:r>
+          </w:p>
+        </w:tc>
+        <w:tc>
+          <w:tcPr>
+            <w:tcW w:w="1417" w:type="dxa"/>
+          </w:tcPr>
+          <w:p>
+            <w:r>
+              <w:t xml:space="preserve">Expected </w:t>
+            </w:r>
+          </w:p>
+        </w:tc>
+        <w:tc>
+          <w:tcPr>
+            <w:tcW w:w="1342" w:type="dxa"/>
+            <w:gridSpan w:val="2"/>
+          </w:tcPr>
+          <w:p>
+            <w:r>
+              <w:t>Attack animation plays once when space is pressed</w:t>
+            </w:r>
+          </w:p>
+        </w:tc>
+        <w:tc>
+          <w:tcPr>
+            <w:tcW w:w="1298" w:type="dxa"/>
+          </w:tcPr>
+          <w:p>
+            <w:r>
+              <w:t>Animation plays</w:t>
+            </w:r>
+          </w:p>
+        </w:tc>
+        <w:tc>
+          <w:tcPr>
+            <w:tcW w:w="6291" w:type="dxa"/>
+          </w:tcPr>
+          <w:p>
+            <w:r>
+              <w:t>None</w:t>
+            </w:r>
+          </w:p>
+        </w:tc>
+      </w:tr>
+      <w:tr>
+        <w:trPr>
+          <w:gridAfter w:val="1"/>
+          <w:wAfter w:w="936" w:type="dxa"/>
+        </w:trPr>
+        <w:tc>
+          <w:tcPr>
+            <w:tcW w:w="762" w:type="dxa"/>
+          </w:tcPr>
+          <w:p>
+            <w:r>
+              <w:t>30/3</w:t>
+            </w:r>
+          </w:p>
+        </w:tc>
+        <w:tc>
+          <w:tcPr>
+            <w:tcW w:w="2777" w:type="dxa"/>
+            <w:gridSpan w:val="2"/>
+          </w:tcPr>
+          <w:p>
+            <w:r>
+              <w:t xml:space="preserve">Enemy death animation </w:t>
+            </w:r>
+          </w:p>
+        </w:tc>
+        <w:tc>
+          <w:tcPr>
+            <w:tcW w:w="1417" w:type="dxa"/>
+          </w:tcPr>
+          <w:p>
+            <w:r>
+              <w:t>Expected</w:t>
+            </w:r>
+          </w:p>
+        </w:tc>
+        <w:tc>
+          <w:tcPr>
+            <w:tcW w:w="1342" w:type="dxa"/>
+            <w:gridSpan w:val="2"/>
+          </w:tcPr>
+          <w:p>
+            <w:r>
+              <w:t>Enemy plays death animation</w:t>
+            </w:r>
+          </w:p>
+        </w:tc>
+        <w:tc>
+          <w:tcPr>
+            <w:tcW w:w="1298" w:type="dxa"/>
+          </w:tcPr>
+          <w:p>
+            <w:r>
+              <w:t>Animation doesn’t play correctly</w:t>
+            </w:r>
+          </w:p>
+        </w:tc>
+        <w:tc>
+          <w:tcPr>
+            <w:tcW w:w="6291" w:type="dxa"/>
+          </w:tcPr>
+          <w:p>
+            <w:r>
+              <w:t>Made it so animations only play if the health of the enemy is above zero</w:t>
+            </w:r>
+          </w:p>
+        </w:tc>
+      </w:tr>
+      <w:tr>
+        <w:trPr>
+          <w:gridAfter w:val="1"/>
+          <w:wAfter w:w="936" w:type="dxa"/>
+        </w:trPr>
+        <w:tc>
+          <w:tcPr>
+            <w:tcW w:w="762" w:type="dxa"/>
+          </w:tcPr>
+          <w:p>
+            <w:r>
+              <w:t>30/3</w:t>
+            </w:r>
+          </w:p>
+        </w:tc>
+        <w:tc>
+          <w:tcPr>
+            <w:tcW w:w="2777" w:type="dxa"/>
+            <w:gridSpan w:val="2"/>
+          </w:tcPr>
+          <w:p>
+            <w:r>
+              <w:t xml:space="preserve">Enemy death animation </w:t>
+            </w:r>
+          </w:p>
+        </w:tc>
+        <w:tc>
+          <w:tcPr>
+            <w:tcW w:w="1417" w:type="dxa"/>
+          </w:tcPr>
+          <w:p>
+            <w:r>
+              <w:t>Expected</w:t>
+            </w:r>
+          </w:p>
+        </w:tc>
+        <w:tc>
+          <w:tcPr>
+            <w:tcW w:w="1342" w:type="dxa"/>
+            <w:gridSpan w:val="2"/>
+          </w:tcPr>
+          <w:p>
+            <w:r>
+              <w:t>Enemy plays death animation</w:t>
+            </w:r>
+          </w:p>
+        </w:tc>
+        <w:tc>
+          <w:tcPr>
+            <w:tcW w:w="1298" w:type="dxa"/>
+          </w:tcPr>
+          <w:p>
+            <w:r>
+              <w:t>Death animation loops endlessly</w:t>
+            </w:r>
+          </w:p>
+        </w:tc>
+        <w:tc>
+          <w:tcPr>
+            <w:tcW w:w="6291" w:type="dxa"/>
+          </w:tcPr>
+          <w:p/>
+        </w:tc>
+      </w:tr>
+      <w:tr>
+        <w:trPr>
+          <w:gridAfter w:val="1"/>
+          <w:wAfter w:w="936" w:type="dxa"/>
+        </w:trPr>
+        <w:tc>
+          <w:tcPr>
+            <w:tcW w:w="762" w:type="dxa"/>
+          </w:tcPr>
+          <w:p>
+            <w:r>
+              <w:t>1/04</w:t>
+            </w:r>
+          </w:p>
+        </w:tc>
+        <w:tc>
+          <w:tcPr>
+            <w:tcW w:w="2777" w:type="dxa"/>
+            <w:gridSpan w:val="2"/>
+          </w:tcPr>
+          <w:p>
+            <w:r>
+              <w:t>Rewriting enemy code to make to more compact</w:t>
+            </w:r>
+          </w:p>
+        </w:tc>
+        <w:tc>
+          <w:tcPr>
+            <w:tcW w:w="1417" w:type="dxa"/>
+          </w:tcPr>
+          <w:p>
+            <w:r>
+              <w:t>Expected</w:t>
+            </w:r>
+          </w:p>
+        </w:tc>
+        <w:tc>
+          <w:tcPr>
+            <w:tcW w:w="1342" w:type="dxa"/>
+            <w:gridSpan w:val="2"/>
+          </w:tcPr>
+          <w:p>
+            <w:r>
+              <w:t>Enemies react to gravity</w:t>
+            </w:r>
+          </w:p>
+        </w:tc>
+        <w:tc>
+          <w:tcPr>
+            <w:tcW w:w="1298" w:type="dxa"/>
+          </w:tcPr>
+          <w:p>
+            <w:r>
+              <w:t>One enemy doesn’t react to gravity</w:t>
+            </w:r>
+          </w:p>
+        </w:tc>
+        <w:tc>
+          <w:tcPr>
+            <w:tcW w:w="6291" w:type="dxa"/>
+          </w:tcPr>
+          <w:p>
+            <w:r>
+              <w:drawing>
+                <wp:inline distT="0" distB="0" distL="0" distR="0" wp14:anchorId="35794512" wp14:editId="085B8973">
+                  <wp:extent cx="3858163" cy="1181265"/>
+                  <wp:effectExtent l="0" t="0" r="0" b="0"/>
+                  <wp:docPr id="1145750840" name="Picture 1"/>
+                  <wp:cNvGraphicFramePr>
+                    <a:graphicFrameLocks xmlns:a="http://schemas.openxmlformats.org/drawingml/2006/main" noChangeAspect="1"/>
+                  </wp:cNvGraphicFramePr>
+                  <a:graphic xmlns:a="http://schemas.openxmlformats.org/drawingml/2006/main">
+                    <a:graphicData uri="http://schemas.openxmlformats.org/drawingml/2006/picture">
+                      <pic:pic xmlns:pic="http://schemas.openxmlformats.org/drawingml/2006/picture">
+                        <pic:nvPicPr>
+                          <pic:cNvPr id="1145750840" name=""/>
+                          <pic:cNvPicPr/>
+                        </pic:nvPicPr>
+                        <pic:blipFill>
+                          <a:blip r:embed="rId10"/>
+                          <a:stretch>
+                            <a:fillRect/>
+                          </a:stretch>
+                        </pic:blipFill>
+                        <pic:spPr>
+                          <a:xfrm>
+                            <a:off x="0" y="0"/>
+                            <a:ext cx="3858163" cy="1181265"/>
+                          </a:xfrm>
+                          <a:prstGeom prst="rect">
+                            <a:avLst/>
+                          </a:prstGeom>
+                        </pic:spPr>
+                      </pic:pic>
+                    </a:graphicData>
+                  </a:graphic>
+                </wp:inline>
+              </w:drawing>
+            </w:r>
+          </w:p>
+        </w:tc>
+      </w:tr>
+      <w:tr>
+        <w:trPr>
+          <w:gridAfter w:val="1"/>
+          <w:wAfter w:w="936" w:type="dxa"/>
+        </w:trPr>
+        <w:tc>
+          <w:tcPr>
+            <w:tcW w:w="762" w:type="dxa"/>
+          </w:tcPr>
+          <w:p>
+            <w:r>
+              <w:t>1/04</w:t>
+            </w:r>
+          </w:p>
+        </w:tc>
+        <w:tc>
+          <w:tcPr>
+            <w:tcW w:w="2777" w:type="dxa"/>
+            <w:gridSpan w:val="2"/>
+          </w:tcPr>
+          <w:p>
+            <w:r>
+              <w:t>Rewriting enemy code to make to more compact</w:t>
+            </w:r>
+          </w:p>
+        </w:tc>
+        <w:tc>
+          <w:tcPr>
+            <w:tcW w:w="1417" w:type="dxa"/>
+          </w:tcPr>
+          <w:p>
+            <w:r>
+              <w:t>Expected</w:t>
+            </w:r>
+          </w:p>
+        </w:tc>
+        <w:tc>
+          <w:tcPr>
+            <w:tcW w:w="1342" w:type="dxa"/>
+            <w:gridSpan w:val="2"/>
+          </w:tcPr>
+          <w:p>
+            <w:r>
+              <w:t>Enemies react to gravity</w:t>
+            </w:r>
+          </w:p>
+        </w:tc>
+        <w:tc>
+          <w:tcPr>
+            <w:tcW w:w="1298" w:type="dxa"/>
+          </w:tcPr>
+          <w:p>
+            <w:r>
+              <w:t>Enemies work with gravity</w:t>
+            </w:r>
+          </w:p>
+        </w:tc>
+        <w:tc>
+          <w:tcPr>
+            <w:tcW w:w="6291" w:type="dxa"/>
+          </w:tcPr>
+          <w:p>
+            <w:r>
               <w:t>None</w:t>
             </w:r>
           </w:p>

</xml_diff>

<commit_message>
added enemy hit and death sounds
</commit_message>
<xml_diff>
--- a/documentation/ongoing_testing.docx
+++ b/documentation/ongoing_testing.docx
@@ -525,6 +525,7 @@
               </w:rPr>
               <w:t xml:space="preserve">        </w:t>
             </w:r>
+            <w:proofErr w:type="gramStart"/>
             <w:r>
               <w:rPr>
                 <w:rFonts w:ascii="Consolas" w:eastAsia="Times New Roman" w:hAnsi="Consolas" w:cs="Times New Roman"/>
@@ -553,7 +554,18 @@
                 <w:szCs w:val="21"/>
                 <w:lang w:eastAsia="en-NZ"/>
               </w:rPr>
-              <w:t>hitbox_texture</w:t>
+              <w:t>hitbox</w:t>
+            </w:r>
+            <w:proofErr w:type="gramEnd"/>
+            <w:r>
+              <w:rPr>
+                <w:rFonts w:ascii="Consolas" w:eastAsia="Times New Roman" w:hAnsi="Consolas" w:cs="Times New Roman"/>
+                <w:color w:val="9CDCFE"/>
+                <w:sz w:val="21"/>
+                <w:szCs w:val="21"/>
+                <w:lang w:eastAsia="en-NZ"/>
+              </w:rPr>
+              <w:t>_texture</w:t>
             </w:r>
             <w:r>
               <w:rPr>
@@ -1043,6 +1055,7 @@
               </w:rPr>
               <w:t xml:space="preserve"> </w:t>
             </w:r>
+            <w:proofErr w:type="gramStart"/>
             <w:r>
               <w:rPr>
                 <w:rFonts w:ascii="Consolas" w:eastAsia="Times New Roman" w:hAnsi="Consolas" w:cs="Times New Roman"/>
@@ -1071,7 +1084,18 @@
                 <w:szCs w:val="21"/>
                 <w:lang w:eastAsia="en-NZ"/>
               </w:rPr>
-              <w:t>change_y</w:t>
+              <w:t>change</w:t>
+            </w:r>
+            <w:proofErr w:type="gramEnd"/>
+            <w:r>
+              <w:rPr>
+                <w:rFonts w:ascii="Consolas" w:eastAsia="Times New Roman" w:hAnsi="Consolas" w:cs="Times New Roman"/>
+                <w:color w:val="9CDCFE"/>
+                <w:sz w:val="21"/>
+                <w:szCs w:val="21"/>
+                <w:lang w:eastAsia="en-NZ"/>
+              </w:rPr>
+              <w:t>_y</w:t>
             </w:r>
             <w:r>
               <w:rPr>
@@ -1146,6 +1170,7 @@
               </w:rPr>
               <w:t xml:space="preserve">            </w:t>
             </w:r>
+            <w:proofErr w:type="gramStart"/>
             <w:r>
               <w:rPr>
                 <w:rFonts w:ascii="Consolas" w:eastAsia="Times New Roman" w:hAnsi="Consolas" w:cs="Times New Roman"/>
@@ -1176,6 +1201,7 @@
               </w:rPr>
               <w:t>texture</w:t>
             </w:r>
+            <w:proofErr w:type="gramEnd"/>
             <w:r>
               <w:rPr>
                 <w:rFonts w:ascii="Consolas" w:eastAsia="Times New Roman" w:hAnsi="Consolas" w:cs="Times New Roman"/>
@@ -1349,6 +1375,7 @@
               </w:rPr>
               <w:t xml:space="preserve"> </w:t>
             </w:r>
+            <w:proofErr w:type="gramStart"/>
             <w:r>
               <w:rPr>
                 <w:rFonts w:ascii="Consolas" w:eastAsia="Times New Roman" w:hAnsi="Consolas" w:cs="Times New Roman"/>
@@ -1377,7 +1404,18 @@
                 <w:szCs w:val="21"/>
                 <w:lang w:eastAsia="en-NZ"/>
               </w:rPr>
-              <w:t>change_y</w:t>
+              <w:t>change</w:t>
+            </w:r>
+            <w:proofErr w:type="gramEnd"/>
+            <w:r>
+              <w:rPr>
+                <w:rFonts w:ascii="Consolas" w:eastAsia="Times New Roman" w:hAnsi="Consolas" w:cs="Times New Roman"/>
+                <w:color w:val="9CDCFE"/>
+                <w:sz w:val="21"/>
+                <w:szCs w:val="21"/>
+                <w:lang w:eastAsia="en-NZ"/>
+              </w:rPr>
+              <w:t>_y</w:t>
             </w:r>
             <w:r>
               <w:rPr>
@@ -1462,6 +1500,7 @@
               </w:rPr>
               <w:t xml:space="preserve">            </w:t>
             </w:r>
+            <w:proofErr w:type="gramStart"/>
             <w:r>
               <w:rPr>
                 <w:rFonts w:ascii="Consolas" w:eastAsia="Times New Roman" w:hAnsi="Consolas" w:cs="Times New Roman"/>
@@ -1492,6 +1531,7 @@
               </w:rPr>
               <w:t>texture</w:t>
             </w:r>
+            <w:proofErr w:type="gramEnd"/>
             <w:r>
               <w:rPr>
                 <w:rFonts w:ascii="Consolas" w:eastAsia="Times New Roman" w:hAnsi="Consolas" w:cs="Times New Roman"/>
@@ -2260,7 +2300,29 @@
                 <w:szCs w:val="21"/>
                 <w:lang w:eastAsia="en-NZ"/>
               </w:rPr>
-              <w:t>Changed code from self.change_x to self.center += x</w:t>
+              <w:t xml:space="preserve">Changed code from </w:t>
+            </w:r>
+            <w:proofErr w:type="gramStart"/>
+            <w:r>
+              <w:rPr>
+                <w:rFonts w:ascii="Consolas" w:eastAsia="Times New Roman" w:hAnsi="Consolas" w:cs="Times New Roman"/>
+                <w:color w:val="CCCCCC"/>
+                <w:sz w:val="21"/>
+                <w:szCs w:val="21"/>
+                <w:lang w:eastAsia="en-NZ"/>
+              </w:rPr>
+              <w:t>self.change</w:t>
+            </w:r>
+            <w:proofErr w:type="gramEnd"/>
+            <w:r>
+              <w:rPr>
+                <w:rFonts w:ascii="Consolas" w:eastAsia="Times New Roman" w:hAnsi="Consolas" w:cs="Times New Roman"/>
+                <w:color w:val="CCCCCC"/>
+                <w:sz w:val="21"/>
+                <w:szCs w:val="21"/>
+                <w:lang w:eastAsia="en-NZ"/>
+              </w:rPr>
+              <w:t>_x to self.center += x</w:t>
             </w:r>
           </w:p>
         </w:tc>
@@ -2306,8 +2368,13 @@
           </w:tcPr>
           <w:p>
             <w:r>
-              <w:t>Enemy sprites moves</w:t>
-            </w:r>
+              <w:t xml:space="preserve">Enemy sprites </w:t>
+            </w:r>
+            <w:proofErr w:type="gramStart"/>
+            <w:r>
+              <w:t>moves</w:t>
+            </w:r>
+            <w:proofErr w:type="gramEnd"/>
           </w:p>
         </w:tc>
         <w:tc>
@@ -2573,6 +2640,7 @@
               </w:rPr>
               <w:t xml:space="preserve"> </w:t>
             </w:r>
+            <w:proofErr w:type="gramStart"/>
             <w:r>
               <w:rPr>
                 <w:rFonts w:ascii="Consolas" w:eastAsia="Times New Roman" w:hAnsi="Consolas" w:cs="Times New Roman"/>
@@ -2603,6 +2671,7 @@
               </w:rPr>
               <w:t>direction</w:t>
             </w:r>
+            <w:proofErr w:type="gramEnd"/>
             <w:r>
               <w:rPr>
                 <w:rFonts w:ascii="Consolas" w:eastAsia="Times New Roman" w:hAnsi="Consolas" w:cs="Times New Roman"/>
@@ -2676,6 +2745,7 @@
               </w:rPr>
               <w:t xml:space="preserve">            </w:t>
             </w:r>
+            <w:proofErr w:type="gramStart"/>
             <w:r>
               <w:rPr>
                 <w:rFonts w:ascii="Consolas" w:eastAsia="Times New Roman" w:hAnsi="Consolas" w:cs="Times New Roman"/>
@@ -2704,7 +2774,18 @@
                 <w:szCs w:val="21"/>
                 <w:lang w:eastAsia="en-NZ"/>
               </w:rPr>
-              <w:t>change_x</w:t>
+              <w:t>change</w:t>
+            </w:r>
+            <w:proofErr w:type="gramEnd"/>
+            <w:r>
+              <w:rPr>
+                <w:rFonts w:ascii="Consolas" w:eastAsia="Times New Roman" w:hAnsi="Consolas" w:cs="Times New Roman"/>
+                <w:color w:val="9CDCFE"/>
+                <w:sz w:val="21"/>
+                <w:szCs w:val="21"/>
+                <w:lang w:eastAsia="en-NZ"/>
+              </w:rPr>
+              <w:t>_x</w:t>
             </w:r>
             <w:r>
               <w:rPr>
@@ -2879,6 +2960,7 @@
                 <w:lang w:eastAsia="en-NZ"/>
               </w:rPr>
             </w:pPr>
+            <w:proofErr w:type="gramStart"/>
             <w:r>
               <w:rPr>
                 <w:rFonts w:ascii="Consolas" w:eastAsia="Times New Roman" w:hAnsi="Consolas" w:cs="Times New Roman"/>
@@ -2887,7 +2969,18 @@
                 <w:szCs w:val="21"/>
                 <w:lang w:eastAsia="en-NZ"/>
               </w:rPr>
-              <w:t>Changed .change_x -= 3 to  .change_x = -3</w:t>
+              <w:t>Changed .change</w:t>
+            </w:r>
+            <w:proofErr w:type="gramEnd"/>
+            <w:r>
+              <w:rPr>
+                <w:rFonts w:ascii="Consolas" w:eastAsia="Times New Roman" w:hAnsi="Consolas" w:cs="Times New Roman"/>
+                <w:color w:val="C586C0"/>
+                <w:sz w:val="21"/>
+                <w:szCs w:val="21"/>
+                <w:lang w:eastAsia="en-NZ"/>
+              </w:rPr>
+              <w:t>_x -= 3 to  .change_x = -3</w:t>
             </w:r>
           </w:p>
         </w:tc>
@@ -3174,6 +3267,7 @@
               </w:rPr>
               <w:t xml:space="preserve"> </w:t>
             </w:r>
+            <w:proofErr w:type="gramStart"/>
             <w:r>
               <w:rPr>
                 <w:rFonts w:ascii="Consolas" w:eastAsia="Times New Roman" w:hAnsi="Consolas" w:cs="Times New Roman"/>
@@ -3224,6 +3318,7 @@
               </w:rPr>
               <w:t>SPACE</w:t>
             </w:r>
+            <w:proofErr w:type="gramEnd"/>
             <w:r>
               <w:rPr>
                 <w:rFonts w:ascii="Consolas" w:eastAsia="Times New Roman" w:hAnsi="Consolas" w:cs="Times New Roman"/>
@@ -3257,6 +3352,7 @@
               </w:rPr>
               <w:t>   </w:t>
             </w:r>
+            <w:proofErr w:type="gramStart"/>
             <w:r>
               <w:rPr>
                 <w:rFonts w:ascii="Consolas" w:eastAsia="Times New Roman" w:hAnsi="Consolas" w:cs="Times New Roman"/>
@@ -3285,7 +3381,18 @@
                 <w:szCs w:val="21"/>
                 <w:lang w:eastAsia="en-NZ"/>
               </w:rPr>
-              <w:t>enemy_sprite</w:t>
+              <w:t>enemy</w:t>
+            </w:r>
+            <w:proofErr w:type="gramEnd"/>
+            <w:r>
+              <w:rPr>
+                <w:rFonts w:ascii="Consolas" w:eastAsia="Times New Roman" w:hAnsi="Consolas" w:cs="Times New Roman"/>
+                <w:color w:val="9CDCFE"/>
+                <w:sz w:val="21"/>
+                <w:szCs w:val="21"/>
+                <w:lang w:eastAsia="en-NZ"/>
+              </w:rPr>
+              <w:t>_sprite</w:t>
             </w:r>
             <w:r>
               <w:rPr>
@@ -3433,7 +3540,29 @@
                 <w:szCs w:val="21"/>
                 <w:lang w:eastAsia="en-NZ"/>
               </w:rPr>
-              <w:t>Added time.sleep(1)</w:t>
+              <w:t xml:space="preserve">Added </w:t>
+            </w:r>
+            <w:proofErr w:type="gramStart"/>
+            <w:r>
+              <w:rPr>
+                <w:rFonts w:ascii="Consolas" w:eastAsia="Times New Roman" w:hAnsi="Consolas" w:cs="Times New Roman"/>
+                <w:color w:val="CCCCCC"/>
+                <w:sz w:val="21"/>
+                <w:szCs w:val="21"/>
+                <w:lang w:eastAsia="en-NZ"/>
+              </w:rPr>
+              <w:t>time.sleep</w:t>
+            </w:r>
+            <w:proofErr w:type="gramEnd"/>
+            <w:r>
+              <w:rPr>
+                <w:rFonts w:ascii="Consolas" w:eastAsia="Times New Roman" w:hAnsi="Consolas" w:cs="Times New Roman"/>
+                <w:color w:val="CCCCCC"/>
+                <w:sz w:val="21"/>
+                <w:szCs w:val="21"/>
+                <w:lang w:eastAsia="en-NZ"/>
+              </w:rPr>
+              <w:t>(1)</w:t>
             </w:r>
           </w:p>
         </w:tc>
@@ -3961,7 +4090,29 @@
                 <w:szCs w:val="21"/>
                 <w:lang w:eastAsia="en-NZ"/>
               </w:rPr>
-              <w:t>Removed the code from on key_release that stops the animation code from running and made self.attack = “” when the animation hd played.</w:t>
+              <w:t xml:space="preserve">Removed the code from on key_release that stops the animation code from running and made </w:t>
+            </w:r>
+            <w:proofErr w:type="gramStart"/>
+            <w:r>
+              <w:rPr>
+                <w:rFonts w:ascii="Consolas" w:eastAsia="Times New Roman" w:hAnsi="Consolas" w:cs="Times New Roman"/>
+                <w:color w:val="CCCCCC"/>
+                <w:sz w:val="21"/>
+                <w:szCs w:val="21"/>
+                <w:lang w:eastAsia="en-NZ"/>
+              </w:rPr>
+              <w:t>self.attack</w:t>
+            </w:r>
+            <w:proofErr w:type="gramEnd"/>
+            <w:r>
+              <w:rPr>
+                <w:rFonts w:ascii="Consolas" w:eastAsia="Times New Roman" w:hAnsi="Consolas" w:cs="Times New Roman"/>
+                <w:color w:val="CCCCCC"/>
+                <w:sz w:val="21"/>
+                <w:szCs w:val="21"/>
+                <w:lang w:eastAsia="en-NZ"/>
+              </w:rPr>
+              <w:t xml:space="preserve"> = “” when the animation hd played.</w:t>
             </w:r>
           </w:p>
         </w:tc>
@@ -4257,8 +4408,20 @@
                 <w:szCs w:val="21"/>
                 <w:lang w:eastAsia="en-NZ"/>
               </w:rPr>
-              <w:t>Attack animation repeats when the sprites move</w:t>
-            </w:r>
+              <w:t xml:space="preserve">Attack animation repeats when the sprites </w:t>
+            </w:r>
+            <w:proofErr w:type="gramStart"/>
+            <w:r>
+              <w:rPr>
+                <w:rFonts w:ascii="Consolas" w:eastAsia="Times New Roman" w:hAnsi="Consolas" w:cs="Times New Roman"/>
+                <w:color w:val="CCCCCC"/>
+                <w:sz w:val="21"/>
+                <w:szCs w:val="21"/>
+                <w:lang w:eastAsia="en-NZ"/>
+              </w:rPr>
+              <w:t>move</w:t>
+            </w:r>
+            <w:proofErr w:type="gramEnd"/>
           </w:p>
           <w:p>
             <w:pPr>
@@ -4272,15 +4435,27 @@
                 <w:lang w:eastAsia="en-NZ"/>
               </w:rPr>
             </w:pPr>
-            <w:r>
-              <w:rPr>
-                <w:rFonts w:ascii="Consolas" w:eastAsia="Times New Roman" w:hAnsi="Consolas" w:cs="Times New Roman"/>
-                <w:color w:val="CCCCCC"/>
-                <w:sz w:val="21"/>
-                <w:szCs w:val="21"/>
-                <w:lang w:eastAsia="en-NZ"/>
-              </w:rPr>
-              <w:t>So I stopped the enemy sprite movement when attack</w:t>
+            <w:proofErr w:type="gramStart"/>
+            <w:r>
+              <w:rPr>
+                <w:rFonts w:ascii="Consolas" w:eastAsia="Times New Roman" w:hAnsi="Consolas" w:cs="Times New Roman"/>
+                <w:color w:val="CCCCCC"/>
+                <w:sz w:val="21"/>
+                <w:szCs w:val="21"/>
+                <w:lang w:eastAsia="en-NZ"/>
+              </w:rPr>
+              <w:t>So</w:t>
+            </w:r>
+            <w:proofErr w:type="gramEnd"/>
+            <w:r>
+              <w:rPr>
+                <w:rFonts w:ascii="Consolas" w:eastAsia="Times New Roman" w:hAnsi="Consolas" w:cs="Times New Roman"/>
+                <w:color w:val="CCCCCC"/>
+                <w:sz w:val="21"/>
+                <w:szCs w:val="21"/>
+                <w:lang w:eastAsia="en-NZ"/>
+              </w:rPr>
+              <w:t xml:space="preserve"> I stopped the enemy sprite movement when attack</w:t>
             </w:r>
           </w:p>
           <w:p>
@@ -4489,7 +4664,15 @@
           </w:tcPr>
           <w:p>
             <w:r>
-              <w:t>Animation doesn’t work for other enemy sprite</w:t>
+              <w:t xml:space="preserve">Animation doesn’t work for </w:t>
+            </w:r>
+            <w:proofErr w:type="gramStart"/>
+            <w:r>
+              <w:t>other</w:t>
+            </w:r>
+            <w:proofErr w:type="gramEnd"/>
+            <w:r>
+              <w:t xml:space="preserve"> enemy sprite</w:t>
             </w:r>
           </w:p>
         </w:tc>
@@ -5370,7 +5553,15 @@
           </w:tcPr>
           <w:p>
             <w:r>
-              <w:t>Animation is  a bit buggy</w:t>
+              <w:t xml:space="preserve">Animation </w:t>
+            </w:r>
+            <w:proofErr w:type="gramStart"/>
+            <w:r>
+              <w:t>is  a</w:t>
+            </w:r>
+            <w:proofErr w:type="gramEnd"/>
+            <w:r>
+              <w:t xml:space="preserve"> bit buggy</w:t>
             </w:r>
           </w:p>
         </w:tc>
@@ -5380,7 +5571,15 @@
           </w:tcPr>
           <w:p>
             <w:r>
-              <w:t>Made the normal idle and walking animation only run if self.if-hit wasn’t true</w:t>
+              <w:t xml:space="preserve">Made the normal idle and walking animation only run if </w:t>
+            </w:r>
+            <w:proofErr w:type="gramStart"/>
+            <w:r>
+              <w:t>self.if</w:t>
+            </w:r>
+            <w:proofErr w:type="gramEnd"/>
+            <w:r>
+              <w:t>-hit wasn’t true</w:t>
             </w:r>
           </w:p>
         </w:tc>
@@ -5877,6 +6076,177 @@
           <w:p>
             <w:r>
               <w:t>Enemies work with gravity</w:t>
+            </w:r>
+          </w:p>
+        </w:tc>
+        <w:tc>
+          <w:tcPr>
+            <w:tcW w:w="6291" w:type="dxa"/>
+          </w:tcPr>
+          <w:p>
+            <w:r>
+              <w:t>None</w:t>
+            </w:r>
+          </w:p>
+        </w:tc>
+      </w:tr>
+      <w:tr>
+        <w:trPr>
+          <w:gridAfter w:val="1"/>
+          <w:wAfter w:w="936" w:type="dxa"/>
+        </w:trPr>
+        <w:tc>
+          <w:tcPr>
+            <w:tcW w:w="762" w:type="dxa"/>
+          </w:tcPr>
+          <w:p>
+            <w:r>
+              <w:lastRenderedPageBreak/>
+              <w:t>1/04</w:t>
+            </w:r>
+          </w:p>
+        </w:tc>
+        <w:tc>
+          <w:tcPr>
+            <w:tcW w:w="2777" w:type="dxa"/>
+            <w:gridSpan w:val="2"/>
+          </w:tcPr>
+          <w:p>
+            <w:r>
+              <w:t>Enemy death sound</w:t>
+            </w:r>
+          </w:p>
+        </w:tc>
+        <w:tc>
+          <w:tcPr>
+            <w:tcW w:w="1417" w:type="dxa"/>
+          </w:tcPr>
+          <w:p>
+            <w:r>
+              <w:t>Expected</w:t>
+            </w:r>
+          </w:p>
+        </w:tc>
+        <w:tc>
+          <w:tcPr>
+            <w:tcW w:w="1342" w:type="dxa"/>
+            <w:gridSpan w:val="2"/>
+          </w:tcPr>
+          <w:p>
+            <w:r>
+              <w:t>Plays death sound when enemy is killed</w:t>
+            </w:r>
+          </w:p>
+        </w:tc>
+        <w:tc>
+          <w:tcPr>
+            <w:tcW w:w="1298" w:type="dxa"/>
+          </w:tcPr>
+          <w:p>
+            <w:r>
+              <w:t>Sound plays every time dead enemy collides with player</w:t>
+            </w:r>
+          </w:p>
+        </w:tc>
+        <w:tc>
+          <w:tcPr>
+            <w:tcW w:w="6291" w:type="dxa"/>
+          </w:tcPr>
+          <w:p>
+            <w:r>
+              <w:drawing>
+                <wp:inline distT="0" distB="0" distL="0" distR="0" wp14:anchorId="580CF0EA" wp14:editId="038335FA">
+                  <wp:extent cx="3115110" cy="724001"/>
+                  <wp:effectExtent l="0" t="0" r="9525" b="0"/>
+                  <wp:docPr id="1709838694" name="Picture 1"/>
+                  <wp:cNvGraphicFramePr>
+                    <a:graphicFrameLocks xmlns:a="http://schemas.openxmlformats.org/drawingml/2006/main" noChangeAspect="1"/>
+                  </wp:cNvGraphicFramePr>
+                  <a:graphic xmlns:a="http://schemas.openxmlformats.org/drawingml/2006/main">
+                    <a:graphicData uri="http://schemas.openxmlformats.org/drawingml/2006/picture">
+                      <pic:pic xmlns:pic="http://schemas.openxmlformats.org/drawingml/2006/picture">
+                        <pic:nvPicPr>
+                          <pic:cNvPr id="1709838694" name=""/>
+                          <pic:cNvPicPr/>
+                        </pic:nvPicPr>
+                        <pic:blipFill>
+                          <a:blip r:embed="rId11"/>
+                          <a:stretch>
+                            <a:fillRect/>
+                          </a:stretch>
+                        </pic:blipFill>
+                        <pic:spPr>
+                          <a:xfrm>
+                            <a:off x="0" y="0"/>
+                            <a:ext cx="3115110" cy="724001"/>
+                          </a:xfrm>
+                          <a:prstGeom prst="rect">
+                            <a:avLst/>
+                          </a:prstGeom>
+                        </pic:spPr>
+                      </pic:pic>
+                    </a:graphicData>
+                  </a:graphic>
+                </wp:inline>
+              </w:drawing>
+            </w:r>
+          </w:p>
+        </w:tc>
+      </w:tr>
+      <w:tr>
+        <w:trPr>
+          <w:gridAfter w:val="1"/>
+          <w:wAfter w:w="936" w:type="dxa"/>
+        </w:trPr>
+        <w:tc>
+          <w:tcPr>
+            <w:tcW w:w="762" w:type="dxa"/>
+          </w:tcPr>
+          <w:p>
+            <w:r>
+              <w:t>1/04</w:t>
+            </w:r>
+          </w:p>
+        </w:tc>
+        <w:tc>
+          <w:tcPr>
+            <w:tcW w:w="2777" w:type="dxa"/>
+            <w:gridSpan w:val="2"/>
+          </w:tcPr>
+          <w:p>
+            <w:r>
+              <w:t>Enemy death sound</w:t>
+            </w:r>
+          </w:p>
+        </w:tc>
+        <w:tc>
+          <w:tcPr>
+            <w:tcW w:w="1417" w:type="dxa"/>
+          </w:tcPr>
+          <w:p>
+            <w:r>
+              <w:t>Expected</w:t>
+            </w:r>
+          </w:p>
+        </w:tc>
+        <w:tc>
+          <w:tcPr>
+            <w:tcW w:w="1342" w:type="dxa"/>
+            <w:gridSpan w:val="2"/>
+          </w:tcPr>
+          <w:p>
+            <w:r>
+              <w:t>Plays death sound when enemy is killed</w:t>
+            </w:r>
+          </w:p>
+        </w:tc>
+        <w:tc>
+          <w:tcPr>
+            <w:tcW w:w="1298" w:type="dxa"/>
+          </w:tcPr>
+          <w:p>
+            <w:r>
+              <w:t>Sound plays once when enemy is killed</w:t>
             </w:r>
           </w:p>
         </w:tc>

</xml_diff>

<commit_message>
rewrote collision code to make it more compact and allow more enemies to be spawned
</commit_message>
<xml_diff>
--- a/documentation/ongoing_testing.docx
+++ b/documentation/ongoing_testing.docx
@@ -525,7 +525,6 @@
               </w:rPr>
               <w:t xml:space="preserve">        </w:t>
             </w:r>
-            <w:proofErr w:type="gramStart"/>
             <w:r>
               <w:rPr>
                 <w:rFonts w:ascii="Consolas" w:eastAsia="Times New Roman" w:hAnsi="Consolas" w:cs="Times New Roman"/>
@@ -554,18 +553,7 @@
                 <w:szCs w:val="21"/>
                 <w:lang w:eastAsia="en-NZ"/>
               </w:rPr>
-              <w:t>hitbox</w:t>
-            </w:r>
-            <w:proofErr w:type="gramEnd"/>
-            <w:r>
-              <w:rPr>
-                <w:rFonts w:ascii="Consolas" w:eastAsia="Times New Roman" w:hAnsi="Consolas" w:cs="Times New Roman"/>
-                <w:color w:val="9CDCFE"/>
-                <w:sz w:val="21"/>
-                <w:szCs w:val="21"/>
-                <w:lang w:eastAsia="en-NZ"/>
-              </w:rPr>
-              <w:t>_texture</w:t>
+              <w:t>hitbox_texture</w:t>
             </w:r>
             <w:r>
               <w:rPr>
@@ -1055,7 +1043,6 @@
               </w:rPr>
               <w:t xml:space="preserve"> </w:t>
             </w:r>
-            <w:proofErr w:type="gramStart"/>
             <w:r>
               <w:rPr>
                 <w:rFonts w:ascii="Consolas" w:eastAsia="Times New Roman" w:hAnsi="Consolas" w:cs="Times New Roman"/>
@@ -1084,18 +1071,7 @@
                 <w:szCs w:val="21"/>
                 <w:lang w:eastAsia="en-NZ"/>
               </w:rPr>
-              <w:t>change</w:t>
-            </w:r>
-            <w:proofErr w:type="gramEnd"/>
-            <w:r>
-              <w:rPr>
-                <w:rFonts w:ascii="Consolas" w:eastAsia="Times New Roman" w:hAnsi="Consolas" w:cs="Times New Roman"/>
-                <w:color w:val="9CDCFE"/>
-                <w:sz w:val="21"/>
-                <w:szCs w:val="21"/>
-                <w:lang w:eastAsia="en-NZ"/>
-              </w:rPr>
-              <w:t>_y</w:t>
+              <w:t>change_y</w:t>
             </w:r>
             <w:r>
               <w:rPr>
@@ -1170,7 +1146,6 @@
               </w:rPr>
               <w:t xml:space="preserve">            </w:t>
             </w:r>
-            <w:proofErr w:type="gramStart"/>
             <w:r>
               <w:rPr>
                 <w:rFonts w:ascii="Consolas" w:eastAsia="Times New Roman" w:hAnsi="Consolas" w:cs="Times New Roman"/>
@@ -1201,7 +1176,6 @@
               </w:rPr>
               <w:t>texture</w:t>
             </w:r>
-            <w:proofErr w:type="gramEnd"/>
             <w:r>
               <w:rPr>
                 <w:rFonts w:ascii="Consolas" w:eastAsia="Times New Roman" w:hAnsi="Consolas" w:cs="Times New Roman"/>
@@ -1375,7 +1349,6 @@
               </w:rPr>
               <w:t xml:space="preserve"> </w:t>
             </w:r>
-            <w:proofErr w:type="gramStart"/>
             <w:r>
               <w:rPr>
                 <w:rFonts w:ascii="Consolas" w:eastAsia="Times New Roman" w:hAnsi="Consolas" w:cs="Times New Roman"/>
@@ -1404,18 +1377,7 @@
                 <w:szCs w:val="21"/>
                 <w:lang w:eastAsia="en-NZ"/>
               </w:rPr>
-              <w:t>change</w:t>
-            </w:r>
-            <w:proofErr w:type="gramEnd"/>
-            <w:r>
-              <w:rPr>
-                <w:rFonts w:ascii="Consolas" w:eastAsia="Times New Roman" w:hAnsi="Consolas" w:cs="Times New Roman"/>
-                <w:color w:val="9CDCFE"/>
-                <w:sz w:val="21"/>
-                <w:szCs w:val="21"/>
-                <w:lang w:eastAsia="en-NZ"/>
-              </w:rPr>
-              <w:t>_y</w:t>
+              <w:t>change_y</w:t>
             </w:r>
             <w:r>
               <w:rPr>
@@ -1500,7 +1462,6 @@
               </w:rPr>
               <w:t xml:space="preserve">            </w:t>
             </w:r>
-            <w:proofErr w:type="gramStart"/>
             <w:r>
               <w:rPr>
                 <w:rFonts w:ascii="Consolas" w:eastAsia="Times New Roman" w:hAnsi="Consolas" w:cs="Times New Roman"/>
@@ -1531,7 +1492,6 @@
               </w:rPr>
               <w:t>texture</w:t>
             </w:r>
-            <w:proofErr w:type="gramEnd"/>
             <w:r>
               <w:rPr>
                 <w:rFonts w:ascii="Consolas" w:eastAsia="Times New Roman" w:hAnsi="Consolas" w:cs="Times New Roman"/>
@@ -2300,29 +2260,7 @@
                 <w:szCs w:val="21"/>
                 <w:lang w:eastAsia="en-NZ"/>
               </w:rPr>
-              <w:t xml:space="preserve">Changed code from </w:t>
-            </w:r>
-            <w:proofErr w:type="gramStart"/>
-            <w:r>
-              <w:rPr>
-                <w:rFonts w:ascii="Consolas" w:eastAsia="Times New Roman" w:hAnsi="Consolas" w:cs="Times New Roman"/>
-                <w:color w:val="CCCCCC"/>
-                <w:sz w:val="21"/>
-                <w:szCs w:val="21"/>
-                <w:lang w:eastAsia="en-NZ"/>
-              </w:rPr>
-              <w:t>self.change</w:t>
-            </w:r>
-            <w:proofErr w:type="gramEnd"/>
-            <w:r>
-              <w:rPr>
-                <w:rFonts w:ascii="Consolas" w:eastAsia="Times New Roman" w:hAnsi="Consolas" w:cs="Times New Roman"/>
-                <w:color w:val="CCCCCC"/>
-                <w:sz w:val="21"/>
-                <w:szCs w:val="21"/>
-                <w:lang w:eastAsia="en-NZ"/>
-              </w:rPr>
-              <w:t>_x to self.center += x</w:t>
+              <w:t>Changed code from self.change_x to self.center += x</w:t>
             </w:r>
           </w:p>
         </w:tc>
@@ -2368,13 +2306,8 @@
           </w:tcPr>
           <w:p>
             <w:r>
-              <w:t xml:space="preserve">Enemy sprites </w:t>
-            </w:r>
-            <w:proofErr w:type="gramStart"/>
-            <w:r>
-              <w:t>moves</w:t>
-            </w:r>
-            <w:proofErr w:type="gramEnd"/>
+              <w:t>Enemy sprites moves</w:t>
+            </w:r>
           </w:p>
         </w:tc>
         <w:tc>
@@ -2640,7 +2573,6 @@
               </w:rPr>
               <w:t xml:space="preserve"> </w:t>
             </w:r>
-            <w:proofErr w:type="gramStart"/>
             <w:r>
               <w:rPr>
                 <w:rFonts w:ascii="Consolas" w:eastAsia="Times New Roman" w:hAnsi="Consolas" w:cs="Times New Roman"/>
@@ -2671,7 +2603,6 @@
               </w:rPr>
               <w:t>direction</w:t>
             </w:r>
-            <w:proofErr w:type="gramEnd"/>
             <w:r>
               <w:rPr>
                 <w:rFonts w:ascii="Consolas" w:eastAsia="Times New Roman" w:hAnsi="Consolas" w:cs="Times New Roman"/>
@@ -2745,7 +2676,6 @@
               </w:rPr>
               <w:t xml:space="preserve">            </w:t>
             </w:r>
-            <w:proofErr w:type="gramStart"/>
             <w:r>
               <w:rPr>
                 <w:rFonts w:ascii="Consolas" w:eastAsia="Times New Roman" w:hAnsi="Consolas" w:cs="Times New Roman"/>
@@ -2774,18 +2704,7 @@
                 <w:szCs w:val="21"/>
                 <w:lang w:eastAsia="en-NZ"/>
               </w:rPr>
-              <w:t>change</w:t>
-            </w:r>
-            <w:proofErr w:type="gramEnd"/>
-            <w:r>
-              <w:rPr>
-                <w:rFonts w:ascii="Consolas" w:eastAsia="Times New Roman" w:hAnsi="Consolas" w:cs="Times New Roman"/>
-                <w:color w:val="9CDCFE"/>
-                <w:sz w:val="21"/>
-                <w:szCs w:val="21"/>
-                <w:lang w:eastAsia="en-NZ"/>
-              </w:rPr>
-              <w:t>_x</w:t>
+              <w:t>change_x</w:t>
             </w:r>
             <w:r>
               <w:rPr>
@@ -2960,7 +2879,6 @@
                 <w:lang w:eastAsia="en-NZ"/>
               </w:rPr>
             </w:pPr>
-            <w:proofErr w:type="gramStart"/>
             <w:r>
               <w:rPr>
                 <w:rFonts w:ascii="Consolas" w:eastAsia="Times New Roman" w:hAnsi="Consolas" w:cs="Times New Roman"/>
@@ -2969,18 +2887,7 @@
                 <w:szCs w:val="21"/>
                 <w:lang w:eastAsia="en-NZ"/>
               </w:rPr>
-              <w:t>Changed .change</w:t>
-            </w:r>
-            <w:proofErr w:type="gramEnd"/>
-            <w:r>
-              <w:rPr>
-                <w:rFonts w:ascii="Consolas" w:eastAsia="Times New Roman" w:hAnsi="Consolas" w:cs="Times New Roman"/>
-                <w:color w:val="C586C0"/>
-                <w:sz w:val="21"/>
-                <w:szCs w:val="21"/>
-                <w:lang w:eastAsia="en-NZ"/>
-              </w:rPr>
-              <w:t>_x -= 3 to  .change_x = -3</w:t>
+              <w:t>Changed .change_x -= 3 to  .change_x = -3</w:t>
             </w:r>
           </w:p>
         </w:tc>
@@ -3267,7 +3174,6 @@
               </w:rPr>
               <w:t xml:space="preserve"> </w:t>
             </w:r>
-            <w:proofErr w:type="gramStart"/>
             <w:r>
               <w:rPr>
                 <w:rFonts w:ascii="Consolas" w:eastAsia="Times New Roman" w:hAnsi="Consolas" w:cs="Times New Roman"/>
@@ -3318,7 +3224,6 @@
               </w:rPr>
               <w:t>SPACE</w:t>
             </w:r>
-            <w:proofErr w:type="gramEnd"/>
             <w:r>
               <w:rPr>
                 <w:rFonts w:ascii="Consolas" w:eastAsia="Times New Roman" w:hAnsi="Consolas" w:cs="Times New Roman"/>
@@ -3352,7 +3257,6 @@
               </w:rPr>
               <w:t>   </w:t>
             </w:r>
-            <w:proofErr w:type="gramStart"/>
             <w:r>
               <w:rPr>
                 <w:rFonts w:ascii="Consolas" w:eastAsia="Times New Roman" w:hAnsi="Consolas" w:cs="Times New Roman"/>
@@ -3381,18 +3285,7 @@
                 <w:szCs w:val="21"/>
                 <w:lang w:eastAsia="en-NZ"/>
               </w:rPr>
-              <w:t>enemy</w:t>
-            </w:r>
-            <w:proofErr w:type="gramEnd"/>
-            <w:r>
-              <w:rPr>
-                <w:rFonts w:ascii="Consolas" w:eastAsia="Times New Roman" w:hAnsi="Consolas" w:cs="Times New Roman"/>
-                <w:color w:val="9CDCFE"/>
-                <w:sz w:val="21"/>
-                <w:szCs w:val="21"/>
-                <w:lang w:eastAsia="en-NZ"/>
-              </w:rPr>
-              <w:t>_sprite</w:t>
+              <w:t>enemy_sprite</w:t>
             </w:r>
             <w:r>
               <w:rPr>
@@ -3540,29 +3433,7 @@
                 <w:szCs w:val="21"/>
                 <w:lang w:eastAsia="en-NZ"/>
               </w:rPr>
-              <w:t xml:space="preserve">Added </w:t>
-            </w:r>
-            <w:proofErr w:type="gramStart"/>
-            <w:r>
-              <w:rPr>
-                <w:rFonts w:ascii="Consolas" w:eastAsia="Times New Roman" w:hAnsi="Consolas" w:cs="Times New Roman"/>
-                <w:color w:val="CCCCCC"/>
-                <w:sz w:val="21"/>
-                <w:szCs w:val="21"/>
-                <w:lang w:eastAsia="en-NZ"/>
-              </w:rPr>
-              <w:t>time.sleep</w:t>
-            </w:r>
-            <w:proofErr w:type="gramEnd"/>
-            <w:r>
-              <w:rPr>
-                <w:rFonts w:ascii="Consolas" w:eastAsia="Times New Roman" w:hAnsi="Consolas" w:cs="Times New Roman"/>
-                <w:color w:val="CCCCCC"/>
-                <w:sz w:val="21"/>
-                <w:szCs w:val="21"/>
-                <w:lang w:eastAsia="en-NZ"/>
-              </w:rPr>
-              <w:t>(1)</w:t>
+              <w:t>Added time.sleep(1)</w:t>
             </w:r>
           </w:p>
         </w:tc>
@@ -4090,29 +3961,7 @@
                 <w:szCs w:val="21"/>
                 <w:lang w:eastAsia="en-NZ"/>
               </w:rPr>
-              <w:t xml:space="preserve">Removed the code from on key_release that stops the animation code from running and made </w:t>
-            </w:r>
-            <w:proofErr w:type="gramStart"/>
-            <w:r>
-              <w:rPr>
-                <w:rFonts w:ascii="Consolas" w:eastAsia="Times New Roman" w:hAnsi="Consolas" w:cs="Times New Roman"/>
-                <w:color w:val="CCCCCC"/>
-                <w:sz w:val="21"/>
-                <w:szCs w:val="21"/>
-                <w:lang w:eastAsia="en-NZ"/>
-              </w:rPr>
-              <w:t>self.attack</w:t>
-            </w:r>
-            <w:proofErr w:type="gramEnd"/>
-            <w:r>
-              <w:rPr>
-                <w:rFonts w:ascii="Consolas" w:eastAsia="Times New Roman" w:hAnsi="Consolas" w:cs="Times New Roman"/>
-                <w:color w:val="CCCCCC"/>
-                <w:sz w:val="21"/>
-                <w:szCs w:val="21"/>
-                <w:lang w:eastAsia="en-NZ"/>
-              </w:rPr>
-              <w:t xml:space="preserve"> = “” when the animation hd played.</w:t>
+              <w:t>Removed the code from on key_release that stops the animation code from running and made self.attack = “” when the animation hd played.</w:t>
             </w:r>
           </w:p>
         </w:tc>
@@ -4408,20 +4257,8 @@
                 <w:szCs w:val="21"/>
                 <w:lang w:eastAsia="en-NZ"/>
               </w:rPr>
-              <w:t xml:space="preserve">Attack animation repeats when the sprites </w:t>
-            </w:r>
-            <w:proofErr w:type="gramStart"/>
-            <w:r>
-              <w:rPr>
-                <w:rFonts w:ascii="Consolas" w:eastAsia="Times New Roman" w:hAnsi="Consolas" w:cs="Times New Roman"/>
-                <w:color w:val="CCCCCC"/>
-                <w:sz w:val="21"/>
-                <w:szCs w:val="21"/>
-                <w:lang w:eastAsia="en-NZ"/>
-              </w:rPr>
-              <w:t>move</w:t>
-            </w:r>
-            <w:proofErr w:type="gramEnd"/>
+              <w:t>Attack animation repeats when the sprites move</w:t>
+            </w:r>
           </w:p>
           <w:p>
             <w:pPr>
@@ -4435,27 +4272,15 @@
                 <w:lang w:eastAsia="en-NZ"/>
               </w:rPr>
             </w:pPr>
-            <w:proofErr w:type="gramStart"/>
-            <w:r>
-              <w:rPr>
-                <w:rFonts w:ascii="Consolas" w:eastAsia="Times New Roman" w:hAnsi="Consolas" w:cs="Times New Roman"/>
-                <w:color w:val="CCCCCC"/>
-                <w:sz w:val="21"/>
-                <w:szCs w:val="21"/>
-                <w:lang w:eastAsia="en-NZ"/>
-              </w:rPr>
-              <w:t>So</w:t>
-            </w:r>
-            <w:proofErr w:type="gramEnd"/>
-            <w:r>
-              <w:rPr>
-                <w:rFonts w:ascii="Consolas" w:eastAsia="Times New Roman" w:hAnsi="Consolas" w:cs="Times New Roman"/>
-                <w:color w:val="CCCCCC"/>
-                <w:sz w:val="21"/>
-                <w:szCs w:val="21"/>
-                <w:lang w:eastAsia="en-NZ"/>
-              </w:rPr>
-              <w:t xml:space="preserve"> I stopped the enemy sprite movement when attack</w:t>
+            <w:r>
+              <w:rPr>
+                <w:rFonts w:ascii="Consolas" w:eastAsia="Times New Roman" w:hAnsi="Consolas" w:cs="Times New Roman"/>
+                <w:color w:val="CCCCCC"/>
+                <w:sz w:val="21"/>
+                <w:szCs w:val="21"/>
+                <w:lang w:eastAsia="en-NZ"/>
+              </w:rPr>
+              <w:t>So I stopped the enemy sprite movement when attack</w:t>
             </w:r>
           </w:p>
           <w:p>
@@ -4664,15 +4489,7 @@
           </w:tcPr>
           <w:p>
             <w:r>
-              <w:t xml:space="preserve">Animation doesn’t work for </w:t>
-            </w:r>
-            <w:proofErr w:type="gramStart"/>
-            <w:r>
-              <w:t>other</w:t>
-            </w:r>
-            <w:proofErr w:type="gramEnd"/>
-            <w:r>
-              <w:t xml:space="preserve"> enemy sprite</w:t>
+              <w:t>Animation doesn’t work for other enemy sprite</w:t>
             </w:r>
           </w:p>
         </w:tc>
@@ -5553,15 +5370,7 @@
           </w:tcPr>
           <w:p>
             <w:r>
-              <w:t xml:space="preserve">Animation </w:t>
-            </w:r>
-            <w:proofErr w:type="gramStart"/>
-            <w:r>
-              <w:t>is  a</w:t>
-            </w:r>
-            <w:proofErr w:type="gramEnd"/>
-            <w:r>
-              <w:t xml:space="preserve"> bit buggy</w:t>
+              <w:t>Animation is  a bit buggy</w:t>
             </w:r>
           </w:p>
         </w:tc>
@@ -5571,15 +5380,7 @@
           </w:tcPr>
           <w:p>
             <w:r>
-              <w:t xml:space="preserve">Made the normal idle and walking animation only run if </w:t>
-            </w:r>
-            <w:proofErr w:type="gramStart"/>
-            <w:r>
-              <w:t>self.if</w:t>
-            </w:r>
-            <w:proofErr w:type="gramEnd"/>
-            <w:r>
-              <w:t>-hit wasn’t true</w:t>
+              <w:t>Made the normal idle and walking animation only run if self.if-hit wasn’t true</w:t>
             </w:r>
           </w:p>
         </w:tc>
@@ -6247,6 +6048,74 @@
           <w:p>
             <w:r>
               <w:t>Sound plays once when enemy is killed</w:t>
+            </w:r>
+          </w:p>
+        </w:tc>
+        <w:tc>
+          <w:tcPr>
+            <w:tcW w:w="6291" w:type="dxa"/>
+          </w:tcPr>
+          <w:p>
+            <w:r>
+              <w:t>None</w:t>
+            </w:r>
+          </w:p>
+        </w:tc>
+      </w:tr>
+      <w:tr>
+        <w:trPr>
+          <w:gridAfter w:val="1"/>
+          <w:wAfter w:w="936" w:type="dxa"/>
+        </w:trPr>
+        <w:tc>
+          <w:tcPr>
+            <w:tcW w:w="762" w:type="dxa"/>
+          </w:tcPr>
+          <w:p>
+            <w:r>
+              <w:t>1/04</w:t>
+            </w:r>
+          </w:p>
+        </w:tc>
+        <w:tc>
+          <w:tcPr>
+            <w:tcW w:w="2777" w:type="dxa"/>
+            <w:gridSpan w:val="2"/>
+          </w:tcPr>
+          <w:p>
+            <w:r>
+              <w:t>Enemy collisions rewritten code</w:t>
+            </w:r>
+          </w:p>
+        </w:tc>
+        <w:tc>
+          <w:tcPr>
+            <w:tcW w:w="1417" w:type="dxa"/>
+          </w:tcPr>
+          <w:p>
+            <w:r>
+              <w:t>Expected</w:t>
+            </w:r>
+          </w:p>
+        </w:tc>
+        <w:tc>
+          <w:tcPr>
+            <w:tcW w:w="1342" w:type="dxa"/>
+            <w:gridSpan w:val="2"/>
+          </w:tcPr>
+          <w:p>
+            <w:r>
+              <w:t>Standard enemy collision events happen</w:t>
+            </w:r>
+          </w:p>
+        </w:tc>
+        <w:tc>
+          <w:tcPr>
+            <w:tcW w:w="1298" w:type="dxa"/>
+          </w:tcPr>
+          <w:p>
+            <w:r>
+              <w:t>Code works</w:t>
             </w:r>
           </w:p>
         </w:tc>

</xml_diff>

<commit_message>
added key sprite as well as sounds
</commit_message>
<xml_diff>
--- a/documentation/ongoing_testing.docx
+++ b/documentation/ongoing_testing.docx
@@ -112,7 +112,15 @@
           </w:tcPr>
           <w:p>
             <w:r>
-              <w:t>Vs code complains about vstd compression</w:t>
+              <w:t xml:space="preserve">Vs code complains about </w:t>
+            </w:r>
+            <w:proofErr w:type="spellStart"/>
+            <w:r>
+              <w:t>vstd</w:t>
+            </w:r>
+            <w:proofErr w:type="spellEnd"/>
+            <w:r>
+              <w:t xml:space="preserve"> compression</w:t>
             </w:r>
           </w:p>
         </w:tc>
@@ -123,8 +131,13 @@
           </w:tcPr>
           <w:p>
             <w:r>
-              <w:t>Changed compression type to zlib</w:t>
-            </w:r>
+              <w:t xml:space="preserve">Changed compression type to </w:t>
+            </w:r>
+            <w:proofErr w:type="spellStart"/>
+            <w:r>
+              <w:t>zlib</w:t>
+            </w:r>
+            <w:proofErr w:type="spellEnd"/>
           </w:p>
         </w:tc>
       </w:tr>
@@ -354,6 +367,7 @@
                 <w:lang w:eastAsia="en-NZ"/>
               </w:rPr>
             </w:pPr>
+            <w:proofErr w:type="spellStart"/>
             <w:r>
               <w:rPr>
                 <w:rFonts w:ascii="Consolas" w:eastAsia="Times New Roman" w:hAnsi="Consolas" w:cs="Times New Roman"/>
@@ -384,6 +398,7 @@
               </w:rPr>
               <w:t>hit_box</w:t>
             </w:r>
+            <w:proofErr w:type="spellEnd"/>
             <w:r>
               <w:rPr>
                 <w:rFonts w:ascii="Consolas" w:eastAsia="Times New Roman" w:hAnsi="Consolas" w:cs="Times New Roman"/>
@@ -394,6 +409,7 @@
               </w:rPr>
               <w:t xml:space="preserve"> = </w:t>
             </w:r>
+            <w:proofErr w:type="spellStart"/>
             <w:r>
               <w:rPr>
                 <w:rFonts w:ascii="Consolas" w:eastAsia="Times New Roman" w:hAnsi="Consolas" w:cs="Times New Roman"/>
@@ -434,6 +450,7 @@
               </w:rPr>
               <w:t>.hit_box_points</w:t>
             </w:r>
+            <w:proofErr w:type="spellEnd"/>
           </w:p>
           <w:p/>
         </w:tc>
@@ -525,6 +542,8 @@
               </w:rPr>
               <w:t xml:space="preserve">        </w:t>
             </w:r>
+            <w:proofErr w:type="spellStart"/>
+            <w:proofErr w:type="gramStart"/>
             <w:r>
               <w:rPr>
                 <w:rFonts w:ascii="Consolas" w:eastAsia="Times New Roman" w:hAnsi="Consolas" w:cs="Times New Roman"/>
@@ -553,8 +572,20 @@
                 <w:szCs w:val="21"/>
                 <w:lang w:eastAsia="en-NZ"/>
               </w:rPr>
-              <w:t>hitbox_texture</w:t>
-            </w:r>
+              <w:t>hitbox</w:t>
+            </w:r>
+            <w:proofErr w:type="gramEnd"/>
+            <w:r>
+              <w:rPr>
+                <w:rFonts w:ascii="Consolas" w:eastAsia="Times New Roman" w:hAnsi="Consolas" w:cs="Times New Roman"/>
+                <w:color w:val="9CDCFE"/>
+                <w:sz w:val="21"/>
+                <w:szCs w:val="21"/>
+                <w:lang w:eastAsia="en-NZ"/>
+              </w:rPr>
+              <w:t>_texture</w:t>
+            </w:r>
+            <w:proofErr w:type="spellEnd"/>
             <w:r>
               <w:rPr>
                 <w:rFonts w:ascii="Consolas" w:eastAsia="Times New Roman" w:hAnsi="Consolas" w:cs="Times New Roman"/>
@@ -565,6 +596,7 @@
               </w:rPr>
               <w:t xml:space="preserve"> = </w:t>
             </w:r>
+            <w:proofErr w:type="spellStart"/>
             <w:r>
               <w:rPr>
                 <w:rFonts w:ascii="Consolas" w:eastAsia="Times New Roman" w:hAnsi="Consolas" w:cs="Times New Roman"/>
@@ -595,6 +627,7 @@
               </w:rPr>
               <w:t>idle_texture_pair</w:t>
             </w:r>
+            <w:proofErr w:type="spellEnd"/>
             <w:r>
               <w:rPr>
                 <w:rFonts w:ascii="Consolas" w:eastAsia="Times New Roman" w:hAnsi="Consolas" w:cs="Times New Roman"/>
@@ -648,6 +681,7 @@
               </w:rPr>
               <w:t xml:space="preserve">        </w:t>
             </w:r>
+            <w:proofErr w:type="spellStart"/>
             <w:r>
               <w:rPr>
                 <w:rFonts w:ascii="Consolas" w:eastAsia="Times New Roman" w:hAnsi="Consolas" w:cs="Times New Roman"/>
@@ -678,6 +712,7 @@
               </w:rPr>
               <w:t>hit_box</w:t>
             </w:r>
+            <w:proofErr w:type="spellEnd"/>
             <w:r>
               <w:rPr>
                 <w:rFonts w:ascii="Consolas" w:eastAsia="Times New Roman" w:hAnsi="Consolas" w:cs="Times New Roman"/>
@@ -688,6 +723,7 @@
               </w:rPr>
               <w:t xml:space="preserve"> = </w:t>
             </w:r>
+            <w:proofErr w:type="spellStart"/>
             <w:r>
               <w:rPr>
                 <w:rFonts w:ascii="Consolas" w:eastAsia="Times New Roman" w:hAnsi="Consolas" w:cs="Times New Roman"/>
@@ -738,6 +774,7 @@
               </w:rPr>
               <w:t>hit_box_points</w:t>
             </w:r>
+            <w:proofErr w:type="spellEnd"/>
           </w:p>
           <w:p/>
         </w:tc>
@@ -899,7 +936,15 @@
           </w:tcPr>
           <w:p>
             <w:r>
-              <w:t>Called function in on_update function</w:t>
+              <w:t xml:space="preserve">Called function in </w:t>
+            </w:r>
+            <w:proofErr w:type="spellStart"/>
+            <w:r>
+              <w:t>on_update</w:t>
+            </w:r>
+            <w:proofErr w:type="spellEnd"/>
+            <w:r>
+              <w:t xml:space="preserve"> function</w:t>
             </w:r>
           </w:p>
         </w:tc>
@@ -1043,6 +1088,8 @@
               </w:rPr>
               <w:t xml:space="preserve"> </w:t>
             </w:r>
+            <w:proofErr w:type="spellStart"/>
+            <w:proofErr w:type="gramStart"/>
             <w:r>
               <w:rPr>
                 <w:rFonts w:ascii="Consolas" w:eastAsia="Times New Roman" w:hAnsi="Consolas" w:cs="Times New Roman"/>
@@ -1071,8 +1118,20 @@
                 <w:szCs w:val="21"/>
                 <w:lang w:eastAsia="en-NZ"/>
               </w:rPr>
-              <w:t>change_y</w:t>
-            </w:r>
+              <w:t>change</w:t>
+            </w:r>
+            <w:proofErr w:type="gramEnd"/>
+            <w:r>
+              <w:rPr>
+                <w:rFonts w:ascii="Consolas" w:eastAsia="Times New Roman" w:hAnsi="Consolas" w:cs="Times New Roman"/>
+                <w:color w:val="9CDCFE"/>
+                <w:sz w:val="21"/>
+                <w:szCs w:val="21"/>
+                <w:lang w:eastAsia="en-NZ"/>
+              </w:rPr>
+              <w:t>_y</w:t>
+            </w:r>
+            <w:proofErr w:type="spellEnd"/>
             <w:r>
               <w:rPr>
                 <w:rFonts w:ascii="Consolas" w:eastAsia="Times New Roman" w:hAnsi="Consolas" w:cs="Times New Roman"/>
@@ -1146,6 +1205,8 @@
               </w:rPr>
               <w:t xml:space="preserve">            </w:t>
             </w:r>
+            <w:proofErr w:type="spellStart"/>
+            <w:proofErr w:type="gramStart"/>
             <w:r>
               <w:rPr>
                 <w:rFonts w:ascii="Consolas" w:eastAsia="Times New Roman" w:hAnsi="Consolas" w:cs="Times New Roman"/>
@@ -1176,6 +1237,8 @@
               </w:rPr>
               <w:t>texture</w:t>
             </w:r>
+            <w:proofErr w:type="spellEnd"/>
+            <w:proofErr w:type="gramEnd"/>
             <w:r>
               <w:rPr>
                 <w:rFonts w:ascii="Consolas" w:eastAsia="Times New Roman" w:hAnsi="Consolas" w:cs="Times New Roman"/>
@@ -1206,6 +1269,7 @@
               </w:rPr>
               <w:t xml:space="preserve"> </w:t>
             </w:r>
+            <w:proofErr w:type="spellStart"/>
             <w:r>
               <w:rPr>
                 <w:rFonts w:ascii="Consolas" w:eastAsia="Times New Roman" w:hAnsi="Consolas" w:cs="Times New Roman"/>
@@ -1236,6 +1300,7 @@
               </w:rPr>
               <w:t>fall_textures</w:t>
             </w:r>
+            <w:proofErr w:type="spellEnd"/>
             <w:r>
               <w:rPr>
                 <w:rFonts w:ascii="Consolas" w:eastAsia="Times New Roman" w:hAnsi="Consolas" w:cs="Times New Roman"/>
@@ -1266,6 +1331,7 @@
               </w:rPr>
               <w:t>][</w:t>
             </w:r>
+            <w:proofErr w:type="spellStart"/>
             <w:r>
               <w:rPr>
                 <w:rFonts w:ascii="Consolas" w:eastAsia="Times New Roman" w:hAnsi="Consolas" w:cs="Times New Roman"/>
@@ -1296,6 +1362,7 @@
               </w:rPr>
               <w:t>character_face_direction</w:t>
             </w:r>
+            <w:proofErr w:type="spellEnd"/>
             <w:r>
               <w:rPr>
                 <w:rFonts w:ascii="Consolas" w:eastAsia="Times New Roman" w:hAnsi="Consolas" w:cs="Times New Roman"/>
@@ -1349,6 +1416,8 @@
               </w:rPr>
               <w:t xml:space="preserve"> </w:t>
             </w:r>
+            <w:proofErr w:type="spellStart"/>
+            <w:proofErr w:type="gramStart"/>
             <w:r>
               <w:rPr>
                 <w:rFonts w:ascii="Consolas" w:eastAsia="Times New Roman" w:hAnsi="Consolas" w:cs="Times New Roman"/>
@@ -1377,8 +1446,20 @@
                 <w:szCs w:val="21"/>
                 <w:lang w:eastAsia="en-NZ"/>
               </w:rPr>
-              <w:t>change_y</w:t>
-            </w:r>
+              <w:t>change</w:t>
+            </w:r>
+            <w:proofErr w:type="gramEnd"/>
+            <w:r>
+              <w:rPr>
+                <w:rFonts w:ascii="Consolas" w:eastAsia="Times New Roman" w:hAnsi="Consolas" w:cs="Times New Roman"/>
+                <w:color w:val="9CDCFE"/>
+                <w:sz w:val="21"/>
+                <w:szCs w:val="21"/>
+                <w:lang w:eastAsia="en-NZ"/>
+              </w:rPr>
+              <w:t>_y</w:t>
+            </w:r>
+            <w:proofErr w:type="spellEnd"/>
             <w:r>
               <w:rPr>
                 <w:rFonts w:ascii="Consolas" w:eastAsia="Times New Roman" w:hAnsi="Consolas" w:cs="Times New Roman"/>
@@ -1462,6 +1543,8 @@
               </w:rPr>
               <w:t xml:space="preserve">            </w:t>
             </w:r>
+            <w:proofErr w:type="spellStart"/>
+            <w:proofErr w:type="gramStart"/>
             <w:r>
               <w:rPr>
                 <w:rFonts w:ascii="Consolas" w:eastAsia="Times New Roman" w:hAnsi="Consolas" w:cs="Times New Roman"/>
@@ -1492,6 +1575,8 @@
               </w:rPr>
               <w:t>texture</w:t>
             </w:r>
+            <w:proofErr w:type="spellEnd"/>
+            <w:proofErr w:type="gramEnd"/>
             <w:r>
               <w:rPr>
                 <w:rFonts w:ascii="Consolas" w:eastAsia="Times New Roman" w:hAnsi="Consolas" w:cs="Times New Roman"/>
@@ -1522,6 +1607,7 @@
               </w:rPr>
               <w:t xml:space="preserve"> </w:t>
             </w:r>
+            <w:proofErr w:type="spellStart"/>
             <w:r>
               <w:rPr>
                 <w:rFonts w:ascii="Consolas" w:eastAsia="Times New Roman" w:hAnsi="Consolas" w:cs="Times New Roman"/>
@@ -1552,6 +1638,7 @@
               </w:rPr>
               <w:t>fall_textures</w:t>
             </w:r>
+            <w:proofErr w:type="spellEnd"/>
             <w:r>
               <w:rPr>
                 <w:rFonts w:ascii="Consolas" w:eastAsia="Times New Roman" w:hAnsi="Consolas" w:cs="Times New Roman"/>
@@ -1582,6 +1669,7 @@
               </w:rPr>
               <w:t>][</w:t>
             </w:r>
+            <w:proofErr w:type="spellStart"/>
             <w:r>
               <w:rPr>
                 <w:rFonts w:ascii="Consolas" w:eastAsia="Times New Roman" w:hAnsi="Consolas" w:cs="Times New Roman"/>
@@ -1612,6 +1700,7 @@
               </w:rPr>
               <w:t>character_face_direction</w:t>
             </w:r>
+            <w:proofErr w:type="spellEnd"/>
             <w:r>
               <w:rPr>
                 <w:rFonts w:ascii="Consolas" w:eastAsia="Times New Roman" w:hAnsi="Consolas" w:cs="Times New Roman"/>
@@ -2260,7 +2349,63 @@
                 <w:szCs w:val="21"/>
                 <w:lang w:eastAsia="en-NZ"/>
               </w:rPr>
-              <w:t>Changed code from self.change_x to self.center += x</w:t>
+              <w:t xml:space="preserve">Changed code from </w:t>
+            </w:r>
+            <w:proofErr w:type="spellStart"/>
+            <w:proofErr w:type="gramStart"/>
+            <w:r>
+              <w:rPr>
+                <w:rFonts w:ascii="Consolas" w:eastAsia="Times New Roman" w:hAnsi="Consolas" w:cs="Times New Roman"/>
+                <w:color w:val="CCCCCC"/>
+                <w:sz w:val="21"/>
+                <w:szCs w:val="21"/>
+                <w:lang w:eastAsia="en-NZ"/>
+              </w:rPr>
+              <w:t>self.change</w:t>
+            </w:r>
+            <w:proofErr w:type="gramEnd"/>
+            <w:r>
+              <w:rPr>
+                <w:rFonts w:ascii="Consolas" w:eastAsia="Times New Roman" w:hAnsi="Consolas" w:cs="Times New Roman"/>
+                <w:color w:val="CCCCCC"/>
+                <w:sz w:val="21"/>
+                <w:szCs w:val="21"/>
+                <w:lang w:eastAsia="en-NZ"/>
+              </w:rPr>
+              <w:t>_x</w:t>
+            </w:r>
+            <w:proofErr w:type="spellEnd"/>
+            <w:r>
+              <w:rPr>
+                <w:rFonts w:ascii="Consolas" w:eastAsia="Times New Roman" w:hAnsi="Consolas" w:cs="Times New Roman"/>
+                <w:color w:val="CCCCCC"/>
+                <w:sz w:val="21"/>
+                <w:szCs w:val="21"/>
+                <w:lang w:eastAsia="en-NZ"/>
+              </w:rPr>
+              <w:t xml:space="preserve"> to </w:t>
+            </w:r>
+            <w:proofErr w:type="spellStart"/>
+            <w:r>
+              <w:rPr>
+                <w:rFonts w:ascii="Consolas" w:eastAsia="Times New Roman" w:hAnsi="Consolas" w:cs="Times New Roman"/>
+                <w:color w:val="CCCCCC"/>
+                <w:sz w:val="21"/>
+                <w:szCs w:val="21"/>
+                <w:lang w:eastAsia="en-NZ"/>
+              </w:rPr>
+              <w:t>self.center</w:t>
+            </w:r>
+            <w:proofErr w:type="spellEnd"/>
+            <w:r>
+              <w:rPr>
+                <w:rFonts w:ascii="Consolas" w:eastAsia="Times New Roman" w:hAnsi="Consolas" w:cs="Times New Roman"/>
+                <w:color w:val="CCCCCC"/>
+                <w:sz w:val="21"/>
+                <w:szCs w:val="21"/>
+                <w:lang w:eastAsia="en-NZ"/>
+              </w:rPr>
+              <w:t xml:space="preserve"> += x</w:t>
             </w:r>
           </w:p>
         </w:tc>
@@ -2306,8 +2451,13 @@
           </w:tcPr>
           <w:p>
             <w:r>
-              <w:t>Enemy sprites moves</w:t>
-            </w:r>
+              <w:t xml:space="preserve">Enemy sprites </w:t>
+            </w:r>
+            <w:proofErr w:type="gramStart"/>
+            <w:r>
+              <w:t>moves</w:t>
+            </w:r>
+            <w:proofErr w:type="gramEnd"/>
           </w:p>
         </w:tc>
         <w:tc>
@@ -2361,8 +2511,13 @@
           </w:tcPr>
           <w:p>
             <w:r>
-              <w:t>Enemy sprite movment</w:t>
-            </w:r>
+              <w:t xml:space="preserve">Enemy sprite </w:t>
+            </w:r>
+            <w:proofErr w:type="spellStart"/>
+            <w:r>
+              <w:t>movment</w:t>
+            </w:r>
+            <w:proofErr w:type="spellEnd"/>
           </w:p>
         </w:tc>
         <w:tc>
@@ -2371,7 +2526,15 @@
           </w:tcPr>
           <w:p>
             <w:r>
-              <w:t xml:space="preserve">Enemy enemy sprites make small movements left and right and jump </w:t>
+              <w:t xml:space="preserve">Enemy </w:t>
+            </w:r>
+            <w:proofErr w:type="spellStart"/>
+            <w:r>
+              <w:t>enemy</w:t>
+            </w:r>
+            <w:proofErr w:type="spellEnd"/>
+            <w:r>
+              <w:t xml:space="preserve"> sprites make small movements left and right and jump </w:t>
             </w:r>
           </w:p>
         </w:tc>
@@ -2553,6 +2716,7 @@
                 <w:lang w:eastAsia="en-NZ"/>
               </w:rPr>
             </w:pPr>
+            <w:proofErr w:type="spellStart"/>
             <w:r>
               <w:rPr>
                 <w:rFonts w:ascii="Consolas" w:eastAsia="Times New Roman" w:hAnsi="Consolas" w:cs="Times New Roman"/>
@@ -2563,6 +2727,7 @@
               </w:rPr>
               <w:t>elif</w:t>
             </w:r>
+            <w:proofErr w:type="spellEnd"/>
             <w:r>
               <w:rPr>
                 <w:rFonts w:ascii="Consolas" w:eastAsia="Times New Roman" w:hAnsi="Consolas" w:cs="Times New Roman"/>
@@ -2573,6 +2738,8 @@
               </w:rPr>
               <w:t xml:space="preserve"> </w:t>
             </w:r>
+            <w:proofErr w:type="spellStart"/>
+            <w:proofErr w:type="gramStart"/>
             <w:r>
               <w:rPr>
                 <w:rFonts w:ascii="Consolas" w:eastAsia="Times New Roman" w:hAnsi="Consolas" w:cs="Times New Roman"/>
@@ -2603,6 +2770,8 @@
               </w:rPr>
               <w:t>direction</w:t>
             </w:r>
+            <w:proofErr w:type="spellEnd"/>
+            <w:proofErr w:type="gramEnd"/>
             <w:r>
               <w:rPr>
                 <w:rFonts w:ascii="Consolas" w:eastAsia="Times New Roman" w:hAnsi="Consolas" w:cs="Times New Roman"/>
@@ -2676,6 +2845,8 @@
               </w:rPr>
               <w:t xml:space="preserve">            </w:t>
             </w:r>
+            <w:proofErr w:type="spellStart"/>
+            <w:proofErr w:type="gramStart"/>
             <w:r>
               <w:rPr>
                 <w:rFonts w:ascii="Consolas" w:eastAsia="Times New Roman" w:hAnsi="Consolas" w:cs="Times New Roman"/>
@@ -2704,8 +2875,20 @@
                 <w:szCs w:val="21"/>
                 <w:lang w:eastAsia="en-NZ"/>
               </w:rPr>
-              <w:t>change_x</w:t>
-            </w:r>
+              <w:t>change</w:t>
+            </w:r>
+            <w:proofErr w:type="gramEnd"/>
+            <w:r>
+              <w:rPr>
+                <w:rFonts w:ascii="Consolas" w:eastAsia="Times New Roman" w:hAnsi="Consolas" w:cs="Times New Roman"/>
+                <w:color w:val="9CDCFE"/>
+                <w:sz w:val="21"/>
+                <w:szCs w:val="21"/>
+                <w:lang w:eastAsia="en-NZ"/>
+              </w:rPr>
+              <w:t>_x</w:t>
+            </w:r>
+            <w:proofErr w:type="spellEnd"/>
             <w:r>
               <w:rPr>
                 <w:rFonts w:ascii="Consolas" w:eastAsia="Times New Roman" w:hAnsi="Consolas" w:cs="Times New Roman"/>
@@ -2879,6 +3062,7 @@
                 <w:lang w:eastAsia="en-NZ"/>
               </w:rPr>
             </w:pPr>
+            <w:proofErr w:type="gramStart"/>
             <w:r>
               <w:rPr>
                 <w:rFonts w:ascii="Consolas" w:eastAsia="Times New Roman" w:hAnsi="Consolas" w:cs="Times New Roman"/>
@@ -2887,7 +3071,62 @@
                 <w:szCs w:val="21"/>
                 <w:lang w:eastAsia="en-NZ"/>
               </w:rPr>
-              <w:t>Changed .change_x -= 3 to  .change_x = -3</w:t>
+              <w:t>Changed .</w:t>
+            </w:r>
+            <w:proofErr w:type="spellStart"/>
+            <w:r>
+              <w:rPr>
+                <w:rFonts w:ascii="Consolas" w:eastAsia="Times New Roman" w:hAnsi="Consolas" w:cs="Times New Roman"/>
+                <w:color w:val="C586C0"/>
+                <w:sz w:val="21"/>
+                <w:szCs w:val="21"/>
+                <w:lang w:eastAsia="en-NZ"/>
+              </w:rPr>
+              <w:t>change</w:t>
+            </w:r>
+            <w:proofErr w:type="gramEnd"/>
+            <w:r>
+              <w:rPr>
+                <w:rFonts w:ascii="Consolas" w:eastAsia="Times New Roman" w:hAnsi="Consolas" w:cs="Times New Roman"/>
+                <w:color w:val="C586C0"/>
+                <w:sz w:val="21"/>
+                <w:szCs w:val="21"/>
+                <w:lang w:eastAsia="en-NZ"/>
+              </w:rPr>
+              <w:t>_x</w:t>
+            </w:r>
+            <w:proofErr w:type="spellEnd"/>
+            <w:r>
+              <w:rPr>
+                <w:rFonts w:ascii="Consolas" w:eastAsia="Times New Roman" w:hAnsi="Consolas" w:cs="Times New Roman"/>
+                <w:color w:val="C586C0"/>
+                <w:sz w:val="21"/>
+                <w:szCs w:val="21"/>
+                <w:lang w:eastAsia="en-NZ"/>
+              </w:rPr>
+              <w:t xml:space="preserve"> -= 3 to  .</w:t>
+            </w:r>
+            <w:proofErr w:type="spellStart"/>
+            <w:r>
+              <w:rPr>
+                <w:rFonts w:ascii="Consolas" w:eastAsia="Times New Roman" w:hAnsi="Consolas" w:cs="Times New Roman"/>
+                <w:color w:val="C586C0"/>
+                <w:sz w:val="21"/>
+                <w:szCs w:val="21"/>
+                <w:lang w:eastAsia="en-NZ"/>
+              </w:rPr>
+              <w:t>change_x</w:t>
+            </w:r>
+            <w:proofErr w:type="spellEnd"/>
+            <w:r>
+              <w:rPr>
+                <w:rFonts w:ascii="Consolas" w:eastAsia="Times New Roman" w:hAnsi="Consolas" w:cs="Times New Roman"/>
+                <w:color w:val="C586C0"/>
+                <w:sz w:val="21"/>
+                <w:szCs w:val="21"/>
+                <w:lang w:eastAsia="en-NZ"/>
+              </w:rPr>
+              <w:t xml:space="preserve"> = -3</w:t>
             </w:r>
           </w:p>
         </w:tc>
@@ -3114,6 +3353,7 @@
               </w:rPr>
               <w:t> </w:t>
             </w:r>
+            <w:proofErr w:type="spellStart"/>
             <w:r>
               <w:rPr>
                 <w:rFonts w:ascii="Consolas" w:eastAsia="Times New Roman" w:hAnsi="Consolas" w:cs="Times New Roman"/>
@@ -3124,6 +3364,7 @@
               </w:rPr>
               <w:t>elif</w:t>
             </w:r>
+            <w:proofErr w:type="spellEnd"/>
             <w:r>
               <w:rPr>
                 <w:rFonts w:ascii="Consolas" w:eastAsia="Times New Roman" w:hAnsi="Consolas" w:cs="Times New Roman"/>
@@ -3174,6 +3415,8 @@
               </w:rPr>
               <w:t xml:space="preserve"> </w:t>
             </w:r>
+            <w:proofErr w:type="spellStart"/>
+            <w:proofErr w:type="gramStart"/>
             <w:r>
               <w:rPr>
                 <w:rFonts w:ascii="Consolas" w:eastAsia="Times New Roman" w:hAnsi="Consolas" w:cs="Times New Roman"/>
@@ -3224,6 +3467,8 @@
               </w:rPr>
               <w:t>SPACE</w:t>
             </w:r>
+            <w:proofErr w:type="spellEnd"/>
+            <w:proofErr w:type="gramEnd"/>
             <w:r>
               <w:rPr>
                 <w:rFonts w:ascii="Consolas" w:eastAsia="Times New Roman" w:hAnsi="Consolas" w:cs="Times New Roman"/>
@@ -3257,6 +3502,8 @@
               </w:rPr>
               <w:t>   </w:t>
             </w:r>
+            <w:proofErr w:type="spellStart"/>
+            <w:proofErr w:type="gramStart"/>
             <w:r>
               <w:rPr>
                 <w:rFonts w:ascii="Consolas" w:eastAsia="Times New Roman" w:hAnsi="Consolas" w:cs="Times New Roman"/>
@@ -3285,7 +3532,18 @@
                 <w:szCs w:val="21"/>
                 <w:lang w:eastAsia="en-NZ"/>
               </w:rPr>
-              <w:t>enemy_sprite</w:t>
+              <w:t>enemy</w:t>
+            </w:r>
+            <w:proofErr w:type="gramEnd"/>
+            <w:r>
+              <w:rPr>
+                <w:rFonts w:ascii="Consolas" w:eastAsia="Times New Roman" w:hAnsi="Consolas" w:cs="Times New Roman"/>
+                <w:color w:val="9CDCFE"/>
+                <w:sz w:val="21"/>
+                <w:szCs w:val="21"/>
+                <w:lang w:eastAsia="en-NZ"/>
+              </w:rPr>
+              <w:t>_sprite</w:t>
             </w:r>
             <w:r>
               <w:rPr>
@@ -3307,6 +3565,7 @@
               </w:rPr>
               <w:t>attack</w:t>
             </w:r>
+            <w:proofErr w:type="spellEnd"/>
             <w:r>
               <w:rPr>
                 <w:rFonts w:ascii="Consolas" w:eastAsia="Times New Roman" w:hAnsi="Consolas" w:cs="Times New Roman"/>
@@ -3433,7 +3692,31 @@
                 <w:szCs w:val="21"/>
                 <w:lang w:eastAsia="en-NZ"/>
               </w:rPr>
-              <w:t>Added time.sleep(1)</w:t>
+              <w:t xml:space="preserve">Added </w:t>
+            </w:r>
+            <w:proofErr w:type="spellStart"/>
+            <w:proofErr w:type="gramStart"/>
+            <w:r>
+              <w:rPr>
+                <w:rFonts w:ascii="Consolas" w:eastAsia="Times New Roman" w:hAnsi="Consolas" w:cs="Times New Roman"/>
+                <w:color w:val="CCCCCC"/>
+                <w:sz w:val="21"/>
+                <w:szCs w:val="21"/>
+                <w:lang w:eastAsia="en-NZ"/>
+              </w:rPr>
+              <w:t>time.sleep</w:t>
+            </w:r>
+            <w:proofErr w:type="spellEnd"/>
+            <w:proofErr w:type="gramEnd"/>
+            <w:r>
+              <w:rPr>
+                <w:rFonts w:ascii="Consolas" w:eastAsia="Times New Roman" w:hAnsi="Consolas" w:cs="Times New Roman"/>
+                <w:color w:val="CCCCCC"/>
+                <w:sz w:val="21"/>
+                <w:szCs w:val="21"/>
+                <w:lang w:eastAsia="en-NZ"/>
+              </w:rPr>
+              <w:t>(1)</w:t>
             </w:r>
           </w:p>
         </w:tc>
@@ -3626,7 +3909,51 @@
                 <w:szCs w:val="21"/>
                 <w:lang w:eastAsia="en-NZ"/>
               </w:rPr>
-              <w:t>Reset self.cur_texture when self attack == “attack</w:t>
+              <w:t xml:space="preserve">Reset </w:t>
+            </w:r>
+            <w:proofErr w:type="spellStart"/>
+            <w:r>
+              <w:rPr>
+                <w:rFonts w:ascii="Consolas" w:eastAsia="Times New Roman" w:hAnsi="Consolas" w:cs="Times New Roman"/>
+                <w:color w:val="CCCCCC"/>
+                <w:sz w:val="21"/>
+                <w:szCs w:val="21"/>
+                <w:lang w:eastAsia="en-NZ"/>
+              </w:rPr>
+              <w:t>self.cur_texture</w:t>
+            </w:r>
+            <w:proofErr w:type="spellEnd"/>
+            <w:r>
+              <w:rPr>
+                <w:rFonts w:ascii="Consolas" w:eastAsia="Times New Roman" w:hAnsi="Consolas" w:cs="Times New Roman"/>
+                <w:color w:val="CCCCCC"/>
+                <w:sz w:val="21"/>
+                <w:szCs w:val="21"/>
+                <w:lang w:eastAsia="en-NZ"/>
+              </w:rPr>
+              <w:t xml:space="preserve"> when </w:t>
+            </w:r>
+            <w:proofErr w:type="spellStart"/>
+            <w:r>
+              <w:rPr>
+                <w:rFonts w:ascii="Consolas" w:eastAsia="Times New Roman" w:hAnsi="Consolas" w:cs="Times New Roman"/>
+                <w:color w:val="CCCCCC"/>
+                <w:sz w:val="21"/>
+                <w:szCs w:val="21"/>
+                <w:lang w:eastAsia="en-NZ"/>
+              </w:rPr>
+              <w:t>self attack</w:t>
+            </w:r>
+            <w:proofErr w:type="spellEnd"/>
+            <w:r>
+              <w:rPr>
+                <w:rFonts w:ascii="Consolas" w:eastAsia="Times New Roman" w:hAnsi="Consolas" w:cs="Times New Roman"/>
+                <w:color w:val="CCCCCC"/>
+                <w:sz w:val="21"/>
+                <w:szCs w:val="21"/>
+                <w:lang w:eastAsia="en-NZ"/>
+              </w:rPr>
+              <w:t xml:space="preserve"> == “attack</w:t>
             </w:r>
           </w:p>
         </w:tc>
@@ -3671,8 +3998,13 @@
             <w:gridSpan w:val="2"/>
           </w:tcPr>
           <w:p>
-            <w:r>
-              <w:t>Self.cur_texture is not being updated</w:t>
+            <w:proofErr w:type="spellStart"/>
+            <w:r>
+              <w:t>Self.cur_texture</w:t>
+            </w:r>
+            <w:proofErr w:type="spellEnd"/>
+            <w:r>
+              <w:t xml:space="preserve"> is not being updated</w:t>
             </w:r>
           </w:p>
         </w:tc>
@@ -3961,7 +4293,75 @@
                 <w:szCs w:val="21"/>
                 <w:lang w:eastAsia="en-NZ"/>
               </w:rPr>
-              <w:t>Removed the code from on key_release that stops the animation code from running and made self.attack = “” when the animation hd played.</w:t>
+              <w:t xml:space="preserve">Removed the code from on </w:t>
+            </w:r>
+            <w:proofErr w:type="spellStart"/>
+            <w:r>
+              <w:rPr>
+                <w:rFonts w:ascii="Consolas" w:eastAsia="Times New Roman" w:hAnsi="Consolas" w:cs="Times New Roman"/>
+                <w:color w:val="CCCCCC"/>
+                <w:sz w:val="21"/>
+                <w:szCs w:val="21"/>
+                <w:lang w:eastAsia="en-NZ"/>
+              </w:rPr>
+              <w:t>key_release</w:t>
+            </w:r>
+            <w:proofErr w:type="spellEnd"/>
+            <w:r>
+              <w:rPr>
+                <w:rFonts w:ascii="Consolas" w:eastAsia="Times New Roman" w:hAnsi="Consolas" w:cs="Times New Roman"/>
+                <w:color w:val="CCCCCC"/>
+                <w:sz w:val="21"/>
+                <w:szCs w:val="21"/>
+                <w:lang w:eastAsia="en-NZ"/>
+              </w:rPr>
+              <w:t xml:space="preserve"> that stops the animation code from running and made </w:t>
+            </w:r>
+            <w:proofErr w:type="spellStart"/>
+            <w:proofErr w:type="gramStart"/>
+            <w:r>
+              <w:rPr>
+                <w:rFonts w:ascii="Consolas" w:eastAsia="Times New Roman" w:hAnsi="Consolas" w:cs="Times New Roman"/>
+                <w:color w:val="CCCCCC"/>
+                <w:sz w:val="21"/>
+                <w:szCs w:val="21"/>
+                <w:lang w:eastAsia="en-NZ"/>
+              </w:rPr>
+              <w:t>self.attack</w:t>
+            </w:r>
+            <w:proofErr w:type="spellEnd"/>
+            <w:proofErr w:type="gramEnd"/>
+            <w:r>
+              <w:rPr>
+                <w:rFonts w:ascii="Consolas" w:eastAsia="Times New Roman" w:hAnsi="Consolas" w:cs="Times New Roman"/>
+                <w:color w:val="CCCCCC"/>
+                <w:sz w:val="21"/>
+                <w:szCs w:val="21"/>
+                <w:lang w:eastAsia="en-NZ"/>
+              </w:rPr>
+              <w:t xml:space="preserve"> = “” when the animation </w:t>
+            </w:r>
+            <w:proofErr w:type="spellStart"/>
+            <w:r>
+              <w:rPr>
+                <w:rFonts w:ascii="Consolas" w:eastAsia="Times New Roman" w:hAnsi="Consolas" w:cs="Times New Roman"/>
+                <w:color w:val="CCCCCC"/>
+                <w:sz w:val="21"/>
+                <w:szCs w:val="21"/>
+                <w:lang w:eastAsia="en-NZ"/>
+              </w:rPr>
+              <w:t>hd</w:t>
+            </w:r>
+            <w:proofErr w:type="spellEnd"/>
+            <w:r>
+              <w:rPr>
+                <w:rFonts w:ascii="Consolas" w:eastAsia="Times New Roman" w:hAnsi="Consolas" w:cs="Times New Roman"/>
+                <w:color w:val="CCCCCC"/>
+                <w:sz w:val="21"/>
+                <w:szCs w:val="21"/>
+                <w:lang w:eastAsia="en-NZ"/>
+              </w:rPr>
+              <w:t xml:space="preserve"> played.</w:t>
             </w:r>
           </w:p>
         </w:tc>
@@ -4257,8 +4657,20 @@
                 <w:szCs w:val="21"/>
                 <w:lang w:eastAsia="en-NZ"/>
               </w:rPr>
-              <w:t>Attack animation repeats when the sprites move</w:t>
-            </w:r>
+              <w:t xml:space="preserve">Attack animation repeats when the sprites </w:t>
+            </w:r>
+            <w:proofErr w:type="gramStart"/>
+            <w:r>
+              <w:rPr>
+                <w:rFonts w:ascii="Consolas" w:eastAsia="Times New Roman" w:hAnsi="Consolas" w:cs="Times New Roman"/>
+                <w:color w:val="CCCCCC"/>
+                <w:sz w:val="21"/>
+                <w:szCs w:val="21"/>
+                <w:lang w:eastAsia="en-NZ"/>
+              </w:rPr>
+              <w:t>move</w:t>
+            </w:r>
+            <w:proofErr w:type="gramEnd"/>
           </w:p>
           <w:p>
             <w:pPr>
@@ -4272,15 +4684,27 @@
                 <w:lang w:eastAsia="en-NZ"/>
               </w:rPr>
             </w:pPr>
-            <w:r>
-              <w:rPr>
-                <w:rFonts w:ascii="Consolas" w:eastAsia="Times New Roman" w:hAnsi="Consolas" w:cs="Times New Roman"/>
-                <w:color w:val="CCCCCC"/>
-                <w:sz w:val="21"/>
-                <w:szCs w:val="21"/>
-                <w:lang w:eastAsia="en-NZ"/>
-              </w:rPr>
-              <w:t>So I stopped the enemy sprite movement when attack</w:t>
+            <w:proofErr w:type="gramStart"/>
+            <w:r>
+              <w:rPr>
+                <w:rFonts w:ascii="Consolas" w:eastAsia="Times New Roman" w:hAnsi="Consolas" w:cs="Times New Roman"/>
+                <w:color w:val="CCCCCC"/>
+                <w:sz w:val="21"/>
+                <w:szCs w:val="21"/>
+                <w:lang w:eastAsia="en-NZ"/>
+              </w:rPr>
+              <w:t>So</w:t>
+            </w:r>
+            <w:proofErr w:type="gramEnd"/>
+            <w:r>
+              <w:rPr>
+                <w:rFonts w:ascii="Consolas" w:eastAsia="Times New Roman" w:hAnsi="Consolas" w:cs="Times New Roman"/>
+                <w:color w:val="CCCCCC"/>
+                <w:sz w:val="21"/>
+                <w:szCs w:val="21"/>
+                <w:lang w:eastAsia="en-NZ"/>
+              </w:rPr>
+              <w:t xml:space="preserve"> I stopped the enemy sprite movement when attack</w:t>
             </w:r>
           </w:p>
           <w:p>
@@ -4489,7 +4913,15 @@
           </w:tcPr>
           <w:p>
             <w:r>
-              <w:t>Animation doesn’t work for other enemy sprite</w:t>
+              <w:t xml:space="preserve">Animation doesn’t work for </w:t>
+            </w:r>
+            <w:proofErr w:type="gramStart"/>
+            <w:r>
+              <w:t>other</w:t>
+            </w:r>
+            <w:proofErr w:type="gramEnd"/>
+            <w:r>
+              <w:t xml:space="preserve"> enemy sprite</w:t>
             </w:r>
           </w:p>
         </w:tc>
@@ -4957,8 +5389,13 @@
           </w:tcPr>
           <w:p>
             <w:r>
-              <w:t>Defined self in init</w:t>
-            </w:r>
+              <w:t xml:space="preserve">Defined self in </w:t>
+            </w:r>
+            <w:proofErr w:type="spellStart"/>
+            <w:r>
+              <w:t>init</w:t>
+            </w:r>
+            <w:proofErr w:type="spellEnd"/>
           </w:p>
         </w:tc>
       </w:tr>
@@ -5370,7 +5807,15 @@
           </w:tcPr>
           <w:p>
             <w:r>
-              <w:t>Animation is  a bit buggy</w:t>
+              <w:t xml:space="preserve">Animation </w:t>
+            </w:r>
+            <w:proofErr w:type="gramStart"/>
+            <w:r>
+              <w:t>is  a</w:t>
+            </w:r>
+            <w:proofErr w:type="gramEnd"/>
+            <w:r>
+              <w:t xml:space="preserve"> bit buggy</w:t>
             </w:r>
           </w:p>
         </w:tc>
@@ -5380,7 +5825,17 @@
           </w:tcPr>
           <w:p>
             <w:r>
-              <w:t>Made the normal idle and walking animation only run if self.if-hit wasn’t true</w:t>
+              <w:t xml:space="preserve">Made the normal idle and walking animation only run if </w:t>
+            </w:r>
+            <w:proofErr w:type="spellStart"/>
+            <w:proofErr w:type="gramStart"/>
+            <w:r>
+              <w:t>self.if</w:t>
+            </w:r>
+            <w:proofErr w:type="spellEnd"/>
+            <w:proofErr w:type="gramEnd"/>
+            <w:r>
+              <w:t>-hit wasn’t true</w:t>
             </w:r>
           </w:p>
         </w:tc>
@@ -6128,6 +6583,493 @@
               <w:t>None</w:t>
             </w:r>
           </w:p>
+        </w:tc>
+      </w:tr>
+      <w:tr>
+        <w:trPr>
+          <w:gridAfter w:val="1"/>
+          <w:wAfter w:w="936" w:type="dxa"/>
+        </w:trPr>
+        <w:tc>
+          <w:tcPr>
+            <w:tcW w:w="762" w:type="dxa"/>
+          </w:tcPr>
+          <w:p>
+            <w:r>
+              <w:t>1/04</w:t>
+            </w:r>
+          </w:p>
+        </w:tc>
+        <w:tc>
+          <w:tcPr>
+            <w:tcW w:w="2777" w:type="dxa"/>
+            <w:gridSpan w:val="2"/>
+          </w:tcPr>
+          <w:p>
+            <w:r>
+              <w:t>Enemy hit animation</w:t>
+            </w:r>
+          </w:p>
+        </w:tc>
+        <w:tc>
+          <w:tcPr>
+            <w:tcW w:w="1417" w:type="dxa"/>
+          </w:tcPr>
+          <w:p>
+            <w:r>
+              <w:t>Expected</w:t>
+            </w:r>
+          </w:p>
+        </w:tc>
+        <w:tc>
+          <w:tcPr>
+            <w:tcW w:w="1342" w:type="dxa"/>
+            <w:gridSpan w:val="2"/>
+          </w:tcPr>
+          <w:p>
+            <w:r>
+              <w:t>Animation plays when enemy is hit</w:t>
+            </w:r>
+          </w:p>
+        </w:tc>
+        <w:tc>
+          <w:tcPr>
+            <w:tcW w:w="1298" w:type="dxa"/>
+          </w:tcPr>
+          <w:p>
+            <w:r>
+              <w:t>Animation is permanent</w:t>
+            </w:r>
+          </w:p>
+        </w:tc>
+        <w:tc>
+          <w:tcPr>
+            <w:tcW w:w="6291" w:type="dxa"/>
+          </w:tcPr>
+          <w:p>
+            <w:r>
+              <w:t xml:space="preserve">Set </w:t>
+            </w:r>
+            <w:proofErr w:type="spellStart"/>
+            <w:r>
+              <w:t>if_hit</w:t>
+            </w:r>
+            <w:proofErr w:type="spellEnd"/>
+            <w:r>
+              <w:t xml:space="preserve"> variable to false after texture is et</w:t>
+            </w:r>
+          </w:p>
+        </w:tc>
+      </w:tr>
+      <w:tr>
+        <w:trPr>
+          <w:gridAfter w:val="1"/>
+          <w:wAfter w:w="936" w:type="dxa"/>
+        </w:trPr>
+        <w:tc>
+          <w:tcPr>
+            <w:tcW w:w="762" w:type="dxa"/>
+          </w:tcPr>
+          <w:p>
+            <w:r>
+              <w:t>1/04</w:t>
+            </w:r>
+          </w:p>
+        </w:tc>
+        <w:tc>
+          <w:tcPr>
+            <w:tcW w:w="2777" w:type="dxa"/>
+            <w:gridSpan w:val="2"/>
+          </w:tcPr>
+          <w:p>
+            <w:r>
+              <w:t>Enemy hit animation</w:t>
+            </w:r>
+          </w:p>
+        </w:tc>
+        <w:tc>
+          <w:tcPr>
+            <w:tcW w:w="1417" w:type="dxa"/>
+          </w:tcPr>
+          <w:p>
+            <w:r>
+              <w:t>Expected</w:t>
+            </w:r>
+          </w:p>
+        </w:tc>
+        <w:tc>
+          <w:tcPr>
+            <w:tcW w:w="1342" w:type="dxa"/>
+            <w:gridSpan w:val="2"/>
+          </w:tcPr>
+          <w:p>
+            <w:r>
+              <w:t>Animation plays when enemy is hit</w:t>
+            </w:r>
+          </w:p>
+        </w:tc>
+        <w:tc>
+          <w:tcPr>
+            <w:tcW w:w="1298" w:type="dxa"/>
+          </w:tcPr>
+          <w:p>
+            <w:r>
+              <w:t xml:space="preserve">Animation </w:t>
+            </w:r>
+            <w:r>
+              <w:t>works as intended</w:t>
+            </w:r>
+          </w:p>
+        </w:tc>
+        <w:tc>
+          <w:tcPr>
+            <w:tcW w:w="6291" w:type="dxa"/>
+          </w:tcPr>
+          <w:p>
+            <w:r>
+              <w:t>None</w:t>
+            </w:r>
+          </w:p>
+        </w:tc>
+      </w:tr>
+      <w:tr>
+        <w:trPr>
+          <w:gridAfter w:val="1"/>
+          <w:wAfter w:w="936" w:type="dxa"/>
+        </w:trPr>
+        <w:tc>
+          <w:tcPr>
+            <w:tcW w:w="762" w:type="dxa"/>
+          </w:tcPr>
+          <w:p>
+            <w:r>
+              <w:t>1/04</w:t>
+            </w:r>
+          </w:p>
+        </w:tc>
+        <w:tc>
+          <w:tcPr>
+            <w:tcW w:w="2777" w:type="dxa"/>
+            <w:gridSpan w:val="2"/>
+          </w:tcPr>
+          <w:p>
+            <w:r>
+              <w:t>Enemy death animation</w:t>
+            </w:r>
+          </w:p>
+        </w:tc>
+        <w:tc>
+          <w:tcPr>
+            <w:tcW w:w="1417" w:type="dxa"/>
+          </w:tcPr>
+          <w:p>
+            <w:r>
+              <w:t>Expected</w:t>
+            </w:r>
+          </w:p>
+        </w:tc>
+        <w:tc>
+          <w:tcPr>
+            <w:tcW w:w="1342" w:type="dxa"/>
+            <w:gridSpan w:val="2"/>
+          </w:tcPr>
+          <w:p>
+            <w:r>
+              <w:t>Animation doesn’t loop when enemy is killed</w:t>
+            </w:r>
+          </w:p>
+        </w:tc>
+        <w:tc>
+          <w:tcPr>
+            <w:tcW w:w="1298" w:type="dxa"/>
+          </w:tcPr>
+          <w:p>
+            <w:r>
+              <w:t>Animation doesn’t look when enemy is killed</w:t>
+            </w:r>
+          </w:p>
+        </w:tc>
+        <w:tc>
+          <w:tcPr>
+            <w:tcW w:w="6291" w:type="dxa"/>
+          </w:tcPr>
+          <w:p>
+            <w:r>
+              <w:t>None</w:t>
+            </w:r>
+          </w:p>
+        </w:tc>
+      </w:tr>
+      <w:tr>
+        <w:trPr>
+          <w:gridAfter w:val="1"/>
+          <w:wAfter w:w="936" w:type="dxa"/>
+        </w:trPr>
+        <w:tc>
+          <w:tcPr>
+            <w:tcW w:w="762" w:type="dxa"/>
+          </w:tcPr>
+          <w:p>
+            <w:r>
+              <w:t>1/04</w:t>
+            </w:r>
+          </w:p>
+        </w:tc>
+        <w:tc>
+          <w:tcPr>
+            <w:tcW w:w="2777" w:type="dxa"/>
+            <w:gridSpan w:val="2"/>
+          </w:tcPr>
+          <w:p>
+            <w:r>
+              <w:t>Player hit ouch sound</w:t>
+            </w:r>
+          </w:p>
+        </w:tc>
+        <w:tc>
+          <w:tcPr>
+            <w:tcW w:w="1417" w:type="dxa"/>
+          </w:tcPr>
+          <w:p>
+            <w:r>
+              <w:t>Expected</w:t>
+            </w:r>
+          </w:p>
+        </w:tc>
+        <w:tc>
+          <w:tcPr>
+            <w:tcW w:w="1342" w:type="dxa"/>
+            <w:gridSpan w:val="2"/>
+          </w:tcPr>
+          <w:p>
+            <w:r>
+              <w:t>Ouch sound plays when player is hit</w:t>
+            </w:r>
+          </w:p>
+        </w:tc>
+        <w:tc>
+          <w:tcPr>
+            <w:tcW w:w="1298" w:type="dxa"/>
+          </w:tcPr>
+          <w:p>
+            <w:r>
+              <w:t>Sound works</w:t>
+            </w:r>
+          </w:p>
+        </w:tc>
+        <w:tc>
+          <w:tcPr>
+            <w:tcW w:w="6291" w:type="dxa"/>
+          </w:tcPr>
+          <w:p>
+            <w:r>
+              <w:t>None</w:t>
+            </w:r>
+          </w:p>
+        </w:tc>
+      </w:tr>
+      <w:tr>
+        <w:trPr>
+          <w:gridAfter w:val="1"/>
+          <w:wAfter w:w="936" w:type="dxa"/>
+        </w:trPr>
+        <w:tc>
+          <w:tcPr>
+            <w:tcW w:w="762" w:type="dxa"/>
+          </w:tcPr>
+          <w:p>
+            <w:r>
+              <w:t>1/04</w:t>
+            </w:r>
+          </w:p>
+        </w:tc>
+        <w:tc>
+          <w:tcPr>
+            <w:tcW w:w="2777" w:type="dxa"/>
+            <w:gridSpan w:val="2"/>
+          </w:tcPr>
+          <w:p>
+            <w:r>
+              <w:t>Key sprite animation</w:t>
+            </w:r>
+          </w:p>
+        </w:tc>
+        <w:tc>
+          <w:tcPr>
+            <w:tcW w:w="1417" w:type="dxa"/>
+          </w:tcPr>
+          <w:p>
+            <w:r>
+              <w:t>Expected</w:t>
+            </w:r>
+          </w:p>
+        </w:tc>
+        <w:tc>
+          <w:tcPr>
+            <w:tcW w:w="1342" w:type="dxa"/>
+            <w:gridSpan w:val="2"/>
+          </w:tcPr>
+          <w:p>
+            <w:r>
+              <w:t>Key sprite slowly bobs up and down</w:t>
+            </w:r>
+          </w:p>
+        </w:tc>
+        <w:tc>
+          <w:tcPr>
+            <w:tcW w:w="1298" w:type="dxa"/>
+          </w:tcPr>
+          <w:p>
+            <w:r>
+              <w:t>Key sprite moves too quickly</w:t>
+            </w:r>
+          </w:p>
+        </w:tc>
+        <w:tc>
+          <w:tcPr>
+            <w:tcW w:w="6291" w:type="dxa"/>
+          </w:tcPr>
+          <w:p>
+            <w:r>
+              <w:t>Set timer to zero after timer reaches 20</w:t>
+            </w:r>
+          </w:p>
+        </w:tc>
+      </w:tr>
+      <w:tr>
+        <w:trPr>
+          <w:gridAfter w:val="1"/>
+          <w:wAfter w:w="936" w:type="dxa"/>
+        </w:trPr>
+        <w:tc>
+          <w:tcPr>
+            <w:tcW w:w="762" w:type="dxa"/>
+          </w:tcPr>
+          <w:p>
+            <w:r>
+              <w:t>1/04</w:t>
+            </w:r>
+          </w:p>
+        </w:tc>
+        <w:tc>
+          <w:tcPr>
+            <w:tcW w:w="2777" w:type="dxa"/>
+            <w:gridSpan w:val="2"/>
+          </w:tcPr>
+          <w:p>
+            <w:r>
+              <w:t>Key sprite animation</w:t>
+            </w:r>
+          </w:p>
+        </w:tc>
+        <w:tc>
+          <w:tcPr>
+            <w:tcW w:w="1417" w:type="dxa"/>
+          </w:tcPr>
+          <w:p>
+            <w:r>
+              <w:t xml:space="preserve">Expected </w:t>
+            </w:r>
+          </w:p>
+        </w:tc>
+        <w:tc>
+          <w:tcPr>
+            <w:tcW w:w="1342" w:type="dxa"/>
+            <w:gridSpan w:val="2"/>
+          </w:tcPr>
+          <w:p>
+            <w:r>
+              <w:t>Key sprite slowly bobs up and down</w:t>
+            </w:r>
+          </w:p>
+        </w:tc>
+        <w:tc>
+          <w:tcPr>
+            <w:tcW w:w="1298" w:type="dxa"/>
+          </w:tcPr>
+          <w:p>
+            <w:r>
+              <w:t>Key sprite snaps to first texture after reaching last</w:t>
+            </w:r>
+          </w:p>
+        </w:tc>
+        <w:tc>
+          <w:tcPr>
+            <w:tcW w:w="6291" w:type="dxa"/>
+          </w:tcPr>
+          <w:p>
+            <w:r>
+              <w:t xml:space="preserve">Added the middle textures </w:t>
+            </w:r>
+            <w:proofErr w:type="gramStart"/>
+            <w:r>
+              <w:t>a</w:t>
+            </w:r>
+            <w:proofErr w:type="gramEnd"/>
+            <w:r>
+              <w:t xml:space="preserve"> the end of the texture list</w:t>
+            </w:r>
+          </w:p>
+        </w:tc>
+      </w:tr>
+      <w:tr>
+        <w:trPr>
+          <w:gridAfter w:val="1"/>
+          <w:wAfter w:w="936" w:type="dxa"/>
+        </w:trPr>
+        <w:tc>
+          <w:tcPr>
+            <w:tcW w:w="762" w:type="dxa"/>
+          </w:tcPr>
+          <w:p>
+            <w:r>
+              <w:t>1/04</w:t>
+            </w:r>
+          </w:p>
+        </w:tc>
+        <w:tc>
+          <w:tcPr>
+            <w:tcW w:w="2777" w:type="dxa"/>
+            <w:gridSpan w:val="2"/>
+          </w:tcPr>
+          <w:p>
+            <w:r>
+              <w:t>Key sprite animation</w:t>
+            </w:r>
+          </w:p>
+        </w:tc>
+        <w:tc>
+          <w:tcPr>
+            <w:tcW w:w="1417" w:type="dxa"/>
+          </w:tcPr>
+          <w:p>
+            <w:r>
+              <w:t xml:space="preserve">Expected </w:t>
+            </w:r>
+          </w:p>
+        </w:tc>
+        <w:tc>
+          <w:tcPr>
+            <w:tcW w:w="1342" w:type="dxa"/>
+            <w:gridSpan w:val="2"/>
+          </w:tcPr>
+          <w:p>
+            <w:r>
+              <w:t>Key sprite slowly bobs up and down</w:t>
+            </w:r>
+          </w:p>
+        </w:tc>
+        <w:tc>
+          <w:tcPr>
+            <w:tcW w:w="1298" w:type="dxa"/>
+          </w:tcPr>
+          <w:p/>
+        </w:tc>
+        <w:tc>
+          <w:tcPr>
+            <w:tcW w:w="6291" w:type="dxa"/>
+          </w:tcPr>
+          <w:p/>
         </w:tc>
       </w:tr>
     </w:tbl>

</xml_diff>

<commit_message>
added key pickup sound and arcade.remove code and added player healthto on draw
</commit_message>
<xml_diff>
--- a/documentation/ongoing_testing.docx
+++ b/documentation/ongoing_testing.docx
@@ -112,15 +112,7 @@
           </w:tcPr>
           <w:p>
             <w:r>
-              <w:t xml:space="preserve">Vs code complains about </w:t>
-            </w:r>
-            <w:proofErr w:type="spellStart"/>
-            <w:r>
-              <w:t>vstd</w:t>
-            </w:r>
-            <w:proofErr w:type="spellEnd"/>
-            <w:r>
-              <w:t xml:space="preserve"> compression</w:t>
+              <w:t>Vs code complains about vstd compression</w:t>
             </w:r>
           </w:p>
         </w:tc>
@@ -131,13 +123,8 @@
           </w:tcPr>
           <w:p>
             <w:r>
-              <w:t xml:space="preserve">Changed compression type to </w:t>
-            </w:r>
-            <w:proofErr w:type="spellStart"/>
-            <w:r>
-              <w:t>zlib</w:t>
-            </w:r>
-            <w:proofErr w:type="spellEnd"/>
+              <w:t>Changed compression type to zlib</w:t>
+            </w:r>
           </w:p>
         </w:tc>
       </w:tr>
@@ -367,7 +354,6 @@
                 <w:lang w:eastAsia="en-NZ"/>
               </w:rPr>
             </w:pPr>
-            <w:proofErr w:type="spellStart"/>
             <w:r>
               <w:rPr>
                 <w:rFonts w:ascii="Consolas" w:eastAsia="Times New Roman" w:hAnsi="Consolas" w:cs="Times New Roman"/>
@@ -398,7 +384,6 @@
               </w:rPr>
               <w:t>hit_box</w:t>
             </w:r>
-            <w:proofErr w:type="spellEnd"/>
             <w:r>
               <w:rPr>
                 <w:rFonts w:ascii="Consolas" w:eastAsia="Times New Roman" w:hAnsi="Consolas" w:cs="Times New Roman"/>
@@ -409,7 +394,6 @@
               </w:rPr>
               <w:t xml:space="preserve"> = </w:t>
             </w:r>
-            <w:proofErr w:type="spellStart"/>
             <w:r>
               <w:rPr>
                 <w:rFonts w:ascii="Consolas" w:eastAsia="Times New Roman" w:hAnsi="Consolas" w:cs="Times New Roman"/>
@@ -450,7 +434,6 @@
               </w:rPr>
               <w:t>.hit_box_points</w:t>
             </w:r>
-            <w:proofErr w:type="spellEnd"/>
           </w:p>
           <w:p/>
         </w:tc>
@@ -542,8 +525,6 @@
               </w:rPr>
               <w:t xml:space="preserve">        </w:t>
             </w:r>
-            <w:proofErr w:type="spellStart"/>
-            <w:proofErr w:type="gramStart"/>
             <w:r>
               <w:rPr>
                 <w:rFonts w:ascii="Consolas" w:eastAsia="Times New Roman" w:hAnsi="Consolas" w:cs="Times New Roman"/>
@@ -572,9 +553,18 @@
                 <w:szCs w:val="21"/>
                 <w:lang w:eastAsia="en-NZ"/>
               </w:rPr>
-              <w:t>hitbox</w:t>
-            </w:r>
-            <w:proofErr w:type="gramEnd"/>
+              <w:t>hitbox_texture</w:t>
+            </w:r>
+            <w:r>
+              <w:rPr>
+                <w:rFonts w:ascii="Consolas" w:eastAsia="Times New Roman" w:hAnsi="Consolas" w:cs="Times New Roman"/>
+                <w:color w:val="D4D4D4"/>
+                <w:sz w:val="21"/>
+                <w:szCs w:val="21"/>
+                <w:lang w:eastAsia="en-NZ"/>
+              </w:rPr>
+              <w:t xml:space="preserve"> = </w:t>
+            </w:r>
             <w:r>
               <w:rPr>
                 <w:rFonts w:ascii="Consolas" w:eastAsia="Times New Roman" w:hAnsi="Consolas" w:cs="Times New Roman"/>
@@ -583,9 +573,8 @@
                 <w:szCs w:val="21"/>
                 <w:lang w:eastAsia="en-NZ"/>
               </w:rPr>
-              <w:t>_texture</w:t>
-            </w:r>
-            <w:proofErr w:type="spellEnd"/>
+              <w:t>self</w:t>
+            </w:r>
             <w:r>
               <w:rPr>
                 <w:rFonts w:ascii="Consolas" w:eastAsia="Times New Roman" w:hAnsi="Consolas" w:cs="Times New Roman"/>
@@ -594,9 +583,8 @@
                 <w:szCs w:val="21"/>
                 <w:lang w:eastAsia="en-NZ"/>
               </w:rPr>
-              <w:t xml:space="preserve"> = </w:t>
-            </w:r>
-            <w:proofErr w:type="spellStart"/>
+              <w:t>.</w:t>
+            </w:r>
             <w:r>
               <w:rPr>
                 <w:rFonts w:ascii="Consolas" w:eastAsia="Times New Roman" w:hAnsi="Consolas" w:cs="Times New Roman"/>
@@ -605,29 +593,8 @@
                 <w:szCs w:val="21"/>
                 <w:lang w:eastAsia="en-NZ"/>
               </w:rPr>
-              <w:t>self</w:t>
-            </w:r>
-            <w:r>
-              <w:rPr>
-                <w:rFonts w:ascii="Consolas" w:eastAsia="Times New Roman" w:hAnsi="Consolas" w:cs="Times New Roman"/>
-                <w:color w:val="D4D4D4"/>
-                <w:sz w:val="21"/>
-                <w:szCs w:val="21"/>
-                <w:lang w:eastAsia="en-NZ"/>
-              </w:rPr>
-              <w:t>.</w:t>
-            </w:r>
-            <w:r>
-              <w:rPr>
-                <w:rFonts w:ascii="Consolas" w:eastAsia="Times New Roman" w:hAnsi="Consolas" w:cs="Times New Roman"/>
-                <w:color w:val="9CDCFE"/>
-                <w:sz w:val="21"/>
-                <w:szCs w:val="21"/>
-                <w:lang w:eastAsia="en-NZ"/>
-              </w:rPr>
               <w:t>idle_texture_pair</w:t>
             </w:r>
-            <w:proofErr w:type="spellEnd"/>
             <w:r>
               <w:rPr>
                 <w:rFonts w:ascii="Consolas" w:eastAsia="Times New Roman" w:hAnsi="Consolas" w:cs="Times New Roman"/>
@@ -681,7 +648,6 @@
               </w:rPr>
               <w:t xml:space="preserve">        </w:t>
             </w:r>
-            <w:proofErr w:type="spellStart"/>
             <w:r>
               <w:rPr>
                 <w:rFonts w:ascii="Consolas" w:eastAsia="Times New Roman" w:hAnsi="Consolas" w:cs="Times New Roman"/>
@@ -712,7 +678,6 @@
               </w:rPr>
               <w:t>hit_box</w:t>
             </w:r>
-            <w:proofErr w:type="spellEnd"/>
             <w:r>
               <w:rPr>
                 <w:rFonts w:ascii="Consolas" w:eastAsia="Times New Roman" w:hAnsi="Consolas" w:cs="Times New Roman"/>
@@ -723,7 +688,6 @@
               </w:rPr>
               <w:t xml:space="preserve"> = </w:t>
             </w:r>
-            <w:proofErr w:type="spellStart"/>
             <w:r>
               <w:rPr>
                 <w:rFonts w:ascii="Consolas" w:eastAsia="Times New Roman" w:hAnsi="Consolas" w:cs="Times New Roman"/>
@@ -774,7 +738,6 @@
               </w:rPr>
               <w:t>hit_box_points</w:t>
             </w:r>
-            <w:proofErr w:type="spellEnd"/>
           </w:p>
           <w:p/>
         </w:tc>
@@ -936,15 +899,7 @@
           </w:tcPr>
           <w:p>
             <w:r>
-              <w:t xml:space="preserve">Called function in </w:t>
-            </w:r>
-            <w:proofErr w:type="spellStart"/>
-            <w:r>
-              <w:t>on_update</w:t>
-            </w:r>
-            <w:proofErr w:type="spellEnd"/>
-            <w:r>
-              <w:t xml:space="preserve"> function</w:t>
+              <w:t>Called function in on_update function</w:t>
             </w:r>
           </w:p>
         </w:tc>
@@ -1088,8 +1043,6 @@
               </w:rPr>
               <w:t xml:space="preserve"> </w:t>
             </w:r>
-            <w:proofErr w:type="spellStart"/>
-            <w:proofErr w:type="gramStart"/>
             <w:r>
               <w:rPr>
                 <w:rFonts w:ascii="Consolas" w:eastAsia="Times New Roman" w:hAnsi="Consolas" w:cs="Times New Roman"/>
@@ -1118,20 +1071,8 @@
                 <w:szCs w:val="21"/>
                 <w:lang w:eastAsia="en-NZ"/>
               </w:rPr>
-              <w:t>change</w:t>
-            </w:r>
-            <w:proofErr w:type="gramEnd"/>
-            <w:r>
-              <w:rPr>
-                <w:rFonts w:ascii="Consolas" w:eastAsia="Times New Roman" w:hAnsi="Consolas" w:cs="Times New Roman"/>
-                <w:color w:val="9CDCFE"/>
-                <w:sz w:val="21"/>
-                <w:szCs w:val="21"/>
-                <w:lang w:eastAsia="en-NZ"/>
-              </w:rPr>
-              <w:t>_y</w:t>
-            </w:r>
-            <w:proofErr w:type="spellEnd"/>
+              <w:t>change_y</w:t>
+            </w:r>
             <w:r>
               <w:rPr>
                 <w:rFonts w:ascii="Consolas" w:eastAsia="Times New Roman" w:hAnsi="Consolas" w:cs="Times New Roman"/>
@@ -1205,8 +1146,6 @@
               </w:rPr>
               <w:t xml:space="preserve">            </w:t>
             </w:r>
-            <w:proofErr w:type="spellStart"/>
-            <w:proofErr w:type="gramStart"/>
             <w:r>
               <w:rPr>
                 <w:rFonts w:ascii="Consolas" w:eastAsia="Times New Roman" w:hAnsi="Consolas" w:cs="Times New Roman"/>
@@ -1237,8 +1176,6 @@
               </w:rPr>
               <w:t>texture</w:t>
             </w:r>
-            <w:proofErr w:type="spellEnd"/>
-            <w:proofErr w:type="gramEnd"/>
             <w:r>
               <w:rPr>
                 <w:rFonts w:ascii="Consolas" w:eastAsia="Times New Roman" w:hAnsi="Consolas" w:cs="Times New Roman"/>
@@ -1269,7 +1206,6 @@
               </w:rPr>
               <w:t xml:space="preserve"> </w:t>
             </w:r>
-            <w:proofErr w:type="spellStart"/>
             <w:r>
               <w:rPr>
                 <w:rFonts w:ascii="Consolas" w:eastAsia="Times New Roman" w:hAnsi="Consolas" w:cs="Times New Roman"/>
@@ -1300,7 +1236,6 @@
               </w:rPr>
               <w:t>fall_textures</w:t>
             </w:r>
-            <w:proofErr w:type="spellEnd"/>
             <w:r>
               <w:rPr>
                 <w:rFonts w:ascii="Consolas" w:eastAsia="Times New Roman" w:hAnsi="Consolas" w:cs="Times New Roman"/>
@@ -1331,7 +1266,6 @@
               </w:rPr>
               <w:t>][</w:t>
             </w:r>
-            <w:proofErr w:type="spellStart"/>
             <w:r>
               <w:rPr>
                 <w:rFonts w:ascii="Consolas" w:eastAsia="Times New Roman" w:hAnsi="Consolas" w:cs="Times New Roman"/>
@@ -1362,7 +1296,6 @@
               </w:rPr>
               <w:t>character_face_direction</w:t>
             </w:r>
-            <w:proofErr w:type="spellEnd"/>
             <w:r>
               <w:rPr>
                 <w:rFonts w:ascii="Consolas" w:eastAsia="Times New Roman" w:hAnsi="Consolas" w:cs="Times New Roman"/>
@@ -1416,8 +1349,6 @@
               </w:rPr>
               <w:t xml:space="preserve"> </w:t>
             </w:r>
-            <w:proofErr w:type="spellStart"/>
-            <w:proofErr w:type="gramStart"/>
             <w:r>
               <w:rPr>
                 <w:rFonts w:ascii="Consolas" w:eastAsia="Times New Roman" w:hAnsi="Consolas" w:cs="Times New Roman"/>
@@ -1446,20 +1377,8 @@
                 <w:szCs w:val="21"/>
                 <w:lang w:eastAsia="en-NZ"/>
               </w:rPr>
-              <w:t>change</w:t>
-            </w:r>
-            <w:proofErr w:type="gramEnd"/>
-            <w:r>
-              <w:rPr>
-                <w:rFonts w:ascii="Consolas" w:eastAsia="Times New Roman" w:hAnsi="Consolas" w:cs="Times New Roman"/>
-                <w:color w:val="9CDCFE"/>
-                <w:sz w:val="21"/>
-                <w:szCs w:val="21"/>
-                <w:lang w:eastAsia="en-NZ"/>
-              </w:rPr>
-              <w:t>_y</w:t>
-            </w:r>
-            <w:proofErr w:type="spellEnd"/>
+              <w:t>change_y</w:t>
+            </w:r>
             <w:r>
               <w:rPr>
                 <w:rFonts w:ascii="Consolas" w:eastAsia="Times New Roman" w:hAnsi="Consolas" w:cs="Times New Roman"/>
@@ -1543,8 +1462,6 @@
               </w:rPr>
               <w:t xml:space="preserve">            </w:t>
             </w:r>
-            <w:proofErr w:type="spellStart"/>
-            <w:proofErr w:type="gramStart"/>
             <w:r>
               <w:rPr>
                 <w:rFonts w:ascii="Consolas" w:eastAsia="Times New Roman" w:hAnsi="Consolas" w:cs="Times New Roman"/>
@@ -1575,8 +1492,6 @@
               </w:rPr>
               <w:t>texture</w:t>
             </w:r>
-            <w:proofErr w:type="spellEnd"/>
-            <w:proofErr w:type="gramEnd"/>
             <w:r>
               <w:rPr>
                 <w:rFonts w:ascii="Consolas" w:eastAsia="Times New Roman" w:hAnsi="Consolas" w:cs="Times New Roman"/>
@@ -1607,7 +1522,6 @@
               </w:rPr>
               <w:t xml:space="preserve"> </w:t>
             </w:r>
-            <w:proofErr w:type="spellStart"/>
             <w:r>
               <w:rPr>
                 <w:rFonts w:ascii="Consolas" w:eastAsia="Times New Roman" w:hAnsi="Consolas" w:cs="Times New Roman"/>
@@ -1638,7 +1552,6 @@
               </w:rPr>
               <w:t>fall_textures</w:t>
             </w:r>
-            <w:proofErr w:type="spellEnd"/>
             <w:r>
               <w:rPr>
                 <w:rFonts w:ascii="Consolas" w:eastAsia="Times New Roman" w:hAnsi="Consolas" w:cs="Times New Roman"/>
@@ -1669,7 +1582,6 @@
               </w:rPr>
               <w:t>][</w:t>
             </w:r>
-            <w:proofErr w:type="spellStart"/>
             <w:r>
               <w:rPr>
                 <w:rFonts w:ascii="Consolas" w:eastAsia="Times New Roman" w:hAnsi="Consolas" w:cs="Times New Roman"/>
@@ -1700,7 +1612,6 @@
               </w:rPr>
               <w:t>character_face_direction</w:t>
             </w:r>
-            <w:proofErr w:type="spellEnd"/>
             <w:r>
               <w:rPr>
                 <w:rFonts w:ascii="Consolas" w:eastAsia="Times New Roman" w:hAnsi="Consolas" w:cs="Times New Roman"/>
@@ -2349,63 +2260,7 @@
                 <w:szCs w:val="21"/>
                 <w:lang w:eastAsia="en-NZ"/>
               </w:rPr>
-              <w:t xml:space="preserve">Changed code from </w:t>
-            </w:r>
-            <w:proofErr w:type="spellStart"/>
-            <w:proofErr w:type="gramStart"/>
-            <w:r>
-              <w:rPr>
-                <w:rFonts w:ascii="Consolas" w:eastAsia="Times New Roman" w:hAnsi="Consolas" w:cs="Times New Roman"/>
-                <w:color w:val="CCCCCC"/>
-                <w:sz w:val="21"/>
-                <w:szCs w:val="21"/>
-                <w:lang w:eastAsia="en-NZ"/>
-              </w:rPr>
-              <w:t>self.change</w:t>
-            </w:r>
-            <w:proofErr w:type="gramEnd"/>
-            <w:r>
-              <w:rPr>
-                <w:rFonts w:ascii="Consolas" w:eastAsia="Times New Roman" w:hAnsi="Consolas" w:cs="Times New Roman"/>
-                <w:color w:val="CCCCCC"/>
-                <w:sz w:val="21"/>
-                <w:szCs w:val="21"/>
-                <w:lang w:eastAsia="en-NZ"/>
-              </w:rPr>
-              <w:t>_x</w:t>
-            </w:r>
-            <w:proofErr w:type="spellEnd"/>
-            <w:r>
-              <w:rPr>
-                <w:rFonts w:ascii="Consolas" w:eastAsia="Times New Roman" w:hAnsi="Consolas" w:cs="Times New Roman"/>
-                <w:color w:val="CCCCCC"/>
-                <w:sz w:val="21"/>
-                <w:szCs w:val="21"/>
-                <w:lang w:eastAsia="en-NZ"/>
-              </w:rPr>
-              <w:t xml:space="preserve"> to </w:t>
-            </w:r>
-            <w:proofErr w:type="spellStart"/>
-            <w:r>
-              <w:rPr>
-                <w:rFonts w:ascii="Consolas" w:eastAsia="Times New Roman" w:hAnsi="Consolas" w:cs="Times New Roman"/>
-                <w:color w:val="CCCCCC"/>
-                <w:sz w:val="21"/>
-                <w:szCs w:val="21"/>
-                <w:lang w:eastAsia="en-NZ"/>
-              </w:rPr>
-              <w:t>self.center</w:t>
-            </w:r>
-            <w:proofErr w:type="spellEnd"/>
-            <w:r>
-              <w:rPr>
-                <w:rFonts w:ascii="Consolas" w:eastAsia="Times New Roman" w:hAnsi="Consolas" w:cs="Times New Roman"/>
-                <w:color w:val="CCCCCC"/>
-                <w:sz w:val="21"/>
-                <w:szCs w:val="21"/>
-                <w:lang w:eastAsia="en-NZ"/>
-              </w:rPr>
-              <w:t xml:space="preserve"> += x</w:t>
+              <w:t>Changed code from self.change_x to self.center += x</w:t>
             </w:r>
           </w:p>
         </w:tc>
@@ -2451,13 +2306,8 @@
           </w:tcPr>
           <w:p>
             <w:r>
-              <w:t xml:space="preserve">Enemy sprites </w:t>
-            </w:r>
-            <w:proofErr w:type="gramStart"/>
-            <w:r>
-              <w:t>moves</w:t>
-            </w:r>
-            <w:proofErr w:type="gramEnd"/>
+              <w:t>Enemy sprites moves</w:t>
+            </w:r>
           </w:p>
         </w:tc>
         <w:tc>
@@ -2511,13 +2361,8 @@
           </w:tcPr>
           <w:p>
             <w:r>
-              <w:t xml:space="preserve">Enemy sprite </w:t>
-            </w:r>
-            <w:proofErr w:type="spellStart"/>
-            <w:r>
-              <w:t>movment</w:t>
-            </w:r>
-            <w:proofErr w:type="spellEnd"/>
+              <w:t>Enemy sprite movment</w:t>
+            </w:r>
           </w:p>
         </w:tc>
         <w:tc>
@@ -2526,15 +2371,7 @@
           </w:tcPr>
           <w:p>
             <w:r>
-              <w:t xml:space="preserve">Enemy </w:t>
-            </w:r>
-            <w:proofErr w:type="spellStart"/>
-            <w:r>
-              <w:t>enemy</w:t>
-            </w:r>
-            <w:proofErr w:type="spellEnd"/>
-            <w:r>
-              <w:t xml:space="preserve"> sprites make small movements left and right and jump </w:t>
+              <w:t xml:space="preserve">Enemy enemy sprites make small movements left and right and jump </w:t>
             </w:r>
           </w:p>
         </w:tc>
@@ -2716,7 +2553,6 @@
                 <w:lang w:eastAsia="en-NZ"/>
               </w:rPr>
             </w:pPr>
-            <w:proofErr w:type="spellStart"/>
             <w:r>
               <w:rPr>
                 <w:rFonts w:ascii="Consolas" w:eastAsia="Times New Roman" w:hAnsi="Consolas" w:cs="Times New Roman"/>
@@ -2727,7 +2563,6 @@
               </w:rPr>
               <w:t>elif</w:t>
             </w:r>
-            <w:proofErr w:type="spellEnd"/>
             <w:r>
               <w:rPr>
                 <w:rFonts w:ascii="Consolas" w:eastAsia="Times New Roman" w:hAnsi="Consolas" w:cs="Times New Roman"/>
@@ -2738,8 +2573,6 @@
               </w:rPr>
               <w:t xml:space="preserve"> </w:t>
             </w:r>
-            <w:proofErr w:type="spellStart"/>
-            <w:proofErr w:type="gramStart"/>
             <w:r>
               <w:rPr>
                 <w:rFonts w:ascii="Consolas" w:eastAsia="Times New Roman" w:hAnsi="Consolas" w:cs="Times New Roman"/>
@@ -2770,8 +2603,6 @@
               </w:rPr>
               <w:t>direction</w:t>
             </w:r>
-            <w:proofErr w:type="spellEnd"/>
-            <w:proofErr w:type="gramEnd"/>
             <w:r>
               <w:rPr>
                 <w:rFonts w:ascii="Consolas" w:eastAsia="Times New Roman" w:hAnsi="Consolas" w:cs="Times New Roman"/>
@@ -2845,8 +2676,6 @@
               </w:rPr>
               <w:t xml:space="preserve">            </w:t>
             </w:r>
-            <w:proofErr w:type="spellStart"/>
-            <w:proofErr w:type="gramStart"/>
             <w:r>
               <w:rPr>
                 <w:rFonts w:ascii="Consolas" w:eastAsia="Times New Roman" w:hAnsi="Consolas" w:cs="Times New Roman"/>
@@ -2875,20 +2704,8 @@
                 <w:szCs w:val="21"/>
                 <w:lang w:eastAsia="en-NZ"/>
               </w:rPr>
-              <w:t>change</w:t>
-            </w:r>
-            <w:proofErr w:type="gramEnd"/>
-            <w:r>
-              <w:rPr>
-                <w:rFonts w:ascii="Consolas" w:eastAsia="Times New Roman" w:hAnsi="Consolas" w:cs="Times New Roman"/>
-                <w:color w:val="9CDCFE"/>
-                <w:sz w:val="21"/>
-                <w:szCs w:val="21"/>
-                <w:lang w:eastAsia="en-NZ"/>
-              </w:rPr>
-              <w:t>_x</w:t>
-            </w:r>
-            <w:proofErr w:type="spellEnd"/>
+              <w:t>change_x</w:t>
+            </w:r>
             <w:r>
               <w:rPr>
                 <w:rFonts w:ascii="Consolas" w:eastAsia="Times New Roman" w:hAnsi="Consolas" w:cs="Times New Roman"/>
@@ -3062,7 +2879,6 @@
                 <w:lang w:eastAsia="en-NZ"/>
               </w:rPr>
             </w:pPr>
-            <w:proofErr w:type="gramStart"/>
             <w:r>
               <w:rPr>
                 <w:rFonts w:ascii="Consolas" w:eastAsia="Times New Roman" w:hAnsi="Consolas" w:cs="Times New Roman"/>
@@ -3071,62 +2887,7 @@
                 <w:szCs w:val="21"/>
                 <w:lang w:eastAsia="en-NZ"/>
               </w:rPr>
-              <w:t>Changed .</w:t>
-            </w:r>
-            <w:proofErr w:type="spellStart"/>
-            <w:r>
-              <w:rPr>
-                <w:rFonts w:ascii="Consolas" w:eastAsia="Times New Roman" w:hAnsi="Consolas" w:cs="Times New Roman"/>
-                <w:color w:val="C586C0"/>
-                <w:sz w:val="21"/>
-                <w:szCs w:val="21"/>
-                <w:lang w:eastAsia="en-NZ"/>
-              </w:rPr>
-              <w:t>change</w:t>
-            </w:r>
-            <w:proofErr w:type="gramEnd"/>
-            <w:r>
-              <w:rPr>
-                <w:rFonts w:ascii="Consolas" w:eastAsia="Times New Roman" w:hAnsi="Consolas" w:cs="Times New Roman"/>
-                <w:color w:val="C586C0"/>
-                <w:sz w:val="21"/>
-                <w:szCs w:val="21"/>
-                <w:lang w:eastAsia="en-NZ"/>
-              </w:rPr>
-              <w:t>_x</w:t>
-            </w:r>
-            <w:proofErr w:type="spellEnd"/>
-            <w:r>
-              <w:rPr>
-                <w:rFonts w:ascii="Consolas" w:eastAsia="Times New Roman" w:hAnsi="Consolas" w:cs="Times New Roman"/>
-                <w:color w:val="C586C0"/>
-                <w:sz w:val="21"/>
-                <w:szCs w:val="21"/>
-                <w:lang w:eastAsia="en-NZ"/>
-              </w:rPr>
-              <w:t xml:space="preserve"> -= 3 to  .</w:t>
-            </w:r>
-            <w:proofErr w:type="spellStart"/>
-            <w:r>
-              <w:rPr>
-                <w:rFonts w:ascii="Consolas" w:eastAsia="Times New Roman" w:hAnsi="Consolas" w:cs="Times New Roman"/>
-                <w:color w:val="C586C0"/>
-                <w:sz w:val="21"/>
-                <w:szCs w:val="21"/>
-                <w:lang w:eastAsia="en-NZ"/>
-              </w:rPr>
-              <w:t>change_x</w:t>
-            </w:r>
-            <w:proofErr w:type="spellEnd"/>
-            <w:r>
-              <w:rPr>
-                <w:rFonts w:ascii="Consolas" w:eastAsia="Times New Roman" w:hAnsi="Consolas" w:cs="Times New Roman"/>
-                <w:color w:val="C586C0"/>
-                <w:sz w:val="21"/>
-                <w:szCs w:val="21"/>
-                <w:lang w:eastAsia="en-NZ"/>
-              </w:rPr>
-              <w:t xml:space="preserve"> = -3</w:t>
+              <w:t>Changed .change_x -= 3 to  .change_x = -3</w:t>
             </w:r>
           </w:p>
         </w:tc>
@@ -3353,7 +3114,6 @@
               </w:rPr>
               <w:t> </w:t>
             </w:r>
-            <w:proofErr w:type="spellStart"/>
             <w:r>
               <w:rPr>
                 <w:rFonts w:ascii="Consolas" w:eastAsia="Times New Roman" w:hAnsi="Consolas" w:cs="Times New Roman"/>
@@ -3364,7 +3124,6 @@
               </w:rPr>
               <w:t>elif</w:t>
             </w:r>
-            <w:proofErr w:type="spellEnd"/>
             <w:r>
               <w:rPr>
                 <w:rFonts w:ascii="Consolas" w:eastAsia="Times New Roman" w:hAnsi="Consolas" w:cs="Times New Roman"/>
@@ -3415,8 +3174,6 @@
               </w:rPr>
               <w:t xml:space="preserve"> </w:t>
             </w:r>
-            <w:proofErr w:type="spellStart"/>
-            <w:proofErr w:type="gramStart"/>
             <w:r>
               <w:rPr>
                 <w:rFonts w:ascii="Consolas" w:eastAsia="Times New Roman" w:hAnsi="Consolas" w:cs="Times New Roman"/>
@@ -3467,8 +3224,6 @@
               </w:rPr>
               <w:t>SPACE</w:t>
             </w:r>
-            <w:proofErr w:type="spellEnd"/>
-            <w:proofErr w:type="gramEnd"/>
             <w:r>
               <w:rPr>
                 <w:rFonts w:ascii="Consolas" w:eastAsia="Times New Roman" w:hAnsi="Consolas" w:cs="Times New Roman"/>
@@ -3502,8 +3257,6 @@
               </w:rPr>
               <w:t>   </w:t>
             </w:r>
-            <w:proofErr w:type="spellStart"/>
-            <w:proofErr w:type="gramStart"/>
             <w:r>
               <w:rPr>
                 <w:rFonts w:ascii="Consolas" w:eastAsia="Times New Roman" w:hAnsi="Consolas" w:cs="Times New Roman"/>
@@ -3532,9 +3285,18 @@
                 <w:szCs w:val="21"/>
                 <w:lang w:eastAsia="en-NZ"/>
               </w:rPr>
-              <w:t>enemy</w:t>
-            </w:r>
-            <w:proofErr w:type="gramEnd"/>
+              <w:t>enemy_sprite</w:t>
+            </w:r>
+            <w:r>
+              <w:rPr>
+                <w:rFonts w:ascii="Consolas" w:eastAsia="Times New Roman" w:hAnsi="Consolas" w:cs="Times New Roman"/>
+                <w:color w:val="CCCCCC"/>
+                <w:sz w:val="21"/>
+                <w:szCs w:val="21"/>
+                <w:lang w:eastAsia="en-NZ"/>
+              </w:rPr>
+              <w:t>.</w:t>
+            </w:r>
             <w:r>
               <w:rPr>
                 <w:rFonts w:ascii="Consolas" w:eastAsia="Times New Roman" w:hAnsi="Consolas" w:cs="Times New Roman"/>
@@ -3543,29 +3305,8 @@
                 <w:szCs w:val="21"/>
                 <w:lang w:eastAsia="en-NZ"/>
               </w:rPr>
-              <w:t>_sprite</w:t>
-            </w:r>
-            <w:r>
-              <w:rPr>
-                <w:rFonts w:ascii="Consolas" w:eastAsia="Times New Roman" w:hAnsi="Consolas" w:cs="Times New Roman"/>
-                <w:color w:val="CCCCCC"/>
-                <w:sz w:val="21"/>
-                <w:szCs w:val="21"/>
-                <w:lang w:eastAsia="en-NZ"/>
-              </w:rPr>
-              <w:t>.</w:t>
-            </w:r>
-            <w:r>
-              <w:rPr>
-                <w:rFonts w:ascii="Consolas" w:eastAsia="Times New Roman" w:hAnsi="Consolas" w:cs="Times New Roman"/>
-                <w:color w:val="9CDCFE"/>
-                <w:sz w:val="21"/>
-                <w:szCs w:val="21"/>
-                <w:lang w:eastAsia="en-NZ"/>
-              </w:rPr>
               <w:t>attack</w:t>
             </w:r>
-            <w:proofErr w:type="spellEnd"/>
             <w:r>
               <w:rPr>
                 <w:rFonts w:ascii="Consolas" w:eastAsia="Times New Roman" w:hAnsi="Consolas" w:cs="Times New Roman"/>
@@ -3692,31 +3433,7 @@
                 <w:szCs w:val="21"/>
                 <w:lang w:eastAsia="en-NZ"/>
               </w:rPr>
-              <w:t xml:space="preserve">Added </w:t>
-            </w:r>
-            <w:proofErr w:type="spellStart"/>
-            <w:proofErr w:type="gramStart"/>
-            <w:r>
-              <w:rPr>
-                <w:rFonts w:ascii="Consolas" w:eastAsia="Times New Roman" w:hAnsi="Consolas" w:cs="Times New Roman"/>
-                <w:color w:val="CCCCCC"/>
-                <w:sz w:val="21"/>
-                <w:szCs w:val="21"/>
-                <w:lang w:eastAsia="en-NZ"/>
-              </w:rPr>
-              <w:t>time.sleep</w:t>
-            </w:r>
-            <w:proofErr w:type="spellEnd"/>
-            <w:proofErr w:type="gramEnd"/>
-            <w:r>
-              <w:rPr>
-                <w:rFonts w:ascii="Consolas" w:eastAsia="Times New Roman" w:hAnsi="Consolas" w:cs="Times New Roman"/>
-                <w:color w:val="CCCCCC"/>
-                <w:sz w:val="21"/>
-                <w:szCs w:val="21"/>
-                <w:lang w:eastAsia="en-NZ"/>
-              </w:rPr>
-              <w:t>(1)</w:t>
+              <w:t>Added time.sleep(1)</w:t>
             </w:r>
           </w:p>
         </w:tc>
@@ -3909,51 +3626,7 @@
                 <w:szCs w:val="21"/>
                 <w:lang w:eastAsia="en-NZ"/>
               </w:rPr>
-              <w:t xml:space="preserve">Reset </w:t>
-            </w:r>
-            <w:proofErr w:type="spellStart"/>
-            <w:r>
-              <w:rPr>
-                <w:rFonts w:ascii="Consolas" w:eastAsia="Times New Roman" w:hAnsi="Consolas" w:cs="Times New Roman"/>
-                <w:color w:val="CCCCCC"/>
-                <w:sz w:val="21"/>
-                <w:szCs w:val="21"/>
-                <w:lang w:eastAsia="en-NZ"/>
-              </w:rPr>
-              <w:t>self.cur_texture</w:t>
-            </w:r>
-            <w:proofErr w:type="spellEnd"/>
-            <w:r>
-              <w:rPr>
-                <w:rFonts w:ascii="Consolas" w:eastAsia="Times New Roman" w:hAnsi="Consolas" w:cs="Times New Roman"/>
-                <w:color w:val="CCCCCC"/>
-                <w:sz w:val="21"/>
-                <w:szCs w:val="21"/>
-                <w:lang w:eastAsia="en-NZ"/>
-              </w:rPr>
-              <w:t xml:space="preserve"> when </w:t>
-            </w:r>
-            <w:proofErr w:type="spellStart"/>
-            <w:r>
-              <w:rPr>
-                <w:rFonts w:ascii="Consolas" w:eastAsia="Times New Roman" w:hAnsi="Consolas" w:cs="Times New Roman"/>
-                <w:color w:val="CCCCCC"/>
-                <w:sz w:val="21"/>
-                <w:szCs w:val="21"/>
-                <w:lang w:eastAsia="en-NZ"/>
-              </w:rPr>
-              <w:t>self attack</w:t>
-            </w:r>
-            <w:proofErr w:type="spellEnd"/>
-            <w:r>
-              <w:rPr>
-                <w:rFonts w:ascii="Consolas" w:eastAsia="Times New Roman" w:hAnsi="Consolas" w:cs="Times New Roman"/>
-                <w:color w:val="CCCCCC"/>
-                <w:sz w:val="21"/>
-                <w:szCs w:val="21"/>
-                <w:lang w:eastAsia="en-NZ"/>
-              </w:rPr>
-              <w:t xml:space="preserve"> == “attack</w:t>
+              <w:t>Reset self.cur_texture when self attack == “attack</w:t>
             </w:r>
           </w:p>
         </w:tc>
@@ -3998,13 +3671,8 @@
             <w:gridSpan w:val="2"/>
           </w:tcPr>
           <w:p>
-            <w:proofErr w:type="spellStart"/>
-            <w:r>
-              <w:t>Self.cur_texture</w:t>
-            </w:r>
-            <w:proofErr w:type="spellEnd"/>
-            <w:r>
-              <w:t xml:space="preserve"> is not being updated</w:t>
+            <w:r>
+              <w:t>Self.cur_texture is not being updated</w:t>
             </w:r>
           </w:p>
         </w:tc>
@@ -4293,75 +3961,7 @@
                 <w:szCs w:val="21"/>
                 <w:lang w:eastAsia="en-NZ"/>
               </w:rPr>
-              <w:t xml:space="preserve">Removed the code from on </w:t>
-            </w:r>
-            <w:proofErr w:type="spellStart"/>
-            <w:r>
-              <w:rPr>
-                <w:rFonts w:ascii="Consolas" w:eastAsia="Times New Roman" w:hAnsi="Consolas" w:cs="Times New Roman"/>
-                <w:color w:val="CCCCCC"/>
-                <w:sz w:val="21"/>
-                <w:szCs w:val="21"/>
-                <w:lang w:eastAsia="en-NZ"/>
-              </w:rPr>
-              <w:t>key_release</w:t>
-            </w:r>
-            <w:proofErr w:type="spellEnd"/>
-            <w:r>
-              <w:rPr>
-                <w:rFonts w:ascii="Consolas" w:eastAsia="Times New Roman" w:hAnsi="Consolas" w:cs="Times New Roman"/>
-                <w:color w:val="CCCCCC"/>
-                <w:sz w:val="21"/>
-                <w:szCs w:val="21"/>
-                <w:lang w:eastAsia="en-NZ"/>
-              </w:rPr>
-              <w:t xml:space="preserve"> that stops the animation code from running and made </w:t>
-            </w:r>
-            <w:proofErr w:type="spellStart"/>
-            <w:proofErr w:type="gramStart"/>
-            <w:r>
-              <w:rPr>
-                <w:rFonts w:ascii="Consolas" w:eastAsia="Times New Roman" w:hAnsi="Consolas" w:cs="Times New Roman"/>
-                <w:color w:val="CCCCCC"/>
-                <w:sz w:val="21"/>
-                <w:szCs w:val="21"/>
-                <w:lang w:eastAsia="en-NZ"/>
-              </w:rPr>
-              <w:t>self.attack</w:t>
-            </w:r>
-            <w:proofErr w:type="spellEnd"/>
-            <w:proofErr w:type="gramEnd"/>
-            <w:r>
-              <w:rPr>
-                <w:rFonts w:ascii="Consolas" w:eastAsia="Times New Roman" w:hAnsi="Consolas" w:cs="Times New Roman"/>
-                <w:color w:val="CCCCCC"/>
-                <w:sz w:val="21"/>
-                <w:szCs w:val="21"/>
-                <w:lang w:eastAsia="en-NZ"/>
-              </w:rPr>
-              <w:t xml:space="preserve"> = “” when the animation </w:t>
-            </w:r>
-            <w:proofErr w:type="spellStart"/>
-            <w:r>
-              <w:rPr>
-                <w:rFonts w:ascii="Consolas" w:eastAsia="Times New Roman" w:hAnsi="Consolas" w:cs="Times New Roman"/>
-                <w:color w:val="CCCCCC"/>
-                <w:sz w:val="21"/>
-                <w:szCs w:val="21"/>
-                <w:lang w:eastAsia="en-NZ"/>
-              </w:rPr>
-              <w:t>hd</w:t>
-            </w:r>
-            <w:proofErr w:type="spellEnd"/>
-            <w:r>
-              <w:rPr>
-                <w:rFonts w:ascii="Consolas" w:eastAsia="Times New Roman" w:hAnsi="Consolas" w:cs="Times New Roman"/>
-                <w:color w:val="CCCCCC"/>
-                <w:sz w:val="21"/>
-                <w:szCs w:val="21"/>
-                <w:lang w:eastAsia="en-NZ"/>
-              </w:rPr>
-              <w:t xml:space="preserve"> played.</w:t>
+              <w:t>Removed the code from on key_release that stops the animation code from running and made self.attack = “” when the animation hd played.</w:t>
             </w:r>
           </w:p>
         </w:tc>
@@ -4657,20 +4257,8 @@
                 <w:szCs w:val="21"/>
                 <w:lang w:eastAsia="en-NZ"/>
               </w:rPr>
-              <w:t xml:space="preserve">Attack animation repeats when the sprites </w:t>
-            </w:r>
-            <w:proofErr w:type="gramStart"/>
-            <w:r>
-              <w:rPr>
-                <w:rFonts w:ascii="Consolas" w:eastAsia="Times New Roman" w:hAnsi="Consolas" w:cs="Times New Roman"/>
-                <w:color w:val="CCCCCC"/>
-                <w:sz w:val="21"/>
-                <w:szCs w:val="21"/>
-                <w:lang w:eastAsia="en-NZ"/>
-              </w:rPr>
-              <w:t>move</w:t>
-            </w:r>
-            <w:proofErr w:type="gramEnd"/>
+              <w:t>Attack animation repeats when the sprites move</w:t>
+            </w:r>
           </w:p>
           <w:p>
             <w:pPr>
@@ -4684,27 +4272,15 @@
                 <w:lang w:eastAsia="en-NZ"/>
               </w:rPr>
             </w:pPr>
-            <w:proofErr w:type="gramStart"/>
-            <w:r>
-              <w:rPr>
-                <w:rFonts w:ascii="Consolas" w:eastAsia="Times New Roman" w:hAnsi="Consolas" w:cs="Times New Roman"/>
-                <w:color w:val="CCCCCC"/>
-                <w:sz w:val="21"/>
-                <w:szCs w:val="21"/>
-                <w:lang w:eastAsia="en-NZ"/>
-              </w:rPr>
-              <w:t>So</w:t>
-            </w:r>
-            <w:proofErr w:type="gramEnd"/>
-            <w:r>
-              <w:rPr>
-                <w:rFonts w:ascii="Consolas" w:eastAsia="Times New Roman" w:hAnsi="Consolas" w:cs="Times New Roman"/>
-                <w:color w:val="CCCCCC"/>
-                <w:sz w:val="21"/>
-                <w:szCs w:val="21"/>
-                <w:lang w:eastAsia="en-NZ"/>
-              </w:rPr>
-              <w:t xml:space="preserve"> I stopped the enemy sprite movement when attack</w:t>
+            <w:r>
+              <w:rPr>
+                <w:rFonts w:ascii="Consolas" w:eastAsia="Times New Roman" w:hAnsi="Consolas" w:cs="Times New Roman"/>
+                <w:color w:val="CCCCCC"/>
+                <w:sz w:val="21"/>
+                <w:szCs w:val="21"/>
+                <w:lang w:eastAsia="en-NZ"/>
+              </w:rPr>
+              <w:t>So I stopped the enemy sprite movement when attack</w:t>
             </w:r>
           </w:p>
           <w:p>
@@ -4913,15 +4489,7 @@
           </w:tcPr>
           <w:p>
             <w:r>
-              <w:t xml:space="preserve">Animation doesn’t work for </w:t>
-            </w:r>
-            <w:proofErr w:type="gramStart"/>
-            <w:r>
-              <w:t>other</w:t>
-            </w:r>
-            <w:proofErr w:type="gramEnd"/>
-            <w:r>
-              <w:t xml:space="preserve"> enemy sprite</w:t>
+              <w:t>Animation doesn’t work for other enemy sprite</w:t>
             </w:r>
           </w:p>
         </w:tc>
@@ -5389,13 +4957,8 @@
           </w:tcPr>
           <w:p>
             <w:r>
-              <w:t xml:space="preserve">Defined self in </w:t>
-            </w:r>
-            <w:proofErr w:type="spellStart"/>
-            <w:r>
-              <w:t>init</w:t>
-            </w:r>
-            <w:proofErr w:type="spellEnd"/>
+              <w:t>Defined self in init</w:t>
+            </w:r>
           </w:p>
         </w:tc>
       </w:tr>
@@ -5807,15 +5370,7 @@
           </w:tcPr>
           <w:p>
             <w:r>
-              <w:t xml:space="preserve">Animation </w:t>
-            </w:r>
-            <w:proofErr w:type="gramStart"/>
-            <w:r>
-              <w:t>is  a</w:t>
-            </w:r>
-            <w:proofErr w:type="gramEnd"/>
-            <w:r>
-              <w:t xml:space="preserve"> bit buggy</w:t>
+              <w:t>Animation is  a bit buggy</w:t>
             </w:r>
           </w:p>
         </w:tc>
@@ -5825,17 +5380,7 @@
           </w:tcPr>
           <w:p>
             <w:r>
-              <w:t xml:space="preserve">Made the normal idle and walking animation only run if </w:t>
-            </w:r>
-            <w:proofErr w:type="spellStart"/>
-            <w:proofErr w:type="gramStart"/>
-            <w:r>
-              <w:t>self.if</w:t>
-            </w:r>
-            <w:proofErr w:type="spellEnd"/>
-            <w:proofErr w:type="gramEnd"/>
-            <w:r>
-              <w:t>-hit wasn’t true</w:t>
+              <w:t>Made the normal idle and walking animation only run if self.if-hit wasn’t true</w:t>
             </w:r>
           </w:p>
         </w:tc>
@@ -6239,6 +5784,9 @@
           </w:tcPr>
           <w:p>
             <w:r>
+              <w:rPr>
+                <w:noProof/>
+              </w:rPr>
               <w:drawing>
                 <wp:inline distT="0" distB="0" distL="0" distR="0" wp14:anchorId="35794512" wp14:editId="085B8973">
                   <wp:extent cx="3858163" cy="1181265"/>
@@ -6410,6 +5958,9 @@
           </w:tcPr>
           <w:p>
             <w:r>
+              <w:rPr>
+                <w:noProof/>
+              </w:rPr>
               <w:drawing>
                 <wp:inline distT="0" distB="0" distL="0" distR="0" wp14:anchorId="580CF0EA" wp14:editId="038335FA">
                   <wp:extent cx="3115110" cy="724001"/>
@@ -6648,15 +6199,7 @@
           </w:tcPr>
           <w:p>
             <w:r>
-              <w:t xml:space="preserve">Set </w:t>
-            </w:r>
-            <w:proofErr w:type="spellStart"/>
-            <w:r>
-              <w:t>if_hit</w:t>
-            </w:r>
-            <w:proofErr w:type="spellEnd"/>
-            <w:r>
-              <w:t xml:space="preserve"> variable to false after texture is et</w:t>
+              <w:t>Set if_hit variable to false after texture is et</w:t>
             </w:r>
           </w:p>
         </w:tc>
@@ -6999,15 +6542,7 @@
           </w:tcPr>
           <w:p>
             <w:r>
-              <w:t xml:space="preserve">Added the middle textures </w:t>
-            </w:r>
-            <w:proofErr w:type="gramStart"/>
-            <w:r>
-              <w:t>a</w:t>
-            </w:r>
-            <w:proofErr w:type="gramEnd"/>
-            <w:r>
-              <w:t xml:space="preserve"> the end of the texture list</w:t>
+              <w:t>Added the middle textures a the end of the texture list</w:t>
             </w:r>
           </w:p>
         </w:tc>
@@ -7063,7 +6598,157 @@
           <w:tcPr>
             <w:tcW w:w="1298" w:type="dxa"/>
           </w:tcPr>
-          <w:p/>
+          <w:p>
+            <w:r>
+              <w:t>Key sprite animation is correct</w:t>
+            </w:r>
+          </w:p>
+        </w:tc>
+        <w:tc>
+          <w:tcPr>
+            <w:tcW w:w="6291" w:type="dxa"/>
+          </w:tcPr>
+          <w:p>
+            <w:r>
+              <w:t>None</w:t>
+            </w:r>
+          </w:p>
+        </w:tc>
+      </w:tr>
+      <w:tr>
+        <w:trPr>
+          <w:gridAfter w:val="1"/>
+          <w:wAfter w:w="936" w:type="dxa"/>
+        </w:trPr>
+        <w:tc>
+          <w:tcPr>
+            <w:tcW w:w="762" w:type="dxa"/>
+          </w:tcPr>
+          <w:p>
+            <w:r>
+              <w:t>2/04</w:t>
+            </w:r>
+          </w:p>
+        </w:tc>
+        <w:tc>
+          <w:tcPr>
+            <w:tcW w:w="2777" w:type="dxa"/>
+            <w:gridSpan w:val="2"/>
+          </w:tcPr>
+          <w:p>
+            <w:r>
+              <w:t>Key sprite pickup</w:t>
+            </w:r>
+          </w:p>
+        </w:tc>
+        <w:tc>
+          <w:tcPr>
+            <w:tcW w:w="1417" w:type="dxa"/>
+          </w:tcPr>
+          <w:p>
+            <w:r>
+              <w:t>Expected</w:t>
+            </w:r>
+          </w:p>
+        </w:tc>
+        <w:tc>
+          <w:tcPr>
+            <w:tcW w:w="1342" w:type="dxa"/>
+            <w:gridSpan w:val="2"/>
+          </w:tcPr>
+          <w:p>
+            <w:r>
+              <w:t xml:space="preserve">Key sprite is removed from scene </w:t>
+            </w:r>
+            <w:r>
+              <w:lastRenderedPageBreak/>
+              <w:t>when picked up</w:t>
+            </w:r>
+          </w:p>
+        </w:tc>
+        <w:tc>
+          <w:tcPr>
+            <w:tcW w:w="1298" w:type="dxa"/>
+          </w:tcPr>
+          <w:p>
+            <w:r>
+              <w:lastRenderedPageBreak/>
+              <w:t xml:space="preserve">Key sprite is removed from scene </w:t>
+            </w:r>
+            <w:r>
+              <w:lastRenderedPageBreak/>
+              <w:t>when picked up</w:t>
+            </w:r>
+          </w:p>
+        </w:tc>
+        <w:tc>
+          <w:tcPr>
+            <w:tcW w:w="6291" w:type="dxa"/>
+          </w:tcPr>
+          <w:p>
+            <w:r>
+              <w:lastRenderedPageBreak/>
+              <w:t>None</w:t>
+            </w:r>
+          </w:p>
+        </w:tc>
+      </w:tr>
+      <w:tr>
+        <w:trPr>
+          <w:gridAfter w:val="1"/>
+          <w:wAfter w:w="936" w:type="dxa"/>
+        </w:trPr>
+        <w:tc>
+          <w:tcPr>
+            <w:tcW w:w="762" w:type="dxa"/>
+          </w:tcPr>
+          <w:p>
+            <w:r>
+              <w:t>2/04</w:t>
+            </w:r>
+          </w:p>
+        </w:tc>
+        <w:tc>
+          <w:tcPr>
+            <w:tcW w:w="2777" w:type="dxa"/>
+            <w:gridSpan w:val="2"/>
+          </w:tcPr>
+          <w:p>
+            <w:r>
+              <w:t>Player health on draw</w:t>
+            </w:r>
+          </w:p>
+        </w:tc>
+        <w:tc>
+          <w:tcPr>
+            <w:tcW w:w="1417" w:type="dxa"/>
+          </w:tcPr>
+          <w:p>
+            <w:r>
+              <w:t>Expected</w:t>
+            </w:r>
+          </w:p>
+        </w:tc>
+        <w:tc>
+          <w:tcPr>
+            <w:tcW w:w="1342" w:type="dxa"/>
+            <w:gridSpan w:val="2"/>
+          </w:tcPr>
+          <w:p>
+            <w:r>
+              <w:t>Player health is displayed on the screen</w:t>
+            </w:r>
+          </w:p>
+        </w:tc>
+        <w:tc>
+          <w:tcPr>
+            <w:tcW w:w="1298" w:type="dxa"/>
+          </w:tcPr>
+          <w:p>
+            <w:r>
+              <w:t>Player health is displayed on screen</w:t>
+            </w:r>
+          </w:p>
         </w:tc>
         <w:tc>
           <w:tcPr>

</xml_diff>

<commit_message>
fixed enemy attacking bugs
</commit_message>
<xml_diff>
--- a/documentation/ongoing_testing.docx
+++ b/documentation/ongoing_testing.docx
@@ -6754,7 +6754,11 @@
           <w:tcPr>
             <w:tcW w:w="6291" w:type="dxa"/>
           </w:tcPr>
-          <w:p/>
+          <w:p>
+            <w:r>
+              <w:t>None</w:t>
+            </w:r>
+          </w:p>
         </w:tc>
       </w:tr>
     </w:tbl>

</xml_diff>

<commit_message>
fixed player attack animation
</commit_message>
<xml_diff>
--- a/documentation/ongoing_testing.docx
+++ b/documentation/ongoing_testing.docx
@@ -6757,6 +6757,74 @@
           <w:p>
             <w:r>
               <w:t>None</w:t>
+            </w:r>
+          </w:p>
+        </w:tc>
+      </w:tr>
+      <w:tr>
+        <w:trPr>
+          <w:gridAfter w:val="1"/>
+          <w:wAfter w:w="936" w:type="dxa"/>
+        </w:trPr>
+        <w:tc>
+          <w:tcPr>
+            <w:tcW w:w="762" w:type="dxa"/>
+          </w:tcPr>
+          <w:p>
+            <w:r>
+              <w:t>3/04</w:t>
+            </w:r>
+          </w:p>
+        </w:tc>
+        <w:tc>
+          <w:tcPr>
+            <w:tcW w:w="2777" w:type="dxa"/>
+            <w:gridSpan w:val="2"/>
+          </w:tcPr>
+          <w:p>
+            <w:r>
+              <w:t>Player attack animation</w:t>
+            </w:r>
+          </w:p>
+        </w:tc>
+        <w:tc>
+          <w:tcPr>
+            <w:tcW w:w="1417" w:type="dxa"/>
+          </w:tcPr>
+          <w:p>
+            <w:r>
+              <w:t>Expected</w:t>
+            </w:r>
+          </w:p>
+        </w:tc>
+        <w:tc>
+          <w:tcPr>
+            <w:tcW w:w="1342" w:type="dxa"/>
+            <w:gridSpan w:val="2"/>
+          </w:tcPr>
+          <w:p>
+            <w:r>
+              <w:t>Play attack animation plays without bugs</w:t>
+            </w:r>
+          </w:p>
+        </w:tc>
+        <w:tc>
+          <w:tcPr>
+            <w:tcW w:w="1298" w:type="dxa"/>
+          </w:tcPr>
+          <w:p>
+            <w:r>
+              <w:t>Player attack animation is buggy</w:t>
+            </w:r>
+          </w:p>
+        </w:tc>
+        <w:tc>
+          <w:tcPr>
+            <w:tcW w:w="6291" w:type="dxa"/>
+          </w:tcPr>
+          <w:p>
+            <w:r>
+              <w:t>Set the attack parameter to false when the enemy is hit so the player can’t hold space to attack</w:t>
             </w:r>
           </w:p>
         </w:tc>

</xml_diff>

<commit_message>
fixed enemy attack and added player float mechanic
</commit_message>
<xml_diff>
--- a/documentation/ongoing_testing.docx
+++ b/documentation/ongoing_testing.docx
@@ -6826,7 +6826,74 @@
             <w:r>
               <w:t>Set the attack parameter to false when the enemy is hit so the player can’t hold space to attack</w:t>
             </w:r>
-          </w:p>
+            <w:r>
+              <w:t>.</w:t>
+            </w:r>
+          </w:p>
+        </w:tc>
+      </w:tr>
+      <w:tr>
+        <w:trPr>
+          <w:gridAfter w:val="1"/>
+          <w:wAfter w:w="936" w:type="dxa"/>
+        </w:trPr>
+        <w:tc>
+          <w:tcPr>
+            <w:tcW w:w="762" w:type="dxa"/>
+          </w:tcPr>
+          <w:p>
+            <w:r>
+              <w:t>4/04</w:t>
+            </w:r>
+          </w:p>
+        </w:tc>
+        <w:tc>
+          <w:tcPr>
+            <w:tcW w:w="2777" w:type="dxa"/>
+            <w:gridSpan w:val="2"/>
+          </w:tcPr>
+          <w:p>
+            <w:r>
+              <w:t>Enemy attack bug fix</w:t>
+            </w:r>
+          </w:p>
+        </w:tc>
+        <w:tc>
+          <w:tcPr>
+            <w:tcW w:w="1417" w:type="dxa"/>
+          </w:tcPr>
+          <w:p>
+            <w:r>
+              <w:t>Expected</w:t>
+            </w:r>
+          </w:p>
+        </w:tc>
+        <w:tc>
+          <w:tcPr>
+            <w:tcW w:w="1342" w:type="dxa"/>
+            <w:gridSpan w:val="2"/>
+          </w:tcPr>
+          <w:p>
+            <w:r>
+              <w:t>When enemy attacks player the player only loses one health at a time</w:t>
+            </w:r>
+          </w:p>
+        </w:tc>
+        <w:tc>
+          <w:tcPr>
+            <w:tcW w:w="1298" w:type="dxa"/>
+          </w:tcPr>
+          <w:p>
+            <w:r>
+              <w:t>Enemy does no damage to player</w:t>
+            </w:r>
+          </w:p>
+        </w:tc>
+        <w:tc>
+          <w:tcPr>
+            <w:tcW w:w="6291" w:type="dxa"/>
+          </w:tcPr>
+          <w:p/>
         </w:tc>
       </w:tr>
     </w:tbl>

</xml_diff>

<commit_message>
forgot to name one last thing
</commit_message>
<xml_diff>
--- a/documentation/ongoing_testing.docx
+++ b/documentation/ongoing_testing.docx
@@ -111,7 +111,15 @@
           </w:tcPr>
           <w:p>
             <w:r>
-              <w:t>Vs code complains about vstd compression</w:t>
+              <w:t xml:space="preserve">Vs code complains about </w:t>
+            </w:r>
+            <w:proofErr w:type="spellStart"/>
+            <w:r>
+              <w:t>vstd</w:t>
+            </w:r>
+            <w:proofErr w:type="spellEnd"/>
+            <w:r>
+              <w:t xml:space="preserve"> compression</w:t>
             </w:r>
           </w:p>
         </w:tc>
@@ -122,8 +130,13 @@
           </w:tcPr>
           <w:p>
             <w:r>
-              <w:t>Changed compression type to zlib</w:t>
-            </w:r>
+              <w:t xml:space="preserve">Changed compression type to </w:t>
+            </w:r>
+            <w:proofErr w:type="spellStart"/>
+            <w:r>
+              <w:t>zlib</w:t>
+            </w:r>
+            <w:proofErr w:type="spellEnd"/>
           </w:p>
         </w:tc>
       </w:tr>
@@ -353,6 +366,7 @@
                 <w:lang w:eastAsia="en-NZ"/>
               </w:rPr>
             </w:pPr>
+            <w:proofErr w:type="spellStart"/>
             <w:r>
               <w:rPr>
                 <w:rFonts w:ascii="Consolas" w:eastAsia="Times New Roman" w:hAnsi="Consolas" w:cs="Times New Roman"/>
@@ -383,6 +397,7 @@
               </w:rPr>
               <w:t>hit_box</w:t>
             </w:r>
+            <w:proofErr w:type="spellEnd"/>
             <w:r>
               <w:rPr>
                 <w:rFonts w:ascii="Consolas" w:eastAsia="Times New Roman" w:hAnsi="Consolas" w:cs="Times New Roman"/>
@@ -393,6 +408,7 @@
               </w:rPr>
               <w:t xml:space="preserve"> = </w:t>
             </w:r>
+            <w:proofErr w:type="spellStart"/>
             <w:r>
               <w:rPr>
                 <w:rFonts w:ascii="Consolas" w:eastAsia="Times New Roman" w:hAnsi="Consolas" w:cs="Times New Roman"/>
@@ -433,6 +449,7 @@
               </w:rPr>
               <w:t>.hit_box_points</w:t>
             </w:r>
+            <w:proofErr w:type="spellEnd"/>
           </w:p>
           <w:p/>
         </w:tc>
@@ -524,6 +541,8 @@
               </w:rPr>
               <w:t xml:space="preserve">        </w:t>
             </w:r>
+            <w:proofErr w:type="spellStart"/>
+            <w:proofErr w:type="gramStart"/>
             <w:r>
               <w:rPr>
                 <w:rFonts w:ascii="Consolas" w:eastAsia="Times New Roman" w:hAnsi="Consolas" w:cs="Times New Roman"/>
@@ -552,8 +571,20 @@
                 <w:szCs w:val="21"/>
                 <w:lang w:eastAsia="en-NZ"/>
               </w:rPr>
-              <w:t>hitbox_texture</w:t>
-            </w:r>
+              <w:t>hitbox</w:t>
+            </w:r>
+            <w:proofErr w:type="gramEnd"/>
+            <w:r>
+              <w:rPr>
+                <w:rFonts w:ascii="Consolas" w:eastAsia="Times New Roman" w:hAnsi="Consolas" w:cs="Times New Roman"/>
+                <w:color w:val="9CDCFE"/>
+                <w:sz w:val="21"/>
+                <w:szCs w:val="21"/>
+                <w:lang w:eastAsia="en-NZ"/>
+              </w:rPr>
+              <w:t>_texture</w:t>
+            </w:r>
+            <w:proofErr w:type="spellEnd"/>
             <w:r>
               <w:rPr>
                 <w:rFonts w:ascii="Consolas" w:eastAsia="Times New Roman" w:hAnsi="Consolas" w:cs="Times New Roman"/>
@@ -564,6 +595,7 @@
               </w:rPr>
               <w:t xml:space="preserve"> = </w:t>
             </w:r>
+            <w:proofErr w:type="spellStart"/>
             <w:r>
               <w:rPr>
                 <w:rFonts w:ascii="Consolas" w:eastAsia="Times New Roman" w:hAnsi="Consolas" w:cs="Times New Roman"/>
@@ -594,6 +626,7 @@
               </w:rPr>
               <w:t>idle_texture_pair</w:t>
             </w:r>
+            <w:proofErr w:type="spellEnd"/>
             <w:r>
               <w:rPr>
                 <w:rFonts w:ascii="Consolas" w:eastAsia="Times New Roman" w:hAnsi="Consolas" w:cs="Times New Roman"/>
@@ -647,6 +680,7 @@
               </w:rPr>
               <w:t xml:space="preserve">        </w:t>
             </w:r>
+            <w:proofErr w:type="spellStart"/>
             <w:r>
               <w:rPr>
                 <w:rFonts w:ascii="Consolas" w:eastAsia="Times New Roman" w:hAnsi="Consolas" w:cs="Times New Roman"/>
@@ -677,6 +711,7 @@
               </w:rPr>
               <w:t>hit_box</w:t>
             </w:r>
+            <w:proofErr w:type="spellEnd"/>
             <w:r>
               <w:rPr>
                 <w:rFonts w:ascii="Consolas" w:eastAsia="Times New Roman" w:hAnsi="Consolas" w:cs="Times New Roman"/>
@@ -687,6 +722,7 @@
               </w:rPr>
               <w:t xml:space="preserve"> = </w:t>
             </w:r>
+            <w:proofErr w:type="spellStart"/>
             <w:r>
               <w:rPr>
                 <w:rFonts w:ascii="Consolas" w:eastAsia="Times New Roman" w:hAnsi="Consolas" w:cs="Times New Roman"/>
@@ -737,6 +773,7 @@
               </w:rPr>
               <w:t>hit_box_points</w:t>
             </w:r>
+            <w:proofErr w:type="spellEnd"/>
           </w:p>
           <w:p/>
         </w:tc>
@@ -898,7 +935,15 @@
           </w:tcPr>
           <w:p>
             <w:r>
-              <w:t>Called function in on_update function</w:t>
+              <w:t xml:space="preserve">Called function in </w:t>
+            </w:r>
+            <w:proofErr w:type="spellStart"/>
+            <w:r>
+              <w:t>on_update</w:t>
+            </w:r>
+            <w:proofErr w:type="spellEnd"/>
+            <w:r>
+              <w:t xml:space="preserve"> function</w:t>
             </w:r>
           </w:p>
         </w:tc>
@@ -1042,6 +1087,8 @@
               </w:rPr>
               <w:t xml:space="preserve"> </w:t>
             </w:r>
+            <w:proofErr w:type="spellStart"/>
+            <w:proofErr w:type="gramStart"/>
             <w:r>
               <w:rPr>
                 <w:rFonts w:ascii="Consolas" w:eastAsia="Times New Roman" w:hAnsi="Consolas" w:cs="Times New Roman"/>
@@ -1070,8 +1117,20 @@
                 <w:szCs w:val="21"/>
                 <w:lang w:eastAsia="en-NZ"/>
               </w:rPr>
-              <w:t>change_y</w:t>
-            </w:r>
+              <w:t>change</w:t>
+            </w:r>
+            <w:proofErr w:type="gramEnd"/>
+            <w:r>
+              <w:rPr>
+                <w:rFonts w:ascii="Consolas" w:eastAsia="Times New Roman" w:hAnsi="Consolas" w:cs="Times New Roman"/>
+                <w:color w:val="9CDCFE"/>
+                <w:sz w:val="21"/>
+                <w:szCs w:val="21"/>
+                <w:lang w:eastAsia="en-NZ"/>
+              </w:rPr>
+              <w:t>_y</w:t>
+            </w:r>
+            <w:proofErr w:type="spellEnd"/>
             <w:r>
               <w:rPr>
                 <w:rFonts w:ascii="Consolas" w:eastAsia="Times New Roman" w:hAnsi="Consolas" w:cs="Times New Roman"/>
@@ -1145,6 +1204,8 @@
               </w:rPr>
               <w:t xml:space="preserve">            </w:t>
             </w:r>
+            <w:proofErr w:type="spellStart"/>
+            <w:proofErr w:type="gramStart"/>
             <w:r>
               <w:rPr>
                 <w:rFonts w:ascii="Consolas" w:eastAsia="Times New Roman" w:hAnsi="Consolas" w:cs="Times New Roman"/>
@@ -1175,6 +1236,8 @@
               </w:rPr>
               <w:t>texture</w:t>
             </w:r>
+            <w:proofErr w:type="spellEnd"/>
+            <w:proofErr w:type="gramEnd"/>
             <w:r>
               <w:rPr>
                 <w:rFonts w:ascii="Consolas" w:eastAsia="Times New Roman" w:hAnsi="Consolas" w:cs="Times New Roman"/>
@@ -1205,6 +1268,7 @@
               </w:rPr>
               <w:t xml:space="preserve"> </w:t>
             </w:r>
+            <w:proofErr w:type="spellStart"/>
             <w:r>
               <w:rPr>
                 <w:rFonts w:ascii="Consolas" w:eastAsia="Times New Roman" w:hAnsi="Consolas" w:cs="Times New Roman"/>
@@ -1235,6 +1299,7 @@
               </w:rPr>
               <w:t>fall_textures</w:t>
             </w:r>
+            <w:proofErr w:type="spellEnd"/>
             <w:r>
               <w:rPr>
                 <w:rFonts w:ascii="Consolas" w:eastAsia="Times New Roman" w:hAnsi="Consolas" w:cs="Times New Roman"/>
@@ -1265,6 +1330,7 @@
               </w:rPr>
               <w:t>][</w:t>
             </w:r>
+            <w:proofErr w:type="spellStart"/>
             <w:r>
               <w:rPr>
                 <w:rFonts w:ascii="Consolas" w:eastAsia="Times New Roman" w:hAnsi="Consolas" w:cs="Times New Roman"/>
@@ -1295,6 +1361,7 @@
               </w:rPr>
               <w:t>character_face_direction</w:t>
             </w:r>
+            <w:proofErr w:type="spellEnd"/>
             <w:r>
               <w:rPr>
                 <w:rFonts w:ascii="Consolas" w:eastAsia="Times New Roman" w:hAnsi="Consolas" w:cs="Times New Roman"/>
@@ -1348,6 +1415,8 @@
               </w:rPr>
               <w:t xml:space="preserve"> </w:t>
             </w:r>
+            <w:proofErr w:type="spellStart"/>
+            <w:proofErr w:type="gramStart"/>
             <w:r>
               <w:rPr>
                 <w:rFonts w:ascii="Consolas" w:eastAsia="Times New Roman" w:hAnsi="Consolas" w:cs="Times New Roman"/>
@@ -1376,8 +1445,20 @@
                 <w:szCs w:val="21"/>
                 <w:lang w:eastAsia="en-NZ"/>
               </w:rPr>
-              <w:t>change_y</w:t>
-            </w:r>
+              <w:t>change</w:t>
+            </w:r>
+            <w:proofErr w:type="gramEnd"/>
+            <w:r>
+              <w:rPr>
+                <w:rFonts w:ascii="Consolas" w:eastAsia="Times New Roman" w:hAnsi="Consolas" w:cs="Times New Roman"/>
+                <w:color w:val="9CDCFE"/>
+                <w:sz w:val="21"/>
+                <w:szCs w:val="21"/>
+                <w:lang w:eastAsia="en-NZ"/>
+              </w:rPr>
+              <w:t>_y</w:t>
+            </w:r>
+            <w:proofErr w:type="spellEnd"/>
             <w:r>
               <w:rPr>
                 <w:rFonts w:ascii="Consolas" w:eastAsia="Times New Roman" w:hAnsi="Consolas" w:cs="Times New Roman"/>
@@ -1461,6 +1542,8 @@
               </w:rPr>
               <w:t xml:space="preserve">            </w:t>
             </w:r>
+            <w:proofErr w:type="spellStart"/>
+            <w:proofErr w:type="gramStart"/>
             <w:r>
               <w:rPr>
                 <w:rFonts w:ascii="Consolas" w:eastAsia="Times New Roman" w:hAnsi="Consolas" w:cs="Times New Roman"/>
@@ -1491,6 +1574,8 @@
               </w:rPr>
               <w:t>texture</w:t>
             </w:r>
+            <w:proofErr w:type="spellEnd"/>
+            <w:proofErr w:type="gramEnd"/>
             <w:r>
               <w:rPr>
                 <w:rFonts w:ascii="Consolas" w:eastAsia="Times New Roman" w:hAnsi="Consolas" w:cs="Times New Roman"/>
@@ -1521,6 +1606,7 @@
               </w:rPr>
               <w:t xml:space="preserve"> </w:t>
             </w:r>
+            <w:proofErr w:type="spellStart"/>
             <w:r>
               <w:rPr>
                 <w:rFonts w:ascii="Consolas" w:eastAsia="Times New Roman" w:hAnsi="Consolas" w:cs="Times New Roman"/>
@@ -1551,6 +1637,7 @@
               </w:rPr>
               <w:t>fall_textures</w:t>
             </w:r>
+            <w:proofErr w:type="spellEnd"/>
             <w:r>
               <w:rPr>
                 <w:rFonts w:ascii="Consolas" w:eastAsia="Times New Roman" w:hAnsi="Consolas" w:cs="Times New Roman"/>
@@ -1581,6 +1668,7 @@
               </w:rPr>
               <w:t>][</w:t>
             </w:r>
+            <w:proofErr w:type="spellStart"/>
             <w:r>
               <w:rPr>
                 <w:rFonts w:ascii="Consolas" w:eastAsia="Times New Roman" w:hAnsi="Consolas" w:cs="Times New Roman"/>
@@ -1611,6 +1699,7 @@
               </w:rPr>
               <w:t>character_face_direction</w:t>
             </w:r>
+            <w:proofErr w:type="spellEnd"/>
             <w:r>
               <w:rPr>
                 <w:rFonts w:ascii="Consolas" w:eastAsia="Times New Roman" w:hAnsi="Consolas" w:cs="Times New Roman"/>
@@ -2259,7 +2348,63 @@
                 <w:szCs w:val="21"/>
                 <w:lang w:eastAsia="en-NZ"/>
               </w:rPr>
-              <w:t>Changed code from self.change_x to self.center += x</w:t>
+              <w:t xml:space="preserve">Changed code from </w:t>
+            </w:r>
+            <w:proofErr w:type="spellStart"/>
+            <w:proofErr w:type="gramStart"/>
+            <w:r>
+              <w:rPr>
+                <w:rFonts w:ascii="Consolas" w:eastAsia="Times New Roman" w:hAnsi="Consolas" w:cs="Times New Roman"/>
+                <w:color w:val="CCCCCC"/>
+                <w:sz w:val="21"/>
+                <w:szCs w:val="21"/>
+                <w:lang w:eastAsia="en-NZ"/>
+              </w:rPr>
+              <w:t>self.change</w:t>
+            </w:r>
+            <w:proofErr w:type="gramEnd"/>
+            <w:r>
+              <w:rPr>
+                <w:rFonts w:ascii="Consolas" w:eastAsia="Times New Roman" w:hAnsi="Consolas" w:cs="Times New Roman"/>
+                <w:color w:val="CCCCCC"/>
+                <w:sz w:val="21"/>
+                <w:szCs w:val="21"/>
+                <w:lang w:eastAsia="en-NZ"/>
+              </w:rPr>
+              <w:t>_x</w:t>
+            </w:r>
+            <w:proofErr w:type="spellEnd"/>
+            <w:r>
+              <w:rPr>
+                <w:rFonts w:ascii="Consolas" w:eastAsia="Times New Roman" w:hAnsi="Consolas" w:cs="Times New Roman"/>
+                <w:color w:val="CCCCCC"/>
+                <w:sz w:val="21"/>
+                <w:szCs w:val="21"/>
+                <w:lang w:eastAsia="en-NZ"/>
+              </w:rPr>
+              <w:t xml:space="preserve"> to </w:t>
+            </w:r>
+            <w:proofErr w:type="spellStart"/>
+            <w:r>
+              <w:rPr>
+                <w:rFonts w:ascii="Consolas" w:eastAsia="Times New Roman" w:hAnsi="Consolas" w:cs="Times New Roman"/>
+                <w:color w:val="CCCCCC"/>
+                <w:sz w:val="21"/>
+                <w:szCs w:val="21"/>
+                <w:lang w:eastAsia="en-NZ"/>
+              </w:rPr>
+              <w:t>self.center</w:t>
+            </w:r>
+            <w:proofErr w:type="spellEnd"/>
+            <w:r>
+              <w:rPr>
+                <w:rFonts w:ascii="Consolas" w:eastAsia="Times New Roman" w:hAnsi="Consolas" w:cs="Times New Roman"/>
+                <w:color w:val="CCCCCC"/>
+                <w:sz w:val="21"/>
+                <w:szCs w:val="21"/>
+                <w:lang w:eastAsia="en-NZ"/>
+              </w:rPr>
+              <w:t xml:space="preserve"> += x</w:t>
             </w:r>
           </w:p>
         </w:tc>
@@ -2305,8 +2450,13 @@
           </w:tcPr>
           <w:p>
             <w:r>
-              <w:t>Enemy sprites moves</w:t>
-            </w:r>
+              <w:t xml:space="preserve">Enemy sprites </w:t>
+            </w:r>
+            <w:proofErr w:type="gramStart"/>
+            <w:r>
+              <w:t>moves</w:t>
+            </w:r>
+            <w:proofErr w:type="gramEnd"/>
           </w:p>
         </w:tc>
         <w:tc>
@@ -2360,8 +2510,13 @@
           </w:tcPr>
           <w:p>
             <w:r>
-              <w:t>Enemy sprite movment</w:t>
-            </w:r>
+              <w:t xml:space="preserve">Enemy sprite </w:t>
+            </w:r>
+            <w:proofErr w:type="spellStart"/>
+            <w:r>
+              <w:t>movment</w:t>
+            </w:r>
+            <w:proofErr w:type="spellEnd"/>
           </w:p>
         </w:tc>
         <w:tc>
@@ -2370,7 +2525,15 @@
           </w:tcPr>
           <w:p>
             <w:r>
-              <w:t xml:space="preserve">Enemy enemy sprites make small movements left and right and jump </w:t>
+              <w:t xml:space="preserve">Enemy </w:t>
+            </w:r>
+            <w:proofErr w:type="spellStart"/>
+            <w:r>
+              <w:t>enemy</w:t>
+            </w:r>
+            <w:proofErr w:type="spellEnd"/>
+            <w:r>
+              <w:t xml:space="preserve"> sprites make small movements left and right and jump </w:t>
             </w:r>
           </w:p>
         </w:tc>
@@ -2552,6 +2715,7 @@
                 <w:lang w:eastAsia="en-NZ"/>
               </w:rPr>
             </w:pPr>
+            <w:proofErr w:type="spellStart"/>
             <w:r>
               <w:rPr>
                 <w:rFonts w:ascii="Consolas" w:eastAsia="Times New Roman" w:hAnsi="Consolas" w:cs="Times New Roman"/>
@@ -2562,6 +2726,7 @@
               </w:rPr>
               <w:t>elif</w:t>
             </w:r>
+            <w:proofErr w:type="spellEnd"/>
             <w:r>
               <w:rPr>
                 <w:rFonts w:ascii="Consolas" w:eastAsia="Times New Roman" w:hAnsi="Consolas" w:cs="Times New Roman"/>
@@ -2572,6 +2737,8 @@
               </w:rPr>
               <w:t xml:space="preserve"> </w:t>
             </w:r>
+            <w:proofErr w:type="spellStart"/>
+            <w:proofErr w:type="gramStart"/>
             <w:r>
               <w:rPr>
                 <w:rFonts w:ascii="Consolas" w:eastAsia="Times New Roman" w:hAnsi="Consolas" w:cs="Times New Roman"/>
@@ -2602,6 +2769,8 @@
               </w:rPr>
               <w:t>direction</w:t>
             </w:r>
+            <w:proofErr w:type="spellEnd"/>
+            <w:proofErr w:type="gramEnd"/>
             <w:r>
               <w:rPr>
                 <w:rFonts w:ascii="Consolas" w:eastAsia="Times New Roman" w:hAnsi="Consolas" w:cs="Times New Roman"/>
@@ -2675,6 +2844,8 @@
               </w:rPr>
               <w:t xml:space="preserve">            </w:t>
             </w:r>
+            <w:proofErr w:type="spellStart"/>
+            <w:proofErr w:type="gramStart"/>
             <w:r>
               <w:rPr>
                 <w:rFonts w:ascii="Consolas" w:eastAsia="Times New Roman" w:hAnsi="Consolas" w:cs="Times New Roman"/>
@@ -2703,8 +2874,20 @@
                 <w:szCs w:val="21"/>
                 <w:lang w:eastAsia="en-NZ"/>
               </w:rPr>
-              <w:t>change_x</w:t>
-            </w:r>
+              <w:t>change</w:t>
+            </w:r>
+            <w:proofErr w:type="gramEnd"/>
+            <w:r>
+              <w:rPr>
+                <w:rFonts w:ascii="Consolas" w:eastAsia="Times New Roman" w:hAnsi="Consolas" w:cs="Times New Roman"/>
+                <w:color w:val="9CDCFE"/>
+                <w:sz w:val="21"/>
+                <w:szCs w:val="21"/>
+                <w:lang w:eastAsia="en-NZ"/>
+              </w:rPr>
+              <w:t>_x</w:t>
+            </w:r>
+            <w:proofErr w:type="spellEnd"/>
             <w:r>
               <w:rPr>
                 <w:rFonts w:ascii="Consolas" w:eastAsia="Times New Roman" w:hAnsi="Consolas" w:cs="Times New Roman"/>
@@ -2878,6 +3061,7 @@
                 <w:lang w:eastAsia="en-NZ"/>
               </w:rPr>
             </w:pPr>
+            <w:proofErr w:type="gramStart"/>
             <w:r>
               <w:rPr>
                 <w:rFonts w:ascii="Consolas" w:eastAsia="Times New Roman" w:hAnsi="Consolas" w:cs="Times New Roman"/>
@@ -2886,7 +3070,62 @@
                 <w:szCs w:val="21"/>
                 <w:lang w:eastAsia="en-NZ"/>
               </w:rPr>
-              <w:t>Changed .change_x -= 3 to  .change_x = -3</w:t>
+              <w:t>Changed .</w:t>
+            </w:r>
+            <w:proofErr w:type="spellStart"/>
+            <w:r>
+              <w:rPr>
+                <w:rFonts w:ascii="Consolas" w:eastAsia="Times New Roman" w:hAnsi="Consolas" w:cs="Times New Roman"/>
+                <w:color w:val="C586C0"/>
+                <w:sz w:val="21"/>
+                <w:szCs w:val="21"/>
+                <w:lang w:eastAsia="en-NZ"/>
+              </w:rPr>
+              <w:t>change</w:t>
+            </w:r>
+            <w:proofErr w:type="gramEnd"/>
+            <w:r>
+              <w:rPr>
+                <w:rFonts w:ascii="Consolas" w:eastAsia="Times New Roman" w:hAnsi="Consolas" w:cs="Times New Roman"/>
+                <w:color w:val="C586C0"/>
+                <w:sz w:val="21"/>
+                <w:szCs w:val="21"/>
+                <w:lang w:eastAsia="en-NZ"/>
+              </w:rPr>
+              <w:t>_x</w:t>
+            </w:r>
+            <w:proofErr w:type="spellEnd"/>
+            <w:r>
+              <w:rPr>
+                <w:rFonts w:ascii="Consolas" w:eastAsia="Times New Roman" w:hAnsi="Consolas" w:cs="Times New Roman"/>
+                <w:color w:val="C586C0"/>
+                <w:sz w:val="21"/>
+                <w:szCs w:val="21"/>
+                <w:lang w:eastAsia="en-NZ"/>
+              </w:rPr>
+              <w:t xml:space="preserve"> -= 3 to  .</w:t>
+            </w:r>
+            <w:proofErr w:type="spellStart"/>
+            <w:r>
+              <w:rPr>
+                <w:rFonts w:ascii="Consolas" w:eastAsia="Times New Roman" w:hAnsi="Consolas" w:cs="Times New Roman"/>
+                <w:color w:val="C586C0"/>
+                <w:sz w:val="21"/>
+                <w:szCs w:val="21"/>
+                <w:lang w:eastAsia="en-NZ"/>
+              </w:rPr>
+              <w:t>change_x</w:t>
+            </w:r>
+            <w:proofErr w:type="spellEnd"/>
+            <w:r>
+              <w:rPr>
+                <w:rFonts w:ascii="Consolas" w:eastAsia="Times New Roman" w:hAnsi="Consolas" w:cs="Times New Roman"/>
+                <w:color w:val="C586C0"/>
+                <w:sz w:val="21"/>
+                <w:szCs w:val="21"/>
+                <w:lang w:eastAsia="en-NZ"/>
+              </w:rPr>
+              <w:t xml:space="preserve"> = -3</w:t>
             </w:r>
           </w:p>
         </w:tc>
@@ -3113,6 +3352,7 @@
               </w:rPr>
               <w:t> </w:t>
             </w:r>
+            <w:proofErr w:type="spellStart"/>
             <w:r>
               <w:rPr>
                 <w:rFonts w:ascii="Consolas" w:eastAsia="Times New Roman" w:hAnsi="Consolas" w:cs="Times New Roman"/>
@@ -3123,6 +3363,7 @@
               </w:rPr>
               <w:t>elif</w:t>
             </w:r>
+            <w:proofErr w:type="spellEnd"/>
             <w:r>
               <w:rPr>
                 <w:rFonts w:ascii="Consolas" w:eastAsia="Times New Roman" w:hAnsi="Consolas" w:cs="Times New Roman"/>
@@ -3173,6 +3414,8 @@
               </w:rPr>
               <w:t xml:space="preserve"> </w:t>
             </w:r>
+            <w:proofErr w:type="spellStart"/>
+            <w:proofErr w:type="gramStart"/>
             <w:r>
               <w:rPr>
                 <w:rFonts w:ascii="Consolas" w:eastAsia="Times New Roman" w:hAnsi="Consolas" w:cs="Times New Roman"/>
@@ -3223,6 +3466,8 @@
               </w:rPr>
               <w:t>SPACE</w:t>
             </w:r>
+            <w:proofErr w:type="spellEnd"/>
+            <w:proofErr w:type="gramEnd"/>
             <w:r>
               <w:rPr>
                 <w:rFonts w:ascii="Consolas" w:eastAsia="Times New Roman" w:hAnsi="Consolas" w:cs="Times New Roman"/>
@@ -3256,6 +3501,8 @@
               </w:rPr>
               <w:t>   </w:t>
             </w:r>
+            <w:proofErr w:type="spellStart"/>
+            <w:proofErr w:type="gramStart"/>
             <w:r>
               <w:rPr>
                 <w:rFonts w:ascii="Consolas" w:eastAsia="Times New Roman" w:hAnsi="Consolas" w:cs="Times New Roman"/>
@@ -3284,7 +3531,18 @@
                 <w:szCs w:val="21"/>
                 <w:lang w:eastAsia="en-NZ"/>
               </w:rPr>
-              <w:t>enemy_sprite</w:t>
+              <w:t>enemy</w:t>
+            </w:r>
+            <w:proofErr w:type="gramEnd"/>
+            <w:r>
+              <w:rPr>
+                <w:rFonts w:ascii="Consolas" w:eastAsia="Times New Roman" w:hAnsi="Consolas" w:cs="Times New Roman"/>
+                <w:color w:val="9CDCFE"/>
+                <w:sz w:val="21"/>
+                <w:szCs w:val="21"/>
+                <w:lang w:eastAsia="en-NZ"/>
+              </w:rPr>
+              <w:t>_sprite</w:t>
             </w:r>
             <w:r>
               <w:rPr>
@@ -3306,6 +3564,7 @@
               </w:rPr>
               <w:t>attack</w:t>
             </w:r>
+            <w:proofErr w:type="spellEnd"/>
             <w:r>
               <w:rPr>
                 <w:rFonts w:ascii="Consolas" w:eastAsia="Times New Roman" w:hAnsi="Consolas" w:cs="Times New Roman"/>
@@ -3432,7 +3691,31 @@
                 <w:szCs w:val="21"/>
                 <w:lang w:eastAsia="en-NZ"/>
               </w:rPr>
-              <w:t>Added time.sleep(1)</w:t>
+              <w:t xml:space="preserve">Added </w:t>
+            </w:r>
+            <w:proofErr w:type="spellStart"/>
+            <w:proofErr w:type="gramStart"/>
+            <w:r>
+              <w:rPr>
+                <w:rFonts w:ascii="Consolas" w:eastAsia="Times New Roman" w:hAnsi="Consolas" w:cs="Times New Roman"/>
+                <w:color w:val="CCCCCC"/>
+                <w:sz w:val="21"/>
+                <w:szCs w:val="21"/>
+                <w:lang w:eastAsia="en-NZ"/>
+              </w:rPr>
+              <w:t>time.sleep</w:t>
+            </w:r>
+            <w:proofErr w:type="spellEnd"/>
+            <w:proofErr w:type="gramEnd"/>
+            <w:r>
+              <w:rPr>
+                <w:rFonts w:ascii="Consolas" w:eastAsia="Times New Roman" w:hAnsi="Consolas" w:cs="Times New Roman"/>
+                <w:color w:val="CCCCCC"/>
+                <w:sz w:val="21"/>
+                <w:szCs w:val="21"/>
+                <w:lang w:eastAsia="en-NZ"/>
+              </w:rPr>
+              <w:t>(1)</w:t>
             </w:r>
           </w:p>
         </w:tc>
@@ -3625,7 +3908,51 @@
                 <w:szCs w:val="21"/>
                 <w:lang w:eastAsia="en-NZ"/>
               </w:rPr>
-              <w:t>Reset self.cur_texture when self attack == “attack</w:t>
+              <w:t xml:space="preserve">Reset </w:t>
+            </w:r>
+            <w:proofErr w:type="spellStart"/>
+            <w:r>
+              <w:rPr>
+                <w:rFonts w:ascii="Consolas" w:eastAsia="Times New Roman" w:hAnsi="Consolas" w:cs="Times New Roman"/>
+                <w:color w:val="CCCCCC"/>
+                <w:sz w:val="21"/>
+                <w:szCs w:val="21"/>
+                <w:lang w:eastAsia="en-NZ"/>
+              </w:rPr>
+              <w:t>self.cur_texture</w:t>
+            </w:r>
+            <w:proofErr w:type="spellEnd"/>
+            <w:r>
+              <w:rPr>
+                <w:rFonts w:ascii="Consolas" w:eastAsia="Times New Roman" w:hAnsi="Consolas" w:cs="Times New Roman"/>
+                <w:color w:val="CCCCCC"/>
+                <w:sz w:val="21"/>
+                <w:szCs w:val="21"/>
+                <w:lang w:eastAsia="en-NZ"/>
+              </w:rPr>
+              <w:t xml:space="preserve"> when </w:t>
+            </w:r>
+            <w:proofErr w:type="spellStart"/>
+            <w:r>
+              <w:rPr>
+                <w:rFonts w:ascii="Consolas" w:eastAsia="Times New Roman" w:hAnsi="Consolas" w:cs="Times New Roman"/>
+                <w:color w:val="CCCCCC"/>
+                <w:sz w:val="21"/>
+                <w:szCs w:val="21"/>
+                <w:lang w:eastAsia="en-NZ"/>
+              </w:rPr>
+              <w:t>self attack</w:t>
+            </w:r>
+            <w:proofErr w:type="spellEnd"/>
+            <w:r>
+              <w:rPr>
+                <w:rFonts w:ascii="Consolas" w:eastAsia="Times New Roman" w:hAnsi="Consolas" w:cs="Times New Roman"/>
+                <w:color w:val="CCCCCC"/>
+                <w:sz w:val="21"/>
+                <w:szCs w:val="21"/>
+                <w:lang w:eastAsia="en-NZ"/>
+              </w:rPr>
+              <w:t xml:space="preserve"> == “attack</w:t>
             </w:r>
           </w:p>
         </w:tc>
@@ -3670,8 +3997,13 @@
             <w:gridSpan w:val="2"/>
           </w:tcPr>
           <w:p>
-            <w:r>
-              <w:t>Self.cur_texture is not being updated</w:t>
+            <w:proofErr w:type="spellStart"/>
+            <w:r>
+              <w:t>Self.cur_texture</w:t>
+            </w:r>
+            <w:proofErr w:type="spellEnd"/>
+            <w:r>
+              <w:t xml:space="preserve"> is not being updated</w:t>
             </w:r>
           </w:p>
         </w:tc>
@@ -3960,7 +4292,75 @@
                 <w:szCs w:val="21"/>
                 <w:lang w:eastAsia="en-NZ"/>
               </w:rPr>
-              <w:t>Removed the code from on key_release that stops the animation code from running and made self.attack = “” when the animation hd played.</w:t>
+              <w:t xml:space="preserve">Removed the code from on </w:t>
+            </w:r>
+            <w:proofErr w:type="spellStart"/>
+            <w:r>
+              <w:rPr>
+                <w:rFonts w:ascii="Consolas" w:eastAsia="Times New Roman" w:hAnsi="Consolas" w:cs="Times New Roman"/>
+                <w:color w:val="CCCCCC"/>
+                <w:sz w:val="21"/>
+                <w:szCs w:val="21"/>
+                <w:lang w:eastAsia="en-NZ"/>
+              </w:rPr>
+              <w:t>key_release</w:t>
+            </w:r>
+            <w:proofErr w:type="spellEnd"/>
+            <w:r>
+              <w:rPr>
+                <w:rFonts w:ascii="Consolas" w:eastAsia="Times New Roman" w:hAnsi="Consolas" w:cs="Times New Roman"/>
+                <w:color w:val="CCCCCC"/>
+                <w:sz w:val="21"/>
+                <w:szCs w:val="21"/>
+                <w:lang w:eastAsia="en-NZ"/>
+              </w:rPr>
+              <w:t xml:space="preserve"> that stops the animation code from running and made </w:t>
+            </w:r>
+            <w:proofErr w:type="spellStart"/>
+            <w:proofErr w:type="gramStart"/>
+            <w:r>
+              <w:rPr>
+                <w:rFonts w:ascii="Consolas" w:eastAsia="Times New Roman" w:hAnsi="Consolas" w:cs="Times New Roman"/>
+                <w:color w:val="CCCCCC"/>
+                <w:sz w:val="21"/>
+                <w:szCs w:val="21"/>
+                <w:lang w:eastAsia="en-NZ"/>
+              </w:rPr>
+              <w:t>self.attack</w:t>
+            </w:r>
+            <w:proofErr w:type="spellEnd"/>
+            <w:proofErr w:type="gramEnd"/>
+            <w:r>
+              <w:rPr>
+                <w:rFonts w:ascii="Consolas" w:eastAsia="Times New Roman" w:hAnsi="Consolas" w:cs="Times New Roman"/>
+                <w:color w:val="CCCCCC"/>
+                <w:sz w:val="21"/>
+                <w:szCs w:val="21"/>
+                <w:lang w:eastAsia="en-NZ"/>
+              </w:rPr>
+              <w:t xml:space="preserve"> = “” when the animation </w:t>
+            </w:r>
+            <w:proofErr w:type="spellStart"/>
+            <w:r>
+              <w:rPr>
+                <w:rFonts w:ascii="Consolas" w:eastAsia="Times New Roman" w:hAnsi="Consolas" w:cs="Times New Roman"/>
+                <w:color w:val="CCCCCC"/>
+                <w:sz w:val="21"/>
+                <w:szCs w:val="21"/>
+                <w:lang w:eastAsia="en-NZ"/>
+              </w:rPr>
+              <w:t>hd</w:t>
+            </w:r>
+            <w:proofErr w:type="spellEnd"/>
+            <w:r>
+              <w:rPr>
+                <w:rFonts w:ascii="Consolas" w:eastAsia="Times New Roman" w:hAnsi="Consolas" w:cs="Times New Roman"/>
+                <w:color w:val="CCCCCC"/>
+                <w:sz w:val="21"/>
+                <w:szCs w:val="21"/>
+                <w:lang w:eastAsia="en-NZ"/>
+              </w:rPr>
+              <w:t xml:space="preserve"> played.</w:t>
             </w:r>
           </w:p>
         </w:tc>
@@ -4256,8 +4656,20 @@
                 <w:szCs w:val="21"/>
                 <w:lang w:eastAsia="en-NZ"/>
               </w:rPr>
-              <w:t>Attack animation repeats when the sprites move</w:t>
-            </w:r>
+              <w:t xml:space="preserve">Attack animation repeats when the sprites </w:t>
+            </w:r>
+            <w:proofErr w:type="gramStart"/>
+            <w:r>
+              <w:rPr>
+                <w:rFonts w:ascii="Consolas" w:eastAsia="Times New Roman" w:hAnsi="Consolas" w:cs="Times New Roman"/>
+                <w:color w:val="CCCCCC"/>
+                <w:sz w:val="21"/>
+                <w:szCs w:val="21"/>
+                <w:lang w:eastAsia="en-NZ"/>
+              </w:rPr>
+              <w:t>move</w:t>
+            </w:r>
+            <w:proofErr w:type="gramEnd"/>
           </w:p>
           <w:p>
             <w:pPr>
@@ -4271,15 +4683,27 @@
                 <w:lang w:eastAsia="en-NZ"/>
               </w:rPr>
             </w:pPr>
-            <w:r>
-              <w:rPr>
-                <w:rFonts w:ascii="Consolas" w:eastAsia="Times New Roman" w:hAnsi="Consolas" w:cs="Times New Roman"/>
-                <w:color w:val="CCCCCC"/>
-                <w:sz w:val="21"/>
-                <w:szCs w:val="21"/>
-                <w:lang w:eastAsia="en-NZ"/>
-              </w:rPr>
-              <w:t>So I stopped the enemy sprite movement when attack</w:t>
+            <w:proofErr w:type="gramStart"/>
+            <w:r>
+              <w:rPr>
+                <w:rFonts w:ascii="Consolas" w:eastAsia="Times New Roman" w:hAnsi="Consolas" w:cs="Times New Roman"/>
+                <w:color w:val="CCCCCC"/>
+                <w:sz w:val="21"/>
+                <w:szCs w:val="21"/>
+                <w:lang w:eastAsia="en-NZ"/>
+              </w:rPr>
+              <w:t>So</w:t>
+            </w:r>
+            <w:proofErr w:type="gramEnd"/>
+            <w:r>
+              <w:rPr>
+                <w:rFonts w:ascii="Consolas" w:eastAsia="Times New Roman" w:hAnsi="Consolas" w:cs="Times New Roman"/>
+                <w:color w:val="CCCCCC"/>
+                <w:sz w:val="21"/>
+                <w:szCs w:val="21"/>
+                <w:lang w:eastAsia="en-NZ"/>
+              </w:rPr>
+              <w:t xml:space="preserve"> I stopped the enemy sprite movement when attack</w:t>
             </w:r>
           </w:p>
           <w:p>
@@ -4488,7 +4912,15 @@
           </w:tcPr>
           <w:p>
             <w:r>
-              <w:t>Animation doesn’t work for other enemy sprite</w:t>
+              <w:t xml:space="preserve">Animation doesn’t work for </w:t>
+            </w:r>
+            <w:proofErr w:type="gramStart"/>
+            <w:r>
+              <w:t>other</w:t>
+            </w:r>
+            <w:proofErr w:type="gramEnd"/>
+            <w:r>
+              <w:t xml:space="preserve"> enemy sprite</w:t>
             </w:r>
           </w:p>
         </w:tc>
@@ -4932,8 +5364,13 @@
           </w:tcPr>
           <w:p>
             <w:r>
-              <w:t>Defined self in init</w:t>
-            </w:r>
+              <w:t xml:space="preserve">Defined self in </w:t>
+            </w:r>
+            <w:proofErr w:type="spellStart"/>
+            <w:r>
+              <w:t>init</w:t>
+            </w:r>
+            <w:proofErr w:type="spellEnd"/>
           </w:p>
         </w:tc>
       </w:tr>
@@ -5312,7 +5749,15 @@
           </w:tcPr>
           <w:p>
             <w:r>
-              <w:t>Animation is  a bit buggy</w:t>
+              <w:t xml:space="preserve">Animation </w:t>
+            </w:r>
+            <w:proofErr w:type="gramStart"/>
+            <w:r>
+              <w:t>is  a</w:t>
+            </w:r>
+            <w:proofErr w:type="gramEnd"/>
+            <w:r>
+              <w:t xml:space="preserve"> bit buggy</w:t>
             </w:r>
           </w:p>
         </w:tc>
@@ -5322,7 +5767,17 @@
           </w:tcPr>
           <w:p>
             <w:r>
-              <w:t>Made the normal idle and walking animation only run if self.if-hit wasn’t true</w:t>
+              <w:t xml:space="preserve">Made the normal idle and walking animation only run if </w:t>
+            </w:r>
+            <w:proofErr w:type="spellStart"/>
+            <w:proofErr w:type="gramStart"/>
+            <w:r>
+              <w:t>self.if</w:t>
+            </w:r>
+            <w:proofErr w:type="spellEnd"/>
+            <w:proofErr w:type="gramEnd"/>
+            <w:r>
+              <w:t>-hit wasn’t true</w:t>
             </w:r>
           </w:p>
         </w:tc>
@@ -6097,7 +6552,15 @@
           </w:tcPr>
           <w:p>
             <w:r>
-              <w:t>Set if_hit variable to false after texture is et</w:t>
+              <w:t xml:space="preserve">Set </w:t>
+            </w:r>
+            <w:proofErr w:type="spellStart"/>
+            <w:r>
+              <w:t>if_hit</w:t>
+            </w:r>
+            <w:proofErr w:type="spellEnd"/>
+            <w:r>
+              <w:t xml:space="preserve"> variable to false after texture is et</w:t>
             </w:r>
           </w:p>
         </w:tc>
@@ -6425,7 +6888,17 @@
           </w:tcPr>
           <w:p>
             <w:r>
-              <w:t>Added the middle textures a the end of the texture list</w:t>
+              <w:t xml:space="preserve">Added the middle textures </w:t>
+            </w:r>
+            <w:proofErr w:type="spellStart"/>
+            <w:proofErr w:type="gramStart"/>
+            <w:r>
+              <w:t>a</w:t>
+            </w:r>
+            <w:proofErr w:type="spellEnd"/>
+            <w:proofErr w:type="gramEnd"/>
+            <w:r>
+              <w:t xml:space="preserve"> the end of the texture list</w:t>
             </w:r>
           </w:p>
         </w:tc>
@@ -6869,7 +7342,15 @@
           </w:tcPr>
           <w:p>
             <w:r>
-              <w:t>Player gains a kill when enemy is killed and enemy is respawned</w:t>
+              <w:t xml:space="preserve">Player gains a kill when enemy is </w:t>
+            </w:r>
+            <w:proofErr w:type="gramStart"/>
+            <w:r>
+              <w:t>killed</w:t>
+            </w:r>
+            <w:proofErr w:type="gramEnd"/>
+            <w:r>
+              <w:t xml:space="preserve"> and enemy is respawned</w:t>
             </w:r>
           </w:p>
         </w:tc>
@@ -6878,8 +7359,13 @@
             <w:tcW w:w="1298" w:type="dxa"/>
           </w:tcPr>
           <w:p>
-            <w:r>
-              <w:t>Amount of kills in increased every second</w:t>
+            <w:proofErr w:type="gramStart"/>
+            <w:r>
+              <w:t>Amount</w:t>
+            </w:r>
+            <w:proofErr w:type="gramEnd"/>
+            <w:r>
+              <w:t xml:space="preserve"> of kills in increased every second</w:t>
             </w:r>
           </w:p>
         </w:tc>
@@ -7320,8 +7806,13 @@
             <w:gridSpan w:val="2"/>
           </w:tcPr>
           <w:p>
-            <w:r>
-              <w:t xml:space="preserve">Setup() is called and everything spawns in </w:t>
+            <w:proofErr w:type="gramStart"/>
+            <w:r>
+              <w:t>Setup(</w:t>
+            </w:r>
+            <w:proofErr w:type="gramEnd"/>
+            <w:r>
+              <w:t xml:space="preserve">) is called and everything spawns in </w:t>
             </w:r>
             <w:r>
               <w:lastRenderedPageBreak/>
@@ -7346,7 +7837,15 @@
           </w:tcPr>
           <w:p>
             <w:r>
-              <w:t>Converted map files to json files</w:t>
+              <w:t xml:space="preserve">Converted map files to </w:t>
+            </w:r>
+            <w:proofErr w:type="spellStart"/>
+            <w:r>
+              <w:t>json</w:t>
+            </w:r>
+            <w:proofErr w:type="spellEnd"/>
+            <w:r>
+              <w:t xml:space="preserve"> files</w:t>
             </w:r>
           </w:p>
         </w:tc>
@@ -7416,8 +7915,21 @@
           </w:tcPr>
           <w:p>
             <w:r>
-              <w:t>Forgot adjust spawn coordinates for tile sclaing</w:t>
-            </w:r>
+              <w:t xml:space="preserve">Forgot </w:t>
+            </w:r>
+            <w:proofErr w:type="gramStart"/>
+            <w:r>
+              <w:t>adjust</w:t>
+            </w:r>
+            <w:proofErr w:type="gramEnd"/>
+            <w:r>
+              <w:t xml:space="preserve"> spawn coordinates for tile </w:t>
+            </w:r>
+            <w:proofErr w:type="spellStart"/>
+            <w:r>
+              <w:t>sclaing</w:t>
+            </w:r>
+            <w:proofErr w:type="spellEnd"/>
           </w:p>
         </w:tc>
       </w:tr>
@@ -7607,7 +8119,15 @@
           </w:tcPr>
           <w:p>
             <w:r>
-              <w:t>Lives go back up to max everytime.</w:t>
+              <w:t xml:space="preserve">Lives go back up to max </w:t>
+            </w:r>
+            <w:proofErr w:type="spellStart"/>
+            <w:r>
+              <w:t>everytime</w:t>
+            </w:r>
+            <w:proofErr w:type="spellEnd"/>
+            <w:r>
+              <w:t>.</w:t>
             </w:r>
           </w:p>
         </w:tc>
@@ -7617,7 +8137,15 @@
           </w:tcPr>
           <w:p>
             <w:r>
-              <w:t>Made the lives variable within the game class not the character class because they are reset everytime setup is called.</w:t>
+              <w:t xml:space="preserve">Made the lives variable within the game class not the character class because they are reset </w:t>
+            </w:r>
+            <w:proofErr w:type="spellStart"/>
+            <w:r>
+              <w:t>everytime</w:t>
+            </w:r>
+            <w:proofErr w:type="spellEnd"/>
+            <w:r>
+              <w:t xml:space="preserve"> setup is called.</w:t>
             </w:r>
           </w:p>
         </w:tc>
@@ -7798,7 +8326,13 @@
           </w:tcPr>
           <w:p>
             <w:r>
-              <w:t>Player returns back to start of the game</w:t>
+              <w:t xml:space="preserve">Player </w:t>
+            </w:r>
+            <w:r>
+              <w:t>returns</w:t>
+            </w:r>
+            <w:r>
+              <w:t xml:space="preserve"> to start of the game</w:t>
             </w:r>
           </w:p>
         </w:tc>
@@ -7808,7 +8342,13 @@
           </w:tcPr>
           <w:p>
             <w:r>
-              <w:t>Player returns back to the start of the game</w:t>
+              <w:t xml:space="preserve">Player </w:t>
+            </w:r>
+            <w:r>
+              <w:t>returns</w:t>
+            </w:r>
+            <w:r>
+              <w:t xml:space="preserve"> to the start of the game</w:t>
             </w:r>
           </w:p>
         </w:tc>

</xml_diff>